<commit_message>
UPDATE: math formules DATE: 2026-09-21 14:39:17
</commit_message>
<xml_diff>
--- a/Учеба 4 семестр/Теория вероятности/Курсовая работа/Отчет, Код/Курсовая_работа.docx
+++ b/Учеба 4 семестр/Теория вероятности/Курсовая работа/Отчет, Код/Курсовая_работа.docx
@@ -2683,30 +2683,30 @@
         </w:rPr>
         <w:t xml:space="preserve">•  </w:t>
       </w:r>
-      <w:proofErr w:type="gramStart"/>
-      <w:r>
-        <w:rPr>
-          <w:i/>
-          <w:iCs/>
-          <w:sz w:val="28"/>
-          <w:szCs w:val="28"/>
-        </w:rPr>
-        <w:t>α</w:t>
-      </w:r>
-      <w:r>
-        <w:rPr>
-          <w:sz w:val="28"/>
-          <w:szCs w:val="28"/>
-        </w:rPr>
-        <w:t xml:space="preserve"> &gt;</w:t>
-      </w:r>
-      <w:proofErr w:type="gramEnd"/>
-      <w:r>
-        <w:rPr>
-          <w:sz w:val="28"/>
-          <w:szCs w:val="28"/>
-        </w:rPr>
-        <w:t xml:space="preserve"> 0 — параметр формы</w:t>
+      <m:oMath>
+        <m:r>
+          <w:rPr>
+            <w:rFonts w:ascii="Cambria Math" w:hAnsi="Cambria Math"/>
+            <w:sz w:val="28"/>
+            <w:szCs w:val="28"/>
+          </w:rPr>
+          <m:t>α</m:t>
+        </m:r>
+        <m:r>
+          <w:rPr>
+            <w:rFonts w:ascii="Cambria Math" w:hAnsi="Cambria Math"/>
+            <w:sz w:val="28"/>
+            <w:szCs w:val="28"/>
+          </w:rPr>
+          <m:t xml:space="preserve"> &gt; 0</m:t>
+        </m:r>
+      </m:oMath>
+      <w:r>
+        <w:rPr>
+          <w:sz w:val="28"/>
+          <w:szCs w:val="28"/>
+        </w:rPr>
+        <w:t xml:space="preserve"> — параметр формы</w:t>
       </w:r>
       <w:r>
         <w:rPr>
@@ -2732,30 +2732,30 @@
         </w:rPr>
         <w:t xml:space="preserve">•  </w:t>
       </w:r>
-      <w:proofErr w:type="gramStart"/>
-      <w:r>
-        <w:rPr>
-          <w:i/>
-          <w:iCs/>
-          <w:sz w:val="28"/>
-          <w:szCs w:val="28"/>
-        </w:rPr>
-        <w:t>β</w:t>
-      </w:r>
-      <w:r>
-        <w:rPr>
-          <w:sz w:val="28"/>
-          <w:szCs w:val="28"/>
-        </w:rPr>
-        <w:t xml:space="preserve"> &gt;</w:t>
-      </w:r>
-      <w:proofErr w:type="gramEnd"/>
-      <w:r>
-        <w:rPr>
-          <w:sz w:val="28"/>
-          <w:szCs w:val="28"/>
-        </w:rPr>
-        <w:t xml:space="preserve"> 0 — параметр масштаба</w:t>
+      <m:oMath>
+        <m:r>
+          <w:rPr>
+            <w:rFonts w:ascii="Cambria Math" w:hAnsi="Cambria Math"/>
+            <w:sz w:val="28"/>
+            <w:szCs w:val="28"/>
+          </w:rPr>
+          <m:t>β</m:t>
+        </m:r>
+        <m:r>
+          <w:rPr>
+            <w:rFonts w:ascii="Cambria Math" w:hAnsi="Cambria Math"/>
+            <w:sz w:val="28"/>
+            <w:szCs w:val="28"/>
+          </w:rPr>
+          <m:t xml:space="preserve"> &gt; 0</m:t>
+        </m:r>
+      </m:oMath>
+      <w:r>
+        <w:rPr>
+          <w:sz w:val="28"/>
+          <w:szCs w:val="28"/>
+        </w:rPr>
+        <w:t xml:space="preserve"> — параметр масштаба</w:t>
       </w:r>
       <w:r>
         <w:rPr>
@@ -2781,26 +2781,27 @@
         </w:rPr>
         <w:t xml:space="preserve">•  </w:t>
       </w:r>
-      <w:proofErr w:type="spellStart"/>
-      <w:r>
-        <w:rPr>
-          <w:i/>
-          <w:iCs/>
-          <w:sz w:val="28"/>
-          <w:szCs w:val="28"/>
-        </w:rPr>
-        <w:t>loc</w:t>
-      </w:r>
-      <w:proofErr w:type="spellEnd"/>
-      <w:r>
-        <w:rPr>
-          <w:i/>
-          <w:iCs/>
-          <w:sz w:val="28"/>
-          <w:szCs w:val="28"/>
-        </w:rPr>
-        <w:t xml:space="preserve"> ∈ ℝ</w:t>
-      </w:r>
+      <m:oMath>
+        <m:r>
+          <w:rPr>
+            <w:rFonts w:ascii="Cambria Math" w:hAnsi="Cambria Math"/>
+            <w:sz w:val="28"/>
+            <w:szCs w:val="28"/>
+          </w:rPr>
+          <m:t>loc</m:t>
+        </m:r>
+        <m:r>
+          <m:rPr>
+            <m:scr m:val="double-struck"/>
+          </m:rPr>
+          <w:rPr>
+            <w:rFonts w:ascii="Cambria Math" w:hAnsi="Cambria Math"/>
+            <w:sz w:val="28"/>
+            <w:szCs w:val="28"/>
+          </w:rPr>
+          <m:t xml:space="preserve"> ∈ R</m:t>
+        </m:r>
+      </m:oMath>
       <w:r>
         <w:rPr>
           <w:sz w:val="28"/>
@@ -2832,15 +2833,16 @@
         </w:rPr>
         <w:t xml:space="preserve">•  </w:t>
       </w:r>
-      <w:r>
-        <w:rPr>
-          <w:i/>
-          <w:iCs/>
-          <w:sz w:val="28"/>
-          <w:szCs w:val="28"/>
-        </w:rPr>
-        <w:t>Γ(α)</w:t>
-      </w:r>
+      <m:oMath>
+        <m:r>
+          <w:rPr>
+            <w:rFonts w:ascii="Cambria Math" w:hAnsi="Cambria Math"/>
+            <w:sz w:val="28"/>
+            <w:szCs w:val="28"/>
+          </w:rPr>
+          <m:t>Γ(α)</m:t>
+        </m:r>
+      </m:oMath>
       <w:r>
         <w:rPr>
           <w:sz w:val="28"/>
@@ -2946,23 +2948,72 @@
           <w:sz w:val="28"/>
           <w:szCs w:val="28"/>
         </w:rPr>
-        <w:t xml:space="preserve">состоит в моделировании симметричных случайных величин на всей числовой оси (-∞, +∞), то есть там, где применение одностороннего гамма-распределения невозможно. Распределение охватывает широкий параметрический класс: при α = 1 оно вырождается в двустороннее экспоненциальное (распределение Лапласа), при </w:t>
-      </w:r>
-      <w:proofErr w:type="gramStart"/>
-      <w:r>
-        <w:rPr>
-          <w:sz w:val="28"/>
-          <w:szCs w:val="28"/>
-        </w:rPr>
-        <w:t>α &gt;</w:t>
-      </w:r>
-      <w:proofErr w:type="gramEnd"/>
-      <w:r>
-        <w:rPr>
-          <w:sz w:val="28"/>
-          <w:szCs w:val="28"/>
-        </w:rPr>
-        <w:t xml:space="preserve"> 1 описывает двугорбые плотности с симметричными пиками по обе стороны от параметра смещения. Это делает его универсальным инструментом для задач, в которых отклонения от центрального значения могут быть как положительными, так и отрицательными [3].</w:t>
+        <w:t xml:space="preserve">состоит в моделировании симметричных случайных величин на всей числовой оси </w:t>
+      </w:r>
+      <m:oMath>
+        <m:r>
+          <w:rPr>
+            <w:rFonts w:ascii="Cambria Math" w:hAnsi="Cambria Math"/>
+            <w:sz w:val="28"/>
+            <w:szCs w:val="28"/>
+          </w:rPr>
+          <m:t>(-∞, +∞)</m:t>
+        </m:r>
+      </m:oMath>
+      <w:r>
+        <w:rPr>
+          <w:sz w:val="28"/>
+          <w:szCs w:val="28"/>
+        </w:rPr>
+        <w:t>,</w:t>
+      </w:r>
+      <w:r>
+        <w:rPr>
+          <w:sz w:val="28"/>
+          <w:szCs w:val="28"/>
+        </w:rPr>
+        <w:t xml:space="preserve"> </w:t>
+      </w:r>
+      <w:r>
+        <w:rPr>
+          <w:sz w:val="28"/>
+          <w:szCs w:val="28"/>
+        </w:rPr>
+        <w:t xml:space="preserve">то есть там, где применение одностороннего гамма-распределения невозможно. Распределение охватывает широкий параметрический класс: при </w:t>
+      </w:r>
+      <m:oMath>
+        <m:r>
+          <w:rPr>
+            <w:rFonts w:ascii="Cambria Math" w:hAnsi="Cambria Math"/>
+            <w:sz w:val="28"/>
+            <w:szCs w:val="28"/>
+          </w:rPr>
+          <m:t>α = 1</m:t>
+        </m:r>
+      </m:oMath>
+      <w:r>
+        <w:rPr>
+          <w:sz w:val="28"/>
+          <w:szCs w:val="28"/>
+        </w:rPr>
+        <w:t xml:space="preserve"> оно вырождается в двустороннее экспоненциальное (распределение Лапласа), при </w:t>
+      </w:r>
+      <m:oMath>
+        <m:r>
+          <w:rPr>
+            <w:rFonts w:ascii="Cambria Math" w:hAnsi="Cambria Math"/>
+            <w:sz w:val="28"/>
+            <w:szCs w:val="28"/>
+          </w:rPr>
+          <m:t>α &gt; 1</m:t>
+        </m:r>
+      </m:oMath>
+      <w:r>
+        <w:rPr>
+          <w:sz w:val="28"/>
+          <w:szCs w:val="28"/>
+        </w:rPr>
+        <w:t xml:space="preserve"> описывает двугорбые плотности с симметричными пиками по обе стороны от параметра смещения. Это делает его универсальным инструментом для задач, в которых отклонения от центрального значения могут быть как положительными, так и отрицательными [3].</w:t>
       </w:r>
     </w:p>
     <w:p>
@@ -4556,7 +4607,41 @@
           <w:sz w:val="28"/>
           <w:szCs w:val="28"/>
         </w:rPr>
-        <w:t>Результаты работы реализованных функций для предоставленной выборки объёмом n = 300 при k = 3:</w:t>
+        <w:t xml:space="preserve">Результаты работы реализованных функций для предоставленной выборки объёмом </w:t>
+      </w:r>
+      <m:oMath>
+        <m:r>
+          <w:rPr>
+            <w:rFonts w:ascii="Cambria Math" w:hAnsi="Cambria Math"/>
+            <w:sz w:val="28"/>
+            <w:szCs w:val="28"/>
+          </w:rPr>
+          <m:t>n = 300</m:t>
+        </m:r>
+      </m:oMath>
+      <w:r>
+        <w:rPr>
+          <w:sz w:val="28"/>
+          <w:szCs w:val="28"/>
+        </w:rPr>
+        <w:t xml:space="preserve"> при </w:t>
+      </w:r>
+      <m:oMath>
+        <m:r>
+          <w:rPr>
+            <w:rFonts w:ascii="Cambria Math" w:hAnsi="Cambria Math"/>
+            <w:sz w:val="28"/>
+            <w:szCs w:val="28"/>
+          </w:rPr>
+          <m:t>k = 3</m:t>
+        </m:r>
+      </m:oMath>
+      <w:r>
+        <w:rPr>
+          <w:sz w:val="28"/>
+          <w:szCs w:val="28"/>
+        </w:rPr>
+        <w:t>:</w:t>
       </w:r>
     </w:p>
     <w:p>
@@ -5110,87 +5195,104 @@
           <w:sz w:val="28"/>
           <w:szCs w:val="28"/>
         </w:rPr>
-        <w:t>Пусть X</w:t>
-      </w:r>
-      <w:r>
-        <w:rPr>
-          <w:sz w:val="28"/>
-          <w:szCs w:val="28"/>
-          <w:vertAlign w:val="subscript"/>
-        </w:rPr>
-        <w:t>1</w:t>
-      </w:r>
-      <w:r>
-        <w:rPr>
-          <w:sz w:val="28"/>
-          <w:szCs w:val="28"/>
-        </w:rPr>
-        <w:t xml:space="preserve">, …, </w:t>
-      </w:r>
-      <w:proofErr w:type="spellStart"/>
-      <w:r>
-        <w:rPr>
-          <w:sz w:val="28"/>
-          <w:szCs w:val="28"/>
-        </w:rPr>
-        <w:t>X</w:t>
-      </w:r>
-      <w:r>
-        <w:rPr>
-          <w:sz w:val="28"/>
-          <w:szCs w:val="28"/>
-          <w:vertAlign w:val="subscript"/>
-        </w:rPr>
-        <w:t>n</w:t>
-      </w:r>
-      <w:proofErr w:type="spellEnd"/>
-      <w:r>
-        <w:rPr>
-          <w:sz w:val="28"/>
-          <w:szCs w:val="28"/>
-        </w:rPr>
-        <w:t xml:space="preserve"> — выборка из распределения F(x), </w:t>
-      </w:r>
-      <w:proofErr w:type="gramStart"/>
-      <w:r>
-        <w:rPr>
-          <w:sz w:val="28"/>
-          <w:szCs w:val="28"/>
-        </w:rPr>
-        <w:t>X</w:t>
-      </w:r>
-      <w:r>
-        <w:rPr>
-          <w:sz w:val="28"/>
-          <w:szCs w:val="28"/>
-          <w:vertAlign w:val="subscript"/>
-        </w:rPr>
-        <w:t>(</w:t>
-      </w:r>
-      <w:proofErr w:type="gramEnd"/>
-      <w:r>
-        <w:rPr>
-          <w:sz w:val="28"/>
-          <w:szCs w:val="28"/>
-          <w:vertAlign w:val="subscript"/>
-        </w:rPr>
-        <w:t>1)</w:t>
-      </w:r>
-      <w:r>
-        <w:rPr>
-          <w:sz w:val="28"/>
-          <w:szCs w:val="28"/>
-        </w:rPr>
-        <w:t>, …, X</w:t>
-      </w:r>
-      <w:r>
-        <w:rPr>
-          <w:sz w:val="28"/>
-          <w:szCs w:val="28"/>
-          <w:vertAlign w:val="subscript"/>
-        </w:rPr>
-        <w:t>(n)</w:t>
-      </w:r>
+        <w:t xml:space="preserve">Пусть </w:t>
+      </w:r>
+      <m:oMath>
+        <m:r>
+          <w:rPr>
+            <w:rFonts w:ascii="Cambria Math" w:hAnsi="Cambria Math"/>
+            <w:sz w:val="28"/>
+            <w:szCs w:val="28"/>
+          </w:rPr>
+          <m:t>X</m:t>
+        </m:r>
+        <m:r>
+          <w:rPr>
+            <w:rFonts w:ascii="Cambria Math" w:hAnsi="Cambria Math"/>
+            <w:sz w:val="28"/>
+            <w:szCs w:val="28"/>
+            <w:vertAlign w:val="subscript"/>
+          </w:rPr>
+          <m:t>1</m:t>
+        </m:r>
+        <m:r>
+          <w:rPr>
+            <w:rFonts w:ascii="Cambria Math" w:hAnsi="Cambria Math"/>
+            <w:sz w:val="28"/>
+            <w:szCs w:val="28"/>
+          </w:rPr>
+          <m:t>, …, X</m:t>
+        </m:r>
+        <m:r>
+          <w:rPr>
+            <w:rFonts w:ascii="Cambria Math" w:hAnsi="Cambria Math"/>
+            <w:sz w:val="28"/>
+            <w:szCs w:val="28"/>
+            <w:vertAlign w:val="subscript"/>
+          </w:rPr>
+          <m:t>n</m:t>
+        </m:r>
+      </m:oMath>
+      <w:r>
+        <w:rPr>
+          <w:sz w:val="28"/>
+          <w:szCs w:val="28"/>
+        </w:rPr>
+        <w:t xml:space="preserve"> — выборка из распределения </w:t>
+      </w:r>
+      <m:oMath>
+        <m:r>
+          <w:rPr>
+            <w:rFonts w:ascii="Cambria Math" w:hAnsi="Cambria Math"/>
+            <w:sz w:val="28"/>
+            <w:szCs w:val="28"/>
+          </w:rPr>
+          <m:t>F(x)</m:t>
+        </m:r>
+      </m:oMath>
+      <w:r>
+        <w:rPr>
+          <w:sz w:val="28"/>
+          <w:szCs w:val="28"/>
+        </w:rPr>
+        <w:t xml:space="preserve">, </w:t>
+      </w:r>
+      <m:oMath>
+        <m:r>
+          <w:rPr>
+            <w:rFonts w:ascii="Cambria Math" w:hAnsi="Cambria Math"/>
+            <w:sz w:val="28"/>
+            <w:szCs w:val="28"/>
+          </w:rPr>
+          <m:t>X</m:t>
+        </m:r>
+        <m:r>
+          <w:rPr>
+            <w:rFonts w:ascii="Cambria Math" w:hAnsi="Cambria Math"/>
+            <w:sz w:val="28"/>
+            <w:szCs w:val="28"/>
+            <w:vertAlign w:val="subscript"/>
+          </w:rPr>
+          <m:t>(1)</m:t>
+        </m:r>
+        <m:r>
+          <w:rPr>
+            <w:rFonts w:ascii="Cambria Math" w:hAnsi="Cambria Math"/>
+            <w:sz w:val="28"/>
+            <w:szCs w:val="28"/>
+          </w:rPr>
+          <m:t>, …, X</m:t>
+        </m:r>
+        <m:r>
+          <w:rPr>
+            <w:rFonts w:ascii="Cambria Math" w:hAnsi="Cambria Math"/>
+            <w:sz w:val="28"/>
+            <w:szCs w:val="28"/>
+            <w:vertAlign w:val="subscript"/>
+          </w:rPr>
+          <m:t>(n)</m:t>
+        </m:r>
+      </m:oMath>
       <w:r>
         <w:rPr>
           <w:sz w:val="28"/>
@@ -5198,29 +5300,42 @@
         </w:rPr>
         <w:t xml:space="preserve"> — вариационный ряд, </w:t>
       </w:r>
-      <w:proofErr w:type="spellStart"/>
-      <w:r>
-        <w:rPr>
-          <w:sz w:val="28"/>
-          <w:szCs w:val="28"/>
-        </w:rPr>
-        <w:t>N</w:t>
-      </w:r>
-      <w:r>
-        <w:rPr>
-          <w:sz w:val="28"/>
-          <w:szCs w:val="28"/>
-          <w:vertAlign w:val="subscript"/>
-        </w:rPr>
-        <w:t>n</w:t>
-      </w:r>
-      <w:proofErr w:type="spellEnd"/>
-      <w:r>
-        <w:rPr>
-          <w:sz w:val="28"/>
-          <w:szCs w:val="28"/>
-        </w:rPr>
-        <w:t xml:space="preserve">(x) — эмпирическая частота (число элементов выборки, </w:t>
+      <m:oMath>
+        <m:r>
+          <w:rPr>
+            <w:rFonts w:ascii="Cambria Math" w:hAnsi="Cambria Math"/>
+            <w:sz w:val="28"/>
+            <w:szCs w:val="28"/>
+          </w:rPr>
+          <m:t>N</m:t>
+        </m:r>
+        <m:r>
+          <m:rPr>
+            <m:nor/>
+          </m:rPr>
+          <w:rPr>
+            <w:rFonts w:ascii="Cambria Math" w:hAnsi="Cambria Math"/>
+            <w:sz w:val="28"/>
+            <w:szCs w:val="28"/>
+            <w:vertAlign w:val="subscript"/>
+          </w:rPr>
+          <m:t>n</m:t>
+        </m:r>
+        <m:r>
+          <w:rPr>
+            <w:rFonts w:ascii="Cambria Math" w:hAnsi="Cambria Math"/>
+            <w:sz w:val="28"/>
+            <w:szCs w:val="28"/>
+          </w:rPr>
+          <m:t>(x)</m:t>
+        </m:r>
+      </m:oMath>
+      <w:r>
+        <w:rPr>
+          <w:sz w:val="28"/>
+          <w:szCs w:val="28"/>
+        </w:rPr>
+        <w:t xml:space="preserve"> — эмпирическая частота (число элементов выборки, </w:t>
       </w:r>
       <w:r>
         <w:rPr>
@@ -5276,38 +5391,40 @@
         </w:rPr>
         <w:t xml:space="preserve">распределения называется функция </w:t>
       </w:r>
-      <w:r>
-        <w:rPr>
-          <w:i/>
-          <w:iCs/>
-          <w:sz w:val="28"/>
-          <w:szCs w:val="28"/>
-        </w:rPr>
-        <w:t>F</w:t>
-      </w:r>
-      <w:r>
-        <w:rPr>
-          <w:sz w:val="28"/>
-          <w:szCs w:val="28"/>
-        </w:rPr>
-        <w:t>ₙ(</w:t>
-      </w:r>
-      <w:r>
-        <w:rPr>
-          <w:i/>
-          <w:iCs/>
-          <w:sz w:val="28"/>
-          <w:szCs w:val="28"/>
-        </w:rPr>
-        <w:t>x</w:t>
-      </w:r>
-      <w:r>
-        <w:rPr>
-          <w:sz w:val="28"/>
-          <w:szCs w:val="28"/>
-        </w:rPr>
-        <w:t>)</w:t>
-      </w:r>
+      <m:oMath>
+        <m:r>
+          <w:rPr>
+            <w:rFonts w:ascii="Cambria Math" w:hAnsi="Cambria Math"/>
+            <w:sz w:val="28"/>
+            <w:szCs w:val="28"/>
+          </w:rPr>
+          <m:t>F</m:t>
+        </m:r>
+        <m:r>
+          <w:rPr>
+            <w:rFonts w:ascii="Cambria Math" w:hAnsi="Cambria Math"/>
+            <w:sz w:val="28"/>
+            <w:szCs w:val="28"/>
+          </w:rPr>
+          <m:t>ₙ(</m:t>
+        </m:r>
+        <m:r>
+          <w:rPr>
+            <w:rFonts w:ascii="Cambria Math" w:hAnsi="Cambria Math"/>
+            <w:sz w:val="28"/>
+            <w:szCs w:val="28"/>
+          </w:rPr>
+          <m:t>x</m:t>
+        </m:r>
+        <m:r>
+          <w:rPr>
+            <w:rFonts w:ascii="Cambria Math" w:hAnsi="Cambria Math"/>
+            <w:sz w:val="28"/>
+            <w:szCs w:val="28"/>
+          </w:rPr>
+          <m:t>)</m:t>
+        </m:r>
+      </m:oMath>
       <w:r>
         <w:rPr>
           <w:sz w:val="28"/>
@@ -5355,40 +5472,44 @@
           <w:sz w:val="28"/>
           <w:szCs w:val="28"/>
         </w:rPr>
-        <w:t xml:space="preserve"> числа элементов выборки X</w:t>
-      </w:r>
-      <w:r>
-        <w:rPr>
-          <w:sz w:val="28"/>
-          <w:szCs w:val="28"/>
-          <w:vertAlign w:val="subscript"/>
-        </w:rPr>
-        <w:t>1</w:t>
-      </w:r>
-      <w:r>
-        <w:rPr>
-          <w:sz w:val="28"/>
-          <w:szCs w:val="28"/>
-        </w:rPr>
-        <w:t xml:space="preserve">, …, </w:t>
-      </w:r>
-      <w:proofErr w:type="spellStart"/>
-      <w:r>
-        <w:rPr>
-          <w:sz w:val="28"/>
-          <w:szCs w:val="28"/>
-        </w:rPr>
-        <w:t>X</w:t>
-      </w:r>
-      <w:r>
-        <w:rPr>
-          <w:sz w:val="28"/>
-          <w:szCs w:val="28"/>
-          <w:vertAlign w:val="subscript"/>
-        </w:rPr>
-        <w:t>n</w:t>
-      </w:r>
-      <w:proofErr w:type="spellEnd"/>
+        <w:t xml:space="preserve"> числа элементов выборки </w:t>
+      </w:r>
+      <m:oMath>
+        <m:r>
+          <w:rPr>
+            <w:rFonts w:ascii="Cambria Math" w:hAnsi="Cambria Math"/>
+            <w:sz w:val="28"/>
+            <w:szCs w:val="28"/>
+          </w:rPr>
+          <m:t>X</m:t>
+        </m:r>
+        <m:r>
+          <w:rPr>
+            <w:rFonts w:ascii="Cambria Math" w:hAnsi="Cambria Math"/>
+            <w:sz w:val="28"/>
+            <w:szCs w:val="28"/>
+            <w:vertAlign w:val="subscript"/>
+          </w:rPr>
+          <m:t>1</m:t>
+        </m:r>
+        <m:r>
+          <w:rPr>
+            <w:rFonts w:ascii="Cambria Math" w:hAnsi="Cambria Math"/>
+            <w:sz w:val="28"/>
+            <w:szCs w:val="28"/>
+          </w:rPr>
+          <m:t>, …, X</m:t>
+        </m:r>
+        <m:r>
+          <w:rPr>
+            <w:rFonts w:ascii="Cambria Math" w:hAnsi="Cambria Math"/>
+            <w:sz w:val="28"/>
+            <w:szCs w:val="28"/>
+            <w:vertAlign w:val="subscript"/>
+          </w:rPr>
+          <m:t>n</m:t>
+        </m:r>
+      </m:oMath>
       <w:r>
         <w:rPr>
           <w:sz w:val="28"/>
@@ -5900,8 +6021,34 @@
           <w:szCs w:val="28"/>
         </w:rPr>
         <w:tab/>
-        <w:t>Fₙ(x) является кусочно-постоянной (ступенчатой) функцией, принимающей значения на отрезке [0; 1]</w:t>
-      </w:r>
+      </w:r>
+      <m:oMath>
+        <m:r>
+          <w:rPr>
+            <w:rFonts w:ascii="Cambria Math" w:hAnsi="Cambria Math"/>
+            <w:sz w:val="28"/>
+            <w:szCs w:val="28"/>
+          </w:rPr>
+          <m:t>Fₙ(x)</m:t>
+        </m:r>
+      </m:oMath>
+      <w:r>
+        <w:rPr>
+          <w:sz w:val="28"/>
+          <w:szCs w:val="28"/>
+        </w:rPr>
+        <w:t xml:space="preserve"> является кусочно-постоянной (ступенчатой) функцией, принимающей значения на отрезке </w:t>
+      </w:r>
+      <m:oMath>
+        <m:r>
+          <w:rPr>
+            <w:rFonts w:ascii="Cambria Math" w:hAnsi="Cambria Math"/>
+            <w:sz w:val="28"/>
+            <w:szCs w:val="28"/>
+          </w:rPr>
+          <m:t>[0; 1]</m:t>
+        </m:r>
+      </m:oMath>
       <w:r>
         <w:rPr>
           <w:sz w:val="28"/>
@@ -5942,8 +6089,35 @@
           <w:sz w:val="28"/>
           <w:szCs w:val="28"/>
         </w:rPr>
-        <w:t>ножество возможных значений Fₙ(x): 0, 1/n, 2/n, …, 1</w:t>
-      </w:r>
+        <w:t xml:space="preserve">ножество возможных значений </w:t>
+      </w:r>
+      <m:oMath>
+        <m:r>
+          <w:rPr>
+            <w:rFonts w:ascii="Cambria Math" w:hAnsi="Cambria Math"/>
+            <w:sz w:val="28"/>
+            <w:szCs w:val="28"/>
+          </w:rPr>
+          <m:t>Fₙ(x)</m:t>
+        </m:r>
+      </m:oMath>
+      <w:r>
+        <w:rPr>
+          <w:sz w:val="28"/>
+          <w:szCs w:val="28"/>
+        </w:rPr>
+        <w:t xml:space="preserve">: </w:t>
+      </w:r>
+      <m:oMath>
+        <m:r>
+          <w:rPr>
+            <w:rFonts w:ascii="Cambria Math" w:hAnsi="Cambria Math"/>
+            <w:sz w:val="28"/>
+            <w:szCs w:val="28"/>
+          </w:rPr>
+          <m:t>0, 1/n, 2/n, …, 1</m:t>
+        </m:r>
+      </m:oMath>
       <w:r>
         <w:rPr>
           <w:sz w:val="28"/>
@@ -5986,38 +6160,67 @@
         </w:rPr>
         <w:t xml:space="preserve"> каждой точке </w:t>
       </w:r>
-      <w:proofErr w:type="spellStart"/>
-      <w:r>
-        <w:rPr>
-          <w:sz w:val="28"/>
-          <w:szCs w:val="28"/>
-        </w:rPr>
-        <w:t>x₍m</w:t>
-      </w:r>
-      <w:proofErr w:type="spellEnd"/>
-      <w:r>
-        <w:rPr>
-          <w:sz w:val="28"/>
-          <w:szCs w:val="28"/>
-        </w:rPr>
-        <w:t xml:space="preserve">₎ функция имеет скачок величиной nₘ/n, где nₘ — число совпадающих элементов выборки, равных </w:t>
-      </w:r>
-      <w:proofErr w:type="spellStart"/>
-      <w:r>
-        <w:rPr>
-          <w:sz w:val="28"/>
-          <w:szCs w:val="28"/>
-        </w:rPr>
-        <w:t>x₍m</w:t>
-      </w:r>
-      <w:proofErr w:type="spellEnd"/>
-      <w:r>
-        <w:rPr>
-          <w:sz w:val="28"/>
-          <w:szCs w:val="28"/>
-        </w:rPr>
-        <w:t>₎</w:t>
-      </w:r>
+      <m:oMath>
+        <m:r>
+          <w:rPr>
+            <w:rFonts w:ascii="Cambria Math" w:hAnsi="Cambria Math"/>
+            <w:sz w:val="28"/>
+            <w:szCs w:val="28"/>
+          </w:rPr>
+          <m:t>x₍m₎</m:t>
+        </m:r>
+      </m:oMath>
+      <w:r>
+        <w:rPr>
+          <w:sz w:val="28"/>
+          <w:szCs w:val="28"/>
+        </w:rPr>
+        <w:t xml:space="preserve"> функция имеет скачок величиной </w:t>
+      </w:r>
+      <m:oMath>
+        <m:r>
+          <w:rPr>
+            <w:rFonts w:ascii="Cambria Math" w:hAnsi="Cambria Math"/>
+            <w:sz w:val="28"/>
+            <w:szCs w:val="28"/>
+          </w:rPr>
+          <m:t>nₘ/n</m:t>
+        </m:r>
+      </m:oMath>
+      <w:r>
+        <w:rPr>
+          <w:sz w:val="28"/>
+          <w:szCs w:val="28"/>
+        </w:rPr>
+        <w:t xml:space="preserve">, где </w:t>
+      </w:r>
+      <m:oMath>
+        <m:r>
+          <w:rPr>
+            <w:rFonts w:ascii="Cambria Math" w:hAnsi="Cambria Math"/>
+            <w:sz w:val="28"/>
+            <w:szCs w:val="28"/>
+          </w:rPr>
+          <m:t>nₘ</m:t>
+        </m:r>
+      </m:oMath>
+      <w:r>
+        <w:rPr>
+          <w:sz w:val="28"/>
+          <w:szCs w:val="28"/>
+        </w:rPr>
+        <w:t xml:space="preserve"> — число совпадающих элементов выборки, равных </w:t>
+      </w:r>
+      <m:oMath>
+        <m:r>
+          <w:rPr>
+            <w:rFonts w:ascii="Cambria Math" w:hAnsi="Cambria Math"/>
+            <w:sz w:val="28"/>
+            <w:szCs w:val="28"/>
+          </w:rPr>
+          <m:t>x₍m₎</m:t>
+        </m:r>
+      </m:oMath>
       <w:r>
         <w:rPr>
           <w:sz w:val="28"/>
@@ -6058,8 +6261,52 @@
           <w:sz w:val="28"/>
           <w:szCs w:val="28"/>
         </w:rPr>
-        <w:t>ри n → ∞ эмпирическая функция распределения сходится по вероятности к теоретической: Fₙ(x) →Fₓ(x) для любого x</w:t>
-      </w:r>
+        <w:t xml:space="preserve">ри </w:t>
+      </w:r>
+      <m:oMath>
+        <m:r>
+          <w:rPr>
+            <w:rFonts w:ascii="Cambria Math" w:hAnsi="Cambria Math"/>
+            <w:sz w:val="28"/>
+            <w:szCs w:val="28"/>
+          </w:rPr>
+          <m:t>n → ∞</m:t>
+        </m:r>
+      </m:oMath>
+      <w:r>
+        <w:rPr>
+          <w:sz w:val="28"/>
+          <w:szCs w:val="28"/>
+        </w:rPr>
+        <w:t xml:space="preserve"> эмпирическая функция распределения сходится по вероятности к теоретической: </w:t>
+      </w:r>
+      <m:oMath>
+        <m:r>
+          <w:rPr>
+            <w:rFonts w:ascii="Cambria Math" w:hAnsi="Cambria Math"/>
+            <w:sz w:val="28"/>
+            <w:szCs w:val="28"/>
+          </w:rPr>
+          <m:t>Fₙ(x) →Fₓ(x)</m:t>
+        </m:r>
+      </m:oMath>
+      <w:r>
+        <w:rPr>
+          <w:sz w:val="28"/>
+          <w:szCs w:val="28"/>
+        </w:rPr>
+        <w:t xml:space="preserve"> для любого </w:t>
+      </w:r>
+      <m:oMath>
+        <m:r>
+          <w:rPr>
+            <w:rFonts w:ascii="Cambria Math" w:hAnsi="Cambria Math"/>
+            <w:sz w:val="28"/>
+            <w:szCs w:val="28"/>
+          </w:rPr>
+          <m:t>x</m:t>
+        </m:r>
+      </m:oMath>
     </w:p>
     <w:p>
       <w:pPr>
@@ -6092,7 +6339,58 @@
           <w:sz w:val="28"/>
           <w:szCs w:val="28"/>
         </w:rPr>
-        <w:t>. Отклонение ЭФР Fₙ(x) от теоретической функции Fₓ(x) с вероятностью 1 стремится к нулю равномерно по всей числовой оси</w:t>
+        <w:t xml:space="preserve">. Отклонение ЭФР </w:t>
+      </w:r>
+      <m:oMath>
+        <m:r>
+          <w:rPr>
+            <w:rFonts w:ascii="Cambria Math" w:hAnsi="Cambria Math"/>
+            <w:sz w:val="28"/>
+            <w:szCs w:val="28"/>
+          </w:rPr>
+          <m:t>Fₙ(x)</m:t>
+        </m:r>
+      </m:oMath>
+      <w:r>
+        <w:rPr>
+          <w:sz w:val="28"/>
+          <w:szCs w:val="28"/>
+        </w:rPr>
+        <w:t xml:space="preserve"> от теоретической функции </w:t>
+      </w:r>
+      <m:oMath>
+        <m:r>
+          <w:rPr>
+            <w:rFonts w:ascii="Cambria Math" w:hAnsi="Cambria Math"/>
+            <w:sz w:val="28"/>
+            <w:szCs w:val="28"/>
+          </w:rPr>
+          <m:t>Fₓ(x)</m:t>
+        </m:r>
+      </m:oMath>
+      <w:r>
+        <w:rPr>
+          <w:sz w:val="28"/>
+          <w:szCs w:val="28"/>
+        </w:rPr>
+        <w:t xml:space="preserve"> с вероятностью </w:t>
+      </w:r>
+      <m:oMath>
+        <m:r>
+          <w:rPr>
+            <w:rFonts w:ascii="Cambria Math" w:hAnsi="Cambria Math"/>
+            <w:sz w:val="28"/>
+            <w:szCs w:val="28"/>
+          </w:rPr>
+          <m:t>1</m:t>
+        </m:r>
+      </m:oMath>
+      <w:r>
+        <w:rPr>
+          <w:sz w:val="28"/>
+          <w:szCs w:val="28"/>
+        </w:rPr>
+        <w:t xml:space="preserve"> стремится к нулю равномерно по всей числовой оси</w:t>
       </w:r>
       <w:r>
         <w:rPr>
@@ -6333,8 +6631,18 @@
           <w:sz w:val="28"/>
           <w:szCs w:val="28"/>
         </w:rPr>
-        <w:t>порядочить элементы выборки по возрастанию, получив вариационный ряд x₍₁₎ ≤ x₍₂₎ ≤ … ≤ x₍ₙ₎</w:t>
-      </w:r>
+        <w:t xml:space="preserve">порядочить элементы выборки по возрастанию, получив вариационный ряд </w:t>
+      </w:r>
+      <m:oMath>
+        <m:r>
+          <w:rPr>
+            <w:rFonts w:ascii="Cambria Math" w:hAnsi="Cambria Math"/>
+            <w:sz w:val="28"/>
+            <w:szCs w:val="28"/>
+          </w:rPr>
+          <m:t>x₍₁₎ ≤ x₍₂₎ ≤ … ≤ x₍ₙ₎</m:t>
+        </m:r>
+      </m:oMath>
       <w:r>
         <w:rPr>
           <w:sz w:val="28"/>
@@ -6375,7 +6683,24 @@
           <w:sz w:val="28"/>
           <w:szCs w:val="28"/>
         </w:rPr>
-        <w:t>ля каждого фиксированного x определить количество Nₙ(x) элементов выборки, строго меньших x</w:t>
+        <w:t xml:space="preserve">ля каждого фиксированного x определить количество </w:t>
+      </w:r>
+      <m:oMath>
+        <m:r>
+          <w:rPr>
+            <w:rFonts w:ascii="Cambria Math" w:hAnsi="Cambria Math"/>
+            <w:sz w:val="28"/>
+            <w:szCs w:val="28"/>
+          </w:rPr>
+          <m:t>Nₙ(x)</m:t>
+        </m:r>
+      </m:oMath>
+      <w:r>
+        <w:rPr>
+          <w:sz w:val="28"/>
+          <w:szCs w:val="28"/>
+        </w:rPr>
+        <w:t xml:space="preserve"> элементов выборки, строго меньших x</w:t>
       </w:r>
       <w:r>
         <w:rPr>
@@ -6417,8 +6742,18 @@
           <w:sz w:val="28"/>
           <w:szCs w:val="28"/>
         </w:rPr>
-        <w:t>ычислить значение эмпирической функции распределения по формуле Fₙ(x) = Nₙ(x) / n</w:t>
-      </w:r>
+        <w:t xml:space="preserve">ычислить значение эмпирической функции распределения по формуле </w:t>
+      </w:r>
+      <m:oMath>
+        <m:r>
+          <w:rPr>
+            <w:rFonts w:ascii="Cambria Math" w:hAnsi="Cambria Math"/>
+            <w:sz w:val="28"/>
+            <w:szCs w:val="28"/>
+          </w:rPr>
+          <m:t>Fₙ(x) = Nₙ(x) / n</m:t>
+        </m:r>
+      </m:oMath>
       <w:r>
         <w:rPr>
           <w:sz w:val="28"/>
@@ -6803,7 +7138,24 @@
           <w:sz w:val="28"/>
           <w:szCs w:val="28"/>
         </w:rPr>
-        <w:t xml:space="preserve"> размером 10, 100 и 200 элементов из исходной выборки X </w:t>
+        <w:t xml:space="preserve"> размером 10, 100 и 200 элементов из исходной выборки </w:t>
+      </w:r>
+      <m:oMath>
+        <m:r>
+          <w:rPr>
+            <w:rFonts w:ascii="Cambria Math" w:hAnsi="Cambria Math"/>
+            <w:sz w:val="28"/>
+            <w:szCs w:val="28"/>
+          </w:rPr>
+          <m:t>X</m:t>
+        </m:r>
+      </m:oMath>
+      <w:r>
+        <w:rPr>
+          <w:sz w:val="28"/>
+          <w:szCs w:val="28"/>
+        </w:rPr>
+        <w:t xml:space="preserve"> </w:t>
       </w:r>
       <w:r>
         <w:rPr>
@@ -6811,23 +7163,24 @@
           <w:szCs w:val="28"/>
         </w:rPr>
         <w:lastRenderedPageBreak/>
-        <w:t xml:space="preserve">объёмом n = 300. Для каждой </w:t>
-      </w:r>
-      <w:proofErr w:type="spellStart"/>
-      <w:r>
-        <w:rPr>
-          <w:sz w:val="28"/>
-          <w:szCs w:val="28"/>
-        </w:rPr>
-        <w:t>подвыборки</w:t>
-      </w:r>
-      <w:proofErr w:type="spellEnd"/>
-      <w:r>
-        <w:rPr>
-          <w:sz w:val="28"/>
-          <w:szCs w:val="28"/>
-        </w:rPr>
-        <w:t xml:space="preserve"> построен ступенчатый график ЭФР совместно с теоретической функцией двойного гамма-распределения.</w:t>
+        <w:t xml:space="preserve">объёмом </w:t>
+      </w:r>
+      <m:oMath>
+        <m:r>
+          <w:rPr>
+            <w:rFonts w:ascii="Cambria Math" w:hAnsi="Cambria Math"/>
+            <w:sz w:val="28"/>
+            <w:szCs w:val="28"/>
+          </w:rPr>
+          <m:t>n = 300</m:t>
+        </m:r>
+      </m:oMath>
+      <w:r>
+        <w:rPr>
+          <w:sz w:val="28"/>
+          <w:szCs w:val="28"/>
+        </w:rPr>
+        <w:t>. Для каждой подвыборки построен ступенчатый график ЭФР совместно с теоретической функцией двойного гамма-распределения.</w:t>
       </w:r>
     </w:p>
     <w:p>
@@ -7318,7 +7671,58 @@
           <w:sz w:val="28"/>
           <w:szCs w:val="28"/>
         </w:rPr>
-        <w:t xml:space="preserve"> эмпирическая функция распределения заметно приближается к теоретической. При n = 10 ступени ЭФР крупные, кривая грубо аппроксимирует теоретическую; при n = 100 сходство становится отчётливым; при n = 200 ЭФР практически совпадает с теоретической функцией. Это согласуется с теоремой Гливенко.</w:t>
+        <w:t xml:space="preserve"> эмпирическая функция распределения заметно приближается к теоретической. При </w:t>
+      </w:r>
+      <m:oMath>
+        <m:r>
+          <w:rPr>
+            <w:rFonts w:ascii="Cambria Math" w:hAnsi="Cambria Math"/>
+            <w:sz w:val="28"/>
+            <w:szCs w:val="28"/>
+          </w:rPr>
+          <m:t>n = 10</m:t>
+        </m:r>
+      </m:oMath>
+      <w:r>
+        <w:rPr>
+          <w:sz w:val="28"/>
+          <w:szCs w:val="28"/>
+        </w:rPr>
+        <w:t xml:space="preserve"> ступени ЭФР крупные, кривая грубо аппроксимирует теоретическую; при </w:t>
+      </w:r>
+      <m:oMath>
+        <m:r>
+          <w:rPr>
+            <w:rFonts w:ascii="Cambria Math" w:hAnsi="Cambria Math"/>
+            <w:sz w:val="28"/>
+            <w:szCs w:val="28"/>
+          </w:rPr>
+          <m:t>n = 100</m:t>
+        </m:r>
+      </m:oMath>
+      <w:r>
+        <w:rPr>
+          <w:sz w:val="28"/>
+          <w:szCs w:val="28"/>
+        </w:rPr>
+        <w:t xml:space="preserve"> сходство становится отчётливым; при </w:t>
+      </w:r>
+      <m:oMath>
+        <m:r>
+          <w:rPr>
+            <w:rFonts w:ascii="Cambria Math" w:hAnsi="Cambria Math"/>
+            <w:sz w:val="28"/>
+            <w:szCs w:val="28"/>
+          </w:rPr>
+          <m:t>n = 200</m:t>
+        </m:r>
+      </m:oMath>
+      <w:r>
+        <w:rPr>
+          <w:sz w:val="28"/>
+          <w:szCs w:val="28"/>
+        </w:rPr>
+        <w:t xml:space="preserve"> ЭФР практически совпадает с теоретической функцией. Это согласуется с теоремой Гливенко.</w:t>
       </w:r>
     </w:p>
     <w:p>
@@ -7355,7 +7759,24 @@
           <w:sz w:val="28"/>
           <w:szCs w:val="28"/>
         </w:rPr>
-        <w:t>. По форме ЭФР на рисунке 3 (n = 200) можно установить:</w:t>
+        <w:t>. По форме ЭФР на рисунке 3 (</w:t>
+      </w:r>
+      <m:oMath>
+        <m:r>
+          <w:rPr>
+            <w:rFonts w:ascii="Cambria Math" w:hAnsi="Cambria Math"/>
+            <w:sz w:val="28"/>
+            <w:szCs w:val="28"/>
+          </w:rPr>
+          <m:t>n = 200</m:t>
+        </m:r>
+      </m:oMath>
+      <w:r>
+        <w:rPr>
+          <w:sz w:val="28"/>
+          <w:szCs w:val="28"/>
+        </w:rPr>
+        <w:t>) можно установить:</w:t>
       </w:r>
     </w:p>
     <w:p>
@@ -7393,24 +7814,35 @@
           <w:sz w:val="28"/>
           <w:szCs w:val="28"/>
         </w:rPr>
-        <w:t xml:space="preserve">очка перегиба ЭФР расположена вблизи x ≈ 0,8, что позволяет предположить значение параметра смещения </w:t>
-      </w:r>
-      <w:proofErr w:type="spellStart"/>
-      <w:r>
-        <w:rPr>
-          <w:sz w:val="28"/>
-          <w:szCs w:val="28"/>
-        </w:rPr>
-        <w:t>loc</w:t>
-      </w:r>
-      <w:proofErr w:type="spellEnd"/>
-      <w:r>
-        <w:rPr>
-          <w:sz w:val="28"/>
-          <w:szCs w:val="28"/>
-        </w:rPr>
-        <w:t> ≈ 0,8</w:t>
-      </w:r>
+        <w:t xml:space="preserve">очка перегиба ЭФР расположена вблизи </w:t>
+      </w:r>
+      <m:oMath>
+        <m:r>
+          <w:rPr>
+            <w:rFonts w:ascii="Cambria Math" w:hAnsi="Cambria Math"/>
+            <w:sz w:val="28"/>
+            <w:szCs w:val="28"/>
+          </w:rPr>
+          <m:t>x ≈ 0,8</m:t>
+        </m:r>
+      </m:oMath>
+      <w:r>
+        <w:rPr>
+          <w:sz w:val="28"/>
+          <w:szCs w:val="28"/>
+        </w:rPr>
+        <w:t xml:space="preserve">, что позволяет предположить значение параметра смещения </w:t>
+      </w:r>
+      <m:oMath>
+        <m:r>
+          <w:rPr>
+            <w:rFonts w:ascii="Cambria Math" w:hAnsi="Cambria Math"/>
+            <w:sz w:val="28"/>
+            <w:szCs w:val="28"/>
+          </w:rPr>
+          <m:t>loc ≈ 0,8</m:t>
+        </m:r>
+      </m:oMath>
       <w:r>
         <w:rPr>
           <w:sz w:val="28"/>
@@ -7456,21 +7888,39 @@
         </w:rPr>
         <w:t xml:space="preserve">ладкая, без резких скачков, форма кривой характерна для параметра формы </w:t>
       </w:r>
-      <w:proofErr w:type="gramStart"/>
-      <w:r>
-        <w:rPr>
-          <w:sz w:val="28"/>
-          <w:szCs w:val="28"/>
-        </w:rPr>
-        <w:t>α &gt;</w:t>
-      </w:r>
-      <w:proofErr w:type="gramEnd"/>
-      <w:r>
-        <w:rPr>
-          <w:sz w:val="28"/>
-          <w:szCs w:val="28"/>
-        </w:rPr>
-        <w:t> 1 (при α ≤ 1 плотность была бы J-образной).</w:t>
+      <m:oMath>
+        <m:r>
+          <w:rPr>
+            <w:rFonts w:ascii="Cambria Math" w:hAnsi="Cambria Math"/>
+            <w:sz w:val="28"/>
+            <w:szCs w:val="28"/>
+          </w:rPr>
+          <m:t>α &gt; 1</m:t>
+        </m:r>
+      </m:oMath>
+      <w:r>
+        <w:rPr>
+          <w:sz w:val="28"/>
+          <w:szCs w:val="28"/>
+        </w:rPr>
+        <w:t xml:space="preserve"> (при </w:t>
+      </w:r>
+      <m:oMath>
+        <m:r>
+          <w:rPr>
+            <w:rFonts w:ascii="Cambria Math" w:hAnsi="Cambria Math"/>
+            <w:sz w:val="28"/>
+            <w:szCs w:val="28"/>
+          </w:rPr>
+          <m:t>α ≤ 1</m:t>
+        </m:r>
+      </m:oMath>
+      <w:r>
+        <w:rPr>
+          <w:sz w:val="28"/>
+          <w:szCs w:val="28"/>
+        </w:rPr>
+        <w:t xml:space="preserve"> плотность была бы J-образной).</w:t>
       </w:r>
     </w:p>
     <w:p>
@@ -7498,7 +7948,41 @@
           <w:sz w:val="28"/>
           <w:szCs w:val="28"/>
         </w:rPr>
-        <w:t xml:space="preserve">Таким образом, визуальный анализ ЭФР позволяет предположить параметры двойного гамма-распределения: α ≈ 8, loc ≈ 0,8. </w:t>
+        <w:t xml:space="preserve">Таким образом, визуальный анализ ЭФР позволяет предположить параметры двойного гамма-распределения: </w:t>
+      </w:r>
+      <m:oMath>
+        <m:r>
+          <w:rPr>
+            <w:rFonts w:ascii="Cambria Math" w:hAnsi="Cambria Math"/>
+            <w:sz w:val="28"/>
+            <w:szCs w:val="28"/>
+          </w:rPr>
+          <m:t>α ≈ 8</m:t>
+        </m:r>
+      </m:oMath>
+      <w:r>
+        <w:rPr>
+          <w:sz w:val="28"/>
+          <w:szCs w:val="28"/>
+        </w:rPr>
+        <w:t xml:space="preserve">, </w:t>
+      </w:r>
+      <m:oMath>
+        <m:r>
+          <w:rPr>
+            <w:rFonts w:ascii="Cambria Math" w:hAnsi="Cambria Math"/>
+            <w:sz w:val="28"/>
+            <w:szCs w:val="28"/>
+          </w:rPr>
+          <m:t>loc ≈ 0,8</m:t>
+        </m:r>
+      </m:oMath>
+      <w:r>
+        <w:rPr>
+          <w:sz w:val="28"/>
+          <w:szCs w:val="28"/>
+        </w:rPr>
+        <w:t xml:space="preserve">. </w:t>
       </w:r>
     </w:p>
     <w:p>
@@ -7699,111 +8183,169 @@
         </w:rPr>
         <w:t xml:space="preserve">Гистограммой называют ступенчатую фигуру, построенную следующим образом: на каждом интервале </w:t>
       </w:r>
-      <w:r>
-        <w:rPr>
-          <w:sz w:val="28"/>
-          <w:szCs w:val="28"/>
-        </w:rPr>
-        <w:sym w:font="Symbol" w:char="F044"/>
-      </w:r>
-      <w:r>
-        <w:rPr>
-          <w:sz w:val="28"/>
-          <w:szCs w:val="28"/>
-        </w:rPr>
-        <w:t>i = (</w:t>
-      </w:r>
-      <w:r>
-        <w:rPr>
-          <w:sz w:val="28"/>
-          <w:szCs w:val="28"/>
-        </w:rPr>
-        <w:sym w:font="Symbol" w:char="F061"/>
-      </w:r>
-      <w:r>
-        <w:rPr>
-          <w:sz w:val="28"/>
-          <w:szCs w:val="28"/>
-          <w:vertAlign w:val="subscript"/>
-        </w:rPr>
-        <w:t>i –1</w:t>
-      </w:r>
-      <w:r>
-        <w:rPr>
-          <w:sz w:val="28"/>
-          <w:szCs w:val="28"/>
-        </w:rPr>
-        <w:t xml:space="preserve"> ; </w:t>
-      </w:r>
-      <w:r>
-        <w:rPr>
-          <w:sz w:val="28"/>
-          <w:szCs w:val="28"/>
-        </w:rPr>
-        <w:sym w:font="Symbol" w:char="F061"/>
-      </w:r>
-      <w:r>
-        <w:rPr>
-          <w:sz w:val="28"/>
-          <w:szCs w:val="28"/>
-          <w:vertAlign w:val="subscript"/>
-        </w:rPr>
-        <w:t>i</w:t>
-      </w:r>
-      <w:r>
-        <w:rPr>
-          <w:sz w:val="28"/>
-          <w:szCs w:val="28"/>
-        </w:rPr>
-        <w:t>), как на основании длиной h =|</w:t>
-      </w:r>
-      <w:r>
-        <w:rPr>
-          <w:sz w:val="28"/>
-          <w:szCs w:val="28"/>
-        </w:rPr>
-        <w:sym w:font="Symbol" w:char="F044"/>
-      </w:r>
-      <w:r>
-        <w:rPr>
-          <w:sz w:val="28"/>
-          <w:szCs w:val="28"/>
-          <w:vertAlign w:val="subscript"/>
-        </w:rPr>
-        <w:t>i</w:t>
-      </w:r>
-      <w:r>
-        <w:rPr>
-          <w:sz w:val="28"/>
-          <w:szCs w:val="28"/>
-        </w:rPr>
-        <w:t>|, строят прямоугольник с высотой, равной n</w:t>
-      </w:r>
-      <w:r>
-        <w:rPr>
-          <w:sz w:val="28"/>
-          <w:szCs w:val="28"/>
-          <w:vertAlign w:val="subscript"/>
-          <w:lang w:val="en-US"/>
-        </w:rPr>
-        <w:t>i</w:t>
-      </w:r>
-      <w:r>
-        <w:rPr>
-          <w:sz w:val="28"/>
-          <w:szCs w:val="28"/>
-        </w:rPr>
-        <w:t>/</w:t>
-      </w:r>
-      <w:proofErr w:type="spellStart"/>
-      <w:r>
-        <w:rPr>
-          <w:sz w:val="28"/>
-          <w:szCs w:val="28"/>
-        </w:rPr>
-        <w:t>nh</w:t>
-      </w:r>
-      <w:proofErr w:type="spellEnd"/>
+      <m:oMath>
+        <m:r>
+          <w:rPr>
+            <w:rFonts w:ascii="Cambria Math" w:hAnsi="Cambria Math"/>
+            <w:i/>
+            <w:sz w:val="28"/>
+            <w:szCs w:val="28"/>
+          </w:rPr>
+          <w:sym w:font="Symbol" w:char="F044"/>
+        </m:r>
+        <m:r>
+          <m:rPr>
+            <m:nor/>
+          </m:rPr>
+          <w:rPr>
+            <w:rFonts w:ascii="Cambria Math" w:hAnsi="Cambria Math"/>
+            <w:sz w:val="22"/>
+            <w:szCs w:val="22"/>
+          </w:rPr>
+          <m:t>i</m:t>
+        </m:r>
+        <m:r>
+          <w:rPr>
+            <w:rFonts w:ascii="Cambria Math" w:hAnsi="Cambria Math"/>
+            <w:sz w:val="28"/>
+            <w:szCs w:val="28"/>
+          </w:rPr>
+          <m:t xml:space="preserve"> = (</m:t>
+        </m:r>
+        <m:r>
+          <w:rPr>
+            <w:rFonts w:ascii="Cambria Math" w:hAnsi="Cambria Math"/>
+            <w:i/>
+            <w:sz w:val="28"/>
+            <w:szCs w:val="28"/>
+          </w:rPr>
+          <w:sym w:font="Symbol" w:char="F061"/>
+        </m:r>
+        <m:r>
+          <w:rPr>
+            <w:rFonts w:ascii="Cambria Math" w:hAnsi="Cambria Math"/>
+            <w:sz w:val="28"/>
+            <w:szCs w:val="28"/>
+            <w:vertAlign w:val="subscript"/>
+          </w:rPr>
+          <m:t>i –1</m:t>
+        </m:r>
+        <m:r>
+          <w:rPr>
+            <w:rFonts w:ascii="Cambria Math" w:hAnsi="Cambria Math"/>
+            <w:sz w:val="28"/>
+            <w:szCs w:val="28"/>
+          </w:rPr>
+          <m:t xml:space="preserve"> ; </m:t>
+        </m:r>
+        <m:r>
+          <w:rPr>
+            <w:rFonts w:ascii="Cambria Math" w:hAnsi="Cambria Math"/>
+            <w:i/>
+            <w:sz w:val="28"/>
+            <w:szCs w:val="28"/>
+          </w:rPr>
+          <w:sym w:font="Symbol" w:char="F061"/>
+        </m:r>
+        <m:r>
+          <w:rPr>
+            <w:rFonts w:ascii="Cambria Math" w:hAnsi="Cambria Math"/>
+            <w:sz w:val="28"/>
+            <w:szCs w:val="28"/>
+            <w:vertAlign w:val="subscript"/>
+          </w:rPr>
+          <m:t>i</m:t>
+        </m:r>
+        <m:r>
+          <w:rPr>
+            <w:rFonts w:ascii="Cambria Math" w:hAnsi="Cambria Math"/>
+            <w:sz w:val="28"/>
+            <w:szCs w:val="28"/>
+          </w:rPr>
+          <m:t>)</m:t>
+        </m:r>
+      </m:oMath>
+      <w:r>
+        <w:rPr>
+          <w:sz w:val="28"/>
+          <w:szCs w:val="28"/>
+        </w:rPr>
+        <w:t xml:space="preserve">, как на основании длиной </w:t>
+      </w:r>
+      <m:oMath>
+        <m:r>
+          <w:rPr>
+            <w:rFonts w:ascii="Cambria Math" w:hAnsi="Cambria Math"/>
+            <w:sz w:val="28"/>
+            <w:szCs w:val="28"/>
+          </w:rPr>
+          <m:t>h =|</m:t>
+        </m:r>
+        <m:r>
+          <w:rPr>
+            <w:rFonts w:ascii="Cambria Math" w:hAnsi="Cambria Math"/>
+            <w:i/>
+            <w:sz w:val="28"/>
+            <w:szCs w:val="28"/>
+          </w:rPr>
+          <w:sym w:font="Symbol" w:char="F044"/>
+        </m:r>
+        <m:r>
+          <w:rPr>
+            <w:rFonts w:ascii="Cambria Math" w:hAnsi="Cambria Math"/>
+            <w:sz w:val="28"/>
+            <w:szCs w:val="28"/>
+            <w:vertAlign w:val="subscript"/>
+          </w:rPr>
+          <m:t>i</m:t>
+        </m:r>
+        <m:r>
+          <w:rPr>
+            <w:rFonts w:ascii="Cambria Math" w:hAnsi="Cambria Math"/>
+            <w:sz w:val="28"/>
+            <w:szCs w:val="28"/>
+          </w:rPr>
+          <m:t>|</m:t>
+        </m:r>
+      </m:oMath>
+      <w:r>
+        <w:rPr>
+          <w:sz w:val="28"/>
+          <w:szCs w:val="28"/>
+        </w:rPr>
+        <w:t xml:space="preserve">, строят прямоугольник с высотой, равной </w:t>
+      </w:r>
+      <m:oMath>
+        <m:r>
+          <w:rPr>
+            <w:rFonts w:ascii="Cambria Math" w:hAnsi="Cambria Math"/>
+            <w:sz w:val="28"/>
+            <w:szCs w:val="28"/>
+          </w:rPr>
+          <m:t>n</m:t>
+        </m:r>
+        <m:r>
+          <m:rPr>
+            <m:nor/>
+          </m:rPr>
+          <w:rPr>
+            <w:rFonts w:ascii="Cambria Math" w:hAnsi="Cambria Math"/>
+            <w:sz w:val="28"/>
+            <w:szCs w:val="28"/>
+            <w:vertAlign w:val="subscript"/>
+            <w:lang w:val="en-US"/>
+          </w:rPr>
+          <m:t>i</m:t>
+        </m:r>
+        <m:r>
+          <w:rPr>
+            <w:rFonts w:ascii="Cambria Math" w:hAnsi="Cambria Math"/>
+            <w:sz w:val="28"/>
+            <w:szCs w:val="28"/>
+          </w:rPr>
+          <m:t>/nh</m:t>
+        </m:r>
+      </m:oMath>
       <w:r>
         <w:rPr>
           <w:sz w:val="28"/>
@@ -7811,45 +8353,72 @@
         </w:rPr>
         <w:t xml:space="preserve"> , так что площадь </w:t>
       </w:r>
-      <w:proofErr w:type="spellStart"/>
-      <w:r>
-        <w:rPr>
-          <w:sz w:val="28"/>
-          <w:szCs w:val="28"/>
-        </w:rPr>
-        <w:t>S</w:t>
-      </w:r>
-      <w:r>
-        <w:rPr>
-          <w:sz w:val="28"/>
-          <w:szCs w:val="28"/>
-          <w:vertAlign w:val="subscript"/>
-        </w:rPr>
-        <w:t>i</w:t>
-      </w:r>
-      <w:proofErr w:type="spellEnd"/>
-      <w:r>
-        <w:rPr>
-          <w:sz w:val="28"/>
-          <w:szCs w:val="28"/>
-        </w:rPr>
-        <w:t xml:space="preserve"> каждого такого прямоугольника оказывается равной относительной частоте n</w:t>
-      </w:r>
-      <w:r>
-        <w:rPr>
-          <w:sz w:val="28"/>
-          <w:szCs w:val="28"/>
-          <w:vertAlign w:val="subscript"/>
-          <w:lang w:val="en-US"/>
-        </w:rPr>
-        <w:t>i</w:t>
-      </w:r>
-      <w:r>
-        <w:rPr>
-          <w:sz w:val="28"/>
-          <w:szCs w:val="28"/>
-        </w:rPr>
-        <w:t>/n числа</w:t>
+      <m:oMath>
+        <m:r>
+          <w:rPr>
+            <w:rFonts w:ascii="Cambria Math" w:hAnsi="Cambria Math"/>
+            <w:sz w:val="28"/>
+            <w:szCs w:val="28"/>
+          </w:rPr>
+          <m:t>S</m:t>
+        </m:r>
+        <m:r>
+          <m:rPr>
+            <m:nor/>
+          </m:rPr>
+          <w:rPr>
+            <w:rFonts w:ascii="Cambria Math" w:hAnsi="Cambria Math"/>
+            <w:sz w:val="28"/>
+            <w:szCs w:val="28"/>
+            <w:vertAlign w:val="subscript"/>
+          </w:rPr>
+          <m:t>i</m:t>
+        </m:r>
+      </m:oMath>
+      <w:r>
+        <w:rPr>
+          <w:sz w:val="28"/>
+          <w:szCs w:val="28"/>
+        </w:rPr>
+        <w:t xml:space="preserve"> каждого такого прямоугольника оказывается равной относительной частоте </w:t>
+      </w:r>
+      <m:oMath>
+        <m:r>
+          <w:rPr>
+            <w:rFonts w:ascii="Cambria Math" w:hAnsi="Cambria Math"/>
+            <w:sz w:val="28"/>
+            <w:szCs w:val="28"/>
+          </w:rPr>
+          <m:t>n</m:t>
+        </m:r>
+        <m:r>
+          <m:rPr>
+            <m:nor/>
+          </m:rPr>
+          <w:rPr>
+            <w:rFonts w:ascii="Cambria Math" w:hAnsi="Cambria Math"/>
+            <w:sz w:val="28"/>
+            <w:szCs w:val="28"/>
+            <w:vertAlign w:val="subscript"/>
+            <w:lang w:val="en-US"/>
+          </w:rPr>
+          <m:t>i</m:t>
+        </m:r>
+        <m:r>
+          <w:rPr>
+            <w:rFonts w:ascii="Cambria Math" w:hAnsi="Cambria Math"/>
+            <w:sz w:val="28"/>
+            <w:szCs w:val="28"/>
+          </w:rPr>
+          <m:t>/n</m:t>
+        </m:r>
+      </m:oMath>
+      <w:r>
+        <w:rPr>
+          <w:sz w:val="28"/>
+          <w:szCs w:val="28"/>
+        </w:rPr>
+        <w:t xml:space="preserve"> числа</w:t>
       </w:r>
       <w:r>
         <w:rPr>
@@ -7865,58 +8434,93 @@
         </w:rPr>
         <w:t xml:space="preserve">элементов выборки, попавших в интервал </w:t>
       </w:r>
-      <w:r>
-        <w:rPr>
-          <w:sz w:val="28"/>
-          <w:szCs w:val="28"/>
-        </w:rPr>
-        <w:sym w:font="Symbol" w:char="F044"/>
-      </w:r>
-      <w:r>
-        <w:rPr>
-          <w:sz w:val="28"/>
-          <w:szCs w:val="28"/>
-          <w:vertAlign w:val="subscript"/>
-        </w:rPr>
-        <w:t>i</w:t>
-      </w:r>
-      <w:r>
-        <w:rPr>
-          <w:sz w:val="28"/>
-          <w:szCs w:val="28"/>
-        </w:rPr>
-        <w:t xml:space="preserve"> (i =1,…,k). Число </w:t>
-      </w:r>
-      <w:proofErr w:type="spellStart"/>
-      <w:r>
-        <w:rPr>
-          <w:sz w:val="28"/>
-          <w:szCs w:val="28"/>
-        </w:rPr>
-        <w:t>n</w:t>
-      </w:r>
-      <w:r>
-        <w:rPr>
-          <w:sz w:val="28"/>
-          <w:szCs w:val="28"/>
-          <w:vertAlign w:val="subscript"/>
-        </w:rPr>
-        <w:t>i</w:t>
-      </w:r>
-      <w:proofErr w:type="spellEnd"/>
-      <w:r>
-        <w:rPr>
-          <w:sz w:val="28"/>
-          <w:szCs w:val="28"/>
-        </w:rPr>
-        <w:t xml:space="preserve"> – частота </w:t>
-      </w:r>
-      <w:r>
-        <w:rPr>
-          <w:sz w:val="28"/>
-          <w:szCs w:val="28"/>
-        </w:rPr>
-        <w:br/>
+      <m:oMath>
+        <m:r>
+          <w:rPr>
+            <w:rFonts w:ascii="Cambria Math" w:hAnsi="Cambria Math"/>
+            <w:i/>
+            <w:sz w:val="28"/>
+            <w:szCs w:val="28"/>
+          </w:rPr>
+          <w:sym w:font="Symbol" w:char="F044"/>
+        </m:r>
+        <m:r>
+          <m:rPr>
+            <m:nor/>
+          </m:rPr>
+          <w:rPr>
+            <w:rFonts w:ascii="Cambria Math" w:hAnsi="Cambria Math"/>
+            <w:sz w:val="32"/>
+            <w:szCs w:val="32"/>
+            <w:vertAlign w:val="subscript"/>
+          </w:rPr>
+          <m:t>i</m:t>
+        </m:r>
+        <m:r>
+          <w:rPr>
+            <w:rFonts w:ascii="Cambria Math" w:hAnsi="Cambria Math"/>
+            <w:sz w:val="28"/>
+            <w:szCs w:val="28"/>
+          </w:rPr>
+          <m:t xml:space="preserve"> (i =1,…,k)</m:t>
+        </m:r>
+      </m:oMath>
+      <w:r>
+        <w:rPr>
+          <w:sz w:val="28"/>
+          <w:szCs w:val="28"/>
+        </w:rPr>
+        <w:t xml:space="preserve">. Число </w:t>
+      </w:r>
+      <m:oMath>
+        <m:r>
+          <w:rPr>
+            <w:rFonts w:ascii="Cambria Math" w:hAnsi="Cambria Math"/>
+            <w:sz w:val="28"/>
+            <w:szCs w:val="28"/>
+          </w:rPr>
+          <m:t>n</m:t>
+        </m:r>
+        <m:r>
+          <m:rPr>
+            <m:nor/>
+          </m:rPr>
+          <w:rPr>
+            <w:rFonts w:ascii="Cambria Math" w:hAnsi="Cambria Math"/>
+            <w:sz w:val="32"/>
+            <w:szCs w:val="32"/>
+            <w:vertAlign w:val="subscript"/>
+          </w:rPr>
+          <m:t>i</m:t>
+        </m:r>
+      </m:oMath>
+      <w:r>
+        <w:rPr>
+          <w:sz w:val="28"/>
+          <w:szCs w:val="28"/>
+        </w:rPr>
+        <w:t xml:space="preserve"> –</w:t>
+      </w:r>
+      <w:r>
+        <w:rPr>
+          <w:sz w:val="28"/>
+          <w:szCs w:val="28"/>
+        </w:rPr>
+        <w:t xml:space="preserve"> </w:t>
+      </w:r>
+      <w:r>
+        <w:rPr>
+          <w:sz w:val="28"/>
+          <w:szCs w:val="28"/>
+        </w:rPr>
+        <w:t>частота</w:t>
+      </w:r>
+      <w:r>
+        <w:rPr>
+          <w:sz w:val="28"/>
+          <w:szCs w:val="28"/>
+        </w:rPr>
+        <w:t xml:space="preserve">, </w:t>
       </w:r>
       <m:oMath>
         <m:sSub>
@@ -8115,69 +8719,97 @@
         </w:rPr>
         <w:t xml:space="preserve">пределить число интервалов </w:t>
       </w:r>
-      <w:r>
-        <w:rPr>
-          <w:i/>
-          <w:iCs/>
-          <w:sz w:val="28"/>
-          <w:szCs w:val="28"/>
-        </w:rPr>
-        <w:t>k</w:t>
-      </w:r>
-      <w:r>
-        <w:rPr>
-          <w:sz w:val="28"/>
-          <w:szCs w:val="28"/>
-        </w:rPr>
-        <w:t xml:space="preserve">. На практике применяется формула </w:t>
-      </w:r>
-      <w:proofErr w:type="spellStart"/>
-      <w:r>
-        <w:rPr>
-          <w:sz w:val="28"/>
-          <w:szCs w:val="28"/>
-        </w:rPr>
-        <w:t>Стёрджеса</w:t>
-      </w:r>
-      <w:proofErr w:type="spellEnd"/>
-      <w:r>
-        <w:rPr>
-          <w:sz w:val="28"/>
-          <w:szCs w:val="28"/>
-        </w:rPr>
-        <w:t>: k = 1 + ⌊</w:t>
-      </w:r>
-      <w:proofErr w:type="spellStart"/>
-      <w:r>
-        <w:rPr>
-          <w:sz w:val="28"/>
-          <w:szCs w:val="28"/>
-        </w:rPr>
-        <w:t>log</w:t>
-      </w:r>
-      <w:proofErr w:type="spellEnd"/>
-      <w:r>
-        <w:rPr>
-          <w:sz w:val="28"/>
-          <w:szCs w:val="28"/>
-        </w:rPr>
-        <w:t>₂ n⌋. Для n = 300 получаем k = ⌊1 + </w:t>
-      </w:r>
-      <w:proofErr w:type="spellStart"/>
-      <w:r>
-        <w:rPr>
-          <w:sz w:val="28"/>
-          <w:szCs w:val="28"/>
-        </w:rPr>
-        <w:t>log</w:t>
-      </w:r>
-      <w:proofErr w:type="spellEnd"/>
-      <w:r>
-        <w:rPr>
-          <w:sz w:val="28"/>
-          <w:szCs w:val="28"/>
-        </w:rPr>
-        <w:t>₂ 300⌋ = 9 интервалов; в реализации принято k = 20 для более детального отображения</w:t>
+      <m:oMath>
+        <m:r>
+          <w:rPr>
+            <w:rFonts w:ascii="Cambria Math" w:hAnsi="Cambria Math"/>
+            <w:sz w:val="28"/>
+            <w:szCs w:val="28"/>
+          </w:rPr>
+          <m:t>k</m:t>
+        </m:r>
+      </m:oMath>
+      <w:r>
+        <w:rPr>
+          <w:sz w:val="28"/>
+          <w:szCs w:val="28"/>
+        </w:rPr>
+        <w:t xml:space="preserve">. На практике применяется формула Стёрджеса: </w:t>
+      </w:r>
+      <m:oMath>
+        <m:r>
+          <w:rPr>
+            <w:rFonts w:ascii="Cambria Math" w:hAnsi="Cambria Math"/>
+            <w:sz w:val="28"/>
+            <w:szCs w:val="28"/>
+          </w:rPr>
+          <m:t>k = 1 + ⌊log₂ n⌋</m:t>
+        </m:r>
+      </m:oMath>
+      <w:r>
+        <w:rPr>
+          <w:sz w:val="28"/>
+          <w:szCs w:val="28"/>
+        </w:rPr>
+        <w:t xml:space="preserve">. Для </w:t>
+      </w:r>
+      <m:oMath>
+        <m:r>
+          <w:rPr>
+            <w:rFonts w:ascii="Cambria Math" w:hAnsi="Cambria Math"/>
+            <w:sz w:val="28"/>
+            <w:szCs w:val="28"/>
+          </w:rPr>
+          <m:t>n = 300</m:t>
+        </m:r>
+      </m:oMath>
+      <w:r>
+        <w:rPr>
+          <w:sz w:val="28"/>
+          <w:szCs w:val="28"/>
+        </w:rPr>
+        <w:t xml:space="preserve"> получаем </w:t>
+      </w:r>
+      <m:oMath>
+        <m:r>
+          <w:rPr>
+            <w:rFonts w:ascii="Cambria Math" w:hAnsi="Cambria Math"/>
+            <w:sz w:val="28"/>
+            <w:szCs w:val="28"/>
+          </w:rPr>
+          <m:t>k = ⌊1 + log₂ 300⌋ = 9</m:t>
+        </m:r>
+      </m:oMath>
+      <w:r>
+        <w:rPr>
+          <w:sz w:val="28"/>
+          <w:szCs w:val="28"/>
+        </w:rPr>
+        <w:t> и</w:t>
+      </w:r>
+      <w:r>
+        <w:rPr>
+          <w:sz w:val="28"/>
+          <w:szCs w:val="28"/>
+        </w:rPr>
+        <w:t xml:space="preserve">нтервалов; в реализации принято </w:t>
+      </w:r>
+      <m:oMath>
+        <m:r>
+          <w:rPr>
+            <w:rFonts w:ascii="Cambria Math" w:hAnsi="Cambria Math"/>
+            <w:sz w:val="28"/>
+            <w:szCs w:val="28"/>
+          </w:rPr>
+          <m:t>k = 20</m:t>
+        </m:r>
+      </m:oMath>
+      <w:r>
+        <w:rPr>
+          <w:sz w:val="28"/>
+          <w:szCs w:val="28"/>
+        </w:rPr>
+        <w:t xml:space="preserve"> для более детального отображения</w:t>
       </w:r>
       <w:r>
         <w:rPr>
@@ -8225,23 +8857,28 @@
         </w:rPr>
         <w:t xml:space="preserve">айти минимальное </w:t>
       </w:r>
-      <w:proofErr w:type="spellStart"/>
-      <w:r>
-        <w:rPr>
-          <w:sz w:val="28"/>
-          <w:szCs w:val="28"/>
-        </w:rPr>
-        <w:t>x</w:t>
-      </w:r>
-      <w:r>
-        <w:rPr>
-          <w:sz w:val="28"/>
-          <w:szCs w:val="28"/>
-          <w:vertAlign w:val="subscript"/>
-        </w:rPr>
-        <w:t>min</w:t>
-      </w:r>
-      <w:proofErr w:type="spellEnd"/>
+      <m:oMath>
+        <m:r>
+          <w:rPr>
+            <w:rFonts w:ascii="Cambria Math" w:hAnsi="Cambria Math"/>
+            <w:sz w:val="28"/>
+            <w:szCs w:val="28"/>
+          </w:rPr>
+          <m:t>x</m:t>
+        </m:r>
+        <m:r>
+          <m:rPr>
+            <m:nor/>
+          </m:rPr>
+          <w:rPr>
+            <w:rFonts w:ascii="Cambria Math" w:hAnsi="Cambria Math"/>
+            <w:sz w:val="28"/>
+            <w:szCs w:val="28"/>
+            <w:vertAlign w:val="subscript"/>
+          </w:rPr>
+          <m:t>min</m:t>
+        </m:r>
+      </m:oMath>
       <w:r>
         <w:rPr>
           <w:sz w:val="28"/>
@@ -8249,23 +8886,28 @@
         </w:rPr>
         <w:t xml:space="preserve"> и максимальное </w:t>
       </w:r>
-      <w:proofErr w:type="spellStart"/>
-      <w:r>
-        <w:rPr>
-          <w:sz w:val="28"/>
-          <w:szCs w:val="28"/>
-        </w:rPr>
-        <w:t>x</w:t>
-      </w:r>
-      <w:r>
-        <w:rPr>
-          <w:sz w:val="28"/>
-          <w:szCs w:val="28"/>
-          <w:vertAlign w:val="subscript"/>
-        </w:rPr>
-        <w:t>max</w:t>
-      </w:r>
-      <w:proofErr w:type="spellEnd"/>
+      <m:oMath>
+        <m:r>
+          <w:rPr>
+            <w:rFonts w:ascii="Cambria Math" w:hAnsi="Cambria Math"/>
+            <w:sz w:val="28"/>
+            <w:szCs w:val="28"/>
+          </w:rPr>
+          <m:t>x</m:t>
+        </m:r>
+        <m:r>
+          <m:rPr>
+            <m:nor/>
+          </m:rPr>
+          <w:rPr>
+            <w:rFonts w:ascii="Cambria Math" w:hAnsi="Cambria Math"/>
+            <w:sz w:val="28"/>
+            <w:szCs w:val="28"/>
+            <w:vertAlign w:val="subscript"/>
+          </w:rPr>
+          <m:t>max</m:t>
+        </m:r>
+      </m:oMath>
       <w:r>
         <w:rPr>
           <w:sz w:val="28"/>
@@ -8317,56 +8959,58 @@
           <w:sz w:val="28"/>
           <w:szCs w:val="28"/>
         </w:rPr>
-        <w:t>ычислить длину одного интервала: |Δ| = (</w:t>
-      </w:r>
-      <w:proofErr w:type="spellStart"/>
-      <w:r>
-        <w:rPr>
-          <w:sz w:val="28"/>
-          <w:szCs w:val="28"/>
-        </w:rPr>
-        <w:t>x</w:t>
-      </w:r>
-      <w:r>
-        <w:rPr>
-          <w:sz w:val="28"/>
-          <w:szCs w:val="28"/>
-          <w:vertAlign w:val="subscript"/>
-        </w:rPr>
-        <w:t>max</w:t>
-      </w:r>
-      <w:proofErr w:type="spellEnd"/>
-      <w:r>
-        <w:rPr>
-          <w:sz w:val="28"/>
-          <w:szCs w:val="28"/>
-        </w:rPr>
-        <w:t> − </w:t>
-      </w:r>
-      <w:proofErr w:type="spellStart"/>
-      <w:r>
-        <w:rPr>
-          <w:sz w:val="28"/>
-          <w:szCs w:val="28"/>
-        </w:rPr>
-        <w:t>x</w:t>
-      </w:r>
-      <w:r>
-        <w:rPr>
-          <w:sz w:val="28"/>
-          <w:szCs w:val="28"/>
-          <w:vertAlign w:val="subscript"/>
-        </w:rPr>
-        <w:t>min</w:t>
-      </w:r>
-      <w:proofErr w:type="spellEnd"/>
-      <w:r>
-        <w:rPr>
-          <w:sz w:val="28"/>
-          <w:szCs w:val="28"/>
-        </w:rPr>
-        <w:t>) / k</w:t>
-      </w:r>
+        <w:t xml:space="preserve">ычислить длину одного интервала: </w:t>
+      </w:r>
+      <m:oMath>
+        <m:r>
+          <w:rPr>
+            <w:rFonts w:ascii="Cambria Math" w:hAnsi="Cambria Math"/>
+            <w:sz w:val="28"/>
+            <w:szCs w:val="28"/>
+          </w:rPr>
+          <m:t>|Δ| = (x</m:t>
+        </m:r>
+        <m:r>
+          <m:rPr>
+            <m:nor/>
+          </m:rPr>
+          <w:rPr>
+            <w:rFonts w:ascii="Cambria Math" w:hAnsi="Cambria Math"/>
+            <w:sz w:val="28"/>
+            <w:szCs w:val="28"/>
+            <w:vertAlign w:val="subscript"/>
+          </w:rPr>
+          <m:t>max</m:t>
+        </m:r>
+        <m:r>
+          <w:rPr>
+            <w:rFonts w:ascii="Cambria Math" w:hAnsi="Cambria Math"/>
+            <w:sz w:val="28"/>
+            <w:szCs w:val="28"/>
+          </w:rPr>
+          <m:t> - x</m:t>
+        </m:r>
+        <m:r>
+          <m:rPr>
+            <m:nor/>
+          </m:rPr>
+          <w:rPr>
+            <w:rFonts w:ascii="Cambria Math" w:hAnsi="Cambria Math"/>
+            <w:sz w:val="28"/>
+            <w:szCs w:val="28"/>
+            <w:vertAlign w:val="subscript"/>
+          </w:rPr>
+          <m:t>min</m:t>
+        </m:r>
+        <m:r>
+          <w:rPr>
+            <w:rFonts w:ascii="Cambria Math" w:hAnsi="Cambria Math"/>
+            <w:sz w:val="28"/>
+            <w:szCs w:val="28"/>
+          </w:rPr>
+          <m:t>) / k</m:t>
+        </m:r>
+      </m:oMath>
       <w:r>
         <w:rPr>
           <w:sz w:val="28"/>
@@ -8411,64 +9055,81 @@
           <w:sz w:val="28"/>
           <w:szCs w:val="28"/>
         </w:rPr>
-        <w:t>ля каждого интервала [Δ</w:t>
-      </w:r>
-      <w:r>
-        <w:rPr>
-          <w:sz w:val="28"/>
-          <w:szCs w:val="28"/>
-          <w:vertAlign w:val="subscript"/>
-        </w:rPr>
-        <w:t>i−1</w:t>
-      </w:r>
-      <w:r>
-        <w:rPr>
-          <w:sz w:val="28"/>
-          <w:szCs w:val="28"/>
-        </w:rPr>
-        <w:t xml:space="preserve">, </w:t>
-      </w:r>
-      <w:proofErr w:type="spellStart"/>
-      <w:r>
-        <w:rPr>
-          <w:sz w:val="28"/>
-          <w:szCs w:val="28"/>
-        </w:rPr>
-        <w:t>Δ</w:t>
-      </w:r>
-      <w:r>
-        <w:rPr>
-          <w:sz w:val="28"/>
-          <w:szCs w:val="28"/>
-          <w:vertAlign w:val="subscript"/>
-        </w:rPr>
-        <w:t>i</w:t>
-      </w:r>
-      <w:proofErr w:type="spellEnd"/>
-      <w:r>
-        <w:rPr>
-          <w:sz w:val="28"/>
-          <w:szCs w:val="28"/>
-        </w:rPr>
-        <w:t xml:space="preserve">] подсчитать число элементов выборки </w:t>
-      </w:r>
-      <w:proofErr w:type="spellStart"/>
-      <w:r>
-        <w:rPr>
-          <w:sz w:val="28"/>
-          <w:szCs w:val="28"/>
-        </w:rPr>
-        <w:t>n</w:t>
-      </w:r>
-      <w:r>
-        <w:rPr>
-          <w:sz w:val="28"/>
-          <w:szCs w:val="28"/>
-          <w:vertAlign w:val="subscript"/>
-        </w:rPr>
-        <w:t>i</w:t>
-      </w:r>
-      <w:proofErr w:type="spellEnd"/>
+        <w:t xml:space="preserve">ля каждого интервала </w:t>
+      </w:r>
+      <m:oMath>
+        <m:r>
+          <w:rPr>
+            <w:rFonts w:ascii="Cambria Math" w:hAnsi="Cambria Math"/>
+            <w:sz w:val="28"/>
+            <w:szCs w:val="28"/>
+          </w:rPr>
+          <m:t>[Δ</m:t>
+        </m:r>
+        <m:r>
+          <w:rPr>
+            <w:rFonts w:ascii="Cambria Math" w:hAnsi="Cambria Math"/>
+            <w:sz w:val="28"/>
+            <w:szCs w:val="28"/>
+            <w:vertAlign w:val="subscript"/>
+          </w:rPr>
+          <m:t>i-1</m:t>
+        </m:r>
+        <m:r>
+          <w:rPr>
+            <w:rFonts w:ascii="Cambria Math" w:hAnsi="Cambria Math"/>
+            <w:sz w:val="28"/>
+            <w:szCs w:val="28"/>
+          </w:rPr>
+          <m:t>, Δ</m:t>
+        </m:r>
+        <m:r>
+          <w:rPr>
+            <w:rFonts w:ascii="Cambria Math" w:hAnsi="Cambria Math"/>
+            <w:sz w:val="28"/>
+            <w:szCs w:val="28"/>
+            <w:vertAlign w:val="subscript"/>
+          </w:rPr>
+          <m:t>i</m:t>
+        </m:r>
+        <m:r>
+          <w:rPr>
+            <w:rFonts w:ascii="Cambria Math" w:hAnsi="Cambria Math"/>
+            <w:sz w:val="28"/>
+            <w:szCs w:val="28"/>
+          </w:rPr>
+          <m:t>]</m:t>
+        </m:r>
+      </m:oMath>
+      <w:r>
+        <w:rPr>
+          <w:sz w:val="28"/>
+          <w:szCs w:val="28"/>
+        </w:rPr>
+        <w:t xml:space="preserve"> подсчитать число элементов выборки </w:t>
+      </w:r>
+      <m:oMath>
+        <m:r>
+          <w:rPr>
+            <w:rFonts w:ascii="Cambria Math" w:hAnsi="Cambria Math"/>
+            <w:sz w:val="28"/>
+            <w:szCs w:val="28"/>
+          </w:rPr>
+          <m:t>n</m:t>
+        </m:r>
+        <m:r>
+          <m:rPr>
+            <m:nor/>
+          </m:rPr>
+          <w:rPr>
+            <w:rFonts w:ascii="Cambria Math" w:hAnsi="Cambria Math"/>
+            <w:sz w:val="28"/>
+            <w:szCs w:val="28"/>
+            <w:vertAlign w:val="subscript"/>
+          </w:rPr>
+          <m:t>i</m:t>
+        </m:r>
+      </m:oMath>
       <w:r>
         <w:rPr>
           <w:sz w:val="28"/>
@@ -8520,32 +9181,38 @@
           <w:sz w:val="28"/>
           <w:szCs w:val="28"/>
         </w:rPr>
-        <w:t>ычислить высоту столбца: h = </w:t>
-      </w:r>
-      <w:proofErr w:type="spellStart"/>
-      <w:r>
-        <w:rPr>
-          <w:sz w:val="28"/>
-          <w:szCs w:val="28"/>
-        </w:rPr>
-        <w:t>n</w:t>
-      </w:r>
-      <w:r>
-        <w:rPr>
-          <w:sz w:val="28"/>
-          <w:szCs w:val="28"/>
-          <w:vertAlign w:val="subscript"/>
-        </w:rPr>
-        <w:t>i</w:t>
-      </w:r>
-      <w:proofErr w:type="spellEnd"/>
-      <w:r>
-        <w:rPr>
-          <w:sz w:val="28"/>
-          <w:szCs w:val="28"/>
-        </w:rPr>
-        <w:t> / (n ⋅ |Δ|)</w:t>
-      </w:r>
+        <w:t xml:space="preserve">ычислить высоту столбца: </w:t>
+      </w:r>
+      <m:oMath>
+        <m:r>
+          <w:rPr>
+            <w:rFonts w:ascii="Cambria Math" w:hAnsi="Cambria Math"/>
+            <w:sz w:val="28"/>
+            <w:szCs w:val="28"/>
+          </w:rPr>
+          <m:t>h = n</m:t>
+        </m:r>
+        <m:r>
+          <m:rPr>
+            <m:nor/>
+          </m:rPr>
+          <w:rPr>
+            <w:rFonts w:ascii="Cambria Math" w:hAnsi="Cambria Math"/>
+            <w:sz w:val="28"/>
+            <w:szCs w:val="28"/>
+            <w:vertAlign w:val="subscript"/>
+          </w:rPr>
+          <m:t>i</m:t>
+        </m:r>
+        <m:r>
+          <w:rPr>
+            <w:rFonts w:ascii="Cambria Math" w:hAnsi="Cambria Math"/>
+            <w:sz w:val="28"/>
+            <w:szCs w:val="28"/>
+          </w:rPr>
+          <m:t> / (n ⋅ |Δ|)</m:t>
+        </m:r>
+      </m:oMath>
       <w:r>
         <w:rPr>
           <w:sz w:val="28"/>
@@ -8756,21 +9423,36 @@
         <w:rPr>
           <w:sz w:val="28"/>
           <w:szCs w:val="28"/>
-          <w:lang w:val="en-US"/>
-        </w:rPr>
-      </w:pPr>
-      <w:r>
-        <w:rPr>
-          <w:sz w:val="28"/>
-          <w:szCs w:val="28"/>
-        </w:rPr>
-        <w:t>Для построения гистограммы реализована функция, разбивающая диапазон выборки на k = 20 равных интервалов и подсчитывающая число элементов, попавших в каждый интервал. Листинг</w:t>
-      </w:r>
-      <w:r>
-        <w:rPr>
-          <w:sz w:val="28"/>
-          <w:szCs w:val="28"/>
-          <w:lang w:val="en-US"/>
+        </w:rPr>
+      </w:pPr>
+      <w:r>
+        <w:rPr>
+          <w:sz w:val="28"/>
+          <w:szCs w:val="28"/>
+        </w:rPr>
+        <w:t xml:space="preserve">Для построения гистограммы реализована функция, разбивающая диапазон выборки на </w:t>
+      </w:r>
+      <m:oMath>
+        <m:r>
+          <w:rPr>
+            <w:rFonts w:ascii="Cambria Math" w:hAnsi="Cambria Math"/>
+            <w:sz w:val="28"/>
+            <w:szCs w:val="28"/>
+          </w:rPr>
+          <m:t>k = 20</m:t>
+        </m:r>
+      </m:oMath>
+      <w:r>
+        <w:rPr>
+          <w:sz w:val="28"/>
+          <w:szCs w:val="28"/>
+        </w:rPr>
+        <w:t xml:space="preserve"> равных интервалов и подсчитывающая число элементов, попавших в каждый интервал. Листинг</w:t>
+      </w:r>
+      <w:r>
+        <w:rPr>
+          <w:sz w:val="28"/>
+          <w:szCs w:val="28"/>
         </w:rPr>
         <w:t xml:space="preserve"> </w:t>
       </w:r>
@@ -8785,7 +9467,6 @@
         <w:rPr>
           <w:sz w:val="28"/>
           <w:szCs w:val="28"/>
-          <w:lang w:val="en-US"/>
         </w:rPr>
         <w:t xml:space="preserve"> </w:t>
       </w:r>
@@ -8800,7 +9481,6 @@
         <w:rPr>
           <w:sz w:val="28"/>
           <w:szCs w:val="28"/>
-          <w:lang w:val="en-US"/>
         </w:rPr>
         <w:t xml:space="preserve"> </w:t>
       </w:r>
@@ -8815,7 +9495,6 @@
         <w:rPr>
           <w:sz w:val="28"/>
           <w:szCs w:val="28"/>
-          <w:lang w:val="en-US"/>
         </w:rPr>
         <w:t>:</w:t>
       </w:r>
@@ -8916,23 +9595,24 @@
           <w:sz w:val="28"/>
           <w:szCs w:val="28"/>
         </w:rPr>
-        <w:t xml:space="preserve">Результаты работы функции для полной выборки объёмом n = 300 приведены на рисунке 6, для случайных </w:t>
-      </w:r>
-      <w:proofErr w:type="spellStart"/>
-      <w:r>
-        <w:rPr>
-          <w:sz w:val="28"/>
-          <w:szCs w:val="28"/>
-        </w:rPr>
-        <w:t>подвыборок</w:t>
-      </w:r>
-      <w:proofErr w:type="spellEnd"/>
-      <w:r>
-        <w:rPr>
-          <w:sz w:val="28"/>
-          <w:szCs w:val="28"/>
-        </w:rPr>
-        <w:t xml:space="preserve"> размером 10, 100 и 200 элементов — на рисунках 7–9.</w:t>
+        <w:t xml:space="preserve">Результаты работы функции для полной выборки объёмом </w:t>
+      </w:r>
+      <m:oMath>
+        <m:r>
+          <w:rPr>
+            <w:rFonts w:ascii="Cambria Math" w:hAnsi="Cambria Math"/>
+            <w:sz w:val="28"/>
+            <w:szCs w:val="28"/>
+          </w:rPr>
+          <m:t>n = 300</m:t>
+        </m:r>
+      </m:oMath>
+      <w:r>
+        <w:rPr>
+          <w:sz w:val="28"/>
+          <w:szCs w:val="28"/>
+        </w:rPr>
+        <w:t xml:space="preserve"> приведены на рисунке 6, для случайных подвыборок размером 10, 100 и 200 элементов — на рисунках 7–9.</w:t>
       </w:r>
     </w:p>
     <w:p>
@@ -9014,20 +9694,16 @@
         <w:spacing w:line="360" w:lineRule="auto"/>
         <w:jc w:val="center"/>
         <w:rPr>
-          <w:i/>
-          <w:iCs/>
-          <w:sz w:val="28"/>
-          <w:szCs w:val="28"/>
-        </w:rPr>
-      </w:pPr>
-      <w:r>
-        <w:rPr>
-          <w:i/>
-          <w:iCs/>
-          <w:sz w:val="28"/>
-          <w:szCs w:val="28"/>
-        </w:rPr>
-        <w:t>Рисунок 6 – Гистограмма для полной выборки (n = 300)</w:t>
+          <w:sz w:val="28"/>
+          <w:szCs w:val="28"/>
+        </w:rPr>
+      </w:pPr>
+      <w:r>
+        <w:rPr>
+          <w:sz w:val="28"/>
+          <w:szCs w:val="28"/>
+        </w:rPr>
+        <w:t>Рисунок 6 – Гистограмма для полной выборки</w:t>
       </w:r>
     </w:p>
     <w:p>
@@ -9314,8 +9990,6 @@
       </w:pPr>
       <w:r>
         <w:rPr>
-          <w:i/>
-          <w:iCs/>
           <w:sz w:val="28"/>
           <w:szCs w:val="28"/>
         </w:rPr>
@@ -9324,8 +9998,6 @@
       <w:proofErr w:type="spellStart"/>
       <w:r>
         <w:rPr>
-          <w:i/>
-          <w:iCs/>
           <w:sz w:val="28"/>
           <w:szCs w:val="28"/>
         </w:rPr>
@@ -9334,8 +10006,6 @@
       <w:proofErr w:type="spellEnd"/>
       <w:r>
         <w:rPr>
-          <w:i/>
-          <w:iCs/>
           <w:sz w:val="28"/>
           <w:szCs w:val="28"/>
         </w:rPr>
@@ -9418,8 +10088,6 @@
       </w:pPr>
       <w:r>
         <w:rPr>
-          <w:i/>
-          <w:iCs/>
           <w:sz w:val="28"/>
           <w:szCs w:val="28"/>
         </w:rPr>
@@ -9428,8 +10096,6 @@
       <w:proofErr w:type="spellStart"/>
       <w:r>
         <w:rPr>
-          <w:i/>
-          <w:iCs/>
           <w:sz w:val="28"/>
           <w:szCs w:val="28"/>
         </w:rPr>
@@ -9438,8 +10104,6 @@
       <w:proofErr w:type="spellEnd"/>
       <w:r>
         <w:rPr>
-          <w:i/>
-          <w:iCs/>
           <w:sz w:val="28"/>
           <w:szCs w:val="28"/>
         </w:rPr>
@@ -9533,8 +10197,6 @@
       </w:pPr>
       <w:r>
         <w:rPr>
-          <w:i/>
-          <w:iCs/>
           <w:sz w:val="28"/>
           <w:szCs w:val="28"/>
         </w:rPr>
@@ -9543,8 +10205,6 @@
       <w:proofErr w:type="spellStart"/>
       <w:r>
         <w:rPr>
-          <w:i/>
-          <w:iCs/>
           <w:sz w:val="28"/>
           <w:szCs w:val="28"/>
         </w:rPr>
@@ -9553,8 +10213,6 @@
       <w:proofErr w:type="spellEnd"/>
       <w:r>
         <w:rPr>
-          <w:i/>
-          <w:iCs/>
           <w:sz w:val="28"/>
           <w:szCs w:val="28"/>
         </w:rPr>
@@ -9636,336 +10294,21 @@
           <w:sz w:val="28"/>
           <w:szCs w:val="28"/>
         </w:rPr>
-        <w:t>Полная выборка (n = 300, рисунок 6)</w:t>
-      </w:r>
-      <w:r>
-        <w:rPr>
-          <w:sz w:val="28"/>
-          <w:szCs w:val="28"/>
-        </w:rPr>
-        <w:t xml:space="preserve">. Гистограмма имеет отчётливую двугорбую (бимодальную) форму, характерную для двойного гамма-распределения при параметре формы </w:t>
-      </w:r>
-      <w:proofErr w:type="gramStart"/>
-      <w:r>
-        <w:rPr>
-          <w:sz w:val="28"/>
-          <w:szCs w:val="28"/>
-        </w:rPr>
-        <w:t>α &gt;</w:t>
-      </w:r>
-      <w:proofErr w:type="gramEnd"/>
-      <w:r>
-        <w:rPr>
-          <w:sz w:val="28"/>
-          <w:szCs w:val="28"/>
-        </w:rPr>
-        <w:t> 1.</w:t>
-      </w:r>
-      <w:r>
-        <w:rPr>
-          <w:sz w:val="28"/>
-          <w:szCs w:val="28"/>
-        </w:rPr>
-        <w:t xml:space="preserve"> В данном варианте требуется рассмотреть параметр формы и параметр смещения, поэтому при анализе гистограммы примем параметр масштаба β = 1.</w:t>
-      </w:r>
-      <w:r>
-        <w:rPr>
-          <w:sz w:val="28"/>
-          <w:szCs w:val="28"/>
-        </w:rPr>
-        <w:t xml:space="preserve"> </w:t>
-      </w:r>
-      <w:r>
-        <w:rPr>
-          <w:sz w:val="28"/>
-          <w:szCs w:val="28"/>
-        </w:rPr>
-        <w:t>Два пика симметрично расположены относительно параметра смещения: левый пик — вблизи x ≈ −4,2, правый — вблизи x ≈ 6,5. Из этих значений можно получить приближённые оценки параметров:</w:t>
-      </w:r>
-    </w:p>
-    <w:p>
-      <w:pPr>
-        <w:spacing w:line="360" w:lineRule="auto"/>
-        <w:jc w:val="both"/>
-        <w:rPr>
-          <w:sz w:val="28"/>
-          <w:szCs w:val="28"/>
-        </w:rPr>
-      </w:pPr>
-    </w:p>
-    <w:p>
-      <w:pPr>
-        <w:spacing w:line="360" w:lineRule="auto"/>
-        <w:ind w:left="720" w:hanging="360"/>
-        <w:jc w:val="both"/>
-        <w:rPr>
-          <w:sz w:val="28"/>
-          <w:szCs w:val="28"/>
-        </w:rPr>
-      </w:pPr>
-      <w:r>
-        <w:rPr>
-          <w:sz w:val="28"/>
-          <w:szCs w:val="28"/>
-        </w:rPr>
-        <w:t>–</w:t>
-      </w:r>
-      <w:r>
-        <w:rPr>
-          <w:sz w:val="28"/>
-          <w:szCs w:val="28"/>
-        </w:rPr>
-        <w:tab/>
-      </w:r>
-      <w:r>
-        <w:rPr>
-          <w:sz w:val="28"/>
-          <w:szCs w:val="28"/>
-        </w:rPr>
-        <w:t>п</w:t>
-      </w:r>
-      <w:r>
-        <w:rPr>
-          <w:sz w:val="28"/>
-          <w:szCs w:val="28"/>
-        </w:rPr>
-        <w:t xml:space="preserve">араметр смещения: </w:t>
-      </w:r>
-      <w:proofErr w:type="spellStart"/>
-      <w:r>
-        <w:rPr>
-          <w:sz w:val="28"/>
-          <w:szCs w:val="28"/>
-        </w:rPr>
-        <w:t>loc</w:t>
-      </w:r>
-      <w:proofErr w:type="spellEnd"/>
-      <w:r>
-        <w:rPr>
-          <w:sz w:val="28"/>
-          <w:szCs w:val="28"/>
-        </w:rPr>
-        <w:t> ≈ (−4,2 + 6,5) / 2 = 1,15;</w:t>
-      </w:r>
-    </w:p>
-    <w:p>
-      <w:pPr>
-        <w:spacing w:line="360" w:lineRule="auto"/>
-        <w:ind w:left="720" w:hanging="360"/>
-        <w:jc w:val="both"/>
-        <w:rPr>
-          <w:sz w:val="28"/>
-          <w:szCs w:val="28"/>
-        </w:rPr>
-      </w:pPr>
-      <w:r>
-        <w:rPr>
-          <w:sz w:val="28"/>
-          <w:szCs w:val="28"/>
-        </w:rPr>
-        <w:t>–</w:t>
-      </w:r>
-      <w:r>
-        <w:rPr>
-          <w:sz w:val="28"/>
-          <w:szCs w:val="28"/>
-        </w:rPr>
-        <w:tab/>
-      </w:r>
-      <w:r>
-        <w:rPr>
-          <w:sz w:val="28"/>
-          <w:szCs w:val="28"/>
-        </w:rPr>
-        <w:t>р</w:t>
-      </w:r>
-      <w:r>
-        <w:rPr>
-          <w:sz w:val="28"/>
-          <w:szCs w:val="28"/>
-        </w:rPr>
-        <w:t xml:space="preserve">асстояние от пика до </w:t>
-      </w:r>
-      <w:proofErr w:type="spellStart"/>
-      <w:r>
-        <w:rPr>
-          <w:sz w:val="28"/>
-          <w:szCs w:val="28"/>
-        </w:rPr>
-        <w:t>loc</w:t>
-      </w:r>
-      <w:proofErr w:type="spellEnd"/>
-      <w:r>
-        <w:rPr>
-          <w:sz w:val="28"/>
-          <w:szCs w:val="28"/>
-        </w:rPr>
-        <w:t xml:space="preserve"> определяется как (α − 1) / </w:t>
-      </w:r>
-      <w:r>
-        <w:rPr>
-          <w:sz w:val="28"/>
-          <w:szCs w:val="28"/>
-        </w:rPr>
-        <w:t>β</w:t>
-      </w:r>
-      <w:r>
-        <w:rPr>
-          <w:sz w:val="28"/>
-          <w:szCs w:val="28"/>
-        </w:rPr>
-        <w:t>; с учётом оценки: α − 1 ≈ (6,5 − 1,15) × 1 ≈ 5,</w:t>
-      </w:r>
-      <w:r>
-        <w:rPr>
-          <w:sz w:val="28"/>
-          <w:szCs w:val="28"/>
-        </w:rPr>
-        <w:t>35</w:t>
-      </w:r>
-      <w:r>
-        <w:rPr>
-          <w:sz w:val="28"/>
-          <w:szCs w:val="28"/>
-        </w:rPr>
-        <w:t>, то есть α ≈ </w:t>
-      </w:r>
-      <w:r>
-        <w:rPr>
-          <w:sz w:val="28"/>
-          <w:szCs w:val="28"/>
-        </w:rPr>
-        <w:t>6,35</w:t>
-      </w:r>
-      <w:r>
-        <w:rPr>
-          <w:sz w:val="28"/>
-          <w:szCs w:val="28"/>
-        </w:rPr>
-        <w:t>.</w:t>
-      </w:r>
-    </w:p>
-    <w:p>
-      <w:pPr>
-        <w:spacing w:line="360" w:lineRule="auto"/>
-        <w:jc w:val="both"/>
-        <w:rPr>
-          <w:sz w:val="28"/>
-          <w:szCs w:val="28"/>
-        </w:rPr>
-      </w:pPr>
-    </w:p>
-    <w:p>
-      <w:pPr>
-        <w:spacing w:line="360" w:lineRule="auto"/>
-        <w:ind w:firstLine="720"/>
-        <w:jc w:val="both"/>
-        <w:rPr>
-          <w:sz w:val="28"/>
-          <w:szCs w:val="28"/>
-        </w:rPr>
-      </w:pPr>
-      <w:r>
-        <w:rPr>
-          <w:sz w:val="28"/>
-          <w:szCs w:val="28"/>
-        </w:rPr>
-        <w:t>Таким образом, по гистограмме полной выборки получены предварительные оценки: α ≈ </w:t>
-      </w:r>
-      <w:r>
-        <w:rPr>
-          <w:sz w:val="28"/>
-          <w:szCs w:val="28"/>
-        </w:rPr>
-        <w:t>6,35</w:t>
-      </w:r>
-      <w:r>
-        <w:rPr>
-          <w:sz w:val="28"/>
-          <w:szCs w:val="28"/>
-        </w:rPr>
-        <w:t>, β </w:t>
-      </w:r>
-      <w:r>
-        <w:rPr>
-          <w:sz w:val="28"/>
-          <w:szCs w:val="28"/>
-        </w:rPr>
-        <w:t>=</w:t>
-      </w:r>
-      <w:r>
-        <w:rPr>
-          <w:sz w:val="28"/>
-          <w:szCs w:val="28"/>
-        </w:rPr>
-        <w:t> </w:t>
-      </w:r>
-      <w:r>
-        <w:rPr>
-          <w:sz w:val="28"/>
-          <w:szCs w:val="28"/>
-        </w:rPr>
-        <w:t>1</w:t>
-      </w:r>
-      <w:r>
-        <w:rPr>
-          <w:sz w:val="28"/>
-          <w:szCs w:val="28"/>
-        </w:rPr>
-        <w:t xml:space="preserve">, </w:t>
-      </w:r>
-      <w:proofErr w:type="spellStart"/>
-      <w:r>
-        <w:rPr>
-          <w:sz w:val="28"/>
-          <w:szCs w:val="28"/>
-        </w:rPr>
-        <w:t>loc</w:t>
-      </w:r>
-      <w:proofErr w:type="spellEnd"/>
-      <w:r>
-        <w:rPr>
-          <w:sz w:val="28"/>
-          <w:szCs w:val="28"/>
-        </w:rPr>
-        <w:t> ≈ 1,</w:t>
-      </w:r>
-      <w:r>
-        <w:rPr>
-          <w:sz w:val="28"/>
-          <w:szCs w:val="28"/>
-        </w:rPr>
-        <w:t>15</w:t>
-      </w:r>
-      <w:r>
-        <w:rPr>
-          <w:sz w:val="28"/>
-          <w:szCs w:val="28"/>
-        </w:rPr>
-        <w:t xml:space="preserve">. </w:t>
-      </w:r>
-    </w:p>
-    <w:p>
-      <w:pPr>
-        <w:spacing w:line="360" w:lineRule="auto"/>
-        <w:jc w:val="both"/>
-        <w:rPr>
-          <w:sz w:val="28"/>
-          <w:szCs w:val="28"/>
-        </w:rPr>
-      </w:pPr>
-    </w:p>
-    <w:p>
-      <w:pPr>
-        <w:spacing w:line="360" w:lineRule="auto"/>
-        <w:ind w:firstLine="720"/>
-        <w:jc w:val="both"/>
-        <w:rPr>
-          <w:sz w:val="28"/>
-          <w:szCs w:val="28"/>
-        </w:rPr>
-      </w:pPr>
-      <w:proofErr w:type="spellStart"/>
+        <w:t>Полная выборка (</w:t>
+      </w:r>
+      <m:oMath>
+        <m:r>
+          <m:rPr>
+            <m:sty m:val="bi"/>
+          </m:rPr>
+          <w:rPr>
+            <w:rFonts w:ascii="Cambria Math" w:hAnsi="Cambria Math"/>
+            <w:sz w:val="28"/>
+            <w:szCs w:val="28"/>
+          </w:rPr>
+          <m:t>n = 300</m:t>
+        </m:r>
+      </m:oMath>
       <w:r>
         <w:rPr>
           <w:b/>
@@ -9973,6 +10316,396 @@
           <w:sz w:val="28"/>
           <w:szCs w:val="28"/>
         </w:rPr>
+        <w:t>, рисунок 6)</w:t>
+      </w:r>
+      <w:r>
+        <w:rPr>
+          <w:sz w:val="28"/>
+          <w:szCs w:val="28"/>
+        </w:rPr>
+        <w:t xml:space="preserve">. Гистограмма имеет отчётливую двугорбую (бимодальную) форму, характерную для двойного гамма-распределения при параметре формы </w:t>
+      </w:r>
+      <m:oMath>
+        <m:r>
+          <w:rPr>
+            <w:rFonts w:ascii="Cambria Math" w:hAnsi="Cambria Math"/>
+            <w:sz w:val="28"/>
+            <w:szCs w:val="28"/>
+          </w:rPr>
+          <m:t>α &gt; 1</m:t>
+        </m:r>
+      </m:oMath>
+      <w:r>
+        <w:rPr>
+          <w:sz w:val="28"/>
+          <w:szCs w:val="28"/>
+        </w:rPr>
+        <w:t>.</w:t>
+      </w:r>
+      <w:r>
+        <w:rPr>
+          <w:sz w:val="28"/>
+          <w:szCs w:val="28"/>
+        </w:rPr>
+        <w:t xml:space="preserve"> В данном варианте требуется рассмотреть параметр формы и параметр смещения, поэтому при анализе гистограммы примем параметр масштаба </w:t>
+      </w:r>
+      <m:oMath>
+        <m:r>
+          <w:rPr>
+            <w:rFonts w:ascii="Cambria Math" w:hAnsi="Cambria Math"/>
+            <w:sz w:val="28"/>
+            <w:szCs w:val="28"/>
+          </w:rPr>
+          <m:t>β = 1</m:t>
+        </m:r>
+      </m:oMath>
+      <w:r>
+        <w:rPr>
+          <w:sz w:val="28"/>
+          <w:szCs w:val="28"/>
+        </w:rPr>
+        <w:t>.</w:t>
+      </w:r>
+      <w:r>
+        <w:rPr>
+          <w:sz w:val="28"/>
+          <w:szCs w:val="28"/>
+        </w:rPr>
+        <w:t xml:space="preserve"> </w:t>
+      </w:r>
+      <w:r>
+        <w:rPr>
+          <w:sz w:val="28"/>
+          <w:szCs w:val="28"/>
+        </w:rPr>
+        <w:t>Два пика симметрично расположены относительно параметра смещения: левый пик — вблизи</w:t>
+      </w:r>
+    </w:p>
+    <w:p>
+      <w:pPr>
+        <w:spacing w:line="360" w:lineRule="auto"/>
+        <w:ind w:firstLine="360"/>
+        <w:jc w:val="both"/>
+        <w:rPr>
+          <w:sz w:val="28"/>
+          <w:szCs w:val="28"/>
+        </w:rPr>
+      </w:pPr>
+      <m:oMath>
+        <m:r>
+          <w:rPr>
+            <w:rFonts w:ascii="Cambria Math" w:hAnsi="Cambria Math"/>
+            <w:sz w:val="28"/>
+            <w:szCs w:val="28"/>
+          </w:rPr>
+          <m:t>x ≈-4,2</m:t>
+        </m:r>
+      </m:oMath>
+      <w:r>
+        <w:rPr>
+          <w:sz w:val="28"/>
+          <w:szCs w:val="28"/>
+        </w:rPr>
+        <w:t xml:space="preserve">, правый — вблизи </w:t>
+      </w:r>
+      <m:oMath>
+        <m:r>
+          <w:rPr>
+            <w:rFonts w:ascii="Cambria Math" w:hAnsi="Cambria Math"/>
+            <w:sz w:val="28"/>
+            <w:szCs w:val="28"/>
+          </w:rPr>
+          <m:t>x ≈ 6,5</m:t>
+        </m:r>
+      </m:oMath>
+      <w:r>
+        <w:rPr>
+          <w:sz w:val="28"/>
+          <w:szCs w:val="28"/>
+        </w:rPr>
+        <w:t>. Из этих значений можно получить приближённые оценки параметров:</w:t>
+      </w:r>
+    </w:p>
+    <w:p>
+      <w:pPr>
+        <w:spacing w:line="360" w:lineRule="auto"/>
+        <w:jc w:val="both"/>
+        <w:rPr>
+          <w:sz w:val="28"/>
+          <w:szCs w:val="28"/>
+        </w:rPr>
+      </w:pPr>
+    </w:p>
+    <w:p>
+      <w:pPr>
+        <w:spacing w:line="360" w:lineRule="auto"/>
+        <w:ind w:left="720" w:hanging="360"/>
+        <w:jc w:val="both"/>
+        <w:rPr>
+          <w:sz w:val="28"/>
+          <w:szCs w:val="28"/>
+        </w:rPr>
+      </w:pPr>
+      <w:r>
+        <w:rPr>
+          <w:sz w:val="28"/>
+          <w:szCs w:val="28"/>
+        </w:rPr>
+        <w:t>–</w:t>
+      </w:r>
+      <w:r>
+        <w:rPr>
+          <w:sz w:val="28"/>
+          <w:szCs w:val="28"/>
+        </w:rPr>
+        <w:tab/>
+      </w:r>
+      <w:r>
+        <w:rPr>
+          <w:sz w:val="28"/>
+          <w:szCs w:val="28"/>
+        </w:rPr>
+        <w:t>п</w:t>
+      </w:r>
+      <w:r>
+        <w:rPr>
+          <w:sz w:val="28"/>
+          <w:szCs w:val="28"/>
+        </w:rPr>
+        <w:t xml:space="preserve">араметр смещения: </w:t>
+      </w:r>
+      <m:oMath>
+        <m:r>
+          <w:rPr>
+            <w:rFonts w:ascii="Cambria Math" w:hAnsi="Cambria Math"/>
+            <w:sz w:val="28"/>
+            <w:szCs w:val="28"/>
+          </w:rPr>
+          <m:t>loc ≈ (-4,2 + 6,5) / 2 = 1,15</m:t>
+        </m:r>
+      </m:oMath>
+      <w:r>
+        <w:rPr>
+          <w:sz w:val="28"/>
+          <w:szCs w:val="28"/>
+        </w:rPr>
+        <w:t>;</w:t>
+      </w:r>
+    </w:p>
+    <w:p>
+      <w:pPr>
+        <w:spacing w:line="360" w:lineRule="auto"/>
+        <w:ind w:left="720" w:hanging="360"/>
+        <w:jc w:val="both"/>
+        <w:rPr>
+          <w:sz w:val="28"/>
+          <w:szCs w:val="28"/>
+        </w:rPr>
+      </w:pPr>
+      <w:r>
+        <w:rPr>
+          <w:sz w:val="28"/>
+          <w:szCs w:val="28"/>
+        </w:rPr>
+        <w:t>–</w:t>
+      </w:r>
+      <w:r>
+        <w:rPr>
+          <w:sz w:val="28"/>
+          <w:szCs w:val="28"/>
+        </w:rPr>
+        <w:tab/>
+      </w:r>
+      <w:r>
+        <w:rPr>
+          <w:sz w:val="28"/>
+          <w:szCs w:val="28"/>
+        </w:rPr>
+        <w:t>р</w:t>
+      </w:r>
+      <w:r>
+        <w:rPr>
+          <w:sz w:val="28"/>
+          <w:szCs w:val="28"/>
+        </w:rPr>
+        <w:t xml:space="preserve">асстояние от пика до </w:t>
+      </w:r>
+      <m:oMath>
+        <m:r>
+          <w:rPr>
+            <w:rFonts w:ascii="Cambria Math" w:hAnsi="Cambria Math"/>
+            <w:sz w:val="28"/>
+            <w:szCs w:val="28"/>
+          </w:rPr>
+          <m:t>loc</m:t>
+        </m:r>
+      </m:oMath>
+      <w:r>
+        <w:rPr>
+          <w:sz w:val="28"/>
+          <w:szCs w:val="28"/>
+        </w:rPr>
+        <w:t xml:space="preserve"> определяется как </w:t>
+      </w:r>
+      <m:oMath>
+        <m:r>
+          <w:rPr>
+            <w:rFonts w:ascii="Cambria Math" w:hAnsi="Cambria Math"/>
+            <w:sz w:val="28"/>
+            <w:szCs w:val="28"/>
+          </w:rPr>
+          <m:t>(α - 1) / β</m:t>
+        </m:r>
+      </m:oMath>
+      <w:r>
+        <w:rPr>
+          <w:sz w:val="28"/>
+          <w:szCs w:val="28"/>
+        </w:rPr>
+        <w:t>; с учётом оценки:</w:t>
+      </w:r>
+      <m:oMath>
+        <m:r>
+          <w:rPr>
+            <w:rFonts w:ascii="Cambria Math" w:hAnsi="Cambria Math"/>
+            <w:sz w:val="28"/>
+            <w:szCs w:val="28"/>
+          </w:rPr>
+          <m:t xml:space="preserve"> α - 1 ≈ (6,5 - 1,15) × 1 ≈ 5,35</m:t>
+        </m:r>
+      </m:oMath>
+      <w:r>
+        <w:rPr>
+          <w:sz w:val="28"/>
+          <w:szCs w:val="28"/>
+        </w:rPr>
+        <w:t xml:space="preserve">, то есть </w:t>
+      </w:r>
+      <m:oMath>
+        <m:r>
+          <w:rPr>
+            <w:rFonts w:ascii="Cambria Math" w:hAnsi="Cambria Math"/>
+            <w:sz w:val="28"/>
+            <w:szCs w:val="28"/>
+          </w:rPr>
+          <m:t>α ≈ 6,35</m:t>
+        </m:r>
+      </m:oMath>
+      <w:r>
+        <w:rPr>
+          <w:sz w:val="28"/>
+          <w:szCs w:val="28"/>
+        </w:rPr>
+        <w:t>.</w:t>
+      </w:r>
+    </w:p>
+    <w:p>
+      <w:pPr>
+        <w:spacing w:line="360" w:lineRule="auto"/>
+        <w:jc w:val="both"/>
+        <w:rPr>
+          <w:sz w:val="28"/>
+          <w:szCs w:val="28"/>
+        </w:rPr>
+      </w:pPr>
+    </w:p>
+    <w:p>
+      <w:pPr>
+        <w:spacing w:line="360" w:lineRule="auto"/>
+        <w:ind w:firstLine="720"/>
+        <w:jc w:val="both"/>
+        <w:rPr>
+          <w:sz w:val="28"/>
+          <w:szCs w:val="28"/>
+        </w:rPr>
+      </w:pPr>
+      <w:r>
+        <w:rPr>
+          <w:sz w:val="28"/>
+          <w:szCs w:val="28"/>
+        </w:rPr>
+        <w:t xml:space="preserve">Таким образом, по гистограмме полной выборки получены предварительные оценки: </w:t>
+      </w:r>
+      <m:oMath>
+        <m:r>
+          <w:rPr>
+            <w:rFonts w:ascii="Cambria Math" w:hAnsi="Cambria Math"/>
+            <w:sz w:val="28"/>
+            <w:szCs w:val="28"/>
+          </w:rPr>
+          <m:t>α ≈ 6,35</m:t>
+        </m:r>
+      </m:oMath>
+      <w:r>
+        <w:rPr>
+          <w:sz w:val="28"/>
+          <w:szCs w:val="28"/>
+        </w:rPr>
+        <w:t xml:space="preserve">, </w:t>
+      </w:r>
+      <m:oMath>
+        <m:r>
+          <w:rPr>
+            <w:rFonts w:ascii="Cambria Math" w:hAnsi="Cambria Math"/>
+            <w:sz w:val="28"/>
+            <w:szCs w:val="28"/>
+          </w:rPr>
+          <m:t>β = 1</m:t>
+        </m:r>
+      </m:oMath>
+      <w:r>
+        <w:rPr>
+          <w:sz w:val="28"/>
+          <w:szCs w:val="28"/>
+        </w:rPr>
+        <w:t xml:space="preserve">, </w:t>
+      </w:r>
+      <m:oMath>
+        <m:r>
+          <w:rPr>
+            <w:rFonts w:ascii="Cambria Math" w:hAnsi="Cambria Math"/>
+            <w:sz w:val="28"/>
+            <w:szCs w:val="28"/>
+          </w:rPr>
+          <m:t>loc ≈ 1,15</m:t>
+        </m:r>
+      </m:oMath>
+      <w:r>
+        <w:rPr>
+          <w:sz w:val="28"/>
+          <w:szCs w:val="28"/>
+        </w:rPr>
+        <w:t xml:space="preserve">. </w:t>
+      </w:r>
+    </w:p>
+    <w:p>
+      <w:pPr>
+        <w:spacing w:line="360" w:lineRule="auto"/>
+        <w:jc w:val="both"/>
+        <w:rPr>
+          <w:sz w:val="28"/>
+          <w:szCs w:val="28"/>
+        </w:rPr>
+      </w:pPr>
+    </w:p>
+    <w:p>
+      <w:pPr>
+        <w:spacing w:line="360" w:lineRule="auto"/>
+        <w:ind w:firstLine="720"/>
+        <w:jc w:val="both"/>
+        <w:rPr>
+          <w:sz w:val="28"/>
+          <w:szCs w:val="28"/>
+        </w:rPr>
+      </w:pPr>
+      <w:proofErr w:type="spellStart"/>
+      <w:r>
+        <w:rPr>
+          <w:b/>
+          <w:bCs/>
+          <w:sz w:val="28"/>
+          <w:szCs w:val="28"/>
+        </w:rPr>
         <w:lastRenderedPageBreak/>
         <w:t>Подвыборка</w:t>
       </w:r>
@@ -10088,7 +10821,24 @@
           <w:sz w:val="28"/>
           <w:szCs w:val="28"/>
         </w:rPr>
-        <w:t xml:space="preserve"> прослеживается, однако правый пик размыт: его положение можно оценить лишь ориентировочно в диапазоне x ∈ [5; 9]. Гистограмма отражает общий характер распределения, но точность оценки параметров по ней невысока.</w:t>
+        <w:t xml:space="preserve"> прослеживается, однако правый пик размыт: его положение можно оценить лишь ориентировочно в диапазоне </w:t>
+      </w:r>
+      <m:oMath>
+        <m:r>
+          <w:rPr>
+            <w:rFonts w:ascii="Cambria Math" w:hAnsi="Cambria Math"/>
+            <w:sz w:val="28"/>
+            <w:szCs w:val="28"/>
+          </w:rPr>
+          <m:t>x ∈ [5; 9]</m:t>
+        </m:r>
+      </m:oMath>
+      <w:r>
+        <w:rPr>
+          <w:sz w:val="28"/>
+          <w:szCs w:val="28"/>
+        </w:rPr>
+        <w:t>. Гистограмма отражает общий характер распределения, но точность оценки параметров по ней невысока.</w:t>
       </w:r>
     </w:p>
     <w:p>
@@ -10531,22 +11281,16 @@
         </w:rPr>
         <w:t xml:space="preserve"> </w:t>
       </w:r>
-      <w:proofErr w:type="spellStart"/>
-      <w:r>
-        <w:rPr>
-          <w:sz w:val="28"/>
-          <w:szCs w:val="28"/>
-        </w:rPr>
-        <w:t>loc</w:t>
-      </w:r>
-      <w:proofErr w:type="spellEnd"/>
-      <w:r>
-        <w:rPr>
-          <w:sz w:val="28"/>
-          <w:szCs w:val="28"/>
-        </w:rPr>
-        <w:t> ≈ 1,2</w:t>
-      </w:r>
+      <m:oMath>
+        <m:r>
+          <w:rPr>
+            <w:rFonts w:ascii="Cambria Math" w:hAnsi="Cambria Math"/>
+            <w:sz w:val="28"/>
+            <w:szCs w:val="28"/>
+          </w:rPr>
+          <m:t>loc ≈ 1,2</m:t>
+        </m:r>
+      </m:oMath>
       <w:r>
         <w:rPr>
           <w:sz w:val="28"/>
@@ -10598,8 +11342,18 @@
           <w:sz w:val="28"/>
           <w:szCs w:val="28"/>
         </w:rPr>
-        <w:t xml:space="preserve"> α ≈ 6,35</w:t>
-      </w:r>
+        <w:t xml:space="preserve"> </w:t>
+      </w:r>
+      <m:oMath>
+        <m:r>
+          <w:rPr>
+            <w:rFonts w:ascii="Cambria Math" w:hAnsi="Cambria Math"/>
+            <w:sz w:val="28"/>
+            <w:szCs w:val="28"/>
+          </w:rPr>
+          <m:t>α ≈ 6,35</m:t>
+        </m:r>
+      </m:oMath>
       <w:r>
         <w:rPr>
           <w:sz w:val="28"/>
@@ -10653,13 +11407,16 @@
         </w:rPr>
         <w:t xml:space="preserve"> </w:t>
       </w:r>
-      <w:r>
-        <w:rPr>
-          <w:sz w:val="28"/>
-          <w:szCs w:val="28"/>
-        </w:rPr>
-        <w:t>β = 1</w:t>
-      </w:r>
+      <m:oMath>
+        <m:r>
+          <w:rPr>
+            <w:rFonts w:ascii="Cambria Math" w:hAnsi="Cambria Math"/>
+            <w:sz w:val="28"/>
+            <w:szCs w:val="28"/>
+          </w:rPr>
+          <m:t>β = 1</m:t>
+        </m:r>
+      </m:oMath>
       <w:r>
         <w:rPr>
           <w:sz w:val="28"/>
@@ -10867,21 +11624,22 @@
         </w:rPr>
         <w:t xml:space="preserve">ри </w:t>
       </w:r>
-      <w:proofErr w:type="gramStart"/>
-      <w:r>
-        <w:rPr>
-          <w:sz w:val="28"/>
-          <w:szCs w:val="28"/>
-        </w:rPr>
-        <w:t>α&lt;</w:t>
-      </w:r>
-      <w:proofErr w:type="gramEnd"/>
-      <w:r>
-        <w:rPr>
-          <w:sz w:val="28"/>
-          <w:szCs w:val="28"/>
-        </w:rPr>
-        <w:t>1 — один острый пик в точке μ</w:t>
+      <m:oMath>
+        <m:r>
+          <w:rPr>
+            <w:rFonts w:ascii="Cambria Math" w:hAnsi="Cambria Math"/>
+            <w:sz w:val="28"/>
+            <w:szCs w:val="28"/>
+          </w:rPr>
+          <m:t>α&lt;1</m:t>
+        </m:r>
+      </m:oMath>
+      <w:r>
+        <w:rPr>
+          <w:sz w:val="28"/>
+          <w:szCs w:val="28"/>
+        </w:rPr>
+        <w:t xml:space="preserve"> — один острый пик в точке μ</w:t>
       </w:r>
       <w:r>
         <w:rPr>
@@ -10916,23 +11674,24 @@
           <w:sz w:val="28"/>
           <w:szCs w:val="28"/>
         </w:rPr>
-        <w:t>ри α=1 — вырождается в двустороннее экспоненциальное (</w:t>
-      </w:r>
-      <w:proofErr w:type="spellStart"/>
-      <w:r>
-        <w:rPr>
-          <w:sz w:val="28"/>
-          <w:szCs w:val="28"/>
-        </w:rPr>
-        <w:t>Лапласово</w:t>
-      </w:r>
-      <w:proofErr w:type="spellEnd"/>
-      <w:r>
-        <w:rPr>
-          <w:sz w:val="28"/>
-          <w:szCs w:val="28"/>
-        </w:rPr>
-        <w:t>) распределение</w:t>
+        <w:t xml:space="preserve">ри </w:t>
+      </w:r>
+      <m:oMath>
+        <m:r>
+          <w:rPr>
+            <w:rFonts w:ascii="Cambria Math" w:hAnsi="Cambria Math"/>
+            <w:sz w:val="28"/>
+            <w:szCs w:val="28"/>
+          </w:rPr>
+          <m:t>α=1</m:t>
+        </m:r>
+      </m:oMath>
+      <w:r>
+        <w:rPr>
+          <w:sz w:val="28"/>
+          <w:szCs w:val="28"/>
+        </w:rPr>
+        <w:t xml:space="preserve"> — вырождается в двустороннее экспоненциальное (Лапласово) распределение</w:t>
       </w:r>
       <w:r>
         <w:rPr>
@@ -10967,7 +11726,24 @@
           <w:sz w:val="28"/>
           <w:szCs w:val="28"/>
         </w:rPr>
-        <w:t xml:space="preserve">ри α&gt;1 — появляются </w:t>
+        <w:t xml:space="preserve">ри </w:t>
+      </w:r>
+      <m:oMath>
+        <m:r>
+          <w:rPr>
+            <w:rFonts w:ascii="Cambria Math" w:hAnsi="Cambria Math"/>
+            <w:sz w:val="28"/>
+            <w:szCs w:val="28"/>
+          </w:rPr>
+          <m:t>α&gt;1</m:t>
+        </m:r>
+      </m:oMath>
+      <w:r>
+        <w:rPr>
+          <w:sz w:val="28"/>
+          <w:szCs w:val="28"/>
+        </w:rPr>
+        <w:t xml:space="preserve"> — появляются </w:t>
       </w:r>
       <w:r>
         <w:rPr>
@@ -11018,7 +11794,24 @@
           <w:sz w:val="28"/>
           <w:szCs w:val="28"/>
         </w:rPr>
-        <w:t>ем больше α— тем дальше пики от центра и тем более они выражены</w:t>
+        <w:t xml:space="preserve">ем больше </w:t>
+      </w:r>
+      <m:oMath>
+        <m:r>
+          <w:rPr>
+            <w:rFonts w:ascii="Cambria Math" w:hAnsi="Cambria Math"/>
+            <w:sz w:val="28"/>
+            <w:szCs w:val="28"/>
+          </w:rPr>
+          <m:t>α</m:t>
+        </m:r>
+      </m:oMath>
+      <w:r>
+        <w:rPr>
+          <w:sz w:val="28"/>
+          <w:szCs w:val="28"/>
+        </w:rPr>
+        <w:t>— тем дальше пики от центра и тем более они выражены</w:t>
       </w:r>
     </w:p>
     <w:p>
@@ -11036,17 +11829,18 @@
           <w:sz w:val="28"/>
           <w:szCs w:val="28"/>
         </w:rPr>
-        <w:t>Моды находятся в точках μ±(α−</w:t>
-      </w:r>
-      <w:proofErr w:type="gramStart"/>
-      <w:r>
-        <w:rPr>
-          <w:sz w:val="28"/>
-          <w:szCs w:val="28"/>
-        </w:rPr>
-        <w:t>1)β</w:t>
-      </w:r>
-      <w:proofErr w:type="gramEnd"/>
+        <w:t xml:space="preserve">Моды находятся в точках </w:t>
+      </w:r>
+      <m:oMath>
+        <m:r>
+          <w:rPr>
+            <w:rFonts w:ascii="Cambria Math" w:hAnsi="Cambria Math"/>
+            <w:sz w:val="28"/>
+            <w:szCs w:val="28"/>
+          </w:rPr>
+          <m:t>μ±(α-1)β</m:t>
+        </m:r>
+      </m:oMath>
       <w:r>
         <w:rPr>
           <w:sz w:val="28"/>
@@ -11143,7 +11937,24 @@
           <w:sz w:val="28"/>
           <w:szCs w:val="28"/>
         </w:rPr>
-        <w:t>ри μ=0 — стандартное двойное гамма, симметрично относительно нуля</w:t>
+        <w:t xml:space="preserve">ри </w:t>
+      </w:r>
+      <m:oMath>
+        <m:r>
+          <w:rPr>
+            <w:rFonts w:ascii="Cambria Math" w:hAnsi="Cambria Math"/>
+            <w:sz w:val="28"/>
+            <w:szCs w:val="28"/>
+          </w:rPr>
+          <m:t>μ=0</m:t>
+        </m:r>
+      </m:oMath>
+      <w:r>
+        <w:rPr>
+          <w:sz w:val="28"/>
+          <w:szCs w:val="28"/>
+        </w:rPr>
+        <w:t xml:space="preserve"> — стандартное двойное гамма, симметрично относительно нуля</w:t>
       </w:r>
       <w:r>
         <w:rPr>
@@ -11171,6 +11982,7 @@
           <w:sz w:val="28"/>
           <w:szCs w:val="28"/>
         </w:rPr>
+        <w:lastRenderedPageBreak/>
         <w:t>п</w:t>
       </w:r>
       <w:r>
@@ -11178,7 +11990,24 @@
           <w:sz w:val="28"/>
           <w:szCs w:val="28"/>
         </w:rPr>
-        <w:t xml:space="preserve">ри μ≠0 — вся кривая </w:t>
+        <w:t xml:space="preserve">ри </w:t>
+      </w:r>
+      <m:oMath>
+        <m:r>
+          <w:rPr>
+            <w:rFonts w:ascii="Cambria Math" w:hAnsi="Cambria Math"/>
+            <w:sz w:val="28"/>
+            <w:szCs w:val="28"/>
+          </w:rPr>
+          <m:t>μ≠0</m:t>
+        </m:r>
+      </m:oMath>
+      <w:r>
+        <w:rPr>
+          <w:sz w:val="28"/>
+          <w:szCs w:val="28"/>
+        </w:rPr>
+        <w:t xml:space="preserve"> — вся кривая </w:t>
       </w:r>
       <w:r>
         <w:rPr>
@@ -11222,7 +12051,6 @@
           <w:sz w:val="28"/>
           <w:szCs w:val="28"/>
         </w:rPr>
-        <w:lastRenderedPageBreak/>
         <w:t>н</w:t>
       </w:r>
       <w:r>
@@ -11498,7 +12326,7 @@
     <w:p>
       <w:pPr>
         <w:spacing w:line="360" w:lineRule="auto"/>
-        <w:jc w:val="both"/>
+        <w:jc w:val="center"/>
         <w:rPr>
           <w:sz w:val="28"/>
           <w:szCs w:val="28"/>
@@ -15283,6 +16111,16 @@
     <w:basedOn w:val="a0"/>
     <w:rsid w:val="000B18D8"/>
   </w:style>
+  <w:style w:type="character" w:styleId="af">
+    <w:name w:val="Placeholder Text"/>
+    <w:basedOn w:val="a0"/>
+    <w:uiPriority w:val="99"/>
+    <w:semiHidden/>
+    <w:rsid w:val="0053289C"/>
+    <w:rPr>
+      <w:color w:val="666666"/>
+    </w:rPr>
+  </w:style>
 </w:styles>
 </file>
 

</xml_diff>

<commit_message>
vault backup: 2026-09-21 20:58:08
</commit_message>
<xml_diff>
--- a/Учеба 4 семестр/Теория вероятности/Курсовая работа/Отчет, Код/Курсовая_работа.docx
+++ b/Учеба 4 семестр/Теория вероятности/Курсовая работа/Отчет, Код/Курсовая_работа.docx
@@ -2690,15 +2690,7 @@
             <w:sz w:val="28"/>
             <w:szCs w:val="28"/>
           </w:rPr>
-          <m:t>α</m:t>
-        </m:r>
-        <m:r>
-          <w:rPr>
-            <w:rFonts w:ascii="Cambria Math" w:hAnsi="Cambria Math"/>
-            <w:sz w:val="28"/>
-            <w:szCs w:val="28"/>
-          </w:rPr>
-          <m:t xml:space="preserve"> &gt; 0</m:t>
+          <m:t>α &gt; 0</m:t>
         </m:r>
       </m:oMath>
       <w:r>
@@ -2739,15 +2731,7 @@
             <w:sz w:val="28"/>
             <w:szCs w:val="28"/>
           </w:rPr>
-          <m:t>β</m:t>
-        </m:r>
-        <m:r>
-          <w:rPr>
-            <w:rFonts w:ascii="Cambria Math" w:hAnsi="Cambria Math"/>
-            <w:sz w:val="28"/>
-            <w:szCs w:val="28"/>
-          </w:rPr>
-          <m:t xml:space="preserve"> &gt; 0</m:t>
+          <m:t>β &gt; 0</m:t>
         </m:r>
       </m:oMath>
       <w:r>
@@ -5398,31 +5382,7 @@
             <w:sz w:val="28"/>
             <w:szCs w:val="28"/>
           </w:rPr>
-          <m:t>F</m:t>
-        </m:r>
-        <m:r>
-          <w:rPr>
-            <w:rFonts w:ascii="Cambria Math" w:hAnsi="Cambria Math"/>
-            <w:sz w:val="28"/>
-            <w:szCs w:val="28"/>
-          </w:rPr>
-          <m:t>ₙ(</m:t>
-        </m:r>
-        <m:r>
-          <w:rPr>
-            <w:rFonts w:ascii="Cambria Math" w:hAnsi="Cambria Math"/>
-            <w:sz w:val="28"/>
-            <w:szCs w:val="28"/>
-          </w:rPr>
-          <m:t>x</m:t>
-        </m:r>
-        <m:r>
-          <w:rPr>
-            <w:rFonts w:ascii="Cambria Math" w:hAnsi="Cambria Math"/>
-            <w:sz w:val="28"/>
-            <w:szCs w:val="28"/>
-          </w:rPr>
-          <m:t>)</m:t>
+          <m:t>Fₙ(x)</m:t>
         </m:r>
       </m:oMath>
       <w:r>
@@ -11429,54 +11389,414 @@
       <w:pPr>
         <w:spacing w:line="360" w:lineRule="auto"/>
         <w:ind w:firstLine="360"/>
-        <w:jc w:val="center"/>
-        <w:rPr>
-          <w:sz w:val="28"/>
-          <w:szCs w:val="28"/>
-        </w:rPr>
-      </w:pPr>
-      <w:r>
-        <w:rPr>
-          <w:noProof/>
-          <w:sz w:val="28"/>
-          <w:szCs w:val="28"/>
-        </w:rPr>
-        <w:drawing>
-          <wp:inline distT="0" distB="0" distL="0" distR="0" wp14:anchorId="02320914" wp14:editId="5492FB7D">
-            <wp:extent cx="3019846" cy="733527"/>
-            <wp:effectExtent l="0" t="0" r="9525" b="9525"/>
-            <wp:docPr id="1461414313" name="Рисунок 1"/>
-            <wp:cNvGraphicFramePr>
-              <a:graphicFrameLocks xmlns:a="http://schemas.openxmlformats.org/drawingml/2006/main" noChangeAspect="1"/>
-            </wp:cNvGraphicFramePr>
-            <a:graphic xmlns:a="http://schemas.openxmlformats.org/drawingml/2006/main">
-              <a:graphicData uri="http://schemas.openxmlformats.org/drawingml/2006/picture">
-                <pic:pic xmlns:pic="http://schemas.openxmlformats.org/drawingml/2006/picture">
-                  <pic:nvPicPr>
-                    <pic:cNvPr id="1461414313" name=""/>
-                    <pic:cNvPicPr/>
-                  </pic:nvPicPr>
-                  <pic:blipFill>
-                    <a:blip r:embed="rId26"/>
-                    <a:stretch>
-                      <a:fillRect/>
-                    </a:stretch>
-                  </pic:blipFill>
-                  <pic:spPr>
-                    <a:xfrm>
-                      <a:off x="0" y="0"/>
-                      <a:ext cx="3019846" cy="733527"/>
-                    </a:xfrm>
-                    <a:prstGeom prst="rect">
-                      <a:avLst/>
-                    </a:prstGeom>
-                  </pic:spPr>
-                </pic:pic>
-              </a:graphicData>
-            </a:graphic>
-          </wp:inline>
-        </w:drawing>
-      </w:r>
+        <w:jc w:val="both"/>
+        <w:rPr>
+          <w:sz w:val="28"/>
+          <w:szCs w:val="28"/>
+          <w:lang w:val="en-US"/>
+        </w:rPr>
+      </w:pPr>
+      <m:oMathPara>
+        <m:oMathParaPr>
+          <m:jc m:val="center"/>
+        </m:oMathParaPr>
+        <m:oMath>
+          <m:r>
+            <w:rPr>
+              <w:rFonts w:ascii="Cambria Math" w:hAnsi="Cambria Math"/>
+              <w:sz w:val="28"/>
+              <w:szCs w:val="28"/>
+              <w:lang w:val="en-US"/>
+            </w:rPr>
+            <m:t>f</m:t>
+          </m:r>
+          <m:d>
+            <m:dPr>
+              <m:ctrlPr>
+                <w:rPr>
+                  <w:rFonts w:ascii="Cambria Math" w:hAnsi="Cambria Math"/>
+                  <w:sz w:val="28"/>
+                  <w:szCs w:val="28"/>
+                  <w:lang w:val="en-US"/>
+                </w:rPr>
+              </m:ctrlPr>
+            </m:dPr>
+            <m:e>
+              <m:r>
+                <w:rPr>
+                  <w:rFonts w:ascii="Cambria Math" w:hAnsi="Cambria Math"/>
+                  <w:sz w:val="28"/>
+                  <w:szCs w:val="28"/>
+                  <w:lang w:val="en-US"/>
+                </w:rPr>
+                <m:t>x</m:t>
+              </m:r>
+              <m:r>
+                <m:rPr>
+                  <m:sty m:val="p"/>
+                </m:rPr>
+                <w:rPr>
+                  <w:rFonts w:ascii="Cambria Math" w:hAnsi="Cambria Math"/>
+                  <w:sz w:val="28"/>
+                  <w:szCs w:val="28"/>
+                  <w:lang w:val="en-US"/>
+                </w:rPr>
+                <m:t>|</m:t>
+              </m:r>
+              <m:r>
+                <w:rPr>
+                  <w:rFonts w:ascii="Cambria Math" w:hAnsi="Cambria Math"/>
+                  <w:sz w:val="28"/>
+                  <w:szCs w:val="28"/>
+                  <w:lang w:val="en-US"/>
+                </w:rPr>
+                <m:t>α</m:t>
+              </m:r>
+              <m:r>
+                <m:rPr>
+                  <m:sty m:val="p"/>
+                </m:rPr>
+                <w:rPr>
+                  <w:rFonts w:ascii="Cambria Math" w:hAnsi="Cambria Math"/>
+                  <w:sz w:val="28"/>
+                  <w:szCs w:val="28"/>
+                  <w:lang w:val="en-US"/>
+                </w:rPr>
+                <m:t>,</m:t>
+              </m:r>
+              <m:r>
+                <w:rPr>
+                  <w:rFonts w:ascii="Cambria Math" w:hAnsi="Cambria Math"/>
+                  <w:sz w:val="28"/>
+                  <w:szCs w:val="28"/>
+                  <w:lang w:val="en-US"/>
+                </w:rPr>
+                <m:t>β</m:t>
+              </m:r>
+              <m:r>
+                <m:rPr>
+                  <m:sty m:val="p"/>
+                </m:rPr>
+                <w:rPr>
+                  <w:rFonts w:ascii="Cambria Math" w:hAnsi="Cambria Math"/>
+                  <w:sz w:val="28"/>
+                  <w:szCs w:val="28"/>
+                  <w:lang w:val="en-US"/>
+                </w:rPr>
+                <m:t>,</m:t>
+              </m:r>
+              <m:r>
+                <w:rPr>
+                  <w:rFonts w:ascii="Cambria Math" w:hAnsi="Cambria Math"/>
+                  <w:sz w:val="28"/>
+                  <w:szCs w:val="28"/>
+                  <w:lang w:val="en-US"/>
+                </w:rPr>
+                <m:t>μ</m:t>
+              </m:r>
+            </m:e>
+          </m:d>
+          <m:r>
+            <m:rPr>
+              <m:sty m:val="p"/>
+            </m:rPr>
+            <w:rPr>
+              <w:rFonts w:ascii="Cambria Math" w:hAnsi="Cambria Math"/>
+              <w:sz w:val="28"/>
+              <w:szCs w:val="28"/>
+              <w:lang w:val="en-US"/>
+            </w:rPr>
+            <m:t>=</m:t>
+          </m:r>
+          <m:f>
+            <m:fPr>
+              <m:ctrlPr>
+                <w:rPr>
+                  <w:rFonts w:ascii="Cambria Math" w:hAnsi="Cambria Math"/>
+                  <w:sz w:val="28"/>
+                  <w:szCs w:val="28"/>
+                  <w:lang w:val="en-US"/>
+                </w:rPr>
+              </m:ctrlPr>
+            </m:fPr>
+            <m:num>
+              <m:sSup>
+                <m:sSupPr>
+                  <m:ctrlPr>
+                    <w:rPr>
+                      <w:rFonts w:ascii="Cambria Math" w:hAnsi="Cambria Math"/>
+                      <w:sz w:val="28"/>
+                      <w:szCs w:val="28"/>
+                      <w:lang w:val="en-US"/>
+                    </w:rPr>
+                  </m:ctrlPr>
+                </m:sSupPr>
+                <m:e>
+                  <m:d>
+                    <m:dPr>
+                      <m:begChr m:val="|"/>
+                      <m:endChr m:val="|"/>
+                      <m:ctrlPr>
+                        <w:rPr>
+                          <w:rFonts w:ascii="Cambria Math" w:hAnsi="Cambria Math"/>
+                          <w:sz w:val="28"/>
+                          <w:szCs w:val="28"/>
+                          <w:lang w:val="en-US"/>
+                        </w:rPr>
+                      </m:ctrlPr>
+                    </m:dPr>
+                    <m:e>
+                      <m:r>
+                        <w:rPr>
+                          <w:rFonts w:ascii="Cambria Math" w:hAnsi="Cambria Math"/>
+                          <w:sz w:val="28"/>
+                          <w:szCs w:val="28"/>
+                          <w:lang w:val="en-US"/>
+                        </w:rPr>
+                        <m:t>x</m:t>
+                      </m:r>
+                      <m:r>
+                        <m:rPr>
+                          <m:sty m:val="p"/>
+                        </m:rPr>
+                        <w:rPr>
+                          <w:rFonts w:ascii="Cambria Math" w:hAnsi="Cambria Math"/>
+                          <w:sz w:val="28"/>
+                          <w:szCs w:val="28"/>
+                          <w:lang w:val="en-US"/>
+                        </w:rPr>
+                        <m:t>-</m:t>
+                      </m:r>
+                      <m:r>
+                        <w:rPr>
+                          <w:rFonts w:ascii="Cambria Math" w:hAnsi="Cambria Math"/>
+                          <w:sz w:val="28"/>
+                          <w:szCs w:val="28"/>
+                          <w:lang w:val="en-US"/>
+                        </w:rPr>
+                        <m:t>loc</m:t>
+                      </m:r>
+                    </m:e>
+                  </m:d>
+                </m:e>
+                <m:sup>
+                  <m:r>
+                    <w:rPr>
+                      <w:rFonts w:ascii="Cambria Math" w:hAnsi="Cambria Math"/>
+                      <w:sz w:val="28"/>
+                      <w:szCs w:val="28"/>
+                      <w:lang w:val="en-US"/>
+                    </w:rPr>
+                    <m:t>α</m:t>
+                  </m:r>
+                  <m:r>
+                    <m:rPr>
+                      <m:sty m:val="p"/>
+                    </m:rPr>
+                    <w:rPr>
+                      <w:rFonts w:ascii="Cambria Math" w:hAnsi="Cambria Math"/>
+                      <w:sz w:val="28"/>
+                      <w:szCs w:val="28"/>
+                      <w:lang w:val="en-US"/>
+                    </w:rPr>
+                    <m:t>-</m:t>
+                  </m:r>
+                  <m:r>
+                    <w:rPr>
+                      <w:rFonts w:ascii="Cambria Math" w:hAnsi="Cambria Math"/>
+                      <w:sz w:val="28"/>
+                      <w:szCs w:val="28"/>
+                      <w:lang w:val="en-US"/>
+                    </w:rPr>
+                    <m:t>1</m:t>
+                  </m:r>
+                </m:sup>
+              </m:sSup>
+              <m:sSup>
+                <m:sSupPr>
+                  <m:ctrlPr>
+                    <w:rPr>
+                      <w:rFonts w:ascii="Cambria Math" w:hAnsi="Cambria Math"/>
+                      <w:sz w:val="28"/>
+                      <w:szCs w:val="28"/>
+                      <w:lang w:val="en-US"/>
+                    </w:rPr>
+                  </m:ctrlPr>
+                </m:sSupPr>
+                <m:e>
+                  <m:r>
+                    <w:rPr>
+                      <w:rFonts w:ascii="Cambria Math" w:hAnsi="Cambria Math"/>
+                      <w:sz w:val="28"/>
+                      <w:szCs w:val="28"/>
+                      <w:lang w:val="en-US"/>
+                    </w:rPr>
+                    <m:t>e</m:t>
+                  </m:r>
+                </m:e>
+                <m:sup>
+                  <m:r>
+                    <m:rPr>
+                      <m:sty m:val="p"/>
+                    </m:rPr>
+                    <w:rPr>
+                      <w:rFonts w:ascii="Cambria Math" w:hAnsi="Cambria Math"/>
+                      <w:sz w:val="28"/>
+                      <w:szCs w:val="28"/>
+                      <w:lang w:val="en-US"/>
+                    </w:rPr>
+                    <m:t>-</m:t>
+                  </m:r>
+                  <m:d>
+                    <m:dPr>
+                      <m:begChr m:val="|"/>
+                      <m:endChr m:val="|"/>
+                      <m:ctrlPr>
+                        <w:rPr>
+                          <w:rFonts w:ascii="Cambria Math" w:hAnsi="Cambria Math"/>
+                          <w:sz w:val="28"/>
+                          <w:szCs w:val="28"/>
+                          <w:lang w:val="en-US"/>
+                        </w:rPr>
+                      </m:ctrlPr>
+                    </m:dPr>
+                    <m:e>
+                      <m:r>
+                        <w:rPr>
+                          <w:rFonts w:ascii="Cambria Math" w:hAnsi="Cambria Math"/>
+                          <w:sz w:val="28"/>
+                          <w:szCs w:val="28"/>
+                          <w:lang w:val="en-US"/>
+                        </w:rPr>
+                        <m:t>x</m:t>
+                      </m:r>
+                      <m:r>
+                        <m:rPr>
+                          <m:sty m:val="p"/>
+                        </m:rPr>
+                        <w:rPr>
+                          <w:rFonts w:ascii="Cambria Math" w:hAnsi="Cambria Math"/>
+                          <w:sz w:val="28"/>
+                          <w:szCs w:val="28"/>
+                          <w:lang w:val="en-US"/>
+                        </w:rPr>
+                        <m:t>-</m:t>
+                      </m:r>
+                      <m:r>
+                        <w:rPr>
+                          <w:rFonts w:ascii="Cambria Math" w:hAnsi="Cambria Math"/>
+                          <w:sz w:val="28"/>
+                          <w:szCs w:val="28"/>
+                          <w:lang w:val="en-US"/>
+                        </w:rPr>
+                        <m:t>loc</m:t>
+                      </m:r>
+                    </m:e>
+                  </m:d>
+                  <m:r>
+                    <m:rPr>
+                      <m:sty m:val="p"/>
+                    </m:rPr>
+                    <w:rPr>
+                      <w:rFonts w:ascii="Cambria Math" w:hAnsi="Cambria Math"/>
+                      <w:sz w:val="28"/>
+                      <w:szCs w:val="28"/>
+                      <w:lang w:val="en-US"/>
+                    </w:rPr>
+                    <m:t>/</m:t>
+                  </m:r>
+                  <m:r>
+                    <w:rPr>
+                      <w:rFonts w:ascii="Cambria Math" w:hAnsi="Cambria Math"/>
+                      <w:sz w:val="28"/>
+                      <w:szCs w:val="28"/>
+                      <w:lang w:val="en-US"/>
+                    </w:rPr>
+                    <m:t>β</m:t>
+                  </m:r>
+                </m:sup>
+              </m:sSup>
+            </m:num>
+            <m:den>
+              <m:r>
+                <w:rPr>
+                  <w:rFonts w:ascii="Cambria Math" w:hAnsi="Cambria Math"/>
+                  <w:sz w:val="28"/>
+                  <w:szCs w:val="28"/>
+                  <w:lang w:val="en-US"/>
+                </w:rPr>
+                <m:t>2</m:t>
+              </m:r>
+              <m:sSup>
+                <m:sSupPr>
+                  <m:ctrlPr>
+                    <w:rPr>
+                      <w:rFonts w:ascii="Cambria Math" w:hAnsi="Cambria Math"/>
+                      <w:sz w:val="28"/>
+                      <w:szCs w:val="28"/>
+                      <w:lang w:val="en-US"/>
+                    </w:rPr>
+                  </m:ctrlPr>
+                </m:sSupPr>
+                <m:e>
+                  <m:r>
+                    <w:rPr>
+                      <w:rFonts w:ascii="Cambria Math" w:hAnsi="Cambria Math"/>
+                      <w:sz w:val="28"/>
+                      <w:szCs w:val="28"/>
+                      <w:lang w:val="en-US"/>
+                    </w:rPr>
+                    <m:t>β</m:t>
+                  </m:r>
+                </m:e>
+                <m:sup>
+                  <m:r>
+                    <w:rPr>
+                      <w:rFonts w:ascii="Cambria Math" w:hAnsi="Cambria Math"/>
+                      <w:sz w:val="28"/>
+                      <w:szCs w:val="28"/>
+                      <w:lang w:val="en-US"/>
+                    </w:rPr>
+                    <m:t>α</m:t>
+                  </m:r>
+                </m:sup>
+              </m:sSup>
+              <m:r>
+                <w:rPr>
+                  <w:rFonts w:ascii="Cambria Math" w:hAnsi="Cambria Math"/>
+                  <w:sz w:val="28"/>
+                  <w:szCs w:val="28"/>
+                  <w:lang w:val="en-US"/>
+                </w:rPr>
+                <m:t>Γ</m:t>
+              </m:r>
+              <m:d>
+                <m:dPr>
+                  <m:ctrlPr>
+                    <w:rPr>
+                      <w:rFonts w:ascii="Cambria Math" w:hAnsi="Cambria Math"/>
+                      <w:sz w:val="28"/>
+                      <w:szCs w:val="28"/>
+                      <w:lang w:val="en-US"/>
+                    </w:rPr>
+                  </m:ctrlPr>
+                </m:dPr>
+                <m:e>
+                  <m:r>
+                    <w:rPr>
+                      <w:rFonts w:ascii="Cambria Math" w:hAnsi="Cambria Math"/>
+                      <w:sz w:val="28"/>
+                      <w:szCs w:val="28"/>
+                      <w:lang w:val="en-US"/>
+                    </w:rPr>
+                    <m:t>α</m:t>
+                  </m:r>
+                </m:e>
+              </m:d>
+            </m:den>
+          </m:f>
+        </m:oMath>
+      </m:oMathPara>
     </w:p>
     <w:p>
       <w:pPr>
@@ -11874,8 +12194,18 @@
           <w:bCs/>
           <w:sz w:val="28"/>
           <w:szCs w:val="28"/>
-        </w:rPr>
-        <w:t>μ — параметр смещения</w:t>
+          <w:lang w:val="en-US"/>
+        </w:rPr>
+        <w:t>loc</w:t>
+      </w:r>
+      <w:r>
+        <w:rPr>
+          <w:b/>
+          <w:bCs/>
+          <w:sz w:val="28"/>
+          <w:szCs w:val="28"/>
+        </w:rPr>
+        <w:t xml:space="preserve"> — параметр смещения</w:t>
       </w:r>
     </w:p>
     <w:p>
@@ -11946,7 +12276,24 @@
             <w:sz w:val="28"/>
             <w:szCs w:val="28"/>
           </w:rPr>
-          <m:t>μ=0</m:t>
+          <m:t>lo</m:t>
+        </m:r>
+        <m:r>
+          <w:rPr>
+            <w:rFonts w:ascii="Cambria Math" w:hAnsi="Cambria Math"/>
+            <w:sz w:val="28"/>
+            <w:szCs w:val="28"/>
+            <w:lang w:val="en-US"/>
+          </w:rPr>
+          <m:t>c</m:t>
+        </m:r>
+        <m:r>
+          <w:rPr>
+            <w:rFonts w:ascii="Cambria Math" w:hAnsi="Cambria Math"/>
+            <w:sz w:val="28"/>
+            <w:szCs w:val="28"/>
+          </w:rPr>
+          <m:t>=0</m:t>
         </m:r>
       </m:oMath>
       <w:r>
@@ -11999,7 +12346,24 @@
             <w:sz w:val="28"/>
             <w:szCs w:val="28"/>
           </w:rPr>
-          <m:t>μ≠0</m:t>
+          <m:t>l</m:t>
+        </m:r>
+        <m:r>
+          <w:rPr>
+            <w:rFonts w:ascii="Cambria Math" w:hAnsi="Cambria Math"/>
+            <w:sz w:val="28"/>
+            <w:szCs w:val="28"/>
+            <w:lang w:val="en-US"/>
+          </w:rPr>
+          <m:t>oc</m:t>
+        </m:r>
+        <m:r>
+          <w:rPr>
+            <w:rFonts w:ascii="Cambria Math" w:hAnsi="Cambria Math"/>
+            <w:sz w:val="28"/>
+            <w:szCs w:val="28"/>
+          </w:rPr>
+          <m:t>≠0</m:t>
         </m:r>
       </m:oMath>
       <w:r>
@@ -12354,7 +12718,7 @@
                     <pic:cNvPicPr/>
                   </pic:nvPicPr>
                   <pic:blipFill>
-                    <a:blip r:embed="rId27"/>
+                    <a:blip r:embed="rId26"/>
                     <a:stretch>
                       <a:fillRect/>
                     </a:stretch>
@@ -12436,7 +12800,7 @@
                     </pic:cNvPicPr>
                   </pic:nvPicPr>
                   <pic:blipFill>
-                    <a:blip r:embed="rId28">
+                    <a:blip r:embed="rId27">
                       <a:extLst>
                         <a:ext uri="{28A0092B-C50C-407E-A947-70E740481C1C}">
                           <a14:useLocalDpi xmlns:a14="http://schemas.microsoft.com/office/drawing/2010/main" val="0"/>
@@ -12532,7 +12896,7 @@
                     </pic:cNvPicPr>
                   </pic:nvPicPr>
                   <pic:blipFill>
-                    <a:blip r:embed="rId29">
+                    <a:blip r:embed="rId28">
                       <a:extLst>
                         <a:ext uri="{28A0092B-C50C-407E-A947-70E740481C1C}">
                           <a14:useLocalDpi xmlns:a14="http://schemas.microsoft.com/office/drawing/2010/main" val="0"/>
@@ -12686,7 +13050,7 @@
                     </pic:cNvPicPr>
                   </pic:nvPicPr>
                   <pic:blipFill>
-                    <a:blip r:embed="rId30">
+                    <a:blip r:embed="rId29">
                       <a:extLst>
                         <a:ext uri="{28A0092B-C50C-407E-A947-70E740481C1C}">
                           <a14:useLocalDpi xmlns:a14="http://schemas.microsoft.com/office/drawing/2010/main" val="0"/>
@@ -12811,7 +13175,7 @@
                     </pic:cNvPicPr>
                   </pic:nvPicPr>
                   <pic:blipFill>
-                    <a:blip r:embed="rId31">
+                    <a:blip r:embed="rId30">
                       <a:extLst>
                         <a:ext uri="{28A0092B-C50C-407E-A947-70E740481C1C}">
                           <a14:useLocalDpi xmlns:a14="http://schemas.microsoft.com/office/drawing/2010/main" val="0"/>
@@ -13171,7 +13535,7 @@
         </w:rPr>
         <w:t xml:space="preserve">: </w:t>
       </w:r>
-      <w:hyperlink r:id="rId32" w:history="1">
+      <w:hyperlink r:id="rId31" w:history="1">
         <w:r>
           <w:rPr>
             <w:rStyle w:val="ac"/>
@@ -13477,7 +13841,7 @@
         </w:rPr>
         <w:t xml:space="preserve"> </w:t>
       </w:r>
-      <w:hyperlink r:id="rId33" w:history="1">
+      <w:hyperlink r:id="rId32" w:history="1">
         <w:r>
           <w:rPr>
             <w:rStyle w:val="ac"/>
@@ -15744,7 +16108,6 @@
   <w:style w:type="character" w:default="1" w:styleId="a0">
     <w:name w:val="Default Paragraph Font"/>
     <w:uiPriority w:val="1"/>
-    <w:semiHidden/>
     <w:unhideWhenUsed/>
   </w:style>
   <w:style w:type="table" w:default="1" w:styleId="a1">

</xml_diff>

<commit_message>
UPDATE: графики DATE: 2026-09-21 22:25:33
</commit_message>
<xml_diff>
--- a/Учеба 4 семестр/Теория вероятности/Курсовая работа/Отчет, Код/Курсовая_работа.docx
+++ b/Учеба 4 семестр/Теория вероятности/Курсовая работа/Отчет, Код/Курсовая_работа.docx
@@ -1953,23 +1953,7 @@
           <w:sz w:val="28"/>
           <w:szCs w:val="28"/>
         </w:rPr>
-        <w:t xml:space="preserve">Объектом исследования является выборка случайной величины, подчиняющейся </w:t>
-      </w:r>
-      <w:proofErr w:type="gramStart"/>
-      <w:r>
-        <w:rPr>
-          <w:sz w:val="28"/>
-          <w:szCs w:val="28"/>
-        </w:rPr>
-        <w:t>двойному</w:t>
-      </w:r>
-      <w:proofErr w:type="gramEnd"/>
-      <w:r>
-        <w:rPr>
-          <w:sz w:val="28"/>
-          <w:szCs w:val="28"/>
-        </w:rPr>
-        <w:t xml:space="preserve"> гамма распределению. Предметом исследования — статистические свойства данной выборки и методы её анализа.</w:t>
+        <w:t>Объектом исследования является выборка случайной величины, подчиняющейся двойному гамма распределению. Предметом исследования — статистические свойства данной выборки и методы её анализа.</w:t>
       </w:r>
     </w:p>
     <w:p>
@@ -6996,14 +6980,12 @@
       <w:r>
         <w:rPr>
           <w:noProof/>
-          <w:sz w:val="28"/>
-          <w:szCs w:val="28"/>
         </w:rPr>
         <w:drawing>
-          <wp:inline distT="0" distB="0" distL="0" distR="0" wp14:anchorId="291C8169" wp14:editId="41F04A4D">
-            <wp:extent cx="5940425" cy="984885"/>
-            <wp:effectExtent l="0" t="0" r="3175" b="5715"/>
-            <wp:docPr id="1" name="Рисунок 1"/>
+          <wp:inline distT="0" distB="0" distL="0" distR="0" wp14:anchorId="323A2407" wp14:editId="24DDA0B1">
+            <wp:extent cx="5940425" cy="1243330"/>
+            <wp:effectExtent l="0" t="0" r="3175" b="0"/>
+            <wp:docPr id="3" name="Рисунок 3"/>
             <wp:cNvGraphicFramePr>
               <a:graphicFrameLocks xmlns:a="http://schemas.openxmlformats.org/drawingml/2006/main" noChangeAspect="1"/>
             </wp:cNvGraphicFramePr>
@@ -7011,172 +6993,13 @@
               <a:graphicData uri="http://schemas.openxmlformats.org/drawingml/2006/picture">
                 <pic:pic xmlns:pic="http://schemas.openxmlformats.org/drawingml/2006/picture">
                   <pic:nvPicPr>
-                    <pic:cNvPr id="1" name=""/>
-                    <pic:cNvPicPr/>
-                  </pic:nvPicPr>
-                  <pic:blipFill>
-                    <a:blip r:embed="rId15"/>
-                    <a:stretch>
-                      <a:fillRect/>
-                    </a:stretch>
-                  </pic:blipFill>
-                  <pic:spPr>
-                    <a:xfrm>
-                      <a:off x="0" y="0"/>
-                      <a:ext cx="5940425" cy="984885"/>
-                    </a:xfrm>
-                    <a:prstGeom prst="rect">
-                      <a:avLst/>
-                    </a:prstGeom>
-                  </pic:spPr>
-                </pic:pic>
-              </a:graphicData>
-            </a:graphic>
-          </wp:inline>
-        </w:drawing>
-      </w:r>
-    </w:p>
-    <w:p>
-      <w:pPr>
-        <w:spacing w:before="60" w:after="120" w:line="360" w:lineRule="auto"/>
-        <w:jc w:val="center"/>
-        <w:rPr>
-          <w:sz w:val="28"/>
-          <w:szCs w:val="28"/>
-        </w:rPr>
-      </w:pPr>
-      <w:r>
-        <w:rPr>
-          <w:sz w:val="28"/>
-          <w:szCs w:val="28"/>
-        </w:rPr>
-        <w:t>Листинг 10 – Функция построения эмпирической функции распределения</w:t>
-      </w:r>
-    </w:p>
-    <w:p>
-      <w:pPr>
-        <w:pStyle w:val="a7"/>
-        <w:spacing w:line="360" w:lineRule="auto"/>
-        <w:ind w:left="780"/>
-        <w:jc w:val="both"/>
-        <w:rPr>
-          <w:b/>
-          <w:bCs/>
-          <w:sz w:val="28"/>
-          <w:szCs w:val="28"/>
-        </w:rPr>
-      </w:pPr>
-    </w:p>
-    <w:p>
-      <w:pPr>
-        <w:spacing w:line="360" w:lineRule="auto"/>
-        <w:ind w:firstLine="708"/>
-        <w:jc w:val="both"/>
-        <w:rPr>
-          <w:sz w:val="28"/>
-          <w:szCs w:val="28"/>
-        </w:rPr>
-      </w:pPr>
-      <w:r>
-        <w:rPr>
-          <w:sz w:val="28"/>
-          <w:szCs w:val="28"/>
-        </w:rPr>
-        <w:t xml:space="preserve">Для анализа поведения ЭФР были сформированы три случайные </w:t>
-      </w:r>
-      <w:proofErr w:type="spellStart"/>
-      <w:r>
-        <w:rPr>
-          <w:sz w:val="28"/>
-          <w:szCs w:val="28"/>
-        </w:rPr>
-        <w:t>подвыборки</w:t>
-      </w:r>
-      <w:proofErr w:type="spellEnd"/>
-      <w:r>
-        <w:rPr>
-          <w:sz w:val="28"/>
-          <w:szCs w:val="28"/>
-        </w:rPr>
-        <w:t xml:space="preserve"> размером 10, 100 и 200 элементов из исходной выборки </w:t>
-      </w:r>
-      <m:oMath>
-        <m:r>
-          <w:rPr>
-            <w:rFonts w:ascii="Cambria Math" w:hAnsi="Cambria Math"/>
-            <w:sz w:val="28"/>
-            <w:szCs w:val="28"/>
-          </w:rPr>
-          <m:t>X</m:t>
-        </m:r>
-      </m:oMath>
-      <w:r>
-        <w:rPr>
-          <w:sz w:val="28"/>
-          <w:szCs w:val="28"/>
-        </w:rPr>
-        <w:t xml:space="preserve"> </w:t>
-      </w:r>
-      <w:r>
-        <w:rPr>
-          <w:sz w:val="28"/>
-          <w:szCs w:val="28"/>
-        </w:rPr>
-        <w:lastRenderedPageBreak/>
-        <w:t xml:space="preserve">объёмом </w:t>
-      </w:r>
-      <m:oMath>
-        <m:r>
-          <w:rPr>
-            <w:rFonts w:ascii="Cambria Math" w:hAnsi="Cambria Math"/>
-            <w:sz w:val="28"/>
-            <w:szCs w:val="28"/>
-          </w:rPr>
-          <m:t>n = 300</m:t>
-        </m:r>
-      </m:oMath>
-      <w:r>
-        <w:rPr>
-          <w:sz w:val="28"/>
-          <w:szCs w:val="28"/>
-        </w:rPr>
-        <w:t>. Для каждой подвыборки построен ступенчатый график ЭФР совместно с теоретической функцией двойного гамма-распределения.</w:t>
-      </w:r>
-    </w:p>
-    <w:p>
-      <w:pPr>
-        <w:spacing w:line="360" w:lineRule="auto"/>
-        <w:jc w:val="center"/>
-        <w:rPr>
-          <w:sz w:val="28"/>
-          <w:szCs w:val="28"/>
-        </w:rPr>
-      </w:pPr>
-      <w:r>
-        <w:rPr>
-          <w:noProof/>
-          <w:sz w:val="28"/>
-          <w:szCs w:val="28"/>
-        </w:rPr>
-        <w:drawing>
-          <wp:inline distT="0" distB="0" distL="0" distR="0" wp14:anchorId="68DCD5F9" wp14:editId="7B0994A9">
-            <wp:extent cx="5935980" cy="3756660"/>
-            <wp:effectExtent l="0" t="0" r="7620" b="0"/>
-            <wp:docPr id="9" name="Рисунок 9"/>
-            <wp:cNvGraphicFramePr>
-              <a:graphicFrameLocks xmlns:a="http://schemas.openxmlformats.org/drawingml/2006/main" noChangeAspect="1"/>
-            </wp:cNvGraphicFramePr>
-            <a:graphic xmlns:a="http://schemas.openxmlformats.org/drawingml/2006/main">
-              <a:graphicData uri="http://schemas.openxmlformats.org/drawingml/2006/picture">
-                <pic:pic xmlns:pic="http://schemas.openxmlformats.org/drawingml/2006/picture">
-                  <pic:nvPicPr>
-                    <pic:cNvPr id="0" name="Picture 17"/>
+                    <pic:cNvPr id="0" name="Picture 6"/>
                     <pic:cNvPicPr>
                       <a:picLocks noChangeAspect="1" noChangeArrowheads="1"/>
                     </pic:cNvPicPr>
                   </pic:nvPicPr>
                   <pic:blipFill>
-                    <a:blip r:embed="rId16" cstate="print">
+                    <a:blip r:embed="rId15">
                       <a:extLst>
                         <a:ext uri="{28A0092B-C50C-407E-A947-70E740481C1C}">
                           <a14:useLocalDpi xmlns:a14="http://schemas.microsoft.com/office/drawing/2010/main" val="0"/>
@@ -7191,7 +7014,7 @@
                   <pic:spPr bwMode="auto">
                     <a:xfrm>
                       <a:off x="0" y="0"/>
-                      <a:ext cx="5935980" cy="3756660"/>
+                      <a:ext cx="5940425" cy="1243330"/>
                     </a:xfrm>
                     <a:prstGeom prst="rect">
                       <a:avLst/>
@@ -7210,7 +7033,7 @@
     </w:p>
     <w:p>
       <w:pPr>
-        <w:spacing w:line="360" w:lineRule="auto"/>
+        <w:spacing w:before="60" w:after="120" w:line="360" w:lineRule="auto"/>
         <w:jc w:val="center"/>
         <w:rPr>
           <w:sz w:val="28"/>
@@ -7222,7 +7045,40 @@
           <w:sz w:val="28"/>
           <w:szCs w:val="28"/>
         </w:rPr>
-        <w:t xml:space="preserve">Рисунок 1. График эмпирической функции распределения для </w:t>
+        <w:t>Листинг 10 – Функция построения эмпирической функции распределения</w:t>
+      </w:r>
+    </w:p>
+    <w:p>
+      <w:pPr>
+        <w:pStyle w:val="a7"/>
+        <w:spacing w:line="360" w:lineRule="auto"/>
+        <w:ind w:left="780"/>
+        <w:jc w:val="both"/>
+        <w:rPr>
+          <w:b/>
+          <w:bCs/>
+          <w:sz w:val="28"/>
+          <w:szCs w:val="28"/>
+        </w:rPr>
+      </w:pPr>
+    </w:p>
+    <w:p>
+      <w:pPr>
+        <w:spacing w:line="360" w:lineRule="auto"/>
+        <w:ind w:firstLine="708"/>
+        <w:jc w:val="both"/>
+        <w:rPr>
+          <w:sz w:val="28"/>
+          <w:szCs w:val="28"/>
+        </w:rPr>
+      </w:pPr>
+      <w:r>
+        <w:rPr>
+          <w:sz w:val="28"/>
+          <w:szCs w:val="28"/>
+        </w:rPr>
+        <w:lastRenderedPageBreak/>
+        <w:t xml:space="preserve">Для анализа поведения ЭФР были сформированы три случайные </w:t>
       </w:r>
       <w:proofErr w:type="spellStart"/>
       <w:r>
@@ -7238,7 +7094,41 @@
           <w:sz w:val="28"/>
           <w:szCs w:val="28"/>
         </w:rPr>
-        <w:t xml:space="preserve"> из 10 элементов. </w:t>
+        <w:t xml:space="preserve"> размером 10, 100 и 200 элементов из исходной выборки </w:t>
+      </w:r>
+      <m:oMath>
+        <m:r>
+          <w:rPr>
+            <w:rFonts w:ascii="Cambria Math" w:hAnsi="Cambria Math"/>
+            <w:sz w:val="28"/>
+            <w:szCs w:val="28"/>
+          </w:rPr>
+          <m:t>X</m:t>
+        </m:r>
+      </m:oMath>
+      <w:r>
+        <w:rPr>
+          <w:sz w:val="28"/>
+          <w:szCs w:val="28"/>
+        </w:rPr>
+        <w:t xml:space="preserve"> объёмом </w:t>
+      </w:r>
+      <m:oMath>
+        <m:r>
+          <w:rPr>
+            <w:rFonts w:ascii="Cambria Math" w:hAnsi="Cambria Math"/>
+            <w:sz w:val="28"/>
+            <w:szCs w:val="28"/>
+          </w:rPr>
+          <m:t>n = 300</m:t>
+        </m:r>
+      </m:oMath>
+      <w:r>
+        <w:rPr>
+          <w:sz w:val="28"/>
+          <w:szCs w:val="28"/>
+        </w:rPr>
+        <w:t>. Для каждой подвыборки построен ступенчатый график ЭФР совместно с теоретической функцией двойного гамма-распределения.</w:t>
       </w:r>
     </w:p>
     <w:p>
@@ -7252,15 +7142,14 @@
       </w:pPr>
       <w:r>
         <w:rPr>
-          <w:noProof/>
           <w:sz w:val="28"/>
           <w:szCs w:val="28"/>
         </w:rPr>
         <w:drawing>
-          <wp:inline distT="0" distB="0" distL="0" distR="0" wp14:anchorId="3999041E" wp14:editId="3E3FBBF4">
-            <wp:extent cx="5940425" cy="3762375"/>
-            <wp:effectExtent l="0" t="0" r="3175" b="9525"/>
-            <wp:docPr id="10" name="Рисунок 10"/>
+          <wp:inline distT="0" distB="0" distL="0" distR="0" wp14:anchorId="7A49A5F3" wp14:editId="30EC7A28">
+            <wp:extent cx="5940425" cy="4241800"/>
+            <wp:effectExtent l="0" t="0" r="3175" b="6350"/>
+            <wp:docPr id="1" name="Рисунок 1"/>
             <wp:cNvGraphicFramePr>
               <a:graphicFrameLocks xmlns:a="http://schemas.openxmlformats.org/drawingml/2006/main" noChangeAspect="1"/>
             </wp:cNvGraphicFramePr>
@@ -7268,36 +7157,23 @@
               <a:graphicData uri="http://schemas.openxmlformats.org/drawingml/2006/picture">
                 <pic:pic xmlns:pic="http://schemas.openxmlformats.org/drawingml/2006/picture">
                   <pic:nvPicPr>
-                    <pic:cNvPr id="0" name="Picture 18"/>
-                    <pic:cNvPicPr>
-                      <a:picLocks noChangeAspect="1" noChangeArrowheads="1"/>
-                    </pic:cNvPicPr>
+                    <pic:cNvPr id="1" name=""/>
+                    <pic:cNvPicPr/>
                   </pic:nvPicPr>
                   <pic:blipFill>
-                    <a:blip r:embed="rId17" cstate="print">
-                      <a:extLst>
-                        <a:ext uri="{28A0092B-C50C-407E-A947-70E740481C1C}">
-                          <a14:useLocalDpi xmlns:a14="http://schemas.microsoft.com/office/drawing/2010/main" val="0"/>
-                        </a:ext>
-                      </a:extLst>
-                    </a:blip>
-                    <a:srcRect/>
+                    <a:blip r:embed="rId16"/>
                     <a:stretch>
                       <a:fillRect/>
                     </a:stretch>
                   </pic:blipFill>
-                  <pic:spPr bwMode="auto">
+                  <pic:spPr>
                     <a:xfrm>
                       <a:off x="0" y="0"/>
-                      <a:ext cx="5940425" cy="3762375"/>
+                      <a:ext cx="5940425" cy="4241800"/>
                     </a:xfrm>
                     <a:prstGeom prst="rect">
                       <a:avLst/>
                     </a:prstGeom>
-                    <a:noFill/>
-                    <a:ln>
-                      <a:noFill/>
-                    </a:ln>
                   </pic:spPr>
                 </pic:pic>
               </a:graphicData>
@@ -7320,56 +7196,45 @@
           <w:sz w:val="28"/>
           <w:szCs w:val="28"/>
         </w:rPr>
+        <w:t xml:space="preserve">Рисунок 1. График эмпирической функции распределения для </w:t>
+      </w:r>
+      <w:proofErr w:type="spellStart"/>
+      <w:r>
+        <w:rPr>
+          <w:sz w:val="28"/>
+          <w:szCs w:val="28"/>
+        </w:rPr>
+        <w:t>подвыборки</w:t>
+      </w:r>
+      <w:proofErr w:type="spellEnd"/>
+      <w:r>
+        <w:rPr>
+          <w:sz w:val="28"/>
+          <w:szCs w:val="28"/>
+        </w:rPr>
+        <w:t xml:space="preserve"> из 10 элементов. </w:t>
+      </w:r>
+    </w:p>
+    <w:p>
+      <w:pPr>
+        <w:spacing w:line="360" w:lineRule="auto"/>
+        <w:jc w:val="center"/>
+        <w:rPr>
+          <w:sz w:val="28"/>
+          <w:szCs w:val="28"/>
+        </w:rPr>
+      </w:pPr>
+      <w:r>
+        <w:rPr>
+          <w:sz w:val="28"/>
+          <w:szCs w:val="28"/>
+        </w:rPr>
         <w:lastRenderedPageBreak/>
-        <w:t xml:space="preserve">Рисунок 2. График эмпирической функции распределения для </w:t>
-      </w:r>
-      <w:proofErr w:type="spellStart"/>
-      <w:r>
-        <w:rPr>
-          <w:sz w:val="28"/>
-          <w:szCs w:val="28"/>
-        </w:rPr>
-        <w:t>подвыборки</w:t>
-      </w:r>
-      <w:proofErr w:type="spellEnd"/>
-      <w:r>
-        <w:rPr>
-          <w:sz w:val="28"/>
-          <w:szCs w:val="28"/>
-        </w:rPr>
-        <w:t xml:space="preserve"> из 100 элементов. </w:t>
-      </w:r>
-    </w:p>
-    <w:p>
-      <w:pPr>
-        <w:spacing w:line="360" w:lineRule="auto"/>
-        <w:jc w:val="center"/>
-        <w:rPr>
-          <w:sz w:val="28"/>
-          <w:szCs w:val="28"/>
-        </w:rPr>
-      </w:pPr>
-    </w:p>
-    <w:p>
-      <w:pPr>
-        <w:spacing w:line="360" w:lineRule="auto"/>
-        <w:jc w:val="center"/>
-        <w:rPr>
-          <w:sz w:val="28"/>
-          <w:szCs w:val="28"/>
-        </w:rPr>
-      </w:pPr>
-      <w:r>
-        <w:rPr>
-          <w:noProof/>
-          <w:sz w:val="28"/>
-          <w:szCs w:val="28"/>
-        </w:rPr>
         <w:drawing>
-          <wp:inline distT="0" distB="0" distL="0" distR="0" wp14:anchorId="2E1A5D4D" wp14:editId="447A2EC3">
-            <wp:extent cx="5940425" cy="3762375"/>
-            <wp:effectExtent l="0" t="0" r="3175" b="9525"/>
-            <wp:docPr id="11" name="Рисунок 11"/>
+          <wp:inline distT="0" distB="0" distL="0" distR="0" wp14:anchorId="0E81E09B" wp14:editId="012AE8F9">
+            <wp:extent cx="5940425" cy="4093210"/>
+            <wp:effectExtent l="0" t="0" r="3175" b="2540"/>
+            <wp:docPr id="4" name="Рисунок 4"/>
             <wp:cNvGraphicFramePr>
               <a:graphicFrameLocks xmlns:a="http://schemas.openxmlformats.org/drawingml/2006/main" noChangeAspect="1"/>
             </wp:cNvGraphicFramePr>
@@ -7377,36 +7242,23 @@
               <a:graphicData uri="http://schemas.openxmlformats.org/drawingml/2006/picture">
                 <pic:pic xmlns:pic="http://schemas.openxmlformats.org/drawingml/2006/picture">
                   <pic:nvPicPr>
-                    <pic:cNvPr id="0" name="Picture 20"/>
-                    <pic:cNvPicPr>
-                      <a:picLocks noChangeAspect="1" noChangeArrowheads="1"/>
-                    </pic:cNvPicPr>
+                    <pic:cNvPr id="1" name=""/>
+                    <pic:cNvPicPr/>
                   </pic:nvPicPr>
                   <pic:blipFill>
-                    <a:blip r:embed="rId18" cstate="print">
-                      <a:extLst>
-                        <a:ext uri="{28A0092B-C50C-407E-A947-70E740481C1C}">
-                          <a14:useLocalDpi xmlns:a14="http://schemas.microsoft.com/office/drawing/2010/main" val="0"/>
-                        </a:ext>
-                      </a:extLst>
-                    </a:blip>
-                    <a:srcRect/>
+                    <a:blip r:embed="rId17"/>
                     <a:stretch>
                       <a:fillRect/>
                     </a:stretch>
                   </pic:blipFill>
-                  <pic:spPr bwMode="auto">
+                  <pic:spPr>
                     <a:xfrm>
                       <a:off x="0" y="0"/>
-                      <a:ext cx="5940425" cy="3762375"/>
+                      <a:ext cx="5940425" cy="4093210"/>
                     </a:xfrm>
                     <a:prstGeom prst="rect">
                       <a:avLst/>
                     </a:prstGeom>
-                    <a:noFill/>
-                    <a:ln>
-                      <a:noFill/>
-                    </a:ln>
                   </pic:spPr>
                 </pic:pic>
               </a:graphicData>
@@ -7429,7 +7281,7 @@
           <w:sz w:val="28"/>
           <w:szCs w:val="28"/>
         </w:rPr>
-        <w:t xml:space="preserve">Рисунок 3. График эмпирической функции распределения для </w:t>
+        <w:t xml:space="preserve">Рисунок 2. График эмпирической функции распределения для </w:t>
       </w:r>
       <w:proofErr w:type="spellStart"/>
       <w:r>
@@ -7445,7 +7297,7 @@
           <w:sz w:val="28"/>
           <w:szCs w:val="28"/>
         </w:rPr>
-        <w:t xml:space="preserve"> из 200 элементов.</w:t>
+        <w:t xml:space="preserve"> из 100 элементов. </w:t>
       </w:r>
     </w:p>
     <w:p>
@@ -7457,17 +7309,27 @@
           <w:szCs w:val="28"/>
         </w:rPr>
       </w:pPr>
-      <w:r>
-        <w:rPr>
-          <w:noProof/>
-          <w:sz w:val="28"/>
-          <w:szCs w:val="28"/>
-        </w:rPr>
+    </w:p>
+    <w:p>
+      <w:pPr>
+        <w:spacing w:line="360" w:lineRule="auto"/>
+        <w:jc w:val="center"/>
+        <w:rPr>
+          <w:sz w:val="28"/>
+          <w:szCs w:val="28"/>
+        </w:rPr>
+      </w:pPr>
+      <w:r>
+        <w:rPr>
+          <w:sz w:val="28"/>
+          <w:szCs w:val="28"/>
+        </w:rPr>
+        <w:lastRenderedPageBreak/>
         <w:drawing>
-          <wp:inline distT="0" distB="0" distL="0" distR="0" wp14:anchorId="1E60B5E0" wp14:editId="5D274B34">
-            <wp:extent cx="4536942" cy="3223260"/>
-            <wp:effectExtent l="0" t="0" r="0" b="0"/>
-            <wp:docPr id="8" name="Рисунок 8"/>
+          <wp:inline distT="0" distB="0" distL="0" distR="0" wp14:anchorId="6E9DE7D5" wp14:editId="76BE7536">
+            <wp:extent cx="5940425" cy="4297045"/>
+            <wp:effectExtent l="0" t="0" r="3175" b="8255"/>
+            <wp:docPr id="5" name="Рисунок 5"/>
             <wp:cNvGraphicFramePr>
               <a:graphicFrameLocks xmlns:a="http://schemas.openxmlformats.org/drawingml/2006/main" noChangeAspect="1"/>
             </wp:cNvGraphicFramePr>
@@ -7475,36 +7337,23 @@
               <a:graphicData uri="http://schemas.openxmlformats.org/drawingml/2006/picture">
                 <pic:pic xmlns:pic="http://schemas.openxmlformats.org/drawingml/2006/picture">
                   <pic:nvPicPr>
-                    <pic:cNvPr id="0" name="Picture 16"/>
-                    <pic:cNvPicPr>
-                      <a:picLocks noChangeAspect="1" noChangeArrowheads="1"/>
-                    </pic:cNvPicPr>
+                    <pic:cNvPr id="1" name=""/>
+                    <pic:cNvPicPr/>
                   </pic:nvPicPr>
                   <pic:blipFill>
-                    <a:blip r:embed="rId19" cstate="print">
-                      <a:extLst>
-                        <a:ext uri="{28A0092B-C50C-407E-A947-70E740481C1C}">
-                          <a14:useLocalDpi xmlns:a14="http://schemas.microsoft.com/office/drawing/2010/main" val="0"/>
-                        </a:ext>
-                      </a:extLst>
-                    </a:blip>
-                    <a:srcRect/>
+                    <a:blip r:embed="rId18"/>
                     <a:stretch>
                       <a:fillRect/>
                     </a:stretch>
                   </pic:blipFill>
-                  <pic:spPr bwMode="auto">
+                  <pic:spPr>
                     <a:xfrm>
                       <a:off x="0" y="0"/>
-                      <a:ext cx="4545194" cy="3229123"/>
+                      <a:ext cx="5940425" cy="4297045"/>
                     </a:xfrm>
                     <a:prstGeom prst="rect">
                       <a:avLst/>
                     </a:prstGeom>
-                    <a:noFill/>
-                    <a:ln>
-                      <a:noFill/>
-                    </a:ln>
                   </pic:spPr>
                 </pic:pic>
               </a:graphicData>
@@ -7527,7 +7376,7 @@
           <w:sz w:val="28"/>
           <w:szCs w:val="28"/>
         </w:rPr>
-        <w:t xml:space="preserve">Рисунок 4. График теоретической функции </w:t>
+        <w:t xml:space="preserve">Рисунок 3. График эмпирической функции распределения для </w:t>
       </w:r>
       <w:proofErr w:type="spellStart"/>
       <w:r>
@@ -7535,7 +7384,7 @@
           <w:sz w:val="28"/>
           <w:szCs w:val="28"/>
         </w:rPr>
-        <w:t>распределния</w:t>
+        <w:t>подвыборки</w:t>
       </w:r>
       <w:proofErr w:type="spellEnd"/>
       <w:r>
@@ -7543,34 +7392,23 @@
           <w:sz w:val="28"/>
           <w:szCs w:val="28"/>
         </w:rPr>
-        <w:t>.</w:t>
-      </w:r>
-    </w:p>
-    <w:p>
-      <w:pPr>
-        <w:spacing w:line="360" w:lineRule="auto"/>
-        <w:jc w:val="center"/>
-        <w:rPr>
-          <w:sz w:val="28"/>
-          <w:szCs w:val="28"/>
-        </w:rPr>
-      </w:pPr>
-    </w:p>
-    <w:p>
-      <w:pPr>
-        <w:spacing w:line="360" w:lineRule="auto"/>
-        <w:jc w:val="both"/>
-        <w:rPr>
-          <w:sz w:val="28"/>
-          <w:szCs w:val="28"/>
-        </w:rPr>
-      </w:pPr>
-      <w:r>
-        <w:rPr>
-          <w:sz w:val="28"/>
-          <w:szCs w:val="28"/>
-        </w:rPr>
-        <w:lastRenderedPageBreak/>
+        <w:t xml:space="preserve"> из 200 элементов.</w:t>
+      </w:r>
+    </w:p>
+    <w:p>
+      <w:pPr>
+        <w:spacing w:line="360" w:lineRule="auto"/>
+        <w:jc w:val="both"/>
+        <w:rPr>
+          <w:sz w:val="28"/>
+          <w:szCs w:val="28"/>
+        </w:rPr>
+      </w:pPr>
+      <w:r>
+        <w:rPr>
+          <w:sz w:val="28"/>
+          <w:szCs w:val="28"/>
+        </w:rPr>
         <w:t>Анализ построенных графиков позволяет сделать следующие выводы</w:t>
       </w:r>
       <w:r>
@@ -7580,16 +7418,6 @@
         </w:rPr>
         <w:t>:</w:t>
       </w:r>
-    </w:p>
-    <w:p>
-      <w:pPr>
-        <w:spacing w:line="360" w:lineRule="auto"/>
-        <w:jc w:val="both"/>
-        <w:rPr>
-          <w:sz w:val="28"/>
-          <w:szCs w:val="28"/>
-        </w:rPr>
-      </w:pPr>
     </w:p>
     <w:p>
       <w:pPr>
@@ -7825,6 +7653,7 @@
           <w:sz w:val="28"/>
           <w:szCs w:val="28"/>
         </w:rPr>
+        <w:lastRenderedPageBreak/>
         <w:t>–</w:t>
       </w:r>
       <w:r>
@@ -7944,6 +7773,136 @@
         </w:rPr>
         <w:t xml:space="preserve">. </w:t>
       </w:r>
+    </w:p>
+    <w:p>
+      <w:pPr>
+        <w:spacing w:line="360" w:lineRule="auto"/>
+        <w:jc w:val="both"/>
+        <w:rPr>
+          <w:sz w:val="28"/>
+          <w:szCs w:val="28"/>
+        </w:rPr>
+      </w:pPr>
+    </w:p>
+    <w:p>
+      <w:pPr>
+        <w:spacing w:line="360" w:lineRule="auto"/>
+        <w:jc w:val="both"/>
+        <w:rPr>
+          <w:sz w:val="28"/>
+          <w:szCs w:val="28"/>
+        </w:rPr>
+      </w:pPr>
+    </w:p>
+    <w:p>
+      <w:pPr>
+        <w:spacing w:line="360" w:lineRule="auto"/>
+        <w:jc w:val="both"/>
+        <w:rPr>
+          <w:sz w:val="28"/>
+          <w:szCs w:val="28"/>
+        </w:rPr>
+      </w:pPr>
+    </w:p>
+    <w:p>
+      <w:pPr>
+        <w:spacing w:line="360" w:lineRule="auto"/>
+        <w:jc w:val="both"/>
+        <w:rPr>
+          <w:sz w:val="28"/>
+          <w:szCs w:val="28"/>
+        </w:rPr>
+      </w:pPr>
+    </w:p>
+    <w:p>
+      <w:pPr>
+        <w:spacing w:line="360" w:lineRule="auto"/>
+        <w:jc w:val="both"/>
+        <w:rPr>
+          <w:sz w:val="28"/>
+          <w:szCs w:val="28"/>
+        </w:rPr>
+      </w:pPr>
+    </w:p>
+    <w:p>
+      <w:pPr>
+        <w:spacing w:line="360" w:lineRule="auto"/>
+        <w:jc w:val="both"/>
+        <w:rPr>
+          <w:sz w:val="28"/>
+          <w:szCs w:val="28"/>
+        </w:rPr>
+      </w:pPr>
+    </w:p>
+    <w:p>
+      <w:pPr>
+        <w:spacing w:line="360" w:lineRule="auto"/>
+        <w:jc w:val="both"/>
+        <w:rPr>
+          <w:sz w:val="28"/>
+          <w:szCs w:val="28"/>
+        </w:rPr>
+      </w:pPr>
+    </w:p>
+    <w:p>
+      <w:pPr>
+        <w:spacing w:line="360" w:lineRule="auto"/>
+        <w:jc w:val="both"/>
+        <w:rPr>
+          <w:sz w:val="28"/>
+          <w:szCs w:val="28"/>
+        </w:rPr>
+      </w:pPr>
+    </w:p>
+    <w:p>
+      <w:pPr>
+        <w:spacing w:line="360" w:lineRule="auto"/>
+        <w:jc w:val="both"/>
+        <w:rPr>
+          <w:sz w:val="28"/>
+          <w:szCs w:val="28"/>
+        </w:rPr>
+      </w:pPr>
+    </w:p>
+    <w:p>
+      <w:pPr>
+        <w:spacing w:line="360" w:lineRule="auto"/>
+        <w:jc w:val="both"/>
+        <w:rPr>
+          <w:sz w:val="28"/>
+          <w:szCs w:val="28"/>
+        </w:rPr>
+      </w:pPr>
+    </w:p>
+    <w:p>
+      <w:pPr>
+        <w:spacing w:line="360" w:lineRule="auto"/>
+        <w:jc w:val="both"/>
+        <w:rPr>
+          <w:sz w:val="28"/>
+          <w:szCs w:val="28"/>
+        </w:rPr>
+      </w:pPr>
+    </w:p>
+    <w:p>
+      <w:pPr>
+        <w:spacing w:line="360" w:lineRule="auto"/>
+        <w:jc w:val="both"/>
+        <w:rPr>
+          <w:sz w:val="28"/>
+          <w:szCs w:val="28"/>
+        </w:rPr>
+      </w:pPr>
+    </w:p>
+    <w:p>
+      <w:pPr>
+        <w:spacing w:line="360" w:lineRule="auto"/>
+        <w:jc w:val="both"/>
+        <w:rPr>
+          <w:sz w:val="28"/>
+          <w:szCs w:val="28"/>
+        </w:rPr>
+      </w:pPr>
     </w:p>
     <w:p>
       <w:pPr>
@@ -8182,13 +8141,25 @@
           <w:sym w:font="Symbol" w:char="F061"/>
         </m:r>
         <m:r>
+          <m:rPr>
+            <m:nor/>
+          </m:rPr>
           <w:rPr>
             <w:rFonts w:ascii="Cambria Math" w:hAnsi="Cambria Math"/>
             <w:sz w:val="28"/>
             <w:szCs w:val="28"/>
             <w:vertAlign w:val="subscript"/>
           </w:rPr>
-          <m:t>i –1</m:t>
+          <m:t>i</m:t>
+        </m:r>
+        <m:r>
+          <w:rPr>
+            <w:rFonts w:ascii="Cambria Math" w:hAnsi="Cambria Math"/>
+            <w:sz w:val="28"/>
+            <w:szCs w:val="28"/>
+            <w:vertAlign w:val="subscript"/>
+          </w:rPr>
+          <m:t xml:space="preserve"> –1</m:t>
         </m:r>
         <m:r>
           <w:rPr>
@@ -8208,6 +8179,9 @@
           <w:sym w:font="Symbol" w:char="F061"/>
         </m:r>
         <m:r>
+          <m:rPr>
+            <m:nor/>
+          </m:rPr>
           <w:rPr>
             <w:rFonts w:ascii="Cambria Math" w:hAnsi="Cambria Math"/>
             <w:sz w:val="28"/>
@@ -8251,6 +8225,9 @@
           <w:sym w:font="Symbol" w:char="F044"/>
         </m:r>
         <m:r>
+          <m:rPr>
+            <m:nor/>
+          </m:rPr>
           <w:rPr>
             <w:rFonts w:ascii="Cambria Math" w:hAnsi="Cambria Math"/>
             <w:sz w:val="28"/>
@@ -9268,7 +9245,7 @@
                     <pic:cNvPicPr/>
                   </pic:nvPicPr>
                   <pic:blipFill>
-                    <a:blip r:embed="rId20"/>
+                    <a:blip r:embed="rId19"/>
                     <a:stretch>
                       <a:fillRect/>
                     </a:stretch>
@@ -9492,7 +9469,7 @@
                     </pic:cNvPicPr>
                   </pic:nvPicPr>
                   <pic:blipFill>
-                    <a:blip r:embed="rId21"/>
+                    <a:blip r:embed="rId20"/>
                     <a:stretch>
                       <a:fillRect/>
                     </a:stretch>
@@ -9555,55 +9532,135 @@
           <w:sz w:val="28"/>
           <w:szCs w:val="28"/>
         </w:rPr>
-        <w:t xml:space="preserve">Результаты работы функции для полной выборки объёмом </w:t>
-      </w:r>
-      <m:oMath>
-        <m:r>
-          <w:rPr>
-            <w:rFonts w:ascii="Cambria Math" w:hAnsi="Cambria Math"/>
-            <w:sz w:val="28"/>
-            <w:szCs w:val="28"/>
-          </w:rPr>
-          <m:t>n = 300</m:t>
-        </m:r>
-      </m:oMath>
-      <w:r>
-        <w:rPr>
-          <w:sz w:val="28"/>
-          <w:szCs w:val="28"/>
-        </w:rPr>
-        <w:t xml:space="preserve"> приведены на рисунке 6, для случайных подвыборок размером 10, 100 и 200 элементов — на рисунках 7–9.</w:t>
-      </w:r>
-    </w:p>
-    <w:p>
-      <w:pPr>
-        <w:spacing w:line="360" w:lineRule="auto"/>
-        <w:jc w:val="both"/>
-        <w:rPr>
-          <w:sz w:val="28"/>
-          <w:szCs w:val="28"/>
-          <w:lang w:val="en-US"/>
-        </w:rPr>
-      </w:pPr>
-      <w:r>
-        <w:rPr>
-          <w:sz w:val="28"/>
-          <w:szCs w:val="28"/>
-        </w:rPr>
-        <w:tab/>
-      </w:r>
-      <w:r>
-        <w:rPr>
-          <w:noProof/>
-          <w:sz w:val="28"/>
-          <w:szCs w:val="28"/>
-          <w:lang w:val="en-US"/>
+        <w:t>Результаты работы функции для случайных подвыборок размером 10, 100 и 200 элементов — на рисунках </w:t>
+      </w:r>
+      <w:r>
+        <w:rPr>
+          <w:sz w:val="28"/>
+          <w:szCs w:val="28"/>
+        </w:rPr>
+        <w:t>6</w:t>
+      </w:r>
+      <w:r>
+        <w:rPr>
+          <w:sz w:val="28"/>
+          <w:szCs w:val="28"/>
+        </w:rPr>
+        <w:t>–</w:t>
+      </w:r>
+      <w:r>
+        <w:rPr>
+          <w:sz w:val="28"/>
+          <w:szCs w:val="28"/>
+        </w:rPr>
+        <w:t>8</w:t>
+      </w:r>
+      <w:r>
+        <w:rPr>
+          <w:sz w:val="28"/>
+          <w:szCs w:val="28"/>
+        </w:rPr>
+        <w:t>.</w:t>
+      </w:r>
+    </w:p>
+    <w:p>
+      <w:pPr>
+        <w:spacing w:line="360" w:lineRule="auto"/>
+        <w:jc w:val="both"/>
+        <w:rPr>
+          <w:sz w:val="28"/>
+          <w:szCs w:val="28"/>
+        </w:rPr>
+      </w:pPr>
+    </w:p>
+    <w:p>
+      <w:pPr>
+        <w:pStyle w:val="a7"/>
+        <w:numPr>
+          <w:ilvl w:val="1"/>
+          <w:numId w:val="3"/>
+        </w:numPr>
+        <w:spacing w:line="360" w:lineRule="auto"/>
+        <w:jc w:val="center"/>
+        <w:rPr>
+          <w:b/>
+          <w:bCs/>
+          <w:sz w:val="32"/>
+          <w:szCs w:val="32"/>
+        </w:rPr>
+      </w:pPr>
+      <w:r>
+        <w:rPr>
+          <w:b/>
+          <w:bCs/>
+          <w:sz w:val="32"/>
+          <w:szCs w:val="32"/>
+        </w:rPr>
+        <w:t xml:space="preserve"> </w:t>
+      </w:r>
+      <w:r>
+        <w:rPr>
+          <w:b/>
+          <w:bCs/>
+          <w:sz w:val="28"/>
+          <w:szCs w:val="28"/>
+        </w:rPr>
+        <w:t xml:space="preserve">Вид гистограмм для случайных </w:t>
+      </w:r>
+      <w:proofErr w:type="spellStart"/>
+      <w:r>
+        <w:rPr>
+          <w:b/>
+          <w:bCs/>
+          <w:sz w:val="28"/>
+          <w:szCs w:val="28"/>
+        </w:rPr>
+        <w:t>подвыборок</w:t>
+      </w:r>
+      <w:proofErr w:type="spellEnd"/>
+      <w:r>
+        <w:rPr>
+          <w:b/>
+          <w:bCs/>
+          <w:sz w:val="28"/>
+          <w:szCs w:val="28"/>
+        </w:rPr>
+        <w:t xml:space="preserve"> размера 10, 100, 200</w:t>
+      </w:r>
+    </w:p>
+    <w:p>
+      <w:pPr>
+        <w:spacing w:line="360" w:lineRule="auto"/>
+        <w:jc w:val="both"/>
+        <w:rPr>
+          <w:sz w:val="28"/>
+          <w:szCs w:val="28"/>
+        </w:rPr>
+      </w:pPr>
+    </w:p>
+    <w:p>
+      <w:pPr>
+        <w:spacing w:line="360" w:lineRule="auto"/>
+        <w:jc w:val="center"/>
+        <w:rPr>
+          <w:b/>
+          <w:bCs/>
+          <w:sz w:val="28"/>
+          <w:szCs w:val="28"/>
+        </w:rPr>
+      </w:pPr>
+      <w:r>
+        <w:rPr>
+          <w:b/>
+          <w:bCs/>
+          <w:sz w:val="28"/>
+          <w:szCs w:val="28"/>
         </w:rPr>
         <w:drawing>
-          <wp:inline distT="0" distB="0" distL="0" distR="0" wp14:anchorId="09FA3AE1" wp14:editId="5FB178B7">
-            <wp:extent cx="5935980" cy="3055620"/>
-            <wp:effectExtent l="0" t="0" r="7620" b="0"/>
-            <wp:docPr id="1406250621" name="Рисунок 1"/>
+          <wp:inline distT="0" distB="0" distL="0" distR="0" wp14:anchorId="0E9FDD8C" wp14:editId="5272C051">
+            <wp:extent cx="5940425" cy="3832860"/>
+            <wp:effectExtent l="0" t="0" r="3175" b="0"/>
+            <wp:docPr id="12" name="Рисунок 12"/>
             <wp:cNvGraphicFramePr>
               <a:graphicFrameLocks xmlns:a="http://schemas.openxmlformats.org/drawingml/2006/main" noChangeAspect="1"/>
             </wp:cNvGraphicFramePr>
@@ -9611,36 +9668,23 @@
               <a:graphicData uri="http://schemas.openxmlformats.org/drawingml/2006/picture">
                 <pic:pic xmlns:pic="http://schemas.openxmlformats.org/drawingml/2006/picture">
                   <pic:nvPicPr>
-                    <pic:cNvPr id="0" name="Picture 1"/>
-                    <pic:cNvPicPr>
-                      <a:picLocks noChangeAspect="1" noChangeArrowheads="1"/>
-                    </pic:cNvPicPr>
+                    <pic:cNvPr id="1" name=""/>
+                    <pic:cNvPicPr/>
                   </pic:nvPicPr>
                   <pic:blipFill>
-                    <a:blip r:embed="rId22">
-                      <a:extLst>
-                        <a:ext uri="{28A0092B-C50C-407E-A947-70E740481C1C}">
-                          <a14:useLocalDpi xmlns:a14="http://schemas.microsoft.com/office/drawing/2010/main" val="0"/>
-                        </a:ext>
-                      </a:extLst>
-                    </a:blip>
-                    <a:srcRect/>
+                    <a:blip r:embed="rId21"/>
                     <a:stretch>
                       <a:fillRect/>
                     </a:stretch>
                   </pic:blipFill>
-                  <pic:spPr bwMode="auto">
+                  <pic:spPr>
                     <a:xfrm>
                       <a:off x="0" y="0"/>
-                      <a:ext cx="5935980" cy="3055620"/>
+                      <a:ext cx="5940425" cy="3832860"/>
                     </a:xfrm>
                     <a:prstGeom prst="rect">
                       <a:avLst/>
                     </a:prstGeom>
-                    <a:noFill/>
-                    <a:ln>
-                      <a:noFill/>
-                    </a:ln>
                   </pic:spPr>
                 </pic:pic>
               </a:graphicData>
@@ -9663,7 +9707,37 @@
           <w:sz w:val="28"/>
           <w:szCs w:val="28"/>
         </w:rPr>
-        <w:t>Рисунок 6 – Гистограмма для полной выборки</w:t>
+        <w:t>Рисунок </w:t>
+      </w:r>
+      <w:r>
+        <w:rPr>
+          <w:sz w:val="28"/>
+          <w:szCs w:val="28"/>
+        </w:rPr>
+        <w:t>6</w:t>
+      </w:r>
+      <w:r>
+        <w:rPr>
+          <w:sz w:val="28"/>
+          <w:szCs w:val="28"/>
+        </w:rPr>
+        <w:t xml:space="preserve"> – Гистограмма для </w:t>
+      </w:r>
+      <w:proofErr w:type="spellStart"/>
+      <w:r>
+        <w:rPr>
+          <w:sz w:val="28"/>
+          <w:szCs w:val="28"/>
+        </w:rPr>
+        <w:t>подвыборки</w:t>
+      </w:r>
+      <w:proofErr w:type="spellEnd"/>
+      <w:r>
+        <w:rPr>
+          <w:sz w:val="28"/>
+          <w:szCs w:val="28"/>
+        </w:rPr>
+        <w:t xml:space="preserve"> из 10 элементов</w:t>
       </w:r>
     </w:p>
     <w:p>
@@ -9671,8 +9745,6 @@
         <w:spacing w:line="360" w:lineRule="auto"/>
         <w:jc w:val="center"/>
         <w:rPr>
-          <w:i/>
-          <w:iCs/>
           <w:sz w:val="28"/>
           <w:szCs w:val="28"/>
         </w:rPr>
@@ -9683,217 +9755,21 @@
         <w:spacing w:line="360" w:lineRule="auto"/>
         <w:jc w:val="center"/>
         <w:rPr>
-          <w:i/>
-          <w:iCs/>
-          <w:sz w:val="28"/>
-          <w:szCs w:val="28"/>
-        </w:rPr>
-      </w:pPr>
-    </w:p>
-    <w:p>
-      <w:pPr>
-        <w:spacing w:line="360" w:lineRule="auto"/>
-        <w:jc w:val="center"/>
-        <w:rPr>
-          <w:i/>
-          <w:iCs/>
-          <w:sz w:val="28"/>
-          <w:szCs w:val="28"/>
-        </w:rPr>
-      </w:pPr>
-    </w:p>
-    <w:p>
-      <w:pPr>
-        <w:spacing w:line="360" w:lineRule="auto"/>
-        <w:jc w:val="center"/>
-        <w:rPr>
-          <w:i/>
-          <w:iCs/>
-          <w:sz w:val="28"/>
-          <w:szCs w:val="28"/>
-        </w:rPr>
-      </w:pPr>
-    </w:p>
-    <w:p>
-      <w:pPr>
-        <w:spacing w:line="360" w:lineRule="auto"/>
-        <w:jc w:val="center"/>
-        <w:rPr>
-          <w:i/>
-          <w:iCs/>
-          <w:sz w:val="28"/>
-          <w:szCs w:val="28"/>
-        </w:rPr>
-      </w:pPr>
-    </w:p>
-    <w:p>
-      <w:pPr>
-        <w:spacing w:line="360" w:lineRule="auto"/>
-        <w:jc w:val="center"/>
-        <w:rPr>
-          <w:i/>
-          <w:iCs/>
-          <w:sz w:val="28"/>
-          <w:szCs w:val="28"/>
-        </w:rPr>
-      </w:pPr>
-    </w:p>
-    <w:p>
-      <w:pPr>
-        <w:spacing w:line="360" w:lineRule="auto"/>
-        <w:jc w:val="center"/>
-        <w:rPr>
-          <w:i/>
-          <w:iCs/>
-          <w:sz w:val="28"/>
-          <w:szCs w:val="28"/>
-        </w:rPr>
-      </w:pPr>
-    </w:p>
-    <w:p>
-      <w:pPr>
-        <w:spacing w:line="360" w:lineRule="auto"/>
-        <w:jc w:val="center"/>
-        <w:rPr>
-          <w:i/>
-          <w:iCs/>
-          <w:sz w:val="28"/>
-          <w:szCs w:val="28"/>
-        </w:rPr>
-      </w:pPr>
-    </w:p>
-    <w:p>
-      <w:pPr>
-        <w:spacing w:line="360" w:lineRule="auto"/>
-        <w:jc w:val="center"/>
-        <w:rPr>
-          <w:i/>
-          <w:iCs/>
-          <w:sz w:val="28"/>
-          <w:szCs w:val="28"/>
-        </w:rPr>
-      </w:pPr>
-    </w:p>
-    <w:p>
-      <w:pPr>
-        <w:spacing w:line="360" w:lineRule="auto"/>
-        <w:jc w:val="center"/>
-        <w:rPr>
-          <w:i/>
-          <w:iCs/>
-          <w:sz w:val="28"/>
-          <w:szCs w:val="28"/>
-        </w:rPr>
-      </w:pPr>
-    </w:p>
-    <w:p>
-      <w:pPr>
-        <w:spacing w:line="360" w:lineRule="auto"/>
-        <w:jc w:val="center"/>
-        <w:rPr>
-          <w:sz w:val="28"/>
-          <w:szCs w:val="28"/>
-        </w:rPr>
-      </w:pPr>
-    </w:p>
-    <w:p>
-      <w:pPr>
-        <w:spacing w:line="360" w:lineRule="auto"/>
-        <w:jc w:val="center"/>
-        <w:rPr>
-          <w:sz w:val="28"/>
-          <w:szCs w:val="28"/>
-        </w:rPr>
-      </w:pPr>
-    </w:p>
-    <w:p>
-      <w:pPr>
-        <w:pStyle w:val="a7"/>
-        <w:numPr>
-          <w:ilvl w:val="1"/>
-          <w:numId w:val="3"/>
-        </w:numPr>
-        <w:spacing w:line="360" w:lineRule="auto"/>
-        <w:jc w:val="center"/>
-        <w:rPr>
-          <w:b/>
-          <w:bCs/>
-          <w:sz w:val="32"/>
-          <w:szCs w:val="32"/>
-        </w:rPr>
-      </w:pPr>
-      <w:r>
-        <w:rPr>
-          <w:b/>
-          <w:bCs/>
-          <w:sz w:val="32"/>
-          <w:szCs w:val="32"/>
+          <w:sz w:val="28"/>
+          <w:szCs w:val="28"/>
+        </w:rPr>
+      </w:pPr>
+      <w:r>
+        <w:rPr>
+          <w:sz w:val="28"/>
+          <w:szCs w:val="28"/>
         </w:rPr>
         <w:lastRenderedPageBreak/>
-        <w:t xml:space="preserve"> </w:t>
-      </w:r>
-      <w:r>
-        <w:rPr>
-          <w:b/>
-          <w:bCs/>
-          <w:sz w:val="28"/>
-          <w:szCs w:val="28"/>
-        </w:rPr>
-        <w:t xml:space="preserve">Вид гистограмм для случайных </w:t>
-      </w:r>
-      <w:proofErr w:type="spellStart"/>
-      <w:r>
-        <w:rPr>
-          <w:b/>
-          <w:bCs/>
-          <w:sz w:val="28"/>
-          <w:szCs w:val="28"/>
-        </w:rPr>
-        <w:t>подвыборок</w:t>
-      </w:r>
-      <w:proofErr w:type="spellEnd"/>
-      <w:r>
-        <w:rPr>
-          <w:b/>
-          <w:bCs/>
-          <w:sz w:val="28"/>
-          <w:szCs w:val="28"/>
-        </w:rPr>
-        <w:t xml:space="preserve"> размера 10, 100, 200</w:t>
-      </w:r>
-    </w:p>
-    <w:p>
-      <w:pPr>
-        <w:spacing w:line="360" w:lineRule="auto"/>
-        <w:jc w:val="both"/>
-        <w:rPr>
-          <w:sz w:val="28"/>
-          <w:szCs w:val="28"/>
-        </w:rPr>
-      </w:pPr>
-    </w:p>
-    <w:p>
-      <w:pPr>
-        <w:spacing w:line="360" w:lineRule="auto"/>
-        <w:jc w:val="both"/>
-        <w:rPr>
-          <w:b/>
-          <w:bCs/>
-          <w:sz w:val="28"/>
-          <w:szCs w:val="28"/>
-        </w:rPr>
-      </w:pPr>
-      <w:r>
-        <w:rPr>
-          <w:noProof/>
-          <w:sz w:val="28"/>
-          <w:szCs w:val="28"/>
-        </w:rPr>
         <w:drawing>
-          <wp:inline distT="0" distB="0" distL="0" distR="0" wp14:anchorId="3671006A" wp14:editId="2829A69F">
-            <wp:extent cx="5935980" cy="2918460"/>
-            <wp:effectExtent l="0" t="0" r="7620" b="0"/>
-            <wp:docPr id="424097772" name="Рисунок 5"/>
+          <wp:inline distT="0" distB="0" distL="0" distR="0" wp14:anchorId="2230F03F" wp14:editId="39FF72C8">
+            <wp:extent cx="5940425" cy="4301490"/>
+            <wp:effectExtent l="0" t="0" r="3175" b="3810"/>
+            <wp:docPr id="13" name="Рисунок 13"/>
             <wp:cNvGraphicFramePr>
               <a:graphicFrameLocks xmlns:a="http://schemas.openxmlformats.org/drawingml/2006/main" noChangeAspect="1"/>
             </wp:cNvGraphicFramePr>
@@ -9901,36 +9777,23 @@
               <a:graphicData uri="http://schemas.openxmlformats.org/drawingml/2006/picture">
                 <pic:pic xmlns:pic="http://schemas.openxmlformats.org/drawingml/2006/picture">
                   <pic:nvPicPr>
-                    <pic:cNvPr id="0" name="Picture 5"/>
-                    <pic:cNvPicPr>
-                      <a:picLocks noChangeAspect="1" noChangeArrowheads="1"/>
-                    </pic:cNvPicPr>
+                    <pic:cNvPr id="1" name=""/>
+                    <pic:cNvPicPr/>
                   </pic:nvPicPr>
                   <pic:blipFill>
-                    <a:blip r:embed="rId23">
-                      <a:extLst>
-                        <a:ext uri="{28A0092B-C50C-407E-A947-70E740481C1C}">
-                          <a14:useLocalDpi xmlns:a14="http://schemas.microsoft.com/office/drawing/2010/main" val="0"/>
-                        </a:ext>
-                      </a:extLst>
-                    </a:blip>
-                    <a:srcRect/>
+                    <a:blip r:embed="rId22"/>
                     <a:stretch>
                       <a:fillRect/>
                     </a:stretch>
                   </pic:blipFill>
-                  <pic:spPr bwMode="auto">
+                  <pic:spPr>
                     <a:xfrm>
                       <a:off x="0" y="0"/>
-                      <a:ext cx="5935980" cy="2918460"/>
+                      <a:ext cx="5940425" cy="4301490"/>
                     </a:xfrm>
                     <a:prstGeom prst="rect">
                       <a:avLst/>
                     </a:prstGeom>
-                    <a:noFill/>
-                    <a:ln>
-                      <a:noFill/>
-                    </a:ln>
                   </pic:spPr>
                 </pic:pic>
               </a:graphicData>
@@ -9953,7 +9816,21 @@
           <w:sz w:val="28"/>
           <w:szCs w:val="28"/>
         </w:rPr>
-        <w:t xml:space="preserve">Рисунок 7 – Гистограмма для </w:t>
+        <w:t>Рисунок </w:t>
+      </w:r>
+      <w:r>
+        <w:rPr>
+          <w:sz w:val="28"/>
+          <w:szCs w:val="28"/>
+        </w:rPr>
+        <w:t>7</w:t>
+      </w:r>
+      <w:r>
+        <w:rPr>
+          <w:sz w:val="28"/>
+          <w:szCs w:val="28"/>
+        </w:rPr>
+        <w:t xml:space="preserve"> – Гистограмма для </w:t>
       </w:r>
       <w:proofErr w:type="spellStart"/>
       <w:r>
@@ -9969,7 +9846,7 @@
           <w:sz w:val="28"/>
           <w:szCs w:val="28"/>
         </w:rPr>
-        <w:t xml:space="preserve"> из 10 элементов</w:t>
+        <w:t xml:space="preserve"> из 100 элементов</w:t>
       </w:r>
     </w:p>
     <w:p>
@@ -9981,17 +9858,37 @@
           <w:szCs w:val="28"/>
         </w:rPr>
       </w:pPr>
-      <w:r>
-        <w:rPr>
-          <w:noProof/>
-          <w:sz w:val="28"/>
-          <w:szCs w:val="28"/>
-        </w:rPr>
+    </w:p>
+    <w:p>
+      <w:pPr>
+        <w:spacing w:line="360" w:lineRule="auto"/>
+        <w:jc w:val="center"/>
+        <w:rPr>
+          <w:sz w:val="28"/>
+          <w:szCs w:val="28"/>
+        </w:rPr>
+      </w:pPr>
+    </w:p>
+    <w:p>
+      <w:pPr>
+        <w:spacing w:line="360" w:lineRule="auto"/>
+        <w:jc w:val="center"/>
+        <w:rPr>
+          <w:sz w:val="28"/>
+          <w:szCs w:val="28"/>
+        </w:rPr>
+      </w:pPr>
+      <w:r>
+        <w:rPr>
+          <w:sz w:val="28"/>
+          <w:szCs w:val="28"/>
+        </w:rPr>
+        <w:lastRenderedPageBreak/>
         <w:drawing>
-          <wp:inline distT="0" distB="0" distL="0" distR="0" wp14:anchorId="60E9D982" wp14:editId="064A2F77">
-            <wp:extent cx="5935980" cy="2727960"/>
-            <wp:effectExtent l="0" t="0" r="7620" b="0"/>
-            <wp:docPr id="841614472" name="Рисунок 7"/>
+          <wp:inline distT="0" distB="0" distL="0" distR="0" wp14:anchorId="3E33D117" wp14:editId="76FBE8C8">
+            <wp:extent cx="5940425" cy="4171315"/>
+            <wp:effectExtent l="0" t="0" r="3175" b="635"/>
+            <wp:docPr id="14" name="Рисунок 14"/>
             <wp:cNvGraphicFramePr>
               <a:graphicFrameLocks xmlns:a="http://schemas.openxmlformats.org/drawingml/2006/main" noChangeAspect="1"/>
             </wp:cNvGraphicFramePr>
@@ -9999,36 +9896,23 @@
               <a:graphicData uri="http://schemas.openxmlformats.org/drawingml/2006/picture">
                 <pic:pic xmlns:pic="http://schemas.openxmlformats.org/drawingml/2006/picture">
                   <pic:nvPicPr>
-                    <pic:cNvPr id="0" name="Picture 7"/>
-                    <pic:cNvPicPr>
-                      <a:picLocks noChangeAspect="1" noChangeArrowheads="1"/>
-                    </pic:cNvPicPr>
+                    <pic:cNvPr id="1" name=""/>
+                    <pic:cNvPicPr/>
                   </pic:nvPicPr>
                   <pic:blipFill>
-                    <a:blip r:embed="rId24">
-                      <a:extLst>
-                        <a:ext uri="{28A0092B-C50C-407E-A947-70E740481C1C}">
-                          <a14:useLocalDpi xmlns:a14="http://schemas.microsoft.com/office/drawing/2010/main" val="0"/>
-                        </a:ext>
-                      </a:extLst>
-                    </a:blip>
-                    <a:srcRect/>
+                    <a:blip r:embed="rId23"/>
                     <a:stretch>
                       <a:fillRect/>
                     </a:stretch>
                   </pic:blipFill>
-                  <pic:spPr bwMode="auto">
+                  <pic:spPr>
                     <a:xfrm>
                       <a:off x="0" y="0"/>
-                      <a:ext cx="5935980" cy="2727960"/>
+                      <a:ext cx="5940425" cy="4171315"/>
                     </a:xfrm>
                     <a:prstGeom prst="rect">
                       <a:avLst/>
                     </a:prstGeom>
-                    <a:noFill/>
-                    <a:ln>
-                      <a:noFill/>
-                    </a:ln>
                   </pic:spPr>
                 </pic:pic>
               </a:graphicData>
@@ -10051,116 +9935,21 @@
           <w:sz w:val="28"/>
           <w:szCs w:val="28"/>
         </w:rPr>
-        <w:t xml:space="preserve">Рисунок 8 – Гистограмма для </w:t>
-      </w:r>
-      <w:proofErr w:type="spellStart"/>
-      <w:r>
-        <w:rPr>
-          <w:sz w:val="28"/>
-          <w:szCs w:val="28"/>
-        </w:rPr>
-        <w:t>подвыборки</w:t>
-      </w:r>
-      <w:proofErr w:type="spellEnd"/>
-      <w:r>
-        <w:rPr>
-          <w:sz w:val="28"/>
-          <w:szCs w:val="28"/>
-        </w:rPr>
-        <w:t xml:space="preserve"> из 100 элементов</w:t>
-      </w:r>
-    </w:p>
-    <w:p>
-      <w:pPr>
-        <w:spacing w:line="360" w:lineRule="auto"/>
-        <w:jc w:val="center"/>
-        <w:rPr>
-          <w:sz w:val="28"/>
-          <w:szCs w:val="28"/>
-        </w:rPr>
-      </w:pPr>
-    </w:p>
-    <w:p>
-      <w:pPr>
-        <w:spacing w:line="360" w:lineRule="auto"/>
-        <w:jc w:val="center"/>
-        <w:rPr>
-          <w:sz w:val="28"/>
-          <w:szCs w:val="28"/>
-        </w:rPr>
-      </w:pPr>
-      <w:r>
-        <w:rPr>
-          <w:noProof/>
-          <w:sz w:val="28"/>
-          <w:szCs w:val="28"/>
-        </w:rPr>
-        <w:lastRenderedPageBreak/>
-        <w:drawing>
-          <wp:inline distT="0" distB="0" distL="0" distR="0" wp14:anchorId="670B9689" wp14:editId="429AE959">
-            <wp:extent cx="5935980" cy="2628900"/>
-            <wp:effectExtent l="0" t="0" r="7620" b="0"/>
-            <wp:docPr id="133623226" name="Рисунок 8"/>
-            <wp:cNvGraphicFramePr>
-              <a:graphicFrameLocks xmlns:a="http://schemas.openxmlformats.org/drawingml/2006/main" noChangeAspect="1"/>
-            </wp:cNvGraphicFramePr>
-            <a:graphic xmlns:a="http://schemas.openxmlformats.org/drawingml/2006/main">
-              <a:graphicData uri="http://schemas.openxmlformats.org/drawingml/2006/picture">
-                <pic:pic xmlns:pic="http://schemas.openxmlformats.org/drawingml/2006/picture">
-                  <pic:nvPicPr>
-                    <pic:cNvPr id="0" name="Picture 8"/>
-                    <pic:cNvPicPr>
-                      <a:picLocks noChangeAspect="1" noChangeArrowheads="1"/>
-                    </pic:cNvPicPr>
-                  </pic:nvPicPr>
-                  <pic:blipFill>
-                    <a:blip r:embed="rId25">
-                      <a:extLst>
-                        <a:ext uri="{28A0092B-C50C-407E-A947-70E740481C1C}">
-                          <a14:useLocalDpi xmlns:a14="http://schemas.microsoft.com/office/drawing/2010/main" val="0"/>
-                        </a:ext>
-                      </a:extLst>
-                    </a:blip>
-                    <a:srcRect/>
-                    <a:stretch>
-                      <a:fillRect/>
-                    </a:stretch>
-                  </pic:blipFill>
-                  <pic:spPr bwMode="auto">
-                    <a:xfrm>
-                      <a:off x="0" y="0"/>
-                      <a:ext cx="5935980" cy="2628900"/>
-                    </a:xfrm>
-                    <a:prstGeom prst="rect">
-                      <a:avLst/>
-                    </a:prstGeom>
-                    <a:noFill/>
-                    <a:ln>
-                      <a:noFill/>
-                    </a:ln>
-                  </pic:spPr>
-                </pic:pic>
-              </a:graphicData>
-            </a:graphic>
-          </wp:inline>
-        </w:drawing>
-      </w:r>
-    </w:p>
-    <w:p>
-      <w:pPr>
-        <w:spacing w:line="360" w:lineRule="auto"/>
-        <w:jc w:val="center"/>
-        <w:rPr>
-          <w:sz w:val="28"/>
-          <w:szCs w:val="28"/>
-        </w:rPr>
-      </w:pPr>
-      <w:r>
-        <w:rPr>
-          <w:sz w:val="28"/>
-          <w:szCs w:val="28"/>
-        </w:rPr>
-        <w:t xml:space="preserve">Рисунок 9 – Гистограмма для </w:t>
+        <w:t>Рисунок </w:t>
+      </w:r>
+      <w:r>
+        <w:rPr>
+          <w:sz w:val="28"/>
+          <w:szCs w:val="28"/>
+        </w:rPr>
+        <w:t>8</w:t>
+      </w:r>
+      <w:r>
+        <w:rPr>
+          <w:sz w:val="28"/>
+          <w:szCs w:val="28"/>
+        </w:rPr>
+        <w:t xml:space="preserve"> – Гистограмма для </w:t>
       </w:r>
       <w:proofErr w:type="spellStart"/>
       <w:r>
@@ -10666,7 +10455,6 @@
           <w:sz w:val="28"/>
           <w:szCs w:val="28"/>
         </w:rPr>
-        <w:lastRenderedPageBreak/>
         <w:t>Подвыборка</w:t>
       </w:r>
       <w:proofErr w:type="spellEnd"/>
@@ -11035,7 +10823,6 @@
           <w:sz w:val="32"/>
           <w:szCs w:val="32"/>
         </w:rPr>
-        <w:lastRenderedPageBreak/>
         <w:t>Описание параметров распределения</w:t>
       </w:r>
     </w:p>
@@ -12196,6 +11983,7 @@
           <w:szCs w:val="28"/>
           <w:lang w:val="en-US"/>
         </w:rPr>
+        <w:lastRenderedPageBreak/>
         <w:t>loc</w:t>
       </w:r>
       <w:r>
@@ -12329,7 +12117,6 @@
           <w:sz w:val="28"/>
           <w:szCs w:val="28"/>
         </w:rPr>
-        <w:lastRenderedPageBreak/>
         <w:t>п</w:t>
       </w:r>
       <w:r>
@@ -12702,6 +12489,7 @@
           <w:sz w:val="28"/>
           <w:szCs w:val="28"/>
         </w:rPr>
+        <w:lastRenderedPageBreak/>
         <w:drawing>
           <wp:inline distT="0" distB="0" distL="0" distR="0" wp14:anchorId="3D52F5E0" wp14:editId="3814D755">
             <wp:extent cx="5433085" cy="4930140"/>
@@ -12718,7 +12506,7 @@
                     <pic:cNvPicPr/>
                   </pic:nvPicPr>
                   <pic:blipFill>
-                    <a:blip r:embed="rId26"/>
+                    <a:blip r:embed="rId24"/>
                     <a:stretch>
                       <a:fillRect/>
                     </a:stretch>
@@ -12758,35 +12546,37 @@
     </w:p>
     <w:p>
       <w:pPr>
-        <w:ind w:firstLine="360"/>
-        <w:jc w:val="center"/>
-        <w:rPr>
-          <w:sz w:val="28"/>
-          <w:szCs w:val="28"/>
-        </w:rPr>
-      </w:pPr>
-    </w:p>
-    <w:p>
-      <w:pPr>
-        <w:spacing w:line="360" w:lineRule="auto"/>
-        <w:jc w:val="both"/>
-        <w:rPr>
-          <w:sz w:val="28"/>
-          <w:szCs w:val="28"/>
-        </w:rPr>
-      </w:pPr>
-      <w:r>
-        <w:rPr>
-          <w:noProof/>
+        <w:spacing w:line="360" w:lineRule="auto"/>
+        <w:rPr>
+          <w:b/>
+          <w:bCs/>
+          <w:sz w:val="28"/>
+          <w:szCs w:val="28"/>
+        </w:rPr>
+      </w:pPr>
+    </w:p>
+    <w:p>
+      <w:pPr>
+        <w:rPr>
+          <w:b/>
+          <w:bCs/>
+          <w:sz w:val="28"/>
+          <w:szCs w:val="28"/>
+        </w:rPr>
+      </w:pPr>
+      <w:r>
+        <w:rPr>
+          <w:b/>
+          <w:bCs/>
           <w:sz w:val="28"/>
           <w:szCs w:val="28"/>
         </w:rPr>
         <w:lastRenderedPageBreak/>
         <w:drawing>
-          <wp:inline distT="0" distB="0" distL="0" distR="0" wp14:anchorId="4EBCD29B" wp14:editId="390471AA">
-            <wp:extent cx="5935980" cy="3352800"/>
-            <wp:effectExtent l="0" t="0" r="7620" b="0"/>
-            <wp:docPr id="1881831513" name="Рисунок 1"/>
+          <wp:inline distT="0" distB="0" distL="0" distR="0" wp14:anchorId="006C963B" wp14:editId="3BD6F111">
+            <wp:extent cx="5940425" cy="4229735"/>
+            <wp:effectExtent l="0" t="0" r="3175" b="0"/>
+            <wp:docPr id="15" name="Рисунок 15"/>
             <wp:cNvGraphicFramePr>
               <a:graphicFrameLocks xmlns:a="http://schemas.openxmlformats.org/drawingml/2006/main" noChangeAspect="1"/>
             </wp:cNvGraphicFramePr>
@@ -12794,36 +12584,23 @@
               <a:graphicData uri="http://schemas.openxmlformats.org/drawingml/2006/picture">
                 <pic:pic xmlns:pic="http://schemas.openxmlformats.org/drawingml/2006/picture">
                   <pic:nvPicPr>
-                    <pic:cNvPr id="0" name="Picture 1"/>
-                    <pic:cNvPicPr>
-                      <a:picLocks noChangeAspect="1" noChangeArrowheads="1"/>
-                    </pic:cNvPicPr>
+                    <pic:cNvPr id="1" name=""/>
+                    <pic:cNvPicPr/>
                   </pic:nvPicPr>
                   <pic:blipFill>
-                    <a:blip r:embed="rId27">
-                      <a:extLst>
-                        <a:ext uri="{28A0092B-C50C-407E-A947-70E740481C1C}">
-                          <a14:useLocalDpi xmlns:a14="http://schemas.microsoft.com/office/drawing/2010/main" val="0"/>
-                        </a:ext>
-                      </a:extLst>
-                    </a:blip>
-                    <a:srcRect/>
+                    <a:blip r:embed="rId25"/>
                     <a:stretch>
                       <a:fillRect/>
                     </a:stretch>
                   </pic:blipFill>
-                  <pic:spPr bwMode="auto">
+                  <pic:spPr>
                     <a:xfrm>
                       <a:off x="0" y="0"/>
-                      <a:ext cx="5935980" cy="3352800"/>
+                      <a:ext cx="5940425" cy="4229735"/>
                     </a:xfrm>
                     <a:prstGeom prst="rect">
                       <a:avLst/>
                     </a:prstGeom>
-                    <a:noFill/>
-                    <a:ln>
-                      <a:noFill/>
-                    </a:ln>
                   </pic:spPr>
                 </pic:pic>
               </a:graphicData>
@@ -12846,13 +12623,163 @@
           <w:sz w:val="28"/>
           <w:szCs w:val="28"/>
         </w:rPr>
-        <w:t>Рисунок 10. График теоретической функции распределения</w:t>
-      </w:r>
-    </w:p>
-    <w:p>
-      <w:pPr>
-        <w:spacing w:line="360" w:lineRule="auto"/>
-        <w:jc w:val="center"/>
+        <w:t xml:space="preserve">Рисунок </w:t>
+      </w:r>
+      <w:r>
+        <w:rPr>
+          <w:sz w:val="28"/>
+          <w:szCs w:val="28"/>
+        </w:rPr>
+        <w:t>9</w:t>
+      </w:r>
+      <w:r>
+        <w:rPr>
+          <w:sz w:val="28"/>
+          <w:szCs w:val="28"/>
+        </w:rPr>
+        <w:t>. График теоретических функций распределения со случайно заданными параметрами распределения.</w:t>
+      </w:r>
+    </w:p>
+    <w:p>
+      <w:pPr>
+        <w:spacing w:line="360" w:lineRule="auto"/>
+        <w:rPr>
+          <w:sz w:val="28"/>
+          <w:szCs w:val="28"/>
+        </w:rPr>
+      </w:pPr>
+    </w:p>
+    <w:p>
+      <w:pPr>
+        <w:spacing w:line="360" w:lineRule="auto"/>
+        <w:rPr>
+          <w:sz w:val="28"/>
+          <w:szCs w:val="28"/>
+        </w:rPr>
+      </w:pPr>
+    </w:p>
+    <w:p>
+      <w:pPr>
+        <w:spacing w:line="360" w:lineRule="auto"/>
+        <w:rPr>
+          <w:sz w:val="28"/>
+          <w:szCs w:val="28"/>
+        </w:rPr>
+      </w:pPr>
+    </w:p>
+    <w:p>
+      <w:pPr>
+        <w:spacing w:line="360" w:lineRule="auto"/>
+        <w:rPr>
+          <w:sz w:val="28"/>
+          <w:szCs w:val="28"/>
+        </w:rPr>
+      </w:pPr>
+    </w:p>
+    <w:p>
+      <w:pPr>
+        <w:spacing w:line="360" w:lineRule="auto"/>
+        <w:rPr>
+          <w:sz w:val="28"/>
+          <w:szCs w:val="28"/>
+        </w:rPr>
+      </w:pPr>
+    </w:p>
+    <w:p>
+      <w:pPr>
+        <w:spacing w:line="360" w:lineRule="auto"/>
+        <w:rPr>
+          <w:sz w:val="28"/>
+          <w:szCs w:val="28"/>
+        </w:rPr>
+      </w:pPr>
+    </w:p>
+    <w:p>
+      <w:pPr>
+        <w:spacing w:line="360" w:lineRule="auto"/>
+        <w:rPr>
+          <w:sz w:val="28"/>
+          <w:szCs w:val="28"/>
+        </w:rPr>
+      </w:pPr>
+    </w:p>
+    <w:p>
+      <w:pPr>
+        <w:spacing w:line="360" w:lineRule="auto"/>
+        <w:rPr>
+          <w:sz w:val="28"/>
+          <w:szCs w:val="28"/>
+        </w:rPr>
+      </w:pPr>
+    </w:p>
+    <w:p>
+      <w:pPr>
+        <w:spacing w:line="360" w:lineRule="auto"/>
+        <w:rPr>
+          <w:sz w:val="28"/>
+          <w:szCs w:val="28"/>
+        </w:rPr>
+      </w:pPr>
+    </w:p>
+    <w:p>
+      <w:pPr>
+        <w:spacing w:line="360" w:lineRule="auto"/>
+        <w:rPr>
+          <w:sz w:val="28"/>
+          <w:szCs w:val="28"/>
+        </w:rPr>
+      </w:pPr>
+    </w:p>
+    <w:p>
+      <w:pPr>
+        <w:spacing w:line="360" w:lineRule="auto"/>
+        <w:rPr>
+          <w:sz w:val="28"/>
+          <w:szCs w:val="28"/>
+        </w:rPr>
+      </w:pPr>
+    </w:p>
+    <w:p>
+      <w:pPr>
+        <w:spacing w:line="360" w:lineRule="auto"/>
+        <w:rPr>
+          <w:sz w:val="28"/>
+          <w:szCs w:val="28"/>
+        </w:rPr>
+      </w:pPr>
+    </w:p>
+    <w:p>
+      <w:pPr>
+        <w:spacing w:line="360" w:lineRule="auto"/>
+        <w:rPr>
+          <w:sz w:val="28"/>
+          <w:szCs w:val="28"/>
+        </w:rPr>
+      </w:pPr>
+    </w:p>
+    <w:p>
+      <w:pPr>
+        <w:spacing w:line="360" w:lineRule="auto"/>
+        <w:rPr>
+          <w:sz w:val="28"/>
+          <w:szCs w:val="28"/>
+        </w:rPr>
+      </w:pPr>
+      <w:r>
+        <w:rPr>
+          <w:sz w:val="28"/>
+          <w:szCs w:val="28"/>
+        </w:rPr>
+        <w:tab/>
+      </w:r>
+    </w:p>
+    <w:p>
+      <w:pPr>
+        <w:pStyle w:val="a7"/>
+        <w:numPr>
+          <w:ilvl w:val="1"/>
+          <w:numId w:val="3"/>
+        </w:numPr>
         <w:rPr>
           <w:b/>
           <w:bCs/>
@@ -12860,29 +12787,36 @@
           <w:szCs w:val="28"/>
         </w:rPr>
       </w:pPr>
-    </w:p>
-    <w:p>
-      <w:pPr>
+      <w:r>
         <w:rPr>
           <w:b/>
           <w:bCs/>
           <w:sz w:val="28"/>
           <w:szCs w:val="28"/>
         </w:rPr>
-      </w:pPr>
-      <w:r>
-        <w:rPr>
-          <w:b/>
-          <w:bCs/>
-          <w:noProof/>
-          <w:sz w:val="28"/>
-          <w:szCs w:val="28"/>
+        <w:lastRenderedPageBreak/>
+        <w:t>Оценка влияния параметров распределения на вид графика распределения</w:t>
+      </w:r>
+    </w:p>
+    <w:p>
+      <w:pPr>
+        <w:spacing w:before="100" w:beforeAutospacing="1" w:after="100" w:afterAutospacing="1" w:line="360" w:lineRule="auto"/>
+        <w:jc w:val="center"/>
+        <w:rPr>
+          <w:sz w:val="28"/>
+          <w:szCs w:val="28"/>
+        </w:rPr>
+      </w:pPr>
+      <w:r>
+        <w:rPr>
+          <w:sz w:val="24"/>
+          <w:szCs w:val="24"/>
         </w:rPr>
         <w:drawing>
-          <wp:inline distT="0" distB="0" distL="0" distR="0" wp14:anchorId="6851B8D4" wp14:editId="40FDED88">
-            <wp:extent cx="5935980" cy="3192780"/>
-            <wp:effectExtent l="0" t="0" r="7620" b="7620"/>
-            <wp:docPr id="1395738731" name="Рисунок 2"/>
+          <wp:inline distT="0" distB="0" distL="0" distR="0" wp14:anchorId="05D84D65" wp14:editId="696D3C9E">
+            <wp:extent cx="5940425" cy="4112895"/>
+            <wp:effectExtent l="0" t="0" r="3175" b="1905"/>
+            <wp:docPr id="16" name="Рисунок 16"/>
             <wp:cNvGraphicFramePr>
               <a:graphicFrameLocks xmlns:a="http://schemas.openxmlformats.org/drawingml/2006/main" noChangeAspect="1"/>
             </wp:cNvGraphicFramePr>
@@ -12890,36 +12824,23 @@
               <a:graphicData uri="http://schemas.openxmlformats.org/drawingml/2006/picture">
                 <pic:pic xmlns:pic="http://schemas.openxmlformats.org/drawingml/2006/picture">
                   <pic:nvPicPr>
-                    <pic:cNvPr id="0" name="Picture 2"/>
-                    <pic:cNvPicPr>
-                      <a:picLocks noChangeAspect="1" noChangeArrowheads="1"/>
-                    </pic:cNvPicPr>
+                    <pic:cNvPr id="1" name=""/>
+                    <pic:cNvPicPr/>
                   </pic:nvPicPr>
                   <pic:blipFill>
-                    <a:blip r:embed="rId28">
-                      <a:extLst>
-                        <a:ext uri="{28A0092B-C50C-407E-A947-70E740481C1C}">
-                          <a14:useLocalDpi xmlns:a14="http://schemas.microsoft.com/office/drawing/2010/main" val="0"/>
-                        </a:ext>
-                      </a:extLst>
-                    </a:blip>
-                    <a:srcRect/>
+                    <a:blip r:embed="rId26"/>
                     <a:stretch>
                       <a:fillRect/>
                     </a:stretch>
                   </pic:blipFill>
-                  <pic:spPr bwMode="auto">
+                  <pic:spPr>
                     <a:xfrm>
                       <a:off x="0" y="0"/>
-                      <a:ext cx="5935980" cy="3192780"/>
+                      <a:ext cx="5940425" cy="4112895"/>
                     </a:xfrm>
                     <a:prstGeom prst="rect">
                       <a:avLst/>
                     </a:prstGeom>
-                    <a:noFill/>
-                    <a:ln>
-                      <a:noFill/>
-                    </a:ln>
                   </pic:spPr>
                 </pic:pic>
               </a:graphicData>
@@ -12927,116 +12848,101 @@
           </wp:inline>
         </w:drawing>
       </w:r>
-    </w:p>
-    <w:p>
-      <w:pPr>
-        <w:spacing w:line="360" w:lineRule="auto"/>
-        <w:jc w:val="center"/>
-        <w:rPr>
-          <w:sz w:val="28"/>
-          <w:szCs w:val="28"/>
-        </w:rPr>
-      </w:pPr>
-      <w:r>
-        <w:rPr>
-          <w:sz w:val="28"/>
-          <w:szCs w:val="28"/>
-        </w:rPr>
-        <w:t>Рисунок 11. График теоретических функций распределения со случайно заданными параметрами распределения.</w:t>
-      </w:r>
-    </w:p>
-    <w:p>
-      <w:pPr>
-        <w:spacing w:line="360" w:lineRule="auto"/>
-        <w:jc w:val="center"/>
-        <w:rPr>
-          <w:sz w:val="28"/>
-          <w:szCs w:val="28"/>
-        </w:rPr>
-      </w:pPr>
-    </w:p>
-    <w:p>
-      <w:pPr>
-        <w:spacing w:line="360" w:lineRule="auto"/>
-        <w:jc w:val="center"/>
-        <w:rPr>
-          <w:sz w:val="28"/>
-          <w:szCs w:val="28"/>
-        </w:rPr>
-      </w:pPr>
-    </w:p>
-    <w:p>
-      <w:pPr>
-        <w:spacing w:line="360" w:lineRule="auto"/>
-        <w:jc w:val="center"/>
-        <w:rPr>
-          <w:sz w:val="28"/>
-          <w:szCs w:val="28"/>
-        </w:rPr>
-      </w:pPr>
-    </w:p>
-    <w:p>
-      <w:pPr>
-        <w:spacing w:line="360" w:lineRule="auto"/>
-        <w:jc w:val="center"/>
-        <w:rPr>
-          <w:sz w:val="28"/>
-          <w:szCs w:val="28"/>
-        </w:rPr>
-      </w:pPr>
-      <w:r>
-        <w:rPr>
-          <w:sz w:val="28"/>
-          <w:szCs w:val="28"/>
-        </w:rPr>
-        <w:tab/>
-      </w:r>
-    </w:p>
-    <w:p>
-      <w:pPr>
-        <w:pStyle w:val="a7"/>
-        <w:numPr>
-          <w:ilvl w:val="1"/>
-          <w:numId w:val="3"/>
-        </w:numPr>
-        <w:rPr>
-          <w:b/>
-          <w:bCs/>
-          <w:sz w:val="28"/>
-          <w:szCs w:val="28"/>
-        </w:rPr>
-      </w:pPr>
-      <w:r>
-        <w:rPr>
-          <w:b/>
-          <w:bCs/>
-          <w:sz w:val="28"/>
-          <w:szCs w:val="28"/>
-        </w:rPr>
-        <w:lastRenderedPageBreak/>
-        <w:t>Оценка влияния параметров распределения на вид графика распределения</w:t>
-      </w:r>
-    </w:p>
-    <w:p>
-      <w:pPr>
-        <w:spacing w:before="100" w:beforeAutospacing="1" w:after="100" w:afterAutospacing="1" w:line="360" w:lineRule="auto"/>
-        <w:jc w:val="center"/>
-        <w:rPr>
-          <w:sz w:val="28"/>
-          <w:szCs w:val="28"/>
-        </w:rPr>
-      </w:pPr>
-      <w:r>
-        <w:rPr>
-          <w:noProof/>
+      <w:r>
+        <w:rPr>
           <w:sz w:val="24"/>
           <w:szCs w:val="24"/>
         </w:rPr>
+        <w:br/>
+      </w:r>
+      <w:r>
+        <w:rPr>
+          <w:sz w:val="28"/>
+          <w:szCs w:val="28"/>
+        </w:rPr>
+        <w:t xml:space="preserve">Рисунок </w:t>
+      </w:r>
+      <w:r>
+        <w:rPr>
+          <w:sz w:val="28"/>
+          <w:szCs w:val="28"/>
+        </w:rPr>
+        <w:t>10</w:t>
+      </w:r>
+      <w:r>
+        <w:rPr>
+          <w:sz w:val="28"/>
+          <w:szCs w:val="28"/>
+        </w:rPr>
+        <w:t>. График теоретических функций распределения с различными параметрами формы.</w:t>
+      </w:r>
+    </w:p>
+    <w:p>
+      <w:pPr>
+        <w:spacing w:before="100" w:beforeAutospacing="1" w:after="100" w:afterAutospacing="1" w:line="360" w:lineRule="auto"/>
+        <w:ind w:firstLine="708"/>
+        <w:rPr>
+          <w:sz w:val="28"/>
+          <w:szCs w:val="28"/>
+        </w:rPr>
+      </w:pPr>
+      <w:r>
+        <w:rPr>
+          <w:sz w:val="28"/>
+          <w:szCs w:val="28"/>
+        </w:rPr>
+        <w:t>Оценка</w:t>
+      </w:r>
+      <w:r>
+        <w:rPr>
+          <w:sz w:val="28"/>
+          <w:szCs w:val="28"/>
+        </w:rPr>
+        <w:t xml:space="preserve">: </w:t>
+      </w:r>
+      <w:r>
+        <w:rPr>
+          <w:sz w:val="28"/>
+          <w:szCs w:val="28"/>
+        </w:rPr>
+        <w:t>при увеличении параметра формы пики расходятся сильнее. высота пиков падает, а также растет разброс</w:t>
+      </w:r>
+      <w:r>
+        <w:rPr>
+          <w:sz w:val="28"/>
+          <w:szCs w:val="28"/>
+        </w:rPr>
+        <w:t>.</w:t>
+      </w:r>
+    </w:p>
+    <w:p>
+      <w:pPr>
+        <w:spacing w:before="100" w:beforeAutospacing="1" w:after="100" w:afterAutospacing="1"/>
+        <w:rPr>
+          <w:sz w:val="28"/>
+          <w:szCs w:val="28"/>
+        </w:rPr>
+      </w:pPr>
+    </w:p>
+    <w:p>
+      <w:pPr>
+        <w:spacing w:before="100" w:beforeAutospacing="1" w:after="100" w:afterAutospacing="1"/>
+        <w:rPr>
+          <w:sz w:val="28"/>
+          <w:szCs w:val="28"/>
+        </w:rPr>
+      </w:pPr>
+      <w:r>
+        <w:rPr>
+          <w:sz w:val="28"/>
+          <w:szCs w:val="28"/>
+        </w:rPr>
+        <w:lastRenderedPageBreak/>
         <w:drawing>
-          <wp:inline distT="0" distB="0" distL="0" distR="0" wp14:anchorId="6A42B13A" wp14:editId="2572DF9B">
-            <wp:extent cx="5935980" cy="3177540"/>
-            <wp:effectExtent l="0" t="0" r="7620" b="3810"/>
-            <wp:docPr id="641265952" name="Рисунок 3"/>
+          <wp:inline distT="0" distB="0" distL="0" distR="0" wp14:anchorId="6937A8A7" wp14:editId="4E1D93C8">
+            <wp:extent cx="5940425" cy="4518025"/>
+            <wp:effectExtent l="0" t="0" r="3175" b="0"/>
+            <wp:docPr id="17" name="Рисунок 17"/>
             <wp:cNvGraphicFramePr>
               <a:graphicFrameLocks xmlns:a="http://schemas.openxmlformats.org/drawingml/2006/main" noChangeAspect="1"/>
             </wp:cNvGraphicFramePr>
@@ -13044,36 +12950,23 @@
               <a:graphicData uri="http://schemas.openxmlformats.org/drawingml/2006/picture">
                 <pic:pic xmlns:pic="http://schemas.openxmlformats.org/drawingml/2006/picture">
                   <pic:nvPicPr>
-                    <pic:cNvPr id="0" name="Picture 3"/>
-                    <pic:cNvPicPr>
-                      <a:picLocks noChangeAspect="1" noChangeArrowheads="1"/>
-                    </pic:cNvPicPr>
+                    <pic:cNvPr id="1" name=""/>
+                    <pic:cNvPicPr/>
                   </pic:nvPicPr>
                   <pic:blipFill>
-                    <a:blip r:embed="rId29">
-                      <a:extLst>
-                        <a:ext uri="{28A0092B-C50C-407E-A947-70E740481C1C}">
-                          <a14:useLocalDpi xmlns:a14="http://schemas.microsoft.com/office/drawing/2010/main" val="0"/>
-                        </a:ext>
-                      </a:extLst>
-                    </a:blip>
-                    <a:srcRect/>
+                    <a:blip r:embed="rId27"/>
                     <a:stretch>
                       <a:fillRect/>
                     </a:stretch>
                   </pic:blipFill>
-                  <pic:spPr bwMode="auto">
+                  <pic:spPr>
                     <a:xfrm>
                       <a:off x="0" y="0"/>
-                      <a:ext cx="5935980" cy="3177540"/>
+                      <a:ext cx="5940425" cy="4518025"/>
                     </a:xfrm>
                     <a:prstGeom prst="rect">
                       <a:avLst/>
                     </a:prstGeom>
-                    <a:noFill/>
-                    <a:ln>
-                      <a:noFill/>
-                    </a:ln>
                   </pic:spPr>
                 </pic:pic>
               </a:graphicData>
@@ -13081,50 +12974,61 @@
           </wp:inline>
         </w:drawing>
       </w:r>
-      <w:r>
-        <w:rPr>
-          <w:sz w:val="24"/>
-          <w:szCs w:val="24"/>
-        </w:rPr>
-        <w:br/>
-      </w:r>
-      <w:r>
-        <w:rPr>
-          <w:sz w:val="28"/>
-          <w:szCs w:val="28"/>
-        </w:rPr>
-        <w:t>Рисунок 12. График теоретических функций распределения с различными параметрами формы.</w:t>
+    </w:p>
+    <w:p>
+      <w:pPr>
+        <w:spacing w:before="100" w:beforeAutospacing="1" w:after="100" w:afterAutospacing="1" w:line="360" w:lineRule="auto"/>
+        <w:jc w:val="center"/>
+        <w:rPr>
+          <w:sz w:val="28"/>
+          <w:szCs w:val="28"/>
+        </w:rPr>
+      </w:pPr>
+      <w:r>
+        <w:rPr>
+          <w:sz w:val="28"/>
+          <w:szCs w:val="28"/>
+        </w:rPr>
+        <w:t xml:space="preserve">Рисунок </w:t>
+      </w:r>
+      <w:r>
+        <w:rPr>
+          <w:sz w:val="28"/>
+          <w:szCs w:val="28"/>
+        </w:rPr>
+        <w:t>11</w:t>
+      </w:r>
+      <w:r>
+        <w:rPr>
+          <w:sz w:val="28"/>
+          <w:szCs w:val="28"/>
+        </w:rPr>
+        <w:t>. График теоретических функций распределения с различными параметрами смещения.</w:t>
       </w:r>
     </w:p>
     <w:p>
       <w:pPr>
         <w:spacing w:before="100" w:beforeAutospacing="1" w:after="100" w:afterAutospacing="1" w:line="360" w:lineRule="auto"/>
         <w:ind w:firstLine="708"/>
-        <w:rPr>
-          <w:sz w:val="28"/>
-          <w:szCs w:val="28"/>
-        </w:rPr>
-      </w:pPr>
-      <w:r>
-        <w:rPr>
-          <w:sz w:val="28"/>
-          <w:szCs w:val="28"/>
-        </w:rPr>
-        <w:t>Оценка</w:t>
-      </w:r>
-      <w:r>
-        <w:rPr>
-          <w:sz w:val="28"/>
-          <w:szCs w:val="28"/>
-        </w:rPr>
-        <w:t xml:space="preserve">: </w:t>
-      </w:r>
-      <w:r>
-        <w:rPr>
-          <w:sz w:val="28"/>
-          <w:szCs w:val="28"/>
-        </w:rPr>
-        <w:t>при увеличении параметра формы пики расходятся сильнее. высота пиков падает, а также растет разброс</w:t>
+        <w:jc w:val="both"/>
+        <w:rPr>
+          <w:sz w:val="28"/>
+          <w:szCs w:val="28"/>
+        </w:rPr>
+      </w:pPr>
+      <w:r>
+        <w:rPr>
+          <w:sz w:val="28"/>
+          <w:szCs w:val="28"/>
+        </w:rPr>
+        <w:t xml:space="preserve">Оценка: </w:t>
+      </w:r>
+      <w:r>
+        <w:rPr>
+          <w:sz w:val="28"/>
+          <w:szCs w:val="28"/>
+        </w:rPr>
+        <w:t>при увеличении параметра смещения не изменяется форма кривой, расстояние между пиками и высота пиков. Изменяется только центр симметрии у двойного гамма распределения</w:t>
       </w:r>
       <w:r>
         <w:rPr>
@@ -13133,264 +13037,6 @@
         </w:rPr>
         <w:t>.</w:t>
       </w:r>
-    </w:p>
-    <w:p>
-      <w:pPr>
-        <w:spacing w:before="100" w:beforeAutospacing="1" w:after="100" w:afterAutospacing="1"/>
-        <w:rPr>
-          <w:sz w:val="28"/>
-          <w:szCs w:val="28"/>
-        </w:rPr>
-      </w:pPr>
-    </w:p>
-    <w:p>
-      <w:pPr>
-        <w:spacing w:before="100" w:beforeAutospacing="1" w:after="100" w:afterAutospacing="1"/>
-        <w:rPr>
-          <w:sz w:val="28"/>
-          <w:szCs w:val="28"/>
-        </w:rPr>
-      </w:pPr>
-      <w:r>
-        <w:rPr>
-          <w:noProof/>
-          <w:sz w:val="28"/>
-          <w:szCs w:val="28"/>
-        </w:rPr>
-        <w:drawing>
-          <wp:inline distT="0" distB="0" distL="0" distR="0" wp14:anchorId="7A41816E" wp14:editId="5CBD4247">
-            <wp:extent cx="5935980" cy="3131820"/>
-            <wp:effectExtent l="0" t="0" r="7620" b="0"/>
-            <wp:docPr id="359336630" name="Рисунок 4"/>
-            <wp:cNvGraphicFramePr>
-              <a:graphicFrameLocks xmlns:a="http://schemas.openxmlformats.org/drawingml/2006/main" noChangeAspect="1"/>
-            </wp:cNvGraphicFramePr>
-            <a:graphic xmlns:a="http://schemas.openxmlformats.org/drawingml/2006/main">
-              <a:graphicData uri="http://schemas.openxmlformats.org/drawingml/2006/picture">
-                <pic:pic xmlns:pic="http://schemas.openxmlformats.org/drawingml/2006/picture">
-                  <pic:nvPicPr>
-                    <pic:cNvPr id="0" name="Picture 4"/>
-                    <pic:cNvPicPr>
-                      <a:picLocks noChangeAspect="1" noChangeArrowheads="1"/>
-                    </pic:cNvPicPr>
-                  </pic:nvPicPr>
-                  <pic:blipFill>
-                    <a:blip r:embed="rId30">
-                      <a:extLst>
-                        <a:ext uri="{28A0092B-C50C-407E-A947-70E740481C1C}">
-                          <a14:useLocalDpi xmlns:a14="http://schemas.microsoft.com/office/drawing/2010/main" val="0"/>
-                        </a:ext>
-                      </a:extLst>
-                    </a:blip>
-                    <a:srcRect/>
-                    <a:stretch>
-                      <a:fillRect/>
-                    </a:stretch>
-                  </pic:blipFill>
-                  <pic:spPr bwMode="auto">
-                    <a:xfrm>
-                      <a:off x="0" y="0"/>
-                      <a:ext cx="5935980" cy="3131820"/>
-                    </a:xfrm>
-                    <a:prstGeom prst="rect">
-                      <a:avLst/>
-                    </a:prstGeom>
-                    <a:noFill/>
-                    <a:ln>
-                      <a:noFill/>
-                    </a:ln>
-                  </pic:spPr>
-                </pic:pic>
-              </a:graphicData>
-            </a:graphic>
-          </wp:inline>
-        </w:drawing>
-      </w:r>
-    </w:p>
-    <w:p>
-      <w:pPr>
-        <w:spacing w:before="100" w:beforeAutospacing="1" w:after="100" w:afterAutospacing="1" w:line="360" w:lineRule="auto"/>
-        <w:jc w:val="center"/>
-        <w:rPr>
-          <w:sz w:val="28"/>
-          <w:szCs w:val="28"/>
-        </w:rPr>
-      </w:pPr>
-      <w:r>
-        <w:rPr>
-          <w:sz w:val="28"/>
-          <w:szCs w:val="28"/>
-        </w:rPr>
-        <w:lastRenderedPageBreak/>
-        <w:t>Рисунок 12. График теоретических функций распределения с различными параметрами смещения.</w:t>
-      </w:r>
-    </w:p>
-    <w:p>
-      <w:pPr>
-        <w:spacing w:before="100" w:beforeAutospacing="1" w:after="100" w:afterAutospacing="1" w:line="360" w:lineRule="auto"/>
-        <w:ind w:firstLine="708"/>
-        <w:jc w:val="both"/>
-        <w:rPr>
-          <w:sz w:val="28"/>
-          <w:szCs w:val="28"/>
-        </w:rPr>
-      </w:pPr>
-      <w:r>
-        <w:rPr>
-          <w:sz w:val="28"/>
-          <w:szCs w:val="28"/>
-        </w:rPr>
-        <w:t xml:space="preserve">Оценка: </w:t>
-      </w:r>
-      <w:r>
-        <w:rPr>
-          <w:sz w:val="28"/>
-          <w:szCs w:val="28"/>
-        </w:rPr>
-        <w:t>при увеличении параметра смещения не изменяется форма кривой, расстояние между пиками и высота пиков. Изменяется только центр симметрии у двойного гамма распределения</w:t>
-      </w:r>
-      <w:r>
-        <w:rPr>
-          <w:sz w:val="28"/>
-          <w:szCs w:val="28"/>
-        </w:rPr>
-        <w:t>.</w:t>
-      </w:r>
-    </w:p>
-    <w:p>
-      <w:pPr>
-        <w:spacing w:line="360" w:lineRule="auto"/>
-        <w:rPr>
-          <w:sz w:val="28"/>
-          <w:szCs w:val="28"/>
-        </w:rPr>
-      </w:pPr>
-    </w:p>
-    <w:p>
-      <w:pPr>
-        <w:spacing w:line="360" w:lineRule="auto"/>
-        <w:rPr>
-          <w:sz w:val="28"/>
-          <w:szCs w:val="28"/>
-        </w:rPr>
-      </w:pPr>
-    </w:p>
-    <w:p>
-      <w:pPr>
-        <w:spacing w:line="360" w:lineRule="auto"/>
-        <w:rPr>
-          <w:sz w:val="28"/>
-          <w:szCs w:val="28"/>
-        </w:rPr>
-      </w:pPr>
-    </w:p>
-    <w:p>
-      <w:pPr>
-        <w:spacing w:line="360" w:lineRule="auto"/>
-        <w:rPr>
-          <w:sz w:val="28"/>
-          <w:szCs w:val="28"/>
-        </w:rPr>
-      </w:pPr>
-    </w:p>
-    <w:p>
-      <w:pPr>
-        <w:spacing w:line="360" w:lineRule="auto"/>
-        <w:rPr>
-          <w:sz w:val="28"/>
-          <w:szCs w:val="28"/>
-        </w:rPr>
-      </w:pPr>
-    </w:p>
-    <w:p>
-      <w:pPr>
-        <w:spacing w:line="360" w:lineRule="auto"/>
-        <w:rPr>
-          <w:sz w:val="28"/>
-          <w:szCs w:val="28"/>
-        </w:rPr>
-      </w:pPr>
-    </w:p>
-    <w:p>
-      <w:pPr>
-        <w:spacing w:line="360" w:lineRule="auto"/>
-        <w:rPr>
-          <w:sz w:val="28"/>
-          <w:szCs w:val="28"/>
-        </w:rPr>
-      </w:pPr>
-    </w:p>
-    <w:p>
-      <w:pPr>
-        <w:spacing w:line="360" w:lineRule="auto"/>
-        <w:rPr>
-          <w:sz w:val="28"/>
-          <w:szCs w:val="28"/>
-        </w:rPr>
-      </w:pPr>
-    </w:p>
-    <w:p>
-      <w:pPr>
-        <w:spacing w:line="360" w:lineRule="auto"/>
-        <w:rPr>
-          <w:sz w:val="28"/>
-          <w:szCs w:val="28"/>
-        </w:rPr>
-      </w:pPr>
-    </w:p>
-    <w:p>
-      <w:pPr>
-        <w:spacing w:line="360" w:lineRule="auto"/>
-        <w:rPr>
-          <w:sz w:val="28"/>
-          <w:szCs w:val="28"/>
-        </w:rPr>
-      </w:pPr>
-    </w:p>
-    <w:p>
-      <w:pPr>
-        <w:spacing w:line="360" w:lineRule="auto"/>
-        <w:rPr>
-          <w:sz w:val="28"/>
-          <w:szCs w:val="28"/>
-        </w:rPr>
-      </w:pPr>
-    </w:p>
-    <w:p>
-      <w:pPr>
-        <w:spacing w:line="360" w:lineRule="auto"/>
-        <w:rPr>
-          <w:sz w:val="28"/>
-          <w:szCs w:val="28"/>
-        </w:rPr>
-      </w:pPr>
-    </w:p>
-    <w:p>
-      <w:pPr>
-        <w:spacing w:line="360" w:lineRule="auto"/>
-        <w:rPr>
-          <w:sz w:val="28"/>
-          <w:szCs w:val="28"/>
-        </w:rPr>
-      </w:pPr>
-    </w:p>
-    <w:p>
-      <w:pPr>
-        <w:spacing w:line="360" w:lineRule="auto"/>
-        <w:rPr>
-          <w:sz w:val="28"/>
-          <w:szCs w:val="28"/>
-        </w:rPr>
-      </w:pPr>
-    </w:p>
-    <w:p>
-      <w:pPr>
-        <w:spacing w:line="360" w:lineRule="auto"/>
-        <w:rPr>
-          <w:sz w:val="28"/>
-          <w:szCs w:val="28"/>
-        </w:rPr>
-      </w:pPr>
     </w:p>
     <w:p>
       <w:pPr>
@@ -13535,7 +13181,7 @@
         </w:rPr>
         <w:t xml:space="preserve">: </w:t>
       </w:r>
-      <w:hyperlink r:id="rId31" w:history="1">
+      <w:hyperlink r:id="rId28" w:history="1">
         <w:r>
           <w:rPr>
             <w:rStyle w:val="ac"/>
@@ -13586,10 +13232,24 @@
           <w:szCs w:val="28"/>
           <w:lang w:val="en-US"/>
         </w:rPr>
-        <w:t xml:space="preserve">[2] Bain L. J., Engelhardt M. Introduction to Probability and Mathematical Statistics. — 2nd ed. — </w:t>
-      </w:r>
-      <w:proofErr w:type="gramStart"/>
-      <w:r>
+        <w:t>[2] Bain L. J., Engelhardt M. Introduction to Probability and Mathematical Statistics. — 2nd ed. — Belmont : Brooks/Cole, 1992. — 644 p.</w:t>
+      </w:r>
+    </w:p>
+    <w:p>
+      <w:pPr>
+        <w:spacing w:line="360" w:lineRule="auto"/>
+        <w:jc w:val="both"/>
+        <w:rPr>
+          <w:sz w:val="28"/>
+          <w:szCs w:val="28"/>
+          <w:lang w:val="en-US"/>
+        </w:rPr>
+      </w:pPr>
+    </w:p>
+    <w:p>
+      <w:pPr>
+        <w:spacing w:line="360" w:lineRule="auto"/>
+        <w:jc w:val="both"/>
         <w:rPr>
           <w:b/>
           <w:bCs/>
@@ -13597,9 +13257,7 @@
           <w:szCs w:val="28"/>
           <w:lang w:val="en-US"/>
         </w:rPr>
-        <w:t>Belmont :</w:t>
-      </w:r>
-      <w:proofErr w:type="gramEnd"/>
+      </w:pPr>
       <w:r>
         <w:rPr>
           <w:b/>
@@ -13608,24 +13266,10 @@
           <w:szCs w:val="28"/>
           <w:lang w:val="en-US"/>
         </w:rPr>
-        <w:t xml:space="preserve"> Brooks/Cole, 1992. — 644 p.</w:t>
-      </w:r>
-    </w:p>
-    <w:p>
-      <w:pPr>
-        <w:spacing w:line="360" w:lineRule="auto"/>
-        <w:jc w:val="both"/>
-        <w:rPr>
-          <w:sz w:val="28"/>
-          <w:szCs w:val="28"/>
-          <w:lang w:val="en-US"/>
-        </w:rPr>
-      </w:pPr>
-    </w:p>
-    <w:p>
-      <w:pPr>
-        <w:spacing w:line="360" w:lineRule="auto"/>
-        <w:jc w:val="both"/>
+        <w:t xml:space="preserve">[3] </w:t>
+      </w:r>
+      <w:proofErr w:type="spellStart"/>
+      <w:r>
         <w:rPr>
           <w:b/>
           <w:bCs/>
@@ -13633,7 +13277,9 @@
           <w:szCs w:val="28"/>
           <w:lang w:val="en-US"/>
         </w:rPr>
-      </w:pPr>
+        <w:t>Bahashwan</w:t>
+      </w:r>
+      <w:proofErr w:type="spellEnd"/>
       <w:r>
         <w:rPr>
           <w:b/>
@@ -13642,7 +13288,7 @@
           <w:szCs w:val="28"/>
           <w:lang w:val="en-US"/>
         </w:rPr>
-        <w:t xml:space="preserve">[3] </w:t>
+        <w:t xml:space="preserve"> A. O., </w:t>
       </w:r>
       <w:proofErr w:type="spellStart"/>
       <w:r>
@@ -13653,7 +13299,7 @@
           <w:szCs w:val="28"/>
           <w:lang w:val="en-US"/>
         </w:rPr>
-        <w:t>Bahashwan</w:t>
+        <w:t>Kalantan</w:t>
       </w:r>
       <w:proofErr w:type="spellEnd"/>
       <w:r>
@@ -13664,7 +13310,7 @@
           <w:szCs w:val="28"/>
           <w:lang w:val="en-US"/>
         </w:rPr>
-        <w:t xml:space="preserve"> A. O., </w:t>
+        <w:t xml:space="preserve"> Z. I., </w:t>
       </w:r>
       <w:proofErr w:type="spellStart"/>
       <w:r>
@@ -13675,7 +13321,7 @@
           <w:szCs w:val="28"/>
           <w:lang w:val="en-US"/>
         </w:rPr>
-        <w:t>Kalantan</w:t>
+        <w:t>Adham</w:t>
       </w:r>
       <w:proofErr w:type="spellEnd"/>
       <w:r>
@@ -13686,47 +13332,45 @@
           <w:szCs w:val="28"/>
           <w:lang w:val="en-US"/>
         </w:rPr>
-        <w:t xml:space="preserve"> Z. I., </w:t>
-      </w:r>
-      <w:proofErr w:type="spellStart"/>
+        <w:t xml:space="preserve"> S. A. Double Gamma Principal Components Analysis // Applied Mathematical Sciences. — 2018. — Vol. 12, № 11. — P. 523–533. </w:t>
+      </w:r>
+    </w:p>
+    <w:p>
+      <w:pPr>
+        <w:spacing w:line="360" w:lineRule="auto"/>
+        <w:jc w:val="both"/>
+        <w:rPr>
+          <w:sz w:val="28"/>
+          <w:szCs w:val="28"/>
+          <w:lang w:val="en-US"/>
+        </w:rPr>
+      </w:pPr>
+    </w:p>
+    <w:p>
+      <w:pPr>
+        <w:spacing w:line="360" w:lineRule="auto"/>
+        <w:jc w:val="both"/>
+      </w:pPr>
       <w:r>
         <w:rPr>
           <w:b/>
           <w:bCs/>
           <w:sz w:val="28"/>
           <w:szCs w:val="28"/>
-          <w:lang w:val="en-US"/>
-        </w:rPr>
-        <w:t>Adham</w:t>
-      </w:r>
-      <w:proofErr w:type="spellEnd"/>
+        </w:rPr>
+        <w:t xml:space="preserve">[4] </w:t>
+      </w:r>
+      <w:proofErr w:type="spellStart"/>
       <w:r>
         <w:rPr>
           <w:b/>
           <w:bCs/>
           <w:sz w:val="28"/>
           <w:szCs w:val="28"/>
-          <w:lang w:val="en-US"/>
-        </w:rPr>
-        <w:t xml:space="preserve"> S. A. Double Gamma Principal Components Analysis // Applied Mathematical Sciences. — 2018. — Vol. 12, № 11. — P. 523–533. </w:t>
-      </w:r>
-    </w:p>
-    <w:p>
-      <w:pPr>
-        <w:spacing w:line="360" w:lineRule="auto"/>
-        <w:jc w:val="both"/>
-        <w:rPr>
-          <w:sz w:val="28"/>
-          <w:szCs w:val="28"/>
-          <w:lang w:val="en-US"/>
-        </w:rPr>
-      </w:pPr>
-    </w:p>
-    <w:p>
-      <w:pPr>
-        <w:spacing w:line="360" w:lineRule="auto"/>
-        <w:jc w:val="both"/>
-      </w:pPr>
+        </w:rPr>
+        <w:t>Положинцев</w:t>
+      </w:r>
+      <w:proofErr w:type="spellEnd"/>
       <w:r>
         <w:rPr>
           <w:b/>
@@ -13734,7 +13378,7 @@
           <w:sz w:val="28"/>
           <w:szCs w:val="28"/>
         </w:rPr>
-        <w:t xml:space="preserve">[4] </w:t>
+        <w:t xml:space="preserve"> Б. И. Теория вероятностей и математическая статистика. Введение в математическую статистику: учебное пособие /  Б. И. </w:t>
       </w:r>
       <w:proofErr w:type="spellStart"/>
       <w:r>
@@ -13754,9 +13398,9 @@
           <w:sz w:val="28"/>
           <w:szCs w:val="28"/>
         </w:rPr>
-        <w:t xml:space="preserve"> Б. И. Теория вероятностей и математическая статистика. Введение в математическую статистику: учебное пособие </w:t>
-      </w:r>
-      <w:proofErr w:type="gramStart"/>
+        <w:t xml:space="preserve">. – Санкт-Петербург: </w:t>
+      </w:r>
+      <w:proofErr w:type="spellStart"/>
       <w:r>
         <w:rPr>
           <w:b/>
@@ -13764,9 +13408,9 @@
           <w:sz w:val="28"/>
           <w:szCs w:val="28"/>
         </w:rPr>
-        <w:t>/  Б.</w:t>
-      </w:r>
-      <w:proofErr w:type="gramEnd"/>
+        <w:t>СПбПУ</w:t>
+      </w:r>
+      <w:proofErr w:type="spellEnd"/>
       <w:r>
         <w:rPr>
           <w:b/>
@@ -13774,9 +13418,8 @@
           <w:sz w:val="28"/>
           <w:szCs w:val="28"/>
         </w:rPr>
-        <w:t xml:space="preserve"> И. </w:t>
-      </w:r>
-      <w:proofErr w:type="spellStart"/>
+        <w:t>, 2016.</w:t>
+      </w:r>
       <w:r>
         <w:rPr>
           <w:b/>
@@ -13784,9 +13427,8 @@
           <w:sz w:val="28"/>
           <w:szCs w:val="28"/>
         </w:rPr>
-        <w:t>Положинцев</w:t>
-      </w:r>
-      <w:proofErr w:type="spellEnd"/>
+        <w:t xml:space="preserve"> </w:t>
+      </w:r>
       <w:r>
         <w:rPr>
           <w:b/>
@@ -13794,54 +13436,16 @@
           <w:sz w:val="28"/>
           <w:szCs w:val="28"/>
         </w:rPr>
-        <w:t xml:space="preserve">. – Санкт-Петербург: </w:t>
-      </w:r>
-      <w:proofErr w:type="spellStart"/>
-      <w:r>
-        <w:rPr>
-          <w:b/>
-          <w:bCs/>
-          <w:sz w:val="28"/>
-          <w:szCs w:val="28"/>
-        </w:rPr>
-        <w:t>СПбПУ</w:t>
-      </w:r>
-      <w:proofErr w:type="spellEnd"/>
-      <w:r>
-        <w:rPr>
-          <w:b/>
-          <w:bCs/>
-          <w:sz w:val="28"/>
-          <w:szCs w:val="28"/>
-        </w:rPr>
-        <w:t>, 2016.</w:t>
-      </w:r>
-      <w:r>
-        <w:rPr>
-          <w:b/>
-          <w:bCs/>
+        <w:t>– URL:</w:t>
+      </w:r>
+      <w:r>
+        <w:rPr>
           <w:sz w:val="28"/>
           <w:szCs w:val="28"/>
         </w:rPr>
         <w:t xml:space="preserve"> </w:t>
       </w:r>
-      <w:r>
-        <w:rPr>
-          <w:b/>
-          <w:bCs/>
-          <w:sz w:val="28"/>
-          <w:szCs w:val="28"/>
-        </w:rPr>
-        <w:t>– URL:</w:t>
-      </w:r>
-      <w:r>
-        <w:rPr>
-          <w:sz w:val="28"/>
-          <w:szCs w:val="28"/>
-        </w:rPr>
-        <w:t xml:space="preserve"> </w:t>
-      </w:r>
-      <w:hyperlink r:id="rId32" w:history="1">
+      <w:hyperlink r:id="rId29" w:history="1">
         <w:r>
           <w:rPr>
             <w:rStyle w:val="ac"/>

</xml_diff>

<commit_message>
UPDATE: code DATE: 2026-09-21 22:36:16
</commit_message>
<xml_diff>
--- a/Учеба 4 семестр/Теория вероятности/Курсовая работа/Отчет, Код/Курсовая_работа.docx
+++ b/Учеба 4 семестр/Теория вероятности/Курсовая работа/Отчет, Код/Курсовая_работа.docx
@@ -1953,7 +1953,23 @@
           <w:sz w:val="28"/>
           <w:szCs w:val="28"/>
         </w:rPr>
-        <w:t>Объектом исследования является выборка случайной величины, подчиняющейся двойному гамма распределению. Предметом исследования — статистические свойства данной выборки и методы её анализа.</w:t>
+        <w:t xml:space="preserve">Объектом исследования является выборка случайной величины, подчиняющейся </w:t>
+      </w:r>
+      <w:proofErr w:type="gramStart"/>
+      <w:r>
+        <w:rPr>
+          <w:sz w:val="28"/>
+          <w:szCs w:val="28"/>
+        </w:rPr>
+        <w:t>двойному</w:t>
+      </w:r>
+      <w:proofErr w:type="gramEnd"/>
+      <w:r>
+        <w:rPr>
+          <w:sz w:val="28"/>
+          <w:szCs w:val="28"/>
+        </w:rPr>
+        <w:t xml:space="preserve"> гамма распределению. Предметом исследования — статистические свойства данной выборки и методы её анализа.</w:t>
       </w:r>
     </w:p>
     <w:p>
@@ -3274,15 +3290,14 @@
       </w:pPr>
       <w:r>
         <w:rPr>
-          <w:noProof/>
           <w:sz w:val="28"/>
           <w:szCs w:val="28"/>
         </w:rPr>
         <w:drawing>
-          <wp:inline distT="0" distB="0" distL="0" distR="0" wp14:anchorId="540CE586" wp14:editId="0DCE18C7">
-            <wp:extent cx="2060448" cy="1121664"/>
-            <wp:effectExtent l="0" t="0" r="0" b="0"/>
-            <wp:docPr id="9001" name="Листинг 9001"/>
+          <wp:inline distT="0" distB="0" distL="0" distR="0" wp14:anchorId="48506750" wp14:editId="4F983DEE">
+            <wp:extent cx="5189670" cy="3101609"/>
+            <wp:effectExtent l="0" t="0" r="0" b="3810"/>
+            <wp:docPr id="18" name="Рисунок 18"/>
             <wp:cNvGraphicFramePr>
               <a:graphicFrameLocks xmlns:a="http://schemas.openxmlformats.org/drawingml/2006/main" noChangeAspect="1"/>
             </wp:cNvGraphicFramePr>
@@ -3290,10 +3305,8 @@
               <a:graphicData uri="http://schemas.openxmlformats.org/drawingml/2006/picture">
                 <pic:pic xmlns:pic="http://schemas.openxmlformats.org/drawingml/2006/picture">
                   <pic:nvPicPr>
-                    <pic:cNvPr id="9001" name="Листинг 9001"/>
-                    <pic:cNvPicPr>
-                      <a:picLocks noChangeAspect="1"/>
-                    </pic:cNvPicPr>
+                    <pic:cNvPr id="1" name=""/>
+                    <pic:cNvPicPr/>
                   </pic:nvPicPr>
                   <pic:blipFill>
                     <a:blip r:embed="rId6"/>
@@ -3304,7 +3317,7 @@
                   <pic:spPr>
                     <a:xfrm>
                       <a:off x="0" y="0"/>
-                      <a:ext cx="2060448" cy="1121664"/>
+                      <a:ext cx="5189670" cy="3101609"/>
                     </a:xfrm>
                     <a:prstGeom prst="rect">
                       <a:avLst/>
@@ -3402,15 +3415,14 @@
       </w:pPr>
       <w:r>
         <w:rPr>
-          <w:noProof/>
           <w:sz w:val="28"/>
           <w:szCs w:val="28"/>
         </w:rPr>
         <w:drawing>
-          <wp:inline distT="0" distB="0" distL="0" distR="0" wp14:anchorId="36994EA1" wp14:editId="326A4324">
-            <wp:extent cx="2980944" cy="609600"/>
-            <wp:effectExtent l="0" t="0" r="0" b="0"/>
-            <wp:docPr id="9002" name="Листинг 9002"/>
+          <wp:inline distT="0" distB="0" distL="0" distR="0" wp14:anchorId="1B719426" wp14:editId="6F4D491F">
+            <wp:extent cx="1653683" cy="1051651"/>
+            <wp:effectExtent l="0" t="0" r="3810" b="0"/>
+            <wp:docPr id="19" name="Рисунок 19"/>
             <wp:cNvGraphicFramePr>
               <a:graphicFrameLocks xmlns:a="http://schemas.openxmlformats.org/drawingml/2006/main" noChangeAspect="1"/>
             </wp:cNvGraphicFramePr>
@@ -3418,10 +3430,8 @@
               <a:graphicData uri="http://schemas.openxmlformats.org/drawingml/2006/picture">
                 <pic:pic xmlns:pic="http://schemas.openxmlformats.org/drawingml/2006/picture">
                   <pic:nvPicPr>
-                    <pic:cNvPr id="9002" name="Листинг 9002"/>
-                    <pic:cNvPicPr>
-                      <a:picLocks noChangeAspect="1"/>
-                    </pic:cNvPicPr>
+                    <pic:cNvPr id="1" name=""/>
+                    <pic:cNvPicPr/>
                   </pic:nvPicPr>
                   <pic:blipFill>
                     <a:blip r:embed="rId7"/>
@@ -3432,7 +3442,7 @@
                   <pic:spPr>
                     <a:xfrm>
                       <a:off x="0" y="0"/>
-                      <a:ext cx="2980944" cy="609600"/>
+                      <a:ext cx="1653683" cy="1051651"/>
                     </a:xfrm>
                     <a:prstGeom prst="rect">
                       <a:avLst/>
@@ -3470,7 +3480,6 @@
         <w:rPr>
           <w:sz w:val="28"/>
           <w:szCs w:val="28"/>
-          <w:lang w:val="en-US"/>
         </w:rPr>
       </w:pPr>
     </w:p>
@@ -3493,6 +3502,7 @@
           <w:sz w:val="28"/>
           <w:szCs w:val="28"/>
         </w:rPr>
+        <w:lastRenderedPageBreak/>
         <w:t>м</w:t>
       </w:r>
       <w:r>
@@ -3542,15 +3552,14 @@
       </w:pPr>
       <w:r>
         <w:rPr>
-          <w:noProof/>
           <w:sz w:val="28"/>
           <w:szCs w:val="28"/>
         </w:rPr>
         <w:drawing>
-          <wp:inline distT="0" distB="0" distL="0" distR="0" wp14:anchorId="319E8EF3" wp14:editId="2ADED612">
-            <wp:extent cx="4901184" cy="1463040"/>
+          <wp:inline distT="0" distB="0" distL="0" distR="0" wp14:anchorId="0964DEFE" wp14:editId="7DCB6A59">
+            <wp:extent cx="4038950" cy="1676545"/>
             <wp:effectExtent l="0" t="0" r="0" b="0"/>
-            <wp:docPr id="9003" name="Листинг 9003"/>
+            <wp:docPr id="20" name="Рисунок 20"/>
             <wp:cNvGraphicFramePr>
               <a:graphicFrameLocks xmlns:a="http://schemas.openxmlformats.org/drawingml/2006/main" noChangeAspect="1"/>
             </wp:cNvGraphicFramePr>
@@ -3558,10 +3567,8 @@
               <a:graphicData uri="http://schemas.openxmlformats.org/drawingml/2006/picture">
                 <pic:pic xmlns:pic="http://schemas.openxmlformats.org/drawingml/2006/picture">
                   <pic:nvPicPr>
-                    <pic:cNvPr id="9003" name="Листинг 9003"/>
-                    <pic:cNvPicPr>
-                      <a:picLocks noChangeAspect="1"/>
-                    </pic:cNvPicPr>
+                    <pic:cNvPr id="1" name=""/>
+                    <pic:cNvPicPr/>
                   </pic:nvPicPr>
                   <pic:blipFill>
                     <a:blip r:embed="rId8"/>
@@ -3572,7 +3579,7 @@
                   <pic:spPr>
                     <a:xfrm>
                       <a:off x="0" y="0"/>
-                      <a:ext cx="4901184" cy="1463040"/>
+                      <a:ext cx="4038950" cy="1676545"/>
                     </a:xfrm>
                     <a:prstGeom prst="rect">
                       <a:avLst/>
@@ -3633,7 +3640,6 @@
           <w:sz w:val="28"/>
           <w:szCs w:val="28"/>
         </w:rPr>
-        <w:lastRenderedPageBreak/>
         <w:t>м</w:t>
       </w:r>
       <w:r>
@@ -3683,15 +3689,14 @@
       </w:pPr>
       <w:r>
         <w:rPr>
-          <w:noProof/>
           <w:sz w:val="28"/>
           <w:szCs w:val="28"/>
         </w:rPr>
         <w:drawing>
-          <wp:inline distT="0" distB="0" distL="0" distR="0" wp14:anchorId="41C7498E" wp14:editId="155D9E56">
-            <wp:extent cx="3249168" cy="2657856"/>
-            <wp:effectExtent l="0" t="0" r="0" b="0"/>
-            <wp:docPr id="9004" name="Листинг 9004"/>
+          <wp:inline distT="0" distB="0" distL="0" distR="0" wp14:anchorId="53DD5753" wp14:editId="6D6BE151">
+            <wp:extent cx="3368332" cy="2834886"/>
+            <wp:effectExtent l="0" t="0" r="3810" b="3810"/>
+            <wp:docPr id="21" name="Рисунок 21"/>
             <wp:cNvGraphicFramePr>
               <a:graphicFrameLocks xmlns:a="http://schemas.openxmlformats.org/drawingml/2006/main" noChangeAspect="1"/>
             </wp:cNvGraphicFramePr>
@@ -3699,10 +3704,8 @@
               <a:graphicData uri="http://schemas.openxmlformats.org/drawingml/2006/picture">
                 <pic:pic xmlns:pic="http://schemas.openxmlformats.org/drawingml/2006/picture">
                   <pic:nvPicPr>
-                    <pic:cNvPr id="9004" name="Листинг 9004"/>
-                    <pic:cNvPicPr>
-                      <a:picLocks noChangeAspect="1"/>
-                    </pic:cNvPicPr>
+                    <pic:cNvPr id="1" name=""/>
+                    <pic:cNvPicPr/>
                   </pic:nvPicPr>
                   <pic:blipFill>
                     <a:blip r:embed="rId9"/>
@@ -3713,7 +3716,7 @@
                   <pic:spPr>
                     <a:xfrm>
                       <a:off x="0" y="0"/>
-                      <a:ext cx="3249168" cy="2657856"/>
+                      <a:ext cx="3368332" cy="2834886"/>
                     </a:xfrm>
                     <a:prstGeom prst="rect">
                       <a:avLst/>
@@ -3823,15 +3826,15 @@
       </w:pPr>
       <w:r>
         <w:rPr>
-          <w:noProof/>
-          <w:sz w:val="28"/>
-          <w:szCs w:val="28"/>
-        </w:rPr>
+          <w:sz w:val="28"/>
+          <w:szCs w:val="28"/>
+        </w:rPr>
+        <w:lastRenderedPageBreak/>
         <w:drawing>
-          <wp:inline distT="0" distB="0" distL="0" distR="0" wp14:anchorId="4390033D" wp14:editId="06D90545">
-            <wp:extent cx="2651760" cy="609600"/>
+          <wp:inline distT="0" distB="0" distL="0" distR="0" wp14:anchorId="43C41EBC" wp14:editId="55DBDC40">
+            <wp:extent cx="2438611" cy="1684166"/>
             <wp:effectExtent l="0" t="0" r="0" b="0"/>
-            <wp:docPr id="9005" name="Листинг 9005"/>
+            <wp:docPr id="22" name="Рисунок 22"/>
             <wp:cNvGraphicFramePr>
               <a:graphicFrameLocks xmlns:a="http://schemas.openxmlformats.org/drawingml/2006/main" noChangeAspect="1"/>
             </wp:cNvGraphicFramePr>
@@ -3839,10 +3842,8 @@
               <a:graphicData uri="http://schemas.openxmlformats.org/drawingml/2006/picture">
                 <pic:pic xmlns:pic="http://schemas.openxmlformats.org/drawingml/2006/picture">
                   <pic:nvPicPr>
-                    <pic:cNvPr id="9005" name="Листинг 9005"/>
-                    <pic:cNvPicPr>
-                      <a:picLocks noChangeAspect="1"/>
-                    </pic:cNvPicPr>
+                    <pic:cNvPr id="1" name=""/>
+                    <pic:cNvPicPr/>
                   </pic:nvPicPr>
                   <pic:blipFill>
                     <a:blip r:embed="rId10"/>
@@ -3853,7 +3854,7 @@
                   <pic:spPr>
                     <a:xfrm>
                       <a:off x="0" y="0"/>
-                      <a:ext cx="2651760" cy="609600"/>
+                      <a:ext cx="2438611" cy="1684166"/>
                     </a:xfrm>
                     <a:prstGeom prst="rect">
                       <a:avLst/>
@@ -3891,7 +3892,6 @@
         <w:rPr>
           <w:sz w:val="28"/>
           <w:szCs w:val="28"/>
-          <w:lang w:val="en-US"/>
         </w:rPr>
       </w:pPr>
     </w:p>
@@ -3963,15 +3963,14 @@
       </w:pPr>
       <w:r>
         <w:rPr>
-          <w:noProof/>
           <w:sz w:val="28"/>
           <w:szCs w:val="28"/>
         </w:rPr>
         <w:drawing>
-          <wp:inline distT="0" distB="0" distL="0" distR="0" wp14:anchorId="4EABCDD4" wp14:editId="30042CD6">
-            <wp:extent cx="3115056" cy="1292352"/>
+          <wp:inline distT="0" distB="0" distL="0" distR="0" wp14:anchorId="0285D523" wp14:editId="634E55E3">
+            <wp:extent cx="2499577" cy="1280271"/>
             <wp:effectExtent l="0" t="0" r="0" b="0"/>
-            <wp:docPr id="9006" name="Листинг 9006"/>
+            <wp:docPr id="23" name="Рисунок 23"/>
             <wp:cNvGraphicFramePr>
               <a:graphicFrameLocks xmlns:a="http://schemas.openxmlformats.org/drawingml/2006/main" noChangeAspect="1"/>
             </wp:cNvGraphicFramePr>
@@ -3979,10 +3978,8 @@
               <a:graphicData uri="http://schemas.openxmlformats.org/drawingml/2006/picture">
                 <pic:pic xmlns:pic="http://schemas.openxmlformats.org/drawingml/2006/picture">
                   <pic:nvPicPr>
-                    <pic:cNvPr id="9006" name="Листинг 9006"/>
-                    <pic:cNvPicPr>
-                      <a:picLocks noChangeAspect="1"/>
-                    </pic:cNvPicPr>
+                    <pic:cNvPr id="1" name=""/>
+                    <pic:cNvPicPr/>
                   </pic:nvPicPr>
                   <pic:blipFill>
                     <a:blip r:embed="rId11"/>
@@ -3993,7 +3990,7 @@
                   <pic:spPr>
                     <a:xfrm>
                       <a:off x="0" y="0"/>
-                      <a:ext cx="3115056" cy="1292352"/>
+                      <a:ext cx="2499577" cy="1280271"/>
                     </a:xfrm>
                     <a:prstGeom prst="rect">
                       <a:avLst/>
@@ -4031,7 +4028,6 @@
         <w:rPr>
           <w:sz w:val="28"/>
           <w:szCs w:val="28"/>
-          <w:lang w:val="en-US"/>
         </w:rPr>
       </w:pPr>
     </w:p>
@@ -4054,7 +4050,6 @@
           <w:sz w:val="28"/>
           <w:szCs w:val="28"/>
         </w:rPr>
-        <w:lastRenderedPageBreak/>
         <w:t>н</w:t>
       </w:r>
       <w:r>
@@ -4104,15 +4099,14 @@
       </w:pPr>
       <w:r>
         <w:rPr>
-          <w:noProof/>
           <w:sz w:val="28"/>
           <w:szCs w:val="28"/>
         </w:rPr>
         <w:drawing>
-          <wp:inline distT="0" distB="0" distL="0" distR="0" wp14:anchorId="2B38DA05" wp14:editId="3F10C836">
-            <wp:extent cx="3115056" cy="1292352"/>
-            <wp:effectExtent l="0" t="0" r="0" b="0"/>
-            <wp:docPr id="9007" name="Листинг 9007"/>
+          <wp:inline distT="0" distB="0" distL="0" distR="0" wp14:anchorId="21602CAA" wp14:editId="019E2C16">
+            <wp:extent cx="2720576" cy="1356478"/>
+            <wp:effectExtent l="0" t="0" r="3810" b="0"/>
+            <wp:docPr id="24" name="Рисунок 24"/>
             <wp:cNvGraphicFramePr>
               <a:graphicFrameLocks xmlns:a="http://schemas.openxmlformats.org/drawingml/2006/main" noChangeAspect="1"/>
             </wp:cNvGraphicFramePr>
@@ -4120,10 +4114,8 @@
               <a:graphicData uri="http://schemas.openxmlformats.org/drawingml/2006/picture">
                 <pic:pic xmlns:pic="http://schemas.openxmlformats.org/drawingml/2006/picture">
                   <pic:nvPicPr>
-                    <pic:cNvPr id="9007" name="Листинг 9007"/>
-                    <pic:cNvPicPr>
-                      <a:picLocks noChangeAspect="1"/>
-                    </pic:cNvPicPr>
+                    <pic:cNvPr id="1" name=""/>
+                    <pic:cNvPicPr/>
                   </pic:nvPicPr>
                   <pic:blipFill>
                     <a:blip r:embed="rId12"/>
@@ -4134,7 +4126,7 @@
                   <pic:spPr>
                     <a:xfrm>
                       <a:off x="0" y="0"/>
-                      <a:ext cx="3115056" cy="1292352"/>
+                      <a:ext cx="2720576" cy="1356478"/>
                     </a:xfrm>
                     <a:prstGeom prst="rect">
                       <a:avLst/>
@@ -4172,7 +4164,6 @@
         <w:rPr>
           <w:sz w:val="28"/>
           <w:szCs w:val="28"/>
-          <w:lang w:val="en-US"/>
         </w:rPr>
       </w:pPr>
     </w:p>
@@ -4259,15 +4250,15 @@
       </w:pPr>
       <w:r>
         <w:rPr>
-          <w:noProof/>
-          <w:sz w:val="28"/>
-          <w:szCs w:val="28"/>
-        </w:rPr>
+          <w:sz w:val="28"/>
+          <w:szCs w:val="28"/>
+        </w:rPr>
+        <w:lastRenderedPageBreak/>
         <w:drawing>
-          <wp:inline distT="0" distB="0" distL="0" distR="0" wp14:anchorId="01DD83A8" wp14:editId="2A1074D0">
-            <wp:extent cx="2322576" cy="1121664"/>
+          <wp:inline distT="0" distB="0" distL="0" distR="0" wp14:anchorId="3908DA10" wp14:editId="23A27C25">
+            <wp:extent cx="2133785" cy="1104996"/>
             <wp:effectExtent l="0" t="0" r="0" b="0"/>
-            <wp:docPr id="9008" name="Листинг 9008"/>
+            <wp:docPr id="25" name="Рисунок 25"/>
             <wp:cNvGraphicFramePr>
               <a:graphicFrameLocks xmlns:a="http://schemas.openxmlformats.org/drawingml/2006/main" noChangeAspect="1"/>
             </wp:cNvGraphicFramePr>
@@ -4275,10 +4266,8 @@
               <a:graphicData uri="http://schemas.openxmlformats.org/drawingml/2006/picture">
                 <pic:pic xmlns:pic="http://schemas.openxmlformats.org/drawingml/2006/picture">
                   <pic:nvPicPr>
-                    <pic:cNvPr id="9008" name="Листинг 9008"/>
-                    <pic:cNvPicPr>
-                      <a:picLocks noChangeAspect="1"/>
-                    </pic:cNvPicPr>
+                    <pic:cNvPr id="1" name=""/>
+                    <pic:cNvPicPr/>
                   </pic:nvPicPr>
                   <pic:blipFill>
                     <a:blip r:embed="rId13"/>
@@ -4289,7 +4278,7 @@
                   <pic:spPr>
                     <a:xfrm>
                       <a:off x="0" y="0"/>
-                      <a:ext cx="2322576" cy="1121664"/>
+                      <a:ext cx="2133785" cy="1104996"/>
                     </a:xfrm>
                     <a:prstGeom prst="rect">
                       <a:avLst/>
@@ -4421,15 +4410,14 @@
       </w:pPr>
       <w:r>
         <w:rPr>
-          <w:noProof/>
           <w:sz w:val="28"/>
           <w:szCs w:val="28"/>
         </w:rPr>
         <w:drawing>
-          <wp:inline distT="0" distB="0" distL="0" distR="0" wp14:anchorId="545E0C8E" wp14:editId="37148EE2">
-            <wp:extent cx="3115056" cy="1292352"/>
-            <wp:effectExtent l="0" t="0" r="0" b="0"/>
-            <wp:docPr id="9009" name="Листинг 9009"/>
+          <wp:inline distT="0" distB="0" distL="0" distR="0" wp14:anchorId="78621A57" wp14:editId="66996DB8">
+            <wp:extent cx="2644369" cy="1265030"/>
+            <wp:effectExtent l="0" t="0" r="3810" b="0"/>
+            <wp:docPr id="26" name="Рисунок 26"/>
             <wp:cNvGraphicFramePr>
               <a:graphicFrameLocks xmlns:a="http://schemas.openxmlformats.org/drawingml/2006/main" noChangeAspect="1"/>
             </wp:cNvGraphicFramePr>
@@ -4437,10 +4425,8 @@
               <a:graphicData uri="http://schemas.openxmlformats.org/drawingml/2006/picture">
                 <pic:pic xmlns:pic="http://schemas.openxmlformats.org/drawingml/2006/picture">
                   <pic:nvPicPr>
-                    <pic:cNvPr id="9009" name="Листинг 9009"/>
-                    <pic:cNvPicPr>
-                      <a:picLocks noChangeAspect="1"/>
-                    </pic:cNvPicPr>
+                    <pic:cNvPr id="1" name=""/>
+                    <pic:cNvPicPr/>
                   </pic:nvPicPr>
                   <pic:blipFill>
                     <a:blip r:embed="rId14"/>
@@ -4451,7 +4437,7 @@
                   <pic:spPr>
                     <a:xfrm>
                       <a:off x="0" y="0"/>
-                      <a:ext cx="3115056" cy="1292352"/>
+                      <a:ext cx="2644369" cy="1265030"/>
                     </a:xfrm>
                     <a:prstGeom prst="rect">
                       <a:avLst/>
@@ -4495,6 +4481,126 @@
     <w:p>
       <w:pPr>
         <w:pStyle w:val="a7"/>
+        <w:spacing w:line="360" w:lineRule="auto"/>
+        <w:jc w:val="both"/>
+        <w:rPr>
+          <w:sz w:val="28"/>
+          <w:szCs w:val="28"/>
+        </w:rPr>
+      </w:pPr>
+    </w:p>
+    <w:p>
+      <w:pPr>
+        <w:spacing w:line="360" w:lineRule="auto"/>
+        <w:jc w:val="both"/>
+        <w:rPr>
+          <w:sz w:val="28"/>
+          <w:szCs w:val="28"/>
+        </w:rPr>
+      </w:pPr>
+    </w:p>
+    <w:p>
+      <w:pPr>
+        <w:spacing w:line="360" w:lineRule="auto"/>
+        <w:jc w:val="both"/>
+        <w:rPr>
+          <w:sz w:val="28"/>
+          <w:szCs w:val="28"/>
+        </w:rPr>
+      </w:pPr>
+    </w:p>
+    <w:p>
+      <w:pPr>
+        <w:spacing w:line="360" w:lineRule="auto"/>
+        <w:jc w:val="both"/>
+        <w:rPr>
+          <w:sz w:val="28"/>
+          <w:szCs w:val="28"/>
+        </w:rPr>
+      </w:pPr>
+    </w:p>
+    <w:p>
+      <w:pPr>
+        <w:spacing w:line="360" w:lineRule="auto"/>
+        <w:jc w:val="both"/>
+        <w:rPr>
+          <w:sz w:val="28"/>
+          <w:szCs w:val="28"/>
+        </w:rPr>
+      </w:pPr>
+    </w:p>
+    <w:p>
+      <w:pPr>
+        <w:spacing w:line="360" w:lineRule="auto"/>
+        <w:jc w:val="both"/>
+        <w:rPr>
+          <w:sz w:val="28"/>
+          <w:szCs w:val="28"/>
+        </w:rPr>
+      </w:pPr>
+    </w:p>
+    <w:p>
+      <w:pPr>
+        <w:spacing w:line="360" w:lineRule="auto"/>
+        <w:jc w:val="both"/>
+        <w:rPr>
+          <w:sz w:val="28"/>
+          <w:szCs w:val="28"/>
+        </w:rPr>
+      </w:pPr>
+    </w:p>
+    <w:p>
+      <w:pPr>
+        <w:spacing w:line="360" w:lineRule="auto"/>
+        <w:jc w:val="both"/>
+        <w:rPr>
+          <w:sz w:val="28"/>
+          <w:szCs w:val="28"/>
+        </w:rPr>
+      </w:pPr>
+    </w:p>
+    <w:p>
+      <w:pPr>
+        <w:spacing w:line="360" w:lineRule="auto"/>
+        <w:jc w:val="both"/>
+        <w:rPr>
+          <w:sz w:val="28"/>
+          <w:szCs w:val="28"/>
+        </w:rPr>
+      </w:pPr>
+    </w:p>
+    <w:p>
+      <w:pPr>
+        <w:spacing w:line="360" w:lineRule="auto"/>
+        <w:jc w:val="both"/>
+        <w:rPr>
+          <w:sz w:val="28"/>
+          <w:szCs w:val="28"/>
+        </w:rPr>
+      </w:pPr>
+    </w:p>
+    <w:p>
+      <w:pPr>
+        <w:spacing w:line="360" w:lineRule="auto"/>
+        <w:jc w:val="both"/>
+        <w:rPr>
+          <w:sz w:val="28"/>
+          <w:szCs w:val="28"/>
+        </w:rPr>
+      </w:pPr>
+    </w:p>
+    <w:p>
+      <w:pPr>
+        <w:spacing w:line="360" w:lineRule="auto"/>
+        <w:jc w:val="both"/>
+        <w:rPr>
+          <w:sz w:val="28"/>
+          <w:szCs w:val="28"/>
+        </w:rPr>
+      </w:pPr>
+    </w:p>
+    <w:p>
+      <w:pPr>
         <w:spacing w:line="360" w:lineRule="auto"/>
         <w:jc w:val="both"/>
         <w:rPr>
@@ -6979,13 +7085,14 @@
       </w:pPr>
       <w:r>
         <w:rPr>
-          <w:noProof/>
+          <w:sz w:val="28"/>
+          <w:szCs w:val="28"/>
         </w:rPr>
         <w:drawing>
-          <wp:inline distT="0" distB="0" distL="0" distR="0" wp14:anchorId="323A2407" wp14:editId="24DDA0B1">
-            <wp:extent cx="5940425" cy="1243330"/>
-            <wp:effectExtent l="0" t="0" r="3175" b="0"/>
-            <wp:docPr id="3" name="Рисунок 3"/>
+          <wp:inline distT="0" distB="0" distL="0" distR="0" wp14:anchorId="65AAEBC1" wp14:editId="692326D3">
+            <wp:extent cx="2408129" cy="1272650"/>
+            <wp:effectExtent l="0" t="0" r="0" b="3810"/>
+            <wp:docPr id="27" name="Рисунок 27"/>
             <wp:cNvGraphicFramePr>
               <a:graphicFrameLocks xmlns:a="http://schemas.openxmlformats.org/drawingml/2006/main" noChangeAspect="1"/>
             </wp:cNvGraphicFramePr>
@@ -6993,36 +7100,23 @@
               <a:graphicData uri="http://schemas.openxmlformats.org/drawingml/2006/picture">
                 <pic:pic xmlns:pic="http://schemas.openxmlformats.org/drawingml/2006/picture">
                   <pic:nvPicPr>
-                    <pic:cNvPr id="0" name="Picture 6"/>
-                    <pic:cNvPicPr>
-                      <a:picLocks noChangeAspect="1" noChangeArrowheads="1"/>
-                    </pic:cNvPicPr>
+                    <pic:cNvPr id="1" name=""/>
+                    <pic:cNvPicPr/>
                   </pic:nvPicPr>
                   <pic:blipFill>
-                    <a:blip r:embed="rId15">
-                      <a:extLst>
-                        <a:ext uri="{28A0092B-C50C-407E-A947-70E740481C1C}">
-                          <a14:useLocalDpi xmlns:a14="http://schemas.microsoft.com/office/drawing/2010/main" val="0"/>
-                        </a:ext>
-                      </a:extLst>
-                    </a:blip>
-                    <a:srcRect/>
+                    <a:blip r:embed="rId15"/>
                     <a:stretch>
                       <a:fillRect/>
                     </a:stretch>
                   </pic:blipFill>
-                  <pic:spPr bwMode="auto">
+                  <pic:spPr>
                     <a:xfrm>
                       <a:off x="0" y="0"/>
-                      <a:ext cx="5940425" cy="1243330"/>
+                      <a:ext cx="2408129" cy="1272650"/>
                     </a:xfrm>
                     <a:prstGeom prst="rect">
                       <a:avLst/>
                     </a:prstGeom>
-                    <a:noFill/>
-                    <a:ln>
-                      <a:noFill/>
-                    </a:ln>
                   </pic:spPr>
                 </pic:pic>
               </a:graphicData>
@@ -9447,15 +9541,15 @@
       </w:pPr>
       <w:r>
         <w:rPr>
-          <w:noProof/>
-          <w:sz w:val="28"/>
-          <w:szCs w:val="28"/>
-        </w:rPr>
+          <w:sz w:val="28"/>
+          <w:szCs w:val="28"/>
+        </w:rPr>
+        <w:lastRenderedPageBreak/>
         <w:drawing>
-          <wp:inline distT="0" distB="0" distL="0" distR="0" wp14:anchorId="1B28BCE1" wp14:editId="04E2C05C">
-            <wp:extent cx="5760720" cy="4194048"/>
+          <wp:inline distT="0" distB="0" distL="0" distR="0" wp14:anchorId="48413165" wp14:editId="0810CD35">
+            <wp:extent cx="5182049" cy="5220152"/>
             <wp:effectExtent l="0" t="0" r="0" b="0"/>
-            <wp:docPr id="9011" name="Листинг 9011"/>
+            <wp:docPr id="28" name="Рисунок 28"/>
             <wp:cNvGraphicFramePr>
               <a:graphicFrameLocks xmlns:a="http://schemas.openxmlformats.org/drawingml/2006/main" noChangeAspect="1"/>
             </wp:cNvGraphicFramePr>
@@ -9463,10 +9557,8 @@
               <a:graphicData uri="http://schemas.openxmlformats.org/drawingml/2006/picture">
                 <pic:pic xmlns:pic="http://schemas.openxmlformats.org/drawingml/2006/picture">
                   <pic:nvPicPr>
-                    <pic:cNvPr id="9011" name="Листинг 9011"/>
-                    <pic:cNvPicPr>
-                      <a:picLocks noChangeAspect="1"/>
-                    </pic:cNvPicPr>
+                    <pic:cNvPr id="1" name=""/>
+                    <pic:cNvPicPr/>
                   </pic:nvPicPr>
                   <pic:blipFill>
                     <a:blip r:embed="rId20"/>
@@ -9477,7 +9569,7 @@
                   <pic:spPr>
                     <a:xfrm>
                       <a:off x="0" y="0"/>
-                      <a:ext cx="5760720" cy="4194048"/>
+                      <a:ext cx="5182049" cy="5220152"/>
                     </a:xfrm>
                     <a:prstGeom prst="rect">
                       <a:avLst/>
@@ -9504,7 +9596,6 @@
           <w:sz w:val="28"/>
           <w:szCs w:val="28"/>
         </w:rPr>
-        <w:lastRenderedPageBreak/>
         <w:t>Листинг 11 – Функция построения гистограммы</w:t>
       </w:r>
     </w:p>
@@ -9562,6 +9653,76 @@
         </w:rPr>
         <w:t>.</w:t>
       </w:r>
+    </w:p>
+    <w:p>
+      <w:pPr>
+        <w:spacing w:line="360" w:lineRule="auto"/>
+        <w:jc w:val="both"/>
+        <w:rPr>
+          <w:sz w:val="28"/>
+          <w:szCs w:val="28"/>
+        </w:rPr>
+      </w:pPr>
+    </w:p>
+    <w:p>
+      <w:pPr>
+        <w:spacing w:line="360" w:lineRule="auto"/>
+        <w:jc w:val="both"/>
+        <w:rPr>
+          <w:sz w:val="28"/>
+          <w:szCs w:val="28"/>
+        </w:rPr>
+      </w:pPr>
+    </w:p>
+    <w:p>
+      <w:pPr>
+        <w:spacing w:line="360" w:lineRule="auto"/>
+        <w:jc w:val="both"/>
+        <w:rPr>
+          <w:sz w:val="28"/>
+          <w:szCs w:val="28"/>
+        </w:rPr>
+      </w:pPr>
+    </w:p>
+    <w:p>
+      <w:pPr>
+        <w:spacing w:line="360" w:lineRule="auto"/>
+        <w:jc w:val="both"/>
+        <w:rPr>
+          <w:sz w:val="28"/>
+          <w:szCs w:val="28"/>
+        </w:rPr>
+      </w:pPr>
+    </w:p>
+    <w:p>
+      <w:pPr>
+        <w:spacing w:line="360" w:lineRule="auto"/>
+        <w:jc w:val="both"/>
+        <w:rPr>
+          <w:sz w:val="28"/>
+          <w:szCs w:val="28"/>
+        </w:rPr>
+      </w:pPr>
+    </w:p>
+    <w:p>
+      <w:pPr>
+        <w:spacing w:line="360" w:lineRule="auto"/>
+        <w:jc w:val="both"/>
+        <w:rPr>
+          <w:sz w:val="28"/>
+          <w:szCs w:val="28"/>
+        </w:rPr>
+      </w:pPr>
+    </w:p>
+    <w:p>
+      <w:pPr>
+        <w:spacing w:line="360" w:lineRule="auto"/>
+        <w:jc w:val="both"/>
+        <w:rPr>
+          <w:sz w:val="28"/>
+          <w:szCs w:val="28"/>
+        </w:rPr>
+      </w:pPr>
     </w:p>
     <w:p>
       <w:pPr>
@@ -9596,6 +9757,7 @@
           <w:sz w:val="32"/>
           <w:szCs w:val="32"/>
         </w:rPr>
+        <w:lastRenderedPageBreak/>
         <w:t xml:space="preserve"> </w:t>
       </w:r>
       <w:r>
@@ -10758,50 +10920,6 @@
     </w:p>
     <w:p>
       <w:pPr>
-        <w:spacing w:line="360" w:lineRule="auto"/>
-        <w:ind w:firstLine="720"/>
-        <w:jc w:val="both"/>
-        <w:rPr>
-          <w:sz w:val="28"/>
-          <w:szCs w:val="28"/>
-        </w:rPr>
-      </w:pPr>
-    </w:p>
-    <w:p>
-      <w:pPr>
-        <w:spacing w:line="360" w:lineRule="auto"/>
-        <w:ind w:firstLine="720"/>
-        <w:jc w:val="both"/>
-        <w:rPr>
-          <w:sz w:val="28"/>
-          <w:szCs w:val="28"/>
-        </w:rPr>
-      </w:pPr>
-    </w:p>
-    <w:p>
-      <w:pPr>
-        <w:spacing w:line="360" w:lineRule="auto"/>
-        <w:ind w:firstLine="720"/>
-        <w:jc w:val="both"/>
-        <w:rPr>
-          <w:sz w:val="28"/>
-          <w:szCs w:val="28"/>
-        </w:rPr>
-      </w:pPr>
-    </w:p>
-    <w:p>
-      <w:pPr>
-        <w:spacing w:line="360" w:lineRule="auto"/>
-        <w:ind w:firstLine="720"/>
-        <w:jc w:val="both"/>
-        <w:rPr>
-          <w:sz w:val="28"/>
-          <w:szCs w:val="28"/>
-        </w:rPr>
-      </w:pPr>
-    </w:p>
-    <w:p>
-      <w:pPr>
         <w:pStyle w:val="a7"/>
         <w:numPr>
           <w:ilvl w:val="0"/>
@@ -10823,6 +10941,7 @@
           <w:sz w:val="32"/>
           <w:szCs w:val="32"/>
         </w:rPr>
+        <w:lastRenderedPageBreak/>
         <w:t>Описание параметров распределения</w:t>
       </w:r>
     </w:p>
@@ -11983,7 +12102,6 @@
           <w:szCs w:val="28"/>
           <w:lang w:val="en-US"/>
         </w:rPr>
-        <w:lastRenderedPageBreak/>
         <w:t>loc</w:t>
       </w:r>
       <w:r>
@@ -12117,6 +12235,7 @@
           <w:sz w:val="28"/>
           <w:szCs w:val="28"/>
         </w:rPr>
+        <w:lastRenderedPageBreak/>
         <w:t>п</w:t>
       </w:r>
       <w:r>
@@ -12485,16 +12604,14 @@
       </w:pPr>
       <w:r>
         <w:rPr>
-          <w:noProof/>
-          <w:sz w:val="28"/>
-          <w:szCs w:val="28"/>
-        </w:rPr>
-        <w:lastRenderedPageBreak/>
+          <w:sz w:val="28"/>
+          <w:szCs w:val="28"/>
+        </w:rPr>
         <w:drawing>
-          <wp:inline distT="0" distB="0" distL="0" distR="0" wp14:anchorId="3D52F5E0" wp14:editId="3814D755">
-            <wp:extent cx="5433085" cy="4930140"/>
-            <wp:effectExtent l="0" t="0" r="0" b="3810"/>
-            <wp:docPr id="1062371791" name="Рисунок 1"/>
+          <wp:inline distT="0" distB="0" distL="0" distR="0" wp14:anchorId="0156E798" wp14:editId="7DFF73C7">
+            <wp:extent cx="4275190" cy="2537680"/>
+            <wp:effectExtent l="0" t="0" r="0" b="0"/>
+            <wp:docPr id="29" name="Рисунок 29"/>
             <wp:cNvGraphicFramePr>
               <a:graphicFrameLocks xmlns:a="http://schemas.openxmlformats.org/drawingml/2006/main" noChangeAspect="1"/>
             </wp:cNvGraphicFramePr>
@@ -12502,7 +12619,7 @@
               <a:graphicData uri="http://schemas.openxmlformats.org/drawingml/2006/picture">
                 <pic:pic xmlns:pic="http://schemas.openxmlformats.org/drawingml/2006/picture">
                   <pic:nvPicPr>
-                    <pic:cNvPr id="1062371791" name=""/>
+                    <pic:cNvPr id="1" name=""/>
                     <pic:cNvPicPr/>
                   </pic:nvPicPr>
                   <pic:blipFill>
@@ -12514,7 +12631,7 @@
                   <pic:spPr>
                     <a:xfrm>
                       <a:off x="0" y="0"/>
-                      <a:ext cx="5433085" cy="4930140"/>
+                      <a:ext cx="4275190" cy="2537680"/>
                     </a:xfrm>
                     <a:prstGeom prst="rect">
                       <a:avLst/>
@@ -13116,6 +13233,7 @@
         <w:rPr>
           <w:sz w:val="28"/>
           <w:szCs w:val="28"/>
+          <w:lang w:val="en-US"/>
         </w:rPr>
       </w:pPr>
     </w:p>
@@ -13232,24 +13350,10 @@
           <w:szCs w:val="28"/>
           <w:lang w:val="en-US"/>
         </w:rPr>
-        <w:t>[2] Bain L. J., Engelhardt M. Introduction to Probability and Mathematical Statistics. — 2nd ed. — Belmont : Brooks/Cole, 1992. — 644 p.</w:t>
-      </w:r>
-    </w:p>
-    <w:p>
-      <w:pPr>
-        <w:spacing w:line="360" w:lineRule="auto"/>
-        <w:jc w:val="both"/>
-        <w:rPr>
-          <w:sz w:val="28"/>
-          <w:szCs w:val="28"/>
-          <w:lang w:val="en-US"/>
-        </w:rPr>
-      </w:pPr>
-    </w:p>
-    <w:p>
-      <w:pPr>
-        <w:spacing w:line="360" w:lineRule="auto"/>
-        <w:jc w:val="both"/>
+        <w:t xml:space="preserve">[2] Bain L. J., Engelhardt M. Introduction to Probability and Mathematical Statistics. — 2nd ed. — </w:t>
+      </w:r>
+      <w:proofErr w:type="gramStart"/>
+      <w:r>
         <w:rPr>
           <w:b/>
           <w:bCs/>
@@ -13257,7 +13361,9 @@
           <w:szCs w:val="28"/>
           <w:lang w:val="en-US"/>
         </w:rPr>
-      </w:pPr>
+        <w:t>Belmont :</w:t>
+      </w:r>
+      <w:proofErr w:type="gramEnd"/>
       <w:r>
         <w:rPr>
           <w:b/>
@@ -13266,10 +13372,24 @@
           <w:szCs w:val="28"/>
           <w:lang w:val="en-US"/>
         </w:rPr>
-        <w:t xml:space="preserve">[3] </w:t>
-      </w:r>
-      <w:proofErr w:type="spellStart"/>
-      <w:r>
+        <w:t xml:space="preserve"> Brooks/Cole, 1992. — 644 p.</w:t>
+      </w:r>
+    </w:p>
+    <w:p>
+      <w:pPr>
+        <w:spacing w:line="360" w:lineRule="auto"/>
+        <w:jc w:val="both"/>
+        <w:rPr>
+          <w:sz w:val="28"/>
+          <w:szCs w:val="28"/>
+          <w:lang w:val="en-US"/>
+        </w:rPr>
+      </w:pPr>
+    </w:p>
+    <w:p>
+      <w:pPr>
+        <w:spacing w:line="360" w:lineRule="auto"/>
+        <w:jc w:val="both"/>
         <w:rPr>
           <w:b/>
           <w:bCs/>
@@ -13277,9 +13397,7 @@
           <w:szCs w:val="28"/>
           <w:lang w:val="en-US"/>
         </w:rPr>
-        <w:t>Bahashwan</w:t>
-      </w:r>
-      <w:proofErr w:type="spellEnd"/>
+      </w:pPr>
       <w:r>
         <w:rPr>
           <w:b/>
@@ -13288,7 +13406,7 @@
           <w:szCs w:val="28"/>
           <w:lang w:val="en-US"/>
         </w:rPr>
-        <w:t xml:space="preserve"> A. O., </w:t>
+        <w:t xml:space="preserve">[3] </w:t>
       </w:r>
       <w:proofErr w:type="spellStart"/>
       <w:r>
@@ -13299,7 +13417,7 @@
           <w:szCs w:val="28"/>
           <w:lang w:val="en-US"/>
         </w:rPr>
-        <w:t>Kalantan</w:t>
+        <w:t>Bahashwan</w:t>
       </w:r>
       <w:proofErr w:type="spellEnd"/>
       <w:r>
@@ -13310,7 +13428,7 @@
           <w:szCs w:val="28"/>
           <w:lang w:val="en-US"/>
         </w:rPr>
-        <w:t xml:space="preserve"> Z. I., </w:t>
+        <w:t xml:space="preserve"> A. O., </w:t>
       </w:r>
       <w:proofErr w:type="spellStart"/>
       <w:r>
@@ -13321,7 +13439,7 @@
           <w:szCs w:val="28"/>
           <w:lang w:val="en-US"/>
         </w:rPr>
-        <w:t>Adham</w:t>
+        <w:t>Kalantan</w:t>
       </w:r>
       <w:proofErr w:type="spellEnd"/>
       <w:r>
@@ -13332,45 +13450,47 @@
           <w:szCs w:val="28"/>
           <w:lang w:val="en-US"/>
         </w:rPr>
-        <w:t xml:space="preserve"> S. A. Double Gamma Principal Components Analysis // Applied Mathematical Sciences. — 2018. — Vol. 12, № 11. — P. 523–533. </w:t>
-      </w:r>
-    </w:p>
-    <w:p>
-      <w:pPr>
-        <w:spacing w:line="360" w:lineRule="auto"/>
-        <w:jc w:val="both"/>
-        <w:rPr>
-          <w:sz w:val="28"/>
-          <w:szCs w:val="28"/>
-          <w:lang w:val="en-US"/>
-        </w:rPr>
-      </w:pPr>
-    </w:p>
-    <w:p>
-      <w:pPr>
-        <w:spacing w:line="360" w:lineRule="auto"/>
-        <w:jc w:val="both"/>
-      </w:pPr>
+        <w:t xml:space="preserve"> Z. I., </w:t>
+      </w:r>
+      <w:proofErr w:type="spellStart"/>
       <w:r>
         <w:rPr>
           <w:b/>
           <w:bCs/>
           <w:sz w:val="28"/>
           <w:szCs w:val="28"/>
-        </w:rPr>
-        <w:t xml:space="preserve">[4] </w:t>
-      </w:r>
-      <w:proofErr w:type="spellStart"/>
+          <w:lang w:val="en-US"/>
+        </w:rPr>
+        <w:t>Adham</w:t>
+      </w:r>
+      <w:proofErr w:type="spellEnd"/>
       <w:r>
         <w:rPr>
           <w:b/>
           <w:bCs/>
           <w:sz w:val="28"/>
           <w:szCs w:val="28"/>
-        </w:rPr>
-        <w:t>Положинцев</w:t>
-      </w:r>
-      <w:proofErr w:type="spellEnd"/>
+          <w:lang w:val="en-US"/>
+        </w:rPr>
+        <w:t xml:space="preserve"> S. A. Double Gamma Principal Components Analysis // Applied Mathematical Sciences. — 2018. — Vol. 12, № 11. — P. 523–533. </w:t>
+      </w:r>
+    </w:p>
+    <w:p>
+      <w:pPr>
+        <w:spacing w:line="360" w:lineRule="auto"/>
+        <w:jc w:val="both"/>
+        <w:rPr>
+          <w:sz w:val="28"/>
+          <w:szCs w:val="28"/>
+          <w:lang w:val="en-US"/>
+        </w:rPr>
+      </w:pPr>
+    </w:p>
+    <w:p>
+      <w:pPr>
+        <w:spacing w:line="360" w:lineRule="auto"/>
+        <w:jc w:val="both"/>
+      </w:pPr>
       <w:r>
         <w:rPr>
           <w:b/>
@@ -13378,7 +13498,47 @@
           <w:sz w:val="28"/>
           <w:szCs w:val="28"/>
         </w:rPr>
-        <w:t xml:space="preserve"> Б. И. Теория вероятностей и математическая статистика. Введение в математическую статистику: учебное пособие /  Б. И. </w:t>
+        <w:t xml:space="preserve">[4] </w:t>
+      </w:r>
+      <w:proofErr w:type="spellStart"/>
+      <w:r>
+        <w:rPr>
+          <w:b/>
+          <w:bCs/>
+          <w:sz w:val="28"/>
+          <w:szCs w:val="28"/>
+        </w:rPr>
+        <w:t>Положинцев</w:t>
+      </w:r>
+      <w:proofErr w:type="spellEnd"/>
+      <w:r>
+        <w:rPr>
+          <w:b/>
+          <w:bCs/>
+          <w:sz w:val="28"/>
+          <w:szCs w:val="28"/>
+        </w:rPr>
+        <w:t xml:space="preserve"> Б. И. Теория вероятностей и математическая статистика. Введение в математическую статистику: учебное пособие </w:t>
+      </w:r>
+      <w:proofErr w:type="gramStart"/>
+      <w:r>
+        <w:rPr>
+          <w:b/>
+          <w:bCs/>
+          <w:sz w:val="28"/>
+          <w:szCs w:val="28"/>
+        </w:rPr>
+        <w:t>/  Б.</w:t>
+      </w:r>
+      <w:proofErr w:type="gramEnd"/>
+      <w:r>
+        <w:rPr>
+          <w:b/>
+          <w:bCs/>
+          <w:sz w:val="28"/>
+          <w:szCs w:val="28"/>
+        </w:rPr>
+        <w:t xml:space="preserve"> И. </w:t>
       </w:r>
       <w:proofErr w:type="spellStart"/>
       <w:r>

</xml_diff>

<commit_message>
UPDATE: 6 пункт DATE: 2026-09-21 23:44:55
</commit_message>
<xml_diff>
--- a/Учеба 4 семестр/Теория вероятности/Курсовая работа/Отчет, Код/Курсовая_работа.docx
+++ b/Учеба 4 семестр/Теория вероятности/Курсовая работа/Отчет, Код/Курсовая_работа.docx
@@ -13157,89 +13157,78 @@
     </w:p>
     <w:p>
       <w:pPr>
-        <w:spacing w:line="360" w:lineRule="auto"/>
-        <w:rPr>
-          <w:sz w:val="28"/>
-          <w:szCs w:val="28"/>
-        </w:rPr>
-      </w:pPr>
-    </w:p>
-    <w:p>
-      <w:pPr>
-        <w:spacing w:line="360" w:lineRule="auto"/>
-        <w:rPr>
-          <w:sz w:val="28"/>
-          <w:szCs w:val="28"/>
-        </w:rPr>
-      </w:pPr>
-    </w:p>
-    <w:p>
-      <w:pPr>
-        <w:spacing w:line="360" w:lineRule="auto"/>
-        <w:rPr>
-          <w:sz w:val="28"/>
-          <w:szCs w:val="28"/>
-        </w:rPr>
-      </w:pPr>
-    </w:p>
-    <w:p>
-      <w:pPr>
-        <w:spacing w:line="360" w:lineRule="auto"/>
-        <w:rPr>
-          <w:sz w:val="28"/>
-          <w:szCs w:val="28"/>
-        </w:rPr>
-      </w:pPr>
-    </w:p>
-    <w:p>
-      <w:pPr>
-        <w:spacing w:line="360" w:lineRule="auto"/>
-        <w:rPr>
-          <w:sz w:val="28"/>
-          <w:szCs w:val="28"/>
-        </w:rPr>
-      </w:pPr>
-    </w:p>
-    <w:p>
-      <w:pPr>
-        <w:spacing w:line="360" w:lineRule="auto"/>
-        <w:rPr>
-          <w:sz w:val="28"/>
-          <w:szCs w:val="28"/>
-        </w:rPr>
-      </w:pPr>
-    </w:p>
-    <w:p>
-      <w:pPr>
-        <w:spacing w:line="360" w:lineRule="auto"/>
-        <w:rPr>
-          <w:sz w:val="28"/>
-          <w:szCs w:val="28"/>
-        </w:rPr>
-      </w:pPr>
-    </w:p>
-    <w:p>
-      <w:pPr>
-        <w:spacing w:line="360" w:lineRule="auto"/>
-        <w:rPr>
-          <w:sz w:val="28"/>
-          <w:szCs w:val="28"/>
-        </w:rPr>
-      </w:pPr>
-    </w:p>
-    <w:p>
-      <w:pPr>
-        <w:spacing w:line="360" w:lineRule="auto"/>
-        <w:rPr>
-          <w:sz w:val="28"/>
-          <w:szCs w:val="28"/>
-          <w:lang w:val="en-US"/>
-        </w:rPr>
-      </w:pPr>
-    </w:p>
-    <w:p>
-      <w:pPr>
-        <w:spacing w:line="360" w:lineRule="auto"/>
+        <w:spacing w:before="100" w:beforeAutospacing="1" w:after="100" w:afterAutospacing="1" w:line="360" w:lineRule="auto"/>
+        <w:ind w:firstLine="708"/>
+        <w:jc w:val="both"/>
+        <w:rPr>
+          <w:sz w:val="28"/>
+          <w:szCs w:val="28"/>
+        </w:rPr>
+      </w:pPr>
+    </w:p>
+    <w:p>
+      <w:pPr>
+        <w:spacing w:before="100" w:beforeAutospacing="1" w:after="100" w:afterAutospacing="1" w:line="360" w:lineRule="auto"/>
+        <w:ind w:firstLine="708"/>
+        <w:jc w:val="both"/>
+        <w:rPr>
+          <w:sz w:val="28"/>
+          <w:szCs w:val="28"/>
+        </w:rPr>
+      </w:pPr>
+    </w:p>
+    <w:p>
+      <w:pPr>
+        <w:spacing w:before="100" w:beforeAutospacing="1" w:after="100" w:afterAutospacing="1" w:line="360" w:lineRule="auto"/>
+        <w:ind w:firstLine="708"/>
+        <w:jc w:val="both"/>
+        <w:rPr>
+          <w:sz w:val="28"/>
+          <w:szCs w:val="28"/>
+        </w:rPr>
+      </w:pPr>
+    </w:p>
+    <w:p>
+      <w:pPr>
+        <w:spacing w:before="100" w:beforeAutospacing="1" w:after="100" w:afterAutospacing="1" w:line="360" w:lineRule="auto"/>
+        <w:ind w:firstLine="708"/>
+        <w:jc w:val="both"/>
+        <w:rPr>
+          <w:sz w:val="28"/>
+          <w:szCs w:val="28"/>
+        </w:rPr>
+      </w:pPr>
+    </w:p>
+    <w:p>
+      <w:pPr>
+        <w:spacing w:before="100" w:beforeAutospacing="1" w:after="100" w:afterAutospacing="1" w:line="360" w:lineRule="auto"/>
+        <w:ind w:firstLine="708"/>
+        <w:jc w:val="both"/>
+        <w:rPr>
+          <w:sz w:val="28"/>
+          <w:szCs w:val="28"/>
+        </w:rPr>
+      </w:pPr>
+    </w:p>
+    <w:p>
+      <w:pPr>
+        <w:spacing w:before="100" w:beforeAutospacing="1" w:after="100" w:afterAutospacing="1" w:line="360" w:lineRule="auto"/>
+        <w:ind w:firstLine="708"/>
+        <w:jc w:val="both"/>
+        <w:rPr>
+          <w:sz w:val="28"/>
+          <w:szCs w:val="28"/>
+        </w:rPr>
+      </w:pPr>
+    </w:p>
+    <w:p>
+      <w:pPr>
+        <w:pStyle w:val="a7"/>
+        <w:numPr>
+          <w:ilvl w:val="0"/>
+          <w:numId w:val="3"/>
+        </w:numPr>
+        <w:spacing w:before="100" w:beforeAutospacing="1" w:after="100" w:afterAutospacing="1" w:line="360" w:lineRule="auto"/>
         <w:jc w:val="center"/>
         <w:rPr>
           <w:b/>
@@ -13256,13 +13245,34 @@
           <w:szCs w:val="32"/>
         </w:rPr>
         <w:lastRenderedPageBreak/>
-        <w:t>Список использованной литературы</w:t>
-      </w:r>
-    </w:p>
-    <w:p>
-      <w:pPr>
-        <w:spacing w:line="360" w:lineRule="auto"/>
-        <w:jc w:val="center"/>
+        <w:t>Точечные оценки параметров</w:t>
+      </w:r>
+    </w:p>
+    <w:p>
+      <w:pPr>
+        <w:spacing w:before="100" w:beforeAutospacing="1" w:after="100" w:afterAutospacing="1" w:line="360" w:lineRule="auto"/>
+        <w:ind w:left="357" w:firstLine="709"/>
+        <w:rPr>
+          <w:sz w:val="28"/>
+          <w:szCs w:val="28"/>
+        </w:rPr>
+      </w:pPr>
+      <w:r>
+        <w:rPr>
+          <w:sz w:val="28"/>
+          <w:szCs w:val="28"/>
+        </w:rPr>
+        <w:t>Точечная оценка — это конкретное числовое значение, вычисляемое по выборке и используемое в качестве приближения неизвестного параметра теоретического распределения.</w:t>
+      </w:r>
+    </w:p>
+    <w:p>
+      <w:pPr>
+        <w:pStyle w:val="a7"/>
+        <w:numPr>
+          <w:ilvl w:val="1"/>
+          <w:numId w:val="3"/>
+        </w:numPr>
+        <w:spacing w:before="100" w:beforeAutospacing="1" w:after="100" w:afterAutospacing="1" w:line="360" w:lineRule="auto"/>
         <w:rPr>
           <w:b/>
           <w:bCs/>
@@ -13270,25 +13280,1488 @@
           <w:szCs w:val="28"/>
         </w:rPr>
       </w:pPr>
-    </w:p>
-    <w:p>
-      <w:pPr>
-        <w:spacing w:line="360" w:lineRule="auto"/>
-        <w:jc w:val="both"/>
-        <w:rPr>
-          <w:sz w:val="28"/>
-          <w:szCs w:val="28"/>
-          <w:lang w:val="en-US"/>
-        </w:rPr>
-      </w:pPr>
       <w:r>
         <w:rPr>
           <w:b/>
           <w:bCs/>
           <w:sz w:val="28"/>
           <w:szCs w:val="28"/>
+        </w:rPr>
+        <w:t>Метод моментов (ММ)</w:t>
+      </w:r>
+    </w:p>
+    <w:p>
+      <w:pPr>
+        <w:spacing w:before="100" w:beforeAutospacing="1" w:after="100" w:afterAutospacing="1" w:line="360" w:lineRule="auto"/>
+        <w:ind w:firstLine="709"/>
+        <w:jc w:val="both"/>
+        <w:rPr>
+          <w:sz w:val="28"/>
+          <w:szCs w:val="28"/>
+        </w:rPr>
+      </w:pPr>
+      <w:r>
+        <w:rPr>
+          <w:sz w:val="28"/>
+          <w:szCs w:val="28"/>
+        </w:rPr>
+        <w:t>Метод моментов состоит в приравнивании выборочных моментов теоретическим и решении полученной системы уравнений относительно неизвестных параметров.</w:t>
+      </w:r>
+      <w:r>
+        <w:rPr>
+          <w:sz w:val="28"/>
+          <w:szCs w:val="28"/>
+        </w:rPr>
+        <w:t xml:space="preserve"> </w:t>
+      </w:r>
+    </w:p>
+    <w:p>
+      <w:pPr>
+        <w:spacing w:before="100" w:beforeAutospacing="1" w:after="100" w:afterAutospacing="1" w:line="360" w:lineRule="auto"/>
+        <w:ind w:firstLine="709"/>
+        <w:jc w:val="both"/>
+        <w:rPr>
+          <w:sz w:val="28"/>
+          <w:szCs w:val="28"/>
+        </w:rPr>
+      </w:pPr>
+      <w:r>
+        <w:rPr>
+          <w:sz w:val="28"/>
+          <w:szCs w:val="28"/>
+        </w:rPr>
+        <w:t xml:space="preserve">Двойное гамма-распределение можно представить как </w:t>
+      </w:r>
+      <m:oMath>
+        <m:r>
+          <w:rPr>
+            <w:rFonts w:ascii="Cambria Math" w:hAnsi="Cambria Math"/>
+            <w:sz w:val="28"/>
+            <w:szCs w:val="28"/>
+          </w:rPr>
+          <m:t>X = loc + S·Y</m:t>
+        </m:r>
+      </m:oMath>
+      <w:r>
+        <w:rPr>
+          <w:sz w:val="28"/>
+          <w:szCs w:val="28"/>
+        </w:rPr>
+        <w:t xml:space="preserve">, где Y — случайная величина с гамма-распределением </w:t>
+      </w:r>
+      <m:oMath>
+        <m:r>
+          <w:rPr>
+            <w:rFonts w:ascii="Cambria Math" w:hAnsi="Cambria Math"/>
+            <w:sz w:val="28"/>
+            <w:szCs w:val="28"/>
+          </w:rPr>
+          <m:t>Γ(α, 1)</m:t>
+        </m:r>
+      </m:oMath>
+      <w:r>
+        <w:rPr>
+          <w:sz w:val="28"/>
+          <w:szCs w:val="28"/>
+        </w:rPr>
+        <w:t>, а S — независимый от Y случайный знак (+1 или −1 с вероятностью 0,5 каждый).</w:t>
+      </w:r>
+      <w:r>
+        <w:rPr>
+          <w:sz w:val="28"/>
+          <w:szCs w:val="28"/>
+        </w:rPr>
+        <w:t xml:space="preserve"> Тогда: </w:t>
+      </w:r>
+      <m:oMath>
+        <m:r>
+          <w:rPr>
+            <w:rFonts w:ascii="Cambria Math" w:hAnsi="Cambria Math"/>
+            <w:sz w:val="28"/>
+            <w:szCs w:val="28"/>
+          </w:rPr>
+          <m:t>E[X] = loc, D[X] = α(α+1)</m:t>
+        </m:r>
+      </m:oMath>
+      <w:r>
+        <w:rPr>
+          <w:sz w:val="28"/>
+          <w:szCs w:val="28"/>
+        </w:rPr>
+        <w:t xml:space="preserve">. </w:t>
+      </w:r>
+      <w:r>
+        <w:rPr>
+          <w:sz w:val="28"/>
+          <w:szCs w:val="28"/>
+        </w:rPr>
+        <w:t xml:space="preserve">Приравнивая эти выражения к выборочному среднему </w:t>
+      </w:r>
+      <m:oMath>
+        <m:r>
+          <w:rPr>
+            <w:rFonts w:ascii="Cambria Math" w:hAnsi="Cambria Math"/>
+            <w:sz w:val="28"/>
+            <w:szCs w:val="28"/>
+          </w:rPr>
+          <m:t>x̄</m:t>
+        </m:r>
+      </m:oMath>
+      <w:r>
+        <w:rPr>
+          <w:sz w:val="28"/>
+          <w:szCs w:val="28"/>
+        </w:rPr>
+        <w:t xml:space="preserve"> и выборочной дисперсии </w:t>
+      </w:r>
+      <m:oMath>
+        <m:r>
+          <w:rPr>
+            <w:rFonts w:ascii="Cambria Math" w:hAnsi="Cambria Math"/>
+            <w:sz w:val="28"/>
+            <w:szCs w:val="28"/>
+          </w:rPr>
+          <m:t>S²</m:t>
+        </m:r>
+      </m:oMath>
+      <w:r>
+        <w:rPr>
+          <w:sz w:val="28"/>
+          <w:szCs w:val="28"/>
+        </w:rPr>
+        <w:t>, получаем систему из двух уравнений, откуда:</w:t>
+      </w:r>
+      <w:r>
+        <w:rPr>
+          <w:sz w:val="28"/>
+          <w:szCs w:val="28"/>
+        </w:rPr>
+        <w:t xml:space="preserve"> </w:t>
+      </w:r>
+    </w:p>
+    <w:p>
+      <w:pPr>
+        <w:spacing w:before="100" w:beforeAutospacing="1" w:after="100" w:afterAutospacing="1" w:line="360" w:lineRule="auto"/>
+        <w:ind w:firstLine="709"/>
+        <w:jc w:val="both"/>
+        <w:rPr>
+          <w:sz w:val="28"/>
+          <w:szCs w:val="28"/>
+        </w:rPr>
+      </w:pPr>
+      <m:oMathPara>
+        <m:oMath>
+          <m:r>
+            <w:rPr>
+              <w:rFonts w:ascii="Cambria Math" w:hAnsi="Cambria Math"/>
+              <w:sz w:val="28"/>
+              <w:szCs w:val="28"/>
+            </w:rPr>
+            <m:t>loĉ = x̄</m:t>
+          </m:r>
+          <m:r>
+            <w:rPr>
+              <w:rFonts w:ascii="Cambria Math" w:hAnsi="Cambria Math"/>
+              <w:sz w:val="28"/>
+              <w:szCs w:val="28"/>
+            </w:rPr>
+            <w:br/>
+          </m:r>
+        </m:oMath>
+        <m:oMath>
+          <m:r>
+            <w:rPr>
+              <w:rFonts w:ascii="Cambria Math" w:hAnsi="Cambria Math"/>
+              <w:sz w:val="28"/>
+              <w:szCs w:val="28"/>
+            </w:rPr>
+            <m:t>α̂ = (-1 + √(1+4S²)) / 2</m:t>
+          </m:r>
+        </m:oMath>
+      </m:oMathPara>
+    </w:p>
+    <w:p>
+      <w:pPr>
+        <w:spacing w:before="100" w:beforeAutospacing="1" w:after="100" w:afterAutospacing="1" w:line="360" w:lineRule="auto"/>
+        <w:ind w:firstLine="709"/>
+        <w:jc w:val="both"/>
+        <w:rPr>
+          <w:sz w:val="28"/>
+          <w:szCs w:val="28"/>
+        </w:rPr>
+      </w:pPr>
+      <w:r>
+        <w:rPr>
+          <w:sz w:val="28"/>
+          <w:szCs w:val="28"/>
+        </w:rPr>
+        <w:t xml:space="preserve">Подставляя </w:t>
+      </w:r>
+      <m:oMath>
+        <m:r>
+          <w:rPr>
+            <w:rFonts w:ascii="Cambria Math" w:hAnsi="Cambria Math"/>
+            <w:sz w:val="28"/>
+            <w:szCs w:val="28"/>
+          </w:rPr>
+          <m:t>x̄ = 0,839291</m:t>
+        </m:r>
+      </m:oMath>
+      <w:r>
+        <w:rPr>
+          <w:sz w:val="28"/>
+          <w:szCs w:val="28"/>
+        </w:rPr>
+        <w:t xml:space="preserve"> и </w:t>
+      </w:r>
+      <m:oMath>
+        <m:r>
+          <w:rPr>
+            <w:rFonts w:ascii="Cambria Math" w:hAnsi="Cambria Math"/>
+            <w:sz w:val="28"/>
+            <w:szCs w:val="28"/>
+          </w:rPr>
+          <m:t>S² = 56,997601</m:t>
+        </m:r>
+      </m:oMath>
+      <w:r>
+        <w:rPr>
+          <w:sz w:val="28"/>
+          <w:szCs w:val="28"/>
+        </w:rPr>
+        <w:t>, получаем</w:t>
+      </w:r>
+      <w:r>
+        <w:rPr>
+          <w:sz w:val="28"/>
+          <w:szCs w:val="28"/>
+        </w:rPr>
+        <w:t xml:space="preserve"> следующие значения, </w:t>
+      </w:r>
+      <w:r>
+        <w:rPr>
+          <w:sz w:val="28"/>
+          <w:szCs w:val="28"/>
+        </w:rPr>
+        <w:t>[</w:t>
+      </w:r>
+      <w:r>
+        <w:rPr>
+          <w:sz w:val="28"/>
+          <w:szCs w:val="28"/>
+        </w:rPr>
+        <w:t>Листинг 1</w:t>
+      </w:r>
+      <w:r>
+        <w:rPr>
+          <w:sz w:val="28"/>
+          <w:szCs w:val="28"/>
+        </w:rPr>
+        <w:t>2</w:t>
+      </w:r>
+      <w:r>
+        <w:rPr>
+          <w:sz w:val="28"/>
+          <w:szCs w:val="28"/>
+        </w:rPr>
+        <w:t>]</w:t>
+      </w:r>
+      <w:r>
+        <w:rPr>
+          <w:sz w:val="28"/>
+          <w:szCs w:val="28"/>
+        </w:rPr>
+        <w:t>:</w:t>
+      </w:r>
+    </w:p>
+    <w:p>
+      <w:pPr>
+        <w:spacing w:before="100" w:beforeAutospacing="1" w:after="100" w:afterAutospacing="1" w:line="360" w:lineRule="auto"/>
+        <w:ind w:firstLine="709"/>
+        <w:jc w:val="both"/>
+        <w:rPr>
+          <w:rFonts w:ascii="Cambria Math" w:hAnsi="Cambria Math"/>
+          <w:sz w:val="28"/>
+          <w:szCs w:val="28"/>
+          <w:oMath/>
+        </w:rPr>
+      </w:pPr>
+      <m:oMathPara>
+        <m:oMath>
+          <m:r>
+            <w:rPr>
+              <w:rFonts w:ascii="Cambria Math" w:hAnsi="Cambria Math"/>
+              <w:sz w:val="28"/>
+              <w:szCs w:val="28"/>
+            </w:rPr>
+            <m:t>alpha_mm = 7.0662144693543185</m:t>
+          </m:r>
+        </m:oMath>
+      </m:oMathPara>
+    </w:p>
+    <w:p>
+      <w:pPr>
+        <w:spacing w:before="100" w:beforeAutospacing="1" w:after="100" w:afterAutospacing="1" w:line="360" w:lineRule="auto"/>
+        <w:ind w:firstLine="709"/>
+        <w:jc w:val="both"/>
+        <w:rPr>
+          <w:sz w:val="28"/>
+          <w:szCs w:val="28"/>
+        </w:rPr>
+      </w:pPr>
+      <m:oMathPara>
+        <m:oMath>
+          <m:r>
+            <w:rPr>
+              <w:rFonts w:ascii="Cambria Math" w:hAnsi="Cambria Math"/>
+              <w:sz w:val="28"/>
+              <w:szCs w:val="28"/>
+            </w:rPr>
+            <m:t>loc_mm = 0.8392914066666667</m:t>
+          </m:r>
+        </m:oMath>
+      </m:oMathPara>
+    </w:p>
+    <w:p>
+      <w:pPr>
+        <w:spacing w:before="100" w:beforeAutospacing="1" w:after="100" w:afterAutospacing="1" w:line="360" w:lineRule="auto"/>
+        <w:ind w:firstLine="709"/>
+        <w:jc w:val="center"/>
+        <w:rPr>
+          <w:sz w:val="28"/>
+          <w:szCs w:val="28"/>
+        </w:rPr>
+      </w:pPr>
+      <w:r>
+        <w:rPr>
+          <w:sz w:val="28"/>
+          <w:szCs w:val="28"/>
+        </w:rPr>
+        <w:lastRenderedPageBreak/>
+        <w:drawing>
+          <wp:inline distT="0" distB="0" distL="0" distR="0" wp14:anchorId="6B0F661C" wp14:editId="48CD3CED">
+            <wp:extent cx="3368332" cy="1585097"/>
+            <wp:effectExtent l="0" t="0" r="3810" b="0"/>
+            <wp:docPr id="30" name="Рисунок 30"/>
+            <wp:cNvGraphicFramePr>
+              <a:graphicFrameLocks xmlns:a="http://schemas.openxmlformats.org/drawingml/2006/main" noChangeAspect="1"/>
+            </wp:cNvGraphicFramePr>
+            <a:graphic xmlns:a="http://schemas.openxmlformats.org/drawingml/2006/main">
+              <a:graphicData uri="http://schemas.openxmlformats.org/drawingml/2006/picture">
+                <pic:pic xmlns:pic="http://schemas.openxmlformats.org/drawingml/2006/picture">
+                  <pic:nvPicPr>
+                    <pic:cNvPr id="1" name=""/>
+                    <pic:cNvPicPr/>
+                  </pic:nvPicPr>
+                  <pic:blipFill>
+                    <a:blip r:embed="rId28"/>
+                    <a:stretch>
+                      <a:fillRect/>
+                    </a:stretch>
+                  </pic:blipFill>
+                  <pic:spPr>
+                    <a:xfrm>
+                      <a:off x="0" y="0"/>
+                      <a:ext cx="3368332" cy="1585097"/>
+                    </a:xfrm>
+                    <a:prstGeom prst="rect">
+                      <a:avLst/>
+                    </a:prstGeom>
+                  </pic:spPr>
+                </pic:pic>
+              </a:graphicData>
+            </a:graphic>
+          </wp:inline>
+        </w:drawing>
+      </w:r>
+    </w:p>
+    <w:p>
+      <w:pPr>
+        <w:spacing w:before="100" w:beforeAutospacing="1" w:after="100" w:afterAutospacing="1" w:line="360" w:lineRule="auto"/>
+        <w:ind w:firstLine="709"/>
+        <w:jc w:val="center"/>
+        <w:rPr>
+          <w:sz w:val="28"/>
+          <w:szCs w:val="28"/>
+        </w:rPr>
+      </w:pPr>
+      <w:r>
+        <w:rPr>
+          <w:sz w:val="28"/>
+          <w:szCs w:val="28"/>
+        </w:rPr>
+        <w:t>Листинг 12. Код для оценки параметров с помощью ММ</w:t>
+      </w:r>
+    </w:p>
+    <w:p>
+      <w:pPr>
+        <w:pStyle w:val="a7"/>
+        <w:numPr>
+          <w:ilvl w:val="1"/>
+          <w:numId w:val="3"/>
+        </w:numPr>
+        <w:spacing w:before="100" w:beforeAutospacing="1" w:after="100" w:afterAutospacing="1" w:line="360" w:lineRule="auto"/>
+        <w:jc w:val="both"/>
+        <w:rPr>
+          <w:rFonts w:ascii="Cambria Math" w:hAnsi="Cambria Math"/>
+          <w:sz w:val="24"/>
+          <w:szCs w:val="24"/>
+          <w:oMath/>
+        </w:rPr>
+      </w:pPr>
+      <w:r>
+        <w:rPr>
+          <w:sz w:val="32"/>
+          <w:szCs w:val="32"/>
+        </w:rPr>
+        <w:t xml:space="preserve"> </w:t>
+      </w:r>
+      <w:r>
+        <w:rPr>
+          <w:b/>
+          <w:bCs/>
+          <w:sz w:val="28"/>
+          <w:szCs w:val="28"/>
+        </w:rPr>
+        <w:t>Метод максимального правдоподобия</w:t>
+      </w:r>
+    </w:p>
+    <w:p>
+      <w:pPr>
+        <w:pStyle w:val="a7"/>
+        <w:spacing w:before="100" w:beforeAutospacing="1" w:after="100" w:afterAutospacing="1" w:line="360" w:lineRule="auto"/>
+        <w:ind w:left="782" w:firstLine="709"/>
+        <w:jc w:val="both"/>
+        <w:rPr>
+          <w:sz w:val="28"/>
+          <w:szCs w:val="28"/>
+        </w:rPr>
+      </w:pPr>
+      <w:r>
+        <w:rPr>
+          <w:sz w:val="28"/>
+          <w:szCs w:val="28"/>
+        </w:rPr>
+        <w:t>Метод максимального правдоподобия состоит в нахождении таких значений параметров, при которых наблюдаемая выборка наиболее вероятна. Логарифмическая функция правдоподобия:</w:t>
+      </w:r>
+      <w:r>
+        <w:rPr>
+          <w:sz w:val="28"/>
+          <w:szCs w:val="28"/>
+        </w:rPr>
+        <w:t xml:space="preserve"> </w:t>
+      </w:r>
+      <m:oMath>
+        <m:r>
+          <w:rPr>
+            <w:rFonts w:ascii="Cambria Math" w:hAnsi="Cambria Math"/>
+            <w:sz w:val="28"/>
+            <w:szCs w:val="28"/>
+          </w:rPr>
+          <m:t>ln L(α, loc) = -n·ln2 - n·lnΓ(α) + (α-1)·Σln|xᵢ-loc| - Σ|xᵢ-loc|</m:t>
+        </m:r>
+      </m:oMath>
+    </w:p>
+    <w:p>
+      <w:pPr>
+        <w:pStyle w:val="a7"/>
+        <w:spacing w:before="100" w:beforeAutospacing="1" w:after="100" w:afterAutospacing="1" w:line="360" w:lineRule="auto"/>
+        <w:ind w:left="782" w:firstLine="709"/>
+        <w:jc w:val="both"/>
+        <w:rPr>
+          <w:sz w:val="28"/>
+          <w:szCs w:val="28"/>
+        </w:rPr>
+      </w:pPr>
+      <w:r>
+        <w:rPr>
+          <w:sz w:val="28"/>
+          <w:szCs w:val="28"/>
+        </w:rPr>
+        <w:t xml:space="preserve">Аналитически решить систему </w:t>
+      </w:r>
+      <m:oMath>
+        <m:r>
+          <w:rPr>
+            <w:rFonts w:ascii="Cambria Math" w:hAnsi="Cambria Math"/>
+            <w:sz w:val="28"/>
+            <w:szCs w:val="28"/>
+          </w:rPr>
+          <m:t>∂lnL/∂α = 0, ∂lnL/∂loc = 0</m:t>
+        </m:r>
+      </m:oMath>
+      <w:r>
+        <w:rPr>
+          <w:sz w:val="28"/>
+          <w:szCs w:val="28"/>
+        </w:rPr>
+        <w:t xml:space="preserve"> не удаётся (в уравнение для α входит дигамма-функция, а знак </w:t>
+      </w:r>
+      <m:oMath>
+        <m:r>
+          <w:rPr>
+            <w:rFonts w:ascii="Cambria Math" w:hAnsi="Cambria Math"/>
+            <w:sz w:val="28"/>
+            <w:szCs w:val="28"/>
+          </w:rPr>
+          <m:t>|xᵢ-loc|</m:t>
+        </m:r>
+      </m:oMath>
+      <w:r>
+        <w:rPr>
+          <w:sz w:val="28"/>
+          <w:szCs w:val="28"/>
+        </w:rPr>
+        <w:t xml:space="preserve"> зависит от </w:t>
+      </w:r>
+      <m:oMath>
+        <m:r>
+          <w:rPr>
+            <w:rFonts w:ascii="Cambria Math" w:hAnsi="Cambria Math"/>
+            <w:sz w:val="28"/>
+            <w:szCs w:val="28"/>
+          </w:rPr>
+          <m:t>loc</m:t>
+        </m:r>
+      </m:oMath>
+      <w:r>
+        <w:rPr>
+          <w:sz w:val="28"/>
+          <w:szCs w:val="28"/>
+        </w:rPr>
+        <w:t>)</w:t>
+      </w:r>
+      <w:r>
+        <w:rPr>
+          <w:sz w:val="28"/>
+          <w:szCs w:val="28"/>
+        </w:rPr>
+        <w:t xml:space="preserve">. </w:t>
+      </w:r>
+      <w:r>
+        <w:rPr>
+          <w:sz w:val="28"/>
+          <w:szCs w:val="28"/>
+        </w:rPr>
+        <w:t>Для выборки нашего распределения функция логарифмического правдоподобия максимизировалась численно</w:t>
+      </w:r>
+      <w:r>
+        <w:rPr>
+          <w:sz w:val="28"/>
+          <w:szCs w:val="28"/>
+        </w:rPr>
+        <w:t xml:space="preserve"> </w:t>
+      </w:r>
+      <w:r>
+        <w:rPr>
+          <w:sz w:val="28"/>
+          <w:szCs w:val="28"/>
+        </w:rPr>
+        <w:t>[</w:t>
+      </w:r>
+      <w:r>
+        <w:rPr>
+          <w:sz w:val="28"/>
+          <w:szCs w:val="28"/>
+        </w:rPr>
+        <w:t>Листинг 13</w:t>
+      </w:r>
+      <w:r>
+        <w:rPr>
+          <w:sz w:val="28"/>
+          <w:szCs w:val="28"/>
+        </w:rPr>
+        <w:t xml:space="preserve">-15]. </w:t>
+      </w:r>
+      <w:r>
+        <w:rPr>
+          <w:sz w:val="28"/>
+          <w:szCs w:val="28"/>
+        </w:rPr>
+        <w:t xml:space="preserve">Нужно было найти такие </w:t>
+      </w:r>
+      <m:oMath>
+        <m:r>
+          <w:rPr>
+            <w:rFonts w:ascii="Cambria Math" w:hAnsi="Cambria Math"/>
+            <w:sz w:val="28"/>
+            <w:szCs w:val="28"/>
+          </w:rPr>
+          <m:t>α</m:t>
+        </m:r>
+      </m:oMath>
+      <w:r>
+        <w:rPr>
+          <w:sz w:val="28"/>
+          <w:szCs w:val="28"/>
+        </w:rPr>
+        <w:t xml:space="preserve"> и </w:t>
+      </w:r>
+      <m:oMath>
+        <m:r>
+          <w:rPr>
+            <w:rFonts w:ascii="Cambria Math" w:hAnsi="Cambria Math"/>
+            <w:sz w:val="28"/>
+            <w:szCs w:val="28"/>
+          </w:rPr>
+          <m:t>loc</m:t>
+        </m:r>
+      </m:oMath>
+      <w:r>
+        <w:rPr>
+          <w:sz w:val="28"/>
+          <w:szCs w:val="28"/>
+        </w:rPr>
+        <w:t xml:space="preserve">, чтобы </w:t>
+      </w:r>
+      <m:oMath>
+        <m:r>
+          <w:rPr>
+            <w:rFonts w:ascii="Cambria Math" w:hAnsi="Cambria Math"/>
+            <w:sz w:val="28"/>
+            <w:szCs w:val="28"/>
+          </w:rPr>
+          <m:t>lnL</m:t>
+        </m:r>
+      </m:oMath>
+      <w:r>
+        <w:rPr>
+          <w:sz w:val="28"/>
+          <w:szCs w:val="28"/>
+        </w:rPr>
+        <w:t xml:space="preserve"> был максимален.</w:t>
+      </w:r>
+      <w:r>
+        <w:rPr>
+          <w:sz w:val="28"/>
+          <w:szCs w:val="28"/>
+        </w:rPr>
+        <w:t xml:space="preserve"> </w:t>
+      </w:r>
+    </w:p>
+    <w:p>
+      <w:pPr>
+        <w:pStyle w:val="a7"/>
+        <w:spacing w:before="100" w:beforeAutospacing="1" w:after="100" w:afterAutospacing="1" w:line="360" w:lineRule="auto"/>
+        <w:ind w:left="782" w:firstLine="709"/>
+        <w:jc w:val="both"/>
+        <w:rPr>
+          <w:sz w:val="28"/>
+          <w:szCs w:val="28"/>
+        </w:rPr>
+      </w:pPr>
+      <w:r>
+        <w:rPr>
+          <w:sz w:val="28"/>
+          <w:szCs w:val="28"/>
+        </w:rPr>
+        <w:t xml:space="preserve">На первом этапе строилась равномерная сетка значений </w:t>
+      </w:r>
+      <m:oMath>
+        <m:r>
+          <w:rPr>
+            <w:rFonts w:ascii="Cambria Math" w:hAnsi="Cambria Math"/>
+            <w:sz w:val="28"/>
+            <w:szCs w:val="28"/>
+          </w:rPr>
+          <m:t>α</m:t>
+        </m:r>
+      </m:oMath>
+      <w:r>
+        <w:rPr>
+          <w:sz w:val="28"/>
+          <w:szCs w:val="28"/>
+        </w:rPr>
+        <w:t xml:space="preserve"> и </w:t>
+      </w:r>
+      <m:oMath>
+        <m:r>
+          <w:rPr>
+            <w:rFonts w:ascii="Cambria Math" w:hAnsi="Cambria Math"/>
+            <w:sz w:val="28"/>
+            <w:szCs w:val="28"/>
+          </w:rPr>
+          <m:t>loc</m:t>
+        </m:r>
+      </m:oMath>
+      <w:r>
+        <w:rPr>
+          <w:sz w:val="28"/>
+          <w:szCs w:val="28"/>
+        </w:rPr>
+        <w:t xml:space="preserve"> в широком диапазоне (в качестве центра диапазона использовались оценки, полученные методом моментов), и для каждой пары </w:t>
+      </w:r>
+      <m:oMath>
+        <m:r>
+          <w:rPr>
+            <w:rFonts w:ascii="Cambria Math" w:hAnsi="Cambria Math"/>
+            <w:sz w:val="28"/>
+            <w:szCs w:val="28"/>
+          </w:rPr>
+          <m:t>(α, loc)</m:t>
+        </m:r>
+      </m:oMath>
+      <w:r>
+        <w:rPr>
+          <w:sz w:val="28"/>
+          <w:szCs w:val="28"/>
+        </w:rPr>
+        <w:t xml:space="preserve"> вычислялось значение </w:t>
+      </w:r>
+      <m:oMath>
+        <m:r>
+          <w:rPr>
+            <w:rFonts w:ascii="Cambria Math" w:hAnsi="Cambria Math"/>
+            <w:sz w:val="28"/>
+            <w:szCs w:val="28"/>
+          </w:rPr>
+          <m:t>lnL</m:t>
+        </m:r>
+      </m:oMath>
+      <w:r>
+        <w:rPr>
+          <w:sz w:val="28"/>
+          <w:szCs w:val="28"/>
+        </w:rPr>
+        <w:t xml:space="preserve">. Пара, дающая наибольшее значение </w:t>
+      </w:r>
+      <m:oMath>
+        <m:r>
+          <w:rPr>
+            <w:rFonts w:ascii="Cambria Math" w:hAnsi="Cambria Math"/>
+            <w:sz w:val="28"/>
+            <w:szCs w:val="28"/>
+          </w:rPr>
+          <m:t>lnL</m:t>
+        </m:r>
+      </m:oMath>
+      <w:r>
+        <w:rPr>
+          <w:sz w:val="28"/>
+          <w:szCs w:val="28"/>
+        </w:rPr>
+        <w:t>, принималась за грубое приближение максимума.</w:t>
+      </w:r>
+    </w:p>
+    <w:p>
+      <w:pPr>
+        <w:pStyle w:val="a7"/>
+        <w:spacing w:line="360" w:lineRule="auto"/>
+        <w:ind w:left="782" w:firstLine="709"/>
+        <w:jc w:val="both"/>
+        <w:rPr>
+          <w:sz w:val="28"/>
+          <w:szCs w:val="28"/>
+        </w:rPr>
+      </w:pPr>
+      <w:r>
+        <w:rPr>
+          <w:sz w:val="28"/>
+          <w:szCs w:val="28"/>
+        </w:rPr>
+        <w:t xml:space="preserve">На втором этапе строилась новая, более мелкая сетка — уже в узком диапазоне вокруг найденной на первом этапе точки, — и поиск максимума </w:t>
+      </w:r>
+      <m:oMath>
+        <m:r>
+          <w:rPr>
+            <w:rFonts w:ascii="Cambria Math" w:hAnsi="Cambria Math"/>
+            <w:sz w:val="28"/>
+            <w:szCs w:val="28"/>
+          </w:rPr>
+          <m:t>lnL</m:t>
+        </m:r>
+      </m:oMath>
+      <w:r>
+        <w:rPr>
+          <w:sz w:val="28"/>
+          <w:szCs w:val="28"/>
+        </w:rPr>
+        <w:t xml:space="preserve"> повторялся на ней. Это позволило уточнить оценку без резкого увеличения числа вычислений.</w:t>
+      </w:r>
+      <w:r>
+        <w:rPr>
+          <w:sz w:val="28"/>
+          <w:szCs w:val="28"/>
+        </w:rPr>
+        <w:t xml:space="preserve"> </w:t>
+      </w:r>
+    </w:p>
+    <w:p>
+      <w:pPr>
+        <w:pStyle w:val="a7"/>
+        <w:spacing w:line="360" w:lineRule="auto"/>
+        <w:ind w:left="782" w:firstLine="709"/>
+        <w:jc w:val="both"/>
+        <w:rPr>
+          <w:sz w:val="28"/>
+          <w:szCs w:val="28"/>
+        </w:rPr>
+      </w:pPr>
+    </w:p>
+    <w:p>
+      <w:pPr>
+        <w:pStyle w:val="a7"/>
+        <w:spacing w:line="360" w:lineRule="auto"/>
+        <w:ind w:left="782" w:firstLine="709"/>
+        <w:jc w:val="center"/>
+        <w:rPr>
+          <w:sz w:val="28"/>
+          <w:szCs w:val="28"/>
+        </w:rPr>
+      </w:pPr>
+      <w:r>
+        <w:rPr>
+          <w:sz w:val="28"/>
+          <w:szCs w:val="28"/>
+        </w:rPr>
+        <w:lastRenderedPageBreak/>
+        <w:drawing>
+          <wp:inline distT="0" distB="0" distL="0" distR="0" wp14:anchorId="4A7CA3D8" wp14:editId="2AA66618">
+            <wp:extent cx="4778154" cy="1767993"/>
+            <wp:effectExtent l="0" t="0" r="3810" b="3810"/>
+            <wp:docPr id="31" name="Рисунок 31"/>
+            <wp:cNvGraphicFramePr>
+              <a:graphicFrameLocks xmlns:a="http://schemas.openxmlformats.org/drawingml/2006/main" noChangeAspect="1"/>
+            </wp:cNvGraphicFramePr>
+            <a:graphic xmlns:a="http://schemas.openxmlformats.org/drawingml/2006/main">
+              <a:graphicData uri="http://schemas.openxmlformats.org/drawingml/2006/picture">
+                <pic:pic xmlns:pic="http://schemas.openxmlformats.org/drawingml/2006/picture">
+                  <pic:nvPicPr>
+                    <pic:cNvPr id="1" name=""/>
+                    <pic:cNvPicPr/>
+                  </pic:nvPicPr>
+                  <pic:blipFill>
+                    <a:blip r:embed="rId29"/>
+                    <a:stretch>
+                      <a:fillRect/>
+                    </a:stretch>
+                  </pic:blipFill>
+                  <pic:spPr>
+                    <a:xfrm>
+                      <a:off x="0" y="0"/>
+                      <a:ext cx="4778154" cy="1767993"/>
+                    </a:xfrm>
+                    <a:prstGeom prst="rect">
+                      <a:avLst/>
+                    </a:prstGeom>
+                  </pic:spPr>
+                </pic:pic>
+              </a:graphicData>
+            </a:graphic>
+          </wp:inline>
+        </w:drawing>
+      </w:r>
+    </w:p>
+    <w:p>
+      <w:pPr>
+        <w:pStyle w:val="a7"/>
+        <w:spacing w:line="360" w:lineRule="auto"/>
+        <w:ind w:left="782" w:firstLine="709"/>
+        <w:jc w:val="center"/>
+        <w:rPr>
+          <w:sz w:val="28"/>
+          <w:szCs w:val="28"/>
+        </w:rPr>
+      </w:pPr>
+      <w:r>
+        <w:rPr>
+          <w:sz w:val="28"/>
+          <w:szCs w:val="28"/>
+        </w:rPr>
+        <w:t>Листинг 13. Код для оценки параметров с помощью ММП</w:t>
+      </w:r>
+    </w:p>
+    <w:p>
+      <w:pPr>
+        <w:pStyle w:val="a7"/>
+        <w:spacing w:line="360" w:lineRule="auto"/>
+        <w:ind w:left="782" w:firstLine="709"/>
+        <w:jc w:val="center"/>
+        <w:rPr>
+          <w:sz w:val="28"/>
+          <w:szCs w:val="28"/>
+        </w:rPr>
+      </w:pPr>
+      <w:r>
+        <w:rPr>
+          <w:sz w:val="28"/>
+          <w:szCs w:val="28"/>
+        </w:rPr>
+        <w:drawing>
+          <wp:inline distT="0" distB="0" distL="0" distR="0" wp14:anchorId="2847C269" wp14:editId="6F27A15F">
+            <wp:extent cx="4767921" cy="2507673"/>
+            <wp:effectExtent l="0" t="0" r="0" b="6985"/>
+            <wp:docPr id="33" name="Рисунок 33"/>
+            <wp:cNvGraphicFramePr>
+              <a:graphicFrameLocks xmlns:a="http://schemas.openxmlformats.org/drawingml/2006/main" noChangeAspect="1"/>
+            </wp:cNvGraphicFramePr>
+            <a:graphic xmlns:a="http://schemas.openxmlformats.org/drawingml/2006/main">
+              <a:graphicData uri="http://schemas.openxmlformats.org/drawingml/2006/picture">
+                <pic:pic xmlns:pic="http://schemas.openxmlformats.org/drawingml/2006/picture">
+                  <pic:nvPicPr>
+                    <pic:cNvPr id="1" name=""/>
+                    <pic:cNvPicPr/>
+                  </pic:nvPicPr>
+                  <pic:blipFill>
+                    <a:blip r:embed="rId30"/>
+                    <a:stretch>
+                      <a:fillRect/>
+                    </a:stretch>
+                  </pic:blipFill>
+                  <pic:spPr>
+                    <a:xfrm>
+                      <a:off x="0" y="0"/>
+                      <a:ext cx="4774333" cy="2511046"/>
+                    </a:xfrm>
+                    <a:prstGeom prst="rect">
+                      <a:avLst/>
+                    </a:prstGeom>
+                  </pic:spPr>
+                </pic:pic>
+              </a:graphicData>
+            </a:graphic>
+          </wp:inline>
+        </w:drawing>
+      </w:r>
+    </w:p>
+    <w:p>
+      <w:pPr>
+        <w:pStyle w:val="a7"/>
+        <w:spacing w:line="360" w:lineRule="auto"/>
+        <w:ind w:left="782" w:firstLine="709"/>
+        <w:jc w:val="center"/>
+        <w:rPr>
+          <w:sz w:val="28"/>
+          <w:szCs w:val="28"/>
+        </w:rPr>
+      </w:pPr>
+      <w:r>
+        <w:rPr>
+          <w:sz w:val="28"/>
+          <w:szCs w:val="28"/>
+        </w:rPr>
+        <w:t>Листинг 14. Код для оценки параметров с помощью ММП</w:t>
+      </w:r>
+    </w:p>
+    <w:p>
+      <w:pPr>
+        <w:pStyle w:val="a7"/>
+        <w:spacing w:line="360" w:lineRule="auto"/>
+        <w:ind w:left="782" w:firstLine="709"/>
+        <w:jc w:val="center"/>
+        <w:rPr>
+          <w:sz w:val="28"/>
+          <w:szCs w:val="28"/>
+        </w:rPr>
+      </w:pPr>
+      <w:r>
+        <w:rPr>
+          <w:sz w:val="28"/>
+          <w:szCs w:val="28"/>
+        </w:rPr>
+        <w:drawing>
+          <wp:inline distT="0" distB="0" distL="0" distR="0" wp14:anchorId="1C3A720A" wp14:editId="5FEF218E">
+            <wp:extent cx="5118946" cy="1774671"/>
+            <wp:effectExtent l="0" t="0" r="5715" b="0"/>
+            <wp:docPr id="35" name="Рисунок 35"/>
+            <wp:cNvGraphicFramePr>
+              <a:graphicFrameLocks xmlns:a="http://schemas.openxmlformats.org/drawingml/2006/main" noChangeAspect="1"/>
+            </wp:cNvGraphicFramePr>
+            <a:graphic xmlns:a="http://schemas.openxmlformats.org/drawingml/2006/main">
+              <a:graphicData uri="http://schemas.openxmlformats.org/drawingml/2006/picture">
+                <pic:pic xmlns:pic="http://schemas.openxmlformats.org/drawingml/2006/picture">
+                  <pic:nvPicPr>
+                    <pic:cNvPr id="1" name=""/>
+                    <pic:cNvPicPr/>
+                  </pic:nvPicPr>
+                  <pic:blipFill>
+                    <a:blip r:embed="rId31"/>
+                    <a:stretch>
+                      <a:fillRect/>
+                    </a:stretch>
+                  </pic:blipFill>
+                  <pic:spPr>
+                    <a:xfrm>
+                      <a:off x="0" y="0"/>
+                      <a:ext cx="5231608" cy="1813730"/>
+                    </a:xfrm>
+                    <a:prstGeom prst="rect">
+                      <a:avLst/>
+                    </a:prstGeom>
+                  </pic:spPr>
+                </pic:pic>
+              </a:graphicData>
+            </a:graphic>
+          </wp:inline>
+        </w:drawing>
+      </w:r>
+    </w:p>
+    <w:p>
+      <w:pPr>
+        <w:pStyle w:val="a7"/>
+        <w:spacing w:line="360" w:lineRule="auto"/>
+        <w:ind w:left="782" w:firstLine="709"/>
+        <w:jc w:val="center"/>
+        <w:rPr>
+          <w:sz w:val="28"/>
+          <w:szCs w:val="28"/>
+        </w:rPr>
+      </w:pPr>
+      <w:r>
+        <w:rPr>
+          <w:sz w:val="28"/>
+          <w:szCs w:val="28"/>
+        </w:rPr>
+        <w:t>Листинг 15. Код для оценки параметров с помощью ММП</w:t>
+      </w:r>
+    </w:p>
+    <w:p>
+      <w:pPr>
+        <w:pStyle w:val="a7"/>
+        <w:spacing w:line="360" w:lineRule="auto"/>
+        <w:ind w:left="782" w:firstLine="709"/>
+        <w:jc w:val="both"/>
+        <w:rPr>
+          <w:sz w:val="28"/>
+          <w:szCs w:val="28"/>
+        </w:rPr>
+      </w:pPr>
+    </w:p>
+    <w:p>
+      <w:pPr>
+        <w:pStyle w:val="a7"/>
+        <w:spacing w:line="360" w:lineRule="auto"/>
+        <w:ind w:left="782" w:firstLine="709"/>
+        <w:jc w:val="both"/>
+        <w:rPr>
+          <w:sz w:val="28"/>
+          <w:szCs w:val="28"/>
+        </w:rPr>
+      </w:pPr>
+      <w:r>
+        <w:rPr>
+          <w:sz w:val="28"/>
+          <w:szCs w:val="28"/>
+        </w:rPr>
+        <w:t xml:space="preserve">Полученные значения: </w:t>
+      </w:r>
+    </w:p>
+    <w:p>
+      <w:pPr>
+        <w:pStyle w:val="a7"/>
+        <w:spacing w:line="360" w:lineRule="auto"/>
+        <w:ind w:left="782" w:firstLine="709"/>
+        <w:jc w:val="both"/>
+        <w:rPr>
+          <w:rFonts w:ascii="Cambria Math" w:hAnsi="Cambria Math"/>
+          <w:sz w:val="28"/>
+          <w:szCs w:val="28"/>
+          <w:oMath/>
+        </w:rPr>
+      </w:pPr>
+      <m:oMathPara>
+        <m:oMath>
+          <m:r>
+            <w:rPr>
+              <w:rFonts w:ascii="Cambria Math" w:hAnsi="Cambria Math"/>
+              <w:sz w:val="28"/>
+              <w:szCs w:val="28"/>
+            </w:rPr>
+            <m:t>alpha_mle = 7.164519554100081</m:t>
+          </m:r>
+        </m:oMath>
+      </m:oMathPara>
+    </w:p>
+    <w:p>
+      <w:pPr>
+        <w:pStyle w:val="a7"/>
+        <w:spacing w:line="360" w:lineRule="auto"/>
+        <w:ind w:left="782" w:firstLine="709"/>
+        <w:jc w:val="both"/>
+        <w:rPr>
+          <w:rFonts w:ascii="Cambria Math" w:hAnsi="Cambria Math"/>
+          <w:sz w:val="28"/>
+          <w:szCs w:val="28"/>
+          <w:oMath/>
+        </w:rPr>
+      </w:pPr>
+      <m:oMathPara>
+        <m:oMath>
+          <m:r>
+            <w:rPr>
+              <w:rFonts w:ascii="Cambria Math" w:hAnsi="Cambria Math"/>
+              <w:sz w:val="28"/>
+              <w:szCs w:val="28"/>
+            </w:rPr>
+            <m:t>loc_mle = 0.7556755874576274</m:t>
+          </m:r>
+        </m:oMath>
+      </m:oMathPara>
+    </w:p>
+    <w:p>
+      <w:pPr>
+        <w:pStyle w:val="a7"/>
+        <w:spacing w:line="360" w:lineRule="auto"/>
+        <w:ind w:left="782" w:firstLine="709"/>
+        <w:jc w:val="both"/>
+        <w:rPr>
+          <w:sz w:val="28"/>
+          <w:szCs w:val="28"/>
+        </w:rPr>
+      </w:pPr>
+    </w:p>
+    <w:p>
+      <w:pPr>
+        <w:pStyle w:val="a7"/>
+        <w:spacing w:line="360" w:lineRule="auto"/>
+        <w:ind w:left="782" w:firstLine="709"/>
+        <w:jc w:val="both"/>
+        <w:rPr>
+          <w:sz w:val="28"/>
+          <w:szCs w:val="28"/>
+        </w:rPr>
+      </w:pPr>
+    </w:p>
+    <w:p>
+      <w:pPr>
+        <w:pStyle w:val="a7"/>
+        <w:numPr>
+          <w:ilvl w:val="1"/>
+          <w:numId w:val="3"/>
+        </w:numPr>
+        <w:spacing w:line="360" w:lineRule="auto"/>
+        <w:jc w:val="both"/>
+        <w:rPr>
+          <w:sz w:val="28"/>
+          <w:szCs w:val="28"/>
+        </w:rPr>
+      </w:pPr>
+    </w:p>
+    <w:p>
+      <w:pPr>
+        <w:pStyle w:val="a7"/>
+        <w:spacing w:before="100" w:beforeAutospacing="1" w:after="100" w:afterAutospacing="1" w:line="360" w:lineRule="auto"/>
+        <w:ind w:left="782" w:firstLine="709"/>
+        <w:jc w:val="both"/>
+        <w:rPr>
+          <w:sz w:val="28"/>
+          <w:szCs w:val="28"/>
+        </w:rPr>
+      </w:pPr>
+    </w:p>
+    <w:p>
+      <w:pPr>
+        <w:spacing w:before="100" w:beforeAutospacing="1" w:after="100" w:afterAutospacing="1" w:line="360" w:lineRule="auto"/>
+        <w:ind w:firstLine="709"/>
+        <w:jc w:val="both"/>
+        <w:rPr>
+          <w:sz w:val="28"/>
+          <w:szCs w:val="28"/>
+        </w:rPr>
+      </w:pPr>
+    </w:p>
+    <w:p>
+      <w:pPr>
+        <w:spacing w:before="100" w:beforeAutospacing="1" w:after="100" w:afterAutospacing="1" w:line="360" w:lineRule="auto"/>
+        <w:ind w:firstLine="709"/>
+        <w:jc w:val="both"/>
+        <w:rPr>
+          <w:sz w:val="28"/>
+          <w:szCs w:val="28"/>
+        </w:rPr>
+      </w:pPr>
+    </w:p>
+    <w:p>
+      <w:pPr>
+        <w:spacing w:before="100" w:beforeAutospacing="1" w:after="100" w:afterAutospacing="1" w:line="360" w:lineRule="auto"/>
+        <w:ind w:firstLine="709"/>
+        <w:jc w:val="both"/>
+        <w:rPr>
+          <w:sz w:val="28"/>
+          <w:szCs w:val="28"/>
+        </w:rPr>
+      </w:pPr>
+    </w:p>
+    <w:p>
+      <w:pPr>
+        <w:spacing w:before="100" w:beforeAutospacing="1" w:after="100" w:afterAutospacing="1" w:line="360" w:lineRule="auto"/>
+        <w:ind w:firstLine="709"/>
+        <w:jc w:val="both"/>
+        <w:rPr>
+          <w:sz w:val="28"/>
+          <w:szCs w:val="28"/>
+        </w:rPr>
+      </w:pPr>
+    </w:p>
+    <w:p>
+      <w:pPr>
+        <w:spacing w:before="100" w:beforeAutospacing="1" w:after="100" w:afterAutospacing="1" w:line="360" w:lineRule="auto"/>
+        <w:ind w:firstLine="708"/>
+        <w:jc w:val="both"/>
+        <w:rPr>
+          <w:sz w:val="28"/>
+          <w:szCs w:val="28"/>
+        </w:rPr>
+      </w:pPr>
+    </w:p>
+    <w:p>
+      <w:pPr>
+        <w:spacing w:line="360" w:lineRule="auto"/>
+        <w:rPr>
+          <w:sz w:val="28"/>
+          <w:szCs w:val="28"/>
+        </w:rPr>
+      </w:pPr>
+    </w:p>
+    <w:p>
+      <w:pPr>
+        <w:spacing w:line="360" w:lineRule="auto"/>
+        <w:rPr>
+          <w:sz w:val="28"/>
+          <w:szCs w:val="28"/>
+        </w:rPr>
+      </w:pPr>
+    </w:p>
+    <w:p>
+      <w:pPr>
+        <w:spacing w:line="360" w:lineRule="auto"/>
+        <w:rPr>
+          <w:sz w:val="28"/>
+          <w:szCs w:val="28"/>
+        </w:rPr>
+      </w:pPr>
+    </w:p>
+    <w:p>
+      <w:pPr>
+        <w:spacing w:line="360" w:lineRule="auto"/>
+        <w:rPr>
+          <w:sz w:val="28"/>
+          <w:szCs w:val="28"/>
+        </w:rPr>
+      </w:pPr>
+    </w:p>
+    <w:p>
+      <w:pPr>
+        <w:spacing w:line="360" w:lineRule="auto"/>
+        <w:rPr>
+          <w:sz w:val="28"/>
+          <w:szCs w:val="28"/>
+        </w:rPr>
+      </w:pPr>
+    </w:p>
+    <w:p>
+      <w:pPr>
+        <w:spacing w:line="360" w:lineRule="auto"/>
+        <w:rPr>
+          <w:sz w:val="28"/>
+          <w:szCs w:val="28"/>
+        </w:rPr>
+      </w:pPr>
+    </w:p>
+    <w:p>
+      <w:pPr>
+        <w:spacing w:line="360" w:lineRule="auto"/>
+        <w:rPr>
+          <w:sz w:val="28"/>
+          <w:szCs w:val="28"/>
+        </w:rPr>
+      </w:pPr>
+    </w:p>
+    <w:p>
+      <w:pPr>
+        <w:spacing w:line="360" w:lineRule="auto"/>
+        <w:rPr>
+          <w:sz w:val="28"/>
+          <w:szCs w:val="28"/>
+        </w:rPr>
+      </w:pPr>
+    </w:p>
+    <w:p>
+      <w:pPr>
+        <w:spacing w:line="360" w:lineRule="auto"/>
+        <w:rPr>
+          <w:sz w:val="28"/>
+          <w:szCs w:val="28"/>
+        </w:rPr>
+      </w:pPr>
+    </w:p>
+    <w:p>
+      <w:pPr>
+        <w:spacing w:line="360" w:lineRule="auto"/>
+        <w:rPr>
+          <w:sz w:val="28"/>
+          <w:szCs w:val="28"/>
+        </w:rPr>
+      </w:pPr>
+    </w:p>
+    <w:p>
+      <w:pPr>
+        <w:spacing w:line="360" w:lineRule="auto"/>
+        <w:rPr>
+          <w:sz w:val="28"/>
+          <w:szCs w:val="28"/>
+        </w:rPr>
+      </w:pPr>
+    </w:p>
+    <w:p>
+      <w:pPr>
+        <w:spacing w:line="360" w:lineRule="auto"/>
+        <w:rPr>
+          <w:sz w:val="28"/>
+          <w:szCs w:val="28"/>
+        </w:rPr>
+      </w:pPr>
+    </w:p>
+    <w:p>
+      <w:pPr>
+        <w:spacing w:line="360" w:lineRule="auto"/>
+        <w:rPr>
+          <w:sz w:val="28"/>
+          <w:szCs w:val="28"/>
+        </w:rPr>
+      </w:pPr>
+    </w:p>
+    <w:p>
+      <w:pPr>
+        <w:spacing w:line="360" w:lineRule="auto"/>
+        <w:rPr>
+          <w:sz w:val="28"/>
+          <w:szCs w:val="28"/>
+        </w:rPr>
+      </w:pPr>
+    </w:p>
+    <w:p>
+      <w:pPr>
+        <w:spacing w:line="360" w:lineRule="auto"/>
+        <w:rPr>
+          <w:sz w:val="28"/>
+          <w:szCs w:val="28"/>
+        </w:rPr>
+      </w:pPr>
+    </w:p>
+    <w:p>
+      <w:pPr>
+        <w:spacing w:line="360" w:lineRule="auto"/>
+        <w:rPr>
+          <w:sz w:val="28"/>
+          <w:szCs w:val="28"/>
+        </w:rPr>
+      </w:pPr>
+    </w:p>
+    <w:p>
+      <w:pPr>
+        <w:spacing w:line="360" w:lineRule="auto"/>
+        <w:rPr>
+          <w:sz w:val="28"/>
+          <w:szCs w:val="28"/>
+        </w:rPr>
+      </w:pPr>
+    </w:p>
+    <w:p>
+      <w:pPr>
+        <w:spacing w:line="360" w:lineRule="auto"/>
+        <w:rPr>
+          <w:sz w:val="28"/>
+          <w:szCs w:val="28"/>
+        </w:rPr>
+      </w:pPr>
+    </w:p>
+    <w:p>
+      <w:pPr>
+        <w:spacing w:line="360" w:lineRule="auto"/>
+        <w:rPr>
+          <w:sz w:val="28"/>
+          <w:szCs w:val="28"/>
+        </w:rPr>
+      </w:pPr>
+    </w:p>
+    <w:p>
+      <w:pPr>
+        <w:spacing w:line="360" w:lineRule="auto"/>
+        <w:rPr>
+          <w:sz w:val="28"/>
+          <w:szCs w:val="28"/>
+        </w:rPr>
+      </w:pPr>
+    </w:p>
+    <w:p>
+      <w:pPr>
+        <w:spacing w:line="360" w:lineRule="auto"/>
+        <w:rPr>
+          <w:sz w:val="28"/>
+          <w:szCs w:val="28"/>
+        </w:rPr>
+      </w:pPr>
+    </w:p>
+    <w:p>
+      <w:pPr>
+        <w:spacing w:line="360" w:lineRule="auto"/>
+        <w:rPr>
+          <w:sz w:val="28"/>
+          <w:szCs w:val="28"/>
+        </w:rPr>
+      </w:pPr>
+    </w:p>
+    <w:p>
+      <w:pPr>
+        <w:spacing w:line="360" w:lineRule="auto"/>
+        <w:rPr>
+          <w:sz w:val="28"/>
+          <w:szCs w:val="28"/>
+        </w:rPr>
+      </w:pPr>
+    </w:p>
+    <w:p>
+      <w:pPr>
+        <w:spacing w:line="360" w:lineRule="auto"/>
+        <w:jc w:val="center"/>
+        <w:rPr>
+          <w:b/>
+          <w:bCs/>
+          <w:sz w:val="32"/>
+          <w:szCs w:val="32"/>
+        </w:rPr>
+      </w:pPr>
+      <w:r>
+        <w:rPr>
+          <w:b/>
+          <w:bCs/>
+          <w:sz w:val="32"/>
+          <w:szCs w:val="32"/>
+        </w:rPr>
+        <w:t>Список использованной литературы</w:t>
+      </w:r>
+    </w:p>
+    <w:p>
+      <w:pPr>
+        <w:spacing w:line="360" w:lineRule="auto"/>
+        <w:jc w:val="center"/>
+        <w:rPr>
+          <w:b/>
+          <w:bCs/>
+          <w:sz w:val="28"/>
+          <w:szCs w:val="28"/>
+        </w:rPr>
+      </w:pPr>
+    </w:p>
+    <w:p>
+      <w:pPr>
+        <w:spacing w:line="360" w:lineRule="auto"/>
+        <w:jc w:val="both"/>
+        <w:rPr>
+          <w:sz w:val="28"/>
+          <w:szCs w:val="28"/>
           <w:lang w:val="en-US"/>
         </w:rPr>
+      </w:pPr>
+      <w:r>
+        <w:rPr>
+          <w:b/>
+          <w:bCs/>
+          <w:sz w:val="28"/>
+          <w:szCs w:val="28"/>
+          <w:lang w:val="en-US"/>
+        </w:rPr>
         <w:t>[1] Pearson K. Tables of the Incomplete Gamma-Function / computed by the staff of the Department of Applied Statistics, University of London. — London: University of London, 1922. — URL</w:t>
       </w:r>
       <w:r>
@@ -13299,7 +14772,7 @@
         </w:rPr>
         <w:t xml:space="preserve">: </w:t>
       </w:r>
-      <w:hyperlink r:id="rId28" w:history="1">
+      <w:hyperlink r:id="rId32" w:history="1">
         <w:r>
           <w:rPr>
             <w:rStyle w:val="ac"/>
@@ -13605,7 +15078,7 @@
         </w:rPr>
         <w:t xml:space="preserve"> </w:t>
       </w:r>
-      <w:hyperlink r:id="rId29" w:history="1">
+      <w:hyperlink r:id="rId33" w:history="1">
         <w:r>
           <w:rPr>
             <w:rStyle w:val="ac"/>
@@ -14764,7 +16237,7 @@
   <w:abstractNum w:abstractNumId="9" w15:restartNumberingAfterBreak="0">
     <w:nsid w:val="447579D3"/>
     <w:multiLevelType w:val="multilevel"/>
-    <w:tmpl w:val="E062D2CE"/>
+    <w:tmpl w:val="896A5380"/>
     <w:lvl w:ilvl="0">
       <w:start w:val="1"/>
       <w:numFmt w:val="decimal"/>
@@ -14787,8 +16260,13 @@
         <w:ind w:left="780" w:hanging="420"/>
       </w:pPr>
       <w:rPr>
-        <w:rFonts w:hint="default"/>
-        <w:sz w:val="24"/>
+        <w:rFonts w:ascii="Times New Roman" w:eastAsia="Times New Roman" w:hAnsi="Times New Roman" w:cs="Times New Roman" w:hint="default"/>
+        <w:b/>
+        <w:bCs/>
+        <w:i w:val="0"/>
+        <w:noProof w:val="0"/>
+        <w:sz w:val="28"/>
+        <w:szCs w:val="32"/>
       </w:rPr>
     </w:lvl>
     <w:lvl w:ilvl="2">

</xml_diff>

<commit_message>
UPDATE: отчет DATE: 2026-09-21 23:54:12
</commit_message>
<xml_diff>
--- a/Учеба 4 семестр/Теория вероятности/Курсовая работа/Отчет, Код/Курсовая_работа.docx
+++ b/Учеба 4 семестр/Теория вероятности/Курсовая работа/Отчет, Код/Курсовая_работа.docx
@@ -8186,7 +8186,7 @@
     <w:p>
       <w:pPr>
         <w:spacing w:line="360" w:lineRule="auto"/>
-        <w:ind w:firstLine="360"/>
+        <w:ind w:firstLine="709"/>
         <w:jc w:val="both"/>
       </w:pPr>
       <w:r>
@@ -8253,7 +8253,7 @@
             <w:szCs w:val="28"/>
             <w:vertAlign w:val="subscript"/>
           </w:rPr>
-          <m:t xml:space="preserve"> –1</m:t>
+          <m:t xml:space="preserve"> -1</m:t>
         </m:r>
         <m:r>
           <w:rPr>
@@ -8449,21 +8449,7 @@
           <w:sz w:val="28"/>
           <w:szCs w:val="28"/>
         </w:rPr>
-        <w:t xml:space="preserve"> числа</w:t>
-      </w:r>
-      <w:r>
-        <w:rPr>
-          <w:sz w:val="28"/>
-          <w:szCs w:val="28"/>
-        </w:rPr>
-        <w:t xml:space="preserve"> </w:t>
-      </w:r>
-      <w:r>
-        <w:rPr>
-          <w:sz w:val="28"/>
-          <w:szCs w:val="28"/>
-        </w:rPr>
-        <w:t xml:space="preserve">элементов выборки, попавших в интервал </w:t>
+        <w:t xml:space="preserve"> числа элементов выборки, попавших в интервал </w:t>
       </w:r>
       <m:oMath>
         <m:r>
@@ -8530,28 +8516,7 @@
           <w:sz w:val="28"/>
           <w:szCs w:val="28"/>
         </w:rPr>
-        <w:t xml:space="preserve"> –</w:t>
-      </w:r>
-      <w:r>
-        <w:rPr>
-          <w:sz w:val="28"/>
-          <w:szCs w:val="28"/>
-        </w:rPr>
-        <w:t xml:space="preserve"> </w:t>
-      </w:r>
-      <w:r>
-        <w:rPr>
-          <w:sz w:val="28"/>
-          <w:szCs w:val="28"/>
-        </w:rPr>
-        <w:t>частота</w:t>
-      </w:r>
-      <w:r>
-        <w:rPr>
-          <w:sz w:val="28"/>
-          <w:szCs w:val="28"/>
-        </w:rPr>
-        <w:t xml:space="preserve">, </w:t>
+        <w:t xml:space="preserve"> – частота, </w:t>
       </w:r>
       <m:oMath>
         <m:sSub>
@@ -8656,21 +8621,7 @@
           <w:sz w:val="28"/>
           <w:szCs w:val="28"/>
         </w:rPr>
-        <w:t xml:space="preserve"> [</w:t>
-      </w:r>
-      <w:r>
-        <w:rPr>
-          <w:sz w:val="28"/>
-          <w:szCs w:val="28"/>
-        </w:rPr>
-        <w:t>4</w:t>
-      </w:r>
-      <w:r>
-        <w:rPr>
-          <w:sz w:val="28"/>
-          <w:szCs w:val="28"/>
-        </w:rPr>
-        <w:t>]</w:t>
+        <w:t xml:space="preserve"> [4]</w:t>
       </w:r>
     </w:p>
     <w:p>
@@ -9527,6 +9478,36 @@
           <w:sz w:val="28"/>
           <w:szCs w:val="28"/>
         </w:rPr>
+        <w:t xml:space="preserve"> </w:t>
+      </w:r>
+      <w:r>
+        <w:rPr>
+          <w:sz w:val="28"/>
+          <w:szCs w:val="28"/>
+          <w:lang w:val="en-US"/>
+        </w:rPr>
+        <w:t>[</w:t>
+      </w:r>
+      <w:r>
+        <w:rPr>
+          <w:sz w:val="28"/>
+          <w:szCs w:val="28"/>
+        </w:rPr>
+        <w:t>Листинг 11</w:t>
+      </w:r>
+      <w:r>
+        <w:rPr>
+          <w:sz w:val="28"/>
+          <w:szCs w:val="28"/>
+          <w:lang w:val="en-US"/>
+        </w:rPr>
+        <w:t>]</w:t>
+      </w:r>
+      <w:r>
+        <w:rPr>
+          <w:sz w:val="28"/>
+          <w:szCs w:val="28"/>
+        </w:rPr>
         <w:t>:</w:t>
       </w:r>
     </w:p>
@@ -10137,6 +10118,7 @@
         <w:rPr>
           <w:sz w:val="28"/>
           <w:szCs w:val="28"/>
+          <w:lang w:val="en-US"/>
         </w:rPr>
       </w:pPr>
     </w:p>
@@ -10144,27 +10126,36 @@
       <w:pPr>
         <w:pStyle w:val="a7"/>
         <w:numPr>
-          <w:ilvl w:val="1"/>
-          <w:numId w:val="3"/>
+          <w:ilvl w:val="0"/>
+          <w:numId w:val="16"/>
         </w:numPr>
         <w:spacing w:line="360" w:lineRule="auto"/>
-        <w:jc w:val="center"/>
+        <w:jc w:val="both"/>
         <w:rPr>
           <w:b/>
           <w:bCs/>
-          <w:sz w:val="32"/>
-          <w:szCs w:val="32"/>
-        </w:rPr>
-      </w:pPr>
-      <w:r>
+          <w:vanish/>
+          <w:sz w:val="28"/>
+          <w:szCs w:val="28"/>
+        </w:rPr>
+      </w:pPr>
+    </w:p>
+    <w:p>
+      <w:pPr>
+        <w:pStyle w:val="a7"/>
+        <w:numPr>
+          <w:ilvl w:val="2"/>
+          <w:numId w:val="16"/>
+        </w:numPr>
+        <w:spacing w:line="360" w:lineRule="auto"/>
+        <w:jc w:val="both"/>
         <w:rPr>
           <w:b/>
           <w:bCs/>
-          <w:sz w:val="32"/>
-          <w:szCs w:val="32"/>
-        </w:rPr>
-        <w:t xml:space="preserve"> </w:t>
-      </w:r>
+          <w:sz w:val="28"/>
+          <w:szCs w:val="28"/>
+        </w:rPr>
+      </w:pPr>
       <w:r>
         <w:rPr>
           <w:b/>
@@ -10178,20 +10169,191 @@
     <w:p>
       <w:pPr>
         <w:spacing w:line="360" w:lineRule="auto"/>
-        <w:ind w:left="360" w:firstLine="348"/>
-        <w:jc w:val="both"/>
+        <w:ind w:firstLine="720"/>
+        <w:jc w:val="both"/>
+        <w:rPr>
+          <w:sz w:val="28"/>
+          <w:szCs w:val="28"/>
+        </w:rPr>
+      </w:pPr>
+      <w:proofErr w:type="spellStart"/>
+      <w:r>
         <w:rPr>
           <w:b/>
           <w:bCs/>
           <w:sz w:val="28"/>
           <w:szCs w:val="28"/>
         </w:rPr>
-      </w:pPr>
-    </w:p>
-    <w:p>
-      <w:pPr>
-        <w:spacing w:line="360" w:lineRule="auto"/>
-        <w:ind w:firstLine="360"/>
+        <w:t>Подвыборка</w:t>
+      </w:r>
+      <w:proofErr w:type="spellEnd"/>
+      <w:r>
+        <w:rPr>
+          <w:b/>
+          <w:bCs/>
+          <w:sz w:val="28"/>
+          <w:szCs w:val="28"/>
+        </w:rPr>
+        <w:t xml:space="preserve"> из 200 элементов (рисунок 9)</w:t>
+      </w:r>
+      <w:r>
+        <w:rPr>
+          <w:sz w:val="28"/>
+          <w:szCs w:val="28"/>
+        </w:rPr>
+        <w:t>. Форма гистограммы близка к полной выборке, а также пики различимы. Это свидетельствует о достаточной репрезентативности выборки объёмом 200 элементов для визуальной идентификации типа распределения.</w:t>
+      </w:r>
+    </w:p>
+    <w:p>
+      <w:pPr>
+        <w:spacing w:line="360" w:lineRule="auto"/>
+        <w:ind w:firstLine="720"/>
+        <w:jc w:val="both"/>
+        <w:rPr>
+          <w:sz w:val="28"/>
+          <w:szCs w:val="28"/>
+        </w:rPr>
+      </w:pPr>
+      <w:proofErr w:type="spellStart"/>
+      <w:r>
+        <w:rPr>
+          <w:b/>
+          <w:bCs/>
+          <w:sz w:val="28"/>
+          <w:szCs w:val="28"/>
+        </w:rPr>
+        <w:t>Подвыборка</w:t>
+      </w:r>
+      <w:proofErr w:type="spellEnd"/>
+      <w:r>
+        <w:rPr>
+          <w:b/>
+          <w:bCs/>
+          <w:sz w:val="28"/>
+          <w:szCs w:val="28"/>
+        </w:rPr>
+        <w:t xml:space="preserve"> из 100 элементов (рисунок 8)</w:t>
+      </w:r>
+      <w:r>
+        <w:rPr>
+          <w:sz w:val="28"/>
+          <w:szCs w:val="28"/>
+        </w:rPr>
+        <w:t xml:space="preserve">. Форма гистограммы прослеживается, однако правый пик размыт: его положение можно оценить лишь ориентировочно в диапазоне </w:t>
+      </w:r>
+      <m:oMath>
+        <m:r>
+          <w:rPr>
+            <w:rFonts w:ascii="Cambria Math" w:hAnsi="Cambria Math"/>
+            <w:sz w:val="28"/>
+            <w:szCs w:val="28"/>
+          </w:rPr>
+          <m:t>x ∈ [5; 9]</m:t>
+        </m:r>
+      </m:oMath>
+      <w:r>
+        <w:rPr>
+          <w:sz w:val="28"/>
+          <w:szCs w:val="28"/>
+        </w:rPr>
+        <w:t>. Гистограмма отражает общий характер распределения, но точность оценки параметров по ней невысока.</w:t>
+      </w:r>
+    </w:p>
+    <w:p>
+      <w:pPr>
+        <w:spacing w:line="360" w:lineRule="auto"/>
+        <w:ind w:firstLine="720"/>
+        <w:jc w:val="both"/>
+        <w:rPr>
+          <w:sz w:val="28"/>
+          <w:szCs w:val="28"/>
+        </w:rPr>
+      </w:pPr>
+      <w:proofErr w:type="spellStart"/>
+      <w:r>
+        <w:rPr>
+          <w:b/>
+          <w:bCs/>
+          <w:sz w:val="28"/>
+          <w:szCs w:val="28"/>
+        </w:rPr>
+        <w:t>Подвыборка</w:t>
+      </w:r>
+      <w:proofErr w:type="spellEnd"/>
+      <w:r>
+        <w:rPr>
+          <w:b/>
+          <w:bCs/>
+          <w:sz w:val="28"/>
+          <w:szCs w:val="28"/>
+        </w:rPr>
+        <w:t xml:space="preserve"> из 10 элементов (рисунок 7)</w:t>
+      </w:r>
+      <w:r>
+        <w:rPr>
+          <w:sz w:val="28"/>
+          <w:szCs w:val="28"/>
+        </w:rPr>
+        <w:t>. При столь малом объёме выборки гистограмма носит случайный характер и не позволяет делать обоснованных выводов о форме распределения. Большинство интервалов содержат 0 или 1 элемент, что делает оценку плотности недостоверной.</w:t>
+      </w:r>
+    </w:p>
+    <w:p>
+      <w:pPr>
+        <w:spacing w:line="360" w:lineRule="auto"/>
+        <w:ind w:firstLine="720"/>
+        <w:jc w:val="both"/>
+        <w:rPr>
+          <w:sz w:val="28"/>
+          <w:szCs w:val="28"/>
+        </w:rPr>
+      </w:pPr>
+      <w:r>
+        <w:rPr>
+          <w:b/>
+          <w:bCs/>
+          <w:sz w:val="28"/>
+          <w:szCs w:val="28"/>
+        </w:rPr>
+        <w:lastRenderedPageBreak/>
+        <w:t>Общий вывод</w:t>
+      </w:r>
+      <w:r>
+        <w:rPr>
+          <w:sz w:val="28"/>
+          <w:szCs w:val="28"/>
+        </w:rPr>
+        <w:t xml:space="preserve">. При увеличении объёма выборки гистограмма всё точнее аппроксимирует плотность теоретического двойного гамма-распределения. Форма гистограммы полной выборки однозначно указывает на принадлежность данного распределения семейству симметричных двойных распределений. </w:t>
+      </w:r>
+    </w:p>
+    <w:p>
+      <w:pPr>
+        <w:numPr>
+          <w:ilvl w:val="2"/>
+          <w:numId w:val="16"/>
+        </w:numPr>
+        <w:spacing w:line="360" w:lineRule="auto"/>
+        <w:jc w:val="both"/>
+        <w:rPr>
+          <w:b/>
+          <w:bCs/>
+          <w:sz w:val="28"/>
+          <w:szCs w:val="28"/>
+        </w:rPr>
+      </w:pPr>
+      <w:r>
+        <w:rPr>
+          <w:b/>
+          <w:bCs/>
+          <w:sz w:val="28"/>
+          <w:szCs w:val="28"/>
+        </w:rPr>
+        <w:t>Предположения о параметрах распределения</w:t>
+      </w:r>
+    </w:p>
+    <w:p>
+      <w:pPr>
+        <w:spacing w:line="360" w:lineRule="auto"/>
+        <w:ind w:firstLine="720"/>
         <w:jc w:val="both"/>
         <w:rPr>
           <w:sz w:val="28"/>
@@ -10227,14 +10389,14 @@
           <w:sz w:val="28"/>
           <w:szCs w:val="28"/>
         </w:rPr>
-        <w:t>, рисунок 6)</w:t>
-      </w:r>
-      <w:r>
-        <w:rPr>
-          <w:sz w:val="28"/>
-          <w:szCs w:val="28"/>
-        </w:rPr>
-        <w:t xml:space="preserve">. Гистограмма имеет отчётливую двугорбую (бимодальную) форму, характерную для двойного гамма-распределения при параметре формы </w:t>
+        <w:t>, рисунок 9)</w:t>
+      </w:r>
+      <w:r>
+        <w:rPr>
+          <w:sz w:val="28"/>
+          <w:szCs w:val="28"/>
+        </w:rPr>
+        <w:t xml:space="preserve">. Гистограмма имеет форму, характерную для двойного гамма-распределения при параметре формы </w:t>
       </w:r>
       <m:oMath>
         <m:r>
@@ -10251,14 +10413,7 @@
           <w:sz w:val="28"/>
           <w:szCs w:val="28"/>
         </w:rPr>
-        <w:t>.</w:t>
-      </w:r>
-      <w:r>
-        <w:rPr>
-          <w:sz w:val="28"/>
-          <w:szCs w:val="28"/>
-        </w:rPr>
-        <w:t xml:space="preserve"> В данном варианте требуется рассмотреть параметр формы и параметр смещения, поэтому при анализе гистограммы примем параметр масштаба </w:t>
+        <w:t xml:space="preserve">. В данном варианте требуется рассмотреть параметр формы и параметр смещения, поэтому при анализе гистограммы примем параметр масштаба </w:t>
       </w:r>
       <m:oMath>
         <m:r>
@@ -10275,33 +10430,8 @@
           <w:sz w:val="28"/>
           <w:szCs w:val="28"/>
         </w:rPr>
-        <w:t>.</w:t>
-      </w:r>
-      <w:r>
-        <w:rPr>
-          <w:sz w:val="28"/>
-          <w:szCs w:val="28"/>
-        </w:rPr>
-        <w:t xml:space="preserve"> </w:t>
-      </w:r>
-      <w:r>
-        <w:rPr>
-          <w:sz w:val="28"/>
-          <w:szCs w:val="28"/>
-        </w:rPr>
-        <w:t>Два пика симметрично расположены относительно параметра смещения: левый пик — вблизи</w:t>
-      </w:r>
-    </w:p>
-    <w:p>
-      <w:pPr>
-        <w:spacing w:line="360" w:lineRule="auto"/>
-        <w:ind w:firstLine="360"/>
-        <w:jc w:val="both"/>
-        <w:rPr>
-          <w:sz w:val="28"/>
-          <w:szCs w:val="28"/>
-        </w:rPr>
-      </w:pPr>
+        <w:t xml:space="preserve">. Два пика симметрично расположены относительно параметра смещения: левый пик — вблизи </w:t>
+      </w:r>
       <m:oMath>
         <m:r>
           <w:rPr>
@@ -10340,17 +10470,7 @@
     <w:p>
       <w:pPr>
         <w:spacing w:line="360" w:lineRule="auto"/>
-        <w:jc w:val="both"/>
-        <w:rPr>
-          <w:sz w:val="28"/>
-          <w:szCs w:val="28"/>
-        </w:rPr>
-      </w:pPr>
-    </w:p>
-    <w:p>
-      <w:pPr>
-        <w:spacing w:line="360" w:lineRule="auto"/>
-        <w:ind w:left="720" w:hanging="360"/>
+        <w:ind w:firstLine="720"/>
         <w:jc w:val="both"/>
         <w:rPr>
           <w:sz w:val="28"/>
@@ -10370,20 +10490,7 @@
           <w:szCs w:val="28"/>
         </w:rPr>
         <w:tab/>
-      </w:r>
-      <w:r>
-        <w:rPr>
-          <w:sz w:val="28"/>
-          <w:szCs w:val="28"/>
-        </w:rPr>
-        <w:t>п</w:t>
-      </w:r>
-      <w:r>
-        <w:rPr>
-          <w:sz w:val="28"/>
-          <w:szCs w:val="28"/>
-        </w:rPr>
-        <w:t xml:space="preserve">араметр смещения: </w:t>
+        <w:t xml:space="preserve">параметр смещения: </w:t>
       </w:r>
       <m:oMath>
         <m:r>
@@ -10392,7 +10499,7 @@
             <w:sz w:val="28"/>
             <w:szCs w:val="28"/>
           </w:rPr>
-          <m:t>loc ≈ (-4,2 + 6,5) / 2 = 1,15</m:t>
+          <m:t>loc ≈ (-5,2 + 7,5) / 2 = 1,15</m:t>
         </m:r>
       </m:oMath>
       <w:r>
@@ -10406,7 +10513,7 @@
     <w:p>
       <w:pPr>
         <w:spacing w:line="360" w:lineRule="auto"/>
-        <w:ind w:left="720" w:hanging="360"/>
+        <w:ind w:firstLine="720"/>
         <w:jc w:val="both"/>
         <w:rPr>
           <w:sz w:val="28"/>
@@ -10426,20 +10533,7 @@
           <w:szCs w:val="28"/>
         </w:rPr>
         <w:tab/>
-      </w:r>
-      <w:r>
-        <w:rPr>
-          <w:sz w:val="28"/>
-          <w:szCs w:val="28"/>
-        </w:rPr>
-        <w:t>р</w:t>
-      </w:r>
-      <w:r>
-        <w:rPr>
-          <w:sz w:val="28"/>
-          <w:szCs w:val="28"/>
-        </w:rPr>
-        <w:t xml:space="preserve">асстояние от пика до </w:t>
+        <w:t xml:space="preserve">расстояние от пика до </w:t>
       </w:r>
       <m:oMath>
         <m:r>
@@ -10482,7 +10576,7 @@
             <w:sz w:val="28"/>
             <w:szCs w:val="28"/>
           </w:rPr>
-          <m:t xml:space="preserve"> α - 1 ≈ (6,5 - 1,15) × 1 ≈ 5,35</m:t>
+          <m:t xml:space="preserve"> α - 1 ≈ (7,5 - 1,15) × 1 ≈ 6,35</m:t>
         </m:r>
       </m:oMath>
       <w:r>
@@ -10499,7 +10593,7 @@
             <w:sz w:val="28"/>
             <w:szCs w:val="28"/>
           </w:rPr>
-          <m:t>α ≈ 6,35</m:t>
+          <m:t>α ≈ 7,35</m:t>
         </m:r>
       </m:oMath>
       <w:r>
@@ -10513,6 +10607,7 @@
     <w:p>
       <w:pPr>
         <w:spacing w:line="360" w:lineRule="auto"/>
+        <w:ind w:firstLine="720"/>
         <w:jc w:val="both"/>
         <w:rPr>
           <w:sz w:val="28"/>
@@ -10544,7 +10639,7 @@
             <w:sz w:val="28"/>
             <w:szCs w:val="28"/>
           </w:rPr>
-          <m:t>α ≈ 6,35</m:t>
+          <m:t>α ≈ 7,35</m:t>
         </m:r>
       </m:oMath>
       <w:r>
@@ -10592,16 +10687,6 @@
     <w:p>
       <w:pPr>
         <w:spacing w:line="360" w:lineRule="auto"/>
-        <w:jc w:val="both"/>
-        <w:rPr>
-          <w:sz w:val="28"/>
-          <w:szCs w:val="28"/>
-        </w:rPr>
-      </w:pPr>
-    </w:p>
-    <w:p>
-      <w:pPr>
-        <w:spacing w:line="360" w:lineRule="auto"/>
         <w:ind w:firstLine="720"/>
         <w:jc w:val="both"/>
         <w:rPr>
@@ -10609,65 +10694,6 @@
           <w:szCs w:val="28"/>
         </w:rPr>
       </w:pPr>
-      <w:proofErr w:type="spellStart"/>
-      <w:r>
-        <w:rPr>
-          <w:b/>
-          <w:bCs/>
-          <w:sz w:val="28"/>
-          <w:szCs w:val="28"/>
-        </w:rPr>
-        <w:t>Подвыборка</w:t>
-      </w:r>
-      <w:proofErr w:type="spellEnd"/>
-      <w:r>
-        <w:rPr>
-          <w:b/>
-          <w:bCs/>
-          <w:sz w:val="28"/>
-          <w:szCs w:val="28"/>
-        </w:rPr>
-        <w:t xml:space="preserve"> из 200 элементов (рисунок 9)</w:t>
-      </w:r>
-      <w:r>
-        <w:rPr>
-          <w:sz w:val="28"/>
-          <w:szCs w:val="28"/>
-        </w:rPr>
-        <w:t xml:space="preserve">. Форма гистограммы близка к полной выборке: </w:t>
-      </w:r>
-      <w:proofErr w:type="spellStart"/>
-      <w:r>
-        <w:rPr>
-          <w:sz w:val="28"/>
-          <w:szCs w:val="28"/>
-        </w:rPr>
-        <w:t>бимодальность</w:t>
-      </w:r>
-      <w:proofErr w:type="spellEnd"/>
-      <w:r>
-        <w:rPr>
-          <w:sz w:val="28"/>
-          <w:szCs w:val="28"/>
-        </w:rPr>
-        <w:t xml:space="preserve"> сохраняется, пики различимы. Это свидетельствует о достаточной репрезентативности </w:t>
-      </w:r>
-      <w:proofErr w:type="spellStart"/>
-      <w:r>
-        <w:rPr>
-          <w:sz w:val="28"/>
-          <w:szCs w:val="28"/>
-        </w:rPr>
-        <w:t>подвыборки</w:t>
-      </w:r>
-      <w:proofErr w:type="spellEnd"/>
-      <w:r>
-        <w:rPr>
-          <w:sz w:val="28"/>
-          <w:szCs w:val="28"/>
-        </w:rPr>
-        <w:t xml:space="preserve"> объёмом 200 элементов для визуальной идентификации типа распределения.</w:t>
-      </w:r>
     </w:p>
     <w:p>
       <w:pPr>
@@ -10677,8 +10703,64 @@
         <w:rPr>
           <w:sz w:val="28"/>
           <w:szCs w:val="28"/>
-        </w:rPr>
-      </w:pPr>
+          <w:lang w:val="en-US"/>
+        </w:rPr>
+      </w:pPr>
+      <w:r>
+        <w:rPr>
+          <w:sz w:val="28"/>
+          <w:szCs w:val="28"/>
+        </w:rPr>
+        <w:lastRenderedPageBreak/>
+        <w:drawing>
+          <wp:inline distT="0" distB="0" distL="0" distR="0" wp14:anchorId="03CD65EF" wp14:editId="2AF5DDD2">
+            <wp:extent cx="5935980" cy="3802380"/>
+            <wp:effectExtent l="0" t="0" r="7620" b="7620"/>
+            <wp:docPr id="37" name="Рисунок 37"/>
+            <wp:cNvGraphicFramePr>
+              <a:graphicFrameLocks xmlns:a="http://schemas.openxmlformats.org/drawingml/2006/main" noChangeAspect="1"/>
+            </wp:cNvGraphicFramePr>
+            <a:graphic xmlns:a="http://schemas.openxmlformats.org/drawingml/2006/main">
+              <a:graphicData uri="http://schemas.openxmlformats.org/drawingml/2006/picture">
+                <pic:pic xmlns:pic="http://schemas.openxmlformats.org/drawingml/2006/picture">
+                  <pic:nvPicPr>
+                    <pic:cNvPr id="0" name="Рисунок 1"/>
+                    <pic:cNvPicPr>
+                      <a:picLocks noChangeAspect="1" noChangeArrowheads="1"/>
+                    </pic:cNvPicPr>
+                  </pic:nvPicPr>
+                  <pic:blipFill>
+                    <a:blip r:embed="rId24">
+                      <a:extLst>
+                        <a:ext uri="{28A0092B-C50C-407E-A947-70E740481C1C}">
+                          <a14:useLocalDpi xmlns:a14="http://schemas.microsoft.com/office/drawing/2010/main" val="0"/>
+                        </a:ext>
+                      </a:extLst>
+                    </a:blip>
+                    <a:srcRect/>
+                    <a:stretch>
+                      <a:fillRect/>
+                    </a:stretch>
+                  </pic:blipFill>
+                  <pic:spPr bwMode="auto">
+                    <a:xfrm>
+                      <a:off x="0" y="0"/>
+                      <a:ext cx="5935980" cy="3802380"/>
+                    </a:xfrm>
+                    <a:prstGeom prst="rect">
+                      <a:avLst/>
+                    </a:prstGeom>
+                    <a:noFill/>
+                    <a:ln>
+                      <a:noFill/>
+                    </a:ln>
+                  </pic:spPr>
+                </pic:pic>
+              </a:graphicData>
+            </a:graphic>
+          </wp:inline>
+        </w:drawing>
+      </w:r>
     </w:p>
     <w:p>
       <w:pPr>
@@ -10690,76 +10772,13 @@
           <w:szCs w:val="28"/>
         </w:rPr>
       </w:pPr>
-      <w:proofErr w:type="spellStart"/>
-      <w:r>
-        <w:rPr>
-          <w:b/>
-          <w:bCs/>
-          <w:sz w:val="28"/>
-          <w:szCs w:val="28"/>
-        </w:rPr>
-        <w:t>Подвыборка</w:t>
-      </w:r>
-      <w:proofErr w:type="spellEnd"/>
-      <w:r>
-        <w:rPr>
-          <w:b/>
-          <w:bCs/>
-          <w:sz w:val="28"/>
-          <w:szCs w:val="28"/>
-        </w:rPr>
-        <w:t xml:space="preserve"> из 100 элементов (рисунок 8)</w:t>
-      </w:r>
-      <w:r>
-        <w:rPr>
-          <w:sz w:val="28"/>
-          <w:szCs w:val="28"/>
-        </w:rPr>
-        <w:t xml:space="preserve">. </w:t>
-      </w:r>
-      <w:proofErr w:type="spellStart"/>
-      <w:r>
-        <w:rPr>
-          <w:sz w:val="28"/>
-          <w:szCs w:val="28"/>
-        </w:rPr>
-        <w:t>Двугорбость</w:t>
-      </w:r>
-      <w:proofErr w:type="spellEnd"/>
-      <w:r>
-        <w:rPr>
-          <w:sz w:val="28"/>
-          <w:szCs w:val="28"/>
-        </w:rPr>
-        <w:t xml:space="preserve"> прослеживается, однако правый пик размыт: его положение можно оценить лишь ориентировочно в диапазоне </w:t>
-      </w:r>
-      <m:oMath>
-        <m:r>
-          <w:rPr>
-            <w:rFonts w:ascii="Cambria Math" w:hAnsi="Cambria Math"/>
-            <w:sz w:val="28"/>
-            <w:szCs w:val="28"/>
-          </w:rPr>
-          <m:t>x ∈ [5; 9]</m:t>
-        </m:r>
-      </m:oMath>
-      <w:r>
-        <w:rPr>
-          <w:sz w:val="28"/>
-          <w:szCs w:val="28"/>
-        </w:rPr>
-        <w:t>. Гистограмма отражает общий характер распределения, но точность оценки параметров по ней невысока.</w:t>
-      </w:r>
-    </w:p>
-    <w:p>
-      <w:pPr>
-        <w:spacing w:line="360" w:lineRule="auto"/>
-        <w:jc w:val="both"/>
-        <w:rPr>
-          <w:sz w:val="28"/>
-          <w:szCs w:val="28"/>
-        </w:rPr>
-      </w:pPr>
+      <w:r>
+        <w:rPr>
+          <w:sz w:val="28"/>
+          <w:szCs w:val="28"/>
+        </w:rPr>
+        <w:t>Рисунок 9 – Гистограмма для полной выборки</w:t>
+      </w:r>
     </w:p>
     <w:p>
       <w:pPr>
@@ -10771,43 +10790,6 @@
           <w:szCs w:val="28"/>
         </w:rPr>
       </w:pPr>
-      <w:proofErr w:type="spellStart"/>
-      <w:r>
-        <w:rPr>
-          <w:b/>
-          <w:bCs/>
-          <w:sz w:val="28"/>
-          <w:szCs w:val="28"/>
-        </w:rPr>
-        <w:t>Подвыборка</w:t>
-      </w:r>
-      <w:proofErr w:type="spellEnd"/>
-      <w:r>
-        <w:rPr>
-          <w:b/>
-          <w:bCs/>
-          <w:sz w:val="28"/>
-          <w:szCs w:val="28"/>
-        </w:rPr>
-        <w:t xml:space="preserve"> из 10 элементов (рисунок 7)</w:t>
-      </w:r>
-      <w:r>
-        <w:rPr>
-          <w:sz w:val="28"/>
-          <w:szCs w:val="28"/>
-        </w:rPr>
-        <w:t>. При столь малом объёме выборки гистограмма носит случайный характер и не позволяет делать обоснованных выводов о форме распределения. Большинство интервалов содержат 0 или 1 элемент, что делает оценку плотности недостоверной.</w:t>
-      </w:r>
-    </w:p>
-    <w:p>
-      <w:pPr>
-        <w:spacing w:line="360" w:lineRule="auto"/>
-        <w:jc w:val="both"/>
-        <w:rPr>
-          <w:sz w:val="28"/>
-          <w:szCs w:val="28"/>
-        </w:rPr>
-      </w:pPr>
     </w:p>
     <w:p>
       <w:pPr>
@@ -10819,38 +10801,6 @@
           <w:szCs w:val="28"/>
         </w:rPr>
       </w:pPr>
-      <w:r>
-        <w:rPr>
-          <w:b/>
-          <w:bCs/>
-          <w:sz w:val="28"/>
-          <w:szCs w:val="28"/>
-        </w:rPr>
-        <w:t>Общий вывод</w:t>
-      </w:r>
-      <w:r>
-        <w:rPr>
-          <w:sz w:val="28"/>
-          <w:szCs w:val="28"/>
-        </w:rPr>
-        <w:t xml:space="preserve">. При увеличении объёма </w:t>
-      </w:r>
-      <w:proofErr w:type="spellStart"/>
-      <w:r>
-        <w:rPr>
-          <w:sz w:val="28"/>
-          <w:szCs w:val="28"/>
-        </w:rPr>
-        <w:t>подвыборки</w:t>
-      </w:r>
-      <w:proofErr w:type="spellEnd"/>
-      <w:r>
-        <w:rPr>
-          <w:sz w:val="28"/>
-          <w:szCs w:val="28"/>
-        </w:rPr>
-        <w:t xml:space="preserve"> гистограмма всё точнее аппроксимирует плотность теоретического двойного гамма-распределения. Двугорбая форма гистограммы полной выборки однозначно указывает на принадлежность данных семейству симметричных двойных распределений. </w:t>
-      </w:r>
     </w:p>
     <w:p>
       <w:pPr>
@@ -10878,6 +10828,92 @@
       <w:pPr>
         <w:spacing w:line="360" w:lineRule="auto"/>
         <w:ind w:firstLine="720"/>
+        <w:jc w:val="both"/>
+        <w:rPr>
+          <w:sz w:val="28"/>
+          <w:szCs w:val="28"/>
+        </w:rPr>
+      </w:pPr>
+    </w:p>
+    <w:p>
+      <w:pPr>
+        <w:spacing w:line="360" w:lineRule="auto"/>
+        <w:ind w:firstLine="720"/>
+        <w:jc w:val="both"/>
+        <w:rPr>
+          <w:sz w:val="28"/>
+          <w:szCs w:val="28"/>
+        </w:rPr>
+      </w:pPr>
+    </w:p>
+    <w:p>
+      <w:pPr>
+        <w:spacing w:line="360" w:lineRule="auto"/>
+        <w:ind w:firstLine="720"/>
+        <w:jc w:val="both"/>
+        <w:rPr>
+          <w:sz w:val="28"/>
+          <w:szCs w:val="28"/>
+        </w:rPr>
+      </w:pPr>
+    </w:p>
+    <w:p>
+      <w:pPr>
+        <w:spacing w:line="360" w:lineRule="auto"/>
+        <w:ind w:firstLine="720"/>
+        <w:jc w:val="both"/>
+        <w:rPr>
+          <w:sz w:val="28"/>
+          <w:szCs w:val="28"/>
+        </w:rPr>
+      </w:pPr>
+    </w:p>
+    <w:p>
+      <w:pPr>
+        <w:spacing w:line="360" w:lineRule="auto"/>
+        <w:ind w:firstLine="720"/>
+        <w:jc w:val="both"/>
+        <w:rPr>
+          <w:sz w:val="28"/>
+          <w:szCs w:val="28"/>
+        </w:rPr>
+      </w:pPr>
+    </w:p>
+    <w:p>
+      <w:pPr>
+        <w:spacing w:line="360" w:lineRule="auto"/>
+        <w:ind w:firstLine="720"/>
+        <w:jc w:val="both"/>
+        <w:rPr>
+          <w:sz w:val="28"/>
+          <w:szCs w:val="28"/>
+        </w:rPr>
+      </w:pPr>
+    </w:p>
+    <w:p>
+      <w:pPr>
+        <w:spacing w:line="360" w:lineRule="auto"/>
+        <w:ind w:firstLine="720"/>
+        <w:jc w:val="both"/>
+        <w:rPr>
+          <w:sz w:val="28"/>
+          <w:szCs w:val="28"/>
+        </w:rPr>
+      </w:pPr>
+    </w:p>
+    <w:p>
+      <w:pPr>
+        <w:spacing w:line="360" w:lineRule="auto"/>
+        <w:jc w:val="both"/>
+        <w:rPr>
+          <w:sz w:val="28"/>
+          <w:szCs w:val="28"/>
+        </w:rPr>
+      </w:pPr>
+    </w:p>
+    <w:p>
+      <w:pPr>
+        <w:spacing w:line="360" w:lineRule="auto"/>
         <w:jc w:val="both"/>
         <w:rPr>
           <w:sz w:val="28"/>
@@ -10923,7 +10959,7 @@
         <w:pStyle w:val="a7"/>
         <w:numPr>
           <w:ilvl w:val="0"/>
-          <w:numId w:val="3"/>
+          <w:numId w:val="15"/>
         </w:numPr>
         <w:spacing w:line="360" w:lineRule="auto"/>
         <w:jc w:val="center"/>
@@ -10950,7 +10986,7 @@
         <w:pStyle w:val="a7"/>
         <w:numPr>
           <w:ilvl w:val="1"/>
-          <w:numId w:val="3"/>
+          <w:numId w:val="17"/>
         </w:numPr>
         <w:rPr>
           <w:b/>
@@ -11707,7 +11743,6 @@
     <w:p>
       <w:pPr>
         <w:spacing w:line="360" w:lineRule="auto"/>
-        <w:ind w:firstLine="360"/>
         <w:jc w:val="both"/>
         <w:rPr>
           <w:sz w:val="28"/>
@@ -11720,9 +11755,8 @@
         <w:pStyle w:val="a7"/>
         <w:numPr>
           <w:ilvl w:val="1"/>
-          <w:numId w:val="3"/>
+          <w:numId w:val="17"/>
         </w:numPr>
-        <w:jc w:val="center"/>
         <w:rPr>
           <w:b/>
           <w:bCs/>
@@ -12563,7 +12597,7 @@
         <w:pStyle w:val="a7"/>
         <w:numPr>
           <w:ilvl w:val="1"/>
-          <w:numId w:val="3"/>
+          <w:numId w:val="17"/>
         </w:numPr>
         <w:rPr>
           <w:b/>
@@ -12612,88 +12646,6 @@
             <wp:extent cx="4275190" cy="2537680"/>
             <wp:effectExtent l="0" t="0" r="0" b="0"/>
             <wp:docPr id="29" name="Рисунок 29"/>
-            <wp:cNvGraphicFramePr>
-              <a:graphicFrameLocks xmlns:a="http://schemas.openxmlformats.org/drawingml/2006/main" noChangeAspect="1"/>
-            </wp:cNvGraphicFramePr>
-            <a:graphic xmlns:a="http://schemas.openxmlformats.org/drawingml/2006/main">
-              <a:graphicData uri="http://schemas.openxmlformats.org/drawingml/2006/picture">
-                <pic:pic xmlns:pic="http://schemas.openxmlformats.org/drawingml/2006/picture">
-                  <pic:nvPicPr>
-                    <pic:cNvPr id="1" name=""/>
-                    <pic:cNvPicPr/>
-                  </pic:nvPicPr>
-                  <pic:blipFill>
-                    <a:blip r:embed="rId24"/>
-                    <a:stretch>
-                      <a:fillRect/>
-                    </a:stretch>
-                  </pic:blipFill>
-                  <pic:spPr>
-                    <a:xfrm>
-                      <a:off x="0" y="0"/>
-                      <a:ext cx="4275190" cy="2537680"/>
-                    </a:xfrm>
-                    <a:prstGeom prst="rect">
-                      <a:avLst/>
-                    </a:prstGeom>
-                  </pic:spPr>
-                </pic:pic>
-              </a:graphicData>
-            </a:graphic>
-          </wp:inline>
-        </w:drawing>
-      </w:r>
-    </w:p>
-    <w:p>
-      <w:pPr>
-        <w:ind w:firstLine="360"/>
-        <w:jc w:val="center"/>
-        <w:rPr>
-          <w:sz w:val="28"/>
-          <w:szCs w:val="28"/>
-        </w:rPr>
-      </w:pPr>
-      <w:r>
-        <w:rPr>
-          <w:sz w:val="28"/>
-          <w:szCs w:val="28"/>
-        </w:rPr>
-        <w:t>Листинг 11. Функция построения теоретической функции распределения</w:t>
-      </w:r>
-    </w:p>
-    <w:p>
-      <w:pPr>
-        <w:spacing w:line="360" w:lineRule="auto"/>
-        <w:rPr>
-          <w:b/>
-          <w:bCs/>
-          <w:sz w:val="28"/>
-          <w:szCs w:val="28"/>
-        </w:rPr>
-      </w:pPr>
-    </w:p>
-    <w:p>
-      <w:pPr>
-        <w:rPr>
-          <w:b/>
-          <w:bCs/>
-          <w:sz w:val="28"/>
-          <w:szCs w:val="28"/>
-        </w:rPr>
-      </w:pPr>
-      <w:r>
-        <w:rPr>
-          <w:b/>
-          <w:bCs/>
-          <w:sz w:val="28"/>
-          <w:szCs w:val="28"/>
-        </w:rPr>
-        <w:lastRenderedPageBreak/>
-        <w:drawing>
-          <wp:inline distT="0" distB="0" distL="0" distR="0" wp14:anchorId="006C963B" wp14:editId="3BD6F111">
-            <wp:extent cx="5940425" cy="4229735"/>
-            <wp:effectExtent l="0" t="0" r="3175" b="0"/>
-            <wp:docPr id="15" name="Рисунок 15"/>
             <wp:cNvGraphicFramePr>
               <a:graphicFrameLocks xmlns:a="http://schemas.openxmlformats.org/drawingml/2006/main" noChangeAspect="1"/>
             </wp:cNvGraphicFramePr>
@@ -12713,7 +12665,7 @@
                   <pic:spPr>
                     <a:xfrm>
                       <a:off x="0" y="0"/>
-                      <a:ext cx="5940425" cy="4229735"/>
+                      <a:ext cx="4275190" cy="2537680"/>
                     </a:xfrm>
                     <a:prstGeom prst="rect">
                       <a:avLst/>
@@ -12728,7 +12680,7 @@
     </w:p>
     <w:p>
       <w:pPr>
-        <w:spacing w:line="360" w:lineRule="auto"/>
+        <w:ind w:firstLine="360"/>
         <w:jc w:val="center"/>
         <w:rPr>
           <w:sz w:val="28"/>
@@ -12740,163 +12692,12 @@
           <w:sz w:val="28"/>
           <w:szCs w:val="28"/>
         </w:rPr>
-        <w:t xml:space="preserve">Рисунок </w:t>
-      </w:r>
-      <w:r>
-        <w:rPr>
-          <w:sz w:val="28"/>
-          <w:szCs w:val="28"/>
-        </w:rPr>
-        <w:t>9</w:t>
-      </w:r>
-      <w:r>
-        <w:rPr>
-          <w:sz w:val="28"/>
-          <w:szCs w:val="28"/>
-        </w:rPr>
-        <w:t>. График теоретических функций распределения со случайно заданными параметрами распределения.</w:t>
-      </w:r>
-    </w:p>
-    <w:p>
-      <w:pPr>
-        <w:spacing w:line="360" w:lineRule="auto"/>
-        <w:rPr>
-          <w:sz w:val="28"/>
-          <w:szCs w:val="28"/>
-        </w:rPr>
-      </w:pPr>
-    </w:p>
-    <w:p>
-      <w:pPr>
-        <w:spacing w:line="360" w:lineRule="auto"/>
-        <w:rPr>
-          <w:sz w:val="28"/>
-          <w:szCs w:val="28"/>
-        </w:rPr>
-      </w:pPr>
-    </w:p>
-    <w:p>
-      <w:pPr>
-        <w:spacing w:line="360" w:lineRule="auto"/>
-        <w:rPr>
-          <w:sz w:val="28"/>
-          <w:szCs w:val="28"/>
-        </w:rPr>
-      </w:pPr>
-    </w:p>
-    <w:p>
-      <w:pPr>
-        <w:spacing w:line="360" w:lineRule="auto"/>
-        <w:rPr>
-          <w:sz w:val="28"/>
-          <w:szCs w:val="28"/>
-        </w:rPr>
-      </w:pPr>
-    </w:p>
-    <w:p>
-      <w:pPr>
-        <w:spacing w:line="360" w:lineRule="auto"/>
-        <w:rPr>
-          <w:sz w:val="28"/>
-          <w:szCs w:val="28"/>
-        </w:rPr>
-      </w:pPr>
-    </w:p>
-    <w:p>
-      <w:pPr>
-        <w:spacing w:line="360" w:lineRule="auto"/>
-        <w:rPr>
-          <w:sz w:val="28"/>
-          <w:szCs w:val="28"/>
-        </w:rPr>
-      </w:pPr>
-    </w:p>
-    <w:p>
-      <w:pPr>
-        <w:spacing w:line="360" w:lineRule="auto"/>
-        <w:rPr>
-          <w:sz w:val="28"/>
-          <w:szCs w:val="28"/>
-        </w:rPr>
-      </w:pPr>
-    </w:p>
-    <w:p>
-      <w:pPr>
-        <w:spacing w:line="360" w:lineRule="auto"/>
-        <w:rPr>
-          <w:sz w:val="28"/>
-          <w:szCs w:val="28"/>
-        </w:rPr>
-      </w:pPr>
-    </w:p>
-    <w:p>
-      <w:pPr>
-        <w:spacing w:line="360" w:lineRule="auto"/>
-        <w:rPr>
-          <w:sz w:val="28"/>
-          <w:szCs w:val="28"/>
-        </w:rPr>
-      </w:pPr>
-    </w:p>
-    <w:p>
-      <w:pPr>
-        <w:spacing w:line="360" w:lineRule="auto"/>
-        <w:rPr>
-          <w:sz w:val="28"/>
-          <w:szCs w:val="28"/>
-        </w:rPr>
-      </w:pPr>
-    </w:p>
-    <w:p>
-      <w:pPr>
-        <w:spacing w:line="360" w:lineRule="auto"/>
-        <w:rPr>
-          <w:sz w:val="28"/>
-          <w:szCs w:val="28"/>
-        </w:rPr>
-      </w:pPr>
-    </w:p>
-    <w:p>
-      <w:pPr>
-        <w:spacing w:line="360" w:lineRule="auto"/>
-        <w:rPr>
-          <w:sz w:val="28"/>
-          <w:szCs w:val="28"/>
-        </w:rPr>
-      </w:pPr>
-    </w:p>
-    <w:p>
-      <w:pPr>
-        <w:spacing w:line="360" w:lineRule="auto"/>
-        <w:rPr>
-          <w:sz w:val="28"/>
-          <w:szCs w:val="28"/>
-        </w:rPr>
-      </w:pPr>
-    </w:p>
-    <w:p>
-      <w:pPr>
-        <w:spacing w:line="360" w:lineRule="auto"/>
-        <w:rPr>
-          <w:sz w:val="28"/>
-          <w:szCs w:val="28"/>
-        </w:rPr>
-      </w:pPr>
-      <w:r>
-        <w:rPr>
-          <w:sz w:val="28"/>
-          <w:szCs w:val="28"/>
-        </w:rPr>
-        <w:tab/>
-      </w:r>
-    </w:p>
-    <w:p>
-      <w:pPr>
-        <w:pStyle w:val="a7"/>
-        <w:numPr>
-          <w:ilvl w:val="1"/>
-          <w:numId w:val="3"/>
-        </w:numPr>
+        <w:t>Листинг 11. Функция построения теоретической функции распределения</w:t>
+      </w:r>
+    </w:p>
+    <w:p>
+      <w:pPr>
+        <w:spacing w:line="360" w:lineRule="auto"/>
         <w:rPr>
           <w:b/>
           <w:bCs/>
@@ -12904,36 +12705,29 @@
           <w:szCs w:val="28"/>
         </w:rPr>
       </w:pPr>
-      <w:r>
+    </w:p>
+    <w:p>
+      <w:pPr>
         <w:rPr>
           <w:b/>
           <w:bCs/>
           <w:sz w:val="28"/>
           <w:szCs w:val="28"/>
         </w:rPr>
+      </w:pPr>
+      <w:r>
+        <w:rPr>
+          <w:b/>
+          <w:bCs/>
+          <w:sz w:val="28"/>
+          <w:szCs w:val="28"/>
+        </w:rPr>
         <w:lastRenderedPageBreak/>
-        <w:t>Оценка влияния параметров распределения на вид графика распределения</w:t>
-      </w:r>
-    </w:p>
-    <w:p>
-      <w:pPr>
-        <w:spacing w:before="100" w:beforeAutospacing="1" w:after="100" w:afterAutospacing="1" w:line="360" w:lineRule="auto"/>
-        <w:jc w:val="center"/>
-        <w:rPr>
-          <w:sz w:val="28"/>
-          <w:szCs w:val="28"/>
-        </w:rPr>
-      </w:pPr>
-      <w:r>
-        <w:rPr>
-          <w:sz w:val="24"/>
-          <w:szCs w:val="24"/>
-        </w:rPr>
         <w:drawing>
-          <wp:inline distT="0" distB="0" distL="0" distR="0" wp14:anchorId="05D84D65" wp14:editId="696D3C9E">
-            <wp:extent cx="5940425" cy="4112895"/>
-            <wp:effectExtent l="0" t="0" r="3175" b="1905"/>
-            <wp:docPr id="16" name="Рисунок 16"/>
+          <wp:inline distT="0" distB="0" distL="0" distR="0" wp14:anchorId="006C963B" wp14:editId="3BD6F111">
+            <wp:extent cx="5940425" cy="4229735"/>
+            <wp:effectExtent l="0" t="0" r="3175" b="0"/>
+            <wp:docPr id="15" name="Рисунок 15"/>
             <wp:cNvGraphicFramePr>
               <a:graphicFrameLocks xmlns:a="http://schemas.openxmlformats.org/drawingml/2006/main" noChangeAspect="1"/>
             </wp:cNvGraphicFramePr>
@@ -12953,7 +12747,7 @@
                   <pic:spPr>
                     <a:xfrm>
                       <a:off x="0" y="0"/>
-                      <a:ext cx="5940425" cy="4112895"/>
+                      <a:ext cx="5940425" cy="4229735"/>
                     </a:xfrm>
                     <a:prstGeom prst="rect">
                       <a:avLst/>
@@ -12965,101 +12759,215 @@
           </wp:inline>
         </w:drawing>
       </w:r>
+    </w:p>
+    <w:p>
+      <w:pPr>
+        <w:spacing w:line="360" w:lineRule="auto"/>
+        <w:jc w:val="center"/>
+        <w:rPr>
+          <w:sz w:val="28"/>
+          <w:szCs w:val="28"/>
+        </w:rPr>
+      </w:pPr>
+      <w:r>
+        <w:rPr>
+          <w:sz w:val="28"/>
+          <w:szCs w:val="28"/>
+        </w:rPr>
+        <w:t xml:space="preserve">Рисунок </w:t>
+      </w:r>
+      <w:r>
+        <w:rPr>
+          <w:sz w:val="28"/>
+          <w:szCs w:val="28"/>
+        </w:rPr>
+        <w:t>9</w:t>
+      </w:r>
+      <w:r>
+        <w:rPr>
+          <w:sz w:val="28"/>
+          <w:szCs w:val="28"/>
+        </w:rPr>
+        <w:t>. График теоретических функций распределения со случайно заданными параметрами распределения.</w:t>
+      </w:r>
+    </w:p>
+    <w:p>
+      <w:pPr>
+        <w:spacing w:line="360" w:lineRule="auto"/>
+        <w:rPr>
+          <w:sz w:val="28"/>
+          <w:szCs w:val="28"/>
+        </w:rPr>
+      </w:pPr>
+    </w:p>
+    <w:p>
+      <w:pPr>
+        <w:spacing w:line="360" w:lineRule="auto"/>
+        <w:rPr>
+          <w:sz w:val="28"/>
+          <w:szCs w:val="28"/>
+        </w:rPr>
+      </w:pPr>
+    </w:p>
+    <w:p>
+      <w:pPr>
+        <w:spacing w:line="360" w:lineRule="auto"/>
+        <w:rPr>
+          <w:sz w:val="28"/>
+          <w:szCs w:val="28"/>
+        </w:rPr>
+      </w:pPr>
+    </w:p>
+    <w:p>
+      <w:pPr>
+        <w:spacing w:line="360" w:lineRule="auto"/>
+        <w:rPr>
+          <w:sz w:val="28"/>
+          <w:szCs w:val="28"/>
+        </w:rPr>
+      </w:pPr>
+    </w:p>
+    <w:p>
+      <w:pPr>
+        <w:spacing w:line="360" w:lineRule="auto"/>
+        <w:rPr>
+          <w:sz w:val="28"/>
+          <w:szCs w:val="28"/>
+        </w:rPr>
+      </w:pPr>
+    </w:p>
+    <w:p>
+      <w:pPr>
+        <w:spacing w:line="360" w:lineRule="auto"/>
+        <w:rPr>
+          <w:sz w:val="28"/>
+          <w:szCs w:val="28"/>
+        </w:rPr>
+      </w:pPr>
+    </w:p>
+    <w:p>
+      <w:pPr>
+        <w:spacing w:line="360" w:lineRule="auto"/>
+        <w:rPr>
+          <w:sz w:val="28"/>
+          <w:szCs w:val="28"/>
+        </w:rPr>
+      </w:pPr>
+    </w:p>
+    <w:p>
+      <w:pPr>
+        <w:spacing w:line="360" w:lineRule="auto"/>
+        <w:rPr>
+          <w:sz w:val="28"/>
+          <w:szCs w:val="28"/>
+        </w:rPr>
+      </w:pPr>
+    </w:p>
+    <w:p>
+      <w:pPr>
+        <w:spacing w:line="360" w:lineRule="auto"/>
+        <w:rPr>
+          <w:sz w:val="28"/>
+          <w:szCs w:val="28"/>
+        </w:rPr>
+      </w:pPr>
+    </w:p>
+    <w:p>
+      <w:pPr>
+        <w:spacing w:line="360" w:lineRule="auto"/>
+        <w:rPr>
+          <w:sz w:val="28"/>
+          <w:szCs w:val="28"/>
+        </w:rPr>
+      </w:pPr>
+    </w:p>
+    <w:p>
+      <w:pPr>
+        <w:spacing w:line="360" w:lineRule="auto"/>
+        <w:rPr>
+          <w:sz w:val="28"/>
+          <w:szCs w:val="28"/>
+        </w:rPr>
+      </w:pPr>
+    </w:p>
+    <w:p>
+      <w:pPr>
+        <w:spacing w:line="360" w:lineRule="auto"/>
+        <w:rPr>
+          <w:sz w:val="28"/>
+          <w:szCs w:val="28"/>
+        </w:rPr>
+      </w:pPr>
+    </w:p>
+    <w:p>
+      <w:pPr>
+        <w:spacing w:line="360" w:lineRule="auto"/>
+        <w:rPr>
+          <w:sz w:val="28"/>
+          <w:szCs w:val="28"/>
+        </w:rPr>
+      </w:pPr>
+    </w:p>
+    <w:p>
+      <w:pPr>
+        <w:spacing w:line="360" w:lineRule="auto"/>
+        <w:rPr>
+          <w:sz w:val="28"/>
+          <w:szCs w:val="28"/>
+        </w:rPr>
+      </w:pPr>
+      <w:r>
+        <w:rPr>
+          <w:sz w:val="28"/>
+          <w:szCs w:val="28"/>
+        </w:rPr>
+        <w:tab/>
+      </w:r>
+    </w:p>
+    <w:p>
+      <w:pPr>
+        <w:pStyle w:val="a7"/>
+        <w:numPr>
+          <w:ilvl w:val="1"/>
+          <w:numId w:val="17"/>
+        </w:numPr>
+        <w:rPr>
+          <w:b/>
+          <w:bCs/>
+          <w:sz w:val="28"/>
+          <w:szCs w:val="28"/>
+        </w:rPr>
+      </w:pPr>
+      <w:r>
+        <w:rPr>
+          <w:b/>
+          <w:bCs/>
+          <w:sz w:val="28"/>
+          <w:szCs w:val="28"/>
+        </w:rPr>
+        <w:lastRenderedPageBreak/>
+        <w:t>Оценка влияния параметров распределения на вид графика распределения</w:t>
+      </w:r>
+    </w:p>
+    <w:p>
+      <w:pPr>
+        <w:spacing w:before="100" w:beforeAutospacing="1" w:after="100" w:afterAutospacing="1" w:line="360" w:lineRule="auto"/>
+        <w:jc w:val="center"/>
+        <w:rPr>
+          <w:sz w:val="28"/>
+          <w:szCs w:val="28"/>
+        </w:rPr>
+      </w:pPr>
       <w:r>
         <w:rPr>
           <w:sz w:val="24"/>
           <w:szCs w:val="24"/>
         </w:rPr>
-        <w:br/>
-      </w:r>
-      <w:r>
-        <w:rPr>
-          <w:sz w:val="28"/>
-          <w:szCs w:val="28"/>
-        </w:rPr>
-        <w:t xml:space="preserve">Рисунок </w:t>
-      </w:r>
-      <w:r>
-        <w:rPr>
-          <w:sz w:val="28"/>
-          <w:szCs w:val="28"/>
-        </w:rPr>
-        <w:t>10</w:t>
-      </w:r>
-      <w:r>
-        <w:rPr>
-          <w:sz w:val="28"/>
-          <w:szCs w:val="28"/>
-        </w:rPr>
-        <w:t>. График теоретических функций распределения с различными параметрами формы.</w:t>
-      </w:r>
-    </w:p>
-    <w:p>
-      <w:pPr>
-        <w:spacing w:before="100" w:beforeAutospacing="1" w:after="100" w:afterAutospacing="1" w:line="360" w:lineRule="auto"/>
-        <w:ind w:firstLine="708"/>
-        <w:rPr>
-          <w:sz w:val="28"/>
-          <w:szCs w:val="28"/>
-        </w:rPr>
-      </w:pPr>
-      <w:r>
-        <w:rPr>
-          <w:sz w:val="28"/>
-          <w:szCs w:val="28"/>
-        </w:rPr>
-        <w:t>Оценка</w:t>
-      </w:r>
-      <w:r>
-        <w:rPr>
-          <w:sz w:val="28"/>
-          <w:szCs w:val="28"/>
-        </w:rPr>
-        <w:t xml:space="preserve">: </w:t>
-      </w:r>
-      <w:r>
-        <w:rPr>
-          <w:sz w:val="28"/>
-          <w:szCs w:val="28"/>
-        </w:rPr>
-        <w:t>при увеличении параметра формы пики расходятся сильнее. высота пиков падает, а также растет разброс</w:t>
-      </w:r>
-      <w:r>
-        <w:rPr>
-          <w:sz w:val="28"/>
-          <w:szCs w:val="28"/>
-        </w:rPr>
-        <w:t>.</w:t>
-      </w:r>
-    </w:p>
-    <w:p>
-      <w:pPr>
-        <w:spacing w:before="100" w:beforeAutospacing="1" w:after="100" w:afterAutospacing="1"/>
-        <w:rPr>
-          <w:sz w:val="28"/>
-          <w:szCs w:val="28"/>
-        </w:rPr>
-      </w:pPr>
-    </w:p>
-    <w:p>
-      <w:pPr>
-        <w:spacing w:before="100" w:beforeAutospacing="1" w:after="100" w:afterAutospacing="1"/>
-        <w:rPr>
-          <w:sz w:val="28"/>
-          <w:szCs w:val="28"/>
-        </w:rPr>
-      </w:pPr>
-      <w:r>
-        <w:rPr>
-          <w:sz w:val="28"/>
-          <w:szCs w:val="28"/>
-        </w:rPr>
-        <w:lastRenderedPageBreak/>
         <w:drawing>
-          <wp:inline distT="0" distB="0" distL="0" distR="0" wp14:anchorId="6937A8A7" wp14:editId="4E1D93C8">
-            <wp:extent cx="5940425" cy="4518025"/>
-            <wp:effectExtent l="0" t="0" r="3175" b="0"/>
-            <wp:docPr id="17" name="Рисунок 17"/>
+          <wp:inline distT="0" distB="0" distL="0" distR="0" wp14:anchorId="05D84D65" wp14:editId="696D3C9E">
+            <wp:extent cx="5940425" cy="4112895"/>
+            <wp:effectExtent l="0" t="0" r="3175" b="1905"/>
+            <wp:docPr id="16" name="Рисунок 16"/>
             <wp:cNvGraphicFramePr>
               <a:graphicFrameLocks xmlns:a="http://schemas.openxmlformats.org/drawingml/2006/main" noChangeAspect="1"/>
             </wp:cNvGraphicFramePr>
@@ -13079,6 +12987,132 @@
                   <pic:spPr>
                     <a:xfrm>
                       <a:off x="0" y="0"/>
+                      <a:ext cx="5940425" cy="4112895"/>
+                    </a:xfrm>
+                    <a:prstGeom prst="rect">
+                      <a:avLst/>
+                    </a:prstGeom>
+                  </pic:spPr>
+                </pic:pic>
+              </a:graphicData>
+            </a:graphic>
+          </wp:inline>
+        </w:drawing>
+      </w:r>
+      <w:r>
+        <w:rPr>
+          <w:sz w:val="24"/>
+          <w:szCs w:val="24"/>
+        </w:rPr>
+        <w:br/>
+      </w:r>
+      <w:r>
+        <w:rPr>
+          <w:sz w:val="28"/>
+          <w:szCs w:val="28"/>
+        </w:rPr>
+        <w:t xml:space="preserve">Рисунок </w:t>
+      </w:r>
+      <w:r>
+        <w:rPr>
+          <w:sz w:val="28"/>
+          <w:szCs w:val="28"/>
+        </w:rPr>
+        <w:t>10</w:t>
+      </w:r>
+      <w:r>
+        <w:rPr>
+          <w:sz w:val="28"/>
+          <w:szCs w:val="28"/>
+        </w:rPr>
+        <w:t>. График теоретических функций распределения с различными параметрами формы.</w:t>
+      </w:r>
+    </w:p>
+    <w:p>
+      <w:pPr>
+        <w:spacing w:before="100" w:beforeAutospacing="1" w:after="100" w:afterAutospacing="1" w:line="360" w:lineRule="auto"/>
+        <w:ind w:firstLine="708"/>
+        <w:rPr>
+          <w:sz w:val="28"/>
+          <w:szCs w:val="28"/>
+        </w:rPr>
+      </w:pPr>
+      <w:r>
+        <w:rPr>
+          <w:sz w:val="28"/>
+          <w:szCs w:val="28"/>
+        </w:rPr>
+        <w:t>Оценка</w:t>
+      </w:r>
+      <w:r>
+        <w:rPr>
+          <w:sz w:val="28"/>
+          <w:szCs w:val="28"/>
+        </w:rPr>
+        <w:t xml:space="preserve">: </w:t>
+      </w:r>
+      <w:r>
+        <w:rPr>
+          <w:sz w:val="28"/>
+          <w:szCs w:val="28"/>
+        </w:rPr>
+        <w:t>при увеличении параметра формы пики расходятся сильнее. высота пиков падает, а также растет разброс</w:t>
+      </w:r>
+      <w:r>
+        <w:rPr>
+          <w:sz w:val="28"/>
+          <w:szCs w:val="28"/>
+        </w:rPr>
+        <w:t>.</w:t>
+      </w:r>
+    </w:p>
+    <w:p>
+      <w:pPr>
+        <w:spacing w:before="100" w:beforeAutospacing="1" w:after="100" w:afterAutospacing="1"/>
+        <w:rPr>
+          <w:sz w:val="28"/>
+          <w:szCs w:val="28"/>
+        </w:rPr>
+      </w:pPr>
+    </w:p>
+    <w:p>
+      <w:pPr>
+        <w:spacing w:before="100" w:beforeAutospacing="1" w:after="100" w:afterAutospacing="1"/>
+        <w:rPr>
+          <w:sz w:val="28"/>
+          <w:szCs w:val="28"/>
+        </w:rPr>
+      </w:pPr>
+      <w:r>
+        <w:rPr>
+          <w:sz w:val="28"/>
+          <w:szCs w:val="28"/>
+        </w:rPr>
+        <w:lastRenderedPageBreak/>
+        <w:drawing>
+          <wp:inline distT="0" distB="0" distL="0" distR="0" wp14:anchorId="6937A8A7" wp14:editId="4E1D93C8">
+            <wp:extent cx="5940425" cy="4518025"/>
+            <wp:effectExtent l="0" t="0" r="3175" b="0"/>
+            <wp:docPr id="17" name="Рисунок 17"/>
+            <wp:cNvGraphicFramePr>
+              <a:graphicFrameLocks xmlns:a="http://schemas.openxmlformats.org/drawingml/2006/main" noChangeAspect="1"/>
+            </wp:cNvGraphicFramePr>
+            <a:graphic xmlns:a="http://schemas.openxmlformats.org/drawingml/2006/main">
+              <a:graphicData uri="http://schemas.openxmlformats.org/drawingml/2006/picture">
+                <pic:pic xmlns:pic="http://schemas.openxmlformats.org/drawingml/2006/picture">
+                  <pic:nvPicPr>
+                    <pic:cNvPr id="1" name=""/>
+                    <pic:cNvPicPr/>
+                  </pic:nvPicPr>
+                  <pic:blipFill>
+                    <a:blip r:embed="rId28"/>
+                    <a:stretch>
+                      <a:fillRect/>
+                    </a:stretch>
+                  </pic:blipFill>
+                  <pic:spPr>
+                    <a:xfrm>
+                      <a:off x="0" y="0"/>
                       <a:ext cx="5940425" cy="4518025"/>
                     </a:xfrm>
                     <a:prstGeom prst="rect">
@@ -13226,7 +13260,7 @@
         <w:pStyle w:val="a7"/>
         <w:numPr>
           <w:ilvl w:val="0"/>
-          <w:numId w:val="3"/>
+          <w:numId w:val="17"/>
         </w:numPr>
         <w:spacing w:before="100" w:beforeAutospacing="1" w:after="100" w:afterAutospacing="1" w:line="360" w:lineRule="auto"/>
         <w:jc w:val="center"/>
@@ -13270,7 +13304,7 @@
         <w:pStyle w:val="a7"/>
         <w:numPr>
           <w:ilvl w:val="1"/>
-          <w:numId w:val="3"/>
+          <w:numId w:val="17"/>
         </w:numPr>
         <w:spacing w:before="100" w:beforeAutospacing="1" w:after="100" w:afterAutospacing="1" w:line="360" w:lineRule="auto"/>
         <w:rPr>
@@ -13654,7 +13688,7 @@
                     <pic:cNvPicPr/>
                   </pic:nvPicPr>
                   <pic:blipFill>
-                    <a:blip r:embed="rId28"/>
+                    <a:blip r:embed="rId29"/>
                     <a:stretch>
                       <a:fillRect/>
                     </a:stretch>
@@ -13698,7 +13732,7 @@
         <w:pStyle w:val="a7"/>
         <w:numPr>
           <w:ilvl w:val="1"/>
-          <w:numId w:val="3"/>
+          <w:numId w:val="17"/>
         </w:numPr>
         <w:spacing w:before="100" w:beforeAutospacing="1" w:after="100" w:afterAutospacing="1" w:line="360" w:lineRule="auto"/>
         <w:jc w:val="both"/>
@@ -14120,78 +14154,6 @@
             <wp:extent cx="4778154" cy="1767993"/>
             <wp:effectExtent l="0" t="0" r="3810" b="3810"/>
             <wp:docPr id="31" name="Рисунок 31"/>
-            <wp:cNvGraphicFramePr>
-              <a:graphicFrameLocks xmlns:a="http://schemas.openxmlformats.org/drawingml/2006/main" noChangeAspect="1"/>
-            </wp:cNvGraphicFramePr>
-            <a:graphic xmlns:a="http://schemas.openxmlformats.org/drawingml/2006/main">
-              <a:graphicData uri="http://schemas.openxmlformats.org/drawingml/2006/picture">
-                <pic:pic xmlns:pic="http://schemas.openxmlformats.org/drawingml/2006/picture">
-                  <pic:nvPicPr>
-                    <pic:cNvPr id="1" name=""/>
-                    <pic:cNvPicPr/>
-                  </pic:nvPicPr>
-                  <pic:blipFill>
-                    <a:blip r:embed="rId29"/>
-                    <a:stretch>
-                      <a:fillRect/>
-                    </a:stretch>
-                  </pic:blipFill>
-                  <pic:spPr>
-                    <a:xfrm>
-                      <a:off x="0" y="0"/>
-                      <a:ext cx="4778154" cy="1767993"/>
-                    </a:xfrm>
-                    <a:prstGeom prst="rect">
-                      <a:avLst/>
-                    </a:prstGeom>
-                  </pic:spPr>
-                </pic:pic>
-              </a:graphicData>
-            </a:graphic>
-          </wp:inline>
-        </w:drawing>
-      </w:r>
-    </w:p>
-    <w:p>
-      <w:pPr>
-        <w:pStyle w:val="a7"/>
-        <w:spacing w:line="360" w:lineRule="auto"/>
-        <w:ind w:left="782" w:firstLine="709"/>
-        <w:jc w:val="center"/>
-        <w:rPr>
-          <w:sz w:val="28"/>
-          <w:szCs w:val="28"/>
-        </w:rPr>
-      </w:pPr>
-      <w:r>
-        <w:rPr>
-          <w:sz w:val="28"/>
-          <w:szCs w:val="28"/>
-        </w:rPr>
-        <w:t>Листинг 13. Код для оценки параметров с помощью ММП</w:t>
-      </w:r>
-    </w:p>
-    <w:p>
-      <w:pPr>
-        <w:pStyle w:val="a7"/>
-        <w:spacing w:line="360" w:lineRule="auto"/>
-        <w:ind w:left="782" w:firstLine="709"/>
-        <w:jc w:val="center"/>
-        <w:rPr>
-          <w:sz w:val="28"/>
-          <w:szCs w:val="28"/>
-        </w:rPr>
-      </w:pPr>
-      <w:r>
-        <w:rPr>
-          <w:sz w:val="28"/>
-          <w:szCs w:val="28"/>
-        </w:rPr>
-        <w:drawing>
-          <wp:inline distT="0" distB="0" distL="0" distR="0" wp14:anchorId="2847C269" wp14:editId="6F27A15F">
-            <wp:extent cx="4767921" cy="2507673"/>
-            <wp:effectExtent l="0" t="0" r="0" b="6985"/>
-            <wp:docPr id="33" name="Рисунок 33"/>
             <wp:cNvGraphicFramePr>
               <a:graphicFrameLocks xmlns:a="http://schemas.openxmlformats.org/drawingml/2006/main" noChangeAspect="1"/>
             </wp:cNvGraphicFramePr>
@@ -14211,7 +14173,7 @@
                   <pic:spPr>
                     <a:xfrm>
                       <a:off x="0" y="0"/>
-                      <a:ext cx="4774333" cy="2511046"/>
+                      <a:ext cx="4778154" cy="1767993"/>
                     </a:xfrm>
                     <a:prstGeom prst="rect">
                       <a:avLst/>
@@ -14240,7 +14202,7 @@
           <w:sz w:val="28"/>
           <w:szCs w:val="28"/>
         </w:rPr>
-        <w:t>Листинг 14. Код для оценки параметров с помощью ММП</w:t>
+        <w:t>Листинг 13. Код для оценки параметров с помощью ММП</w:t>
       </w:r>
     </w:p>
     <w:p>
@@ -14260,10 +14222,10 @@
           <w:szCs w:val="28"/>
         </w:rPr>
         <w:drawing>
-          <wp:inline distT="0" distB="0" distL="0" distR="0" wp14:anchorId="1C3A720A" wp14:editId="5FEF218E">
-            <wp:extent cx="5118946" cy="1774671"/>
-            <wp:effectExtent l="0" t="0" r="5715" b="0"/>
-            <wp:docPr id="35" name="Рисунок 35"/>
+          <wp:inline distT="0" distB="0" distL="0" distR="0" wp14:anchorId="2847C269" wp14:editId="6F27A15F">
+            <wp:extent cx="4767921" cy="2507673"/>
+            <wp:effectExtent l="0" t="0" r="0" b="6985"/>
+            <wp:docPr id="33" name="Рисунок 33"/>
             <wp:cNvGraphicFramePr>
               <a:graphicFrameLocks xmlns:a="http://schemas.openxmlformats.org/drawingml/2006/main" noChangeAspect="1"/>
             </wp:cNvGraphicFramePr>
@@ -14283,6 +14245,78 @@
                   <pic:spPr>
                     <a:xfrm>
                       <a:off x="0" y="0"/>
+                      <a:ext cx="4774333" cy="2511046"/>
+                    </a:xfrm>
+                    <a:prstGeom prst="rect">
+                      <a:avLst/>
+                    </a:prstGeom>
+                  </pic:spPr>
+                </pic:pic>
+              </a:graphicData>
+            </a:graphic>
+          </wp:inline>
+        </w:drawing>
+      </w:r>
+    </w:p>
+    <w:p>
+      <w:pPr>
+        <w:pStyle w:val="a7"/>
+        <w:spacing w:line="360" w:lineRule="auto"/>
+        <w:ind w:left="782" w:firstLine="709"/>
+        <w:jc w:val="center"/>
+        <w:rPr>
+          <w:sz w:val="28"/>
+          <w:szCs w:val="28"/>
+        </w:rPr>
+      </w:pPr>
+      <w:r>
+        <w:rPr>
+          <w:sz w:val="28"/>
+          <w:szCs w:val="28"/>
+        </w:rPr>
+        <w:t>Листинг 14. Код для оценки параметров с помощью ММП</w:t>
+      </w:r>
+    </w:p>
+    <w:p>
+      <w:pPr>
+        <w:pStyle w:val="a7"/>
+        <w:spacing w:line="360" w:lineRule="auto"/>
+        <w:ind w:left="782" w:firstLine="709"/>
+        <w:jc w:val="center"/>
+        <w:rPr>
+          <w:sz w:val="28"/>
+          <w:szCs w:val="28"/>
+        </w:rPr>
+      </w:pPr>
+      <w:r>
+        <w:rPr>
+          <w:sz w:val="28"/>
+          <w:szCs w:val="28"/>
+        </w:rPr>
+        <w:drawing>
+          <wp:inline distT="0" distB="0" distL="0" distR="0" wp14:anchorId="1C3A720A" wp14:editId="5FEF218E">
+            <wp:extent cx="5118946" cy="1774671"/>
+            <wp:effectExtent l="0" t="0" r="5715" b="0"/>
+            <wp:docPr id="35" name="Рисунок 35"/>
+            <wp:cNvGraphicFramePr>
+              <a:graphicFrameLocks xmlns:a="http://schemas.openxmlformats.org/drawingml/2006/main" noChangeAspect="1"/>
+            </wp:cNvGraphicFramePr>
+            <a:graphic xmlns:a="http://schemas.openxmlformats.org/drawingml/2006/main">
+              <a:graphicData uri="http://schemas.openxmlformats.org/drawingml/2006/picture">
+                <pic:pic xmlns:pic="http://schemas.openxmlformats.org/drawingml/2006/picture">
+                  <pic:nvPicPr>
+                    <pic:cNvPr id="1" name=""/>
+                    <pic:cNvPicPr/>
+                  </pic:nvPicPr>
+                  <pic:blipFill>
+                    <a:blip r:embed="rId32"/>
+                    <a:stretch>
+                      <a:fillRect/>
+                    </a:stretch>
+                  </pic:blipFill>
+                  <pic:spPr>
+                    <a:xfrm>
+                      <a:off x="0" y="0"/>
                       <a:ext cx="5231608" cy="1813730"/>
                     </a:xfrm>
                     <a:prstGeom prst="rect">
@@ -14427,7 +14461,7 @@
         <w:pStyle w:val="a7"/>
         <w:numPr>
           <w:ilvl w:val="1"/>
-          <w:numId w:val="3"/>
+          <w:numId w:val="17"/>
         </w:numPr>
         <w:spacing w:line="360" w:lineRule="auto"/>
         <w:jc w:val="both"/>
@@ -14772,7 +14806,7 @@
         </w:rPr>
         <w:t xml:space="preserve">: </w:t>
       </w:r>
-      <w:hyperlink r:id="rId32" w:history="1">
+      <w:hyperlink r:id="rId33" w:history="1">
         <w:r>
           <w:rPr>
             <w:rStyle w:val="ac"/>
@@ -15078,7 +15112,7 @@
         </w:rPr>
         <w:t xml:space="preserve"> </w:t>
       </w:r>
-      <w:hyperlink r:id="rId33" w:history="1">
+      <w:hyperlink r:id="rId34" w:history="1">
         <w:r>
           <w:rPr>
             <w:rStyle w:val="ac"/>
@@ -15504,6 +15538,125 @@
     </w:lvl>
   </w:abstractNum>
   <w:abstractNum w:abstractNumId="3" w15:restartNumberingAfterBreak="0">
+    <w:nsid w:val="15DE0EAB"/>
+    <w:multiLevelType w:val="multilevel"/>
+    <w:tmpl w:val="C0561E02"/>
+    <w:lvl w:ilvl="0">
+      <w:start w:val="5"/>
+      <w:numFmt w:val="decimal"/>
+      <w:lvlText w:val="%1."/>
+      <w:lvlJc w:val="left"/>
+      <w:pPr>
+        <w:ind w:left="648" w:hanging="648"/>
+      </w:pPr>
+      <w:rPr>
+        <w:rFonts w:hint="default"/>
+      </w:rPr>
+    </w:lvl>
+    <w:lvl w:ilvl="1">
+      <w:start w:val="1"/>
+      <w:numFmt w:val="decimal"/>
+      <w:lvlText w:val="%1.%2."/>
+      <w:lvlJc w:val="left"/>
+      <w:pPr>
+        <w:ind w:left="1080" w:hanging="720"/>
+      </w:pPr>
+      <w:rPr>
+        <w:rFonts w:ascii="Times New Roman" w:hAnsi="Times New Roman" w:cs="Times New Roman" w:hint="default"/>
+        <w:b/>
+        <w:bCs/>
+        <w:i w:val="0"/>
+        <w:iCs/>
+        <w:sz w:val="28"/>
+        <w:szCs w:val="28"/>
+      </w:rPr>
+    </w:lvl>
+    <w:lvl w:ilvl="2">
+      <w:start w:val="1"/>
+      <w:numFmt w:val="decimal"/>
+      <w:lvlText w:val="%1.%2.%3."/>
+      <w:lvlJc w:val="left"/>
+      <w:pPr>
+        <w:ind w:left="1440" w:hanging="720"/>
+      </w:pPr>
+      <w:rPr>
+        <w:rFonts w:hint="default"/>
+      </w:rPr>
+    </w:lvl>
+    <w:lvl w:ilvl="3">
+      <w:start w:val="1"/>
+      <w:numFmt w:val="decimal"/>
+      <w:lvlText w:val="%1.%2.%3.%4."/>
+      <w:lvlJc w:val="left"/>
+      <w:pPr>
+        <w:ind w:left="2160" w:hanging="1080"/>
+      </w:pPr>
+      <w:rPr>
+        <w:rFonts w:hint="default"/>
+      </w:rPr>
+    </w:lvl>
+    <w:lvl w:ilvl="4">
+      <w:start w:val="1"/>
+      <w:numFmt w:val="decimal"/>
+      <w:lvlText w:val="%1.%2.%3.%4.%5."/>
+      <w:lvlJc w:val="left"/>
+      <w:pPr>
+        <w:ind w:left="2520" w:hanging="1080"/>
+      </w:pPr>
+      <w:rPr>
+        <w:rFonts w:hint="default"/>
+      </w:rPr>
+    </w:lvl>
+    <w:lvl w:ilvl="5">
+      <w:start w:val="1"/>
+      <w:numFmt w:val="decimal"/>
+      <w:lvlText w:val="%1.%2.%3.%4.%5.%6."/>
+      <w:lvlJc w:val="left"/>
+      <w:pPr>
+        <w:ind w:left="3240" w:hanging="1440"/>
+      </w:pPr>
+      <w:rPr>
+        <w:rFonts w:hint="default"/>
+      </w:rPr>
+    </w:lvl>
+    <w:lvl w:ilvl="6">
+      <w:start w:val="1"/>
+      <w:numFmt w:val="decimal"/>
+      <w:lvlText w:val="%1.%2.%3.%4.%5.%6.%7."/>
+      <w:lvlJc w:val="left"/>
+      <w:pPr>
+        <w:ind w:left="3960" w:hanging="1800"/>
+      </w:pPr>
+      <w:rPr>
+        <w:rFonts w:hint="default"/>
+      </w:rPr>
+    </w:lvl>
+    <w:lvl w:ilvl="7">
+      <w:start w:val="1"/>
+      <w:numFmt w:val="decimal"/>
+      <w:lvlText w:val="%1.%2.%3.%4.%5.%6.%7.%8."/>
+      <w:lvlJc w:val="left"/>
+      <w:pPr>
+        <w:ind w:left="4320" w:hanging="1800"/>
+      </w:pPr>
+      <w:rPr>
+        <w:rFonts w:hint="default"/>
+      </w:rPr>
+    </w:lvl>
+    <w:lvl w:ilvl="8">
+      <w:start w:val="1"/>
+      <w:numFmt w:val="decimal"/>
+      <w:lvlText w:val="%1.%2.%3.%4.%5.%6.%7.%8.%9."/>
+      <w:lvlJc w:val="left"/>
+      <w:pPr>
+        <w:ind w:left="5040" w:hanging="2160"/>
+      </w:pPr>
+      <w:rPr>
+        <w:rFonts w:hint="default"/>
+      </w:rPr>
+    </w:lvl>
+  </w:abstractNum>
+  <w:abstractNum w:abstractNumId="4" w15:restartNumberingAfterBreak="0">
     <w:nsid w:val="20760212"/>
     <w:multiLevelType w:val="hybridMultilevel"/>
     <w:tmpl w:val="46A21DE2"/>
@@ -15592,7 +15745,7 @@
       </w:pPr>
     </w:lvl>
   </w:abstractNum>
-  <w:abstractNum w:abstractNumId="4" w15:restartNumberingAfterBreak="0">
+  <w:abstractNum w:abstractNumId="5" w15:restartNumberingAfterBreak="0">
     <w:nsid w:val="25130CBC"/>
     <w:multiLevelType w:val="hybridMultilevel"/>
     <w:tmpl w:val="892E0C60"/>
@@ -15705,7 +15858,7 @@
       </w:rPr>
     </w:lvl>
   </w:abstractNum>
-  <w:abstractNum w:abstractNumId="5" w15:restartNumberingAfterBreak="0">
+  <w:abstractNum w:abstractNumId="6" w15:restartNumberingAfterBreak="0">
     <w:nsid w:val="27406A6D"/>
     <w:multiLevelType w:val="multilevel"/>
     <w:tmpl w:val="E062D2CE"/>
@@ -15834,7 +15987,7 @@
       </w:rPr>
     </w:lvl>
   </w:abstractNum>
-  <w:abstractNum w:abstractNumId="6" w15:restartNumberingAfterBreak="0">
+  <w:abstractNum w:abstractNumId="7" w15:restartNumberingAfterBreak="0">
     <w:nsid w:val="27AA62F0"/>
     <w:multiLevelType w:val="multilevel"/>
     <w:tmpl w:val="E062D2CE"/>
@@ -15963,7 +16116,120 @@
       </w:rPr>
     </w:lvl>
   </w:abstractNum>
-  <w:abstractNum w:abstractNumId="7" w15:restartNumberingAfterBreak="0">
+  <w:abstractNum w:abstractNumId="8" w15:restartNumberingAfterBreak="0">
+    <w:nsid w:val="28C53D88"/>
+    <w:multiLevelType w:val="multilevel"/>
+    <w:tmpl w:val="8F62495E"/>
+    <w:lvl w:ilvl="0">
+      <w:start w:val="4"/>
+      <w:numFmt w:val="decimal"/>
+      <w:lvlText w:val="%1."/>
+      <w:lvlJc w:val="left"/>
+      <w:pPr>
+        <w:ind w:left="648" w:hanging="648"/>
+      </w:pPr>
+      <w:rPr>
+        <w:rFonts w:hint="default"/>
+      </w:rPr>
+    </w:lvl>
+    <w:lvl w:ilvl="1">
+      <w:start w:val="4"/>
+      <w:numFmt w:val="decimal"/>
+      <w:lvlText w:val="%1.%2."/>
+      <w:lvlJc w:val="left"/>
+      <w:pPr>
+        <w:ind w:left="1080" w:hanging="720"/>
+      </w:pPr>
+      <w:rPr>
+        <w:rFonts w:hint="default"/>
+      </w:rPr>
+    </w:lvl>
+    <w:lvl w:ilvl="2">
+      <w:start w:val="1"/>
+      <w:numFmt w:val="decimal"/>
+      <w:lvlText w:val="%1.%2.%3."/>
+      <w:lvlJc w:val="left"/>
+      <w:pPr>
+        <w:ind w:left="1570" w:hanging="720"/>
+      </w:pPr>
+      <w:rPr>
+        <w:rFonts w:hint="default"/>
+      </w:rPr>
+    </w:lvl>
+    <w:lvl w:ilvl="3">
+      <w:start w:val="1"/>
+      <w:numFmt w:val="decimal"/>
+      <w:lvlText w:val="%1.%2.%3.%4."/>
+      <w:lvlJc w:val="left"/>
+      <w:pPr>
+        <w:ind w:left="2160" w:hanging="1080"/>
+      </w:pPr>
+      <w:rPr>
+        <w:rFonts w:hint="default"/>
+      </w:rPr>
+    </w:lvl>
+    <w:lvl w:ilvl="4">
+      <w:start w:val="1"/>
+      <w:numFmt w:val="decimal"/>
+      <w:lvlText w:val="%1.%2.%3.%4.%5."/>
+      <w:lvlJc w:val="left"/>
+      <w:pPr>
+        <w:ind w:left="2520" w:hanging="1080"/>
+      </w:pPr>
+      <w:rPr>
+        <w:rFonts w:hint="default"/>
+      </w:rPr>
+    </w:lvl>
+    <w:lvl w:ilvl="5">
+      <w:start w:val="1"/>
+      <w:numFmt w:val="decimal"/>
+      <w:lvlText w:val="%1.%2.%3.%4.%5.%6."/>
+      <w:lvlJc w:val="left"/>
+      <w:pPr>
+        <w:ind w:left="3240" w:hanging="1440"/>
+      </w:pPr>
+      <w:rPr>
+        <w:rFonts w:hint="default"/>
+      </w:rPr>
+    </w:lvl>
+    <w:lvl w:ilvl="6">
+      <w:start w:val="1"/>
+      <w:numFmt w:val="decimal"/>
+      <w:lvlText w:val="%1.%2.%3.%4.%5.%6.%7."/>
+      <w:lvlJc w:val="left"/>
+      <w:pPr>
+        <w:ind w:left="3960" w:hanging="1800"/>
+      </w:pPr>
+      <w:rPr>
+        <w:rFonts w:hint="default"/>
+      </w:rPr>
+    </w:lvl>
+    <w:lvl w:ilvl="7">
+      <w:start w:val="1"/>
+      <w:numFmt w:val="decimal"/>
+      <w:lvlText w:val="%1.%2.%3.%4.%5.%6.%7.%8."/>
+      <w:lvlJc w:val="left"/>
+      <w:pPr>
+        <w:ind w:left="4320" w:hanging="1800"/>
+      </w:pPr>
+      <w:rPr>
+        <w:rFonts w:hint="default"/>
+      </w:rPr>
+    </w:lvl>
+    <w:lvl w:ilvl="8">
+      <w:start w:val="1"/>
+      <w:numFmt w:val="decimal"/>
+      <w:lvlText w:val="%1.%2.%3.%4.%5.%6.%7.%8.%9."/>
+      <w:lvlJc w:val="left"/>
+      <w:pPr>
+        <w:ind w:left="5040" w:hanging="2160"/>
+      </w:pPr>
+      <w:rPr>
+        <w:rFonts w:hint="default"/>
+      </w:rPr>
+    </w:lvl>
+  </w:abstractNum>
+  <w:abstractNum w:abstractNumId="9" w15:restartNumberingAfterBreak="0">
     <w:nsid w:val="29001FDF"/>
     <w:multiLevelType w:val="multilevel"/>
     <w:tmpl w:val="C47EA3DC"/>
@@ -16112,7 +16378,7 @@
       </w:rPr>
     </w:lvl>
   </w:abstractNum>
-  <w:abstractNum w:abstractNumId="8" w15:restartNumberingAfterBreak="0">
+  <w:abstractNum w:abstractNumId="10" w15:restartNumberingAfterBreak="0">
     <w:nsid w:val="42B83D0D"/>
     <w:multiLevelType w:val="multilevel"/>
     <w:tmpl w:val="B858AC80"/>
@@ -16234,7 +16500,7 @@
       </w:rPr>
     </w:lvl>
   </w:abstractNum>
-  <w:abstractNum w:abstractNumId="9" w15:restartNumberingAfterBreak="0">
+  <w:abstractNum w:abstractNumId="11" w15:restartNumberingAfterBreak="0">
     <w:nsid w:val="447579D3"/>
     <w:multiLevelType w:val="multilevel"/>
     <w:tmpl w:val="896A5380"/>
@@ -16368,7 +16634,7 @@
       </w:rPr>
     </w:lvl>
   </w:abstractNum>
-  <w:abstractNum w:abstractNumId="10" w15:restartNumberingAfterBreak="0">
+  <w:abstractNum w:abstractNumId="12" w15:restartNumberingAfterBreak="0">
     <w:nsid w:val="4F5A6620"/>
     <w:multiLevelType w:val="hybridMultilevel"/>
     <w:tmpl w:val="59BCE0F2"/>
@@ -16457,7 +16723,7 @@
       </w:pPr>
     </w:lvl>
   </w:abstractNum>
-  <w:abstractNum w:abstractNumId="11" w15:restartNumberingAfterBreak="0">
+  <w:abstractNum w:abstractNumId="13" w15:restartNumberingAfterBreak="0">
     <w:nsid w:val="591A7815"/>
     <w:multiLevelType w:val="hybridMultilevel"/>
     <w:tmpl w:val="FC7A57BA"/>
@@ -16546,7 +16812,120 @@
       </w:pPr>
     </w:lvl>
   </w:abstractNum>
-  <w:abstractNum w:abstractNumId="12" w15:restartNumberingAfterBreak="0">
+  <w:abstractNum w:abstractNumId="14" w15:restartNumberingAfterBreak="0">
+    <w:nsid w:val="5FF5131B"/>
+    <w:multiLevelType w:val="multilevel"/>
+    <w:tmpl w:val="C3BC83A4"/>
+    <w:lvl w:ilvl="0">
+      <w:start w:val="5"/>
+      <w:numFmt w:val="decimal"/>
+      <w:lvlText w:val="%1."/>
+      <w:lvlJc w:val="left"/>
+      <w:pPr>
+        <w:ind w:left="648" w:hanging="648"/>
+      </w:pPr>
+      <w:rPr>
+        <w:rFonts w:hint="default"/>
+      </w:rPr>
+    </w:lvl>
+    <w:lvl w:ilvl="1">
+      <w:start w:val="4"/>
+      <w:numFmt w:val="decimal"/>
+      <w:lvlText w:val="%1.%2."/>
+      <w:lvlJc w:val="left"/>
+      <w:pPr>
+        <w:ind w:left="1080" w:hanging="720"/>
+      </w:pPr>
+      <w:rPr>
+        <w:rFonts w:hint="default"/>
+      </w:rPr>
+    </w:lvl>
+    <w:lvl w:ilvl="2">
+      <w:start w:val="1"/>
+      <w:numFmt w:val="decimal"/>
+      <w:lvlText w:val="%1.%2.%3."/>
+      <w:lvlJc w:val="left"/>
+      <w:pPr>
+        <w:ind w:left="1440" w:hanging="720"/>
+      </w:pPr>
+      <w:rPr>
+        <w:rFonts w:hint="default"/>
+      </w:rPr>
+    </w:lvl>
+    <w:lvl w:ilvl="3">
+      <w:start w:val="1"/>
+      <w:numFmt w:val="decimal"/>
+      <w:lvlText w:val="%1.%2.%3.%4."/>
+      <w:lvlJc w:val="left"/>
+      <w:pPr>
+        <w:ind w:left="2160" w:hanging="1080"/>
+      </w:pPr>
+      <w:rPr>
+        <w:rFonts w:hint="default"/>
+      </w:rPr>
+    </w:lvl>
+    <w:lvl w:ilvl="4">
+      <w:start w:val="1"/>
+      <w:numFmt w:val="decimal"/>
+      <w:lvlText w:val="%1.%2.%3.%4.%5."/>
+      <w:lvlJc w:val="left"/>
+      <w:pPr>
+        <w:ind w:left="2520" w:hanging="1080"/>
+      </w:pPr>
+      <w:rPr>
+        <w:rFonts w:hint="default"/>
+      </w:rPr>
+    </w:lvl>
+    <w:lvl w:ilvl="5">
+      <w:start w:val="1"/>
+      <w:numFmt w:val="decimal"/>
+      <w:lvlText w:val="%1.%2.%3.%4.%5.%6."/>
+      <w:lvlJc w:val="left"/>
+      <w:pPr>
+        <w:ind w:left="3240" w:hanging="1440"/>
+      </w:pPr>
+      <w:rPr>
+        <w:rFonts w:hint="default"/>
+      </w:rPr>
+    </w:lvl>
+    <w:lvl w:ilvl="6">
+      <w:start w:val="1"/>
+      <w:numFmt w:val="decimal"/>
+      <w:lvlText w:val="%1.%2.%3.%4.%5.%6.%7."/>
+      <w:lvlJc w:val="left"/>
+      <w:pPr>
+        <w:ind w:left="3960" w:hanging="1800"/>
+      </w:pPr>
+      <w:rPr>
+        <w:rFonts w:hint="default"/>
+      </w:rPr>
+    </w:lvl>
+    <w:lvl w:ilvl="7">
+      <w:start w:val="1"/>
+      <w:numFmt w:val="decimal"/>
+      <w:lvlText w:val="%1.%2.%3.%4.%5.%6.%7.%8."/>
+      <w:lvlJc w:val="left"/>
+      <w:pPr>
+        <w:ind w:left="4320" w:hanging="1800"/>
+      </w:pPr>
+      <w:rPr>
+        <w:rFonts w:hint="default"/>
+      </w:rPr>
+    </w:lvl>
+    <w:lvl w:ilvl="8">
+      <w:start w:val="1"/>
+      <w:numFmt w:val="decimal"/>
+      <w:lvlText w:val="%1.%2.%3.%4.%5.%6.%7.%8.%9."/>
+      <w:lvlJc w:val="left"/>
+      <w:pPr>
+        <w:ind w:left="5040" w:hanging="2160"/>
+      </w:pPr>
+      <w:rPr>
+        <w:rFonts w:hint="default"/>
+      </w:rPr>
+    </w:lvl>
+  </w:abstractNum>
+  <w:abstractNum w:abstractNumId="15" w15:restartNumberingAfterBreak="0">
     <w:nsid w:val="6D2D1443"/>
     <w:multiLevelType w:val="multilevel"/>
     <w:tmpl w:val="2424FC36"/>
@@ -16696,43 +17075,82 @@
     </w:lvl>
   </w:abstractNum>
   <w:num w:numId="1" w16cid:durableId="765272132">
-    <w:abstractNumId w:val="11"/>
+    <w:abstractNumId w:val="13"/>
   </w:num>
   <w:num w:numId="2" w16cid:durableId="1280603550">
     <w:abstractNumId w:val="2"/>
   </w:num>
   <w:num w:numId="3" w16cid:durableId="435517487">
-    <w:abstractNumId w:val="9"/>
+    <w:abstractNumId w:val="11"/>
   </w:num>
   <w:num w:numId="4" w16cid:durableId="718240523">
-    <w:abstractNumId w:val="3"/>
+    <w:abstractNumId w:val="4"/>
   </w:num>
   <w:num w:numId="5" w16cid:durableId="395593643">
     <w:abstractNumId w:val="1"/>
   </w:num>
   <w:num w:numId="6" w16cid:durableId="2027636951">
+    <w:abstractNumId w:val="12"/>
+  </w:num>
+  <w:num w:numId="7" w16cid:durableId="749816692">
     <w:abstractNumId w:val="10"/>
   </w:num>
-  <w:num w:numId="7" w16cid:durableId="749816692">
-    <w:abstractNumId w:val="8"/>
-  </w:num>
   <w:num w:numId="8" w16cid:durableId="1835101558">
-    <w:abstractNumId w:val="4"/>
+    <w:abstractNumId w:val="5"/>
   </w:num>
   <w:num w:numId="9" w16cid:durableId="1421294848">
-    <w:abstractNumId w:val="7"/>
+    <w:abstractNumId w:val="9"/>
   </w:num>
   <w:num w:numId="10" w16cid:durableId="557129504">
-    <w:abstractNumId w:val="12"/>
+    <w:abstractNumId w:val="15"/>
   </w:num>
   <w:num w:numId="11" w16cid:durableId="36779260">
     <w:abstractNumId w:val="0"/>
   </w:num>
   <w:num w:numId="12" w16cid:durableId="1319654721">
+    <w:abstractNumId w:val="7"/>
+  </w:num>
+  <w:num w:numId="13" w16cid:durableId="739059937">
     <w:abstractNumId w:val="6"/>
   </w:num>
-  <w:num w:numId="13" w16cid:durableId="739059937">
-    <w:abstractNumId w:val="5"/>
+  <w:num w:numId="14" w16cid:durableId="76901467">
+    <w:abstractNumId w:val="11"/>
+    <w:lvlOverride w:ilvl="0">
+      <w:startOverride w:val="1"/>
+    </w:lvlOverride>
+    <w:lvlOverride w:ilvl="1">
+      <w:startOverride w:val="1"/>
+    </w:lvlOverride>
+    <w:lvlOverride w:ilvl="2">
+      <w:startOverride w:val="1"/>
+    </w:lvlOverride>
+    <w:lvlOverride w:ilvl="3">
+      <w:startOverride w:val="1"/>
+    </w:lvlOverride>
+    <w:lvlOverride w:ilvl="4">
+      <w:startOverride w:val="1"/>
+    </w:lvlOverride>
+    <w:lvlOverride w:ilvl="5">
+      <w:startOverride w:val="1"/>
+    </w:lvlOverride>
+    <w:lvlOverride w:ilvl="6">
+      <w:startOverride w:val="1"/>
+    </w:lvlOverride>
+    <w:lvlOverride w:ilvl="7">
+      <w:startOverride w:val="1"/>
+    </w:lvlOverride>
+    <w:lvlOverride w:ilvl="8">
+      <w:startOverride w:val="1"/>
+    </w:lvlOverride>
+  </w:num>
+  <w:num w:numId="15" w16cid:durableId="172652363">
+    <w:abstractNumId w:val="14"/>
+  </w:num>
+  <w:num w:numId="16" w16cid:durableId="222717199">
+    <w:abstractNumId w:val="8"/>
+  </w:num>
+  <w:num w:numId="17" w16cid:durableId="313069312">
+    <w:abstractNumId w:val="3"/>
   </w:num>
 </w:numbering>
 </file>

</xml_diff>

<commit_message>
UPDATE: отчет DATE: 2026-09-21 23:56:13
</commit_message>
<xml_diff>
--- a/Учеба 4 семестр/Теория вероятности/Курсовая работа/Отчет, Код/Курсовая_работа.docx
+++ b/Учеба 4 семестр/Теория вероятности/Курсовая работа/Отчет, Код/Курсовая_работа.docx
@@ -13042,28 +13042,7 @@
           <w:sz w:val="28"/>
           <w:szCs w:val="28"/>
         </w:rPr>
-        <w:t>Оценка</w:t>
-      </w:r>
-      <w:r>
-        <w:rPr>
-          <w:sz w:val="28"/>
-          <w:szCs w:val="28"/>
-        </w:rPr>
-        <w:t xml:space="preserve">: </w:t>
-      </w:r>
-      <w:r>
-        <w:rPr>
-          <w:sz w:val="28"/>
-          <w:szCs w:val="28"/>
-        </w:rPr>
-        <w:t>при увеличении параметра формы пики расходятся сильнее. высота пиков падает, а также растет разброс</w:t>
-      </w:r>
-      <w:r>
-        <w:rPr>
-          <w:sz w:val="28"/>
-          <w:szCs w:val="28"/>
-        </w:rPr>
-        <w:t>.</w:t>
+        <w:t>Оценка: при увеличении параметра формы распределение становится более растянутым относительно центра, а область изменения случайной величины увеличивается. На графике функции распределения это проявляется в увеличении ширины участка, на котором происходит переход от значений, близких к 0, к значениям, близким к 1. При этом форма функции распределения изменяется, а её центральная область становится менее крутой.</w:t>
       </w:r>
     </w:p>
     <w:p>
@@ -13172,21 +13151,24 @@
           <w:sz w:val="28"/>
           <w:szCs w:val="28"/>
         </w:rPr>
-        <w:t xml:space="preserve">Оценка: </w:t>
-      </w:r>
-      <w:r>
-        <w:rPr>
-          <w:sz w:val="28"/>
-          <w:szCs w:val="28"/>
-        </w:rPr>
-        <w:t>при увеличении параметра смещения не изменяется форма кривой, расстояние между пиками и высота пиков. Изменяется только центр симметрии у двойного гамма распределения</w:t>
-      </w:r>
-      <w:r>
-        <w:rPr>
-          <w:sz w:val="28"/>
-          <w:szCs w:val="28"/>
-        </w:rPr>
-        <w:t>.</w:t>
+        <w:t xml:space="preserve">Оценка: при изменении параметра смещения форма распределения практически не изменяется, однако функция распределения смещается вдоль оси </w:t>
+      </w:r>
+      <m:oMath>
+        <m:r>
+          <w:rPr>
+            <w:rFonts w:ascii="Cambria Math" w:hAnsi="Cambria Math"/>
+            <w:sz w:val="28"/>
+            <w:szCs w:val="28"/>
+          </w:rPr>
+          <m:t>x</m:t>
+        </m:r>
+      </m:oMath>
+      <w:r>
+        <w:rPr>
+          <w:sz w:val="28"/>
+          <w:szCs w:val="28"/>
+        </w:rPr>
+        <w:t xml:space="preserve">. При увеличении центр распределения перемещается вправо, а при уменьшении — влево. </w:t>
       </w:r>
     </w:p>
     <w:p>
@@ -13278,7 +13260,6 @@
           <w:sz w:val="32"/>
           <w:szCs w:val="32"/>
         </w:rPr>
-        <w:lastRenderedPageBreak/>
         <w:t>Точечные оценки параметров</w:t>
       </w:r>
     </w:p>

</xml_diff>

<commit_message>
vault backup: 2026-09-22 00:59:04
</commit_message>
<xml_diff>
--- a/Учеба 4 семестр/Теория вероятности/Курсовая работа/Отчет, Код/Курсовая_работа.docx
+++ b/Учеба 4 семестр/Теория вероятности/Курсовая работа/Отчет, Код/Курсовая_работа.docx
@@ -14451,6 +14451,1662 @@
           <w:szCs w:val="28"/>
         </w:rPr>
       </w:pPr>
+      <w:r>
+        <w:rPr>
+          <w:b/>
+          <w:bCs/>
+          <w:sz w:val="28"/>
+          <w:szCs w:val="28"/>
+        </w:rPr>
+        <w:lastRenderedPageBreak/>
+        <w:t>Свойства оценок</w:t>
+      </w:r>
+    </w:p>
+    <w:p>
+      <w:pPr>
+        <w:spacing w:line="360" w:lineRule="auto"/>
+        <w:ind w:firstLine="709"/>
+        <w:jc w:val="both"/>
+        <w:rPr>
+          <w:sz w:val="28"/>
+          <w:szCs w:val="28"/>
+        </w:rPr>
+      </w:pPr>
+      <w:r>
+        <w:rPr>
+          <w:sz w:val="28"/>
+          <w:szCs w:val="28"/>
+        </w:rPr>
+        <w:t>Для проверки свойств оценок было проведено статистическое моделирование. В качестве истинных параметров использовались оценки, полученные методом максимального правдоподобия по исходной выборке:</w:t>
+      </w:r>
+      <w:r>
+        <w:rPr>
+          <w:sz w:val="28"/>
+          <w:szCs w:val="28"/>
+        </w:rPr>
+        <w:t xml:space="preserve"> </w:t>
+      </w:r>
+    </w:p>
+    <w:p>
+      <w:pPr>
+        <w:pStyle w:val="a7"/>
+        <w:spacing w:line="360" w:lineRule="auto"/>
+        <w:ind w:left="782" w:firstLine="709"/>
+        <w:jc w:val="both"/>
+        <w:rPr>
+          <w:rFonts w:ascii="Cambria Math" w:hAnsi="Cambria Math"/>
+          <w:sz w:val="28"/>
+          <w:szCs w:val="28"/>
+          <w:oMath/>
+        </w:rPr>
+      </w:pPr>
+      <m:oMathPara>
+        <m:oMath>
+          <m:r>
+            <w:rPr>
+              <w:rFonts w:ascii="Cambria Math" w:hAnsi="Cambria Math"/>
+              <w:sz w:val="28"/>
+              <w:szCs w:val="28"/>
+            </w:rPr>
+            <m:t>alpha_mle = 7.164519554100081</m:t>
+          </m:r>
+        </m:oMath>
+      </m:oMathPara>
+    </w:p>
+    <w:p>
+      <w:pPr>
+        <w:pStyle w:val="a7"/>
+        <w:spacing w:line="360" w:lineRule="auto"/>
+        <w:ind w:left="782" w:firstLine="709"/>
+        <w:jc w:val="both"/>
+        <w:rPr>
+          <w:rFonts w:ascii="Cambria Math" w:hAnsi="Cambria Math"/>
+          <w:sz w:val="28"/>
+          <w:szCs w:val="28"/>
+          <w:oMath/>
+        </w:rPr>
+      </w:pPr>
+      <m:oMathPara>
+        <m:oMath>
+          <m:r>
+            <w:rPr>
+              <w:rFonts w:ascii="Cambria Math" w:hAnsi="Cambria Math"/>
+              <w:sz w:val="28"/>
+              <w:szCs w:val="28"/>
+            </w:rPr>
+            <m:t>loc_mle = 0.7556755874576274</m:t>
+          </m:r>
+        </m:oMath>
+      </m:oMathPara>
+    </w:p>
+    <w:p>
+      <w:pPr>
+        <w:spacing w:line="360" w:lineRule="auto"/>
+        <w:ind w:firstLine="708"/>
+        <w:jc w:val="both"/>
+        <w:rPr>
+          <w:sz w:val="28"/>
+          <w:szCs w:val="28"/>
+        </w:rPr>
+      </w:pPr>
+      <w:r>
+        <w:rPr>
+          <w:sz w:val="28"/>
+          <w:szCs w:val="28"/>
+        </w:rPr>
+        <w:t xml:space="preserve">Оценка </w:t>
+      </w:r>
+      <m:oMath>
+        <m:acc>
+          <m:accPr>
+            <m:ctrlPr>
+              <w:rPr>
+                <w:rFonts w:ascii="Cambria Math" w:hAnsi="Cambria Math"/>
+                <w:i/>
+                <w:sz w:val="28"/>
+                <w:szCs w:val="28"/>
+              </w:rPr>
+            </m:ctrlPr>
+          </m:accPr>
+          <m:e>
+            <m:r>
+              <w:rPr>
+                <w:rFonts w:ascii="Cambria Math" w:hAnsi="Cambria Math"/>
+                <w:sz w:val="28"/>
+                <w:szCs w:val="28"/>
+              </w:rPr>
+              <m:t>θ</m:t>
+            </m:r>
+          </m:e>
+        </m:acc>
+      </m:oMath>
+      <w:r>
+        <w:rPr>
+          <w:sz w:val="28"/>
+          <w:szCs w:val="28"/>
+        </w:rPr>
+        <w:t xml:space="preserve"> называется несмещённой, если её математическое ожидание совпадает с истинным значением параметра</w:t>
+      </w:r>
+    </w:p>
+    <w:p>
+      <w:pPr>
+        <w:spacing w:line="360" w:lineRule="auto"/>
+        <w:jc w:val="both"/>
+        <w:rPr>
+          <w:sz w:val="28"/>
+          <w:szCs w:val="28"/>
+        </w:rPr>
+      </w:pPr>
+      <m:oMath>
+        <m:r>
+          <w:rPr>
+            <w:rFonts w:ascii="Cambria Math" w:hAnsi="Cambria Math"/>
+            <w:sz w:val="28"/>
+            <w:szCs w:val="28"/>
+          </w:rPr>
+          <m:t>E</m:t>
+        </m:r>
+        <m:d>
+          <m:dPr>
+            <m:ctrlPr>
+              <w:rPr>
+                <w:rFonts w:ascii="Cambria Math" w:hAnsi="Cambria Math"/>
+                <w:i/>
+                <w:sz w:val="28"/>
+                <w:szCs w:val="28"/>
+              </w:rPr>
+            </m:ctrlPr>
+          </m:dPr>
+          <m:e>
+            <m:acc>
+              <m:accPr>
+                <m:ctrlPr>
+                  <w:rPr>
+                    <w:rFonts w:ascii="Cambria Math" w:hAnsi="Cambria Math"/>
+                    <w:i/>
+                    <w:sz w:val="28"/>
+                    <w:szCs w:val="28"/>
+                  </w:rPr>
+                </m:ctrlPr>
+              </m:accPr>
+              <m:e>
+                <m:r>
+                  <w:rPr>
+                    <w:rFonts w:ascii="Cambria Math" w:hAnsi="Cambria Math"/>
+                    <w:sz w:val="28"/>
+                    <w:szCs w:val="28"/>
+                  </w:rPr>
+                  <m:t>θ</m:t>
+                </m:r>
+              </m:e>
+            </m:acc>
+          </m:e>
+        </m:d>
+        <m:r>
+          <w:rPr>
+            <w:rFonts w:ascii="Cambria Math" w:hAnsi="Cambria Math"/>
+            <w:sz w:val="28"/>
+            <w:szCs w:val="28"/>
+          </w:rPr>
+          <m:t>= θ</m:t>
+        </m:r>
+      </m:oMath>
+      <w:r>
+        <w:rPr>
+          <w:sz w:val="28"/>
+          <w:szCs w:val="28"/>
+        </w:rPr>
+        <w:t xml:space="preserve">, где </w:t>
+      </w:r>
+      <m:oMath>
+        <m:acc>
+          <m:accPr>
+            <m:ctrlPr>
+              <w:rPr>
+                <w:rFonts w:ascii="Cambria Math" w:hAnsi="Cambria Math"/>
+                <w:i/>
+                <w:sz w:val="28"/>
+                <w:szCs w:val="28"/>
+              </w:rPr>
+            </m:ctrlPr>
+          </m:accPr>
+          <m:e>
+            <m:r>
+              <w:rPr>
+                <w:rFonts w:ascii="Cambria Math" w:hAnsi="Cambria Math"/>
+                <w:sz w:val="28"/>
+                <w:szCs w:val="28"/>
+              </w:rPr>
+              <m:t>θ</m:t>
+            </m:r>
+          </m:e>
+        </m:acc>
+      </m:oMath>
+      <w:r>
+        <w:rPr>
+          <w:sz w:val="28"/>
+          <w:szCs w:val="28"/>
+        </w:rPr>
+        <w:t xml:space="preserve"> значение параметра полученные с помощью ММ или ММП, а </w:t>
+      </w:r>
+      <m:oMath>
+        <m:r>
+          <w:rPr>
+            <w:rFonts w:ascii="Cambria Math" w:hAnsi="Cambria Math"/>
+            <w:sz w:val="28"/>
+            <w:szCs w:val="28"/>
+          </w:rPr>
+          <m:t>θ</m:t>
+        </m:r>
+      </m:oMath>
+      <w:r>
+        <w:rPr>
+          <w:sz w:val="28"/>
+          <w:szCs w:val="28"/>
+        </w:rPr>
+        <w:t xml:space="preserve"> – истинное значение параметра. Формула математического ожидания:</w:t>
+      </w:r>
+    </w:p>
+    <w:p>
+      <w:pPr>
+        <w:spacing w:line="360" w:lineRule="auto"/>
+        <w:jc w:val="both"/>
+        <w:rPr>
+          <w:sz w:val="28"/>
+          <w:szCs w:val="28"/>
+        </w:rPr>
+      </w:pPr>
+      <m:oMathPara>
+        <m:oMath>
+          <m:r>
+            <w:rPr>
+              <w:rFonts w:ascii="Cambria Math" w:hAnsi="Cambria Math"/>
+              <w:sz w:val="28"/>
+              <w:szCs w:val="28"/>
+            </w:rPr>
+            <m:t>E</m:t>
+          </m:r>
+          <m:d>
+            <m:dPr>
+              <m:ctrlPr>
+                <w:rPr>
+                  <w:rFonts w:ascii="Cambria Math" w:hAnsi="Cambria Math"/>
+                  <w:i/>
+                  <w:sz w:val="28"/>
+                  <w:szCs w:val="28"/>
+                </w:rPr>
+              </m:ctrlPr>
+            </m:dPr>
+            <m:e>
+              <m:r>
+                <w:rPr>
+                  <w:rFonts w:ascii="Cambria Math" w:hAnsi="Cambria Math"/>
+                  <w:sz w:val="28"/>
+                  <w:szCs w:val="28"/>
+                </w:rPr>
+                <m:t>X</m:t>
+              </m:r>
+            </m:e>
+          </m:d>
+          <m:r>
+            <w:rPr>
+              <w:rFonts w:ascii="Cambria Math" w:hAnsi="Cambria Math"/>
+              <w:sz w:val="28"/>
+              <w:szCs w:val="28"/>
+            </w:rPr>
+            <m:t>=∫g</m:t>
+          </m:r>
+          <m:d>
+            <m:dPr>
+              <m:ctrlPr>
+                <w:rPr>
+                  <w:rFonts w:ascii="Cambria Math" w:hAnsi="Cambria Math"/>
+                  <w:i/>
+                  <w:sz w:val="28"/>
+                  <w:szCs w:val="28"/>
+                  <w:lang w:val="en-US"/>
+                </w:rPr>
+              </m:ctrlPr>
+            </m:dPr>
+            <m:e>
+              <m:r>
+                <w:rPr>
+                  <w:rFonts w:ascii="Cambria Math" w:hAnsi="Cambria Math"/>
+                  <w:sz w:val="28"/>
+                  <w:szCs w:val="28"/>
+                  <w:lang w:val="en-US"/>
+                </w:rPr>
+                <m:t>x</m:t>
+              </m:r>
+            </m:e>
+          </m:d>
+          <m:r>
+            <w:rPr>
+              <w:rFonts w:ascii="Cambria Math" w:hAnsi="Cambria Math"/>
+              <w:sz w:val="28"/>
+              <w:szCs w:val="28"/>
+            </w:rPr>
+            <m:t>f</m:t>
+          </m:r>
+          <m:d>
+            <m:dPr>
+              <m:ctrlPr>
+                <w:rPr>
+                  <w:rFonts w:ascii="Cambria Math" w:hAnsi="Cambria Math"/>
+                  <w:i/>
+                  <w:sz w:val="28"/>
+                  <w:szCs w:val="28"/>
+                </w:rPr>
+              </m:ctrlPr>
+            </m:dPr>
+            <m:e>
+              <m:r>
+                <w:rPr>
+                  <w:rFonts w:ascii="Cambria Math" w:hAnsi="Cambria Math"/>
+                  <w:sz w:val="28"/>
+                  <w:szCs w:val="28"/>
+                </w:rPr>
+                <m:t>x</m:t>
+              </m:r>
+            </m:e>
+          </m:d>
+          <m:r>
+            <w:rPr>
+              <w:rFonts w:ascii="Cambria Math" w:hAnsi="Cambria Math"/>
+              <w:sz w:val="28"/>
+              <w:szCs w:val="28"/>
+            </w:rPr>
+            <m:t>dx,</m:t>
+          </m:r>
+        </m:oMath>
+      </m:oMathPara>
+    </w:p>
+    <w:p>
+      <w:pPr>
+        <w:spacing w:line="360" w:lineRule="auto"/>
+        <w:ind w:firstLine="708"/>
+        <w:jc w:val="both"/>
+        <w:rPr>
+          <w:sz w:val="28"/>
+          <w:szCs w:val="28"/>
+        </w:rPr>
+      </w:pPr>
+      <w:r>
+        <w:rPr>
+          <w:sz w:val="28"/>
+          <w:szCs w:val="28"/>
+        </w:rPr>
+        <w:t xml:space="preserve">Для проверки </w:t>
+      </w:r>
+      <w:proofErr w:type="spellStart"/>
+      <w:r>
+        <w:rPr>
+          <w:sz w:val="28"/>
+          <w:szCs w:val="28"/>
+        </w:rPr>
+        <w:t>несмещённости</w:t>
+      </w:r>
+      <w:proofErr w:type="spellEnd"/>
+      <w:r>
+        <w:rPr>
+          <w:sz w:val="28"/>
+          <w:szCs w:val="28"/>
+        </w:rPr>
+        <w:t xml:space="preserve"> было сгенерировано 1000 выборок объём</w:t>
+      </w:r>
+      <w:r>
+        <w:rPr>
+          <w:sz w:val="28"/>
+          <w:szCs w:val="28"/>
+        </w:rPr>
+        <w:t xml:space="preserve">ом </w:t>
+      </w:r>
+      <w:r>
+        <w:rPr>
+          <w:sz w:val="28"/>
+          <w:szCs w:val="28"/>
+        </w:rPr>
+        <w:t>n = 300</w:t>
+      </w:r>
+      <w:r>
+        <w:rPr>
+          <w:sz w:val="28"/>
+          <w:szCs w:val="28"/>
+        </w:rPr>
+        <w:t xml:space="preserve"> </w:t>
+      </w:r>
+      <w:r>
+        <w:rPr>
+          <w:sz w:val="28"/>
+          <w:szCs w:val="28"/>
+        </w:rPr>
+        <w:t>[</w:t>
+      </w:r>
+      <w:r>
+        <w:rPr>
+          <w:sz w:val="28"/>
+          <w:szCs w:val="28"/>
+        </w:rPr>
+        <w:t>Листинг 16</w:t>
+      </w:r>
+      <w:r>
+        <w:rPr>
+          <w:sz w:val="28"/>
+          <w:szCs w:val="28"/>
+        </w:rPr>
+        <w:t>]</w:t>
+      </w:r>
+      <w:r>
+        <w:rPr>
+          <w:sz w:val="28"/>
+          <w:szCs w:val="28"/>
+        </w:rPr>
+        <w:t xml:space="preserve">: </w:t>
+      </w:r>
+      <w:r>
+        <w:rPr>
+          <w:sz w:val="28"/>
+          <w:szCs w:val="28"/>
+        </w:rPr>
+        <w:t xml:space="preserve">для этого была построена численная сетка значений теоретической функции распределения </w:t>
+      </w:r>
+      <m:oMath>
+        <m:r>
+          <w:rPr>
+            <w:rFonts w:ascii="Cambria Math" w:hAnsi="Cambria Math"/>
+            <w:sz w:val="28"/>
+            <w:szCs w:val="28"/>
+          </w:rPr>
+          <m:t>F(x)</m:t>
+        </m:r>
+      </m:oMath>
+      <w:r>
+        <w:rPr>
+          <w:sz w:val="28"/>
+          <w:szCs w:val="28"/>
+        </w:rPr>
+        <w:t xml:space="preserve"> с шагом 0,01</w:t>
+      </w:r>
+      <w:r>
+        <w:rPr>
+          <w:sz w:val="28"/>
+          <w:szCs w:val="28"/>
+        </w:rPr>
+        <w:t xml:space="preserve"> [</w:t>
+      </w:r>
+      <w:r>
+        <w:rPr>
+          <w:sz w:val="28"/>
+          <w:szCs w:val="28"/>
+        </w:rPr>
+        <w:t>Листинг 17</w:t>
+      </w:r>
+      <w:r>
+        <w:rPr>
+          <w:sz w:val="28"/>
+          <w:szCs w:val="28"/>
+        </w:rPr>
+        <w:t>]</w:t>
+      </w:r>
+      <w:r>
+        <w:rPr>
+          <w:sz w:val="28"/>
+          <w:szCs w:val="28"/>
+        </w:rPr>
+        <w:t xml:space="preserve">, после чего для каждого элемента выборки бралось случайное число </w:t>
+      </w:r>
+      <m:oMath>
+        <m:r>
+          <w:rPr>
+            <w:rFonts w:ascii="Cambria Math" w:hAnsi="Cambria Math"/>
+            <w:sz w:val="28"/>
+            <w:szCs w:val="28"/>
+          </w:rPr>
+          <m:t>u ~ U(0,1)</m:t>
+        </m:r>
+      </m:oMath>
+      <w:r>
+        <w:rPr>
+          <w:sz w:val="28"/>
+          <w:szCs w:val="28"/>
+        </w:rPr>
+        <w:t xml:space="preserve"> и методом бинарного поиска по сетке находилось значение </w:t>
+      </w:r>
+      <m:oMath>
+        <m:r>
+          <w:rPr>
+            <w:rFonts w:ascii="Cambria Math" w:hAnsi="Cambria Math"/>
+            <w:sz w:val="28"/>
+            <w:szCs w:val="28"/>
+          </w:rPr>
+          <m:t>x</m:t>
+        </m:r>
+      </m:oMath>
+      <w:r>
+        <w:rPr>
+          <w:sz w:val="28"/>
+          <w:szCs w:val="28"/>
+        </w:rPr>
+        <w:t xml:space="preserve">, такое что </w:t>
+      </w:r>
+      <m:oMath>
+        <m:r>
+          <w:rPr>
+            <w:rFonts w:ascii="Cambria Math" w:hAnsi="Cambria Math"/>
+            <w:sz w:val="28"/>
+            <w:szCs w:val="28"/>
+          </w:rPr>
+          <m:t>F(x) ≈ u</m:t>
+        </m:r>
+      </m:oMath>
+      <w:r>
+        <w:rPr>
+          <w:sz w:val="28"/>
+          <w:szCs w:val="28"/>
+        </w:rPr>
+        <w:t>. По результатам моделирования получены следующие значения:</w:t>
+      </w:r>
+    </w:p>
+    <w:p>
+      <w:pPr>
+        <w:spacing w:line="360" w:lineRule="auto"/>
+        <w:ind w:firstLine="708"/>
+        <w:jc w:val="both"/>
+        <w:rPr>
+          <w:rFonts w:ascii="Cambria Math" w:hAnsi="Cambria Math"/>
+          <w:sz w:val="28"/>
+          <w:szCs w:val="28"/>
+          <w:oMath/>
+        </w:rPr>
+      </w:pPr>
+      <w:r>
+        <w:rPr>
+          <w:sz w:val="28"/>
+          <w:szCs w:val="28"/>
+        </w:rPr>
+        <w:t>Метод моментов</w:t>
+      </w:r>
+      <w:r>
+        <w:rPr>
+          <w:sz w:val="28"/>
+          <w:szCs w:val="28"/>
+        </w:rPr>
+        <w:t xml:space="preserve"> </w:t>
+      </w:r>
+      <w:r>
+        <w:rPr>
+          <w:sz w:val="28"/>
+          <w:szCs w:val="28"/>
+          <w:lang w:val="en-US"/>
+        </w:rPr>
+        <w:t>[</w:t>
+      </w:r>
+      <w:r>
+        <w:rPr>
+          <w:sz w:val="28"/>
+          <w:szCs w:val="28"/>
+        </w:rPr>
+        <w:t>Листинг 18</w:t>
+      </w:r>
+      <w:r>
+        <w:rPr>
+          <w:sz w:val="28"/>
+          <w:szCs w:val="28"/>
+          <w:lang w:val="en-US"/>
+        </w:rPr>
+        <w:t>]</w:t>
+      </w:r>
+      <w:r>
+        <w:rPr>
+          <w:sz w:val="28"/>
+          <w:szCs w:val="28"/>
+        </w:rPr>
+        <w:t>:</w:t>
+      </w:r>
+    </w:p>
+    <w:p>
+      <w:pPr>
+        <w:spacing w:line="360" w:lineRule="auto"/>
+        <w:ind w:firstLine="708"/>
+        <w:jc w:val="both"/>
+        <w:rPr>
+          <w:sz w:val="28"/>
+          <w:szCs w:val="28"/>
+        </w:rPr>
+      </w:pPr>
+      <m:oMathPara>
+        <m:oMath>
+          <m:r>
+            <w:rPr>
+              <w:rFonts w:ascii="Cambria Math" w:hAnsi="Cambria Math"/>
+              <w:sz w:val="28"/>
+              <w:szCs w:val="28"/>
+            </w:rPr>
+            <m:t>E</m:t>
+          </m:r>
+          <m:d>
+            <m:dPr>
+              <m:ctrlPr>
+                <w:rPr>
+                  <w:rFonts w:ascii="Cambria Math" w:hAnsi="Cambria Math"/>
+                  <w:i/>
+                  <w:sz w:val="28"/>
+                  <w:szCs w:val="28"/>
+                </w:rPr>
+              </m:ctrlPr>
+            </m:dPr>
+            <m:e>
+              <m:r>
+                <w:rPr>
+                  <w:rFonts w:ascii="Cambria Math" w:hAnsi="Cambria Math"/>
+                  <w:sz w:val="28"/>
+                  <w:szCs w:val="28"/>
+                </w:rPr>
+                <m:t>alph</m:t>
+              </m:r>
+              <m:sSub>
+                <m:sSubPr>
+                  <m:ctrlPr>
+                    <w:rPr>
+                      <w:rFonts w:ascii="Cambria Math" w:hAnsi="Cambria Math"/>
+                      <w:i/>
+                      <w:sz w:val="28"/>
+                      <w:szCs w:val="28"/>
+                    </w:rPr>
+                  </m:ctrlPr>
+                </m:sSubPr>
+                <m:e>
+                  <m:r>
+                    <w:rPr>
+                      <w:rFonts w:ascii="Cambria Math" w:hAnsi="Cambria Math"/>
+                      <w:sz w:val="28"/>
+                      <w:szCs w:val="28"/>
+                    </w:rPr>
+                    <m:t>a</m:t>
+                  </m:r>
+                </m:e>
+                <m:sub>
+                  <m:r>
+                    <w:rPr>
+                      <w:rFonts w:ascii="Cambria Math" w:hAnsi="Cambria Math"/>
+                      <w:sz w:val="28"/>
+                      <w:szCs w:val="28"/>
+                    </w:rPr>
+                    <m:t>m</m:t>
+                  </m:r>
+                </m:sub>
+              </m:sSub>
+              <m:r>
+                <w:rPr>
+                  <w:rFonts w:ascii="Cambria Math" w:hAnsi="Cambria Math"/>
+                  <w:sz w:val="28"/>
+                  <w:szCs w:val="28"/>
+                </w:rPr>
+                <m:t>m</m:t>
+              </m:r>
+            </m:e>
+          </m:d>
+          <m:r>
+            <w:rPr>
+              <w:rFonts w:ascii="Cambria Math" w:hAnsi="Cambria Math"/>
+              <w:sz w:val="28"/>
+              <w:szCs w:val="28"/>
+            </w:rPr>
+            <m:t>=7.151437423955929</m:t>
+          </m:r>
+        </m:oMath>
+      </m:oMathPara>
+    </w:p>
+    <w:p>
+      <w:pPr>
+        <w:spacing w:line="360" w:lineRule="auto"/>
+        <w:ind w:firstLine="708"/>
+        <w:jc w:val="both"/>
+        <w:rPr>
+          <w:sz w:val="28"/>
+          <w:szCs w:val="28"/>
+        </w:rPr>
+      </w:pPr>
+      <m:oMathPara>
+        <m:oMath>
+          <m:r>
+            <w:rPr>
+              <w:rFonts w:ascii="Cambria Math" w:hAnsi="Cambria Math"/>
+              <w:sz w:val="28"/>
+              <w:szCs w:val="28"/>
+            </w:rPr>
+            <m:t xml:space="preserve">  истинное alpha = 7.164519554100081 </m:t>
+          </m:r>
+        </m:oMath>
+      </m:oMathPara>
+    </w:p>
+    <w:p>
+      <w:pPr>
+        <w:spacing w:line="360" w:lineRule="auto"/>
+        <w:ind w:firstLine="708"/>
+        <w:jc w:val="both"/>
+        <w:rPr>
+          <w:rFonts w:ascii="Cambria Math" w:hAnsi="Cambria Math"/>
+          <w:sz w:val="28"/>
+          <w:szCs w:val="28"/>
+          <w:oMath/>
+        </w:rPr>
+      </w:pPr>
+      <m:oMathPara>
+        <m:oMath>
+          <m:r>
+            <w:rPr>
+              <w:rFonts w:ascii="Cambria Math" w:hAnsi="Cambria Math"/>
+              <w:sz w:val="28"/>
+              <w:szCs w:val="28"/>
+            </w:rPr>
+            <m:t xml:space="preserve"> смещение = -0.01308213014415216</m:t>
+          </m:r>
+        </m:oMath>
+      </m:oMathPara>
+    </w:p>
+    <w:p>
+      <w:pPr>
+        <w:spacing w:line="360" w:lineRule="auto"/>
+        <w:ind w:firstLine="708"/>
+        <w:jc w:val="both"/>
+        <w:rPr>
+          <w:sz w:val="28"/>
+          <w:szCs w:val="28"/>
+        </w:rPr>
+      </w:pPr>
+      <m:oMathPara>
+        <m:oMath>
+          <m:r>
+            <w:rPr>
+              <w:rFonts w:ascii="Cambria Math" w:hAnsi="Cambria Math"/>
+              <w:sz w:val="28"/>
+              <w:szCs w:val="28"/>
+            </w:rPr>
+            <m:t>E</m:t>
+          </m:r>
+          <m:d>
+            <m:dPr>
+              <m:ctrlPr>
+                <w:rPr>
+                  <w:rFonts w:ascii="Cambria Math" w:hAnsi="Cambria Math"/>
+                  <w:i/>
+                  <w:sz w:val="28"/>
+                  <w:szCs w:val="28"/>
+                </w:rPr>
+              </m:ctrlPr>
+            </m:dPr>
+            <m:e>
+              <m:r>
+                <w:rPr>
+                  <w:rFonts w:ascii="Cambria Math" w:hAnsi="Cambria Math"/>
+                  <w:sz w:val="28"/>
+                  <w:szCs w:val="28"/>
+                </w:rPr>
+                <m:t>lo</m:t>
+              </m:r>
+              <m:sSub>
+                <m:sSubPr>
+                  <m:ctrlPr>
+                    <w:rPr>
+                      <w:rFonts w:ascii="Cambria Math" w:hAnsi="Cambria Math"/>
+                      <w:i/>
+                      <w:sz w:val="28"/>
+                      <w:szCs w:val="28"/>
+                    </w:rPr>
+                  </m:ctrlPr>
+                </m:sSubPr>
+                <m:e>
+                  <m:r>
+                    <w:rPr>
+                      <w:rFonts w:ascii="Cambria Math" w:hAnsi="Cambria Math"/>
+                      <w:sz w:val="28"/>
+                      <w:szCs w:val="28"/>
+                    </w:rPr>
+                    <m:t>c</m:t>
+                  </m:r>
+                </m:e>
+                <m:sub>
+                  <m:r>
+                    <w:rPr>
+                      <w:rFonts w:ascii="Cambria Math" w:hAnsi="Cambria Math"/>
+                      <w:sz w:val="28"/>
+                      <w:szCs w:val="28"/>
+                    </w:rPr>
+                    <m:t>m</m:t>
+                  </m:r>
+                </m:sub>
+              </m:sSub>
+              <m:r>
+                <w:rPr>
+                  <w:rFonts w:ascii="Cambria Math" w:hAnsi="Cambria Math"/>
+                  <w:sz w:val="28"/>
+                  <w:szCs w:val="28"/>
+                </w:rPr>
+                <m:t>m</m:t>
+              </m:r>
+            </m:e>
+          </m:d>
+          <m:r>
+            <w:rPr>
+              <w:rFonts w:ascii="Cambria Math" w:hAnsi="Cambria Math"/>
+              <w:sz w:val="28"/>
+              <w:szCs w:val="28"/>
+            </w:rPr>
+            <m:t>=0.743076187459385</m:t>
+          </m:r>
+        </m:oMath>
+      </m:oMathPara>
+    </w:p>
+    <w:p>
+      <w:pPr>
+        <w:spacing w:line="360" w:lineRule="auto"/>
+        <w:ind w:firstLine="708"/>
+        <w:jc w:val="both"/>
+        <w:rPr>
+          <w:sz w:val="28"/>
+          <w:szCs w:val="28"/>
+        </w:rPr>
+      </w:pPr>
+      <m:oMathPara>
+        <m:oMath>
+          <m:r>
+            <w:rPr>
+              <w:rFonts w:ascii="Cambria Math" w:hAnsi="Cambria Math"/>
+              <w:sz w:val="28"/>
+              <w:szCs w:val="28"/>
+            </w:rPr>
+            <m:t xml:space="preserve">истинное loc = 0.7556755874576274  </m:t>
+          </m:r>
+        </m:oMath>
+      </m:oMathPara>
+    </w:p>
+    <w:p>
+      <w:pPr>
+        <w:spacing w:line="360" w:lineRule="auto"/>
+        <w:ind w:firstLine="708"/>
+        <w:jc w:val="both"/>
+        <w:rPr>
+          <w:sz w:val="28"/>
+          <w:szCs w:val="28"/>
+        </w:rPr>
+      </w:pPr>
+      <m:oMathPara>
+        <m:oMath>
+          <m:r>
+            <w:rPr>
+              <w:rFonts w:ascii="Cambria Math" w:hAnsi="Cambria Math"/>
+              <w:sz w:val="28"/>
+              <w:szCs w:val="28"/>
+            </w:rPr>
+            <m:t>смещение = -0.012599399998242444</m:t>
+          </m:r>
+        </m:oMath>
+      </m:oMathPara>
+    </w:p>
+    <w:p>
+      <w:pPr>
+        <w:spacing w:line="360" w:lineRule="auto"/>
+        <w:ind w:firstLine="708"/>
+        <w:jc w:val="both"/>
+        <w:rPr>
+          <w:sz w:val="28"/>
+          <w:szCs w:val="28"/>
+        </w:rPr>
+      </w:pPr>
+    </w:p>
+    <w:p>
+      <w:pPr>
+        <w:spacing w:line="360" w:lineRule="auto"/>
+        <w:ind w:firstLine="708"/>
+        <w:jc w:val="both"/>
+        <w:rPr>
+          <w:sz w:val="28"/>
+          <w:szCs w:val="28"/>
+        </w:rPr>
+      </w:pPr>
+    </w:p>
+    <w:p>
+      <w:pPr>
+        <w:spacing w:line="360" w:lineRule="auto"/>
+        <w:ind w:firstLine="708"/>
+        <w:jc w:val="both"/>
+        <w:rPr>
+          <w:sz w:val="28"/>
+          <w:szCs w:val="28"/>
+        </w:rPr>
+      </w:pPr>
+    </w:p>
+    <w:p>
+      <w:pPr>
+        <w:spacing w:line="360" w:lineRule="auto"/>
+        <w:ind w:firstLine="708"/>
+        <w:jc w:val="both"/>
+        <w:rPr>
+          <w:sz w:val="28"/>
+          <w:szCs w:val="28"/>
+        </w:rPr>
+      </w:pPr>
+    </w:p>
+    <w:p>
+      <w:pPr>
+        <w:spacing w:line="360" w:lineRule="auto"/>
+        <w:ind w:firstLine="708"/>
+        <w:jc w:val="both"/>
+        <w:rPr>
+          <w:sz w:val="28"/>
+          <w:szCs w:val="28"/>
+        </w:rPr>
+      </w:pPr>
+    </w:p>
+    <w:p>
+      <w:pPr>
+        <w:spacing w:line="360" w:lineRule="auto"/>
+        <w:ind w:firstLine="708"/>
+        <w:jc w:val="both"/>
+        <w:rPr>
+          <w:sz w:val="28"/>
+          <w:szCs w:val="28"/>
+        </w:rPr>
+      </w:pPr>
+    </w:p>
+    <w:p>
+      <w:pPr>
+        <w:spacing w:line="360" w:lineRule="auto"/>
+        <w:ind w:firstLine="708"/>
+        <w:jc w:val="both"/>
+        <w:rPr>
+          <w:sz w:val="28"/>
+          <w:szCs w:val="28"/>
+        </w:rPr>
+      </w:pPr>
+      <w:r>
+        <w:rPr>
+          <w:sz w:val="28"/>
+          <w:szCs w:val="28"/>
+        </w:rPr>
+        <w:t>Метод максимального правдоподобия</w:t>
+      </w:r>
+      <w:r>
+        <w:rPr>
+          <w:sz w:val="28"/>
+          <w:szCs w:val="28"/>
+          <w:lang w:val="en-US"/>
+        </w:rPr>
+        <w:t xml:space="preserve"> [</w:t>
+      </w:r>
+      <w:r>
+        <w:rPr>
+          <w:sz w:val="28"/>
+          <w:szCs w:val="28"/>
+        </w:rPr>
+        <w:t>Листинг 19</w:t>
+      </w:r>
+      <w:r>
+        <w:rPr>
+          <w:sz w:val="28"/>
+          <w:szCs w:val="28"/>
+          <w:lang w:val="en-US"/>
+        </w:rPr>
+        <w:t>]</w:t>
+      </w:r>
+      <w:r>
+        <w:rPr>
+          <w:sz w:val="28"/>
+          <w:szCs w:val="28"/>
+        </w:rPr>
+        <w:t>:</w:t>
+      </w:r>
+    </w:p>
+    <w:p>
+      <w:pPr>
+        <w:spacing w:line="360" w:lineRule="auto"/>
+        <w:ind w:firstLine="708"/>
+        <w:jc w:val="both"/>
+        <w:rPr>
+          <w:sz w:val="28"/>
+          <w:szCs w:val="28"/>
+        </w:rPr>
+      </w:pPr>
+      <m:oMathPara>
+        <m:oMath>
+          <m:r>
+            <w:rPr>
+              <w:rFonts w:ascii="Cambria Math" w:hAnsi="Cambria Math"/>
+              <w:sz w:val="28"/>
+              <w:szCs w:val="28"/>
+            </w:rPr>
+            <m:t>E</m:t>
+          </m:r>
+          <m:d>
+            <m:dPr>
+              <m:ctrlPr>
+                <w:rPr>
+                  <w:rFonts w:ascii="Cambria Math" w:hAnsi="Cambria Math"/>
+                  <w:i/>
+                  <w:sz w:val="28"/>
+                  <w:szCs w:val="28"/>
+                </w:rPr>
+              </m:ctrlPr>
+            </m:dPr>
+            <m:e>
+              <m:r>
+                <w:rPr>
+                  <w:rFonts w:ascii="Cambria Math" w:hAnsi="Cambria Math"/>
+                  <w:sz w:val="28"/>
+                  <w:szCs w:val="28"/>
+                </w:rPr>
+                <m:t>alph</m:t>
+              </m:r>
+              <m:sSub>
+                <m:sSubPr>
+                  <m:ctrlPr>
+                    <w:rPr>
+                      <w:rFonts w:ascii="Cambria Math" w:hAnsi="Cambria Math"/>
+                      <w:i/>
+                      <w:sz w:val="28"/>
+                      <w:szCs w:val="28"/>
+                    </w:rPr>
+                  </m:ctrlPr>
+                </m:sSubPr>
+                <m:e>
+                  <m:r>
+                    <w:rPr>
+                      <w:rFonts w:ascii="Cambria Math" w:hAnsi="Cambria Math"/>
+                      <w:sz w:val="28"/>
+                      <w:szCs w:val="28"/>
+                    </w:rPr>
+                    <m:t>a</m:t>
+                  </m:r>
+                </m:e>
+                <m:sub>
+                  <m:r>
+                    <w:rPr>
+                      <w:rFonts w:ascii="Cambria Math" w:hAnsi="Cambria Math"/>
+                      <w:sz w:val="28"/>
+                      <w:szCs w:val="28"/>
+                    </w:rPr>
+                    <m:t>m</m:t>
+                  </m:r>
+                </m:sub>
+              </m:sSub>
+              <m:r>
+                <w:rPr>
+                  <w:rFonts w:ascii="Cambria Math" w:hAnsi="Cambria Math"/>
+                  <w:sz w:val="28"/>
+                  <w:szCs w:val="28"/>
+                </w:rPr>
+                <m:t>le</m:t>
+              </m:r>
+            </m:e>
+          </m:d>
+          <m:r>
+            <w:rPr>
+              <w:rFonts w:ascii="Cambria Math" w:hAnsi="Cambria Math"/>
+              <w:sz w:val="28"/>
+              <w:szCs w:val="28"/>
+            </w:rPr>
+            <m:t>=7.170310594582897</m:t>
+          </m:r>
+        </m:oMath>
+      </m:oMathPara>
+    </w:p>
+    <w:p>
+      <w:pPr>
+        <w:spacing w:line="360" w:lineRule="auto"/>
+        <w:ind w:firstLine="708"/>
+        <w:jc w:val="both"/>
+        <w:rPr>
+          <w:sz w:val="28"/>
+          <w:szCs w:val="28"/>
+        </w:rPr>
+      </w:pPr>
+      <m:oMathPara>
+        <m:oMath>
+          <m:r>
+            <w:rPr>
+              <w:rFonts w:ascii="Cambria Math" w:hAnsi="Cambria Math"/>
+              <w:sz w:val="28"/>
+              <w:szCs w:val="28"/>
+            </w:rPr>
+            <m:t xml:space="preserve"> истинное alpha = 7.164519554100081</m:t>
+          </m:r>
+        </m:oMath>
+      </m:oMathPara>
+    </w:p>
+    <w:p>
+      <w:pPr>
+        <w:spacing w:line="360" w:lineRule="auto"/>
+        <w:ind w:firstLine="708"/>
+        <w:jc w:val="both"/>
+        <w:rPr>
+          <w:rFonts w:ascii="Cambria Math" w:hAnsi="Cambria Math"/>
+          <w:sz w:val="28"/>
+          <w:szCs w:val="28"/>
+          <w:oMath/>
+        </w:rPr>
+      </w:pPr>
+      <m:oMathPara>
+        <m:oMath>
+          <m:r>
+            <w:rPr>
+              <w:rFonts w:ascii="Cambria Math" w:hAnsi="Cambria Math"/>
+              <w:sz w:val="28"/>
+              <w:szCs w:val="28"/>
+            </w:rPr>
+            <m:t xml:space="preserve">  смещение = 0.005791040482816534</m:t>
+          </m:r>
+        </m:oMath>
+      </m:oMathPara>
+    </w:p>
+    <w:p>
+      <w:pPr>
+        <w:spacing w:line="360" w:lineRule="auto"/>
+        <w:ind w:firstLine="708"/>
+        <w:jc w:val="both"/>
+        <w:rPr>
+          <w:sz w:val="28"/>
+          <w:szCs w:val="28"/>
+        </w:rPr>
+      </w:pPr>
+      <m:oMathPara>
+        <m:oMath>
+          <m:r>
+            <w:rPr>
+              <w:rFonts w:ascii="Cambria Math" w:hAnsi="Cambria Math"/>
+              <w:sz w:val="28"/>
+              <w:szCs w:val="28"/>
+            </w:rPr>
+            <m:t>E</m:t>
+          </m:r>
+          <m:d>
+            <m:dPr>
+              <m:ctrlPr>
+                <w:rPr>
+                  <w:rFonts w:ascii="Cambria Math" w:hAnsi="Cambria Math"/>
+                  <w:i/>
+                  <w:sz w:val="28"/>
+                  <w:szCs w:val="28"/>
+                </w:rPr>
+              </m:ctrlPr>
+            </m:dPr>
+            <m:e>
+              <m:r>
+                <w:rPr>
+                  <w:rFonts w:ascii="Cambria Math" w:hAnsi="Cambria Math"/>
+                  <w:sz w:val="28"/>
+                  <w:szCs w:val="28"/>
+                </w:rPr>
+                <m:t>lo</m:t>
+              </m:r>
+              <m:sSub>
+                <m:sSubPr>
+                  <m:ctrlPr>
+                    <w:rPr>
+                      <w:rFonts w:ascii="Cambria Math" w:hAnsi="Cambria Math"/>
+                      <w:i/>
+                      <w:sz w:val="28"/>
+                      <w:szCs w:val="28"/>
+                    </w:rPr>
+                  </m:ctrlPr>
+                </m:sSubPr>
+                <m:e>
+                  <m:r>
+                    <w:rPr>
+                      <w:rFonts w:ascii="Cambria Math" w:hAnsi="Cambria Math"/>
+                      <w:sz w:val="28"/>
+                      <w:szCs w:val="28"/>
+                    </w:rPr>
+                    <m:t>c</m:t>
+                  </m:r>
+                </m:e>
+                <m:sub>
+                  <m:r>
+                    <w:rPr>
+                      <w:rFonts w:ascii="Cambria Math" w:hAnsi="Cambria Math"/>
+                      <w:sz w:val="28"/>
+                      <w:szCs w:val="28"/>
+                    </w:rPr>
+                    <m:t>m</m:t>
+                  </m:r>
+                </m:sub>
+              </m:sSub>
+              <m:r>
+                <w:rPr>
+                  <w:rFonts w:ascii="Cambria Math" w:hAnsi="Cambria Math"/>
+                  <w:sz w:val="28"/>
+                  <w:szCs w:val="28"/>
+                </w:rPr>
+                <m:t>le</m:t>
+              </m:r>
+            </m:e>
+          </m:d>
+          <m:r>
+            <w:rPr>
+              <w:rFonts w:ascii="Cambria Math" w:hAnsi="Cambria Math"/>
+              <w:sz w:val="28"/>
+              <w:szCs w:val="28"/>
+            </w:rPr>
+            <m:t>=0.7565077230915684</m:t>
+          </m:r>
+        </m:oMath>
+      </m:oMathPara>
+    </w:p>
+    <w:p>
+      <w:pPr>
+        <w:spacing w:line="360" w:lineRule="auto"/>
+        <w:ind w:firstLine="708"/>
+        <w:jc w:val="both"/>
+        <w:rPr>
+          <w:sz w:val="28"/>
+          <w:szCs w:val="28"/>
+        </w:rPr>
+      </w:pPr>
+      <m:oMathPara>
+        <m:oMath>
+          <m:r>
+            <w:rPr>
+              <w:rFonts w:ascii="Cambria Math" w:hAnsi="Cambria Math"/>
+              <w:sz w:val="28"/>
+              <w:szCs w:val="28"/>
+            </w:rPr>
+            <m:t xml:space="preserve"> истинное loc = 0.7556755874576274 </m:t>
+          </m:r>
+        </m:oMath>
+      </m:oMathPara>
+    </w:p>
+    <w:p>
+      <w:pPr>
+        <w:spacing w:line="360" w:lineRule="auto"/>
+        <w:ind w:firstLine="708"/>
+        <w:jc w:val="both"/>
+        <w:rPr>
+          <w:rFonts w:ascii="Cambria Math" w:hAnsi="Cambria Math"/>
+          <w:sz w:val="28"/>
+          <w:szCs w:val="28"/>
+          <w:oMath/>
+        </w:rPr>
+      </w:pPr>
+      <m:oMathPara>
+        <m:oMath>
+          <m:r>
+            <w:rPr>
+              <w:rFonts w:ascii="Cambria Math" w:hAnsi="Cambria Math"/>
+              <w:sz w:val="28"/>
+              <w:szCs w:val="28"/>
+            </w:rPr>
+            <m:t xml:space="preserve"> смещение = 0.0008321356339410224</m:t>
+          </m:r>
+        </m:oMath>
+      </m:oMathPara>
+    </w:p>
+    <w:p>
+      <w:pPr>
+        <w:spacing w:line="360" w:lineRule="auto"/>
+        <w:ind w:firstLine="708"/>
+        <w:jc w:val="both"/>
+        <w:rPr>
+          <w:sz w:val="28"/>
+          <w:szCs w:val="28"/>
+        </w:rPr>
+      </w:pPr>
+      <w:r>
+        <w:rPr>
+          <w:sz w:val="28"/>
+          <w:szCs w:val="28"/>
+        </w:rPr>
+        <w:t xml:space="preserve">Полученные смещения малы по сравнению со значениями параметров. </w:t>
+      </w:r>
+    </w:p>
+    <w:p>
+      <w:pPr>
+        <w:spacing w:line="360" w:lineRule="auto"/>
+        <w:ind w:firstLine="708"/>
+        <w:jc w:val="center"/>
+        <w:rPr>
+          <w:sz w:val="28"/>
+          <w:szCs w:val="28"/>
+          <w:lang w:val="en-US"/>
+        </w:rPr>
+      </w:pPr>
+      <w:r>
+        <w:rPr>
+          <w:sz w:val="28"/>
+          <w:szCs w:val="28"/>
+        </w:rPr>
+        <w:drawing>
+          <wp:inline distT="0" distB="0" distL="0" distR="0" wp14:anchorId="567E1A76" wp14:editId="661A6803">
+            <wp:extent cx="5426547" cy="4358640"/>
+            <wp:effectExtent l="0" t="0" r="3175" b="3810"/>
+            <wp:docPr id="38" name="Рисунок 38"/>
+            <wp:cNvGraphicFramePr>
+              <a:graphicFrameLocks xmlns:a="http://schemas.openxmlformats.org/drawingml/2006/main" noChangeAspect="1"/>
+            </wp:cNvGraphicFramePr>
+            <a:graphic xmlns:a="http://schemas.openxmlformats.org/drawingml/2006/main">
+              <a:graphicData uri="http://schemas.openxmlformats.org/drawingml/2006/picture">
+                <pic:pic xmlns:pic="http://schemas.openxmlformats.org/drawingml/2006/picture">
+                  <pic:nvPicPr>
+                    <pic:cNvPr id="1" name=""/>
+                    <pic:cNvPicPr/>
+                  </pic:nvPicPr>
+                  <pic:blipFill>
+                    <a:blip r:embed="rId33"/>
+                    <a:stretch>
+                      <a:fillRect/>
+                    </a:stretch>
+                  </pic:blipFill>
+                  <pic:spPr>
+                    <a:xfrm>
+                      <a:off x="0" y="0"/>
+                      <a:ext cx="5434291" cy="4364860"/>
+                    </a:xfrm>
+                    <a:prstGeom prst="rect">
+                      <a:avLst/>
+                    </a:prstGeom>
+                  </pic:spPr>
+                </pic:pic>
+              </a:graphicData>
+            </a:graphic>
+          </wp:inline>
+        </w:drawing>
+      </w:r>
+    </w:p>
+    <w:p>
+      <w:pPr>
+        <w:spacing w:line="360" w:lineRule="auto"/>
+        <w:ind w:firstLine="708"/>
+        <w:jc w:val="center"/>
+        <w:rPr>
+          <w:sz w:val="28"/>
+          <w:szCs w:val="28"/>
+        </w:rPr>
+      </w:pPr>
+      <w:r>
+        <w:rPr>
+          <w:sz w:val="28"/>
+          <w:szCs w:val="28"/>
+        </w:rPr>
+        <w:t>Листинг 16. Генерация 1000 выборок</w:t>
+      </w:r>
+    </w:p>
+    <w:p>
+      <w:pPr>
+        <w:spacing w:line="360" w:lineRule="auto"/>
+        <w:ind w:firstLine="708"/>
+        <w:jc w:val="both"/>
+        <w:rPr>
+          <w:sz w:val="28"/>
+          <w:szCs w:val="28"/>
+          <w:lang w:val="en-US"/>
+        </w:rPr>
+      </w:pPr>
+      <w:r>
+        <w:rPr>
+          <w:sz w:val="28"/>
+          <w:szCs w:val="28"/>
+        </w:rPr>
+        <w:drawing>
+          <wp:inline distT="0" distB="0" distL="0" distR="0" wp14:anchorId="558F35DB" wp14:editId="1D69F2F2">
+            <wp:extent cx="5570220" cy="976500"/>
+            <wp:effectExtent l="0" t="0" r="0" b="0"/>
+            <wp:docPr id="39" name="Рисунок 39"/>
+            <wp:cNvGraphicFramePr>
+              <a:graphicFrameLocks xmlns:a="http://schemas.openxmlformats.org/drawingml/2006/main" noChangeAspect="1"/>
+            </wp:cNvGraphicFramePr>
+            <a:graphic xmlns:a="http://schemas.openxmlformats.org/drawingml/2006/main">
+              <a:graphicData uri="http://schemas.openxmlformats.org/drawingml/2006/picture">
+                <pic:pic xmlns:pic="http://schemas.openxmlformats.org/drawingml/2006/picture">
+                  <pic:nvPicPr>
+                    <pic:cNvPr id="1" name=""/>
+                    <pic:cNvPicPr/>
+                  </pic:nvPicPr>
+                  <pic:blipFill>
+                    <a:blip r:embed="rId34"/>
+                    <a:stretch>
+                      <a:fillRect/>
+                    </a:stretch>
+                  </pic:blipFill>
+                  <pic:spPr>
+                    <a:xfrm>
+                      <a:off x="0" y="0"/>
+                      <a:ext cx="5588540" cy="979712"/>
+                    </a:xfrm>
+                    <a:prstGeom prst="rect">
+                      <a:avLst/>
+                    </a:prstGeom>
+                  </pic:spPr>
+                </pic:pic>
+              </a:graphicData>
+            </a:graphic>
+          </wp:inline>
+        </w:drawing>
+      </w:r>
+    </w:p>
+    <w:p>
+      <w:pPr>
+        <w:spacing w:line="360" w:lineRule="auto"/>
+        <w:ind w:firstLine="708"/>
+        <w:jc w:val="center"/>
+        <w:rPr>
+          <w:sz w:val="28"/>
+          <w:szCs w:val="28"/>
+        </w:rPr>
+      </w:pPr>
+      <w:r>
+        <w:rPr>
+          <w:sz w:val="28"/>
+          <w:szCs w:val="28"/>
+        </w:rPr>
+        <w:t>Листинг 17. Подсчет сетки численных значений ТФР.</w:t>
+      </w:r>
+    </w:p>
+    <w:p>
+      <w:pPr>
+        <w:spacing w:line="360" w:lineRule="auto"/>
+        <w:ind w:firstLine="708"/>
+        <w:jc w:val="center"/>
+        <w:rPr>
+          <w:sz w:val="28"/>
+          <w:szCs w:val="28"/>
+        </w:rPr>
+      </w:pPr>
+    </w:p>
+    <w:p>
+      <w:pPr>
+        <w:spacing w:line="360" w:lineRule="auto"/>
+        <w:ind w:firstLine="708"/>
+        <w:jc w:val="center"/>
+        <w:rPr>
+          <w:sz w:val="28"/>
+          <w:szCs w:val="28"/>
+        </w:rPr>
+      </w:pPr>
+      <w:r>
+        <w:rPr>
+          <w:sz w:val="28"/>
+          <w:szCs w:val="28"/>
+        </w:rPr>
+        <w:lastRenderedPageBreak/>
+        <w:drawing>
+          <wp:inline distT="0" distB="0" distL="0" distR="0" wp14:anchorId="07431FC0" wp14:editId="105F7BCA">
+            <wp:extent cx="5408232" cy="2865120"/>
+            <wp:effectExtent l="0" t="0" r="2540" b="0"/>
+            <wp:docPr id="40" name="Рисунок 40"/>
+            <wp:cNvGraphicFramePr>
+              <a:graphicFrameLocks xmlns:a="http://schemas.openxmlformats.org/drawingml/2006/main" noChangeAspect="1"/>
+            </wp:cNvGraphicFramePr>
+            <a:graphic xmlns:a="http://schemas.openxmlformats.org/drawingml/2006/main">
+              <a:graphicData uri="http://schemas.openxmlformats.org/drawingml/2006/picture">
+                <pic:pic xmlns:pic="http://schemas.openxmlformats.org/drawingml/2006/picture">
+                  <pic:nvPicPr>
+                    <pic:cNvPr id="1" name=""/>
+                    <pic:cNvPicPr/>
+                  </pic:nvPicPr>
+                  <pic:blipFill>
+                    <a:blip r:embed="rId35"/>
+                    <a:stretch>
+                      <a:fillRect/>
+                    </a:stretch>
+                  </pic:blipFill>
+                  <pic:spPr>
+                    <a:xfrm>
+                      <a:off x="0" y="0"/>
+                      <a:ext cx="5413547" cy="2867935"/>
+                    </a:xfrm>
+                    <a:prstGeom prst="rect">
+                      <a:avLst/>
+                    </a:prstGeom>
+                  </pic:spPr>
+                </pic:pic>
+              </a:graphicData>
+            </a:graphic>
+          </wp:inline>
+        </w:drawing>
+      </w:r>
+    </w:p>
+    <w:p>
+      <w:pPr>
+        <w:spacing w:line="360" w:lineRule="auto"/>
+        <w:ind w:firstLine="708"/>
+        <w:jc w:val="center"/>
+        <w:rPr>
+          <w:sz w:val="28"/>
+          <w:szCs w:val="28"/>
+          <w:lang w:val="en-US"/>
+        </w:rPr>
+      </w:pPr>
+      <w:r>
+        <w:rPr>
+          <w:sz w:val="28"/>
+          <w:szCs w:val="28"/>
+        </w:rPr>
+        <w:t xml:space="preserve">Листинг 18. Проверка </w:t>
+      </w:r>
+      <w:proofErr w:type="spellStart"/>
+      <w:r>
+        <w:rPr>
+          <w:sz w:val="28"/>
+          <w:szCs w:val="28"/>
+        </w:rPr>
+        <w:t>несмещенности</w:t>
+      </w:r>
+      <w:proofErr w:type="spellEnd"/>
+      <w:r>
+        <w:rPr>
+          <w:sz w:val="28"/>
+          <w:szCs w:val="28"/>
+        </w:rPr>
+        <w:t xml:space="preserve"> с помощью ММ.</w:t>
+      </w:r>
+    </w:p>
+    <w:p>
+      <w:pPr>
+        <w:spacing w:line="360" w:lineRule="auto"/>
+        <w:ind w:firstLine="708"/>
+        <w:jc w:val="center"/>
+        <w:rPr>
+          <w:sz w:val="28"/>
+          <w:szCs w:val="28"/>
+          <w:lang w:val="en-US"/>
+        </w:rPr>
+      </w:pPr>
+      <w:r>
+        <w:rPr>
+          <w:sz w:val="28"/>
+          <w:szCs w:val="28"/>
+          <w:lang w:val="en-US"/>
+        </w:rPr>
+        <w:drawing>
+          <wp:inline distT="0" distB="0" distL="0" distR="0" wp14:anchorId="203A9FCD" wp14:editId="46D03A67">
+            <wp:extent cx="5940425" cy="3582035"/>
+            <wp:effectExtent l="0" t="0" r="3175" b="0"/>
+            <wp:docPr id="41" name="Рисунок 41"/>
+            <wp:cNvGraphicFramePr>
+              <a:graphicFrameLocks xmlns:a="http://schemas.openxmlformats.org/drawingml/2006/main" noChangeAspect="1"/>
+            </wp:cNvGraphicFramePr>
+            <a:graphic xmlns:a="http://schemas.openxmlformats.org/drawingml/2006/main">
+              <a:graphicData uri="http://schemas.openxmlformats.org/drawingml/2006/picture">
+                <pic:pic xmlns:pic="http://schemas.openxmlformats.org/drawingml/2006/picture">
+                  <pic:nvPicPr>
+                    <pic:cNvPr id="1" name=""/>
+                    <pic:cNvPicPr/>
+                  </pic:nvPicPr>
+                  <pic:blipFill>
+                    <a:blip r:embed="rId36"/>
+                    <a:stretch>
+                      <a:fillRect/>
+                    </a:stretch>
+                  </pic:blipFill>
+                  <pic:spPr>
+                    <a:xfrm>
+                      <a:off x="0" y="0"/>
+                      <a:ext cx="5940425" cy="3582035"/>
+                    </a:xfrm>
+                    <a:prstGeom prst="rect">
+                      <a:avLst/>
+                    </a:prstGeom>
+                  </pic:spPr>
+                </pic:pic>
+              </a:graphicData>
+            </a:graphic>
+          </wp:inline>
+        </w:drawing>
+      </w:r>
+    </w:p>
+    <w:p>
+      <w:pPr>
+        <w:spacing w:line="360" w:lineRule="auto"/>
+        <w:ind w:firstLine="708"/>
+        <w:jc w:val="center"/>
+        <w:rPr>
+          <w:sz w:val="28"/>
+          <w:szCs w:val="28"/>
+        </w:rPr>
+      </w:pPr>
+      <w:r>
+        <w:rPr>
+          <w:sz w:val="28"/>
+          <w:szCs w:val="28"/>
+        </w:rPr>
+        <w:t xml:space="preserve">Листинг 19. Проверка </w:t>
+      </w:r>
+      <w:proofErr w:type="spellStart"/>
+      <w:r>
+        <w:rPr>
+          <w:sz w:val="28"/>
+          <w:szCs w:val="28"/>
+        </w:rPr>
+        <w:t>несмещенности</w:t>
+      </w:r>
+      <w:proofErr w:type="spellEnd"/>
+      <w:r>
+        <w:rPr>
+          <w:sz w:val="28"/>
+          <w:szCs w:val="28"/>
+        </w:rPr>
+        <w:t xml:space="preserve"> с помощью ММП.</w:t>
+      </w:r>
+    </w:p>
+    <w:p>
+      <w:pPr>
+        <w:spacing w:line="360" w:lineRule="auto"/>
+        <w:ind w:firstLine="708"/>
+        <w:jc w:val="both"/>
+        <w:rPr>
+          <w:sz w:val="28"/>
+          <w:szCs w:val="28"/>
+        </w:rPr>
+      </w:pPr>
+    </w:p>
+    <w:p>
+      <w:pPr>
+        <w:spacing w:line="360" w:lineRule="auto"/>
+        <w:jc w:val="both"/>
+        <w:rPr>
+          <w:sz w:val="28"/>
+          <w:szCs w:val="28"/>
+        </w:rPr>
+      </w:pPr>
     </w:p>
     <w:p>
       <w:pPr>
@@ -14777,6 +16433,7 @@
           <w:szCs w:val="28"/>
           <w:lang w:val="en-US"/>
         </w:rPr>
+        <w:lastRenderedPageBreak/>
         <w:t>[1] Pearson K. Tables of the Incomplete Gamma-Function / computed by the staff of the Department of Applied Statistics, University of London. — London: University of London, 1922. — URL</w:t>
       </w:r>
       <w:r>
@@ -14787,7 +16444,7 @@
         </w:rPr>
         <w:t xml:space="preserve">: </w:t>
       </w:r>
-      <w:hyperlink r:id="rId33" w:history="1">
+      <w:hyperlink r:id="rId37" w:history="1">
         <w:r>
           <w:rPr>
             <w:rStyle w:val="ac"/>
@@ -15093,7 +16750,7 @@
         </w:rPr>
         <w:t xml:space="preserve"> </w:t>
       </w:r>
-      <w:hyperlink r:id="rId34" w:history="1">
+      <w:hyperlink r:id="rId38" w:history="1">
         <w:r>
           <w:rPr>
             <w:rStyle w:val="ac"/>

</xml_diff>

<commit_message>
UPDATE: отчет DATE: 2026-09-22 03:09:26
</commit_message>
<xml_diff>
--- a/Учеба 4 семестр/Теория вероятности/Курсовая работа/Отчет, Код/Курсовая_работа.docx
+++ b/Учеба 4 семестр/Теория вероятности/Курсовая работа/Отчет, Код/Курсовая_работа.docx
@@ -257,8 +257,16 @@
           <w:szCs w:val="28"/>
         </w:rPr>
         <w:tab/>
+      </w:r>
+      <w:proofErr w:type="spellStart"/>
+      <w:r>
+        <w:rPr>
+          <w:sz w:val="28"/>
+          <w:szCs w:val="28"/>
+        </w:rPr>
         <w:t>И.А.Эков</w:t>
       </w:r>
+      <w:proofErr w:type="spellEnd"/>
     </w:p>
     <w:p>
       <w:pPr>
@@ -309,6 +317,7 @@
         </w:rPr>
         <w:tab/>
       </w:r>
+      <w:proofErr w:type="spellStart"/>
       <w:r>
         <w:rPr>
           <w:sz w:val="28"/>
@@ -316,6 +325,7 @@
         </w:rPr>
         <w:t>Р.А.Ажермачев</w:t>
       </w:r>
+      <w:proofErr w:type="spellEnd"/>
     </w:p>
     <w:p>
       <w:pPr>
@@ -379,8 +389,16 @@
           <w:szCs w:val="28"/>
         </w:rPr>
         <w:tab/>
+      </w:r>
+      <w:proofErr w:type="spellStart"/>
+      <w:r>
+        <w:rPr>
+          <w:sz w:val="28"/>
+          <w:szCs w:val="28"/>
+        </w:rPr>
         <w:t>О.А.Пахомова</w:t>
       </w:r>
+      <w:proofErr w:type="spellEnd"/>
     </w:p>
     <w:p>
       <w:pPr>
@@ -839,8 +857,17 @@
           <w:sz w:val="28"/>
           <w:szCs w:val="28"/>
         </w:rPr>
-        <w:t>4.2. Реализация на языке Python и анализ подвыборок</w:t>
-      </w:r>
+        <w:t xml:space="preserve">4.2. Реализация на языке Python и анализ </w:t>
+      </w:r>
+      <w:proofErr w:type="spellStart"/>
+      <w:r>
+        <w:rPr>
+          <w:sz w:val="28"/>
+          <w:szCs w:val="28"/>
+        </w:rPr>
+        <w:t>подвыборок</w:t>
+      </w:r>
+      <w:proofErr w:type="spellEnd"/>
       <w:r>
         <w:rPr>
           <w:sz w:val="28"/>
@@ -1926,7 +1953,23 @@
           <w:sz w:val="28"/>
           <w:szCs w:val="28"/>
         </w:rPr>
-        <w:t>Объектом исследования является выборка случайной величины, подчиняющейся двойному гамма распределению. Предметом исследования — статистические свойства данной выборки и методы её анализа.</w:t>
+        <w:t xml:space="preserve">Объектом исследования является выборка случайной величины, подчиняющейся </w:t>
+      </w:r>
+      <w:proofErr w:type="gramStart"/>
+      <w:r>
+        <w:rPr>
+          <w:sz w:val="28"/>
+          <w:szCs w:val="28"/>
+        </w:rPr>
+        <w:t>двойному</w:t>
+      </w:r>
+      <w:proofErr w:type="gramEnd"/>
+      <w:r>
+        <w:rPr>
+          <w:sz w:val="28"/>
+          <w:szCs w:val="28"/>
+        </w:rPr>
+        <w:t xml:space="preserve"> гамма распределению. Предметом исследования — статистические свойства данной выборки и методы её анализа.</w:t>
       </w:r>
     </w:p>
     <w:p>
@@ -1955,7 +1998,39 @@
           <w:sz w:val="28"/>
           <w:szCs w:val="28"/>
         </w:rPr>
-        <w:t>Работа выполнена с использованием языка программирования Python в среде Jupyter Notebook. Все вычисления реализованы самостоятельно, без применения готовых статистических библиотек там, где это оговорено заданием.</w:t>
+        <w:t xml:space="preserve">Работа выполнена с использованием языка программирования Python в среде </w:t>
+      </w:r>
+      <w:proofErr w:type="spellStart"/>
+      <w:r>
+        <w:rPr>
+          <w:sz w:val="28"/>
+          <w:szCs w:val="28"/>
+        </w:rPr>
+        <w:t>Jupyter</w:t>
+      </w:r>
+      <w:proofErr w:type="spellEnd"/>
+      <w:r>
+        <w:rPr>
+          <w:sz w:val="28"/>
+          <w:szCs w:val="28"/>
+        </w:rPr>
+        <w:t xml:space="preserve"> </w:t>
+      </w:r>
+      <w:proofErr w:type="spellStart"/>
+      <w:r>
+        <w:rPr>
+          <w:sz w:val="28"/>
+          <w:szCs w:val="28"/>
+        </w:rPr>
+        <w:t>Notebook</w:t>
+      </w:r>
+      <w:proofErr w:type="spellEnd"/>
+      <w:r>
+        <w:rPr>
+          <w:sz w:val="28"/>
+          <w:szCs w:val="28"/>
+        </w:rPr>
+        <w:t>. Все вычисления реализованы самостоятельно, без применения готовых статистических библиотек там, где это оговорено заданием.</w:t>
       </w:r>
     </w:p>
     <w:p>
@@ -2281,6 +2356,7 @@
         </w:rPr>
         <w:t xml:space="preserve">Гамма-распределение определено только для неотрицательных значений случайной величины, что ограничивает его применимость при моделировании симметричных процессов [2]. Для преодоления этого ограничения исследователями было предложено его естественное расширение на всю числовую ось — двойное гамма-распределение (также называемое отражённым гамма-распределением, англ. </w:t>
       </w:r>
+      <w:proofErr w:type="spellStart"/>
       <w:r>
         <w:rPr>
           <w:i/>
@@ -2288,8 +2364,49 @@
           <w:sz w:val="28"/>
           <w:szCs w:val="28"/>
         </w:rPr>
-        <w:t>Reflected gamma distribution</w:t>
-      </w:r>
+        <w:t>Reflected</w:t>
+      </w:r>
+      <w:proofErr w:type="spellEnd"/>
+      <w:r>
+        <w:rPr>
+          <w:i/>
+          <w:iCs/>
+          <w:sz w:val="28"/>
+          <w:szCs w:val="28"/>
+        </w:rPr>
+        <w:t xml:space="preserve"> </w:t>
+      </w:r>
+      <w:proofErr w:type="spellStart"/>
+      <w:r>
+        <w:rPr>
+          <w:i/>
+          <w:iCs/>
+          <w:sz w:val="28"/>
+          <w:szCs w:val="28"/>
+        </w:rPr>
+        <w:t>gamma</w:t>
+      </w:r>
+      <w:proofErr w:type="spellEnd"/>
+      <w:r>
+        <w:rPr>
+          <w:i/>
+          <w:iCs/>
+          <w:sz w:val="28"/>
+          <w:szCs w:val="28"/>
+        </w:rPr>
+        <w:t xml:space="preserve"> </w:t>
+      </w:r>
+      <w:proofErr w:type="spellStart"/>
+      <w:r>
+        <w:rPr>
+          <w:i/>
+          <w:iCs/>
+          <w:sz w:val="28"/>
+          <w:szCs w:val="28"/>
+        </w:rPr>
+        <w:t>distribution</w:t>
+      </w:r>
+      <w:proofErr w:type="spellEnd"/>
       <w:r>
         <w:rPr>
           <w:sz w:val="28"/>
@@ -2898,7 +3015,71 @@
           <w:sz w:val="28"/>
           <w:szCs w:val="28"/>
         </w:rPr>
-        <w:t xml:space="preserve">Несмотря на то, что двойное гамма-распределение не является специализированным инструментом информационной безопасности, его свойства находят применение в ряде смежных задач. В частности, как показано в работе Bahashwan, Kalantan и Adham [3], метод главных компонент (PCA), основанный на двойном гамма-распределении для моделирования шума, демонстрирует повышенную устойчивость к выбросам по сравнению с классическим гауссовским PCA. Данное свойство актуально при анализе сетевого трафика, где наблюдаемые данные, как правило, содержат выбросы и нештатные значения, характерные для атак типа DoS или аномального поведения пользователей. Применение устойчивых к шуму и выбросам методов снижения размерности позволяет выделять информативные признаки из зашумлённых данных, что является одним из ключевых этапов в системах обнаружения вторжений (IDS). </w:t>
+        <w:t xml:space="preserve">Несмотря на то, что двойное гамма-распределение не является специализированным инструментом информационной безопасности, его свойства находят применение в ряде смежных задач. В частности, как показано в работе </w:t>
+      </w:r>
+      <w:proofErr w:type="spellStart"/>
+      <w:r>
+        <w:rPr>
+          <w:sz w:val="28"/>
+          <w:szCs w:val="28"/>
+        </w:rPr>
+        <w:t>Bahashwan</w:t>
+      </w:r>
+      <w:proofErr w:type="spellEnd"/>
+      <w:r>
+        <w:rPr>
+          <w:sz w:val="28"/>
+          <w:szCs w:val="28"/>
+        </w:rPr>
+        <w:t xml:space="preserve">, </w:t>
+      </w:r>
+      <w:proofErr w:type="spellStart"/>
+      <w:r>
+        <w:rPr>
+          <w:sz w:val="28"/>
+          <w:szCs w:val="28"/>
+        </w:rPr>
+        <w:t>Kalantan</w:t>
+      </w:r>
+      <w:proofErr w:type="spellEnd"/>
+      <w:r>
+        <w:rPr>
+          <w:sz w:val="28"/>
+          <w:szCs w:val="28"/>
+        </w:rPr>
+        <w:t xml:space="preserve"> и </w:t>
+      </w:r>
+      <w:proofErr w:type="spellStart"/>
+      <w:r>
+        <w:rPr>
+          <w:sz w:val="28"/>
+          <w:szCs w:val="28"/>
+        </w:rPr>
+        <w:t>Adham</w:t>
+      </w:r>
+      <w:proofErr w:type="spellEnd"/>
+      <w:r>
+        <w:rPr>
+          <w:sz w:val="28"/>
+          <w:szCs w:val="28"/>
+        </w:rPr>
+        <w:t xml:space="preserve"> [3], метод главных компонент (PCA), основанный на двойном гамма-распределении для моделирования шума, демонстрирует повышенную устойчивость к выбросам по сравнению с классическим гауссовским PCA. Данное свойство актуально при анализе сетевого трафика, где наблюдаемые данные, как правило, содержат выбросы и нештатные значения, характерные для атак типа </w:t>
+      </w:r>
+      <w:proofErr w:type="spellStart"/>
+      <w:r>
+        <w:rPr>
+          <w:sz w:val="28"/>
+          <w:szCs w:val="28"/>
+        </w:rPr>
+        <w:t>DoS</w:t>
+      </w:r>
+      <w:proofErr w:type="spellEnd"/>
+      <w:r>
+        <w:rPr>
+          <w:sz w:val="28"/>
+          <w:szCs w:val="28"/>
+        </w:rPr>
+        <w:t xml:space="preserve"> или аномального поведения пользователей. Применение устойчивых к шуму и выбросам методов снижения размерности позволяет выделять информативные признаки из зашумлённых данных, что является одним из ключевых этапов в системах обнаружения вторжений (IDS). </w:t>
       </w:r>
     </w:p>
     <w:p>
@@ -5541,7 +5722,23 @@
           <w:sz w:val="28"/>
           <w:szCs w:val="28"/>
         </w:rPr>
-        <w:t>С помощью функции единичного скачка (функции Хевисайда) эмпирическую функцию распределения можно записать в виде [4]:</w:t>
+        <w:t xml:space="preserve">С помощью функции единичного скачка (функции </w:t>
+      </w:r>
+      <w:proofErr w:type="spellStart"/>
+      <w:r>
+        <w:rPr>
+          <w:sz w:val="28"/>
+          <w:szCs w:val="28"/>
+        </w:rPr>
+        <w:t>Хевисайда</w:t>
+      </w:r>
+      <w:proofErr w:type="spellEnd"/>
+      <w:r>
+        <w:rPr>
+          <w:sz w:val="28"/>
+          <w:szCs w:val="28"/>
+        </w:rPr>
+        <w:t>) эмпирическую функцию распределения можно записать в виде [4]:</w:t>
       </w:r>
     </w:p>
     <w:p>
@@ -5731,7 +5928,23 @@
           <w:sz w:val="28"/>
           <w:szCs w:val="28"/>
         </w:rPr>
-        <w:t>где функция Хевисайда e(x) определяется следующим образом:</w:t>
+        <w:t xml:space="preserve">где функция </w:t>
+      </w:r>
+      <w:proofErr w:type="spellStart"/>
+      <w:r>
+        <w:rPr>
+          <w:sz w:val="28"/>
+          <w:szCs w:val="28"/>
+        </w:rPr>
+        <w:t>Хевисайда</w:t>
+      </w:r>
+      <w:proofErr w:type="spellEnd"/>
+      <w:r>
+        <w:rPr>
+          <w:sz w:val="28"/>
+          <w:szCs w:val="28"/>
+        </w:rPr>
+        <w:t xml:space="preserve"> e(x) определяется следующим образом:</w:t>
       </w:r>
     </w:p>
     <w:p>
@@ -6959,7 +7172,23 @@
           <w:szCs w:val="28"/>
         </w:rPr>
         <w:lastRenderedPageBreak/>
-        <w:t xml:space="preserve">Для анализа поведения ЭФР были сформированы три случайные подвыборки размером 10, 100 и 200 элементов из исходной выборки </w:t>
+        <w:t xml:space="preserve">Для анализа поведения ЭФР были сформированы три случайные </w:t>
+      </w:r>
+      <w:proofErr w:type="spellStart"/>
+      <w:r>
+        <w:rPr>
+          <w:sz w:val="28"/>
+          <w:szCs w:val="28"/>
+        </w:rPr>
+        <w:t>подвыборки</w:t>
+      </w:r>
+      <w:proofErr w:type="spellEnd"/>
+      <w:r>
+        <w:rPr>
+          <w:sz w:val="28"/>
+          <w:szCs w:val="28"/>
+        </w:rPr>
+        <w:t xml:space="preserve"> размером 10, 100 и 200 элементов из исходной выборки </w:t>
       </w:r>
       <m:oMath>
         <m:r>
@@ -7061,7 +7290,23 @@
           <w:sz w:val="28"/>
           <w:szCs w:val="28"/>
         </w:rPr>
-        <w:t xml:space="preserve">Рисунок 1. График эмпирической функции распределения для подвыборки из 10 элементов. </w:t>
+        <w:t xml:space="preserve">Рисунок 1. График эмпирической функции распределения для </w:t>
+      </w:r>
+      <w:proofErr w:type="spellStart"/>
+      <w:r>
+        <w:rPr>
+          <w:sz w:val="28"/>
+          <w:szCs w:val="28"/>
+        </w:rPr>
+        <w:t>подвыборки</w:t>
+      </w:r>
+      <w:proofErr w:type="spellEnd"/>
+      <w:r>
+        <w:rPr>
+          <w:sz w:val="28"/>
+          <w:szCs w:val="28"/>
+        </w:rPr>
+        <w:t xml:space="preserve"> из 10 элементов. </w:t>
       </w:r>
     </w:p>
     <w:p>
@@ -7130,7 +7375,23 @@
           <w:sz w:val="28"/>
           <w:szCs w:val="28"/>
         </w:rPr>
-        <w:t xml:space="preserve">Рисунок 2. График эмпирической функции распределения для подвыборки из 100 элементов. </w:t>
+        <w:t xml:space="preserve">Рисунок 2. График эмпирической функции распределения для </w:t>
+      </w:r>
+      <w:proofErr w:type="spellStart"/>
+      <w:r>
+        <w:rPr>
+          <w:sz w:val="28"/>
+          <w:szCs w:val="28"/>
+        </w:rPr>
+        <w:t>подвыборки</w:t>
+      </w:r>
+      <w:proofErr w:type="spellEnd"/>
+      <w:r>
+        <w:rPr>
+          <w:sz w:val="28"/>
+          <w:szCs w:val="28"/>
+        </w:rPr>
+        <w:t xml:space="preserve"> из 100 элементов. </w:t>
       </w:r>
     </w:p>
     <w:p>
@@ -7209,7 +7470,23 @@
           <w:sz w:val="28"/>
           <w:szCs w:val="28"/>
         </w:rPr>
-        <w:t>Рисунок 3. График эмпирической функции распределения для подвыборки из 200 элементов.</w:t>
+        <w:t xml:space="preserve">Рисунок 3. График эмпирической функции распределения для </w:t>
+      </w:r>
+      <w:proofErr w:type="spellStart"/>
+      <w:r>
+        <w:rPr>
+          <w:sz w:val="28"/>
+          <w:szCs w:val="28"/>
+        </w:rPr>
+        <w:t>подвыборки</w:t>
+      </w:r>
+      <w:proofErr w:type="spellEnd"/>
+      <w:r>
+        <w:rPr>
+          <w:sz w:val="28"/>
+          <w:szCs w:val="28"/>
+        </w:rPr>
+        <w:t xml:space="preserve"> из 200 элементов.</w:t>
       </w:r>
     </w:p>
     <w:p>
@@ -7260,7 +7537,23 @@
           <w:sz w:val="28"/>
           <w:szCs w:val="28"/>
         </w:rPr>
-        <w:t xml:space="preserve">. При увеличении объёма подвыборки эмпирическая функция распределения заметно приближается к теоретической. При </w:t>
+        <w:t xml:space="preserve">. При увеличении объёма </w:t>
+      </w:r>
+      <w:proofErr w:type="spellStart"/>
+      <w:r>
+        <w:rPr>
+          <w:sz w:val="28"/>
+          <w:szCs w:val="28"/>
+        </w:rPr>
+        <w:t>подвыборки</w:t>
+      </w:r>
+      <w:proofErr w:type="spellEnd"/>
+      <w:r>
+        <w:rPr>
+          <w:sz w:val="28"/>
+          <w:szCs w:val="28"/>
+        </w:rPr>
+        <w:t xml:space="preserve"> эмпирическая функция распределения заметно приближается к теоретической. При </w:t>
       </w:r>
       <m:oMath>
         <m:r>
@@ -8476,12 +8769,21 @@
         </w:rPr>
         <w:t> и</w:t>
       </w:r>
-      <w:r>
-        <w:rPr>
-          <w:sz w:val="28"/>
-          <w:szCs w:val="28"/>
-        </w:rPr>
-        <w:t xml:space="preserve">нтервалов; в реализации принято </w:t>
+      <w:proofErr w:type="spellStart"/>
+      <w:r>
+        <w:rPr>
+          <w:sz w:val="28"/>
+          <w:szCs w:val="28"/>
+        </w:rPr>
+        <w:t>нтервалов</w:t>
+      </w:r>
+      <w:proofErr w:type="spellEnd"/>
+      <w:r>
+        <w:rPr>
+          <w:sz w:val="28"/>
+          <w:szCs w:val="28"/>
+        </w:rPr>
+        <w:t xml:space="preserve">; в реализации принято </w:t>
       </w:r>
       <m:oMath>
         <m:r>
@@ -9311,7 +9613,23 @@
           <w:sz w:val="28"/>
           <w:szCs w:val="28"/>
         </w:rPr>
-        <w:t>Результаты работы функции для случайных подвыборок размером 10, 100 и 200 элементов — на рисунках </w:t>
+        <w:t xml:space="preserve">Результаты работы функции для случайных </w:t>
+      </w:r>
+      <w:proofErr w:type="spellStart"/>
+      <w:r>
+        <w:rPr>
+          <w:sz w:val="28"/>
+          <w:szCs w:val="28"/>
+        </w:rPr>
+        <w:t>подвыборок</w:t>
+      </w:r>
+      <w:proofErr w:type="spellEnd"/>
+      <w:r>
+        <w:rPr>
+          <w:sz w:val="28"/>
+          <w:szCs w:val="28"/>
+        </w:rPr>
+        <w:t xml:space="preserve"> размером 10, 100 и 200 элементов — на рисунках </w:t>
       </w:r>
       <w:r>
         <w:rPr>
@@ -9455,7 +9773,27 @@
           <w:sz w:val="28"/>
           <w:szCs w:val="28"/>
         </w:rPr>
-        <w:t>Вид гистограмм для случайных подвыборок размера 10, 100, 200</w:t>
+        <w:t xml:space="preserve">Вид гистограмм для случайных </w:t>
+      </w:r>
+      <w:proofErr w:type="spellStart"/>
+      <w:r>
+        <w:rPr>
+          <w:b/>
+          <w:bCs/>
+          <w:sz w:val="28"/>
+          <w:szCs w:val="28"/>
+        </w:rPr>
+        <w:t>подвыборок</w:t>
+      </w:r>
+      <w:proofErr w:type="spellEnd"/>
+      <w:r>
+        <w:rPr>
+          <w:b/>
+          <w:bCs/>
+          <w:sz w:val="28"/>
+          <w:szCs w:val="28"/>
+        </w:rPr>
+        <w:t xml:space="preserve"> размера 10, 100, 200</w:t>
       </w:r>
     </w:p>
     <w:p>
@@ -9551,7 +9889,23 @@
           <w:sz w:val="28"/>
           <w:szCs w:val="28"/>
         </w:rPr>
-        <w:t> – Гистограмма для подвыборки из 10 элементов</w:t>
+        <w:t xml:space="preserve"> – Гистограмма для </w:t>
+      </w:r>
+      <w:proofErr w:type="spellStart"/>
+      <w:r>
+        <w:rPr>
+          <w:sz w:val="28"/>
+          <w:szCs w:val="28"/>
+        </w:rPr>
+        <w:t>подвыборки</w:t>
+      </w:r>
+      <w:proofErr w:type="spellEnd"/>
+      <w:r>
+        <w:rPr>
+          <w:sz w:val="28"/>
+          <w:szCs w:val="28"/>
+        </w:rPr>
+        <w:t xml:space="preserve"> из 10 элементов</w:t>
       </w:r>
     </w:p>
     <w:p>
@@ -9644,7 +9998,23 @@
           <w:sz w:val="28"/>
           <w:szCs w:val="28"/>
         </w:rPr>
-        <w:t> – Гистограмма для подвыборки из 100 элементов</w:t>
+        <w:t xml:space="preserve"> – Гистограмма для </w:t>
+      </w:r>
+      <w:proofErr w:type="spellStart"/>
+      <w:r>
+        <w:rPr>
+          <w:sz w:val="28"/>
+          <w:szCs w:val="28"/>
+        </w:rPr>
+        <w:t>подвыборки</w:t>
+      </w:r>
+      <w:proofErr w:type="spellEnd"/>
+      <w:r>
+        <w:rPr>
+          <w:sz w:val="28"/>
+          <w:szCs w:val="28"/>
+        </w:rPr>
+        <w:t xml:space="preserve"> из 100 элементов</w:t>
       </w:r>
     </w:p>
     <w:p>
@@ -9747,7 +10117,23 @@
           <w:sz w:val="28"/>
           <w:szCs w:val="28"/>
         </w:rPr>
-        <w:t> – Гистограмма для подвыборки из 200 элементов.</w:t>
+        <w:t xml:space="preserve"> – Гистограмма для </w:t>
+      </w:r>
+      <w:proofErr w:type="spellStart"/>
+      <w:r>
+        <w:rPr>
+          <w:sz w:val="28"/>
+          <w:szCs w:val="28"/>
+        </w:rPr>
+        <w:t>подвыборки</w:t>
+      </w:r>
+      <w:proofErr w:type="spellEnd"/>
+      <w:r>
+        <w:rPr>
+          <w:sz w:val="28"/>
+          <w:szCs w:val="28"/>
+        </w:rPr>
+        <w:t xml:space="preserve"> из 200 элементов.</w:t>
       </w:r>
     </w:p>
     <w:p>
@@ -9814,6 +10200,7 @@
           <w:szCs w:val="28"/>
         </w:rPr>
       </w:pPr>
+      <w:proofErr w:type="spellStart"/>
       <w:r>
         <w:rPr>
           <w:b/>
@@ -9821,26 +10208,9 @@
           <w:sz w:val="28"/>
           <w:szCs w:val="28"/>
         </w:rPr>
-        <w:t>Подвыборка из 200 элементов (рисунок 9)</w:t>
-      </w:r>
-      <w:r>
-        <w:rPr>
-          <w:sz w:val="28"/>
-          <w:szCs w:val="28"/>
-        </w:rPr>
-        <w:t>. Форма гистограммы близка к полной выборке, а также пики различимы. Это свидетельствует о достаточной репрезентативности выборки объёмом 200 элементов для визуальной идентификации типа распределения.</w:t>
-      </w:r>
-    </w:p>
-    <w:p>
-      <w:pPr>
-        <w:spacing w:line="360" w:lineRule="auto"/>
-        <w:ind w:firstLine="720"/>
-        <w:jc w:val="both"/>
-        <w:rPr>
-          <w:sz w:val="28"/>
-          <w:szCs w:val="28"/>
-        </w:rPr>
-      </w:pPr>
+        <w:t>Подвыборка</w:t>
+      </w:r>
+      <w:proofErr w:type="spellEnd"/>
       <w:r>
         <w:rPr>
           <w:b/>
@@ -9848,7 +10218,45 @@
           <w:sz w:val="28"/>
           <w:szCs w:val="28"/>
         </w:rPr>
-        <w:t>Подвыборка из 100 элементов (рисунок 8)</w:t>
+        <w:t xml:space="preserve"> из 200 элементов (рисунок 9)</w:t>
+      </w:r>
+      <w:r>
+        <w:rPr>
+          <w:sz w:val="28"/>
+          <w:szCs w:val="28"/>
+        </w:rPr>
+        <w:t>. Форма гистограммы близка к полной выборке, а также пики различимы. Это свидетельствует о достаточной репрезентативности выборки объёмом 200 элементов для визуальной идентификации типа распределения.</w:t>
+      </w:r>
+    </w:p>
+    <w:p>
+      <w:pPr>
+        <w:spacing w:line="360" w:lineRule="auto"/>
+        <w:ind w:firstLine="720"/>
+        <w:jc w:val="both"/>
+        <w:rPr>
+          <w:sz w:val="28"/>
+          <w:szCs w:val="28"/>
+        </w:rPr>
+      </w:pPr>
+      <w:proofErr w:type="spellStart"/>
+      <w:r>
+        <w:rPr>
+          <w:b/>
+          <w:bCs/>
+          <w:sz w:val="28"/>
+          <w:szCs w:val="28"/>
+        </w:rPr>
+        <w:t>Подвыборка</w:t>
+      </w:r>
+      <w:proofErr w:type="spellEnd"/>
+      <w:r>
+        <w:rPr>
+          <w:b/>
+          <w:bCs/>
+          <w:sz w:val="28"/>
+          <w:szCs w:val="28"/>
+        </w:rPr>
+        <w:t xml:space="preserve"> из 100 элементов (рисунок 8)</w:t>
       </w:r>
       <w:r>
         <w:rPr>
@@ -9885,6 +10293,7 @@
           <w:szCs w:val="28"/>
         </w:rPr>
       </w:pPr>
+      <w:proofErr w:type="spellStart"/>
       <w:r>
         <w:rPr>
           <w:b/>
@@ -9892,7 +10301,17 @@
           <w:sz w:val="28"/>
           <w:szCs w:val="28"/>
         </w:rPr>
-        <w:t>Подвыборка из 10 элементов (рисунок 7)</w:t>
+        <w:t>Подвыборка</w:t>
+      </w:r>
+      <w:proofErr w:type="spellEnd"/>
+      <w:r>
+        <w:rPr>
+          <w:b/>
+          <w:bCs/>
+          <w:sz w:val="28"/>
+          <w:szCs w:val="28"/>
+        </w:rPr>
+        <w:t xml:space="preserve"> из 10 элементов (рисунок 7)</w:t>
       </w:r>
       <w:r>
         <w:rPr>
@@ -11992,7 +12411,23 @@
           <w:sz w:val="28"/>
           <w:szCs w:val="28"/>
         </w:rPr>
-        <w:t>Это означает, что среднее значения распределения равно ровно μ\mu μ.</w:t>
+        <w:t>Это означает, что среднее значения распределения равно ровно μ\</w:t>
+      </w:r>
+      <w:proofErr w:type="spellStart"/>
+      <w:r>
+        <w:rPr>
+          <w:sz w:val="28"/>
+          <w:szCs w:val="28"/>
+        </w:rPr>
+        <w:t>mu</w:t>
+      </w:r>
+      <w:proofErr w:type="spellEnd"/>
+      <w:r>
+        <w:rPr>
+          <w:sz w:val="28"/>
+          <w:szCs w:val="28"/>
+        </w:rPr>
+        <w:t xml:space="preserve"> μ.</w:t>
       </w:r>
     </w:p>
     <w:p>
@@ -14453,7 +14888,23 @@
           <w:sz w:val="28"/>
           <w:szCs w:val="28"/>
         </w:rPr>
-        <w:t>Для проверки несмещённости было сгенерировано 1000 выборок объём</w:t>
+        <w:t xml:space="preserve">Для проверки </w:t>
+      </w:r>
+      <w:proofErr w:type="spellStart"/>
+      <w:r>
+        <w:rPr>
+          <w:sz w:val="28"/>
+          <w:szCs w:val="28"/>
+        </w:rPr>
+        <w:t>несмещённости</w:t>
+      </w:r>
+      <w:proofErr w:type="spellEnd"/>
+      <w:r>
+        <w:rPr>
+          <w:sz w:val="28"/>
+          <w:szCs w:val="28"/>
+        </w:rPr>
+        <w:t xml:space="preserve"> было сгенерировано 1000 выборок объём</w:t>
       </w:r>
       <w:r>
         <w:rPr>
@@ -15581,7 +16032,23 @@
           <w:sz w:val="28"/>
           <w:szCs w:val="28"/>
         </w:rPr>
-        <w:t>Листинг 18. Проверка несмещенности с помощью ММ.</w:t>
+        <w:t xml:space="preserve">Листинг 18. Проверка </w:t>
+      </w:r>
+      <w:proofErr w:type="spellStart"/>
+      <w:r>
+        <w:rPr>
+          <w:sz w:val="28"/>
+          <w:szCs w:val="28"/>
+        </w:rPr>
+        <w:t>несмещенности</w:t>
+      </w:r>
+      <w:proofErr w:type="spellEnd"/>
+      <w:r>
+        <w:rPr>
+          <w:sz w:val="28"/>
+          <w:szCs w:val="28"/>
+        </w:rPr>
+        <w:t xml:space="preserve"> с помощью ММ.</w:t>
       </w:r>
     </w:p>
     <w:p>
@@ -15653,7 +16120,23 @@
           <w:sz w:val="28"/>
           <w:szCs w:val="28"/>
         </w:rPr>
-        <w:t>Листинг 19. Проверка несмещенности с помощью ММП.</w:t>
+        <w:t xml:space="preserve">Листинг 19. Проверка </w:t>
+      </w:r>
+      <w:proofErr w:type="spellStart"/>
+      <w:r>
+        <w:rPr>
+          <w:sz w:val="28"/>
+          <w:szCs w:val="28"/>
+        </w:rPr>
+        <w:t>несмещенности</w:t>
+      </w:r>
+      <w:proofErr w:type="spellEnd"/>
+      <w:r>
+        <w:rPr>
+          <w:sz w:val="28"/>
+          <w:szCs w:val="28"/>
+        </w:rPr>
+        <w:t xml:space="preserve"> с помощью ММП.</w:t>
       </w:r>
     </w:p>
     <w:p>
@@ -16521,12 +17004,21 @@
         <w:lastRenderedPageBreak/>
         <w:t xml:space="preserve">Эффективной называется оценка, дисперсия которой близка к минимально возможной. Согласно неравенству </w:t>
       </w:r>
-      <w:r>
-        <w:rPr>
-          <w:sz w:val="28"/>
-          <w:szCs w:val="28"/>
-        </w:rPr>
-        <w:t>Рао-Крамера</w:t>
+      <w:proofErr w:type="spellStart"/>
+      <w:r>
+        <w:rPr>
+          <w:sz w:val="28"/>
+          <w:szCs w:val="28"/>
+        </w:rPr>
+        <w:t>Рао</w:t>
+      </w:r>
+      <w:proofErr w:type="spellEnd"/>
+      <w:r>
+        <w:rPr>
+          <w:sz w:val="28"/>
+          <w:szCs w:val="28"/>
+        </w:rPr>
+        <w:t>-Крамера</w:t>
       </w:r>
       <w:r>
         <w:rPr>
@@ -17550,7 +18042,23 @@
           <w:sz w:val="28"/>
           <w:szCs w:val="28"/>
         </w:rPr>
-        <w:t xml:space="preserve">Поскольку явной формулы для тригамма-функции </w:t>
+        <w:t xml:space="preserve">Поскольку явной формулы для </w:t>
+      </w:r>
+      <w:proofErr w:type="spellStart"/>
+      <w:r>
+        <w:rPr>
+          <w:sz w:val="28"/>
+          <w:szCs w:val="28"/>
+        </w:rPr>
+        <w:t>тригамма</w:t>
+      </w:r>
+      <w:proofErr w:type="spellEnd"/>
+      <w:r>
+        <w:rPr>
+          <w:sz w:val="28"/>
+          <w:szCs w:val="28"/>
+        </w:rPr>
+        <w:t xml:space="preserve">-функции </w:t>
       </w:r>
       <m:oMath>
         <m:r>
@@ -18738,12 +19246,21 @@
         </w:rPr>
         <w:t xml:space="preserve"> дисперсия оценки методом моментов почти в 11 раз превышает нижнюю границу, что говорит о низкой эффективности выборочного среднего как оценки этого параметра. Дисперсия оценки методом максимального правдоподобия, напротив, лишь незначительно превышает границу </w:t>
       </w:r>
-      <w:r>
-        <w:rPr>
-          <w:sz w:val="28"/>
-          <w:szCs w:val="28"/>
-        </w:rPr>
-        <w:t>Рао-Крамера</w:t>
+      <w:proofErr w:type="spellStart"/>
+      <w:r>
+        <w:rPr>
+          <w:sz w:val="28"/>
+          <w:szCs w:val="28"/>
+        </w:rPr>
+        <w:t>Рао</w:t>
+      </w:r>
+      <w:proofErr w:type="spellEnd"/>
+      <w:r>
+        <w:rPr>
+          <w:sz w:val="28"/>
+          <w:szCs w:val="28"/>
+        </w:rPr>
+        <w:t>-Крамера</w:t>
       </w:r>
       <w:r>
         <w:rPr>
@@ -19222,7 +19739,23 @@
           <w:sz w:val="28"/>
           <w:szCs w:val="28"/>
         </w:rPr>
-        <w:t>Для параметра loc эффективность оценок различается: метод моментов использует лишь около 9% максимально достижимой точности</w:t>
+        <w:t xml:space="preserve">Для параметра </w:t>
+      </w:r>
+      <w:proofErr w:type="spellStart"/>
+      <w:r>
+        <w:rPr>
+          <w:sz w:val="28"/>
+          <w:szCs w:val="28"/>
+        </w:rPr>
+        <w:t>loc</w:t>
+      </w:r>
+      <w:proofErr w:type="spellEnd"/>
+      <w:r>
+        <w:rPr>
+          <w:sz w:val="28"/>
+          <w:szCs w:val="28"/>
+        </w:rPr>
+        <w:t xml:space="preserve"> эффективность оценок различается: метод моментов использует лишь около 9% максимально достижимой точности</w:t>
       </w:r>
       <w:r>
         <w:rPr>
@@ -19360,6 +19893,7 @@
     <w:p>
       <w:pPr>
         <w:spacing w:before="100" w:beforeAutospacing="1" w:after="100" w:afterAutospacing="1" w:line="360" w:lineRule="auto"/>
+        <w:ind w:firstLine="360"/>
         <w:jc w:val="both"/>
         <w:rPr>
           <w:sz w:val="28"/>
@@ -19523,12 +20057,19 @@
         </w:rPr>
         <w:t>.</w:t>
       </w:r>
+      <w:r>
+        <w:rPr>
+          <w:sz w:val="28"/>
+          <w:szCs w:val="28"/>
+        </w:rPr>
+        <w:t xml:space="preserve"> </w:t>
+      </w:r>
     </w:p>
     <w:p>
       <w:pPr>
         <w:spacing w:before="100" w:beforeAutospacing="1" w:after="100" w:afterAutospacing="1" w:line="360" w:lineRule="auto"/>
         <w:ind w:firstLine="708"/>
-        <w:jc w:val="center"/>
+        <w:jc w:val="both"/>
         <w:rPr>
           <w:sz w:val="28"/>
           <w:szCs w:val="28"/>
@@ -19549,16 +20090,7 @@
     <w:p>
       <w:pPr>
         <w:spacing w:before="100" w:beforeAutospacing="1" w:after="100" w:afterAutospacing="1" w:line="360" w:lineRule="auto"/>
-        <w:jc w:val="both"/>
-        <w:rPr>
-          <w:sz w:val="28"/>
-          <w:szCs w:val="28"/>
-        </w:rPr>
-      </w:pPr>
-    </w:p>
-    <w:p>
-      <w:pPr>
-        <w:spacing w:before="100" w:beforeAutospacing="1" w:after="100" w:afterAutospacing="1" w:line="360" w:lineRule="auto"/>
+        <w:ind w:firstLine="708"/>
         <w:jc w:val="both"/>
         <w:rPr>
           <w:sz w:val="28"/>
@@ -19591,28 +20123,7 @@
     <w:p>
       <w:pPr>
         <w:spacing w:before="100" w:beforeAutospacing="1" w:after="100" w:afterAutospacing="1" w:line="360" w:lineRule="auto"/>
-        <w:jc w:val="both"/>
-        <w:rPr>
-          <w:sz w:val="28"/>
-          <w:szCs w:val="28"/>
-        </w:rPr>
-      </w:pPr>
-    </w:p>
-    <w:p>
-      <w:pPr>
-        <w:spacing w:before="100" w:beforeAutospacing="1" w:after="100" w:afterAutospacing="1" w:line="360" w:lineRule="auto"/>
-        <w:ind w:firstLine="709"/>
-        <w:jc w:val="both"/>
-        <w:rPr>
-          <w:sz w:val="28"/>
-          <w:szCs w:val="28"/>
-        </w:rPr>
-      </w:pPr>
-    </w:p>
-    <w:p>
-      <w:pPr>
-        <w:spacing w:before="100" w:beforeAutospacing="1" w:after="100" w:afterAutospacing="1" w:line="360" w:lineRule="auto"/>
-        <w:ind w:firstLine="709"/>
+        <w:ind w:firstLine="708"/>
         <w:jc w:val="both"/>
         <w:rPr>
           <w:sz w:val="28"/>
@@ -19633,264 +20144,2872 @@
     </w:p>
     <w:p>
       <w:pPr>
-        <w:spacing w:line="360" w:lineRule="auto"/>
-        <w:rPr>
-          <w:sz w:val="28"/>
-          <w:szCs w:val="28"/>
-        </w:rPr>
-      </w:pPr>
-    </w:p>
-    <w:p>
-      <w:pPr>
-        <w:spacing w:line="360" w:lineRule="auto"/>
-        <w:rPr>
-          <w:sz w:val="28"/>
-          <w:szCs w:val="28"/>
-        </w:rPr>
-      </w:pPr>
-    </w:p>
-    <w:p>
-      <w:pPr>
-        <w:spacing w:line="360" w:lineRule="auto"/>
+        <w:pStyle w:val="a7"/>
+        <w:numPr>
+          <w:ilvl w:val="0"/>
+          <w:numId w:val="17"/>
+        </w:numPr>
+        <w:spacing w:before="100" w:beforeAutospacing="1" w:after="100" w:afterAutospacing="1" w:line="360" w:lineRule="auto"/>
         <w:jc w:val="center"/>
         <w:rPr>
           <w:sz w:val="28"/>
           <w:szCs w:val="28"/>
         </w:rPr>
       </w:pPr>
-    </w:p>
-    <w:p>
-      <w:pPr>
-        <w:spacing w:line="360" w:lineRule="auto"/>
-        <w:rPr>
-          <w:sz w:val="28"/>
-          <w:szCs w:val="28"/>
-        </w:rPr>
-      </w:pPr>
-    </w:p>
-    <w:p>
-      <w:pPr>
-        <w:spacing w:line="360" w:lineRule="auto"/>
-        <w:rPr>
-          <w:sz w:val="28"/>
-          <w:szCs w:val="28"/>
-        </w:rPr>
-      </w:pPr>
-    </w:p>
-    <w:p>
-      <w:pPr>
-        <w:spacing w:line="360" w:lineRule="auto"/>
-        <w:rPr>
-          <w:sz w:val="28"/>
-          <w:szCs w:val="28"/>
-        </w:rPr>
-      </w:pPr>
-    </w:p>
-    <w:p>
-      <w:pPr>
-        <w:spacing w:line="360" w:lineRule="auto"/>
-        <w:rPr>
-          <w:sz w:val="28"/>
-          <w:szCs w:val="28"/>
-        </w:rPr>
-      </w:pPr>
-    </w:p>
-    <w:p>
-      <w:pPr>
-        <w:spacing w:line="360" w:lineRule="auto"/>
-        <w:rPr>
-          <w:sz w:val="28"/>
-          <w:szCs w:val="28"/>
-        </w:rPr>
-      </w:pPr>
-    </w:p>
-    <w:p>
-      <w:pPr>
-        <w:spacing w:line="360" w:lineRule="auto"/>
-        <w:rPr>
-          <w:sz w:val="28"/>
-          <w:szCs w:val="28"/>
-        </w:rPr>
-      </w:pPr>
-    </w:p>
-    <w:p>
-      <w:pPr>
-        <w:spacing w:line="360" w:lineRule="auto"/>
-        <w:rPr>
-          <w:sz w:val="28"/>
-          <w:szCs w:val="28"/>
-        </w:rPr>
-      </w:pPr>
-    </w:p>
-    <w:p>
-      <w:pPr>
-        <w:spacing w:line="360" w:lineRule="auto"/>
-        <w:rPr>
-          <w:sz w:val="28"/>
-          <w:szCs w:val="28"/>
-        </w:rPr>
-      </w:pPr>
-    </w:p>
-    <w:p>
-      <w:pPr>
-        <w:spacing w:line="360" w:lineRule="auto"/>
-        <w:rPr>
-          <w:sz w:val="28"/>
-          <w:szCs w:val="28"/>
-        </w:rPr>
-      </w:pPr>
-    </w:p>
-    <w:p>
-      <w:pPr>
-        <w:spacing w:line="360" w:lineRule="auto"/>
-        <w:rPr>
-          <w:sz w:val="28"/>
-          <w:szCs w:val="28"/>
-        </w:rPr>
-      </w:pPr>
-    </w:p>
-    <w:p>
-      <w:pPr>
-        <w:spacing w:line="360" w:lineRule="auto"/>
-        <w:rPr>
-          <w:sz w:val="28"/>
-          <w:szCs w:val="28"/>
-        </w:rPr>
-      </w:pPr>
-    </w:p>
-    <w:p>
-      <w:pPr>
-        <w:spacing w:line="360" w:lineRule="auto"/>
-        <w:rPr>
-          <w:sz w:val="28"/>
-          <w:szCs w:val="28"/>
-        </w:rPr>
-      </w:pPr>
-    </w:p>
-    <w:p>
-      <w:pPr>
-        <w:spacing w:line="360" w:lineRule="auto"/>
-        <w:rPr>
-          <w:sz w:val="28"/>
-          <w:szCs w:val="28"/>
-        </w:rPr>
-      </w:pPr>
-    </w:p>
-    <w:p>
-      <w:pPr>
-        <w:spacing w:line="360" w:lineRule="auto"/>
-        <w:rPr>
-          <w:sz w:val="28"/>
-          <w:szCs w:val="28"/>
-        </w:rPr>
-      </w:pPr>
-    </w:p>
-    <w:p>
-      <w:pPr>
-        <w:spacing w:line="360" w:lineRule="auto"/>
-        <w:rPr>
-          <w:sz w:val="28"/>
-          <w:szCs w:val="28"/>
-        </w:rPr>
-      </w:pPr>
-    </w:p>
-    <w:p>
-      <w:pPr>
-        <w:spacing w:line="360" w:lineRule="auto"/>
-        <w:rPr>
-          <w:sz w:val="28"/>
-          <w:szCs w:val="28"/>
-        </w:rPr>
-      </w:pPr>
-    </w:p>
-    <w:p>
-      <w:pPr>
-        <w:spacing w:line="360" w:lineRule="auto"/>
-        <w:rPr>
-          <w:sz w:val="28"/>
-          <w:szCs w:val="28"/>
-        </w:rPr>
-      </w:pPr>
-    </w:p>
-    <w:p>
-      <w:pPr>
-        <w:spacing w:line="360" w:lineRule="auto"/>
-        <w:rPr>
-          <w:sz w:val="28"/>
-          <w:szCs w:val="28"/>
-        </w:rPr>
-      </w:pPr>
-    </w:p>
-    <w:p>
-      <w:pPr>
-        <w:spacing w:line="360" w:lineRule="auto"/>
-        <w:rPr>
-          <w:sz w:val="28"/>
-          <w:szCs w:val="28"/>
-        </w:rPr>
-      </w:pPr>
-    </w:p>
-    <w:p>
-      <w:pPr>
-        <w:spacing w:line="360" w:lineRule="auto"/>
-        <w:rPr>
-          <w:sz w:val="28"/>
-          <w:szCs w:val="28"/>
-        </w:rPr>
-      </w:pPr>
-    </w:p>
-    <w:p>
-      <w:pPr>
-        <w:spacing w:line="360" w:lineRule="auto"/>
-        <w:jc w:val="center"/>
+      <w:r>
         <w:rPr>
           <w:b/>
           <w:bCs/>
           <w:sz w:val="32"/>
           <w:szCs w:val="32"/>
         </w:rPr>
-      </w:pPr>
-      <w:r>
+        <w:lastRenderedPageBreak/>
+        <w:t>Интервальные оценки параметров</w:t>
+      </w:r>
+    </w:p>
+    <w:p>
+      <w:pPr>
+        <w:pStyle w:val="a7"/>
+        <w:numPr>
+          <w:ilvl w:val="1"/>
+          <w:numId w:val="17"/>
+        </w:numPr>
+        <w:spacing w:before="100" w:beforeAutospacing="1" w:after="100" w:afterAutospacing="1" w:line="360" w:lineRule="auto"/>
+        <w:jc w:val="both"/>
+        <w:rPr>
+          <w:sz w:val="28"/>
+          <w:szCs w:val="28"/>
+        </w:rPr>
+      </w:pPr>
+      <w:r>
+        <w:rPr>
+          <w:b/>
+          <w:bCs/>
+          <w:sz w:val="28"/>
+          <w:szCs w:val="28"/>
+        </w:rPr>
+        <w:t>Метод построения</w:t>
+      </w:r>
+    </w:p>
+    <w:p>
+      <w:pPr>
+        <w:spacing w:before="100" w:beforeAutospacing="1" w:after="100" w:afterAutospacing="1" w:line="360" w:lineRule="auto"/>
+        <w:ind w:firstLine="360"/>
+        <w:jc w:val="both"/>
+        <w:rPr>
+          <w:sz w:val="28"/>
+          <w:szCs w:val="28"/>
+        </w:rPr>
+      </w:pPr>
+      <w:r>
+        <w:rPr>
+          <w:sz w:val="28"/>
+          <w:szCs w:val="28"/>
+        </w:rPr>
+        <w:t xml:space="preserve">Интервальная оценка параметра </w:t>
+      </w:r>
+      <m:oMath>
+        <m:r>
+          <w:rPr>
+            <w:rFonts w:ascii="Cambria Math" w:hAnsi="Cambria Math"/>
+            <w:sz w:val="28"/>
+            <w:szCs w:val="28"/>
+          </w:rPr>
+          <m:t>θ</m:t>
+        </m:r>
+      </m:oMath>
+      <w:r>
+        <w:rPr>
+          <w:sz w:val="28"/>
+          <w:szCs w:val="28"/>
+        </w:rPr>
+        <w:t xml:space="preserve"> с уровнем доверия </w:t>
+      </w:r>
+      <m:oMath>
+        <m:r>
+          <w:rPr>
+            <w:rFonts w:ascii="Cambria Math" w:hAnsi="Cambria Math"/>
+            <w:sz w:val="28"/>
+            <w:szCs w:val="28"/>
+          </w:rPr>
+          <m:t>γ</m:t>
+        </m:r>
+      </m:oMath>
+      <w:r>
+        <w:rPr>
+          <w:sz w:val="28"/>
+          <w:szCs w:val="28"/>
+        </w:rPr>
+        <w:t xml:space="preserve"> — это случайный интервал </w:t>
+      </w:r>
+      <m:oMath>
+        <m:d>
+          <m:dPr>
+            <m:ctrlPr>
+              <w:rPr>
+                <w:rFonts w:ascii="Cambria Math" w:hAnsi="Cambria Math"/>
+                <w:i/>
+                <w:sz w:val="28"/>
+                <w:szCs w:val="28"/>
+              </w:rPr>
+            </m:ctrlPr>
+          </m:dPr>
+          <m:e>
+            <m:sSub>
+              <m:sSubPr>
+                <m:ctrlPr>
+                  <w:rPr>
+                    <w:rFonts w:ascii="Cambria Math" w:hAnsi="Cambria Math"/>
+                    <w:i/>
+                    <w:sz w:val="28"/>
+                    <w:szCs w:val="28"/>
+                  </w:rPr>
+                </m:ctrlPr>
+              </m:sSubPr>
+              <m:e>
+                <m:acc>
+                  <m:accPr>
+                    <m:ctrlPr>
+                      <w:rPr>
+                        <w:rFonts w:ascii="Cambria Math" w:hAnsi="Cambria Math"/>
+                        <w:i/>
+                        <w:sz w:val="28"/>
+                        <w:szCs w:val="28"/>
+                      </w:rPr>
+                    </m:ctrlPr>
+                  </m:accPr>
+                  <m:e>
+                    <m:r>
+                      <w:rPr>
+                        <w:rFonts w:ascii="Cambria Math" w:hAnsi="Cambria Math"/>
+                        <w:sz w:val="28"/>
+                        <w:szCs w:val="28"/>
+                      </w:rPr>
+                      <m:t>θ</m:t>
+                    </m:r>
+                  </m:e>
+                </m:acc>
+              </m:e>
+              <m:sub>
+                <m:r>
+                  <w:rPr>
+                    <w:rFonts w:ascii="Cambria Math" w:hAnsi="Cambria Math"/>
+                    <w:sz w:val="28"/>
+                    <w:szCs w:val="28"/>
+                  </w:rPr>
+                  <m:t>н</m:t>
+                </m:r>
+              </m:sub>
+            </m:sSub>
+            <m:r>
+              <w:rPr>
+                <w:rFonts w:ascii="Cambria Math" w:hAnsi="Cambria Math"/>
+                <w:sz w:val="28"/>
+                <w:szCs w:val="28"/>
+              </w:rPr>
+              <m:t xml:space="preserve">, </m:t>
+            </m:r>
+            <m:sSub>
+              <m:sSubPr>
+                <m:ctrlPr>
+                  <w:rPr>
+                    <w:rFonts w:ascii="Cambria Math" w:hAnsi="Cambria Math"/>
+                    <w:i/>
+                    <w:sz w:val="28"/>
+                    <w:szCs w:val="28"/>
+                  </w:rPr>
+                </m:ctrlPr>
+              </m:sSubPr>
+              <m:e>
+                <m:acc>
+                  <m:accPr>
+                    <m:ctrlPr>
+                      <w:rPr>
+                        <w:rFonts w:ascii="Cambria Math" w:hAnsi="Cambria Math"/>
+                        <w:i/>
+                        <w:sz w:val="28"/>
+                        <w:szCs w:val="28"/>
+                      </w:rPr>
+                    </m:ctrlPr>
+                  </m:accPr>
+                  <m:e>
+                    <m:r>
+                      <w:rPr>
+                        <w:rFonts w:ascii="Cambria Math" w:hAnsi="Cambria Math"/>
+                        <w:sz w:val="28"/>
+                        <w:szCs w:val="28"/>
+                      </w:rPr>
+                      <m:t>θ</m:t>
+                    </m:r>
+                  </m:e>
+                </m:acc>
+              </m:e>
+              <m:sub>
+                <m:r>
+                  <w:rPr>
+                    <w:rFonts w:ascii="Cambria Math" w:hAnsi="Cambria Math"/>
+                    <w:sz w:val="28"/>
+                    <w:szCs w:val="28"/>
+                  </w:rPr>
+                  <m:t>в</m:t>
+                </m:r>
+              </m:sub>
+            </m:sSub>
+          </m:e>
+        </m:d>
+      </m:oMath>
+      <w:r>
+        <w:rPr>
+          <w:sz w:val="28"/>
+          <w:szCs w:val="28"/>
+        </w:rPr>
+        <w:t xml:space="preserve">, который с вероятностью γ накрывает истинное значение </w:t>
+      </w:r>
+      <m:oMath>
+        <m:r>
+          <w:rPr>
+            <w:rFonts w:ascii="Cambria Math" w:hAnsi="Cambria Math"/>
+            <w:sz w:val="28"/>
+            <w:szCs w:val="28"/>
+          </w:rPr>
+          <m:t>θ</m:t>
+        </m:r>
+      </m:oMath>
+      <w:r>
+        <w:rPr>
+          <w:sz w:val="28"/>
+          <w:szCs w:val="28"/>
+        </w:rPr>
+        <w:t xml:space="preserve">: </w:t>
+      </w:r>
+      <m:oMath>
+        <m:r>
+          <w:rPr>
+            <w:rFonts w:ascii="Cambria Math" w:hAnsi="Cambria Math"/>
+            <w:sz w:val="28"/>
+            <w:szCs w:val="28"/>
+          </w:rPr>
+          <m:t>P</m:t>
+        </m:r>
+        <m:d>
+          <m:dPr>
+            <m:ctrlPr>
+              <w:rPr>
+                <w:rFonts w:ascii="Cambria Math" w:hAnsi="Cambria Math"/>
+                <w:i/>
+                <w:sz w:val="28"/>
+                <w:szCs w:val="28"/>
+              </w:rPr>
+            </m:ctrlPr>
+          </m:dPr>
+          <m:e>
+            <m:sSub>
+              <m:sSubPr>
+                <m:ctrlPr>
+                  <w:rPr>
+                    <w:rFonts w:ascii="Cambria Math" w:hAnsi="Cambria Math"/>
+                    <w:i/>
+                    <w:sz w:val="28"/>
+                    <w:szCs w:val="28"/>
+                  </w:rPr>
+                </m:ctrlPr>
+              </m:sSubPr>
+              <m:e>
+                <m:acc>
+                  <m:accPr>
+                    <m:ctrlPr>
+                      <w:rPr>
+                        <w:rFonts w:ascii="Cambria Math" w:hAnsi="Cambria Math"/>
+                        <w:i/>
+                        <w:sz w:val="28"/>
+                        <w:szCs w:val="28"/>
+                      </w:rPr>
+                    </m:ctrlPr>
+                  </m:accPr>
+                  <m:e>
+                    <m:r>
+                      <w:rPr>
+                        <w:rFonts w:ascii="Cambria Math" w:hAnsi="Cambria Math"/>
+                        <w:sz w:val="28"/>
+                        <w:szCs w:val="28"/>
+                      </w:rPr>
+                      <m:t>θ</m:t>
+                    </m:r>
+                  </m:e>
+                </m:acc>
+              </m:e>
+              <m:sub>
+                <m:r>
+                  <w:rPr>
+                    <w:rFonts w:ascii="Cambria Math" w:hAnsi="Cambria Math"/>
+                    <w:sz w:val="28"/>
+                    <w:szCs w:val="28"/>
+                  </w:rPr>
+                  <m:t>н</m:t>
+                </m:r>
+              </m:sub>
+            </m:sSub>
+            <m:r>
+              <w:rPr>
+                <w:rFonts w:ascii="Cambria Math" w:hAnsi="Cambria Math"/>
+                <w:sz w:val="28"/>
+                <w:szCs w:val="28"/>
+              </w:rPr>
+              <m:t xml:space="preserve">≤ θ ≤ </m:t>
+            </m:r>
+            <m:sSub>
+              <m:sSubPr>
+                <m:ctrlPr>
+                  <w:rPr>
+                    <w:rFonts w:ascii="Cambria Math" w:hAnsi="Cambria Math"/>
+                    <w:i/>
+                    <w:sz w:val="28"/>
+                    <w:szCs w:val="28"/>
+                  </w:rPr>
+                </m:ctrlPr>
+              </m:sSubPr>
+              <m:e>
+                <m:acc>
+                  <m:accPr>
+                    <m:ctrlPr>
+                      <w:rPr>
+                        <w:rFonts w:ascii="Cambria Math" w:hAnsi="Cambria Math"/>
+                        <w:i/>
+                        <w:sz w:val="28"/>
+                        <w:szCs w:val="28"/>
+                      </w:rPr>
+                    </m:ctrlPr>
+                  </m:accPr>
+                  <m:e>
+                    <m:r>
+                      <w:rPr>
+                        <w:rFonts w:ascii="Cambria Math" w:hAnsi="Cambria Math"/>
+                        <w:sz w:val="28"/>
+                        <w:szCs w:val="28"/>
+                      </w:rPr>
+                      <m:t>θ</m:t>
+                    </m:r>
+                  </m:e>
+                </m:acc>
+              </m:e>
+              <m:sub>
+                <m:r>
+                  <w:rPr>
+                    <w:rFonts w:ascii="Cambria Math" w:hAnsi="Cambria Math"/>
+                    <w:sz w:val="28"/>
+                    <w:szCs w:val="28"/>
+                  </w:rPr>
+                  <m:t>в</m:t>
+                </m:r>
+              </m:sub>
+            </m:sSub>
+          </m:e>
+        </m:d>
+        <m:r>
+          <w:rPr>
+            <w:rFonts w:ascii="Cambria Math" w:hAnsi="Cambria Math"/>
+            <w:sz w:val="28"/>
+            <w:szCs w:val="28"/>
+          </w:rPr>
+          <m:t>= γ</m:t>
+        </m:r>
+      </m:oMath>
+      <w:r>
+        <w:rPr>
+          <w:sz w:val="28"/>
+          <w:szCs w:val="28"/>
+        </w:rPr>
+        <w:t>.</w:t>
+      </w:r>
+      <w:r>
+        <w:rPr>
+          <w:sz w:val="28"/>
+          <w:szCs w:val="28"/>
+        </w:rPr>
+        <w:t xml:space="preserve"> </w:t>
+      </w:r>
+      <w:r>
+        <w:rPr>
+          <w:sz w:val="28"/>
+          <w:szCs w:val="28"/>
+        </w:rPr>
+        <w:t>В качестве θ поочерёдно рассматриваются параметр формы и параметр масштаба</w:t>
+      </w:r>
+      <m:oMath>
+        <m:r>
+          <w:rPr>
+            <w:rFonts w:ascii="Cambria Math" w:hAnsi="Cambria Math"/>
+            <w:sz w:val="28"/>
+            <w:szCs w:val="28"/>
+          </w:rPr>
+          <m:t>: θ = a</m:t>
+        </m:r>
+      </m:oMath>
+      <w:r>
+        <w:rPr>
+          <w:sz w:val="28"/>
+          <w:szCs w:val="28"/>
+        </w:rPr>
+        <w:t xml:space="preserve"> с точечной оценкой</w:t>
+      </w:r>
+      <w:r>
+        <w:rPr>
+          <w:sz w:val="28"/>
+          <w:szCs w:val="28"/>
+        </w:rPr>
+        <w:t xml:space="preserve"> </w:t>
+      </w:r>
+      <m:oMath>
+        <m:sSub>
+          <m:sSubPr>
+            <m:ctrlPr>
+              <w:rPr>
+                <w:rFonts w:ascii="Cambria Math" w:hAnsi="Cambria Math"/>
+                <w:i/>
+                <w:sz w:val="28"/>
+                <w:szCs w:val="28"/>
+              </w:rPr>
+            </m:ctrlPr>
+          </m:sSubPr>
+          <m:e>
+            <m:r>
+              <w:rPr>
+                <w:rFonts w:ascii="Cambria Math" w:hAnsi="Cambria Math"/>
+                <w:sz w:val="28"/>
+                <w:szCs w:val="28"/>
+              </w:rPr>
+              <m:t>â</m:t>
+            </m:r>
+          </m:e>
+          <m:sub>
+            <m:r>
+              <w:rPr>
+                <w:rFonts w:ascii="Cambria Math" w:hAnsi="Cambria Math"/>
+                <w:sz w:val="28"/>
+                <w:szCs w:val="28"/>
+              </w:rPr>
+              <m:t>М</m:t>
+            </m:r>
+            <m:r>
+              <w:rPr>
+                <w:rFonts w:ascii="Cambria Math" w:hAnsi="Cambria Math"/>
+                <w:sz w:val="28"/>
+                <w:szCs w:val="28"/>
+              </w:rPr>
+              <m:t>МП</m:t>
+            </m:r>
+          </m:sub>
+        </m:sSub>
+        <m:r>
+          <w:rPr>
+            <w:rFonts w:ascii="Cambria Math" w:hAnsi="Cambria Math"/>
+            <w:sz w:val="28"/>
+            <w:szCs w:val="28"/>
+          </w:rPr>
+          <m:t xml:space="preserve"> = 7.16</m:t>
+        </m:r>
+      </m:oMath>
+      <w:r>
+        <w:rPr>
+          <w:sz w:val="28"/>
+          <w:szCs w:val="28"/>
+        </w:rPr>
+        <w:t xml:space="preserve"> и</w:t>
+      </w:r>
+      <w:r>
+        <w:rPr>
+          <w:sz w:val="28"/>
+          <w:szCs w:val="28"/>
+        </w:rPr>
+        <w:t xml:space="preserve"> </w:t>
+      </w:r>
+      <w:r>
+        <w:rPr>
+          <w:sz w:val="28"/>
+          <w:szCs w:val="28"/>
+        </w:rPr>
+        <w:t xml:space="preserve"> </w:t>
+      </w:r>
+      <m:oMath>
+        <m:r>
+          <w:rPr>
+            <w:rFonts w:ascii="Cambria Math" w:hAnsi="Cambria Math"/>
+            <w:sz w:val="28"/>
+            <w:szCs w:val="28"/>
+          </w:rPr>
+          <m:t>θ = loc</m:t>
+        </m:r>
+      </m:oMath>
+      <w:r>
+        <w:rPr>
+          <w:sz w:val="28"/>
+          <w:szCs w:val="28"/>
+        </w:rPr>
+        <w:t xml:space="preserve"> с точечной оценкой </w:t>
+      </w:r>
+      <m:oMath>
+        <m:acc>
+          <m:accPr>
+            <m:ctrlPr>
+              <w:rPr>
+                <w:rFonts w:ascii="Cambria Math" w:hAnsi="Cambria Math"/>
+                <w:i/>
+                <w:sz w:val="28"/>
+                <w:szCs w:val="28"/>
+                <w:lang w:val="en-US"/>
+              </w:rPr>
+            </m:ctrlPr>
+          </m:accPr>
+          <m:e>
+            <m:sSub>
+              <m:sSubPr>
+                <m:ctrlPr>
+                  <w:rPr>
+                    <w:rFonts w:ascii="Cambria Math" w:hAnsi="Cambria Math"/>
+                    <w:i/>
+                    <w:sz w:val="28"/>
+                    <w:szCs w:val="28"/>
+                    <w:lang w:val="en-US"/>
+                  </w:rPr>
+                </m:ctrlPr>
+              </m:sSubPr>
+              <m:e>
+                <m:r>
+                  <w:rPr>
+                    <w:rFonts w:ascii="Cambria Math" w:hAnsi="Cambria Math"/>
+                    <w:sz w:val="28"/>
+                    <w:szCs w:val="28"/>
+                    <w:lang w:val="en-US"/>
+                  </w:rPr>
+                  <m:t>loc</m:t>
+                </m:r>
+              </m:e>
+              <m:sub>
+                <m:r>
+                  <w:rPr>
+                    <w:rFonts w:ascii="Cambria Math" w:hAnsi="Cambria Math"/>
+                    <w:sz w:val="28"/>
+                    <w:szCs w:val="28"/>
+                  </w:rPr>
+                  <m:t>ММП</m:t>
+                </m:r>
+              </m:sub>
+            </m:sSub>
+          </m:e>
+        </m:acc>
+        <m:r>
+          <w:rPr>
+            <w:rFonts w:ascii="Cambria Math" w:hAnsi="Cambria Math"/>
+            <w:sz w:val="28"/>
+            <w:szCs w:val="28"/>
+          </w:rPr>
+          <m:t xml:space="preserve"> = 0.76</m:t>
+        </m:r>
+      </m:oMath>
+      <w:r>
+        <w:rPr>
+          <w:sz w:val="28"/>
+          <w:szCs w:val="28"/>
+        </w:rPr>
+        <w:t>.</w:t>
+      </w:r>
+    </w:p>
+    <w:p>
+      <w:pPr>
+        <w:spacing w:before="100" w:beforeAutospacing="1" w:after="100" w:afterAutospacing="1" w:line="360" w:lineRule="auto"/>
+        <w:ind w:firstLine="360"/>
+        <w:jc w:val="both"/>
+        <w:rPr>
+          <w:sz w:val="28"/>
+          <w:szCs w:val="28"/>
+        </w:rPr>
+      </w:pPr>
+      <w:r>
+        <w:rPr>
+          <w:sz w:val="28"/>
+          <w:szCs w:val="28"/>
+        </w:rPr>
+        <w:tab/>
+      </w:r>
+      <w:r>
+        <w:rPr>
+          <w:sz w:val="28"/>
+          <w:szCs w:val="28"/>
+        </w:rPr>
+        <w:t>Для оценок ММП при достаточно большом объёме выборки (n = 300) применима асимптотическая нормальность оценок максимального правдоподобия.</w:t>
+      </w:r>
+      <w:r>
+        <w:t xml:space="preserve"> </w:t>
+      </w:r>
+      <w:r>
+        <w:rPr>
+          <w:sz w:val="28"/>
+          <w:szCs w:val="28"/>
+        </w:rPr>
+        <w:t xml:space="preserve">Стандартная ошибка оценки определяется через матрицу Фишера: </w:t>
+      </w:r>
+      <m:oMath>
+        <m:r>
+          <w:rPr>
+            <w:rFonts w:ascii="Cambria Math" w:hAnsi="Cambria Math"/>
+            <w:sz w:val="28"/>
+            <w:szCs w:val="28"/>
+          </w:rPr>
+          <m:t>se</m:t>
+        </m:r>
+        <m:d>
+          <m:dPr>
+            <m:ctrlPr>
+              <w:rPr>
+                <w:rFonts w:ascii="Cambria Math" w:hAnsi="Cambria Math"/>
+                <w:i/>
+                <w:sz w:val="28"/>
+                <w:szCs w:val="28"/>
+              </w:rPr>
+            </m:ctrlPr>
+          </m:dPr>
+          <m:e>
+            <m:acc>
+              <m:accPr>
+                <m:ctrlPr>
+                  <w:rPr>
+                    <w:rFonts w:ascii="Cambria Math" w:hAnsi="Cambria Math"/>
+                    <w:i/>
+                    <w:sz w:val="28"/>
+                    <w:szCs w:val="28"/>
+                  </w:rPr>
+                </m:ctrlPr>
+              </m:accPr>
+              <m:e>
+                <m:r>
+                  <w:rPr>
+                    <w:rFonts w:ascii="Cambria Math" w:hAnsi="Cambria Math"/>
+                    <w:sz w:val="28"/>
+                    <w:szCs w:val="28"/>
+                  </w:rPr>
+                  <m:t>θ</m:t>
+                </m:r>
+              </m:e>
+            </m:acc>
+          </m:e>
+        </m:d>
+        <m:r>
+          <w:rPr>
+            <w:rFonts w:ascii="Cambria Math" w:hAnsi="Cambria Math"/>
+            <w:sz w:val="28"/>
+            <w:szCs w:val="28"/>
+          </w:rPr>
+          <m:t>=</m:t>
+        </m:r>
+        <m:f>
+          <m:fPr>
+            <m:ctrlPr>
+              <w:rPr>
+                <w:rFonts w:ascii="Cambria Math" w:hAnsi="Cambria Math"/>
+                <w:i/>
+                <w:sz w:val="28"/>
+                <w:szCs w:val="28"/>
+              </w:rPr>
+            </m:ctrlPr>
+          </m:fPr>
+          <m:num>
+            <m:r>
+              <w:rPr>
+                <w:rFonts w:ascii="Cambria Math" w:hAnsi="Cambria Math"/>
+                <w:sz w:val="28"/>
+                <w:szCs w:val="28"/>
+              </w:rPr>
+              <m:t>1</m:t>
+            </m:r>
+          </m:num>
+          <m:den>
+            <m:rad>
+              <m:radPr>
+                <m:degHide m:val="1"/>
+                <m:ctrlPr>
+                  <w:rPr>
+                    <w:rFonts w:ascii="Cambria Math" w:hAnsi="Cambria Math"/>
+                    <w:i/>
+                    <w:sz w:val="28"/>
+                    <w:szCs w:val="28"/>
+                  </w:rPr>
+                </m:ctrlPr>
+              </m:radPr>
+              <m:deg/>
+              <m:e>
+                <m:r>
+                  <w:rPr>
+                    <w:rFonts w:ascii="Cambria Math" w:hAnsi="Cambria Math"/>
+                    <w:sz w:val="28"/>
+                    <w:szCs w:val="28"/>
+                  </w:rPr>
+                  <m:t>n∙</m:t>
+                </m:r>
+                <m:r>
+                  <w:rPr>
+                    <w:rFonts w:ascii="Cambria Math" w:hAnsi="Cambria Math"/>
+                    <w:sz w:val="28"/>
+                    <w:szCs w:val="28"/>
+                  </w:rPr>
+                  <m:t>I</m:t>
+                </m:r>
+                <m:d>
+                  <m:dPr>
+                    <m:ctrlPr>
+                      <w:rPr>
+                        <w:rFonts w:ascii="Cambria Math" w:hAnsi="Cambria Math"/>
+                        <w:i/>
+                        <w:sz w:val="28"/>
+                        <w:szCs w:val="28"/>
+                      </w:rPr>
+                    </m:ctrlPr>
+                  </m:dPr>
+                  <m:e>
+                    <m:acc>
+                      <m:accPr>
+                        <m:ctrlPr>
+                          <w:rPr>
+                            <w:rFonts w:ascii="Cambria Math" w:hAnsi="Cambria Math"/>
+                            <w:i/>
+                            <w:sz w:val="28"/>
+                            <w:szCs w:val="28"/>
+                          </w:rPr>
+                        </m:ctrlPr>
+                      </m:accPr>
+                      <m:e>
+                        <m:r>
+                          <w:rPr>
+                            <w:rFonts w:ascii="Cambria Math" w:hAnsi="Cambria Math"/>
+                            <w:sz w:val="28"/>
+                            <w:szCs w:val="28"/>
+                          </w:rPr>
+                          <m:t>θ</m:t>
+                        </m:r>
+                      </m:e>
+                    </m:acc>
+                  </m:e>
+                </m:d>
+              </m:e>
+            </m:rad>
+          </m:den>
+        </m:f>
+      </m:oMath>
+      <w:r>
+        <w:rPr>
+          <w:sz w:val="28"/>
+          <w:szCs w:val="28"/>
+        </w:rPr>
+        <w:t xml:space="preserve">, где </w:t>
+      </w:r>
+      <m:oMath>
+        <m:r>
+          <w:rPr>
+            <w:rFonts w:ascii="Cambria Math" w:hAnsi="Cambria Math"/>
+            <w:sz w:val="28"/>
+            <w:szCs w:val="28"/>
+          </w:rPr>
+          <m:t>I(θ)</m:t>
+        </m:r>
+      </m:oMath>
+      <w:r>
+        <w:rPr>
+          <w:sz w:val="28"/>
+          <w:szCs w:val="28"/>
+        </w:rPr>
+        <w:t xml:space="preserve"> — информация Фишера</w:t>
+      </w:r>
+      <w:r>
+        <w:rPr>
+          <w:sz w:val="28"/>
+          <w:szCs w:val="28"/>
+        </w:rPr>
+        <w:t>, посчитанная в пункте 6.3.</w:t>
+      </w:r>
+    </w:p>
+    <w:p>
+      <w:pPr>
+        <w:spacing w:before="100" w:beforeAutospacing="1" w:after="100" w:afterAutospacing="1" w:line="360" w:lineRule="auto"/>
+        <w:ind w:firstLine="360"/>
+        <w:rPr>
+          <w:sz w:val="28"/>
+          <w:szCs w:val="28"/>
+        </w:rPr>
+      </w:pPr>
+      <m:oMathPara>
+        <m:oMath>
+          <m:r>
+            <w:rPr>
+              <w:rFonts w:ascii="Cambria Math" w:hAnsi="Cambria Math"/>
+              <w:sz w:val="28"/>
+              <w:szCs w:val="28"/>
+            </w:rPr>
+            <m:t>se(</m:t>
+          </m:r>
+          <m:sSub>
+            <m:sSubPr>
+              <m:ctrlPr>
+                <w:rPr>
+                  <w:rFonts w:ascii="Cambria Math" w:hAnsi="Cambria Math"/>
+                  <w:i/>
+                  <w:sz w:val="28"/>
+                  <w:szCs w:val="28"/>
+                </w:rPr>
+              </m:ctrlPr>
+            </m:sSubPr>
+            <m:e>
+              <m:r>
+                <w:rPr>
+                  <w:rFonts w:ascii="Cambria Math" w:hAnsi="Cambria Math"/>
+                  <w:sz w:val="28"/>
+                  <w:szCs w:val="28"/>
+                </w:rPr>
+                <m:t>α̂</m:t>
+              </m:r>
+            </m:e>
+            <m:sub>
+              <m:r>
+                <w:rPr>
+                  <w:rFonts w:ascii="Cambria Math" w:hAnsi="Cambria Math"/>
+                  <w:sz w:val="28"/>
+                  <w:szCs w:val="28"/>
+                </w:rPr>
+                <m:t>ММП</m:t>
+              </m:r>
+            </m:sub>
+          </m:sSub>
+          <m:r>
+            <w:rPr>
+              <w:rFonts w:ascii="Cambria Math" w:hAnsi="Cambria Math"/>
+              <w:sz w:val="28"/>
+              <w:szCs w:val="28"/>
+            </w:rPr>
+            <m:t>) = √0,0223 ≈ 0,149</m:t>
+          </m:r>
+          <m:r>
+            <w:rPr>
+              <w:rFonts w:ascii="Cambria Math" w:hAnsi="Cambria Math"/>
+              <w:sz w:val="28"/>
+              <w:szCs w:val="28"/>
+            </w:rPr>
+            <w:br/>
+          </m:r>
+        </m:oMath>
+        <m:oMath>
+          <m:r>
+            <w:rPr>
+              <w:rFonts w:ascii="Cambria Math" w:hAnsi="Cambria Math"/>
+              <w:sz w:val="28"/>
+              <w:szCs w:val="28"/>
+            </w:rPr>
+            <m:t>se(</m:t>
+          </m:r>
+          <m:acc>
+            <m:accPr>
+              <m:ctrlPr>
+                <w:rPr>
+                  <w:rFonts w:ascii="Cambria Math" w:hAnsi="Cambria Math"/>
+                  <w:i/>
+                  <w:sz w:val="28"/>
+                  <w:szCs w:val="28"/>
+                  <w:lang w:val="en-US"/>
+                </w:rPr>
+              </m:ctrlPr>
+            </m:accPr>
+            <m:e>
+              <m:sSub>
+                <m:sSubPr>
+                  <m:ctrlPr>
+                    <w:rPr>
+                      <w:rFonts w:ascii="Cambria Math" w:hAnsi="Cambria Math"/>
+                      <w:i/>
+                      <w:sz w:val="28"/>
+                      <w:szCs w:val="28"/>
+                      <w:lang w:val="en-US"/>
+                    </w:rPr>
+                  </m:ctrlPr>
+                </m:sSubPr>
+                <m:e>
+                  <m:r>
+                    <w:rPr>
+                      <w:rFonts w:ascii="Cambria Math" w:hAnsi="Cambria Math"/>
+                      <w:sz w:val="28"/>
+                      <w:szCs w:val="28"/>
+                      <w:lang w:val="en-US"/>
+                    </w:rPr>
+                    <m:t>loc</m:t>
+                  </m:r>
+                </m:e>
+                <m:sub>
+                  <m:r>
+                    <w:rPr>
+                      <w:rFonts w:ascii="Cambria Math" w:hAnsi="Cambria Math"/>
+                      <w:sz w:val="28"/>
+                      <w:szCs w:val="28"/>
+                    </w:rPr>
+                    <m:t>ММП</m:t>
+                  </m:r>
+                </m:sub>
+              </m:sSub>
+            </m:e>
+          </m:acc>
+          <m:r>
+            <w:rPr>
+              <w:rFonts w:ascii="Cambria Math" w:hAnsi="Cambria Math"/>
+              <w:sz w:val="28"/>
+              <w:szCs w:val="28"/>
+            </w:rPr>
+            <m:t>) = √0,0172 ≈ 0,131</m:t>
+          </m:r>
+        </m:oMath>
+      </m:oMathPara>
+    </w:p>
+    <w:p>
+      <w:pPr>
+        <w:spacing w:before="100" w:beforeAutospacing="1" w:after="100" w:afterAutospacing="1" w:line="360" w:lineRule="auto"/>
+        <w:ind w:firstLine="360"/>
+        <w:jc w:val="both"/>
+        <w:rPr>
+          <w:sz w:val="28"/>
+          <w:szCs w:val="28"/>
+        </w:rPr>
+      </w:pPr>
+      <w:r>
+        <w:rPr>
+          <w:sz w:val="28"/>
+          <w:szCs w:val="28"/>
+        </w:rPr>
+        <w:tab/>
+        <w:t>Доверительный интервал строится по формуле:</w:t>
+      </w:r>
+    </w:p>
+    <w:p>
+      <w:pPr>
+        <w:spacing w:line="360" w:lineRule="auto"/>
+        <w:jc w:val="both"/>
+        <w:rPr>
+          <w:sz w:val="28"/>
+          <w:szCs w:val="28"/>
+        </w:rPr>
+      </w:pPr>
+      <m:oMathPara>
+        <m:oMath>
+          <m:acc>
+            <m:accPr>
+              <m:ctrlPr>
+                <w:rPr>
+                  <w:rFonts w:ascii="Cambria Math" w:hAnsi="Cambria Math"/>
+                  <w:i/>
+                  <w:sz w:val="28"/>
+                  <w:szCs w:val="28"/>
+                </w:rPr>
+              </m:ctrlPr>
+            </m:accPr>
+            <m:e>
+              <m:r>
+                <w:rPr>
+                  <w:rFonts w:ascii="Cambria Math" w:hAnsi="Cambria Math"/>
+                  <w:sz w:val="28"/>
+                  <w:szCs w:val="28"/>
+                </w:rPr>
+                <m:t>θ</m:t>
+              </m:r>
+            </m:e>
+          </m:acc>
+          <m:r>
+            <w:rPr>
+              <w:rFonts w:ascii="Cambria Math" w:hAnsi="Cambria Math"/>
+              <w:sz w:val="28"/>
+              <w:szCs w:val="28"/>
+            </w:rPr>
+            <m:t>± z</m:t>
+          </m:r>
+          <m:d>
+            <m:dPr>
+              <m:begChr m:val="{"/>
+              <m:endChr m:val="}"/>
+              <m:ctrlPr>
+                <w:rPr>
+                  <w:rFonts w:ascii="Cambria Math" w:hAnsi="Cambria Math"/>
+                  <w:i/>
+                  <w:sz w:val="28"/>
+                  <w:szCs w:val="28"/>
+                </w:rPr>
+              </m:ctrlPr>
+            </m:dPr>
+            <m:e>
+              <m:f>
+                <m:fPr>
+                  <m:ctrlPr>
+                    <w:rPr>
+                      <w:rFonts w:ascii="Cambria Math" w:hAnsi="Cambria Math"/>
+                      <w:i/>
+                      <w:sz w:val="28"/>
+                      <w:szCs w:val="28"/>
+                    </w:rPr>
+                  </m:ctrlPr>
+                </m:fPr>
+                <m:num>
+                  <m:r>
+                    <w:rPr>
+                      <w:rFonts w:ascii="Cambria Math" w:hAnsi="Cambria Math"/>
+                      <w:sz w:val="28"/>
+                      <w:szCs w:val="28"/>
+                    </w:rPr>
+                    <m:t>1+γ</m:t>
+                  </m:r>
+                </m:num>
+                <m:den>
+                  <m:r>
+                    <w:rPr>
+                      <w:rFonts w:ascii="Cambria Math" w:hAnsi="Cambria Math"/>
+                      <w:sz w:val="28"/>
+                      <w:szCs w:val="28"/>
+                    </w:rPr>
+                    <m:t>2</m:t>
+                  </m:r>
+                </m:den>
+              </m:f>
+            </m:e>
+          </m:d>
+          <m:r>
+            <w:rPr>
+              <w:rFonts w:ascii="Cambria Math" w:hAnsi="Cambria Math"/>
+              <w:sz w:val="28"/>
+              <w:szCs w:val="28"/>
+            </w:rPr>
+            <m:t>· se</m:t>
+          </m:r>
+          <m:d>
+            <m:dPr>
+              <m:ctrlPr>
+                <w:rPr>
+                  <w:rFonts w:ascii="Cambria Math" w:hAnsi="Cambria Math"/>
+                  <w:i/>
+                  <w:sz w:val="28"/>
+                  <w:szCs w:val="28"/>
+                </w:rPr>
+              </m:ctrlPr>
+            </m:dPr>
+            <m:e>
+              <m:acc>
+                <m:accPr>
+                  <m:ctrlPr>
+                    <w:rPr>
+                      <w:rFonts w:ascii="Cambria Math" w:hAnsi="Cambria Math"/>
+                      <w:i/>
+                      <w:sz w:val="28"/>
+                      <w:szCs w:val="28"/>
+                    </w:rPr>
+                  </m:ctrlPr>
+                </m:accPr>
+                <m:e>
+                  <m:r>
+                    <w:rPr>
+                      <w:rFonts w:ascii="Cambria Math" w:hAnsi="Cambria Math"/>
+                      <w:sz w:val="28"/>
+                      <w:szCs w:val="28"/>
+                    </w:rPr>
+                    <m:t>θ</m:t>
+                  </m:r>
+                </m:e>
+              </m:acc>
+            </m:e>
+          </m:d>
+        </m:oMath>
+      </m:oMathPara>
+    </w:p>
+    <w:p>
+      <w:pPr>
+        <w:spacing w:line="360" w:lineRule="auto"/>
+        <w:jc w:val="both"/>
+        <w:rPr>
+          <w:sz w:val="28"/>
+          <w:szCs w:val="28"/>
+        </w:rPr>
+      </w:pPr>
+      <w:r>
+        <w:rPr>
+          <w:sz w:val="28"/>
+          <w:szCs w:val="28"/>
+        </w:rPr>
+        <w:t xml:space="preserve">где </w:t>
+      </w:r>
+      <m:oMath>
+        <m:r>
+          <w:rPr>
+            <w:rFonts w:ascii="Cambria Math" w:hAnsi="Cambria Math"/>
+            <w:sz w:val="28"/>
+            <w:szCs w:val="28"/>
+          </w:rPr>
+          <m:t>z</m:t>
+        </m:r>
+        <m:d>
+          <m:dPr>
+            <m:begChr m:val="{"/>
+            <m:endChr m:val="}"/>
+            <m:ctrlPr>
+              <w:rPr>
+                <w:rFonts w:ascii="Cambria Math" w:hAnsi="Cambria Math"/>
+                <w:i/>
+                <w:sz w:val="28"/>
+                <w:szCs w:val="28"/>
+              </w:rPr>
+            </m:ctrlPr>
+          </m:dPr>
+          <m:e>
+            <m:f>
+              <m:fPr>
+                <m:ctrlPr>
+                  <w:rPr>
+                    <w:rFonts w:ascii="Cambria Math" w:hAnsi="Cambria Math"/>
+                    <w:i/>
+                    <w:sz w:val="28"/>
+                    <w:szCs w:val="28"/>
+                  </w:rPr>
+                </m:ctrlPr>
+              </m:fPr>
+              <m:num>
+                <m:r>
+                  <w:rPr>
+                    <w:rFonts w:ascii="Cambria Math" w:hAnsi="Cambria Math"/>
+                    <w:sz w:val="28"/>
+                    <w:szCs w:val="28"/>
+                  </w:rPr>
+                  <m:t>1+γ</m:t>
+                </m:r>
+              </m:num>
+              <m:den>
+                <m:r>
+                  <w:rPr>
+                    <w:rFonts w:ascii="Cambria Math" w:hAnsi="Cambria Math"/>
+                    <w:sz w:val="28"/>
+                    <w:szCs w:val="28"/>
+                  </w:rPr>
+                  <m:t>2</m:t>
+                </m:r>
+              </m:den>
+            </m:f>
+          </m:e>
+        </m:d>
+      </m:oMath>
+      <w:r>
+        <w:rPr>
+          <w:sz w:val="28"/>
+          <w:szCs w:val="28"/>
+        </w:rPr>
+        <w:t xml:space="preserve"> — квантиль стандартного нормального распределения: </w:t>
+      </w:r>
+      <m:oMath>
+        <m:r>
+          <w:rPr>
+            <w:rFonts w:ascii="Cambria Math" w:hAnsi="Cambria Math"/>
+            <w:sz w:val="28"/>
+            <w:szCs w:val="28"/>
+          </w:rPr>
+          <m:t>z{0,975} ≈ 1,960</m:t>
+        </m:r>
+      </m:oMath>
+      <w:r>
+        <w:rPr>
+          <w:sz w:val="28"/>
+          <w:szCs w:val="28"/>
+        </w:rPr>
+        <w:t xml:space="preserve"> при </w:t>
+      </w:r>
+      <m:oMath>
+        <m:r>
+          <w:rPr>
+            <w:rFonts w:ascii="Cambria Math" w:hAnsi="Cambria Math"/>
+            <w:sz w:val="28"/>
+            <w:szCs w:val="28"/>
+          </w:rPr>
+          <m:t>γ = 0,95</m:t>
+        </m:r>
+      </m:oMath>
+      <w:r>
+        <w:rPr>
+          <w:sz w:val="28"/>
+          <w:szCs w:val="28"/>
+        </w:rPr>
+        <w:t xml:space="preserve">; </w:t>
+      </w:r>
+      <m:oMath>
+        <m:r>
+          <w:rPr>
+            <w:rFonts w:ascii="Cambria Math" w:hAnsi="Cambria Math"/>
+            <w:sz w:val="28"/>
+            <w:szCs w:val="28"/>
+          </w:rPr>
+          <m:t>z</m:t>
+        </m:r>
+        <m:d>
+          <m:dPr>
+            <m:begChr m:val="{"/>
+            <m:endChr m:val="}"/>
+            <m:ctrlPr>
+              <w:rPr>
+                <w:rFonts w:ascii="Cambria Math" w:hAnsi="Cambria Math"/>
+                <w:i/>
+                <w:sz w:val="28"/>
+                <w:szCs w:val="28"/>
+              </w:rPr>
+            </m:ctrlPr>
+          </m:dPr>
+          <m:e>
+            <m:r>
+              <w:rPr>
+                <w:rFonts w:ascii="Cambria Math" w:hAnsi="Cambria Math"/>
+                <w:sz w:val="28"/>
+                <w:szCs w:val="28"/>
+              </w:rPr>
+              <m:t>0,995</m:t>
+            </m:r>
+          </m:e>
+        </m:d>
+        <m:r>
+          <w:rPr>
+            <w:rFonts w:ascii="Cambria Math" w:hAnsi="Cambria Math"/>
+            <w:sz w:val="28"/>
+            <w:szCs w:val="28"/>
+          </w:rPr>
+          <m:t>≈ 2,576</m:t>
+        </m:r>
+      </m:oMath>
+      <w:r>
+        <w:rPr>
+          <w:sz w:val="28"/>
+          <w:szCs w:val="28"/>
+        </w:rPr>
+        <w:t xml:space="preserve"> при </w:t>
+      </w:r>
+      <m:oMath>
+        <m:r>
+          <w:rPr>
+            <w:rFonts w:ascii="Cambria Math" w:hAnsi="Cambria Math"/>
+            <w:sz w:val="28"/>
+            <w:szCs w:val="28"/>
+          </w:rPr>
+          <m:t>γ = 0,99</m:t>
+        </m:r>
+      </m:oMath>
+      <w:r>
+        <w:rPr>
+          <w:sz w:val="28"/>
+          <w:szCs w:val="28"/>
+        </w:rPr>
+        <w:t xml:space="preserve">, </w:t>
+      </w:r>
+      <m:oMath>
+        <m:acc>
+          <m:accPr>
+            <m:ctrlPr>
+              <w:rPr>
+                <w:rFonts w:ascii="Cambria Math" w:hAnsi="Cambria Math"/>
+                <w:i/>
+                <w:sz w:val="28"/>
+                <w:szCs w:val="28"/>
+              </w:rPr>
+            </m:ctrlPr>
+          </m:accPr>
+          <m:e>
+            <m:r>
+              <w:rPr>
+                <w:rFonts w:ascii="Cambria Math" w:hAnsi="Cambria Math"/>
+                <w:sz w:val="28"/>
+                <w:szCs w:val="28"/>
+              </w:rPr>
+              <m:t>θ</m:t>
+            </m:r>
+          </m:e>
+        </m:acc>
+      </m:oMath>
+      <w:r>
+        <w:rPr>
+          <w:sz w:val="28"/>
+          <w:szCs w:val="28"/>
+        </w:rPr>
+        <w:t xml:space="preserve"> – значения </w:t>
+      </w:r>
+      <w:r>
+        <w:rPr>
+          <w:sz w:val="28"/>
+          <w:szCs w:val="28"/>
+        </w:rPr>
+        <w:t>параметров,</w:t>
+      </w:r>
+      <w:r>
+        <w:rPr>
+          <w:sz w:val="28"/>
+          <w:szCs w:val="28"/>
+        </w:rPr>
+        <w:t xml:space="preserve"> полученные через ММП. Значения </w:t>
+      </w:r>
+      <w:r>
+        <w:rPr>
+          <w:sz w:val="28"/>
+          <w:szCs w:val="28"/>
+          <w:lang w:val="en-US"/>
+        </w:rPr>
+        <w:t>z</w:t>
+      </w:r>
+      <w:r>
+        <w:rPr>
+          <w:sz w:val="28"/>
+          <w:szCs w:val="28"/>
+        </w:rPr>
+        <w:t xml:space="preserve"> взяли из таблицы значений для квантиля нормального распределения.</w:t>
+      </w:r>
+    </w:p>
+    <w:p>
+      <w:pPr>
+        <w:spacing w:line="360" w:lineRule="auto"/>
+        <w:ind w:firstLine="708"/>
+        <w:jc w:val="both"/>
+        <w:rPr>
+          <w:b/>
+          <w:bCs/>
+          <w:sz w:val="28"/>
+          <w:szCs w:val="28"/>
+        </w:rPr>
+      </w:pPr>
+    </w:p>
+    <w:p>
+      <w:pPr>
+        <w:spacing w:line="360" w:lineRule="auto"/>
+        <w:ind w:firstLine="708"/>
+        <w:jc w:val="both"/>
+        <w:rPr>
+          <w:b/>
+          <w:bCs/>
+          <w:sz w:val="28"/>
+          <w:szCs w:val="28"/>
+        </w:rPr>
+      </w:pPr>
+    </w:p>
+    <w:p>
+      <w:pPr>
+        <w:spacing w:line="360" w:lineRule="auto"/>
+        <w:ind w:firstLine="708"/>
+        <w:jc w:val="both"/>
+        <w:rPr>
+          <w:b/>
+          <w:bCs/>
+          <w:sz w:val="28"/>
+          <w:szCs w:val="28"/>
+        </w:rPr>
+      </w:pPr>
+    </w:p>
+    <w:p>
+      <w:pPr>
+        <w:spacing w:line="360" w:lineRule="auto"/>
+        <w:ind w:firstLine="708"/>
+        <w:jc w:val="both"/>
+        <w:rPr>
+          <w:b/>
+          <w:bCs/>
+          <w:sz w:val="28"/>
+          <w:szCs w:val="28"/>
+        </w:rPr>
+      </w:pPr>
+    </w:p>
+    <w:p>
+      <w:pPr>
+        <w:spacing w:line="360" w:lineRule="auto"/>
+        <w:ind w:firstLine="708"/>
+        <w:jc w:val="both"/>
+        <w:rPr>
+          <w:b/>
+          <w:bCs/>
+          <w:sz w:val="28"/>
+          <w:szCs w:val="28"/>
+        </w:rPr>
+      </w:pPr>
+      <w:r>
+        <w:rPr>
+          <w:b/>
+          <w:bCs/>
+          <w:sz w:val="28"/>
+          <w:szCs w:val="28"/>
+        </w:rPr>
+        <w:lastRenderedPageBreak/>
+        <w:t>7.2. Результаты</w:t>
+      </w:r>
+    </w:p>
+    <w:p>
+      <w:pPr>
+        <w:spacing w:line="360" w:lineRule="auto"/>
+        <w:ind w:firstLine="708"/>
+        <w:jc w:val="both"/>
+        <w:rPr>
+          <w:sz w:val="28"/>
+          <w:szCs w:val="28"/>
+        </w:rPr>
+      </w:pPr>
+      <w:r>
+        <w:rPr>
+          <w:sz w:val="28"/>
+          <w:szCs w:val="28"/>
+        </w:rPr>
+        <w:t xml:space="preserve">Доверительные интервалы для параметров a и </w:t>
+      </w:r>
+      <w:proofErr w:type="spellStart"/>
+      <w:r>
+        <w:rPr>
+          <w:sz w:val="28"/>
+          <w:szCs w:val="28"/>
+        </w:rPr>
+        <w:t>loc</w:t>
+      </w:r>
+      <w:proofErr w:type="spellEnd"/>
+      <w:r>
+        <w:rPr>
+          <w:sz w:val="28"/>
+          <w:szCs w:val="28"/>
+        </w:rPr>
+        <w:t xml:space="preserve"> приведены в таблице 4.</w:t>
+      </w:r>
+    </w:p>
+    <w:p>
+      <w:pPr>
+        <w:spacing w:line="360" w:lineRule="auto"/>
+        <w:jc w:val="both"/>
+        <w:rPr>
+          <w:sz w:val="28"/>
+          <w:szCs w:val="28"/>
+        </w:rPr>
+      </w:pPr>
+      <w:r>
+        <w:rPr>
+          <w:sz w:val="28"/>
+          <w:szCs w:val="28"/>
+        </w:rPr>
+        <w:t>Таблица 4 – Интервальные оценки параметров</w:t>
+      </w:r>
+    </w:p>
+    <w:tbl>
+      <w:tblPr>
+        <w:tblW w:w="9203" w:type="dxa"/>
+        <w:tblBorders>
+          <w:top w:val="single" w:sz="4" w:space="0" w:color="auto"/>
+          <w:left w:val="single" w:sz="4" w:space="0" w:color="auto"/>
+          <w:bottom w:val="single" w:sz="4" w:space="0" w:color="auto"/>
+          <w:right w:val="single" w:sz="4" w:space="0" w:color="auto"/>
+          <w:insideH w:val="single" w:sz="4" w:space="0" w:color="auto"/>
+          <w:insideV w:val="single" w:sz="4" w:space="0" w:color="auto"/>
+        </w:tblBorders>
+        <w:tblCellMar>
+          <w:left w:w="10" w:type="dxa"/>
+          <w:right w:w="10" w:type="dxa"/>
+        </w:tblCellMar>
+        <w:tblLook w:val="04A0" w:firstRow="1" w:lastRow="0" w:firstColumn="1" w:lastColumn="0" w:noHBand="0" w:noVBand="1"/>
+      </w:tblPr>
+      <w:tblGrid>
+        <w:gridCol w:w="1979"/>
+        <w:gridCol w:w="1827"/>
+        <w:gridCol w:w="1827"/>
+        <w:gridCol w:w="1969"/>
+        <w:gridCol w:w="1601"/>
+      </w:tblGrid>
+      <w:tr>
+        <w:tc>
+          <w:tcPr>
+            <w:tcW w:w="1979" w:type="dxa"/>
+            <w:tcBorders>
+              <w:top w:val="single" w:sz="4" w:space="0" w:color="auto"/>
+              <w:left w:val="single" w:sz="4" w:space="0" w:color="auto"/>
+              <w:bottom w:val="single" w:sz="4" w:space="0" w:color="auto"/>
+              <w:right w:val="single" w:sz="4" w:space="0" w:color="auto"/>
+            </w:tcBorders>
+            <w:tcMar>
+              <w:top w:w="80" w:type="dxa"/>
+              <w:left w:w="120" w:type="dxa"/>
+              <w:bottom w:w="80" w:type="dxa"/>
+              <w:right w:w="120" w:type="dxa"/>
+            </w:tcMar>
+            <w:hideMark/>
+          </w:tcPr>
+          <w:p>
+            <w:pPr>
+              <w:spacing w:line="360" w:lineRule="auto"/>
+              <w:jc w:val="both"/>
+              <w:rPr>
+                <w:sz w:val="28"/>
+                <w:szCs w:val="28"/>
+              </w:rPr>
+            </w:pPr>
+            <w:r>
+              <w:rPr>
+                <w:b/>
+                <w:bCs/>
+                <w:sz w:val="28"/>
+                <w:szCs w:val="28"/>
+              </w:rPr>
+              <w:t>Параметр</w:t>
+            </w:r>
+          </w:p>
+        </w:tc>
+        <w:tc>
+          <w:tcPr>
+            <w:tcW w:w="1827" w:type="dxa"/>
+            <w:tcBorders>
+              <w:top w:val="single" w:sz="4" w:space="0" w:color="auto"/>
+              <w:left w:val="single" w:sz="4" w:space="0" w:color="auto"/>
+              <w:bottom w:val="single" w:sz="4" w:space="0" w:color="auto"/>
+              <w:right w:val="single" w:sz="4" w:space="0" w:color="auto"/>
+            </w:tcBorders>
+            <w:tcMar>
+              <w:top w:w="80" w:type="dxa"/>
+              <w:left w:w="120" w:type="dxa"/>
+              <w:bottom w:w="80" w:type="dxa"/>
+              <w:right w:w="120" w:type="dxa"/>
+            </w:tcMar>
+            <w:hideMark/>
+          </w:tcPr>
+          <w:p>
+            <w:pPr>
+              <w:spacing w:line="360" w:lineRule="auto"/>
+              <w:jc w:val="both"/>
+              <w:rPr>
+                <w:sz w:val="28"/>
+                <w:szCs w:val="28"/>
+              </w:rPr>
+            </w:pPr>
+            <w:bookmarkStart w:id="0" w:name="_Hlk232986388"/>
+            <w:r>
+              <w:rPr>
+                <w:b/>
+                <w:bCs/>
+                <w:sz w:val="28"/>
+                <w:szCs w:val="28"/>
+              </w:rPr>
+              <w:t>γ = 0,95</w:t>
+            </w:r>
+            <w:bookmarkEnd w:id="0"/>
+          </w:p>
+        </w:tc>
+        <w:tc>
+          <w:tcPr>
+            <w:tcW w:w="1827" w:type="dxa"/>
+            <w:tcBorders>
+              <w:top w:val="single" w:sz="4" w:space="0" w:color="auto"/>
+              <w:left w:val="single" w:sz="4" w:space="0" w:color="auto"/>
+              <w:bottom w:val="single" w:sz="4" w:space="0" w:color="auto"/>
+              <w:right w:val="single" w:sz="4" w:space="0" w:color="auto"/>
+            </w:tcBorders>
+            <w:tcMar>
+              <w:top w:w="80" w:type="dxa"/>
+              <w:left w:w="120" w:type="dxa"/>
+              <w:bottom w:w="80" w:type="dxa"/>
+              <w:right w:w="120" w:type="dxa"/>
+            </w:tcMar>
+            <w:hideMark/>
+          </w:tcPr>
+          <w:p>
+            <w:pPr>
+              <w:spacing w:line="360" w:lineRule="auto"/>
+              <w:jc w:val="both"/>
+              <w:rPr>
+                <w:sz w:val="28"/>
+                <w:szCs w:val="28"/>
+              </w:rPr>
+            </w:pPr>
+            <w:r>
+              <w:rPr>
+                <w:b/>
+                <w:bCs/>
+                <w:sz w:val="28"/>
+                <w:szCs w:val="28"/>
+              </w:rPr>
+              <w:t>γ = 0,99</w:t>
+            </w:r>
+          </w:p>
+        </w:tc>
+        <w:tc>
+          <w:tcPr>
+            <w:tcW w:w="1969" w:type="dxa"/>
+            <w:tcBorders>
+              <w:top w:val="single" w:sz="4" w:space="0" w:color="auto"/>
+              <w:left w:val="single" w:sz="4" w:space="0" w:color="auto"/>
+              <w:bottom w:val="single" w:sz="4" w:space="0" w:color="auto"/>
+              <w:right w:val="single" w:sz="4" w:space="0" w:color="auto"/>
+            </w:tcBorders>
+            <w:tcMar>
+              <w:top w:w="80" w:type="dxa"/>
+              <w:left w:w="120" w:type="dxa"/>
+              <w:bottom w:w="80" w:type="dxa"/>
+              <w:right w:w="120" w:type="dxa"/>
+            </w:tcMar>
+            <w:hideMark/>
+          </w:tcPr>
+          <w:p>
+            <w:pPr>
+              <w:spacing w:line="360" w:lineRule="auto"/>
+              <w:jc w:val="both"/>
+              <w:rPr>
+                <w:sz w:val="28"/>
+                <w:szCs w:val="28"/>
+              </w:rPr>
+            </w:pPr>
+            <w:r>
+              <w:rPr>
+                <w:b/>
+                <w:bCs/>
+                <w:sz w:val="28"/>
+                <w:szCs w:val="28"/>
+              </w:rPr>
+              <w:t xml:space="preserve">Точечная </w:t>
+            </w:r>
+            <w:r>
+              <w:rPr>
+                <w:b/>
+                <w:bCs/>
+                <w:sz w:val="28"/>
+                <w:szCs w:val="28"/>
+              </w:rPr>
+              <w:t>оценка (</w:t>
+            </w:r>
+            <w:r>
+              <w:rPr>
+                <w:b/>
+                <w:bCs/>
+                <w:sz w:val="28"/>
+                <w:szCs w:val="28"/>
+              </w:rPr>
+              <w:t>ММП</w:t>
+            </w:r>
+            <w:r>
+              <w:rPr>
+                <w:b/>
+                <w:bCs/>
+                <w:sz w:val="28"/>
+                <w:szCs w:val="28"/>
+              </w:rPr>
+              <w:t>)</w:t>
+            </w:r>
+          </w:p>
+        </w:tc>
+        <w:tc>
+          <w:tcPr>
+            <w:tcW w:w="1601" w:type="dxa"/>
+            <w:tcBorders>
+              <w:top w:val="single" w:sz="4" w:space="0" w:color="auto"/>
+              <w:left w:val="single" w:sz="4" w:space="0" w:color="auto"/>
+              <w:bottom w:val="single" w:sz="4" w:space="0" w:color="auto"/>
+              <w:right w:val="single" w:sz="4" w:space="0" w:color="auto"/>
+            </w:tcBorders>
+            <w:hideMark/>
+          </w:tcPr>
+          <w:p>
+            <w:pPr>
+              <w:spacing w:line="360" w:lineRule="auto"/>
+              <w:jc w:val="both"/>
+              <w:rPr>
+                <w:b/>
+                <w:bCs/>
+                <w:sz w:val="28"/>
+                <w:szCs w:val="28"/>
+              </w:rPr>
+            </w:pPr>
+            <w:r>
+              <w:rPr>
+                <w:b/>
+                <w:bCs/>
+                <w:sz w:val="28"/>
+                <w:szCs w:val="28"/>
+              </w:rPr>
+              <w:t>Точечная оценка</w:t>
+            </w:r>
+            <w:r>
+              <w:rPr>
+                <w:b/>
+                <w:bCs/>
+                <w:sz w:val="28"/>
+                <w:szCs w:val="28"/>
+              </w:rPr>
+              <w:t xml:space="preserve"> </w:t>
+            </w:r>
+            <w:r>
+              <w:rPr>
+                <w:b/>
+                <w:bCs/>
+                <w:sz w:val="28"/>
+                <w:szCs w:val="28"/>
+              </w:rPr>
+              <w:t>(</w:t>
+            </w:r>
+            <w:r>
+              <w:rPr>
+                <w:b/>
+                <w:bCs/>
+                <w:sz w:val="28"/>
+                <w:szCs w:val="28"/>
+              </w:rPr>
+              <w:t>ММ</w:t>
+            </w:r>
+            <w:r>
+              <w:rPr>
+                <w:b/>
+                <w:bCs/>
+                <w:sz w:val="28"/>
+                <w:szCs w:val="28"/>
+              </w:rPr>
+              <w:t>)</w:t>
+            </w:r>
+          </w:p>
+        </w:tc>
+      </w:tr>
+      <w:tr>
+        <w:tc>
+          <w:tcPr>
+            <w:tcW w:w="1979" w:type="dxa"/>
+            <w:tcBorders>
+              <w:top w:val="single" w:sz="4" w:space="0" w:color="auto"/>
+              <w:left w:val="single" w:sz="4" w:space="0" w:color="auto"/>
+              <w:bottom w:val="single" w:sz="4" w:space="0" w:color="auto"/>
+              <w:right w:val="single" w:sz="4" w:space="0" w:color="auto"/>
+            </w:tcBorders>
+            <w:tcMar>
+              <w:top w:w="80" w:type="dxa"/>
+              <w:left w:w="120" w:type="dxa"/>
+              <w:bottom w:w="80" w:type="dxa"/>
+              <w:right w:w="120" w:type="dxa"/>
+            </w:tcMar>
+            <w:hideMark/>
+          </w:tcPr>
+          <w:p>
+            <w:pPr>
+              <w:spacing w:line="360" w:lineRule="auto"/>
+              <w:jc w:val="both"/>
+              <w:rPr>
+                <w:sz w:val="28"/>
+                <w:szCs w:val="28"/>
+              </w:rPr>
+            </w:pPr>
+            <m:oMathPara>
+              <m:oMath>
+                <m:r>
+                  <w:rPr>
+                    <w:rFonts w:ascii="Cambria Math" w:hAnsi="Cambria Math"/>
+                    <w:sz w:val="28"/>
+                    <w:szCs w:val="28"/>
+                  </w:rPr>
+                  <m:t>a</m:t>
+                </m:r>
+              </m:oMath>
+            </m:oMathPara>
+          </w:p>
+        </w:tc>
+        <w:tc>
+          <w:tcPr>
+            <w:tcW w:w="1827" w:type="dxa"/>
+            <w:tcBorders>
+              <w:top w:val="single" w:sz="4" w:space="0" w:color="auto"/>
+              <w:left w:val="single" w:sz="4" w:space="0" w:color="auto"/>
+              <w:bottom w:val="single" w:sz="4" w:space="0" w:color="auto"/>
+              <w:right w:val="single" w:sz="4" w:space="0" w:color="auto"/>
+            </w:tcBorders>
+            <w:tcMar>
+              <w:top w:w="80" w:type="dxa"/>
+              <w:left w:w="120" w:type="dxa"/>
+              <w:bottom w:w="80" w:type="dxa"/>
+              <w:right w:w="120" w:type="dxa"/>
+            </w:tcMar>
+            <w:hideMark/>
+          </w:tcPr>
+          <w:p>
+            <w:pPr>
+              <w:spacing w:line="360" w:lineRule="auto"/>
+              <w:jc w:val="both"/>
+              <w:rPr>
+                <w:sz w:val="28"/>
+                <w:szCs w:val="28"/>
+                <w:lang w:val="en-US"/>
+              </w:rPr>
+            </w:pPr>
+            <w:r>
+              <w:rPr>
+                <w:sz w:val="28"/>
+                <w:szCs w:val="28"/>
+              </w:rPr>
+              <w:t>[6</w:t>
+            </w:r>
+            <w:r>
+              <w:rPr>
+                <w:sz w:val="28"/>
+                <w:szCs w:val="28"/>
+                <w:lang w:val="en-US"/>
+              </w:rPr>
+              <w:t>,</w:t>
+            </w:r>
+            <w:r>
+              <w:rPr>
+                <w:sz w:val="28"/>
+                <w:szCs w:val="28"/>
+              </w:rPr>
+              <w:t>87</w:t>
+            </w:r>
+            <w:r>
+              <w:rPr>
+                <w:sz w:val="28"/>
+                <w:szCs w:val="28"/>
+                <w:lang w:val="en-US"/>
+              </w:rPr>
+              <w:t>;</w:t>
+            </w:r>
+            <w:r>
+              <w:rPr>
+                <w:sz w:val="28"/>
+                <w:szCs w:val="28"/>
+              </w:rPr>
+              <w:t xml:space="preserve"> 7</w:t>
+            </w:r>
+            <w:r>
+              <w:rPr>
+                <w:sz w:val="28"/>
+                <w:szCs w:val="28"/>
+                <w:lang w:val="en-US"/>
+              </w:rPr>
+              <w:t>,</w:t>
+            </w:r>
+            <w:r>
+              <w:rPr>
+                <w:sz w:val="28"/>
+                <w:szCs w:val="28"/>
+              </w:rPr>
+              <w:t>46</w:t>
+            </w:r>
+            <w:r>
+              <w:rPr>
+                <w:sz w:val="28"/>
+                <w:szCs w:val="28"/>
+              </w:rPr>
+              <w:t>]</w:t>
+            </w:r>
+          </w:p>
+        </w:tc>
+        <w:tc>
+          <w:tcPr>
+            <w:tcW w:w="1827" w:type="dxa"/>
+            <w:tcBorders>
+              <w:top w:val="single" w:sz="4" w:space="0" w:color="auto"/>
+              <w:left w:val="single" w:sz="4" w:space="0" w:color="auto"/>
+              <w:bottom w:val="single" w:sz="4" w:space="0" w:color="auto"/>
+              <w:right w:val="single" w:sz="4" w:space="0" w:color="auto"/>
+            </w:tcBorders>
+            <w:tcMar>
+              <w:top w:w="80" w:type="dxa"/>
+              <w:left w:w="120" w:type="dxa"/>
+              <w:bottom w:w="80" w:type="dxa"/>
+              <w:right w:w="120" w:type="dxa"/>
+            </w:tcMar>
+            <w:hideMark/>
+          </w:tcPr>
+          <w:p>
+            <w:pPr>
+              <w:spacing w:line="360" w:lineRule="auto"/>
+              <w:jc w:val="both"/>
+              <w:rPr>
+                <w:sz w:val="28"/>
+                <w:szCs w:val="28"/>
+                <w:lang w:val="en-US"/>
+              </w:rPr>
+            </w:pPr>
+            <w:r>
+              <w:rPr>
+                <w:sz w:val="28"/>
+                <w:szCs w:val="28"/>
+              </w:rPr>
+              <w:t>[6</w:t>
+            </w:r>
+            <w:r>
+              <w:rPr>
+                <w:sz w:val="28"/>
+                <w:szCs w:val="28"/>
+                <w:lang w:val="en-US"/>
+              </w:rPr>
+              <w:t>,</w:t>
+            </w:r>
+            <w:r>
+              <w:rPr>
+                <w:sz w:val="28"/>
+                <w:szCs w:val="28"/>
+              </w:rPr>
+              <w:t>7</w:t>
+            </w:r>
+            <w:r>
+              <w:rPr>
+                <w:sz w:val="28"/>
+                <w:szCs w:val="28"/>
+              </w:rPr>
+              <w:t>8</w:t>
+            </w:r>
+            <w:r>
+              <w:rPr>
+                <w:sz w:val="28"/>
+                <w:szCs w:val="28"/>
+                <w:lang w:val="en-US"/>
+              </w:rPr>
+              <w:t>;</w:t>
+            </w:r>
+            <w:r>
+              <w:rPr>
+                <w:sz w:val="28"/>
+                <w:szCs w:val="28"/>
+              </w:rPr>
+              <w:t xml:space="preserve"> 7</w:t>
+            </w:r>
+            <w:r>
+              <w:rPr>
+                <w:sz w:val="28"/>
+                <w:szCs w:val="28"/>
+                <w:lang w:val="en-US"/>
+              </w:rPr>
+              <w:t>,</w:t>
+            </w:r>
+            <w:r>
+              <w:rPr>
+                <w:sz w:val="28"/>
+                <w:szCs w:val="28"/>
+              </w:rPr>
+              <w:t>5</w:t>
+            </w:r>
+            <w:r>
+              <w:rPr>
+                <w:sz w:val="28"/>
+                <w:szCs w:val="28"/>
+              </w:rPr>
+              <w:t>5</w:t>
+            </w:r>
+            <w:r>
+              <w:rPr>
+                <w:sz w:val="28"/>
+                <w:szCs w:val="28"/>
+              </w:rPr>
+              <w:t>]</w:t>
+            </w:r>
+          </w:p>
+        </w:tc>
+        <w:tc>
+          <w:tcPr>
+            <w:tcW w:w="1969" w:type="dxa"/>
+            <w:tcBorders>
+              <w:top w:val="single" w:sz="4" w:space="0" w:color="auto"/>
+              <w:left w:val="single" w:sz="4" w:space="0" w:color="auto"/>
+              <w:bottom w:val="single" w:sz="4" w:space="0" w:color="auto"/>
+              <w:right w:val="single" w:sz="4" w:space="0" w:color="auto"/>
+            </w:tcBorders>
+            <w:tcMar>
+              <w:top w:w="80" w:type="dxa"/>
+              <w:left w:w="120" w:type="dxa"/>
+              <w:bottom w:w="80" w:type="dxa"/>
+              <w:right w:w="120" w:type="dxa"/>
+            </w:tcMar>
+            <w:hideMark/>
+          </w:tcPr>
+          <w:p>
+            <w:pPr>
+              <w:spacing w:line="360" w:lineRule="auto"/>
+              <w:jc w:val="both"/>
+              <w:rPr>
+                <w:sz w:val="28"/>
+                <w:szCs w:val="28"/>
+              </w:rPr>
+            </w:pPr>
+            <w:r>
+              <w:rPr>
+                <w:sz w:val="28"/>
+                <w:szCs w:val="28"/>
+                <w:lang w:val="en-US"/>
+              </w:rPr>
+              <w:t>7,16</w:t>
+            </w:r>
+          </w:p>
+        </w:tc>
+        <w:tc>
+          <w:tcPr>
+            <w:tcW w:w="1601" w:type="dxa"/>
+            <w:tcBorders>
+              <w:top w:val="single" w:sz="4" w:space="0" w:color="auto"/>
+              <w:left w:val="single" w:sz="4" w:space="0" w:color="auto"/>
+              <w:bottom w:val="single" w:sz="4" w:space="0" w:color="auto"/>
+              <w:right w:val="single" w:sz="4" w:space="0" w:color="auto"/>
+            </w:tcBorders>
+            <w:hideMark/>
+          </w:tcPr>
+          <w:p>
+            <w:pPr>
+              <w:spacing w:line="360" w:lineRule="auto"/>
+              <w:jc w:val="both"/>
+              <w:rPr>
+                <w:sz w:val="28"/>
+                <w:szCs w:val="28"/>
+                <w:lang w:val="en-US"/>
+              </w:rPr>
+            </w:pPr>
+            <w:r>
+              <w:rPr>
+                <w:sz w:val="28"/>
+                <w:szCs w:val="28"/>
+                <w:lang w:val="en-US"/>
+              </w:rPr>
+              <w:t>7,07</w:t>
+            </w:r>
+          </w:p>
+        </w:tc>
+      </w:tr>
+      <w:tr>
+        <w:tc>
+          <w:tcPr>
+            <w:tcW w:w="1979" w:type="dxa"/>
+            <w:tcBorders>
+              <w:top w:val="single" w:sz="4" w:space="0" w:color="auto"/>
+              <w:left w:val="single" w:sz="4" w:space="0" w:color="auto"/>
+              <w:bottom w:val="single" w:sz="4" w:space="0" w:color="auto"/>
+              <w:right w:val="single" w:sz="4" w:space="0" w:color="auto"/>
+            </w:tcBorders>
+            <w:tcMar>
+              <w:top w:w="80" w:type="dxa"/>
+              <w:left w:w="120" w:type="dxa"/>
+              <w:bottom w:w="80" w:type="dxa"/>
+              <w:right w:w="120" w:type="dxa"/>
+            </w:tcMar>
+            <w:hideMark/>
+          </w:tcPr>
+          <w:p>
+            <w:pPr>
+              <w:spacing w:line="360" w:lineRule="auto"/>
+              <w:jc w:val="both"/>
+              <w:rPr>
+                <w:sz w:val="28"/>
+                <w:szCs w:val="28"/>
+              </w:rPr>
+            </w:pPr>
+            <m:oMathPara>
+              <m:oMath>
+                <m:r>
+                  <w:rPr>
+                    <w:rFonts w:ascii="Cambria Math" w:hAnsi="Cambria Math"/>
+                    <w:sz w:val="28"/>
+                    <w:szCs w:val="28"/>
+                  </w:rPr>
+                  <m:t>loc</m:t>
+                </m:r>
+              </m:oMath>
+            </m:oMathPara>
+          </w:p>
+        </w:tc>
+        <w:tc>
+          <w:tcPr>
+            <w:tcW w:w="1827" w:type="dxa"/>
+            <w:tcBorders>
+              <w:top w:val="single" w:sz="4" w:space="0" w:color="auto"/>
+              <w:left w:val="single" w:sz="4" w:space="0" w:color="auto"/>
+              <w:bottom w:val="single" w:sz="4" w:space="0" w:color="auto"/>
+              <w:right w:val="single" w:sz="4" w:space="0" w:color="auto"/>
+            </w:tcBorders>
+            <w:tcMar>
+              <w:top w:w="80" w:type="dxa"/>
+              <w:left w:w="120" w:type="dxa"/>
+              <w:bottom w:w="80" w:type="dxa"/>
+              <w:right w:w="120" w:type="dxa"/>
+            </w:tcMar>
+            <w:hideMark/>
+          </w:tcPr>
+          <w:p>
+            <w:pPr>
+              <w:spacing w:line="360" w:lineRule="auto"/>
+              <w:jc w:val="both"/>
+              <w:rPr>
+                <w:sz w:val="28"/>
+                <w:szCs w:val="28"/>
+                <w:lang w:val="en-US"/>
+              </w:rPr>
+            </w:pPr>
+            <w:r>
+              <w:rPr>
+                <w:sz w:val="28"/>
+                <w:szCs w:val="28"/>
+              </w:rPr>
+              <w:t>[0</w:t>
+            </w:r>
+            <w:r>
+              <w:rPr>
+                <w:sz w:val="28"/>
+                <w:szCs w:val="28"/>
+                <w:lang w:val="en-US"/>
+              </w:rPr>
+              <w:t>,</w:t>
+            </w:r>
+            <w:r>
+              <w:rPr>
+                <w:sz w:val="28"/>
+                <w:szCs w:val="28"/>
+              </w:rPr>
+              <w:t>5</w:t>
+            </w:r>
+            <w:r>
+              <w:rPr>
+                <w:sz w:val="28"/>
+                <w:szCs w:val="28"/>
+              </w:rPr>
+              <w:t>;</w:t>
+            </w:r>
+            <w:r>
+              <w:rPr>
+                <w:sz w:val="28"/>
+                <w:szCs w:val="28"/>
+              </w:rPr>
+              <w:t xml:space="preserve"> 1</w:t>
+            </w:r>
+            <w:r>
+              <w:rPr>
+                <w:sz w:val="28"/>
+                <w:szCs w:val="28"/>
+                <w:lang w:val="en-US"/>
+              </w:rPr>
+              <w:t>,</w:t>
+            </w:r>
+            <w:r>
+              <w:rPr>
+                <w:sz w:val="28"/>
+                <w:szCs w:val="28"/>
+              </w:rPr>
+              <w:t>0</w:t>
+            </w:r>
+            <w:r>
+              <w:rPr>
+                <w:sz w:val="28"/>
+                <w:szCs w:val="28"/>
+              </w:rPr>
+              <w:t>1</w:t>
+            </w:r>
+            <w:r>
+              <w:rPr>
+                <w:sz w:val="28"/>
+                <w:szCs w:val="28"/>
+              </w:rPr>
+              <w:t>]</w:t>
+            </w:r>
+          </w:p>
+        </w:tc>
+        <w:tc>
+          <w:tcPr>
+            <w:tcW w:w="1827" w:type="dxa"/>
+            <w:tcBorders>
+              <w:top w:val="single" w:sz="4" w:space="0" w:color="auto"/>
+              <w:left w:val="single" w:sz="4" w:space="0" w:color="auto"/>
+              <w:bottom w:val="single" w:sz="4" w:space="0" w:color="auto"/>
+              <w:right w:val="single" w:sz="4" w:space="0" w:color="auto"/>
+            </w:tcBorders>
+            <w:tcMar>
+              <w:top w:w="80" w:type="dxa"/>
+              <w:left w:w="120" w:type="dxa"/>
+              <w:bottom w:w="80" w:type="dxa"/>
+              <w:right w:w="120" w:type="dxa"/>
+            </w:tcMar>
+            <w:hideMark/>
+          </w:tcPr>
+          <w:p>
+            <w:pPr>
+              <w:spacing w:line="360" w:lineRule="auto"/>
+              <w:jc w:val="both"/>
+              <w:rPr>
+                <w:sz w:val="28"/>
+                <w:szCs w:val="28"/>
+                <w:lang w:val="en-US"/>
+              </w:rPr>
+            </w:pPr>
+            <w:r>
+              <w:rPr>
+                <w:sz w:val="28"/>
+                <w:szCs w:val="28"/>
+              </w:rPr>
+              <w:t>[0</w:t>
+            </w:r>
+            <w:r>
+              <w:rPr>
+                <w:sz w:val="28"/>
+                <w:szCs w:val="28"/>
+                <w:lang w:val="en-US"/>
+              </w:rPr>
+              <w:t>,</w:t>
+            </w:r>
+            <w:r>
+              <w:rPr>
+                <w:sz w:val="28"/>
+                <w:szCs w:val="28"/>
+              </w:rPr>
+              <w:t>4</w:t>
+            </w:r>
+            <w:r>
+              <w:rPr>
+                <w:sz w:val="28"/>
+                <w:szCs w:val="28"/>
+              </w:rPr>
+              <w:t>2</w:t>
+            </w:r>
+            <w:r>
+              <w:rPr>
+                <w:sz w:val="28"/>
+                <w:szCs w:val="28"/>
+                <w:lang w:val="en-US"/>
+              </w:rPr>
+              <w:t xml:space="preserve">; </w:t>
+            </w:r>
+            <w:r>
+              <w:rPr>
+                <w:sz w:val="28"/>
+                <w:szCs w:val="28"/>
+              </w:rPr>
+              <w:t>1</w:t>
+            </w:r>
+            <w:r>
+              <w:rPr>
+                <w:sz w:val="28"/>
+                <w:szCs w:val="28"/>
+                <w:lang w:val="en-US"/>
+              </w:rPr>
+              <w:t>,</w:t>
+            </w:r>
+            <w:r>
+              <w:rPr>
+                <w:sz w:val="28"/>
+                <w:szCs w:val="28"/>
+              </w:rPr>
+              <w:t>0</w:t>
+            </w:r>
+            <w:r>
+              <w:rPr>
+                <w:sz w:val="28"/>
+                <w:szCs w:val="28"/>
+              </w:rPr>
+              <w:t>9</w:t>
+            </w:r>
+            <w:r>
+              <w:rPr>
+                <w:sz w:val="28"/>
+                <w:szCs w:val="28"/>
+              </w:rPr>
+              <w:t>]</w:t>
+            </w:r>
+          </w:p>
+        </w:tc>
+        <w:tc>
+          <w:tcPr>
+            <w:tcW w:w="1969" w:type="dxa"/>
+            <w:tcBorders>
+              <w:top w:val="single" w:sz="4" w:space="0" w:color="auto"/>
+              <w:left w:val="single" w:sz="4" w:space="0" w:color="auto"/>
+              <w:bottom w:val="single" w:sz="4" w:space="0" w:color="auto"/>
+              <w:right w:val="single" w:sz="4" w:space="0" w:color="auto"/>
+            </w:tcBorders>
+            <w:tcMar>
+              <w:top w:w="80" w:type="dxa"/>
+              <w:left w:w="120" w:type="dxa"/>
+              <w:bottom w:w="80" w:type="dxa"/>
+              <w:right w:w="120" w:type="dxa"/>
+            </w:tcMar>
+            <w:hideMark/>
+          </w:tcPr>
+          <w:p>
+            <w:pPr>
+              <w:spacing w:line="360" w:lineRule="auto"/>
+              <w:jc w:val="both"/>
+              <w:rPr>
+                <w:sz w:val="28"/>
+                <w:szCs w:val="28"/>
+              </w:rPr>
+            </w:pPr>
+            <w:r>
+              <w:rPr>
+                <w:sz w:val="28"/>
+                <w:szCs w:val="28"/>
+                <w:lang w:val="en-US"/>
+              </w:rPr>
+              <w:t>0,76</w:t>
+            </w:r>
+          </w:p>
+        </w:tc>
+        <w:tc>
+          <w:tcPr>
+            <w:tcW w:w="1601" w:type="dxa"/>
+            <w:tcBorders>
+              <w:top w:val="single" w:sz="4" w:space="0" w:color="auto"/>
+              <w:left w:val="single" w:sz="4" w:space="0" w:color="auto"/>
+              <w:bottom w:val="single" w:sz="4" w:space="0" w:color="auto"/>
+              <w:right w:val="single" w:sz="4" w:space="0" w:color="auto"/>
+            </w:tcBorders>
+            <w:hideMark/>
+          </w:tcPr>
+          <w:p>
+            <w:pPr>
+              <w:spacing w:line="360" w:lineRule="auto"/>
+              <w:jc w:val="both"/>
+              <w:rPr>
+                <w:sz w:val="28"/>
+                <w:szCs w:val="28"/>
+              </w:rPr>
+            </w:pPr>
+            <w:r>
+              <w:rPr>
+                <w:sz w:val="28"/>
+                <w:szCs w:val="28"/>
+                <w:lang w:val="en-US"/>
+              </w:rPr>
+              <w:t>0,84</w:t>
+            </w:r>
+          </w:p>
+        </w:tc>
+      </w:tr>
+    </w:tbl>
+    <w:p>
+      <w:pPr>
+        <w:spacing w:line="360" w:lineRule="auto"/>
+        <w:ind w:firstLine="708"/>
+        <w:jc w:val="both"/>
+        <w:rPr>
+          <w:b/>
+          <w:bCs/>
+          <w:sz w:val="28"/>
+          <w:szCs w:val="28"/>
+        </w:rPr>
+      </w:pPr>
+    </w:p>
+    <w:p>
+      <w:pPr>
+        <w:spacing w:line="360" w:lineRule="auto"/>
+        <w:ind w:firstLine="708"/>
+        <w:jc w:val="both"/>
+        <w:rPr>
+          <w:b/>
+          <w:bCs/>
+          <w:sz w:val="28"/>
+          <w:szCs w:val="28"/>
+        </w:rPr>
+      </w:pPr>
+      <w:r>
+        <w:rPr>
+          <w:b/>
+          <w:bCs/>
+          <w:sz w:val="28"/>
+          <w:szCs w:val="28"/>
+        </w:rPr>
+        <w:t>7.3. Вывод</w:t>
+      </w:r>
+    </w:p>
+    <w:p>
+      <w:pPr>
+        <w:spacing w:line="360" w:lineRule="auto"/>
+        <w:ind w:firstLine="708"/>
+        <w:jc w:val="both"/>
+        <w:rPr>
+          <w:sz w:val="28"/>
+          <w:szCs w:val="28"/>
+        </w:rPr>
+      </w:pPr>
+      <w:r>
+        <w:rPr>
+          <w:sz w:val="28"/>
+          <w:szCs w:val="28"/>
+        </w:rPr>
+        <w:t>Доверительные интервалы</w:t>
+      </w:r>
+      <w:r>
+        <w:rPr>
+          <w:sz w:val="28"/>
+          <w:szCs w:val="28"/>
+        </w:rPr>
+        <w:t xml:space="preserve"> </w:t>
+      </w:r>
+      <w:r>
+        <w:rPr>
+          <w:sz w:val="28"/>
+          <w:szCs w:val="28"/>
+        </w:rPr>
+        <w:t>при γ = 0,99 шире, чем при γ = 0,95, что закономерно: для повышения надёжности необходимо расширить интервал.</w:t>
+      </w:r>
+      <w:r>
+        <w:rPr>
+          <w:sz w:val="28"/>
+          <w:szCs w:val="28"/>
+        </w:rPr>
+        <w:t xml:space="preserve"> Точечные оценки параметров </w:t>
+      </w:r>
+      <w:r>
+        <w:rPr>
+          <w:sz w:val="28"/>
+          <w:szCs w:val="28"/>
+          <w:lang w:val="en-US"/>
+        </w:rPr>
+        <w:t>a</w:t>
+      </w:r>
+      <w:r>
+        <w:rPr>
+          <w:sz w:val="28"/>
+          <w:szCs w:val="28"/>
+        </w:rPr>
+        <w:t xml:space="preserve"> и </w:t>
+      </w:r>
+      <w:r>
+        <w:rPr>
+          <w:sz w:val="28"/>
+          <w:szCs w:val="28"/>
+          <w:lang w:val="en-US"/>
+        </w:rPr>
+        <w:t>loc</w:t>
+      </w:r>
+      <w:r>
+        <w:rPr>
+          <w:sz w:val="28"/>
+          <w:szCs w:val="28"/>
+        </w:rPr>
+        <w:t xml:space="preserve"> </w:t>
+      </w:r>
+      <w:r>
+        <w:rPr>
+          <w:sz w:val="28"/>
+          <w:szCs w:val="28"/>
+        </w:rPr>
+        <w:t>для метода максимального правдоподобия (</w:t>
+      </w:r>
+      <w:r>
+        <w:rPr>
+          <w:sz w:val="28"/>
+          <w:szCs w:val="28"/>
+        </w:rPr>
+        <w:t>ММП</w:t>
+      </w:r>
+      <w:r>
+        <w:rPr>
+          <w:sz w:val="28"/>
+          <w:szCs w:val="28"/>
+        </w:rPr>
+        <w:t xml:space="preserve">) </w:t>
+      </w:r>
+      <w:r>
+        <w:rPr>
+          <w:sz w:val="28"/>
+          <w:szCs w:val="28"/>
+        </w:rPr>
+        <w:t>и для метода моментов (</w:t>
+      </w:r>
+      <w:r>
+        <w:rPr>
+          <w:sz w:val="28"/>
+          <w:szCs w:val="28"/>
+        </w:rPr>
+        <w:t>ММ</w:t>
+      </w:r>
+      <w:r>
+        <w:rPr>
+          <w:sz w:val="28"/>
+          <w:szCs w:val="28"/>
+        </w:rPr>
+        <w:t>)</w:t>
+      </w:r>
+      <w:r>
+        <w:rPr>
+          <w:sz w:val="28"/>
+          <w:szCs w:val="28"/>
+        </w:rPr>
+        <w:t xml:space="preserve"> попадают в доверительные интервалы обоих уровней. Следовательно, полученные интервальные оценки согласуются с точечными оценками параметров распределения.</w:t>
+      </w:r>
+    </w:p>
+    <w:p>
+      <w:pPr>
+        <w:spacing w:before="100" w:beforeAutospacing="1" w:after="100" w:afterAutospacing="1" w:line="360" w:lineRule="auto"/>
+        <w:ind w:firstLine="360"/>
+        <w:jc w:val="both"/>
+        <w:rPr>
+          <w:sz w:val="28"/>
+          <w:szCs w:val="28"/>
+        </w:rPr>
+      </w:pPr>
+    </w:p>
+    <w:p>
+      <w:pPr>
+        <w:spacing w:before="100" w:beforeAutospacing="1" w:after="100" w:afterAutospacing="1" w:line="360" w:lineRule="auto"/>
+        <w:ind w:firstLine="360"/>
+        <w:jc w:val="both"/>
+        <w:rPr>
+          <w:sz w:val="28"/>
+          <w:szCs w:val="28"/>
+        </w:rPr>
+      </w:pPr>
+      <w:r>
+        <w:rPr>
+          <w:sz w:val="28"/>
+          <w:szCs w:val="28"/>
+        </w:rPr>
+        <w:tab/>
+      </w:r>
+    </w:p>
+    <w:p>
+      <w:pPr>
+        <w:spacing w:before="100" w:beforeAutospacing="1" w:after="100" w:afterAutospacing="1" w:line="360" w:lineRule="auto"/>
+        <w:ind w:firstLine="708"/>
+        <w:jc w:val="center"/>
+        <w:rPr>
+          <w:sz w:val="28"/>
+          <w:szCs w:val="28"/>
+        </w:rPr>
+      </w:pPr>
+    </w:p>
+    <w:p>
+      <w:pPr>
+        <w:spacing w:before="100" w:beforeAutospacing="1" w:after="100" w:afterAutospacing="1" w:line="360" w:lineRule="auto"/>
+        <w:ind w:firstLine="708"/>
+        <w:jc w:val="both"/>
+        <w:rPr>
+          <w:sz w:val="28"/>
+          <w:szCs w:val="28"/>
+        </w:rPr>
+      </w:pPr>
+    </w:p>
+    <w:p>
+      <w:pPr>
+        <w:spacing w:before="100" w:beforeAutospacing="1" w:after="100" w:afterAutospacing="1" w:line="360" w:lineRule="auto"/>
+        <w:jc w:val="both"/>
+        <w:rPr>
+          <w:sz w:val="28"/>
+          <w:szCs w:val="28"/>
+        </w:rPr>
+      </w:pPr>
+    </w:p>
+    <w:p>
+      <w:pPr>
+        <w:spacing w:before="100" w:beforeAutospacing="1" w:after="100" w:afterAutospacing="1" w:line="360" w:lineRule="auto"/>
+        <w:jc w:val="both"/>
+        <w:rPr>
+          <w:sz w:val="28"/>
+          <w:szCs w:val="28"/>
+        </w:rPr>
+      </w:pPr>
+    </w:p>
+    <w:p>
+      <w:pPr>
+        <w:spacing w:before="100" w:beforeAutospacing="1" w:after="100" w:afterAutospacing="1" w:line="360" w:lineRule="auto"/>
+        <w:ind w:firstLine="708"/>
+        <w:jc w:val="both"/>
+        <w:rPr>
+          <w:sz w:val="28"/>
+          <w:szCs w:val="28"/>
+        </w:rPr>
+      </w:pPr>
+    </w:p>
+    <w:p>
+      <w:pPr>
+        <w:spacing w:before="100" w:beforeAutospacing="1" w:after="100" w:afterAutospacing="1" w:line="360" w:lineRule="auto"/>
+        <w:ind w:firstLine="708"/>
+        <w:jc w:val="both"/>
+        <w:rPr>
+          <w:sz w:val="28"/>
+          <w:szCs w:val="28"/>
+        </w:rPr>
+      </w:pPr>
+    </w:p>
+    <w:p>
+      <w:pPr>
+        <w:spacing w:before="100" w:beforeAutospacing="1" w:after="100" w:afterAutospacing="1" w:line="360" w:lineRule="auto"/>
+        <w:jc w:val="both"/>
+        <w:rPr>
+          <w:sz w:val="28"/>
+          <w:szCs w:val="28"/>
+        </w:rPr>
+      </w:pPr>
+    </w:p>
+    <w:p>
+      <w:pPr>
+        <w:spacing w:before="100" w:beforeAutospacing="1" w:after="100" w:afterAutospacing="1" w:line="360" w:lineRule="auto"/>
+        <w:ind w:firstLine="709"/>
+        <w:jc w:val="both"/>
+        <w:rPr>
+          <w:sz w:val="28"/>
+          <w:szCs w:val="28"/>
+        </w:rPr>
+      </w:pPr>
+    </w:p>
+    <w:p>
+      <w:pPr>
+        <w:spacing w:before="100" w:beforeAutospacing="1" w:after="100" w:afterAutospacing="1" w:line="360" w:lineRule="auto"/>
+        <w:ind w:firstLine="709"/>
+        <w:jc w:val="both"/>
+        <w:rPr>
+          <w:sz w:val="28"/>
+          <w:szCs w:val="28"/>
+        </w:rPr>
+      </w:pPr>
+    </w:p>
+    <w:p>
+      <w:pPr>
+        <w:spacing w:before="100" w:beforeAutospacing="1" w:after="100" w:afterAutospacing="1" w:line="360" w:lineRule="auto"/>
+        <w:ind w:firstLine="708"/>
+        <w:jc w:val="both"/>
+        <w:rPr>
+          <w:sz w:val="28"/>
+          <w:szCs w:val="28"/>
+        </w:rPr>
+      </w:pPr>
+    </w:p>
+    <w:p>
+      <w:pPr>
+        <w:spacing w:line="360" w:lineRule="auto"/>
+        <w:rPr>
+          <w:sz w:val="28"/>
+          <w:szCs w:val="28"/>
+        </w:rPr>
+      </w:pPr>
+    </w:p>
+    <w:p>
+      <w:pPr>
+        <w:spacing w:line="360" w:lineRule="auto"/>
+        <w:rPr>
+          <w:sz w:val="28"/>
+          <w:szCs w:val="28"/>
+        </w:rPr>
+      </w:pPr>
+    </w:p>
+    <w:p>
+      <w:pPr>
+        <w:spacing w:line="360" w:lineRule="auto"/>
+        <w:jc w:val="center"/>
+        <w:rPr>
+          <w:sz w:val="28"/>
+          <w:szCs w:val="28"/>
+        </w:rPr>
+      </w:pPr>
+    </w:p>
+    <w:p>
+      <w:pPr>
+        <w:spacing w:line="360" w:lineRule="auto"/>
+        <w:rPr>
+          <w:sz w:val="28"/>
+          <w:szCs w:val="28"/>
+        </w:rPr>
+      </w:pPr>
+    </w:p>
+    <w:p>
+      <w:pPr>
+        <w:spacing w:line="360" w:lineRule="auto"/>
+        <w:rPr>
+          <w:sz w:val="28"/>
+          <w:szCs w:val="28"/>
+        </w:rPr>
+      </w:pPr>
+    </w:p>
+    <w:p>
+      <w:pPr>
+        <w:spacing w:line="360" w:lineRule="auto"/>
+        <w:rPr>
+          <w:sz w:val="28"/>
+          <w:szCs w:val="28"/>
+        </w:rPr>
+      </w:pPr>
+    </w:p>
+    <w:p>
+      <w:pPr>
+        <w:spacing w:line="360" w:lineRule="auto"/>
+        <w:rPr>
+          <w:sz w:val="28"/>
+          <w:szCs w:val="28"/>
+        </w:rPr>
+      </w:pPr>
+    </w:p>
+    <w:p>
+      <w:pPr>
+        <w:spacing w:line="360" w:lineRule="auto"/>
+        <w:rPr>
+          <w:sz w:val="28"/>
+          <w:szCs w:val="28"/>
+        </w:rPr>
+      </w:pPr>
+    </w:p>
+    <w:p>
+      <w:pPr>
+        <w:spacing w:line="360" w:lineRule="auto"/>
+        <w:rPr>
+          <w:sz w:val="28"/>
+          <w:szCs w:val="28"/>
+        </w:rPr>
+      </w:pPr>
+    </w:p>
+    <w:p>
+      <w:pPr>
+        <w:spacing w:line="360" w:lineRule="auto"/>
+        <w:rPr>
+          <w:sz w:val="28"/>
+          <w:szCs w:val="28"/>
+        </w:rPr>
+      </w:pPr>
+    </w:p>
+    <w:p>
+      <w:pPr>
+        <w:spacing w:line="360" w:lineRule="auto"/>
+        <w:rPr>
+          <w:sz w:val="28"/>
+          <w:szCs w:val="28"/>
+        </w:rPr>
+      </w:pPr>
+    </w:p>
+    <w:p>
+      <w:pPr>
+        <w:spacing w:line="360" w:lineRule="auto"/>
+        <w:rPr>
+          <w:sz w:val="28"/>
+          <w:szCs w:val="28"/>
+        </w:rPr>
+      </w:pPr>
+    </w:p>
+    <w:p>
+      <w:pPr>
+        <w:spacing w:line="360" w:lineRule="auto"/>
+        <w:rPr>
+          <w:sz w:val="28"/>
+          <w:szCs w:val="28"/>
+        </w:rPr>
+      </w:pPr>
+    </w:p>
+    <w:p>
+      <w:pPr>
+        <w:spacing w:line="360" w:lineRule="auto"/>
+        <w:rPr>
+          <w:sz w:val="28"/>
+          <w:szCs w:val="28"/>
+        </w:rPr>
+      </w:pPr>
+    </w:p>
+    <w:p>
+      <w:pPr>
+        <w:spacing w:line="360" w:lineRule="auto"/>
+        <w:rPr>
+          <w:sz w:val="28"/>
+          <w:szCs w:val="28"/>
+        </w:rPr>
+      </w:pPr>
+    </w:p>
+    <w:p>
+      <w:pPr>
+        <w:spacing w:line="360" w:lineRule="auto"/>
+        <w:rPr>
+          <w:sz w:val="28"/>
+          <w:szCs w:val="28"/>
+        </w:rPr>
+      </w:pPr>
+    </w:p>
+    <w:p>
+      <w:pPr>
+        <w:spacing w:line="360" w:lineRule="auto"/>
+        <w:rPr>
+          <w:sz w:val="28"/>
+          <w:szCs w:val="28"/>
+        </w:rPr>
+      </w:pPr>
+    </w:p>
+    <w:p>
+      <w:pPr>
+        <w:spacing w:line="360" w:lineRule="auto"/>
+        <w:rPr>
+          <w:sz w:val="28"/>
+          <w:szCs w:val="28"/>
+        </w:rPr>
+      </w:pPr>
+    </w:p>
+    <w:p>
+      <w:pPr>
+        <w:spacing w:line="360" w:lineRule="auto"/>
+        <w:rPr>
+          <w:sz w:val="28"/>
+          <w:szCs w:val="28"/>
+        </w:rPr>
+      </w:pPr>
+    </w:p>
+    <w:p>
+      <w:pPr>
+        <w:spacing w:line="360" w:lineRule="auto"/>
+        <w:rPr>
+          <w:sz w:val="28"/>
+          <w:szCs w:val="28"/>
+        </w:rPr>
+      </w:pPr>
+    </w:p>
+    <w:p>
+      <w:pPr>
+        <w:spacing w:line="360" w:lineRule="auto"/>
+        <w:rPr>
+          <w:sz w:val="28"/>
+          <w:szCs w:val="28"/>
+        </w:rPr>
+      </w:pPr>
+    </w:p>
+    <w:p>
+      <w:pPr>
+        <w:spacing w:line="360" w:lineRule="auto"/>
+        <w:rPr>
+          <w:sz w:val="28"/>
+          <w:szCs w:val="28"/>
+        </w:rPr>
+      </w:pPr>
+    </w:p>
+    <w:p>
+      <w:pPr>
+        <w:spacing w:line="360" w:lineRule="auto"/>
+        <w:rPr>
+          <w:sz w:val="28"/>
+          <w:szCs w:val="28"/>
+        </w:rPr>
+      </w:pPr>
+    </w:p>
+    <w:p>
+      <w:pPr>
+        <w:spacing w:line="360" w:lineRule="auto"/>
+        <w:jc w:val="center"/>
         <w:rPr>
           <w:b/>
           <w:bCs/>
           <w:sz w:val="32"/>
           <w:szCs w:val="32"/>
         </w:rPr>
-        <w:t>Список использованной литературы</w:t>
-      </w:r>
-    </w:p>
-    <w:p>
-      <w:pPr>
-        <w:spacing w:line="360" w:lineRule="auto"/>
-        <w:jc w:val="center"/>
+      </w:pPr>
+      <w:r>
         <w:rPr>
           <w:b/>
           <w:bCs/>
-          <w:sz w:val="28"/>
-          <w:szCs w:val="28"/>
-        </w:rPr>
-      </w:pPr>
-    </w:p>
-    <w:p>
-      <w:pPr>
-        <w:spacing w:line="360" w:lineRule="auto"/>
-        <w:jc w:val="both"/>
-        <w:rPr>
-          <w:sz w:val="28"/>
-          <w:szCs w:val="28"/>
-          <w:lang w:val="en-US"/>
-        </w:rPr>
-      </w:pPr>
-      <w:r>
+          <w:sz w:val="32"/>
+          <w:szCs w:val="32"/>
+        </w:rPr>
+        <w:t>Список использованной литературы</w:t>
+      </w:r>
+    </w:p>
+    <w:p>
+      <w:pPr>
+        <w:spacing w:line="360" w:lineRule="auto"/>
+        <w:jc w:val="center"/>
         <w:rPr>
           <w:b/>
           <w:bCs/>
           <w:sz w:val="28"/>
           <w:szCs w:val="28"/>
+        </w:rPr>
+      </w:pPr>
+    </w:p>
+    <w:p>
+      <w:pPr>
+        <w:spacing w:line="360" w:lineRule="auto"/>
+        <w:jc w:val="both"/>
+        <w:rPr>
+          <w:sz w:val="28"/>
+          <w:szCs w:val="28"/>
           <w:lang w:val="en-US"/>
         </w:rPr>
-        <w:lastRenderedPageBreak/>
+      </w:pPr>
+      <w:r>
+        <w:rPr>
+          <w:b/>
+          <w:bCs/>
+          <w:sz w:val="28"/>
+          <w:szCs w:val="28"/>
+          <w:lang w:val="en-US"/>
+        </w:rPr>
         <w:t>[1] Pearson K. Tables of the Incomplete Gamma-Function / computed by the staff of the Department of Applied Statistics, University of London. — London: University of London, 1922. — URL</w:t>
       </w:r>
       <w:r>
@@ -19952,24 +23071,10 @@
           <w:szCs w:val="28"/>
           <w:lang w:val="en-US"/>
         </w:rPr>
-        <w:t>[2] Bain L. J., Engelhardt M. Introduction to Probability and Mathematical Statistics. — 2nd ed. — Belmont : Brooks/Cole, 1992. — 644 p.</w:t>
-      </w:r>
-    </w:p>
-    <w:p>
-      <w:pPr>
-        <w:spacing w:line="360" w:lineRule="auto"/>
-        <w:jc w:val="both"/>
-        <w:rPr>
-          <w:sz w:val="28"/>
-          <w:szCs w:val="28"/>
-          <w:lang w:val="en-US"/>
-        </w:rPr>
-      </w:pPr>
-    </w:p>
-    <w:p>
-      <w:pPr>
-        <w:spacing w:line="360" w:lineRule="auto"/>
-        <w:jc w:val="both"/>
+        <w:t xml:space="preserve">[2] Bain L. J., Engelhardt M. Introduction to Probability and Mathematical Statistics. — 2nd ed. — </w:t>
+      </w:r>
+      <w:proofErr w:type="gramStart"/>
+      <w:r>
         <w:rPr>
           <w:b/>
           <w:bCs/>
@@ -19977,7 +23082,9 @@
           <w:szCs w:val="28"/>
           <w:lang w:val="en-US"/>
         </w:rPr>
-      </w:pPr>
+        <w:t>Belmont :</w:t>
+      </w:r>
+      <w:proofErr w:type="gramEnd"/>
       <w:r>
         <w:rPr>
           <w:b/>
@@ -19986,7 +23093,7 @@
           <w:szCs w:val="28"/>
           <w:lang w:val="en-US"/>
         </w:rPr>
-        <w:t xml:space="preserve">[3] Bahashwan A. O., Kalantan Z. I., Adham S. A. Double Gamma Principal Components Analysis // Applied Mathematical Sciences. — 2018. — Vol. 12, № 11. — P. 523–533. </w:t>
+        <w:t xml:space="preserve"> Brooks/Cole, 1992. — 644 p.</w:t>
       </w:r>
     </w:p>
     <w:p>
@@ -20004,15 +23111,195 @@
       <w:pPr>
         <w:spacing w:line="360" w:lineRule="auto"/>
         <w:jc w:val="both"/>
-      </w:pPr>
-      <w:r>
         <w:rPr>
           <w:b/>
           <w:bCs/>
           <w:sz w:val="28"/>
           <w:szCs w:val="28"/>
-        </w:rPr>
-        <w:t>[4] Положинцев Б. И. Теория вероятностей и математическая статистика. Введение в математическую статистику: учебное пособие /  Б. И. Положинцев. – Санкт-Петербург: СПбПУ, 2016.</w:t>
+          <w:lang w:val="en-US"/>
+        </w:rPr>
+      </w:pPr>
+      <w:r>
+        <w:rPr>
+          <w:b/>
+          <w:bCs/>
+          <w:sz w:val="28"/>
+          <w:szCs w:val="28"/>
+          <w:lang w:val="en-US"/>
+        </w:rPr>
+        <w:t xml:space="preserve">[3] </w:t>
+      </w:r>
+      <w:proofErr w:type="spellStart"/>
+      <w:r>
+        <w:rPr>
+          <w:b/>
+          <w:bCs/>
+          <w:sz w:val="28"/>
+          <w:szCs w:val="28"/>
+          <w:lang w:val="en-US"/>
+        </w:rPr>
+        <w:t>Bahashwan</w:t>
+      </w:r>
+      <w:proofErr w:type="spellEnd"/>
+      <w:r>
+        <w:rPr>
+          <w:b/>
+          <w:bCs/>
+          <w:sz w:val="28"/>
+          <w:szCs w:val="28"/>
+          <w:lang w:val="en-US"/>
+        </w:rPr>
+        <w:t xml:space="preserve"> A. O., </w:t>
+      </w:r>
+      <w:proofErr w:type="spellStart"/>
+      <w:r>
+        <w:rPr>
+          <w:b/>
+          <w:bCs/>
+          <w:sz w:val="28"/>
+          <w:szCs w:val="28"/>
+          <w:lang w:val="en-US"/>
+        </w:rPr>
+        <w:t>Kalantan</w:t>
+      </w:r>
+      <w:proofErr w:type="spellEnd"/>
+      <w:r>
+        <w:rPr>
+          <w:b/>
+          <w:bCs/>
+          <w:sz w:val="28"/>
+          <w:szCs w:val="28"/>
+          <w:lang w:val="en-US"/>
+        </w:rPr>
+        <w:t xml:space="preserve"> Z. I., </w:t>
+      </w:r>
+      <w:proofErr w:type="spellStart"/>
+      <w:r>
+        <w:rPr>
+          <w:b/>
+          <w:bCs/>
+          <w:sz w:val="28"/>
+          <w:szCs w:val="28"/>
+          <w:lang w:val="en-US"/>
+        </w:rPr>
+        <w:t>Adham</w:t>
+      </w:r>
+      <w:proofErr w:type="spellEnd"/>
+      <w:r>
+        <w:rPr>
+          <w:b/>
+          <w:bCs/>
+          <w:sz w:val="28"/>
+          <w:szCs w:val="28"/>
+          <w:lang w:val="en-US"/>
+        </w:rPr>
+        <w:t xml:space="preserve"> S. A. Double Gamma Principal Components Analysis // Applied Mathematical Sciences. — 2018. — Vol. 12, № 11. — P. 523–533. </w:t>
+      </w:r>
+    </w:p>
+    <w:p>
+      <w:pPr>
+        <w:spacing w:line="360" w:lineRule="auto"/>
+        <w:jc w:val="both"/>
+        <w:rPr>
+          <w:sz w:val="28"/>
+          <w:szCs w:val="28"/>
+          <w:lang w:val="en-US"/>
+        </w:rPr>
+      </w:pPr>
+    </w:p>
+    <w:p>
+      <w:pPr>
+        <w:spacing w:line="360" w:lineRule="auto"/>
+        <w:jc w:val="both"/>
+      </w:pPr>
+      <w:r>
+        <w:rPr>
+          <w:b/>
+          <w:bCs/>
+          <w:sz w:val="28"/>
+          <w:szCs w:val="28"/>
+        </w:rPr>
+        <w:t xml:space="preserve">[4] </w:t>
+      </w:r>
+      <w:proofErr w:type="spellStart"/>
+      <w:r>
+        <w:rPr>
+          <w:b/>
+          <w:bCs/>
+          <w:sz w:val="28"/>
+          <w:szCs w:val="28"/>
+        </w:rPr>
+        <w:t>Положинцев</w:t>
+      </w:r>
+      <w:proofErr w:type="spellEnd"/>
+      <w:r>
+        <w:rPr>
+          <w:b/>
+          <w:bCs/>
+          <w:sz w:val="28"/>
+          <w:szCs w:val="28"/>
+        </w:rPr>
+        <w:t xml:space="preserve"> Б. И. Теория вероятностей и математическая статистика. Введение в математическую статистику: учебное пособие </w:t>
+      </w:r>
+      <w:proofErr w:type="gramStart"/>
+      <w:r>
+        <w:rPr>
+          <w:b/>
+          <w:bCs/>
+          <w:sz w:val="28"/>
+          <w:szCs w:val="28"/>
+        </w:rPr>
+        <w:t>/  Б.</w:t>
+      </w:r>
+      <w:proofErr w:type="gramEnd"/>
+      <w:r>
+        <w:rPr>
+          <w:b/>
+          <w:bCs/>
+          <w:sz w:val="28"/>
+          <w:szCs w:val="28"/>
+        </w:rPr>
+        <w:t xml:space="preserve"> И. </w:t>
+      </w:r>
+      <w:proofErr w:type="spellStart"/>
+      <w:r>
+        <w:rPr>
+          <w:b/>
+          <w:bCs/>
+          <w:sz w:val="28"/>
+          <w:szCs w:val="28"/>
+        </w:rPr>
+        <w:t>Положинцев</w:t>
+      </w:r>
+      <w:proofErr w:type="spellEnd"/>
+      <w:r>
+        <w:rPr>
+          <w:b/>
+          <w:bCs/>
+          <w:sz w:val="28"/>
+          <w:szCs w:val="28"/>
+        </w:rPr>
+        <w:t xml:space="preserve">. – Санкт-Петербург: </w:t>
+      </w:r>
+      <w:proofErr w:type="spellStart"/>
+      <w:r>
+        <w:rPr>
+          <w:b/>
+          <w:bCs/>
+          <w:sz w:val="28"/>
+          <w:szCs w:val="28"/>
+        </w:rPr>
+        <w:t>СПбПУ</w:t>
+      </w:r>
+      <w:proofErr w:type="spellEnd"/>
+      <w:r>
+        <w:rPr>
+          <w:b/>
+          <w:bCs/>
+          <w:sz w:val="28"/>
+          <w:szCs w:val="28"/>
+        </w:rPr>
+        <w:t>, 2016.</w:t>
       </w:r>
       <w:r>
         <w:rPr>
@@ -20467,7 +23754,7 @@
   <w:abstractNum w:abstractNumId="3" w15:restartNumberingAfterBreak="0">
     <w:nsid w:val="15DE0EAB"/>
     <w:multiLevelType w:val="multilevel"/>
-    <w:tmpl w:val="C0561E02"/>
+    <w:tmpl w:val="B6B27BCA"/>
     <w:lvl w:ilvl="0">
       <w:start w:val="5"/>
       <w:numFmt w:val="decimal"/>
@@ -20478,6 +23765,10 @@
       </w:pPr>
       <w:rPr>
         <w:rFonts w:hint="default"/>
+        <w:b/>
+        <w:bCs/>
+        <w:sz w:val="32"/>
+        <w:szCs w:val="32"/>
       </w:rPr>
     </w:lvl>
     <w:lvl w:ilvl="1">

</xml_diff>

<commit_message>
UPDATE: отчет DATE: 2026-09-22 03:55:12
</commit_message>
<xml_diff>
--- a/Учеба 4 семестр/Теория вероятности/Курсовая работа/Отчет, Код/Курсовая_работа.docx
+++ b/Учеба 4 семестр/Теория вероятности/Курсовая работа/Отчет, Код/Курсовая_работа.docx
@@ -21543,6 +21543,7 @@
         <w:rPr>
           <w:sz w:val="28"/>
           <w:szCs w:val="28"/>
+          <w:lang w:val="en-US"/>
         </w:rPr>
       </w:pPr>
       <w:r>
@@ -21566,24 +21567,56 @@
           <w:sz w:val="28"/>
           <w:szCs w:val="28"/>
         </w:rPr>
-        <w:t xml:space="preserve"> приведены в таблице 4.</w:t>
-      </w:r>
-    </w:p>
-    <w:p>
-      <w:pPr>
-        <w:spacing w:line="360" w:lineRule="auto"/>
-        <w:jc w:val="both"/>
-        <w:rPr>
-          <w:sz w:val="28"/>
-          <w:szCs w:val="28"/>
-        </w:rPr>
-      </w:pPr>
-      <w:r>
-        <w:rPr>
-          <w:sz w:val="28"/>
-          <w:szCs w:val="28"/>
-        </w:rPr>
-        <w:t>Таблица 4 – Интервальные оценки параметров</w:t>
+        <w:t xml:space="preserve"> </w:t>
+      </w:r>
+      <w:r>
+        <w:rPr>
+          <w:sz w:val="28"/>
+          <w:szCs w:val="28"/>
+        </w:rPr>
+        <w:t>[</w:t>
+      </w:r>
+      <w:r>
+        <w:rPr>
+          <w:sz w:val="28"/>
+          <w:szCs w:val="28"/>
+        </w:rPr>
+        <w:t>Т</w:t>
+      </w:r>
+      <w:r>
+        <w:rPr>
+          <w:sz w:val="28"/>
+          <w:szCs w:val="28"/>
+        </w:rPr>
+        <w:t>аблиц</w:t>
+      </w:r>
+      <w:r>
+        <w:rPr>
+          <w:sz w:val="28"/>
+          <w:szCs w:val="28"/>
+        </w:rPr>
+        <w:t>а</w:t>
+      </w:r>
+      <w:r>
+        <w:rPr>
+          <w:sz w:val="28"/>
+          <w:szCs w:val="28"/>
+        </w:rPr>
+        <w:t xml:space="preserve"> 4</w:t>
+      </w:r>
+      <w:r>
+        <w:rPr>
+          <w:sz w:val="28"/>
+          <w:szCs w:val="28"/>
+        </w:rPr>
+        <w:t>]</w:t>
+      </w:r>
+      <w:r>
+        <w:rPr>
+          <w:sz w:val="28"/>
+          <w:szCs w:val="28"/>
+        </w:rPr>
+        <w:t>.</w:t>
       </w:r>
     </w:p>
     <w:tbl>
@@ -22466,12 +22499,32 @@
       <w:pPr>
         <w:spacing w:line="360" w:lineRule="auto"/>
         <w:ind w:firstLine="708"/>
-        <w:jc w:val="both"/>
+        <w:jc w:val="center"/>
+        <w:rPr>
+          <w:sz w:val="28"/>
+          <w:szCs w:val="28"/>
+          <w:lang w:val="en-US"/>
+        </w:rPr>
+      </w:pPr>
+      <w:r>
+        <w:rPr>
+          <w:sz w:val="28"/>
+          <w:szCs w:val="28"/>
+        </w:rPr>
+        <w:t>Таблица 4 – Интервальные оценки параметров</w:t>
+      </w:r>
+    </w:p>
+    <w:p>
+      <w:pPr>
+        <w:spacing w:line="360" w:lineRule="auto"/>
+        <w:ind w:firstLine="708"/>
+        <w:jc w:val="center"/>
         <w:rPr>
           <w:b/>
           <w:bCs/>
           <w:sz w:val="28"/>
           <w:szCs w:val="28"/>
+          <w:lang w:val="en-US"/>
         </w:rPr>
       </w:pPr>
     </w:p>
@@ -22623,6 +22676,7 @@
         <w:rPr>
           <w:sz w:val="28"/>
           <w:szCs w:val="28"/>
+          <w:lang w:val="en-US"/>
         </w:rPr>
       </w:pPr>
     </w:p>

</xml_diff>

<commit_message>
UPDATE: отчет, код DATE: 2026-09-22 04:22:07
</commit_message>
<xml_diff>
--- a/Учеба 4 семестр/Теория вероятности/Курсовая работа/Отчет, Код/Курсовая_работа.docx
+++ b/Учеба 4 семестр/Теория вероятности/Курсовая работа/Отчет, Код/Курсовая_работа.docx
@@ -22524,7 +22524,6 @@
           <w:bCs/>
           <w:sz w:val="28"/>
           <w:szCs w:val="28"/>
-          <w:lang w:val="en-US"/>
         </w:rPr>
       </w:pPr>
     </w:p>
@@ -22753,328 +22752,2457 @@
     </w:p>
     <w:p>
       <w:pPr>
+        <w:pStyle w:val="a7"/>
+        <w:numPr>
+          <w:ilvl w:val="0"/>
+          <w:numId w:val="17"/>
+        </w:numPr>
         <w:spacing w:before="100" w:beforeAutospacing="1" w:after="100" w:afterAutospacing="1" w:line="360" w:lineRule="auto"/>
-        <w:ind w:firstLine="708"/>
-        <w:jc w:val="both"/>
-        <w:rPr>
-          <w:sz w:val="28"/>
-          <w:szCs w:val="28"/>
-        </w:rPr>
-      </w:pPr>
-    </w:p>
-    <w:p>
-      <w:pPr>
-        <w:spacing w:before="100" w:beforeAutospacing="1" w:after="100" w:afterAutospacing="1" w:line="360" w:lineRule="auto"/>
-        <w:jc w:val="both"/>
-        <w:rPr>
-          <w:sz w:val="28"/>
-          <w:szCs w:val="28"/>
-        </w:rPr>
-      </w:pPr>
-    </w:p>
-    <w:p>
-      <w:pPr>
-        <w:spacing w:before="100" w:beforeAutospacing="1" w:after="100" w:afterAutospacing="1" w:line="360" w:lineRule="auto"/>
-        <w:ind w:firstLine="709"/>
-        <w:jc w:val="both"/>
-        <w:rPr>
-          <w:sz w:val="28"/>
-          <w:szCs w:val="28"/>
-        </w:rPr>
-      </w:pPr>
-    </w:p>
-    <w:p>
-      <w:pPr>
-        <w:spacing w:before="100" w:beforeAutospacing="1" w:after="100" w:afterAutospacing="1" w:line="360" w:lineRule="auto"/>
-        <w:ind w:firstLine="709"/>
-        <w:jc w:val="both"/>
-        <w:rPr>
-          <w:sz w:val="28"/>
-          <w:szCs w:val="28"/>
-        </w:rPr>
-      </w:pPr>
-    </w:p>
-    <w:p>
-      <w:pPr>
-        <w:spacing w:before="100" w:beforeAutospacing="1" w:after="100" w:afterAutospacing="1" w:line="360" w:lineRule="auto"/>
-        <w:ind w:firstLine="708"/>
-        <w:jc w:val="both"/>
-        <w:rPr>
-          <w:sz w:val="28"/>
-          <w:szCs w:val="28"/>
-        </w:rPr>
-      </w:pPr>
-    </w:p>
-    <w:p>
-      <w:pPr>
-        <w:spacing w:line="360" w:lineRule="auto"/>
-        <w:rPr>
-          <w:sz w:val="28"/>
-          <w:szCs w:val="28"/>
-        </w:rPr>
-      </w:pPr>
-    </w:p>
-    <w:p>
-      <w:pPr>
-        <w:spacing w:line="360" w:lineRule="auto"/>
-        <w:rPr>
-          <w:sz w:val="28"/>
-          <w:szCs w:val="28"/>
-        </w:rPr>
-      </w:pPr>
-    </w:p>
-    <w:p>
-      <w:pPr>
-        <w:spacing w:line="360" w:lineRule="auto"/>
-        <w:jc w:val="center"/>
-        <w:rPr>
-          <w:sz w:val="28"/>
-          <w:szCs w:val="28"/>
-        </w:rPr>
-      </w:pPr>
-    </w:p>
-    <w:p>
-      <w:pPr>
-        <w:spacing w:line="360" w:lineRule="auto"/>
-        <w:rPr>
-          <w:sz w:val="28"/>
-          <w:szCs w:val="28"/>
-        </w:rPr>
-      </w:pPr>
-    </w:p>
-    <w:p>
-      <w:pPr>
-        <w:spacing w:line="360" w:lineRule="auto"/>
-        <w:rPr>
-          <w:sz w:val="28"/>
-          <w:szCs w:val="28"/>
-        </w:rPr>
-      </w:pPr>
-    </w:p>
-    <w:p>
-      <w:pPr>
-        <w:spacing w:line="360" w:lineRule="auto"/>
-        <w:rPr>
-          <w:sz w:val="28"/>
-          <w:szCs w:val="28"/>
-        </w:rPr>
-      </w:pPr>
-    </w:p>
-    <w:p>
-      <w:pPr>
-        <w:spacing w:line="360" w:lineRule="auto"/>
-        <w:rPr>
-          <w:sz w:val="28"/>
-          <w:szCs w:val="28"/>
-        </w:rPr>
-      </w:pPr>
-    </w:p>
-    <w:p>
-      <w:pPr>
-        <w:spacing w:line="360" w:lineRule="auto"/>
-        <w:rPr>
-          <w:sz w:val="28"/>
-          <w:szCs w:val="28"/>
-        </w:rPr>
-      </w:pPr>
-    </w:p>
-    <w:p>
-      <w:pPr>
-        <w:spacing w:line="360" w:lineRule="auto"/>
-        <w:rPr>
-          <w:sz w:val="28"/>
-          <w:szCs w:val="28"/>
-        </w:rPr>
-      </w:pPr>
-    </w:p>
-    <w:p>
-      <w:pPr>
-        <w:spacing w:line="360" w:lineRule="auto"/>
-        <w:rPr>
-          <w:sz w:val="28"/>
-          <w:szCs w:val="28"/>
-        </w:rPr>
-      </w:pPr>
-    </w:p>
-    <w:p>
-      <w:pPr>
-        <w:spacing w:line="360" w:lineRule="auto"/>
-        <w:rPr>
-          <w:sz w:val="28"/>
-          <w:szCs w:val="28"/>
-        </w:rPr>
-      </w:pPr>
-    </w:p>
-    <w:p>
-      <w:pPr>
-        <w:spacing w:line="360" w:lineRule="auto"/>
-        <w:rPr>
-          <w:sz w:val="28"/>
-          <w:szCs w:val="28"/>
-        </w:rPr>
-      </w:pPr>
-    </w:p>
-    <w:p>
-      <w:pPr>
-        <w:spacing w:line="360" w:lineRule="auto"/>
-        <w:rPr>
-          <w:sz w:val="28"/>
-          <w:szCs w:val="28"/>
-        </w:rPr>
-      </w:pPr>
-    </w:p>
-    <w:p>
-      <w:pPr>
-        <w:spacing w:line="360" w:lineRule="auto"/>
-        <w:rPr>
-          <w:sz w:val="28"/>
-          <w:szCs w:val="28"/>
-        </w:rPr>
-      </w:pPr>
-    </w:p>
-    <w:p>
-      <w:pPr>
-        <w:spacing w:line="360" w:lineRule="auto"/>
-        <w:rPr>
-          <w:sz w:val="28"/>
-          <w:szCs w:val="28"/>
-        </w:rPr>
-      </w:pPr>
-    </w:p>
-    <w:p>
-      <w:pPr>
-        <w:spacing w:line="360" w:lineRule="auto"/>
-        <w:rPr>
-          <w:sz w:val="28"/>
-          <w:szCs w:val="28"/>
-        </w:rPr>
-      </w:pPr>
-    </w:p>
-    <w:p>
-      <w:pPr>
-        <w:spacing w:line="360" w:lineRule="auto"/>
-        <w:rPr>
-          <w:sz w:val="28"/>
-          <w:szCs w:val="28"/>
-        </w:rPr>
-      </w:pPr>
-    </w:p>
-    <w:p>
-      <w:pPr>
-        <w:spacing w:line="360" w:lineRule="auto"/>
-        <w:rPr>
-          <w:sz w:val="28"/>
-          <w:szCs w:val="28"/>
-        </w:rPr>
-      </w:pPr>
-    </w:p>
-    <w:p>
-      <w:pPr>
-        <w:spacing w:line="360" w:lineRule="auto"/>
-        <w:rPr>
-          <w:sz w:val="28"/>
-          <w:szCs w:val="28"/>
-        </w:rPr>
-      </w:pPr>
-    </w:p>
-    <w:p>
-      <w:pPr>
-        <w:spacing w:line="360" w:lineRule="auto"/>
-        <w:rPr>
-          <w:sz w:val="28"/>
-          <w:szCs w:val="28"/>
-        </w:rPr>
-      </w:pPr>
-    </w:p>
-    <w:p>
-      <w:pPr>
-        <w:spacing w:line="360" w:lineRule="auto"/>
-        <w:rPr>
-          <w:sz w:val="28"/>
-          <w:szCs w:val="28"/>
-        </w:rPr>
-      </w:pPr>
-    </w:p>
-    <w:p>
-      <w:pPr>
-        <w:spacing w:line="360" w:lineRule="auto"/>
-        <w:rPr>
-          <w:sz w:val="28"/>
-          <w:szCs w:val="28"/>
-        </w:rPr>
-      </w:pPr>
-    </w:p>
-    <w:p>
-      <w:pPr>
-        <w:spacing w:line="360" w:lineRule="auto"/>
-        <w:rPr>
-          <w:sz w:val="28"/>
-          <w:szCs w:val="28"/>
-        </w:rPr>
-      </w:pPr>
-    </w:p>
-    <w:p>
-      <w:pPr>
-        <w:spacing w:line="360" w:lineRule="auto"/>
-        <w:jc w:val="center"/>
+        <w:jc w:val="both"/>
+        <w:rPr>
+          <w:sz w:val="28"/>
+          <w:szCs w:val="28"/>
+        </w:rPr>
+      </w:pPr>
+      <w:r>
         <w:rPr>
           <w:b/>
           <w:bCs/>
           <w:sz w:val="32"/>
           <w:szCs w:val="32"/>
         </w:rPr>
-      </w:pPr>
-      <w:r>
+        <w:lastRenderedPageBreak/>
+        <w:t>Статистические критерии</w:t>
+      </w:r>
+    </w:p>
+    <w:p>
+      <w:pPr>
+        <w:pStyle w:val="a7"/>
+        <w:numPr>
+          <w:ilvl w:val="1"/>
+          <w:numId w:val="17"/>
+        </w:numPr>
+        <w:spacing w:before="100" w:beforeAutospacing="1" w:after="100" w:afterAutospacing="1" w:line="360" w:lineRule="auto"/>
+        <w:jc w:val="both"/>
+        <w:rPr>
+          <w:sz w:val="28"/>
+          <w:szCs w:val="28"/>
+        </w:rPr>
+      </w:pPr>
+      <w:r>
+        <w:rPr>
+          <w:b/>
+          <w:bCs/>
+          <w:sz w:val="28"/>
+          <w:szCs w:val="28"/>
+        </w:rPr>
+        <w:t>Ошибки первого и второго рода</w:t>
+      </w:r>
+    </w:p>
+    <w:p>
+      <w:pPr>
+        <w:spacing w:line="360" w:lineRule="auto"/>
+        <w:ind w:firstLine="709"/>
+        <w:rPr>
+          <w:rFonts w:eastAsia="Arial"/>
+          <w:sz w:val="24"/>
+          <w:szCs w:val="24"/>
+        </w:rPr>
+      </w:pPr>
+      <w:r>
+        <w:rPr>
+          <w:sz w:val="24"/>
+          <w:szCs w:val="24"/>
+        </w:rPr>
+        <w:t xml:space="preserve">Для вычисления ошибок первого и второго рода строился критерий вида </w:t>
+      </w:r>
+      <m:oMath>
+        <m:r>
+          <w:rPr>
+            <w:rFonts w:ascii="Cambria Math" w:eastAsia="Arial" w:hAnsi="Cambria Math"/>
+            <w:sz w:val="24"/>
+            <w:szCs w:val="24"/>
+          </w:rPr>
+          <m:t>H_0:{a=</m:t>
+        </m:r>
+        <m:acc>
+          <m:accPr>
+            <m:ctrlPr>
+              <w:rPr>
+                <w:rFonts w:ascii="Cambria Math" w:eastAsia="Arial" w:hAnsi="Cambria Math"/>
+                <w:i/>
+                <w:sz w:val="24"/>
+                <w:szCs w:val="24"/>
+              </w:rPr>
+            </m:ctrlPr>
+          </m:accPr>
+          <m:e>
+            <m:sSub>
+              <m:sSubPr>
+                <m:ctrlPr>
+                  <w:rPr>
+                    <w:rFonts w:ascii="Cambria Math" w:eastAsia="Arial" w:hAnsi="Cambria Math"/>
+                    <w:i/>
+                    <w:sz w:val="24"/>
+                    <w:szCs w:val="24"/>
+                  </w:rPr>
+                </m:ctrlPr>
+              </m:sSubPr>
+              <m:e>
+                <m:r>
+                  <w:rPr>
+                    <w:rFonts w:ascii="Cambria Math" w:eastAsia="Arial" w:hAnsi="Cambria Math"/>
+                    <w:sz w:val="24"/>
+                    <w:szCs w:val="24"/>
+                  </w:rPr>
+                  <m:t>a</m:t>
+                </m:r>
+              </m:e>
+              <m:sub>
+                <m:r>
+                  <w:rPr>
+                    <w:rFonts w:ascii="Cambria Math" w:eastAsia="Arial" w:hAnsi="Cambria Math"/>
+                    <w:sz w:val="24"/>
+                    <w:szCs w:val="24"/>
+                  </w:rPr>
+                  <m:t>i</m:t>
+                </m:r>
+              </m:sub>
+            </m:sSub>
+          </m:e>
+        </m:acc>
+        <m:r>
+          <w:rPr>
+            <w:rFonts w:ascii="Cambria Math" w:eastAsia="Arial" w:hAnsi="Cambria Math"/>
+            <w:sz w:val="24"/>
+            <w:szCs w:val="24"/>
+          </w:rPr>
+          <m:t>̂</m:t>
+        </m:r>
+      </m:oMath>
+      <w:r>
+        <w:rPr>
+          <w:rFonts w:eastAsia="Arial"/>
+          <w:sz w:val="24"/>
+          <w:szCs w:val="24"/>
+        </w:rPr>
+        <w:t>} для каждого параметра. Здесь</w:t>
+      </w:r>
+      <m:oMath>
+        <m:r>
+          <w:rPr>
+            <w:rFonts w:ascii="Cambria Math" w:eastAsia="Arial" w:hAnsi="Cambria Math"/>
+            <w:sz w:val="24"/>
+            <w:szCs w:val="24"/>
+          </w:rPr>
+          <m:t xml:space="preserve"> </m:t>
+        </m:r>
+        <m:acc>
+          <m:accPr>
+            <m:ctrlPr>
+              <w:rPr>
+                <w:rFonts w:ascii="Cambria Math" w:eastAsia="Arial" w:hAnsi="Cambria Math"/>
+                <w:i/>
+                <w:sz w:val="24"/>
+                <w:szCs w:val="24"/>
+              </w:rPr>
+            </m:ctrlPr>
+          </m:accPr>
+          <m:e>
+            <m:sSub>
+              <m:sSubPr>
+                <m:ctrlPr>
+                  <w:rPr>
+                    <w:rFonts w:ascii="Cambria Math" w:eastAsia="Arial" w:hAnsi="Cambria Math"/>
+                    <w:i/>
+                    <w:sz w:val="24"/>
+                    <w:szCs w:val="24"/>
+                  </w:rPr>
+                </m:ctrlPr>
+              </m:sSubPr>
+              <m:e>
+                <m:r>
+                  <w:rPr>
+                    <w:rFonts w:ascii="Cambria Math" w:eastAsia="Arial" w:hAnsi="Cambria Math"/>
+                    <w:sz w:val="24"/>
+                    <w:szCs w:val="24"/>
+                  </w:rPr>
+                  <m:t>a</m:t>
+                </m:r>
+              </m:e>
+              <m:sub>
+                <m:r>
+                  <w:rPr>
+                    <w:rFonts w:ascii="Cambria Math" w:eastAsia="Arial" w:hAnsi="Cambria Math"/>
+                    <w:sz w:val="24"/>
+                    <w:szCs w:val="24"/>
+                  </w:rPr>
+                  <m:t>i</m:t>
+                </m:r>
+              </m:sub>
+            </m:sSub>
+          </m:e>
+        </m:acc>
+      </m:oMath>
+      <w:r>
+        <w:rPr>
+          <w:rFonts w:eastAsia="Arial"/>
+          <w:sz w:val="24"/>
+          <w:szCs w:val="24"/>
+        </w:rPr>
+        <w:t xml:space="preserve">- оценка параметра распределения </w:t>
+      </w:r>
+      <m:oMath>
+        <m:r>
+          <w:rPr>
+            <w:rFonts w:ascii="Cambria Math" w:eastAsia="Arial" w:hAnsi="Cambria Math"/>
+            <w:sz w:val="24"/>
+            <w:szCs w:val="24"/>
+          </w:rPr>
+          <m:t>a</m:t>
+        </m:r>
+      </m:oMath>
+      <w:r>
+        <w:rPr>
+          <w:rFonts w:eastAsia="Arial"/>
+          <w:sz w:val="24"/>
+          <w:szCs w:val="24"/>
+        </w:rPr>
+        <w:t>, полученная в результате применения метода моментов, метода максимального правдоподобия. Уровень значимости</w:t>
+      </w:r>
+      <m:oMath>
+        <m:sSub>
+          <m:sSubPr>
+            <m:ctrlPr>
+              <w:rPr>
+                <w:rFonts w:ascii="Cambria Math" w:eastAsia="Arial" w:hAnsi="Cambria Math"/>
+                <w:i/>
+                <w:sz w:val="24"/>
+                <w:szCs w:val="24"/>
+              </w:rPr>
+            </m:ctrlPr>
+          </m:sSubPr>
+          <m:e>
+            <m:r>
+              <w:rPr>
+                <w:rFonts w:ascii="Cambria Math" w:eastAsia="Arial" w:hAnsi="Cambria Math"/>
+                <w:sz w:val="24"/>
+                <w:szCs w:val="24"/>
+              </w:rPr>
+              <m:t xml:space="preserve"> α</m:t>
+            </m:r>
+          </m:e>
+          <m:sub>
+            <m:r>
+              <w:rPr>
+                <w:rFonts w:ascii="Cambria Math" w:eastAsia="Arial" w:hAnsi="Cambria Math"/>
+                <w:sz w:val="24"/>
+                <w:szCs w:val="24"/>
+              </w:rPr>
+              <m:t>1</m:t>
+            </m:r>
+          </m:sub>
+        </m:sSub>
+      </m:oMath>
+      <w:r>
+        <w:rPr>
+          <w:rFonts w:eastAsia="Arial"/>
+          <w:sz w:val="24"/>
+          <w:szCs w:val="24"/>
+        </w:rPr>
+        <w:t>=0,05. [</w:t>
+      </w:r>
+      <w:r>
+        <w:rPr>
+          <w:rFonts w:eastAsia="Arial"/>
+          <w:sz w:val="24"/>
+          <w:szCs w:val="24"/>
+        </w:rPr>
+        <w:t>Листинг 23, 24,</w:t>
+      </w:r>
+      <w:r>
+        <w:rPr>
+          <w:rFonts w:eastAsia="Arial"/>
+          <w:sz w:val="24"/>
+          <w:szCs w:val="24"/>
+        </w:rPr>
+        <w:t xml:space="preserve"> </w:t>
+      </w:r>
+      <w:r>
+        <w:rPr>
+          <w:rFonts w:eastAsia="Arial"/>
+          <w:sz w:val="24"/>
+          <w:szCs w:val="24"/>
+        </w:rPr>
+        <w:t>25</w:t>
+      </w:r>
+      <w:r>
+        <w:rPr>
+          <w:rFonts w:eastAsia="Arial"/>
+          <w:sz w:val="24"/>
+          <w:szCs w:val="24"/>
+        </w:rPr>
+        <w:t>]</w:t>
+      </w:r>
+    </w:p>
+    <w:p>
+      <w:pPr>
+        <w:spacing w:line="360" w:lineRule="auto"/>
+        <w:ind w:firstLine="709"/>
+        <w:rPr>
+          <w:rFonts w:eastAsia="Arial"/>
+          <w:sz w:val="24"/>
+          <w:szCs w:val="24"/>
+        </w:rPr>
+      </w:pPr>
+      <w:r>
+        <w:rPr>
+          <w:sz w:val="24"/>
+          <w:szCs w:val="24"/>
+        </w:rPr>
+        <w:t xml:space="preserve">Ошибка первого рода возникает, когда мы отвергаем основную гипотезу </w:t>
+      </w:r>
+      <m:oMath>
+        <m:r>
+          <w:rPr>
+            <w:rFonts w:ascii="Cambria Math" w:hAnsi="Cambria Math"/>
+            <w:sz w:val="24"/>
+            <w:szCs w:val="24"/>
+          </w:rPr>
+          <m:t>H₀,</m:t>
+        </m:r>
+      </m:oMath>
+      <w:r>
+        <w:rPr>
+          <w:sz w:val="24"/>
+          <w:szCs w:val="24"/>
+        </w:rPr>
+        <w:t xml:space="preserve"> хотя на самом деле она верна. Ошибка второго рода возникает, когда мы принимаем основную гипотезу </w:t>
+      </w:r>
+      <m:oMath>
+        <m:r>
+          <w:rPr>
+            <w:rFonts w:ascii="Cambria Math" w:hAnsi="Cambria Math"/>
+            <w:sz w:val="24"/>
+            <w:szCs w:val="24"/>
+          </w:rPr>
+          <m:t>H₀,</m:t>
+        </m:r>
+      </m:oMath>
+      <w:r>
+        <w:rPr>
+          <w:sz w:val="24"/>
+          <w:szCs w:val="24"/>
+        </w:rPr>
+        <w:t xml:space="preserve"> хотя на самом деле верна альтернатива </w:t>
+      </w:r>
+      <m:oMath>
+        <m:r>
+          <w:rPr>
+            <w:rFonts w:ascii="Cambria Math" w:hAnsi="Cambria Math"/>
+            <w:sz w:val="24"/>
+            <w:szCs w:val="24"/>
+          </w:rPr>
+          <m:t>H₁.</m:t>
+        </m:r>
+      </m:oMath>
+      <w:r>
+        <w:rPr>
+          <w:sz w:val="24"/>
+          <w:szCs w:val="24"/>
+        </w:rPr>
+        <w:t xml:space="preserve"> Для вычисления ошибки первого рода генерируем выборку по параметрам, считаем параметры полученной выборки, вычисляем статистику критерия, которая </w:t>
+      </w:r>
+      <w:proofErr w:type="gramStart"/>
+      <w:r>
+        <w:rPr>
+          <w:sz w:val="24"/>
+          <w:szCs w:val="24"/>
+        </w:rPr>
+        <w:t>показывает</w:t>
+      </w:r>
+      <w:proofErr w:type="gramEnd"/>
+      <w:r>
+        <w:rPr>
+          <w:sz w:val="24"/>
+          <w:szCs w:val="24"/>
+        </w:rPr>
+        <w:t xml:space="preserve"> насколько отклоняются наши данные от теоретических. Сравниваем нашу статистику с критической значением. Если статистика больше критического значения, то гипотеза отвергается, хотя она истина. Так повторя</w:t>
+      </w:r>
+      <w:proofErr w:type="spellStart"/>
+      <w:r>
+        <w:rPr>
+          <w:sz w:val="24"/>
+          <w:szCs w:val="24"/>
+        </w:rPr>
+        <w:t>ется</w:t>
+      </w:r>
+      <w:proofErr w:type="spellEnd"/>
+      <w:r>
+        <w:rPr>
+          <w:sz w:val="24"/>
+          <w:szCs w:val="24"/>
+        </w:rPr>
+        <w:t xml:space="preserve"> 1000 раз и считается отношение количества отвергнутых гипотез </w:t>
+      </w:r>
+      <m:oMath>
+        <m:sSub>
+          <m:sSubPr>
+            <m:ctrlPr>
+              <w:rPr>
+                <w:rFonts w:ascii="Cambria Math" w:hAnsi="Cambria Math"/>
+                <w:i/>
+                <w:sz w:val="24"/>
+                <w:szCs w:val="24"/>
+              </w:rPr>
+            </m:ctrlPr>
+          </m:sSubPr>
+          <m:e>
+            <m:r>
+              <w:rPr>
+                <w:rFonts w:ascii="Cambria Math" w:hAnsi="Cambria Math"/>
+                <w:sz w:val="24"/>
+                <w:szCs w:val="24"/>
+              </w:rPr>
+              <m:t>H</m:t>
+            </m:r>
+          </m:e>
+          <m:sub>
+            <m:r>
+              <w:rPr>
+                <w:rFonts w:ascii="Cambria Math" w:hAnsi="Cambria Math"/>
+                <w:sz w:val="24"/>
+                <w:szCs w:val="24"/>
+              </w:rPr>
+              <m:t>0</m:t>
+            </m:r>
+          </m:sub>
+        </m:sSub>
+      </m:oMath>
+      <w:r>
+        <w:rPr>
+          <w:sz w:val="24"/>
+          <w:szCs w:val="24"/>
+        </w:rPr>
+        <w:t xml:space="preserve"> к количеству генераций. Для вычислений ошибки второго рода аналогично, но считаем количество принятых </w:t>
+      </w:r>
+      <m:oMath>
+        <m:sSub>
+          <m:sSubPr>
+            <m:ctrlPr>
+              <w:rPr>
+                <w:rFonts w:ascii="Cambria Math" w:hAnsi="Cambria Math"/>
+                <w:i/>
+                <w:sz w:val="24"/>
+                <w:szCs w:val="24"/>
+              </w:rPr>
+            </m:ctrlPr>
+          </m:sSubPr>
+          <m:e>
+            <m:r>
+              <w:rPr>
+                <w:rFonts w:ascii="Cambria Math" w:hAnsi="Cambria Math"/>
+                <w:sz w:val="24"/>
+                <w:szCs w:val="24"/>
+              </w:rPr>
+              <m:t>H</m:t>
+            </m:r>
+          </m:e>
+          <m:sub>
+            <m:r>
+              <w:rPr>
+                <w:rFonts w:ascii="Cambria Math" w:hAnsi="Cambria Math"/>
+                <w:sz w:val="24"/>
+                <w:szCs w:val="24"/>
+              </w:rPr>
+              <m:t>0</m:t>
+            </m:r>
+          </m:sub>
+        </m:sSub>
+      </m:oMath>
+      <w:r>
+        <w:rPr>
+          <w:sz w:val="24"/>
+          <w:szCs w:val="24"/>
+        </w:rPr>
+        <w:t>.</w:t>
+      </w:r>
+    </w:p>
+    <w:p>
+      <w:pPr>
+        <w:spacing w:line="360" w:lineRule="auto"/>
+        <w:ind w:firstLine="708"/>
+        <w:jc w:val="both"/>
+        <w:rPr>
+          <w:sz w:val="28"/>
+          <w:szCs w:val="28"/>
+        </w:rPr>
+      </w:pPr>
+      <w:r>
+        <w:rPr>
+          <w:noProof/>
+          <w:sz w:val="28"/>
+          <w:szCs w:val="28"/>
+        </w:rPr>
+        <w:drawing>
+          <wp:inline distT="0" distB="0" distL="0" distR="0" wp14:anchorId="2050DF07" wp14:editId="5988D2FA">
+            <wp:extent cx="5940425" cy="1710055"/>
+            <wp:effectExtent l="0" t="0" r="3175" b="4445"/>
+            <wp:docPr id="961823197" name="Рисунок 1"/>
+            <wp:cNvGraphicFramePr>
+              <a:graphicFrameLocks xmlns:a="http://schemas.openxmlformats.org/drawingml/2006/main" noChangeAspect="1"/>
+            </wp:cNvGraphicFramePr>
+            <a:graphic xmlns:a="http://schemas.openxmlformats.org/drawingml/2006/main">
+              <a:graphicData uri="http://schemas.openxmlformats.org/drawingml/2006/picture">
+                <pic:pic xmlns:pic="http://schemas.openxmlformats.org/drawingml/2006/picture">
+                  <pic:nvPicPr>
+                    <pic:cNvPr id="961823197" name=""/>
+                    <pic:cNvPicPr/>
+                  </pic:nvPicPr>
+                  <pic:blipFill>
+                    <a:blip r:embed="rId41"/>
+                    <a:stretch>
+                      <a:fillRect/>
+                    </a:stretch>
+                  </pic:blipFill>
+                  <pic:spPr>
+                    <a:xfrm>
+                      <a:off x="0" y="0"/>
+                      <a:ext cx="5940425" cy="1710055"/>
+                    </a:xfrm>
+                    <a:prstGeom prst="rect">
+                      <a:avLst/>
+                    </a:prstGeom>
+                  </pic:spPr>
+                </pic:pic>
+              </a:graphicData>
+            </a:graphic>
+          </wp:inline>
+        </w:drawing>
+      </w:r>
+    </w:p>
+    <w:p>
+      <w:pPr>
+        <w:spacing w:line="360" w:lineRule="auto"/>
+        <w:ind w:firstLine="708"/>
+        <w:jc w:val="center"/>
+        <w:rPr>
+          <w:sz w:val="28"/>
+          <w:szCs w:val="28"/>
+        </w:rPr>
+      </w:pPr>
+      <w:r>
+        <w:rPr>
+          <w:sz w:val="28"/>
+          <w:szCs w:val="28"/>
+        </w:rPr>
+        <w:t>Листинг 23</w:t>
+      </w:r>
+      <w:r>
+        <w:rPr>
+          <w:sz w:val="28"/>
+          <w:szCs w:val="28"/>
+        </w:rPr>
+        <w:t>. Статистика критерия</w:t>
+      </w:r>
+    </w:p>
+    <w:p>
+      <w:pPr>
+        <w:spacing w:line="360" w:lineRule="auto"/>
+        <w:ind w:firstLine="708"/>
+        <w:jc w:val="both"/>
+        <w:rPr>
+          <w:sz w:val="28"/>
+          <w:szCs w:val="28"/>
+          <w:lang w:val="en-US"/>
+        </w:rPr>
+      </w:pPr>
+    </w:p>
+    <w:p>
+      <w:pPr>
+        <w:spacing w:line="360" w:lineRule="auto"/>
+        <w:ind w:firstLine="708"/>
+        <w:jc w:val="both"/>
+        <w:rPr>
+          <w:sz w:val="28"/>
+          <w:szCs w:val="28"/>
+        </w:rPr>
+      </w:pPr>
+      <w:r>
+        <w:rPr>
+          <w:noProof/>
+          <w:sz w:val="28"/>
+          <w:szCs w:val="28"/>
+        </w:rPr>
+        <w:lastRenderedPageBreak/>
+        <w:drawing>
+          <wp:inline distT="0" distB="0" distL="0" distR="0" wp14:anchorId="7112ACF0" wp14:editId="74817782">
+            <wp:extent cx="5940425" cy="3978275"/>
+            <wp:effectExtent l="0" t="0" r="3175" b="3175"/>
+            <wp:docPr id="1919131282" name="Рисунок 1"/>
+            <wp:cNvGraphicFramePr>
+              <a:graphicFrameLocks xmlns:a="http://schemas.openxmlformats.org/drawingml/2006/main" noChangeAspect="1"/>
+            </wp:cNvGraphicFramePr>
+            <a:graphic xmlns:a="http://schemas.openxmlformats.org/drawingml/2006/main">
+              <a:graphicData uri="http://schemas.openxmlformats.org/drawingml/2006/picture">
+                <pic:pic xmlns:pic="http://schemas.openxmlformats.org/drawingml/2006/picture">
+                  <pic:nvPicPr>
+                    <pic:cNvPr id="1919131282" name=""/>
+                    <pic:cNvPicPr/>
+                  </pic:nvPicPr>
+                  <pic:blipFill>
+                    <a:blip r:embed="rId42"/>
+                    <a:stretch>
+                      <a:fillRect/>
+                    </a:stretch>
+                  </pic:blipFill>
+                  <pic:spPr>
+                    <a:xfrm>
+                      <a:off x="0" y="0"/>
+                      <a:ext cx="5940425" cy="3978275"/>
+                    </a:xfrm>
+                    <a:prstGeom prst="rect">
+                      <a:avLst/>
+                    </a:prstGeom>
+                  </pic:spPr>
+                </pic:pic>
+              </a:graphicData>
+            </a:graphic>
+          </wp:inline>
+        </w:drawing>
+      </w:r>
+    </w:p>
+    <w:p>
+      <w:pPr>
+        <w:spacing w:line="360" w:lineRule="auto"/>
+        <w:ind w:firstLine="708"/>
+        <w:jc w:val="center"/>
+        <w:rPr>
+          <w:sz w:val="28"/>
+          <w:szCs w:val="28"/>
+        </w:rPr>
+      </w:pPr>
+      <w:r>
+        <w:rPr>
+          <w:sz w:val="28"/>
+          <w:szCs w:val="28"/>
+        </w:rPr>
+        <w:t>Листинг 24</w:t>
+      </w:r>
+      <w:r>
+        <w:rPr>
+          <w:sz w:val="28"/>
+          <w:szCs w:val="28"/>
+        </w:rPr>
+        <w:t>. Поиск критического значения методом Монте-Карло</w:t>
+      </w:r>
+    </w:p>
+    <w:p>
+      <w:pPr>
+        <w:spacing w:line="360" w:lineRule="auto"/>
+        <w:ind w:firstLine="708"/>
+        <w:jc w:val="both"/>
+        <w:rPr>
+          <w:sz w:val="28"/>
+          <w:szCs w:val="28"/>
+        </w:rPr>
+      </w:pPr>
+      <w:r>
+        <w:rPr>
+          <w:noProof/>
+          <w:sz w:val="28"/>
+          <w:szCs w:val="28"/>
+        </w:rPr>
+        <w:drawing>
+          <wp:inline distT="0" distB="0" distL="0" distR="0" wp14:anchorId="25D2AE0A" wp14:editId="1E6B7A32">
+            <wp:extent cx="5940425" cy="4307840"/>
+            <wp:effectExtent l="0" t="0" r="3175" b="0"/>
+            <wp:docPr id="106218734" name="Рисунок 1"/>
+            <wp:cNvGraphicFramePr>
+              <a:graphicFrameLocks xmlns:a="http://schemas.openxmlformats.org/drawingml/2006/main" noChangeAspect="1"/>
+            </wp:cNvGraphicFramePr>
+            <a:graphic xmlns:a="http://schemas.openxmlformats.org/drawingml/2006/main">
+              <a:graphicData uri="http://schemas.openxmlformats.org/drawingml/2006/picture">
+                <pic:pic xmlns:pic="http://schemas.openxmlformats.org/drawingml/2006/picture">
+                  <pic:nvPicPr>
+                    <pic:cNvPr id="106218734" name=""/>
+                    <pic:cNvPicPr/>
+                  </pic:nvPicPr>
+                  <pic:blipFill>
+                    <a:blip r:embed="rId43"/>
+                    <a:stretch>
+                      <a:fillRect/>
+                    </a:stretch>
+                  </pic:blipFill>
+                  <pic:spPr>
+                    <a:xfrm>
+                      <a:off x="0" y="0"/>
+                      <a:ext cx="5940425" cy="4307840"/>
+                    </a:xfrm>
+                    <a:prstGeom prst="rect">
+                      <a:avLst/>
+                    </a:prstGeom>
+                  </pic:spPr>
+                </pic:pic>
+              </a:graphicData>
+            </a:graphic>
+          </wp:inline>
+        </w:drawing>
+      </w:r>
+    </w:p>
+    <w:p>
+      <w:pPr>
+        <w:spacing w:line="360" w:lineRule="auto"/>
+        <w:ind w:firstLine="708"/>
+        <w:jc w:val="center"/>
+        <w:rPr>
+          <w:sz w:val="28"/>
+          <w:szCs w:val="28"/>
+        </w:rPr>
+      </w:pPr>
+      <w:r>
+        <w:rPr>
+          <w:sz w:val="28"/>
+          <w:szCs w:val="28"/>
+        </w:rPr>
+        <w:t>Листинг 25</w:t>
+      </w:r>
+      <w:r>
+        <w:rPr>
+          <w:sz w:val="28"/>
+          <w:szCs w:val="28"/>
+        </w:rPr>
+        <w:t xml:space="preserve">. Доля попаданий в критическую область </w:t>
+      </w:r>
+    </w:p>
+    <w:p>
+      <w:pPr>
+        <w:spacing w:line="360" w:lineRule="auto"/>
+        <w:ind w:firstLine="708"/>
+        <w:jc w:val="both"/>
+        <w:rPr>
+          <w:sz w:val="28"/>
+          <w:szCs w:val="28"/>
+        </w:rPr>
+      </w:pPr>
+      <w:r>
+        <w:rPr>
+          <w:noProof/>
+          <w:sz w:val="28"/>
+          <w:szCs w:val="28"/>
+        </w:rPr>
+        <w:lastRenderedPageBreak/>
+        <w:drawing>
+          <wp:inline distT="0" distB="0" distL="0" distR="0" wp14:anchorId="1C3B8B5C" wp14:editId="335E0EEE">
+            <wp:extent cx="5563450" cy="5105400"/>
+            <wp:effectExtent l="0" t="0" r="0" b="0"/>
+            <wp:docPr id="1307944843" name="Рисунок 1"/>
+            <wp:cNvGraphicFramePr>
+              <a:graphicFrameLocks xmlns:a="http://schemas.openxmlformats.org/drawingml/2006/main" noChangeAspect="1"/>
+            </wp:cNvGraphicFramePr>
+            <a:graphic xmlns:a="http://schemas.openxmlformats.org/drawingml/2006/main">
+              <a:graphicData uri="http://schemas.openxmlformats.org/drawingml/2006/picture">
+                <pic:pic xmlns:pic="http://schemas.openxmlformats.org/drawingml/2006/picture">
+                  <pic:nvPicPr>
+                    <pic:cNvPr id="1307944843" name=""/>
+                    <pic:cNvPicPr/>
+                  </pic:nvPicPr>
+                  <pic:blipFill>
+                    <a:blip r:embed="rId44"/>
+                    <a:stretch>
+                      <a:fillRect/>
+                    </a:stretch>
+                  </pic:blipFill>
+                  <pic:spPr>
+                    <a:xfrm>
+                      <a:off x="0" y="0"/>
+                      <a:ext cx="5564540" cy="5106400"/>
+                    </a:xfrm>
+                    <a:prstGeom prst="rect">
+                      <a:avLst/>
+                    </a:prstGeom>
+                  </pic:spPr>
+                </pic:pic>
+              </a:graphicData>
+            </a:graphic>
+          </wp:inline>
+        </w:drawing>
+      </w:r>
+    </w:p>
+    <w:p>
+      <w:pPr>
+        <w:spacing w:line="360" w:lineRule="auto"/>
+        <w:ind w:firstLine="708"/>
+        <w:jc w:val="center"/>
+        <w:rPr>
+          <w:sz w:val="28"/>
+          <w:szCs w:val="28"/>
+        </w:rPr>
+      </w:pPr>
+      <w:r>
+        <w:rPr>
+          <w:sz w:val="28"/>
+          <w:szCs w:val="28"/>
+        </w:rPr>
+        <w:t>Листинг 26</w:t>
+      </w:r>
+      <w:r>
+        <w:rPr>
+          <w:sz w:val="28"/>
+          <w:szCs w:val="28"/>
+        </w:rPr>
+        <w:t>. Критерий</w:t>
+      </w:r>
+    </w:p>
+    <w:p>
+      <w:pPr>
+        <w:spacing w:line="360" w:lineRule="auto"/>
+        <w:ind w:firstLine="709"/>
+        <w:jc w:val="both"/>
+        <w:rPr>
+          <w:sz w:val="28"/>
+          <w:szCs w:val="28"/>
+        </w:rPr>
+      </w:pPr>
+      <w:r>
+        <w:rPr>
+          <w:sz w:val="28"/>
+          <w:szCs w:val="28"/>
+        </w:rPr>
+        <w:t>Полученные результаты для ММ:</w:t>
+      </w:r>
+    </w:p>
+    <w:p>
+      <w:pPr>
+        <w:pStyle w:val="a7"/>
+        <w:numPr>
+          <w:ilvl w:val="0"/>
+          <w:numId w:val="19"/>
+        </w:numPr>
+        <w:spacing w:line="360" w:lineRule="auto"/>
+        <w:ind w:left="1072" w:firstLine="709"/>
+        <w:contextualSpacing w:val="0"/>
+        <w:jc w:val="both"/>
+        <w:rPr>
+          <w:sz w:val="28"/>
+          <w:szCs w:val="28"/>
+        </w:rPr>
+      </w:pPr>
+      <m:oMath>
+        <m:r>
+          <w:rPr>
+            <w:rFonts w:ascii="Cambria Math" w:hAnsi="Cambria Math"/>
+            <w:sz w:val="28"/>
+            <w:szCs w:val="28"/>
+          </w:rPr>
+          <m:t>c = 576,5</m:t>
+        </m:r>
+      </m:oMath>
+    </w:p>
+    <w:p>
+      <w:pPr>
+        <w:pStyle w:val="a7"/>
+        <w:numPr>
+          <w:ilvl w:val="0"/>
+          <w:numId w:val="19"/>
+        </w:numPr>
+        <w:spacing w:line="360" w:lineRule="auto"/>
+        <w:ind w:left="1072" w:firstLine="709"/>
+        <w:contextualSpacing w:val="0"/>
+        <w:jc w:val="both"/>
+        <w:rPr>
+          <w:sz w:val="28"/>
+          <w:szCs w:val="28"/>
+        </w:rPr>
+      </w:pPr>
+      <m:oMath>
+        <m:r>
+          <w:rPr>
+            <w:rFonts w:ascii="Cambria Math" w:hAnsi="Cambria Math"/>
+            <w:sz w:val="28"/>
+            <w:szCs w:val="28"/>
+          </w:rPr>
+          <m:t>a (ошибка I рода) = 0</m:t>
+        </m:r>
+        <m:r>
+          <w:rPr>
+            <w:rFonts w:ascii="Cambria Math" w:hAnsi="Cambria Math"/>
+            <w:sz w:val="28"/>
+            <w:szCs w:val="28"/>
+            <w:lang w:val="en-US"/>
+          </w:rPr>
+          <m:t>,</m:t>
+        </m:r>
+        <m:r>
+          <w:rPr>
+            <w:rFonts w:ascii="Cambria Math" w:hAnsi="Cambria Math"/>
+            <w:sz w:val="28"/>
+            <w:szCs w:val="28"/>
+          </w:rPr>
+          <m:t>039</m:t>
+        </m:r>
+      </m:oMath>
+    </w:p>
+    <w:p>
+      <w:pPr>
+        <w:pStyle w:val="a7"/>
+        <w:numPr>
+          <w:ilvl w:val="0"/>
+          <w:numId w:val="19"/>
+        </w:numPr>
+        <w:spacing w:line="360" w:lineRule="auto"/>
+        <w:ind w:left="1072" w:firstLine="709"/>
+        <w:contextualSpacing w:val="0"/>
+        <w:jc w:val="both"/>
+        <w:rPr>
+          <w:sz w:val="28"/>
+          <w:szCs w:val="28"/>
+        </w:rPr>
+      </w:pPr>
+      <m:oMath>
+        <m:r>
+          <w:rPr>
+            <w:rFonts w:ascii="Cambria Math" w:hAnsi="Cambria Math"/>
+            <w:sz w:val="28"/>
+            <w:szCs w:val="28"/>
+          </w:rPr>
+          <m:t>β</m:t>
+        </m:r>
+      </m:oMath>
+      <w:r>
+        <w:rPr>
+          <w:sz w:val="28"/>
+          <w:szCs w:val="28"/>
+        </w:rPr>
+        <w:t xml:space="preserve"> (ошибка II рода) = 0</w:t>
+      </w:r>
+      <w:r>
+        <w:rPr>
+          <w:sz w:val="28"/>
+          <w:szCs w:val="28"/>
+          <w:lang w:val="en-US"/>
+        </w:rPr>
+        <w:t>,</w:t>
+      </w:r>
+      <w:r>
+        <w:rPr>
+          <w:sz w:val="28"/>
+          <w:szCs w:val="28"/>
+        </w:rPr>
+        <w:t>864</w:t>
+      </w:r>
+    </w:p>
+    <w:p>
+      <w:pPr>
+        <w:spacing w:line="360" w:lineRule="auto"/>
+        <w:ind w:firstLine="708"/>
+        <w:jc w:val="both"/>
+        <w:rPr>
+          <w:sz w:val="28"/>
+          <w:szCs w:val="28"/>
+        </w:rPr>
+      </w:pPr>
+      <w:r>
+        <w:rPr>
+          <w:sz w:val="28"/>
+          <w:szCs w:val="28"/>
+        </w:rPr>
+        <w:t>Полученные результаты для ММ:</w:t>
+      </w:r>
+    </w:p>
+    <w:p>
+      <w:pPr>
+        <w:pStyle w:val="a7"/>
+        <w:numPr>
+          <w:ilvl w:val="0"/>
+          <w:numId w:val="19"/>
+        </w:numPr>
+        <w:spacing w:line="360" w:lineRule="auto"/>
+        <w:ind w:left="1072" w:firstLine="709"/>
+        <w:contextualSpacing w:val="0"/>
+        <w:jc w:val="both"/>
+        <w:rPr>
+          <w:sz w:val="28"/>
+          <w:szCs w:val="28"/>
+        </w:rPr>
+      </w:pPr>
+      <m:oMath>
+        <m:r>
+          <w:rPr>
+            <w:rFonts w:ascii="Cambria Math" w:hAnsi="Cambria Math"/>
+            <w:sz w:val="28"/>
+            <w:szCs w:val="28"/>
+          </w:rPr>
+          <m:t>c = 558,8</m:t>
+        </m:r>
+      </m:oMath>
+    </w:p>
+    <w:p>
+      <w:pPr>
+        <w:pStyle w:val="a7"/>
+        <w:numPr>
+          <w:ilvl w:val="0"/>
+          <w:numId w:val="19"/>
+        </w:numPr>
+        <w:spacing w:line="360" w:lineRule="auto"/>
+        <w:ind w:left="1072" w:firstLine="709"/>
+        <w:contextualSpacing w:val="0"/>
+        <w:jc w:val="both"/>
+        <w:rPr>
+          <w:sz w:val="28"/>
+          <w:szCs w:val="28"/>
+        </w:rPr>
+      </w:pPr>
+      <m:oMath>
+        <m:r>
+          <w:rPr>
+            <w:rFonts w:ascii="Cambria Math" w:eastAsiaTheme="minorEastAsia" w:hAnsi="Cambria Math"/>
+            <w:sz w:val="28"/>
+            <w:szCs w:val="28"/>
+          </w:rPr>
+          <m:t>a</m:t>
+        </m:r>
+      </m:oMath>
+      <w:r>
+        <w:rPr>
+          <w:sz w:val="28"/>
+          <w:szCs w:val="28"/>
+        </w:rPr>
+        <w:t xml:space="preserve"> (ошибка I рода) = 0</w:t>
+      </w:r>
+      <w:r>
+        <w:rPr>
+          <w:sz w:val="28"/>
+          <w:szCs w:val="28"/>
+          <w:lang w:val="en-US"/>
+        </w:rPr>
+        <w:t>,069</w:t>
+      </w:r>
+    </w:p>
+    <w:p>
+      <w:pPr>
+        <w:pStyle w:val="a7"/>
+        <w:numPr>
+          <w:ilvl w:val="0"/>
+          <w:numId w:val="19"/>
+        </w:numPr>
+        <w:spacing w:line="360" w:lineRule="auto"/>
+        <w:ind w:left="1072" w:firstLine="709"/>
+        <w:contextualSpacing w:val="0"/>
+        <w:jc w:val="both"/>
+        <w:rPr>
+          <w:sz w:val="28"/>
+          <w:szCs w:val="28"/>
+        </w:rPr>
+      </w:pPr>
+      <m:oMath>
+        <m:r>
+          <w:rPr>
+            <w:rFonts w:ascii="Cambria Math" w:hAnsi="Cambria Math"/>
+            <w:sz w:val="28"/>
+            <w:szCs w:val="28"/>
+          </w:rPr>
+          <m:t>β</m:t>
+        </m:r>
+      </m:oMath>
+      <w:r>
+        <w:rPr>
+          <w:sz w:val="28"/>
+          <w:szCs w:val="28"/>
+        </w:rPr>
+        <w:t xml:space="preserve"> (ошибка II рода) = 0</w:t>
+      </w:r>
+      <w:r>
+        <w:rPr>
+          <w:sz w:val="28"/>
+          <w:szCs w:val="28"/>
+          <w:lang w:val="en-US"/>
+        </w:rPr>
+        <w:t>,803</w:t>
+      </w:r>
+    </w:p>
+    <w:p>
+      <w:pPr>
+        <w:spacing w:before="100" w:beforeAutospacing="1" w:after="100" w:afterAutospacing="1" w:line="360" w:lineRule="auto"/>
+        <w:jc w:val="both"/>
+        <w:rPr>
+          <w:sz w:val="28"/>
+          <w:szCs w:val="28"/>
+        </w:rPr>
+      </w:pPr>
+    </w:p>
+    <w:p>
+      <w:pPr>
+        <w:spacing w:before="100" w:beforeAutospacing="1" w:after="100" w:afterAutospacing="1" w:line="360" w:lineRule="auto"/>
+        <w:jc w:val="both"/>
+        <w:rPr>
+          <w:sz w:val="28"/>
+          <w:szCs w:val="28"/>
+        </w:rPr>
+      </w:pPr>
+    </w:p>
+    <w:p>
+      <w:pPr>
+        <w:pStyle w:val="a7"/>
+        <w:numPr>
+          <w:ilvl w:val="1"/>
+          <w:numId w:val="17"/>
+        </w:numPr>
+        <w:spacing w:before="100" w:beforeAutospacing="1" w:after="100" w:afterAutospacing="1" w:line="360" w:lineRule="auto"/>
+        <w:jc w:val="both"/>
+        <w:rPr>
+          <w:sz w:val="28"/>
+          <w:szCs w:val="28"/>
+        </w:rPr>
+      </w:pPr>
+      <w:r>
+        <w:rPr>
+          <w:b/>
+          <w:bCs/>
+          <w:sz w:val="28"/>
+          <w:szCs w:val="28"/>
+        </w:rPr>
+        <w:lastRenderedPageBreak/>
+        <w:t>Гипотезы о виде распределения</w:t>
+      </w:r>
+    </w:p>
+    <w:p>
+      <w:pPr>
+        <w:spacing w:before="100" w:beforeAutospacing="1" w:after="100" w:afterAutospacing="1" w:line="360" w:lineRule="auto"/>
+        <w:ind w:firstLine="360"/>
+        <w:jc w:val="both"/>
+        <w:rPr>
+          <w:sz w:val="28"/>
+          <w:szCs w:val="28"/>
+          <w:lang w:val="en-US"/>
+        </w:rPr>
+      </w:pPr>
+      <w:r>
+        <w:rPr>
+          <w:sz w:val="28"/>
+          <w:szCs w:val="28"/>
+        </w:rPr>
+        <w:t xml:space="preserve">Проверялась гипотеза H0: выборка подчиняется двойному гамма-распределению с параметрами </w:t>
+      </w:r>
+      <m:oMath>
+        <m:sSub>
+          <m:sSubPr>
+            <m:ctrlPr>
+              <w:rPr>
+                <w:rFonts w:ascii="Cambria Math" w:hAnsi="Cambria Math"/>
+                <w:i/>
+                <w:sz w:val="28"/>
+                <w:szCs w:val="28"/>
+              </w:rPr>
+            </m:ctrlPr>
+          </m:sSubPr>
+          <m:e>
+            <m:r>
+              <w:rPr>
+                <w:rFonts w:ascii="Cambria Math" w:hAnsi="Cambria Math"/>
+                <w:sz w:val="28"/>
+                <w:szCs w:val="28"/>
+              </w:rPr>
+              <m:t>α̂</m:t>
+            </m:r>
+          </m:e>
+          <m:sub>
+            <m:r>
+              <w:rPr>
+                <w:rFonts w:ascii="Cambria Math" w:hAnsi="Cambria Math"/>
+                <w:sz w:val="28"/>
+                <w:szCs w:val="28"/>
+              </w:rPr>
+              <m:t>ММП</m:t>
+            </m:r>
+          </m:sub>
+        </m:sSub>
+        <m:r>
+          <w:rPr>
+            <w:rFonts w:ascii="Cambria Math" w:hAnsi="Cambria Math"/>
+            <w:sz w:val="28"/>
+            <w:szCs w:val="28"/>
+          </w:rPr>
+          <m:t xml:space="preserve"> ≈ 7,16</m:t>
+        </m:r>
+      </m:oMath>
+      <w:r>
+        <w:rPr>
+          <w:sz w:val="28"/>
+          <w:szCs w:val="28"/>
+        </w:rPr>
+        <w:t xml:space="preserve">, </w:t>
+      </w:r>
+      <m:oMath>
+        <m:acc>
+          <m:accPr>
+            <m:ctrlPr>
+              <w:rPr>
+                <w:rFonts w:ascii="Cambria Math" w:hAnsi="Cambria Math"/>
+                <w:i/>
+                <w:sz w:val="28"/>
+                <w:szCs w:val="28"/>
+                <w:lang w:val="en-US"/>
+              </w:rPr>
+            </m:ctrlPr>
+          </m:accPr>
+          <m:e>
+            <m:sSub>
+              <m:sSubPr>
+                <m:ctrlPr>
+                  <w:rPr>
+                    <w:rFonts w:ascii="Cambria Math" w:hAnsi="Cambria Math"/>
+                    <w:i/>
+                    <w:sz w:val="28"/>
+                    <w:szCs w:val="28"/>
+                    <w:lang w:val="en-US"/>
+                  </w:rPr>
+                </m:ctrlPr>
+              </m:sSubPr>
+              <m:e>
+                <m:r>
+                  <w:rPr>
+                    <w:rFonts w:ascii="Cambria Math" w:hAnsi="Cambria Math"/>
+                    <w:sz w:val="28"/>
+                    <w:szCs w:val="28"/>
+                    <w:lang w:val="en-US"/>
+                  </w:rPr>
+                  <m:t>loc</m:t>
+                </m:r>
+              </m:e>
+              <m:sub>
+                <m:r>
+                  <w:rPr>
+                    <w:rFonts w:ascii="Cambria Math" w:hAnsi="Cambria Math"/>
+                    <w:sz w:val="28"/>
+                    <w:szCs w:val="28"/>
+                  </w:rPr>
+                  <m:t>ММП</m:t>
+                </m:r>
+              </m:sub>
+            </m:sSub>
+          </m:e>
+        </m:acc>
+        <m:r>
+          <w:rPr>
+            <w:rFonts w:ascii="Cambria Math" w:hAnsi="Cambria Math"/>
+            <w:sz w:val="28"/>
+            <w:szCs w:val="28"/>
+          </w:rPr>
+          <m:t xml:space="preserve"> ≈ 0,76</m:t>
+        </m:r>
+      </m:oMath>
+      <w:r>
+        <w:rPr>
+          <w:sz w:val="28"/>
+          <w:szCs w:val="28"/>
+        </w:rPr>
+        <w:t xml:space="preserve">. Уровень значимости принят </w:t>
+      </w:r>
+      <m:oMath>
+        <m:r>
+          <w:rPr>
+            <w:rFonts w:ascii="Cambria Math" w:hAnsi="Cambria Math"/>
+            <w:sz w:val="28"/>
+            <w:szCs w:val="28"/>
+          </w:rPr>
+          <m:t>α₁ = 0,05</m:t>
+        </m:r>
+      </m:oMath>
+      <w:r>
+        <w:rPr>
+          <w:sz w:val="28"/>
+          <w:szCs w:val="28"/>
+        </w:rPr>
+        <w:t>.</w:t>
+      </w:r>
+    </w:p>
+    <w:p>
+      <w:pPr>
+        <w:spacing w:before="100" w:beforeAutospacing="1" w:after="100" w:afterAutospacing="1" w:line="360" w:lineRule="auto"/>
+        <w:ind w:firstLine="360"/>
+        <w:jc w:val="both"/>
+        <w:rPr>
+          <w:sz w:val="28"/>
+          <w:szCs w:val="28"/>
+        </w:rPr>
+      </w:pPr>
+      <w:r>
+        <w:rPr>
+          <w:sz w:val="28"/>
+          <w:szCs w:val="28"/>
+        </w:rPr>
+        <w:t xml:space="preserve">Гипотезу о принадлежности выборке из варианта проверяли с помощью критериев Колмогорова и </w:t>
+      </w:r>
+      <m:oMath>
+        <m:sSup>
+          <m:sSupPr>
+            <m:ctrlPr>
+              <w:rPr>
+                <w:rFonts w:ascii="Cambria Math" w:hAnsi="Cambria Math"/>
+                <w:sz w:val="28"/>
+                <w:szCs w:val="28"/>
+              </w:rPr>
+            </m:ctrlPr>
+          </m:sSupPr>
+          <m:e>
+            <m:r>
+              <w:rPr>
+                <w:rFonts w:ascii="Cambria Math" w:hAnsi="Cambria Math"/>
+                <w:sz w:val="28"/>
+                <w:szCs w:val="28"/>
+              </w:rPr>
+              <m:t>χ</m:t>
+            </m:r>
+          </m:e>
+          <m:sup>
+            <m:r>
+              <m:rPr>
+                <m:sty m:val="p"/>
+              </m:rPr>
+              <w:rPr>
+                <w:rFonts w:ascii="Cambria Math" w:hAnsi="Cambria Math"/>
+                <w:sz w:val="28"/>
+                <w:szCs w:val="28"/>
+              </w:rPr>
+              <m:t>2</m:t>
+            </m:r>
+          </m:sup>
+        </m:sSup>
+      </m:oMath>
+      <w:r>
+        <w:rPr>
+          <w:sz w:val="28"/>
+          <w:szCs w:val="28"/>
+        </w:rPr>
+        <w:t>. Функция расстояния по Колмогорову считает максимальное расстояние между эмпирической функцией и теоретической</w:t>
+      </w:r>
+      <w:r>
+        <w:rPr>
+          <w:sz w:val="28"/>
+          <w:szCs w:val="28"/>
+        </w:rPr>
+        <w:t xml:space="preserve"> [</w:t>
+      </w:r>
+      <w:r>
+        <w:rPr>
+          <w:sz w:val="28"/>
+          <w:szCs w:val="28"/>
+        </w:rPr>
+        <w:t>Листинг 2</w:t>
+      </w:r>
+      <w:r>
+        <w:rPr>
+          <w:sz w:val="28"/>
+          <w:szCs w:val="28"/>
+        </w:rPr>
+        <w:t>7]</w:t>
+      </w:r>
+      <w:r>
+        <w:rPr>
+          <w:sz w:val="28"/>
+          <w:szCs w:val="28"/>
+        </w:rPr>
+        <w:t>:</w:t>
+      </w:r>
+    </w:p>
+    <w:p>
+      <w:pPr>
+        <w:spacing w:before="100" w:beforeAutospacing="1" w:after="100" w:afterAutospacing="1" w:line="360" w:lineRule="auto"/>
+        <w:ind w:firstLine="360"/>
+        <w:jc w:val="both"/>
+        <w:rPr>
+          <w:sz w:val="28"/>
+          <w:szCs w:val="28"/>
+          <w:lang w:val="en-US"/>
+        </w:rPr>
+      </w:pPr>
+      <m:oMathPara>
+        <m:oMath>
+          <m:r>
+            <w:rPr>
+              <w:rFonts w:ascii="Cambria Math" w:hAnsi="Cambria Math"/>
+              <w:sz w:val="28"/>
+              <w:szCs w:val="28"/>
+            </w:rPr>
+            <m:t>ρ</m:t>
+          </m:r>
+          <m:r>
+            <w:rPr>
+              <w:rFonts w:ascii="Cambria Math" w:hAnsi="Cambria Math"/>
+              <w:sz w:val="28"/>
+              <w:szCs w:val="28"/>
+              <w:lang w:val="en-US"/>
+            </w:rPr>
+            <m:t xml:space="preserve"> =</m:t>
+          </m:r>
+          <m:func>
+            <m:funcPr>
+              <m:ctrlPr>
+                <w:rPr>
+                  <w:rFonts w:ascii="Cambria Math" w:hAnsi="Cambria Math"/>
+                  <w:sz w:val="28"/>
+                  <w:szCs w:val="28"/>
+                  <w:lang w:val="en-US"/>
+                </w:rPr>
+              </m:ctrlPr>
+            </m:funcPr>
+            <m:fName>
+              <m:r>
+                <w:rPr>
+                  <w:rFonts w:ascii="Cambria Math" w:hAnsi="Cambria Math"/>
+                  <w:sz w:val="28"/>
+                  <w:szCs w:val="28"/>
+                  <w:lang w:val="en-US"/>
+                </w:rPr>
+                <m:t>sup</m:t>
+              </m:r>
+            </m:fName>
+            <m:e>
+              <m:d>
+                <m:dPr>
+                  <m:begChr m:val="|"/>
+                  <m:endChr m:val="|"/>
+                  <m:ctrlPr>
+                    <w:rPr>
+                      <w:rFonts w:ascii="Cambria Math" w:hAnsi="Cambria Math"/>
+                      <w:i/>
+                      <w:sz w:val="28"/>
+                      <w:szCs w:val="28"/>
+                      <w:lang w:val="en-US"/>
+                    </w:rPr>
+                  </m:ctrlPr>
+                </m:dPr>
+                <m:e>
+                  <m:r>
+                    <w:rPr>
+                      <w:rFonts w:ascii="Cambria Math" w:hAnsi="Cambria Math"/>
+                      <w:sz w:val="28"/>
+                      <w:szCs w:val="28"/>
+                      <w:lang w:val="en-US"/>
+                    </w:rPr>
+                    <m:t>F</m:t>
+                  </m:r>
+                  <m:d>
+                    <m:dPr>
+                      <m:ctrlPr>
+                        <w:rPr>
+                          <w:rFonts w:ascii="Cambria Math" w:hAnsi="Cambria Math"/>
+                          <w:i/>
+                          <w:sz w:val="28"/>
+                          <w:szCs w:val="28"/>
+                          <w:lang w:val="en-US"/>
+                        </w:rPr>
+                      </m:ctrlPr>
+                    </m:dPr>
+                    <m:e>
+                      <m:r>
+                        <w:rPr>
+                          <w:rFonts w:ascii="Cambria Math" w:hAnsi="Cambria Math"/>
+                          <w:sz w:val="28"/>
+                          <w:szCs w:val="28"/>
+                          <w:lang w:val="en-US"/>
+                        </w:rPr>
+                        <m:t>x</m:t>
+                      </m:r>
+                    </m:e>
+                  </m:d>
+                  <m:r>
+                    <w:rPr>
+                      <w:rFonts w:ascii="Cambria Math" w:hAnsi="Cambria Math"/>
+                      <w:sz w:val="28"/>
+                      <w:szCs w:val="28"/>
+                      <w:lang w:val="en-US"/>
+                    </w:rPr>
+                    <m:t xml:space="preserve">- </m:t>
+                  </m:r>
+                  <m:sSub>
+                    <m:sSubPr>
+                      <m:ctrlPr>
+                        <w:rPr>
+                          <w:rFonts w:ascii="Cambria Math" w:hAnsi="Cambria Math"/>
+                          <w:i/>
+                          <w:sz w:val="28"/>
+                          <w:szCs w:val="28"/>
+                          <w:lang w:val="en-US"/>
+                        </w:rPr>
+                      </m:ctrlPr>
+                    </m:sSubPr>
+                    <m:e>
+                      <m:acc>
+                        <m:accPr>
+                          <m:ctrlPr>
+                            <w:rPr>
+                              <w:rFonts w:ascii="Cambria Math" w:hAnsi="Cambria Math"/>
+                              <w:i/>
+                              <w:sz w:val="28"/>
+                              <w:szCs w:val="28"/>
+                              <w:lang w:val="en-US"/>
+                            </w:rPr>
+                          </m:ctrlPr>
+                        </m:accPr>
+                        <m:e>
+                          <m:r>
+                            <w:rPr>
+                              <w:rFonts w:ascii="Cambria Math" w:hAnsi="Cambria Math"/>
+                              <w:sz w:val="28"/>
+                              <w:szCs w:val="28"/>
+                              <w:lang w:val="en-US"/>
+                            </w:rPr>
+                            <m:t>F</m:t>
+                          </m:r>
+                        </m:e>
+                      </m:acc>
+                    </m:e>
+                    <m:sub>
+                      <m:r>
+                        <w:rPr>
+                          <w:rFonts w:ascii="Cambria Math" w:hAnsi="Cambria Math"/>
+                          <w:sz w:val="28"/>
+                          <w:szCs w:val="28"/>
+                          <w:lang w:val="en-US"/>
+                        </w:rPr>
+                        <m:t>n</m:t>
+                      </m:r>
+                    </m:sub>
+                  </m:sSub>
+                  <m:r>
+                    <w:rPr>
+                      <w:rFonts w:ascii="Cambria Math" w:hAnsi="Cambria Math"/>
+                      <w:sz w:val="28"/>
+                      <w:szCs w:val="28"/>
+                      <w:lang w:val="en-US"/>
+                    </w:rPr>
+                    <m:t>(x)</m:t>
+                  </m:r>
+                </m:e>
+              </m:d>
+            </m:e>
+          </m:func>
+        </m:oMath>
+      </m:oMathPara>
+    </w:p>
+    <w:p>
+      <w:pPr>
+        <w:spacing w:before="100" w:beforeAutospacing="1" w:after="100" w:afterAutospacing="1" w:line="360" w:lineRule="auto"/>
+        <w:ind w:firstLine="360"/>
+        <w:jc w:val="both"/>
+        <w:rPr>
+          <w:sz w:val="28"/>
+          <w:szCs w:val="28"/>
+        </w:rPr>
+      </w:pPr>
+      <w:r>
+        <w:rPr>
+          <w:sz w:val="28"/>
+          <w:szCs w:val="28"/>
+        </w:rPr>
+        <w:t>Получены результаты:</w:t>
+      </w:r>
+    </w:p>
+    <w:p>
+      <w:pPr>
+        <w:spacing w:before="100" w:beforeAutospacing="1" w:after="100" w:afterAutospacing="1" w:line="360" w:lineRule="auto"/>
+        <w:ind w:firstLine="360"/>
+        <w:jc w:val="both"/>
+        <w:rPr>
+          <w:sz w:val="28"/>
+          <w:szCs w:val="28"/>
+        </w:rPr>
+      </w:pPr>
+      <m:oMathPara>
+        <m:oMath>
+          <m:r>
+            <w:rPr>
+              <w:rFonts w:ascii="Cambria Math" w:hAnsi="Cambria Math"/>
+              <w:sz w:val="28"/>
+              <w:szCs w:val="28"/>
+            </w:rPr>
+            <m:t>ρ</m:t>
+          </m:r>
+          <m:r>
+            <w:rPr>
+              <w:rFonts w:ascii="Cambria Math" w:hAnsi="Cambria Math"/>
+              <w:sz w:val="28"/>
+              <w:szCs w:val="28"/>
+            </w:rPr>
+            <m:t xml:space="preserve">= </m:t>
+          </m:r>
+          <m:r>
+            <w:rPr>
+              <w:rFonts w:ascii="Cambria Math" w:hAnsi="Cambria Math"/>
+              <w:sz w:val="28"/>
+              <w:szCs w:val="28"/>
+            </w:rPr>
+            <m:t>0,0343</m:t>
+          </m:r>
+        </m:oMath>
+      </m:oMathPara>
+    </w:p>
+    <w:p>
+      <w:pPr>
+        <w:spacing w:before="100" w:beforeAutospacing="1" w:after="100" w:afterAutospacing="1" w:line="360" w:lineRule="auto"/>
+        <w:ind w:firstLine="360"/>
+        <w:jc w:val="both"/>
+        <w:rPr>
+          <w:sz w:val="28"/>
+          <w:szCs w:val="28"/>
+          <w:lang w:val="en-US"/>
+        </w:rPr>
+      </w:pPr>
+      <m:oMathPara>
+        <m:oMath>
+          <m:r>
+            <w:rPr>
+              <w:rFonts w:ascii="Cambria Math" w:hAnsi="Cambria Math"/>
+              <w:sz w:val="28"/>
+              <w:szCs w:val="28"/>
+            </w:rPr>
+            <m:t xml:space="preserve">λ = </m:t>
+          </m:r>
+          <m:r>
+            <w:rPr>
+              <w:rFonts w:ascii="Cambria Math" w:hAnsi="Cambria Math"/>
+              <w:sz w:val="28"/>
+              <w:szCs w:val="28"/>
+            </w:rPr>
+            <m:t>ρ</m:t>
+          </m:r>
+          <m:r>
+            <w:rPr>
+              <w:rFonts w:ascii="Cambria Math" w:hAnsi="Cambria Math"/>
+              <w:sz w:val="28"/>
+              <w:szCs w:val="28"/>
+            </w:rPr>
+            <m:t>√n ≈ 0,594</m:t>
+          </m:r>
+        </m:oMath>
+      </m:oMathPara>
+    </w:p>
+    <w:p>
+      <w:pPr>
+        <w:spacing w:before="100" w:beforeAutospacing="1" w:after="100" w:afterAutospacing="1" w:line="360" w:lineRule="auto"/>
+        <w:ind w:firstLine="360"/>
+        <w:jc w:val="both"/>
+        <w:rPr>
+          <w:sz w:val="28"/>
+          <w:szCs w:val="28"/>
+          <w:lang w:val="en-US"/>
+        </w:rPr>
+      </w:pPr>
+      <w:r>
+        <w:rPr>
+          <w:sz w:val="28"/>
+          <w:szCs w:val="28"/>
+        </w:rPr>
+        <w:t xml:space="preserve">Табличное критическое значение при уровне значимости 0,05 составляет </w:t>
+      </w:r>
+      <m:oMath>
+        <m:r>
+          <w:rPr>
+            <w:rFonts w:ascii="Cambria Math" w:hAnsi="Cambria Math"/>
+            <w:sz w:val="28"/>
+            <w:szCs w:val="28"/>
+          </w:rPr>
+          <m:t>λкр ≈ 1,36</m:t>
+        </m:r>
+      </m:oMath>
+      <w:r>
+        <w:rPr>
+          <w:sz w:val="28"/>
+          <w:szCs w:val="28"/>
+        </w:rPr>
+        <w:t xml:space="preserve">. Так как </w:t>
+      </w:r>
+      <m:oMath>
+        <m:r>
+          <w:rPr>
+            <w:rFonts w:ascii="Cambria Math" w:hAnsi="Cambria Math"/>
+            <w:sz w:val="28"/>
+            <w:szCs w:val="28"/>
+          </w:rPr>
+          <m:t>λ &lt; λкр</m:t>
+        </m:r>
+      </m:oMath>
+      <w:r>
+        <w:rPr>
+          <w:sz w:val="28"/>
+          <w:szCs w:val="28"/>
+          <w:lang w:val="en-US"/>
+        </w:rPr>
+        <w:t>,</w:t>
+      </w:r>
+      <w:r>
+        <w:rPr>
+          <w:sz w:val="28"/>
+          <w:szCs w:val="28"/>
+        </w:rPr>
+        <w:t xml:space="preserve"> гипотеза H0 не отвергается.</w:t>
+      </w:r>
+    </w:p>
+    <w:p>
+      <w:pPr>
+        <w:spacing w:before="100" w:beforeAutospacing="1" w:after="100" w:afterAutospacing="1" w:line="360" w:lineRule="auto"/>
+        <w:ind w:firstLine="360"/>
+        <w:jc w:val="center"/>
+        <w:rPr>
+          <w:sz w:val="28"/>
+          <w:szCs w:val="28"/>
+          <w:lang w:val="en-US"/>
+        </w:rPr>
+      </w:pPr>
+      <w:r>
+        <w:rPr>
+          <w:sz w:val="28"/>
+          <w:szCs w:val="28"/>
+          <w:lang w:val="en-US"/>
+        </w:rPr>
+        <w:lastRenderedPageBreak/>
+        <w:drawing>
+          <wp:inline distT="0" distB="0" distL="0" distR="0" wp14:anchorId="73251B02" wp14:editId="5A64687C">
+            <wp:extent cx="5940425" cy="5617210"/>
+            <wp:effectExtent l="0" t="0" r="3175" b="2540"/>
+            <wp:docPr id="47" name="Рисунок 47"/>
+            <wp:cNvGraphicFramePr>
+              <a:graphicFrameLocks xmlns:a="http://schemas.openxmlformats.org/drawingml/2006/main" noChangeAspect="1"/>
+            </wp:cNvGraphicFramePr>
+            <a:graphic xmlns:a="http://schemas.openxmlformats.org/drawingml/2006/main">
+              <a:graphicData uri="http://schemas.openxmlformats.org/drawingml/2006/picture">
+                <pic:pic xmlns:pic="http://schemas.openxmlformats.org/drawingml/2006/picture">
+                  <pic:nvPicPr>
+                    <pic:cNvPr id="1" name=""/>
+                    <pic:cNvPicPr/>
+                  </pic:nvPicPr>
+                  <pic:blipFill>
+                    <a:blip r:embed="rId45"/>
+                    <a:stretch>
+                      <a:fillRect/>
+                    </a:stretch>
+                  </pic:blipFill>
+                  <pic:spPr>
+                    <a:xfrm>
+                      <a:off x="0" y="0"/>
+                      <a:ext cx="5940425" cy="5617210"/>
+                    </a:xfrm>
+                    <a:prstGeom prst="rect">
+                      <a:avLst/>
+                    </a:prstGeom>
+                  </pic:spPr>
+                </pic:pic>
+              </a:graphicData>
+            </a:graphic>
+          </wp:inline>
+        </w:drawing>
+      </w:r>
+    </w:p>
+    <w:p>
+      <w:pPr>
+        <w:spacing w:before="100" w:beforeAutospacing="1" w:after="100" w:afterAutospacing="1" w:line="360" w:lineRule="auto"/>
+        <w:ind w:firstLine="360"/>
+        <w:jc w:val="center"/>
+        <w:rPr>
+          <w:sz w:val="28"/>
+          <w:szCs w:val="28"/>
+        </w:rPr>
+      </w:pPr>
+      <w:r>
+        <w:rPr>
+          <w:sz w:val="28"/>
+          <w:szCs w:val="28"/>
+        </w:rPr>
+        <w:t>Листинг 2</w:t>
+      </w:r>
+      <w:r>
+        <w:rPr>
+          <w:sz w:val="28"/>
+          <w:szCs w:val="28"/>
+        </w:rPr>
+        <w:t>7</w:t>
+      </w:r>
+      <w:r>
+        <w:rPr>
+          <w:sz w:val="28"/>
+          <w:szCs w:val="28"/>
+        </w:rPr>
+        <w:t>. Критерий Колмогорова</w:t>
+      </w:r>
+    </w:p>
+    <w:p>
+      <w:pPr>
+        <w:spacing w:before="100" w:beforeAutospacing="1" w:after="100" w:afterAutospacing="1" w:line="360" w:lineRule="auto"/>
+        <w:ind w:firstLine="360"/>
+        <w:jc w:val="both"/>
+        <w:rPr>
+          <w:sz w:val="28"/>
+          <w:szCs w:val="28"/>
+        </w:rPr>
+      </w:pPr>
+      <w:r>
+        <w:rPr>
+          <w:sz w:val="28"/>
+          <w:szCs w:val="28"/>
+        </w:rPr>
+        <w:t xml:space="preserve">Критерий </w:t>
+      </w:r>
+      <m:oMath>
+        <m:sSup>
+          <m:sSupPr>
+            <m:ctrlPr>
+              <w:rPr>
+                <w:rFonts w:ascii="Cambria Math" w:hAnsi="Cambria Math"/>
+                <w:sz w:val="28"/>
+                <w:szCs w:val="28"/>
+              </w:rPr>
+            </m:ctrlPr>
+          </m:sSupPr>
+          <m:e>
+            <m:r>
+              <w:rPr>
+                <w:rFonts w:ascii="Cambria Math" w:hAnsi="Cambria Math"/>
+                <w:sz w:val="28"/>
+                <w:szCs w:val="28"/>
+              </w:rPr>
+              <m:t>χ</m:t>
+            </m:r>
+          </m:e>
+          <m:sup>
+            <m:r>
+              <m:rPr>
+                <m:sty m:val="p"/>
+              </m:rPr>
+              <w:rPr>
+                <w:rFonts w:ascii="Cambria Math" w:hAnsi="Cambria Math"/>
+                <w:sz w:val="28"/>
+                <w:szCs w:val="28"/>
+              </w:rPr>
+              <m:t>2</m:t>
+            </m:r>
+          </m:sup>
+        </m:sSup>
+      </m:oMath>
+      <w:r>
+        <w:rPr>
+          <w:sz w:val="28"/>
+          <w:szCs w:val="28"/>
+        </w:rPr>
+        <w:t xml:space="preserve"> делит нашу выборку на интервалы и считает количество попавших значений в каждый интервал</w:t>
+      </w:r>
+      <w:r>
+        <w:rPr>
+          <w:sz w:val="28"/>
+          <w:szCs w:val="28"/>
+        </w:rPr>
+        <w:t xml:space="preserve"> [</w:t>
+      </w:r>
+      <w:r>
+        <w:rPr>
+          <w:sz w:val="28"/>
+          <w:szCs w:val="28"/>
+        </w:rPr>
+        <w:t>Листинг 28</w:t>
+      </w:r>
+      <w:r>
+        <w:rPr>
+          <w:sz w:val="28"/>
+          <w:szCs w:val="28"/>
+        </w:rPr>
+        <w:t>]</w:t>
+      </w:r>
+      <w:r>
+        <w:rPr>
+          <w:sz w:val="28"/>
+          <w:szCs w:val="28"/>
+        </w:rPr>
+        <w:t>.</w:t>
+      </w:r>
+      <w:r>
+        <w:rPr>
+          <w:sz w:val="28"/>
+          <w:szCs w:val="28"/>
+        </w:rPr>
+        <w:t xml:space="preserve"> </w:t>
+      </w:r>
+      <w:r>
+        <w:rPr>
+          <w:sz w:val="28"/>
+          <w:szCs w:val="28"/>
+        </w:rPr>
+        <w:t>Выборка разбита на k = 9 интервалов равной теоретической вероятности</w:t>
+      </w:r>
+      <w:r>
+        <w:rPr>
+          <w:sz w:val="28"/>
+          <w:szCs w:val="28"/>
+        </w:rPr>
+        <w:t xml:space="preserve">. </w:t>
+      </w:r>
+    </w:p>
+    <w:p>
+      <w:pPr>
+        <w:spacing w:before="100" w:beforeAutospacing="1" w:after="100" w:afterAutospacing="1" w:line="360" w:lineRule="auto"/>
+        <w:ind w:firstLine="360"/>
+        <w:jc w:val="both"/>
+        <w:rPr>
+          <w:sz w:val="28"/>
+          <w:szCs w:val="28"/>
+        </w:rPr>
+      </w:pPr>
+      <w:r>
+        <w:rPr>
+          <w:sz w:val="28"/>
+          <w:szCs w:val="28"/>
+        </w:rPr>
+        <w:t>Число степеней свободы:</w:t>
+      </w:r>
+    </w:p>
+    <w:p>
+      <w:pPr>
+        <w:spacing w:before="100" w:beforeAutospacing="1" w:after="100" w:afterAutospacing="1" w:line="360" w:lineRule="auto"/>
+        <w:ind w:firstLine="360"/>
+        <w:jc w:val="both"/>
+        <w:rPr>
+          <w:sz w:val="28"/>
+          <w:szCs w:val="28"/>
+        </w:rPr>
+      </w:pPr>
+      <w:r>
+        <w:rPr>
+          <w:sz w:val="28"/>
+          <w:szCs w:val="28"/>
+        </w:rPr>
+        <w:t xml:space="preserve"> </w:t>
+      </w:r>
+      <m:oMath>
+        <m:r>
+          <w:rPr>
+            <w:rFonts w:ascii="Cambria Math" w:hAnsi="Cambria Math"/>
+            <w:sz w:val="28"/>
+            <w:szCs w:val="28"/>
+          </w:rPr>
+          <m:t>df = k - 1 - r = 9 - 1 - 2 = 6</m:t>
+        </m:r>
+      </m:oMath>
+    </w:p>
+    <w:p>
+      <w:pPr>
+        <w:spacing w:before="100" w:beforeAutospacing="1" w:after="100" w:afterAutospacing="1" w:line="360" w:lineRule="auto"/>
+        <w:ind w:firstLine="360"/>
+        <w:jc w:val="both"/>
+        <w:rPr>
+          <w:sz w:val="28"/>
+          <w:szCs w:val="28"/>
+          <w:lang w:val="en-US"/>
+        </w:rPr>
+      </w:pPr>
+      <w:r>
+        <w:rPr>
+          <w:sz w:val="28"/>
+          <w:szCs w:val="28"/>
+        </w:rPr>
+        <w:lastRenderedPageBreak/>
+        <w:drawing>
+          <wp:inline distT="0" distB="0" distL="0" distR="0" wp14:anchorId="288AFAC9" wp14:editId="6D364750">
+            <wp:extent cx="5940425" cy="6190615"/>
+            <wp:effectExtent l="0" t="0" r="3175" b="635"/>
+            <wp:docPr id="48" name="Рисунок 48"/>
+            <wp:cNvGraphicFramePr>
+              <a:graphicFrameLocks xmlns:a="http://schemas.openxmlformats.org/drawingml/2006/main" noChangeAspect="1"/>
+            </wp:cNvGraphicFramePr>
+            <a:graphic xmlns:a="http://schemas.openxmlformats.org/drawingml/2006/main">
+              <a:graphicData uri="http://schemas.openxmlformats.org/drawingml/2006/picture">
+                <pic:pic xmlns:pic="http://schemas.openxmlformats.org/drawingml/2006/picture">
+                  <pic:nvPicPr>
+                    <pic:cNvPr id="1" name=""/>
+                    <pic:cNvPicPr/>
+                  </pic:nvPicPr>
+                  <pic:blipFill>
+                    <a:blip r:embed="rId46"/>
+                    <a:stretch>
+                      <a:fillRect/>
+                    </a:stretch>
+                  </pic:blipFill>
+                  <pic:spPr>
+                    <a:xfrm>
+                      <a:off x="0" y="0"/>
+                      <a:ext cx="5940425" cy="6190615"/>
+                    </a:xfrm>
+                    <a:prstGeom prst="rect">
+                      <a:avLst/>
+                    </a:prstGeom>
+                  </pic:spPr>
+                </pic:pic>
+              </a:graphicData>
+            </a:graphic>
+          </wp:inline>
+        </w:drawing>
+      </w:r>
+    </w:p>
+    <w:p>
+      <w:pPr>
+        <w:spacing w:before="100" w:beforeAutospacing="1" w:after="100" w:afterAutospacing="1" w:line="360" w:lineRule="auto"/>
+        <w:ind w:firstLine="360"/>
+        <w:jc w:val="center"/>
+        <w:rPr>
+          <w:sz w:val="28"/>
+          <w:szCs w:val="28"/>
+          <w:lang w:val="en-US"/>
+        </w:rPr>
+      </w:pPr>
+      <w:r>
+        <w:rPr>
+          <w:sz w:val="28"/>
+          <w:szCs w:val="28"/>
+        </w:rPr>
+        <w:t>Листинг 2</w:t>
+      </w:r>
+      <w:r>
+        <w:rPr>
+          <w:sz w:val="28"/>
+          <w:szCs w:val="28"/>
+          <w:lang w:val="en-US"/>
+        </w:rPr>
+        <w:t>8</w:t>
+      </w:r>
+      <w:r>
+        <w:rPr>
+          <w:sz w:val="28"/>
+          <w:szCs w:val="28"/>
+        </w:rPr>
+        <w:t xml:space="preserve">. Критерий </w:t>
+      </w:r>
+      <m:oMath>
+        <m:sSup>
+          <m:sSupPr>
+            <m:ctrlPr>
+              <w:rPr>
+                <w:rFonts w:ascii="Cambria Math" w:hAnsi="Cambria Math"/>
+                <w:sz w:val="28"/>
+                <w:szCs w:val="28"/>
+              </w:rPr>
+            </m:ctrlPr>
+          </m:sSupPr>
+          <m:e>
+            <m:r>
+              <w:rPr>
+                <w:rFonts w:ascii="Cambria Math" w:hAnsi="Cambria Math"/>
+                <w:sz w:val="28"/>
+                <w:szCs w:val="28"/>
+              </w:rPr>
+              <m:t>χ</m:t>
+            </m:r>
+          </m:e>
+          <m:sup>
+            <m:r>
+              <m:rPr>
+                <m:sty m:val="p"/>
+              </m:rPr>
+              <w:rPr>
+                <w:rFonts w:ascii="Cambria Math" w:hAnsi="Cambria Math"/>
+                <w:sz w:val="28"/>
+                <w:szCs w:val="28"/>
+              </w:rPr>
+              <m:t>2</m:t>
+            </m:r>
+          </m:sup>
+        </m:sSup>
+      </m:oMath>
+    </w:p>
+    <w:p>
+      <w:pPr>
+        <w:spacing w:before="100" w:beforeAutospacing="1" w:after="100" w:afterAutospacing="1" w:line="360" w:lineRule="auto"/>
+        <w:jc w:val="both"/>
+        <w:rPr>
+          <w:sz w:val="28"/>
+          <w:szCs w:val="28"/>
+        </w:rPr>
+      </w:pPr>
+      <w:r>
+        <w:rPr>
+          <w:sz w:val="28"/>
+          <w:szCs w:val="28"/>
+        </w:rPr>
+        <w:t>По результатам работы программы</w:t>
+      </w:r>
+      <w:r>
+        <w:rPr>
+          <w:sz w:val="28"/>
+          <w:szCs w:val="28"/>
+        </w:rPr>
+        <w:t xml:space="preserve"> </w:t>
+      </w:r>
+      <w:r>
+        <w:rPr>
+          <w:sz w:val="28"/>
+          <w:szCs w:val="28"/>
+        </w:rPr>
+        <w:t xml:space="preserve">получилось, что для обоих методов гипотеза </w:t>
+      </w:r>
+      <m:oMath>
+        <m:sSub>
+          <m:sSubPr>
+            <m:ctrlPr>
+              <w:rPr>
+                <w:rFonts w:ascii="Cambria Math" w:hAnsi="Cambria Math"/>
+                <w:i/>
+                <w:sz w:val="28"/>
+                <w:szCs w:val="28"/>
+              </w:rPr>
+            </m:ctrlPr>
+          </m:sSubPr>
+          <m:e>
+            <m:r>
+              <w:rPr>
+                <w:rFonts w:ascii="Cambria Math" w:hAnsi="Cambria Math"/>
+                <w:sz w:val="28"/>
+                <w:szCs w:val="28"/>
+              </w:rPr>
+              <m:t>H</m:t>
+            </m:r>
+          </m:e>
+          <m:sub>
+            <m:r>
+              <w:rPr>
+                <w:rFonts w:ascii="Cambria Math" w:hAnsi="Cambria Math"/>
+                <w:sz w:val="28"/>
+                <w:szCs w:val="28"/>
+              </w:rPr>
+              <m:t>0</m:t>
+            </m:r>
+          </m:sub>
+        </m:sSub>
+      </m:oMath>
+      <w:r>
+        <w:rPr>
+          <w:sz w:val="28"/>
+          <w:szCs w:val="28"/>
+        </w:rPr>
+        <w:t xml:space="preserve"> не отвергается, что говорит о принадлежности нашей выборки распределению из варианта.</w:t>
+      </w:r>
+    </w:p>
+    <w:p>
+      <w:pPr>
+        <w:spacing w:before="100" w:beforeAutospacing="1" w:after="100" w:afterAutospacing="1" w:line="360" w:lineRule="auto"/>
+        <w:jc w:val="both"/>
+        <w:rPr>
+          <w:sz w:val="28"/>
+          <w:szCs w:val="28"/>
+        </w:rPr>
+      </w:pPr>
+    </w:p>
+    <w:p>
+      <w:pPr>
+        <w:spacing w:before="100" w:beforeAutospacing="1" w:after="100" w:afterAutospacing="1" w:line="360" w:lineRule="auto"/>
+        <w:ind w:firstLine="709"/>
+        <w:jc w:val="both"/>
+        <w:rPr>
+          <w:sz w:val="28"/>
+          <w:szCs w:val="28"/>
+        </w:rPr>
+      </w:pPr>
+    </w:p>
+    <w:p>
+      <w:pPr>
+        <w:spacing w:before="100" w:beforeAutospacing="1" w:after="100" w:afterAutospacing="1" w:line="360" w:lineRule="auto"/>
+        <w:ind w:firstLine="709"/>
+        <w:jc w:val="both"/>
+        <w:rPr>
+          <w:sz w:val="28"/>
+          <w:szCs w:val="28"/>
+        </w:rPr>
+      </w:pPr>
+    </w:p>
+    <w:p>
+      <w:pPr>
+        <w:spacing w:before="100" w:beforeAutospacing="1" w:after="100" w:afterAutospacing="1" w:line="360" w:lineRule="auto"/>
+        <w:ind w:firstLine="708"/>
+        <w:jc w:val="both"/>
+        <w:rPr>
+          <w:sz w:val="28"/>
+          <w:szCs w:val="28"/>
+        </w:rPr>
+      </w:pPr>
+    </w:p>
+    <w:p>
+      <w:pPr>
+        <w:spacing w:line="360" w:lineRule="auto"/>
+        <w:rPr>
+          <w:sz w:val="28"/>
+          <w:szCs w:val="28"/>
+        </w:rPr>
+      </w:pPr>
+    </w:p>
+    <w:p>
+      <w:pPr>
+        <w:spacing w:line="360" w:lineRule="auto"/>
+        <w:rPr>
+          <w:sz w:val="28"/>
+          <w:szCs w:val="28"/>
+        </w:rPr>
+      </w:pPr>
+    </w:p>
+    <w:p>
+      <w:pPr>
+        <w:spacing w:line="360" w:lineRule="auto"/>
+        <w:jc w:val="center"/>
+        <w:rPr>
+          <w:sz w:val="28"/>
+          <w:szCs w:val="28"/>
+        </w:rPr>
+      </w:pPr>
+    </w:p>
+    <w:p>
+      <w:pPr>
+        <w:spacing w:line="360" w:lineRule="auto"/>
+        <w:rPr>
+          <w:sz w:val="28"/>
+          <w:szCs w:val="28"/>
+        </w:rPr>
+      </w:pPr>
+    </w:p>
+    <w:p>
+      <w:pPr>
+        <w:spacing w:line="360" w:lineRule="auto"/>
+        <w:rPr>
+          <w:sz w:val="28"/>
+          <w:szCs w:val="28"/>
+        </w:rPr>
+      </w:pPr>
+    </w:p>
+    <w:p>
+      <w:pPr>
+        <w:spacing w:line="360" w:lineRule="auto"/>
+        <w:rPr>
+          <w:sz w:val="28"/>
+          <w:szCs w:val="28"/>
+        </w:rPr>
+      </w:pPr>
+    </w:p>
+    <w:p>
+      <w:pPr>
+        <w:spacing w:line="360" w:lineRule="auto"/>
+        <w:rPr>
+          <w:sz w:val="28"/>
+          <w:szCs w:val="28"/>
+        </w:rPr>
+      </w:pPr>
+    </w:p>
+    <w:p>
+      <w:pPr>
+        <w:spacing w:line="360" w:lineRule="auto"/>
+        <w:rPr>
+          <w:sz w:val="28"/>
+          <w:szCs w:val="28"/>
+        </w:rPr>
+      </w:pPr>
+    </w:p>
+    <w:p>
+      <w:pPr>
+        <w:spacing w:line="360" w:lineRule="auto"/>
+        <w:rPr>
+          <w:sz w:val="28"/>
+          <w:szCs w:val="28"/>
+        </w:rPr>
+      </w:pPr>
+    </w:p>
+    <w:p>
+      <w:pPr>
+        <w:spacing w:line="360" w:lineRule="auto"/>
+        <w:rPr>
+          <w:sz w:val="28"/>
+          <w:szCs w:val="28"/>
+        </w:rPr>
+      </w:pPr>
+    </w:p>
+    <w:p>
+      <w:pPr>
+        <w:spacing w:line="360" w:lineRule="auto"/>
+        <w:rPr>
+          <w:sz w:val="28"/>
+          <w:szCs w:val="28"/>
+        </w:rPr>
+      </w:pPr>
+    </w:p>
+    <w:p>
+      <w:pPr>
+        <w:spacing w:line="360" w:lineRule="auto"/>
+        <w:rPr>
+          <w:sz w:val="28"/>
+          <w:szCs w:val="28"/>
+        </w:rPr>
+      </w:pPr>
+    </w:p>
+    <w:p>
+      <w:pPr>
+        <w:spacing w:line="360" w:lineRule="auto"/>
+        <w:rPr>
+          <w:sz w:val="28"/>
+          <w:szCs w:val="28"/>
+        </w:rPr>
+      </w:pPr>
+    </w:p>
+    <w:p>
+      <w:pPr>
+        <w:spacing w:line="360" w:lineRule="auto"/>
+        <w:rPr>
+          <w:sz w:val="28"/>
+          <w:szCs w:val="28"/>
+        </w:rPr>
+      </w:pPr>
+    </w:p>
+    <w:p>
+      <w:pPr>
+        <w:spacing w:line="360" w:lineRule="auto"/>
+        <w:rPr>
+          <w:sz w:val="28"/>
+          <w:szCs w:val="28"/>
+        </w:rPr>
+      </w:pPr>
+    </w:p>
+    <w:p>
+      <w:pPr>
+        <w:spacing w:line="360" w:lineRule="auto"/>
+        <w:rPr>
+          <w:sz w:val="28"/>
+          <w:szCs w:val="28"/>
+        </w:rPr>
+      </w:pPr>
+    </w:p>
+    <w:p>
+      <w:pPr>
+        <w:spacing w:line="360" w:lineRule="auto"/>
+        <w:rPr>
+          <w:sz w:val="28"/>
+          <w:szCs w:val="28"/>
+        </w:rPr>
+      </w:pPr>
+    </w:p>
+    <w:p>
+      <w:pPr>
+        <w:spacing w:line="360" w:lineRule="auto"/>
+        <w:rPr>
+          <w:sz w:val="28"/>
+          <w:szCs w:val="28"/>
+        </w:rPr>
+      </w:pPr>
+    </w:p>
+    <w:p>
+      <w:pPr>
+        <w:spacing w:line="360" w:lineRule="auto"/>
+        <w:rPr>
+          <w:sz w:val="28"/>
+          <w:szCs w:val="28"/>
+        </w:rPr>
+      </w:pPr>
+    </w:p>
+    <w:p>
+      <w:pPr>
+        <w:spacing w:line="360" w:lineRule="auto"/>
+        <w:rPr>
+          <w:sz w:val="28"/>
+          <w:szCs w:val="28"/>
+        </w:rPr>
+      </w:pPr>
+    </w:p>
+    <w:p>
+      <w:pPr>
+        <w:spacing w:line="360" w:lineRule="auto"/>
+        <w:rPr>
+          <w:sz w:val="28"/>
+          <w:szCs w:val="28"/>
+        </w:rPr>
+      </w:pPr>
+    </w:p>
+    <w:p>
+      <w:pPr>
+        <w:spacing w:line="360" w:lineRule="auto"/>
+        <w:rPr>
+          <w:sz w:val="28"/>
+          <w:szCs w:val="28"/>
+        </w:rPr>
+      </w:pPr>
+    </w:p>
+    <w:p>
+      <w:pPr>
+        <w:spacing w:line="360" w:lineRule="auto"/>
+        <w:rPr>
+          <w:sz w:val="28"/>
+          <w:szCs w:val="28"/>
+        </w:rPr>
+      </w:pPr>
+    </w:p>
+    <w:p>
+      <w:pPr>
+        <w:spacing w:line="360" w:lineRule="auto"/>
+        <w:jc w:val="center"/>
         <w:rPr>
           <w:b/>
           <w:bCs/>
           <w:sz w:val="32"/>
           <w:szCs w:val="32"/>
         </w:rPr>
-        <w:t>Список использованной литературы</w:t>
-      </w:r>
-    </w:p>
-    <w:p>
-      <w:pPr>
-        <w:spacing w:line="360" w:lineRule="auto"/>
-        <w:jc w:val="center"/>
+      </w:pPr>
+      <w:r>
         <w:rPr>
           <w:b/>
           <w:bCs/>
-          <w:sz w:val="28"/>
-          <w:szCs w:val="28"/>
-        </w:rPr>
-      </w:pPr>
-    </w:p>
-    <w:p>
-      <w:pPr>
-        <w:spacing w:line="360" w:lineRule="auto"/>
-        <w:jc w:val="both"/>
-        <w:rPr>
-          <w:sz w:val="28"/>
-          <w:szCs w:val="28"/>
-          <w:lang w:val="en-US"/>
-        </w:rPr>
-      </w:pPr>
-      <w:r>
+          <w:sz w:val="32"/>
+          <w:szCs w:val="32"/>
+        </w:rPr>
+        <w:t>Список использованной литературы</w:t>
+      </w:r>
+    </w:p>
+    <w:p>
+      <w:pPr>
+        <w:spacing w:line="360" w:lineRule="auto"/>
+        <w:jc w:val="center"/>
         <w:rPr>
           <w:b/>
           <w:bCs/>
           <w:sz w:val="28"/>
           <w:szCs w:val="28"/>
+        </w:rPr>
+      </w:pPr>
+    </w:p>
+    <w:p>
+      <w:pPr>
+        <w:spacing w:line="360" w:lineRule="auto"/>
+        <w:jc w:val="both"/>
+        <w:rPr>
+          <w:sz w:val="28"/>
+          <w:szCs w:val="28"/>
           <w:lang w:val="en-US"/>
         </w:rPr>
-        <w:t>[1] Pearson K. Tables of the Incomplete Gamma-Function / computed by the staff of the Department of Applied Statistics, University of London. — London: University of London, 1922. — URL</w:t>
-      </w:r>
-      <w:r>
-        <w:rPr>
+      </w:pPr>
+      <w:r>
+        <w:rPr>
+          <w:b/>
+          <w:bCs/>
           <w:sz w:val="28"/>
           <w:szCs w:val="28"/>
           <w:lang w:val="en-US"/>
         </w:rPr>
+        <w:t xml:space="preserve">[1] Pearson K. Tables of the Incomplete Gamma-Function / computed by the staff of the Department of Applied Statistics, University of London. — London: </w:t>
+      </w:r>
+      <w:r>
+        <w:rPr>
+          <w:b/>
+          <w:bCs/>
+          <w:sz w:val="28"/>
+          <w:szCs w:val="28"/>
+          <w:lang w:val="en-US"/>
+        </w:rPr>
+        <w:lastRenderedPageBreak/>
+        <w:t>University of London, 1922. — URL</w:t>
+      </w:r>
+      <w:r>
+        <w:rPr>
+          <w:sz w:val="28"/>
+          <w:szCs w:val="28"/>
+          <w:lang w:val="en-US"/>
+        </w:rPr>
         <w:t xml:space="preserve">: </w:t>
       </w:r>
-      <w:hyperlink r:id="rId41" w:history="1">
+      <w:hyperlink r:id="rId47" w:history="1">
         <w:r>
           <w:rPr>
             <w:rStyle w:val="ac"/>
@@ -23380,7 +25508,7 @@
         </w:rPr>
         <w:t xml:space="preserve"> </w:t>
       </w:r>
-      <w:hyperlink r:id="rId42" w:history="1">
+      <w:hyperlink r:id="rId48" w:history="1">
         <w:r>
           <w:rPr>
             <w:rStyle w:val="ac"/>
@@ -25492,6 +27620,121 @@
       <w:rPr>
         <w:rFonts w:ascii="Wingdings" w:hAnsi="Wingdings" w:hint="default"/>
         <w:sz w:val="20"/>
+      </w:rPr>
+    </w:lvl>
+  </w:abstractNum>
+  <w:abstractNum w:abstractNumId="17" w15:restartNumberingAfterBreak="0">
+    <w:nsid w:val="72AE5787"/>
+    <w:multiLevelType w:val="multilevel"/>
+    <w:tmpl w:val="92ECF4F4"/>
+    <w:lvl w:ilvl="0">
+      <w:start w:val="1"/>
+      <w:numFmt w:val="bullet"/>
+      <w:lvlText w:val="–"/>
+      <w:lvlJc w:val="left"/>
+      <w:pPr>
+        <w:ind w:left="1429" w:hanging="360"/>
+      </w:pPr>
+      <w:rPr>
+        <w:rFonts w:ascii="Times New Roman" w:eastAsia="Times New Roman" w:hAnsi="Times New Roman" w:cs="Times New Roman"/>
+        <w:sz w:val="24"/>
+        <w:szCs w:val="24"/>
+      </w:rPr>
+    </w:lvl>
+    <w:lvl w:ilvl="1">
+      <w:start w:val="1"/>
+      <w:numFmt w:val="bullet"/>
+      <w:lvlText w:val="o"/>
+      <w:lvlJc w:val="left"/>
+      <w:pPr>
+        <w:ind w:left="2149" w:hanging="360"/>
+      </w:pPr>
+      <w:rPr>
+        <w:rFonts w:ascii="Courier New" w:hAnsi="Courier New" w:cs="Courier New" w:hint="default"/>
+      </w:rPr>
+    </w:lvl>
+    <w:lvl w:ilvl="2">
+      <w:start w:val="1"/>
+      <w:numFmt w:val="bullet"/>
+      <w:lvlText w:val=""/>
+      <w:lvlJc w:val="left"/>
+      <w:pPr>
+        <w:ind w:left="2869" w:hanging="360"/>
+      </w:pPr>
+      <w:rPr>
+        <w:rFonts w:ascii="Wingdings" w:hAnsi="Wingdings" w:hint="default"/>
+      </w:rPr>
+    </w:lvl>
+    <w:lvl w:ilvl="3">
+      <w:start w:val="1"/>
+      <w:numFmt w:val="bullet"/>
+      <w:lvlText w:val=""/>
+      <w:lvlJc w:val="left"/>
+      <w:pPr>
+        <w:ind w:left="3589" w:hanging="360"/>
+      </w:pPr>
+      <w:rPr>
+        <w:rFonts w:ascii="Symbol" w:hAnsi="Symbol" w:hint="default"/>
+      </w:rPr>
+    </w:lvl>
+    <w:lvl w:ilvl="4">
+      <w:start w:val="1"/>
+      <w:numFmt w:val="bullet"/>
+      <w:lvlText w:val="o"/>
+      <w:lvlJc w:val="left"/>
+      <w:pPr>
+        <w:ind w:left="4309" w:hanging="360"/>
+      </w:pPr>
+      <w:rPr>
+        <w:rFonts w:ascii="Courier New" w:hAnsi="Courier New" w:cs="Courier New" w:hint="default"/>
+      </w:rPr>
+    </w:lvl>
+    <w:lvl w:ilvl="5">
+      <w:start w:val="1"/>
+      <w:numFmt w:val="bullet"/>
+      <w:lvlText w:val=""/>
+      <w:lvlJc w:val="left"/>
+      <w:pPr>
+        <w:ind w:left="5029" w:hanging="360"/>
+      </w:pPr>
+      <w:rPr>
+        <w:rFonts w:ascii="Wingdings" w:hAnsi="Wingdings" w:hint="default"/>
+      </w:rPr>
+    </w:lvl>
+    <w:lvl w:ilvl="6">
+      <w:start w:val="1"/>
+      <w:numFmt w:val="bullet"/>
+      <w:lvlText w:val=""/>
+      <w:lvlJc w:val="left"/>
+      <w:pPr>
+        <w:ind w:left="5749" w:hanging="360"/>
+      </w:pPr>
+      <w:rPr>
+        <w:rFonts w:ascii="Symbol" w:hAnsi="Symbol" w:hint="default"/>
+      </w:rPr>
+    </w:lvl>
+    <w:lvl w:ilvl="7">
+      <w:start w:val="1"/>
+      <w:numFmt w:val="bullet"/>
+      <w:lvlText w:val="o"/>
+      <w:lvlJc w:val="left"/>
+      <w:pPr>
+        <w:ind w:left="6469" w:hanging="360"/>
+      </w:pPr>
+      <w:rPr>
+        <w:rFonts w:ascii="Courier New" w:hAnsi="Courier New" w:cs="Courier New" w:hint="default"/>
+      </w:rPr>
+    </w:lvl>
+    <w:lvl w:ilvl="8">
+      <w:start w:val="1"/>
+      <w:numFmt w:val="bullet"/>
+      <w:lvlText w:val=""/>
+      <w:lvlJc w:val="left"/>
+      <w:pPr>
+        <w:ind w:left="7189" w:hanging="360"/>
+      </w:pPr>
+      <w:rPr>
+        <w:rFonts w:ascii="Wingdings" w:hAnsi="Wingdings" w:hint="default"/>
       </w:rPr>
     </w:lvl>
   </w:abstractNum>
@@ -25575,6 +27818,9 @@
   </w:num>
   <w:num w:numId="18" w16cid:durableId="1785735337">
     <w:abstractNumId w:val="5"/>
+  </w:num>
+  <w:num w:numId="19" w16cid:durableId="899749302">
+    <w:abstractNumId w:val="17"/>
   </w:num>
 </w:numbering>
 </file>
@@ -25778,7 +28024,7 @@
     <w:lsdException w:name="Medium Shading 2 Accent 1" w:uiPriority="64"/>
     <w:lsdException w:name="Medium List 1 Accent 1" w:uiPriority="65"/>
     <w:lsdException w:name="Revision" w:semiHidden="1"/>
-    <w:lsdException w:name="List Paragraph" w:uiPriority="34" w:qFormat="1"/>
+    <w:lsdException w:name="List Paragraph" w:qFormat="1"/>
     <w:lsdException w:name="Quote" w:uiPriority="29" w:qFormat="1"/>
     <w:lsdException w:name="Intense Quote" w:uiPriority="30" w:qFormat="1"/>
     <w:lsdException w:name="Medium List 2 Accent 1" w:uiPriority="66"/>
@@ -26436,7 +28682,7 @@
   <w:style w:type="paragraph" w:styleId="a7">
     <w:name w:val="List Paragraph"/>
     <w:basedOn w:val="a"/>
-    <w:uiPriority w:val="34"/>
+    <w:uiPriority w:val="99"/>
     <w:qFormat/>
     <w:rsid w:val="00527DC4"/>
     <w:pPr>

</xml_diff>

<commit_message>
UPDATE: отчет DATE: 2026-09-22 14:57:45
</commit_message>
<xml_diff>
--- a/Учеба 4 семестр/Теория вероятности/Курсовая работа/Отчет, Код/Курсовая_работа.docx
+++ b/Учеба 4 семестр/Теория вероятности/Курсовая работа/Отчет, Код/Курсовая_работа.docx
@@ -319,16 +319,8 @@
           <w:szCs w:val="28"/>
         </w:rPr>
         <w:tab/>
-      </w:r>
-      <w:proofErr w:type="spellStart"/>
-      <w:r>
-        <w:rPr>
-          <w:sz w:val="28"/>
-          <w:szCs w:val="28"/>
-        </w:rPr>
         <w:t>И.А.Эков</w:t>
       </w:r>
-      <w:proofErr w:type="spellEnd"/>
     </w:p>
     <w:p>
       <w:pPr>
@@ -379,7 +371,6 @@
         </w:rPr>
         <w:tab/>
       </w:r>
-      <w:proofErr w:type="spellStart"/>
       <w:r>
         <w:rPr>
           <w:sz w:val="28"/>
@@ -387,7 +378,6 @@
         </w:rPr>
         <w:t>Р.А.Ажермачев</w:t>
       </w:r>
-      <w:proofErr w:type="spellEnd"/>
     </w:p>
     <w:p>
       <w:pPr>
@@ -451,16 +441,8 @@
           <w:szCs w:val="28"/>
         </w:rPr>
         <w:tab/>
-      </w:r>
-      <w:proofErr w:type="spellStart"/>
-      <w:r>
-        <w:rPr>
-          <w:sz w:val="28"/>
-          <w:szCs w:val="28"/>
-        </w:rPr>
         <w:t>О.А.Пахомова</w:t>
       </w:r>
-      <w:proofErr w:type="spellEnd"/>
     </w:p>
     <w:p>
       <w:pPr>
@@ -935,23 +917,7 @@
           <w:sz w:val="28"/>
           <w:szCs w:val="28"/>
         </w:rPr>
-        <w:t xml:space="preserve">4.3. Вид гистограмм для случайных </w:t>
-      </w:r>
-      <w:proofErr w:type="spellStart"/>
-      <w:r>
-        <w:rPr>
-          <w:sz w:val="28"/>
-          <w:szCs w:val="28"/>
-        </w:rPr>
-        <w:t>подвыборок</w:t>
-      </w:r>
-      <w:proofErr w:type="spellEnd"/>
-      <w:r>
-        <w:rPr>
-          <w:sz w:val="28"/>
-          <w:szCs w:val="28"/>
-        </w:rPr>
-        <w:t xml:space="preserve"> размера 10, 100, 200</w:t>
+        <w:t>4.3. Вид гистограмм для случайных подвыборок размера 10, 100, 200</w:t>
       </w:r>
       <w:r>
         <w:rPr>
@@ -2114,23 +2080,7 @@
           <w:sz w:val="28"/>
           <w:szCs w:val="28"/>
         </w:rPr>
-        <w:t xml:space="preserve">Объектом исследования является выборка случайной величины, подчиняющейся </w:t>
-      </w:r>
-      <w:proofErr w:type="gramStart"/>
-      <w:r>
-        <w:rPr>
-          <w:sz w:val="28"/>
-          <w:szCs w:val="28"/>
-        </w:rPr>
-        <w:t>двойному</w:t>
-      </w:r>
-      <w:proofErr w:type="gramEnd"/>
-      <w:r>
-        <w:rPr>
-          <w:sz w:val="28"/>
-          <w:szCs w:val="28"/>
-        </w:rPr>
-        <w:t xml:space="preserve"> гамма распределению. Предметом исследования — статистические свойства данной выборки и методы её анализа.</w:t>
+        <w:t>Объектом исследования является выборка случайной величины, подчиняющейся двойному гамма распределению. Предметом исследования — статистические свойства данной выборки и методы её анализа.</w:t>
       </w:r>
     </w:p>
     <w:p>
@@ -2159,39 +2109,7 @@
           <w:sz w:val="28"/>
           <w:szCs w:val="28"/>
         </w:rPr>
-        <w:t xml:space="preserve">Работа выполнена с использованием языка программирования Python в среде </w:t>
-      </w:r>
-      <w:proofErr w:type="spellStart"/>
-      <w:r>
-        <w:rPr>
-          <w:sz w:val="28"/>
-          <w:szCs w:val="28"/>
-        </w:rPr>
-        <w:t>Jupyter</w:t>
-      </w:r>
-      <w:proofErr w:type="spellEnd"/>
-      <w:r>
-        <w:rPr>
-          <w:sz w:val="28"/>
-          <w:szCs w:val="28"/>
-        </w:rPr>
-        <w:t xml:space="preserve"> </w:t>
-      </w:r>
-      <w:proofErr w:type="spellStart"/>
-      <w:r>
-        <w:rPr>
-          <w:sz w:val="28"/>
-          <w:szCs w:val="28"/>
-        </w:rPr>
-        <w:t>Notebook</w:t>
-      </w:r>
-      <w:proofErr w:type="spellEnd"/>
-      <w:r>
-        <w:rPr>
-          <w:sz w:val="28"/>
-          <w:szCs w:val="28"/>
-        </w:rPr>
-        <w:t>. Все вычисления реализованы самостоятельно, без применения готовых статистических библиотек там, где это оговорено заданием.</w:t>
+        <w:t>Работа выполнена с использованием языка программирования Python в среде Jupyter Notebook. Все вычисления реализованы самостоятельно, без применения готовых статистических библиотек там, где это оговорено заданием.</w:t>
       </w:r>
     </w:p>
     <w:p>
@@ -2517,7 +2435,6 @@
         </w:rPr>
         <w:t xml:space="preserve">Гамма-распределение определено только для неотрицательных значений случайной величины, что ограничивает его применимость при моделировании симметричных процессов [2]. Для преодоления этого ограничения исследователями было предложено его естественное расширение на всю числовую ось — двойное гамма-распределение (также называемое отражённым гамма-распределением, англ. </w:t>
       </w:r>
-      <w:proofErr w:type="spellStart"/>
       <w:r>
         <w:rPr>
           <w:i/>
@@ -2525,49 +2442,8 @@
           <w:sz w:val="28"/>
           <w:szCs w:val="28"/>
         </w:rPr>
-        <w:t>Reflected</w:t>
-      </w:r>
-      <w:proofErr w:type="spellEnd"/>
-      <w:r>
-        <w:rPr>
-          <w:i/>
-          <w:iCs/>
-          <w:sz w:val="28"/>
-          <w:szCs w:val="28"/>
-        </w:rPr>
-        <w:t xml:space="preserve"> </w:t>
-      </w:r>
-      <w:proofErr w:type="spellStart"/>
-      <w:r>
-        <w:rPr>
-          <w:i/>
-          <w:iCs/>
-          <w:sz w:val="28"/>
-          <w:szCs w:val="28"/>
-        </w:rPr>
-        <w:t>gamma</w:t>
-      </w:r>
-      <w:proofErr w:type="spellEnd"/>
-      <w:r>
-        <w:rPr>
-          <w:i/>
-          <w:iCs/>
-          <w:sz w:val="28"/>
-          <w:szCs w:val="28"/>
-        </w:rPr>
-        <w:t xml:space="preserve"> </w:t>
-      </w:r>
-      <w:proofErr w:type="spellStart"/>
-      <w:r>
-        <w:rPr>
-          <w:i/>
-          <w:iCs/>
-          <w:sz w:val="28"/>
-          <w:szCs w:val="28"/>
-        </w:rPr>
-        <w:t>distribution</w:t>
-      </w:r>
-      <w:proofErr w:type="spellEnd"/>
+        <w:t>Reflected gamma distribution</w:t>
+      </w:r>
       <w:r>
         <w:rPr>
           <w:sz w:val="28"/>
@@ -3176,71 +3052,7 @@
           <w:sz w:val="28"/>
           <w:szCs w:val="28"/>
         </w:rPr>
-        <w:t xml:space="preserve">Несмотря на то, что двойное гамма-распределение не является специализированным инструментом информационной безопасности, его свойства находят применение в ряде смежных задач. В частности, как показано в работе </w:t>
-      </w:r>
-      <w:proofErr w:type="spellStart"/>
-      <w:r>
-        <w:rPr>
-          <w:sz w:val="28"/>
-          <w:szCs w:val="28"/>
-        </w:rPr>
-        <w:t>Bahashwan</w:t>
-      </w:r>
-      <w:proofErr w:type="spellEnd"/>
-      <w:r>
-        <w:rPr>
-          <w:sz w:val="28"/>
-          <w:szCs w:val="28"/>
-        </w:rPr>
-        <w:t xml:space="preserve">, </w:t>
-      </w:r>
-      <w:proofErr w:type="spellStart"/>
-      <w:r>
-        <w:rPr>
-          <w:sz w:val="28"/>
-          <w:szCs w:val="28"/>
-        </w:rPr>
-        <w:t>Kalantan</w:t>
-      </w:r>
-      <w:proofErr w:type="spellEnd"/>
-      <w:r>
-        <w:rPr>
-          <w:sz w:val="28"/>
-          <w:szCs w:val="28"/>
-        </w:rPr>
-        <w:t xml:space="preserve"> и </w:t>
-      </w:r>
-      <w:proofErr w:type="spellStart"/>
-      <w:r>
-        <w:rPr>
-          <w:sz w:val="28"/>
-          <w:szCs w:val="28"/>
-        </w:rPr>
-        <w:t>Adham</w:t>
-      </w:r>
-      <w:proofErr w:type="spellEnd"/>
-      <w:r>
-        <w:rPr>
-          <w:sz w:val="28"/>
-          <w:szCs w:val="28"/>
-        </w:rPr>
-        <w:t xml:space="preserve"> [3], метод главных компонент (PCA), основанный на двойном гамма-распределении для моделирования шума, демонстрирует повышенную устойчивость к выбросам по сравнению с классическим гауссовским PCA. Данное свойство актуально при анализе сетевого трафика, где наблюдаемые данные, как правило, содержат выбросы и нештатные значения, характерные для атак типа </w:t>
-      </w:r>
-      <w:proofErr w:type="spellStart"/>
-      <w:r>
-        <w:rPr>
-          <w:sz w:val="28"/>
-          <w:szCs w:val="28"/>
-        </w:rPr>
-        <w:t>DoS</w:t>
-      </w:r>
-      <w:proofErr w:type="spellEnd"/>
-      <w:r>
-        <w:rPr>
-          <w:sz w:val="28"/>
-          <w:szCs w:val="28"/>
-        </w:rPr>
-        <w:t xml:space="preserve"> или аномального поведения пользователей. Применение устойчивых к шуму и выбросам методов снижения размерности позволяет выделять информативные признаки из зашумлённых данных, что является одним из ключевых этапов в системах обнаружения вторжений (IDS). </w:t>
+        <w:t xml:space="preserve">Несмотря на то, что двойное гамма-распределение не является специализированным инструментом информационной безопасности, его свойства находят применение в ряде смежных задач. В частности, как показано в работе Bahashwan, Kalantan и Adham [3], метод главных компонент (PCA), основанный на двойном гамма-распределении для моделирования шума, демонстрирует повышенную устойчивость к выбросам по сравнению с классическим гауссовским PCA. Данное свойство актуально при анализе сетевого трафика, где наблюдаемые данные, как правило, содержат выбросы и нештатные значения, характерные для атак типа DoS или аномального поведения пользователей. Применение устойчивых к шуму и выбросам методов снижения размерности позволяет выделять информативные признаки из зашумлённых данных, что является одним из ключевых этапов в системах обнаружения вторжений (IDS). </w:t>
       </w:r>
     </w:p>
     <w:p>
@@ -5784,23 +5596,7 @@
           <w:sz w:val="28"/>
           <w:szCs w:val="28"/>
         </w:rPr>
-        <w:t xml:space="preserve">С помощью функции единичного скачка (функции </w:t>
-      </w:r>
-      <w:proofErr w:type="spellStart"/>
-      <w:r>
-        <w:rPr>
-          <w:sz w:val="28"/>
-          <w:szCs w:val="28"/>
-        </w:rPr>
-        <w:t>Хевисайда</w:t>
-      </w:r>
-      <w:proofErr w:type="spellEnd"/>
-      <w:r>
-        <w:rPr>
-          <w:sz w:val="28"/>
-          <w:szCs w:val="28"/>
-        </w:rPr>
-        <w:t>) эмпирическую функцию распределения можно записать в виде [4]:</w:t>
+        <w:t>С помощью функции единичного скачка (функции Хевисайда) эмпирическую функцию распределения можно записать в виде [4]:</w:t>
       </w:r>
     </w:p>
     <w:p>
@@ -5990,23 +5786,7 @@
           <w:sz w:val="28"/>
           <w:szCs w:val="28"/>
         </w:rPr>
-        <w:t xml:space="preserve">где функция </w:t>
-      </w:r>
-      <w:proofErr w:type="spellStart"/>
-      <w:r>
-        <w:rPr>
-          <w:sz w:val="28"/>
-          <w:szCs w:val="28"/>
-        </w:rPr>
-        <w:t>Хевисайда</w:t>
-      </w:r>
-      <w:proofErr w:type="spellEnd"/>
-      <w:r>
-        <w:rPr>
-          <w:sz w:val="28"/>
-          <w:szCs w:val="28"/>
-        </w:rPr>
-        <w:t xml:space="preserve"> e(x) определяется следующим образом:</w:t>
+        <w:t>где функция Хевисайда e(x) определяется следующим образом:</w:t>
       </w:r>
     </w:p>
     <w:p>
@@ -7235,23 +7015,7 @@
           <w:szCs w:val="28"/>
         </w:rPr>
         <w:lastRenderedPageBreak/>
-        <w:t xml:space="preserve">Для анализа поведения ЭФР были сформированы три случайные </w:t>
-      </w:r>
-      <w:proofErr w:type="spellStart"/>
-      <w:r>
-        <w:rPr>
-          <w:sz w:val="28"/>
-          <w:szCs w:val="28"/>
-        </w:rPr>
-        <w:t>подвыборки</w:t>
-      </w:r>
-      <w:proofErr w:type="spellEnd"/>
-      <w:r>
-        <w:rPr>
-          <w:sz w:val="28"/>
-          <w:szCs w:val="28"/>
-        </w:rPr>
-        <w:t xml:space="preserve"> размером 10, 100 и 200 элементов из исходной выборки </w:t>
+        <w:t xml:space="preserve">Для анализа поведения ЭФР были сформированы три случайные подвыборки размером 10, 100 и 200 элементов из исходной выборки </w:t>
       </w:r>
       <m:oMath>
         <m:r>
@@ -7354,23 +7118,7 @@
           <w:sz w:val="28"/>
           <w:szCs w:val="28"/>
         </w:rPr>
-        <w:t xml:space="preserve">Рисунок 1. График эмпирической функции распределения для </w:t>
-      </w:r>
-      <w:proofErr w:type="spellStart"/>
-      <w:r>
-        <w:rPr>
-          <w:sz w:val="28"/>
-          <w:szCs w:val="28"/>
-        </w:rPr>
-        <w:t>подвыборки</w:t>
-      </w:r>
-      <w:proofErr w:type="spellEnd"/>
-      <w:r>
-        <w:rPr>
-          <w:sz w:val="28"/>
-          <w:szCs w:val="28"/>
-        </w:rPr>
-        <w:t xml:space="preserve"> из 10 элементов. </w:t>
+        <w:t xml:space="preserve">Рисунок 1. График эмпирической функции распределения для подвыборки из 10 элементов. </w:t>
       </w:r>
     </w:p>
     <w:p>
@@ -7440,23 +7188,7 @@
           <w:sz w:val="28"/>
           <w:szCs w:val="28"/>
         </w:rPr>
-        <w:t xml:space="preserve">Рисунок 2. График эмпирической функции распределения для </w:t>
-      </w:r>
-      <w:proofErr w:type="spellStart"/>
-      <w:r>
-        <w:rPr>
-          <w:sz w:val="28"/>
-          <w:szCs w:val="28"/>
-        </w:rPr>
-        <w:t>подвыборки</w:t>
-      </w:r>
-      <w:proofErr w:type="spellEnd"/>
-      <w:r>
-        <w:rPr>
-          <w:sz w:val="28"/>
-          <w:szCs w:val="28"/>
-        </w:rPr>
-        <w:t xml:space="preserve"> из 100 элементов. </w:t>
+        <w:t xml:space="preserve">Рисунок 2. График эмпирической функции распределения для подвыборки из 100 элементов. </w:t>
       </w:r>
     </w:p>
     <w:p>
@@ -7536,23 +7268,7 @@
           <w:sz w:val="28"/>
           <w:szCs w:val="28"/>
         </w:rPr>
-        <w:t xml:space="preserve">Рисунок 3. График эмпирической функции распределения для </w:t>
-      </w:r>
-      <w:proofErr w:type="spellStart"/>
-      <w:r>
-        <w:rPr>
-          <w:sz w:val="28"/>
-          <w:szCs w:val="28"/>
-        </w:rPr>
-        <w:t>подвыборки</w:t>
-      </w:r>
-      <w:proofErr w:type="spellEnd"/>
-      <w:r>
-        <w:rPr>
-          <w:sz w:val="28"/>
-          <w:szCs w:val="28"/>
-        </w:rPr>
-        <w:t xml:space="preserve"> из 200 элементов.</w:t>
+        <w:t>Рисунок 3. График эмпирической функции распределения для подвыборки из 200 элементов.</w:t>
       </w:r>
     </w:p>
     <w:p>
@@ -7603,23 +7319,7 @@
           <w:sz w:val="28"/>
           <w:szCs w:val="28"/>
         </w:rPr>
-        <w:t xml:space="preserve">. При увеличении объёма </w:t>
-      </w:r>
-      <w:proofErr w:type="spellStart"/>
-      <w:r>
-        <w:rPr>
-          <w:sz w:val="28"/>
-          <w:szCs w:val="28"/>
-        </w:rPr>
-        <w:t>подвыборки</w:t>
-      </w:r>
-      <w:proofErr w:type="spellEnd"/>
-      <w:r>
-        <w:rPr>
-          <w:sz w:val="28"/>
-          <w:szCs w:val="28"/>
-        </w:rPr>
-        <w:t xml:space="preserve"> эмпирическая функция распределения заметно приближается к теоретической. При </w:t>
+        <w:t xml:space="preserve">. При увеличении объёма подвыборки эмпирическая функция распределения заметно приближается к теоретической. При </w:t>
       </w:r>
       <m:oMath>
         <m:r>
@@ -9667,23 +9367,7 @@
           <w:sz w:val="28"/>
           <w:szCs w:val="28"/>
         </w:rPr>
-        <w:t xml:space="preserve">Результаты работы функции для случайных </w:t>
-      </w:r>
-      <w:proofErr w:type="spellStart"/>
-      <w:r>
-        <w:rPr>
-          <w:sz w:val="28"/>
-          <w:szCs w:val="28"/>
-        </w:rPr>
-        <w:t>подвыборок</w:t>
-      </w:r>
-      <w:proofErr w:type="spellEnd"/>
-      <w:r>
-        <w:rPr>
-          <w:sz w:val="28"/>
-          <w:szCs w:val="28"/>
-        </w:rPr>
-        <w:t xml:space="preserve"> размером 10, 100 и 200 элементов — на рисунках </w:t>
+        <w:t>Результаты работы функции для случайных подвыборок размером 10, 100 и 200 элементов — на рисунках </w:t>
       </w:r>
       <w:r>
         <w:rPr>
@@ -9827,27 +9511,7 @@
           <w:sz w:val="28"/>
           <w:szCs w:val="28"/>
         </w:rPr>
-        <w:t xml:space="preserve">Вид гистограмм для случайных </w:t>
-      </w:r>
-      <w:proofErr w:type="spellStart"/>
-      <w:r>
-        <w:rPr>
-          <w:b/>
-          <w:bCs/>
-          <w:sz w:val="28"/>
-          <w:szCs w:val="28"/>
-        </w:rPr>
-        <w:t>подвыборок</w:t>
-      </w:r>
-      <w:proofErr w:type="spellEnd"/>
-      <w:r>
-        <w:rPr>
-          <w:b/>
-          <w:bCs/>
-          <w:sz w:val="28"/>
-          <w:szCs w:val="28"/>
-        </w:rPr>
-        <w:t xml:space="preserve"> размера 10, 100, 200</w:t>
+        <w:t>Вид гистограмм для случайных подвыборок размера 10, 100, 200</w:t>
       </w:r>
     </w:p>
     <w:p>
@@ -9944,23 +9608,7 @@
           <w:sz w:val="28"/>
           <w:szCs w:val="28"/>
         </w:rPr>
-        <w:t xml:space="preserve"> – Гистограмма для </w:t>
-      </w:r>
-      <w:proofErr w:type="spellStart"/>
-      <w:r>
-        <w:rPr>
-          <w:sz w:val="28"/>
-          <w:szCs w:val="28"/>
-        </w:rPr>
-        <w:t>подвыборки</w:t>
-      </w:r>
-      <w:proofErr w:type="spellEnd"/>
-      <w:r>
-        <w:rPr>
-          <w:sz w:val="28"/>
-          <w:szCs w:val="28"/>
-        </w:rPr>
-        <w:t xml:space="preserve"> из 10 элементов</w:t>
+        <w:t> – Гистограмма для подвыборки из 10 элементов</w:t>
       </w:r>
     </w:p>
     <w:p>
@@ -10054,23 +9702,7 @@
           <w:sz w:val="28"/>
           <w:szCs w:val="28"/>
         </w:rPr>
-        <w:t xml:space="preserve"> – Гистограмма для </w:t>
-      </w:r>
-      <w:proofErr w:type="spellStart"/>
-      <w:r>
-        <w:rPr>
-          <w:sz w:val="28"/>
-          <w:szCs w:val="28"/>
-        </w:rPr>
-        <w:t>подвыборки</w:t>
-      </w:r>
-      <w:proofErr w:type="spellEnd"/>
-      <w:r>
-        <w:rPr>
-          <w:sz w:val="28"/>
-          <w:szCs w:val="28"/>
-        </w:rPr>
-        <w:t xml:space="preserve"> из 100 элементов</w:t>
+        <w:t> – Гистограмма для подвыборки из 100 элементов</w:t>
       </w:r>
     </w:p>
     <w:p>
@@ -10174,23 +9806,7 @@
           <w:sz w:val="28"/>
           <w:szCs w:val="28"/>
         </w:rPr>
-        <w:t xml:space="preserve"> – Гистограмма для </w:t>
-      </w:r>
-      <w:proofErr w:type="spellStart"/>
-      <w:r>
-        <w:rPr>
-          <w:sz w:val="28"/>
-          <w:szCs w:val="28"/>
-        </w:rPr>
-        <w:t>подвыборки</w:t>
-      </w:r>
-      <w:proofErr w:type="spellEnd"/>
-      <w:r>
-        <w:rPr>
-          <w:sz w:val="28"/>
-          <w:szCs w:val="28"/>
-        </w:rPr>
-        <w:t xml:space="preserve"> из 200 элементов.</w:t>
+        <w:t> – Гистограмма для подвыборки из 200 элементов.</w:t>
       </w:r>
     </w:p>
     <w:p>
@@ -10257,7 +9873,6 @@
           <w:szCs w:val="28"/>
         </w:rPr>
       </w:pPr>
-      <w:proofErr w:type="spellStart"/>
       <w:r>
         <w:rPr>
           <w:b/>
@@ -10265,9 +9880,8 @@
           <w:sz w:val="28"/>
           <w:szCs w:val="28"/>
         </w:rPr>
-        <w:t>Подвыборка</w:t>
-      </w:r>
-      <w:proofErr w:type="spellEnd"/>
+        <w:t>Подвыборка из 200 элементов (рисунок </w:t>
+      </w:r>
       <w:r>
         <w:rPr>
           <w:b/>
@@ -10275,27 +9889,8 @@
           <w:sz w:val="28"/>
           <w:szCs w:val="28"/>
         </w:rPr>
-        <w:t xml:space="preserve"> из 200 элементов (рисунок 9)</w:t>
-      </w:r>
-      <w:r>
-        <w:rPr>
-          <w:sz w:val="28"/>
-          <w:szCs w:val="28"/>
-        </w:rPr>
-        <w:t>. Форма гистограммы близка к полной выборке, а также пики различимы. Это свидетельствует о достаточной репрезентативности выборки объёмом 200 элементов для визуальной идентификации типа распределения.</w:t>
-      </w:r>
-    </w:p>
-    <w:p>
-      <w:pPr>
-        <w:spacing w:line="360" w:lineRule="auto"/>
-        <w:ind w:firstLine="720"/>
-        <w:jc w:val="both"/>
-        <w:rPr>
-          <w:sz w:val="28"/>
-          <w:szCs w:val="28"/>
-        </w:rPr>
-      </w:pPr>
-      <w:proofErr w:type="spellStart"/>
+        <w:t>7</w:t>
+      </w:r>
       <w:r>
         <w:rPr>
           <w:b/>
@@ -10303,9 +9898,26 @@
           <w:sz w:val="28"/>
           <w:szCs w:val="28"/>
         </w:rPr>
-        <w:t>Подвыборка</w:t>
-      </w:r>
-      <w:proofErr w:type="spellEnd"/>
+        <w:t>)</w:t>
+      </w:r>
+      <w:r>
+        <w:rPr>
+          <w:sz w:val="28"/>
+          <w:szCs w:val="28"/>
+        </w:rPr>
+        <w:t>. Форма гистограммы близка к полной выборке, а также пики различимы. Это свидетельствует о достаточной репрезентативности выборки объёмом 200 элементов для визуальной идентификации типа распределения.</w:t>
+      </w:r>
+    </w:p>
+    <w:p>
+      <w:pPr>
+        <w:spacing w:line="360" w:lineRule="auto"/>
+        <w:ind w:firstLine="720"/>
+        <w:jc w:val="both"/>
+        <w:rPr>
+          <w:sz w:val="28"/>
+          <w:szCs w:val="28"/>
+        </w:rPr>
+      </w:pPr>
       <w:r>
         <w:rPr>
           <w:b/>
@@ -10313,7 +9925,25 @@
           <w:sz w:val="28"/>
           <w:szCs w:val="28"/>
         </w:rPr>
-        <w:t xml:space="preserve"> из 100 элементов (рисунок 8)</w:t>
+        <w:t>Подвыборка из 100 элементов (рисунок </w:t>
+      </w:r>
+      <w:r>
+        <w:rPr>
+          <w:b/>
+          <w:bCs/>
+          <w:sz w:val="28"/>
+          <w:szCs w:val="28"/>
+        </w:rPr>
+        <w:t>6</w:t>
+      </w:r>
+      <w:r>
+        <w:rPr>
+          <w:b/>
+          <w:bCs/>
+          <w:sz w:val="28"/>
+          <w:szCs w:val="28"/>
+        </w:rPr>
+        <w:t>)</w:t>
       </w:r>
       <w:r>
         <w:rPr>
@@ -10350,7 +9980,6 @@
           <w:szCs w:val="28"/>
         </w:rPr>
       </w:pPr>
-      <w:proofErr w:type="spellStart"/>
       <w:r>
         <w:rPr>
           <w:b/>
@@ -10358,9 +9987,8 @@
           <w:sz w:val="28"/>
           <w:szCs w:val="28"/>
         </w:rPr>
-        <w:t>Подвыборка</w:t>
-      </w:r>
-      <w:proofErr w:type="spellEnd"/>
+        <w:t>Подвыборка из 10 элементов (рисунок </w:t>
+      </w:r>
       <w:r>
         <w:rPr>
           <w:b/>
@@ -10368,7 +9996,16 @@
           <w:sz w:val="28"/>
           <w:szCs w:val="28"/>
         </w:rPr>
-        <w:t xml:space="preserve"> из 10 элементов (рисунок 7)</w:t>
+        <w:t>5</w:t>
+      </w:r>
+      <w:r>
+        <w:rPr>
+          <w:b/>
+          <w:bCs/>
+          <w:sz w:val="28"/>
+          <w:szCs w:val="28"/>
+        </w:rPr>
+        <w:t>)</w:t>
       </w:r>
       <w:r>
         <w:rPr>
@@ -10470,7 +10107,25 @@
           <w:sz w:val="28"/>
           <w:szCs w:val="28"/>
         </w:rPr>
-        <w:t>, рисунок 9)</w:t>
+        <w:t>, рисунок </w:t>
+      </w:r>
+      <w:r>
+        <w:rPr>
+          <w:b/>
+          <w:bCs/>
+          <w:sz w:val="28"/>
+          <w:szCs w:val="28"/>
+        </w:rPr>
+        <w:t>8</w:t>
+      </w:r>
+      <w:r>
+        <w:rPr>
+          <w:b/>
+          <w:bCs/>
+          <w:sz w:val="28"/>
+          <w:szCs w:val="28"/>
+        </w:rPr>
+        <w:t>)</w:t>
       </w:r>
       <w:r>
         <w:rPr>
@@ -15255,23 +14910,7 @@
           <w:sz w:val="28"/>
           <w:szCs w:val="28"/>
         </w:rPr>
-        <w:t xml:space="preserve">Для проверки </w:t>
-      </w:r>
-      <w:proofErr w:type="spellStart"/>
-      <w:r>
-        <w:rPr>
-          <w:sz w:val="28"/>
-          <w:szCs w:val="28"/>
-        </w:rPr>
-        <w:t>несмещённости</w:t>
-      </w:r>
-      <w:proofErr w:type="spellEnd"/>
-      <w:r>
-        <w:rPr>
-          <w:sz w:val="28"/>
-          <w:szCs w:val="28"/>
-        </w:rPr>
-        <w:t xml:space="preserve"> было сгенерировано 1000 выборок объём</w:t>
+        <w:t>Для проверки несмещённости было сгенерировано 1000 выборок объём</w:t>
       </w:r>
       <w:r>
         <w:rPr>
@@ -16619,23 +16258,7 @@
           <w:sz w:val="28"/>
           <w:szCs w:val="28"/>
         </w:rPr>
-        <w:t xml:space="preserve">Листинг 18. Проверка </w:t>
-      </w:r>
-      <w:proofErr w:type="spellStart"/>
-      <w:r>
-        <w:rPr>
-          <w:sz w:val="28"/>
-          <w:szCs w:val="28"/>
-        </w:rPr>
-        <w:t>несмещенности</w:t>
-      </w:r>
-      <w:proofErr w:type="spellEnd"/>
-      <w:r>
-        <w:rPr>
-          <w:sz w:val="28"/>
-          <w:szCs w:val="28"/>
-        </w:rPr>
-        <w:t xml:space="preserve"> с помощью ММ.</w:t>
+        <w:t>Листинг 18. Проверка несмещенности с помощью ММ.</w:t>
       </w:r>
     </w:p>
     <w:p>
@@ -16708,23 +16331,7 @@
           <w:sz w:val="28"/>
           <w:szCs w:val="28"/>
         </w:rPr>
-        <w:t xml:space="preserve">Листинг 19. Проверка </w:t>
-      </w:r>
-      <w:proofErr w:type="spellStart"/>
-      <w:r>
-        <w:rPr>
-          <w:sz w:val="28"/>
-          <w:szCs w:val="28"/>
-        </w:rPr>
-        <w:t>несмещенности</w:t>
-      </w:r>
-      <w:proofErr w:type="spellEnd"/>
-      <w:r>
-        <w:rPr>
-          <w:sz w:val="28"/>
-          <w:szCs w:val="28"/>
-        </w:rPr>
-        <w:t xml:space="preserve"> с помощью ММП.</w:t>
+        <w:t>Листинг 19. Проверка несмещенности с помощью ММП.</w:t>
       </w:r>
     </w:p>
     <w:p>
@@ -17685,23 +17292,7 @@
           <w:sz w:val="28"/>
           <w:szCs w:val="28"/>
         </w:rPr>
-        <w:t xml:space="preserve">Эффективной называется оценка, дисперсия которой близка к минимально возможной. Согласно неравенству </w:t>
-      </w:r>
-      <w:proofErr w:type="spellStart"/>
-      <w:r>
-        <w:rPr>
-          <w:sz w:val="28"/>
-          <w:szCs w:val="28"/>
-        </w:rPr>
-        <w:t>Рао</w:t>
-      </w:r>
-      <w:proofErr w:type="spellEnd"/>
-      <w:r>
-        <w:rPr>
-          <w:sz w:val="28"/>
-          <w:szCs w:val="28"/>
-        </w:rPr>
-        <w:t>-Крамера:</w:t>
+        <w:t>Эффективной называется оценка, дисперсия которой близка к минимально возможной. Согласно неравенству Рао-Крамера:</w:t>
       </w:r>
     </w:p>
     <w:p>
@@ -18694,23 +18285,7 @@
           <w:sz w:val="28"/>
           <w:szCs w:val="28"/>
         </w:rPr>
-        <w:t xml:space="preserve">Поскольку явной формулы для </w:t>
-      </w:r>
-      <w:proofErr w:type="spellStart"/>
-      <w:r>
-        <w:rPr>
-          <w:sz w:val="28"/>
-          <w:szCs w:val="28"/>
-        </w:rPr>
-        <w:t>тригамма</w:t>
-      </w:r>
-      <w:proofErr w:type="spellEnd"/>
-      <w:r>
-        <w:rPr>
-          <w:sz w:val="28"/>
-          <w:szCs w:val="28"/>
-        </w:rPr>
-        <w:t xml:space="preserve">-функции </w:t>
+        <w:t xml:space="preserve">Поскольку явной формулы для тригамма-функции </w:t>
       </w:r>
       <m:oMath>
         <m:r>
@@ -20020,21 +19595,12 @@
         </w:rPr>
         <w:t xml:space="preserve"> дисперсия оценки методом моментов почти в 11 раз превышает нижнюю границу, что говорит о низкой эффективности выборочного среднего как оценки этого параметра. Дисперсия оценки методом максимального правдоподобия, напротив, лишь незначительно превышает границу </w:t>
       </w:r>
-      <w:proofErr w:type="spellStart"/>
-      <w:r>
-        <w:rPr>
-          <w:sz w:val="28"/>
-          <w:szCs w:val="28"/>
-        </w:rPr>
-        <w:t>Рао</w:t>
-      </w:r>
-      <w:proofErr w:type="spellEnd"/>
-      <w:r>
-        <w:rPr>
-          <w:sz w:val="28"/>
-          <w:szCs w:val="28"/>
-        </w:rPr>
-        <w:t>-Крамера</w:t>
+      <w:r>
+        <w:rPr>
+          <w:sz w:val="28"/>
+          <w:szCs w:val="28"/>
+        </w:rPr>
+        <w:t>Рао-Крамера</w:t>
       </w:r>
       <w:r>
         <w:rPr>
@@ -20601,23 +20167,7 @@
           <w:sz w:val="28"/>
           <w:szCs w:val="28"/>
         </w:rPr>
-        <w:t xml:space="preserve">Для параметра </w:t>
-      </w:r>
-      <w:proofErr w:type="spellStart"/>
-      <w:r>
-        <w:rPr>
-          <w:sz w:val="28"/>
-          <w:szCs w:val="28"/>
-        </w:rPr>
-        <w:t>loc</w:t>
-      </w:r>
-      <w:proofErr w:type="spellEnd"/>
-      <w:r>
-        <w:rPr>
-          <w:sz w:val="28"/>
-          <w:szCs w:val="28"/>
-        </w:rPr>
-        <w:t xml:space="preserve"> эффективность оценок различается: метод моментов использует лишь около 9% максимально достижимой точности</w:t>
+        <w:t>Для параметра loc эффективность оценок различается: метод моментов использует лишь около 9% максимально достижимой точности</w:t>
       </w:r>
       <w:r>
         <w:rPr>
@@ -22387,23 +21937,7 @@
           <w:sz w:val="28"/>
           <w:szCs w:val="28"/>
         </w:rPr>
-        <w:t xml:space="preserve">Доверительные интервалы для параметров a и </w:t>
-      </w:r>
-      <w:proofErr w:type="spellStart"/>
-      <w:r>
-        <w:rPr>
-          <w:sz w:val="28"/>
-          <w:szCs w:val="28"/>
-        </w:rPr>
-        <w:t>loc</w:t>
-      </w:r>
-      <w:proofErr w:type="spellEnd"/>
-      <w:r>
-        <w:rPr>
-          <w:sz w:val="28"/>
-          <w:szCs w:val="28"/>
-        </w:rPr>
-        <w:t xml:space="preserve"> </w:t>
+        <w:t xml:space="preserve">Доверительные интервалы для параметров a и loc </w:t>
       </w:r>
       <w:r>
         <w:rPr>
@@ -27810,39 +27344,7 @@
           <w:sz w:val="28"/>
           <w:szCs w:val="28"/>
         </w:rPr>
-        <w:t xml:space="preserve">Для предоставленной выборки объёмом n = 300 были самостоятельно реализованы функции вычисления основных статистик выборки, построены эмпирическая функция распределения и гистограмма для полной выборки и случайных </w:t>
-      </w:r>
-      <w:proofErr w:type="spellStart"/>
-      <w:r>
-        <w:rPr>
-          <w:sz w:val="28"/>
-          <w:szCs w:val="28"/>
-        </w:rPr>
-        <w:t>подвыборок</w:t>
-      </w:r>
-      <w:proofErr w:type="spellEnd"/>
-      <w:r>
-        <w:rPr>
-          <w:sz w:val="28"/>
-          <w:szCs w:val="28"/>
-        </w:rPr>
-        <w:t xml:space="preserve"> объёмом 10, 100 и 200 элементов. С ростом объёма </w:t>
-      </w:r>
-      <w:proofErr w:type="spellStart"/>
-      <w:r>
-        <w:rPr>
-          <w:sz w:val="28"/>
-          <w:szCs w:val="28"/>
-        </w:rPr>
-        <w:t>подвыборки</w:t>
-      </w:r>
-      <w:proofErr w:type="spellEnd"/>
-      <w:r>
-        <w:rPr>
-          <w:sz w:val="28"/>
-          <w:szCs w:val="28"/>
-        </w:rPr>
-        <w:t xml:space="preserve"> обе характеристики закономерно приближались к теоретическим, что согласуется с теоремой Гливенко. </w:t>
+        <w:t xml:space="preserve">Для предоставленной выборки объёмом n = 300 были самостоятельно реализованы функции вычисления основных статистик выборки, построены эмпирическая функция распределения и гистограмма для полной выборки и случайных подвыборок объёмом 10, 100 и 200 элементов. С ростом объёма подвыборки обе характеристики закономерно приближались к теоретическим, что согласуется с теоремой Гливенко. </w:t>
       </w:r>
     </w:p>
     <w:p>
@@ -28388,10 +27890,24 @@
           <w:szCs w:val="28"/>
           <w:lang w:val="en-US"/>
         </w:rPr>
-        <w:t xml:space="preserve">[2] Bain L. J., Engelhardt M. Introduction to Probability and Mathematical Statistics. — 2nd ed. — </w:t>
-      </w:r>
-      <w:proofErr w:type="gramStart"/>
-      <w:r>
+        <w:t>[2] Bain L. J., Engelhardt M. Introduction to Probability and Mathematical Statistics. — 2nd ed. — Belmont : Brooks/Cole, 1992. — 644 p.</w:t>
+      </w:r>
+    </w:p>
+    <w:p>
+      <w:pPr>
+        <w:spacing w:line="360" w:lineRule="auto"/>
+        <w:jc w:val="both"/>
+        <w:rPr>
+          <w:sz w:val="28"/>
+          <w:szCs w:val="28"/>
+          <w:lang w:val="en-US"/>
+        </w:rPr>
+      </w:pPr>
+    </w:p>
+    <w:p>
+      <w:pPr>
+        <w:spacing w:line="360" w:lineRule="auto"/>
+        <w:jc w:val="both"/>
         <w:rPr>
           <w:b/>
           <w:bCs/>
@@ -28399,9 +27915,7 @@
           <w:szCs w:val="28"/>
           <w:lang w:val="en-US"/>
         </w:rPr>
-        <w:t>Belmont :</w:t>
-      </w:r>
-      <w:proofErr w:type="gramEnd"/>
+      </w:pPr>
       <w:r>
         <w:rPr>
           <w:b/>
@@ -28410,7 +27924,7 @@
           <w:szCs w:val="28"/>
           <w:lang w:val="en-US"/>
         </w:rPr>
-        <w:t xml:space="preserve"> Brooks/Cole, 1992. — 644 p.</w:t>
+        <w:t xml:space="preserve">[3] Bahashwan A. O., Kalantan Z. I., Adham S. A. Double Gamma Principal Components Analysis // Applied Mathematical Sciences. — 2018. — Vol. 12, № 11. — P. 523–533. </w:t>
       </w:r>
     </w:p>
     <w:p>
@@ -28428,195 +27942,15 @@
       <w:pPr>
         <w:spacing w:line="360" w:lineRule="auto"/>
         <w:jc w:val="both"/>
+      </w:pPr>
+      <w:r>
         <w:rPr>
           <w:b/>
           <w:bCs/>
           <w:sz w:val="28"/>
           <w:szCs w:val="28"/>
-          <w:lang w:val="en-US"/>
-        </w:rPr>
-      </w:pPr>
-      <w:r>
-        <w:rPr>
-          <w:b/>
-          <w:bCs/>
-          <w:sz w:val="28"/>
-          <w:szCs w:val="28"/>
-          <w:lang w:val="en-US"/>
-        </w:rPr>
-        <w:t xml:space="preserve">[3] </w:t>
-      </w:r>
-      <w:proofErr w:type="spellStart"/>
-      <w:r>
-        <w:rPr>
-          <w:b/>
-          <w:bCs/>
-          <w:sz w:val="28"/>
-          <w:szCs w:val="28"/>
-          <w:lang w:val="en-US"/>
-        </w:rPr>
-        <w:t>Bahashwan</w:t>
-      </w:r>
-      <w:proofErr w:type="spellEnd"/>
-      <w:r>
-        <w:rPr>
-          <w:b/>
-          <w:bCs/>
-          <w:sz w:val="28"/>
-          <w:szCs w:val="28"/>
-          <w:lang w:val="en-US"/>
-        </w:rPr>
-        <w:t xml:space="preserve"> A. O., </w:t>
-      </w:r>
-      <w:proofErr w:type="spellStart"/>
-      <w:r>
-        <w:rPr>
-          <w:b/>
-          <w:bCs/>
-          <w:sz w:val="28"/>
-          <w:szCs w:val="28"/>
-          <w:lang w:val="en-US"/>
-        </w:rPr>
-        <w:t>Kalantan</w:t>
-      </w:r>
-      <w:proofErr w:type="spellEnd"/>
-      <w:r>
-        <w:rPr>
-          <w:b/>
-          <w:bCs/>
-          <w:sz w:val="28"/>
-          <w:szCs w:val="28"/>
-          <w:lang w:val="en-US"/>
-        </w:rPr>
-        <w:t xml:space="preserve"> Z. I., </w:t>
-      </w:r>
-      <w:proofErr w:type="spellStart"/>
-      <w:r>
-        <w:rPr>
-          <w:b/>
-          <w:bCs/>
-          <w:sz w:val="28"/>
-          <w:szCs w:val="28"/>
-          <w:lang w:val="en-US"/>
-        </w:rPr>
-        <w:t>Adham</w:t>
-      </w:r>
-      <w:proofErr w:type="spellEnd"/>
-      <w:r>
-        <w:rPr>
-          <w:b/>
-          <w:bCs/>
-          <w:sz w:val="28"/>
-          <w:szCs w:val="28"/>
-          <w:lang w:val="en-US"/>
-        </w:rPr>
-        <w:t xml:space="preserve"> S. A. Double Gamma Principal Components Analysis // Applied Mathematical Sciences. — 2018. — Vol. 12, № 11. — P. 523–533. </w:t>
-      </w:r>
-    </w:p>
-    <w:p>
-      <w:pPr>
-        <w:spacing w:line="360" w:lineRule="auto"/>
-        <w:jc w:val="both"/>
-        <w:rPr>
-          <w:sz w:val="28"/>
-          <w:szCs w:val="28"/>
-          <w:lang w:val="en-US"/>
-        </w:rPr>
-      </w:pPr>
-    </w:p>
-    <w:p>
-      <w:pPr>
-        <w:spacing w:line="360" w:lineRule="auto"/>
-        <w:jc w:val="both"/>
-      </w:pPr>
-      <w:r>
-        <w:rPr>
-          <w:b/>
-          <w:bCs/>
-          <w:sz w:val="28"/>
-          <w:szCs w:val="28"/>
-        </w:rPr>
-        <w:t xml:space="preserve">[4] </w:t>
-      </w:r>
-      <w:proofErr w:type="spellStart"/>
-      <w:r>
-        <w:rPr>
-          <w:b/>
-          <w:bCs/>
-          <w:sz w:val="28"/>
-          <w:szCs w:val="28"/>
-        </w:rPr>
-        <w:t>Положинцев</w:t>
-      </w:r>
-      <w:proofErr w:type="spellEnd"/>
-      <w:r>
-        <w:rPr>
-          <w:b/>
-          <w:bCs/>
-          <w:sz w:val="28"/>
-          <w:szCs w:val="28"/>
-        </w:rPr>
-        <w:t xml:space="preserve"> Б. И. Теория вероятностей и математическая статистика. Введение в математическую статистику: учебное пособие </w:t>
-      </w:r>
-      <w:proofErr w:type="gramStart"/>
-      <w:r>
-        <w:rPr>
-          <w:b/>
-          <w:bCs/>
-          <w:sz w:val="28"/>
-          <w:szCs w:val="28"/>
-        </w:rPr>
-        <w:t>/  Б.</w:t>
-      </w:r>
-      <w:proofErr w:type="gramEnd"/>
-      <w:r>
-        <w:rPr>
-          <w:b/>
-          <w:bCs/>
-          <w:sz w:val="28"/>
-          <w:szCs w:val="28"/>
-        </w:rPr>
-        <w:t xml:space="preserve"> И. </w:t>
-      </w:r>
-      <w:proofErr w:type="spellStart"/>
-      <w:r>
-        <w:rPr>
-          <w:b/>
-          <w:bCs/>
-          <w:sz w:val="28"/>
-          <w:szCs w:val="28"/>
-        </w:rPr>
-        <w:t>Положинцев</w:t>
-      </w:r>
-      <w:proofErr w:type="spellEnd"/>
-      <w:r>
-        <w:rPr>
-          <w:b/>
-          <w:bCs/>
-          <w:sz w:val="28"/>
-          <w:szCs w:val="28"/>
-        </w:rPr>
-        <w:t xml:space="preserve">. – Санкт-Петербург: </w:t>
-      </w:r>
-      <w:proofErr w:type="spellStart"/>
-      <w:r>
-        <w:rPr>
-          <w:b/>
-          <w:bCs/>
-          <w:sz w:val="28"/>
-          <w:szCs w:val="28"/>
-        </w:rPr>
-        <w:t>СПбПУ</w:t>
-      </w:r>
-      <w:proofErr w:type="spellEnd"/>
-      <w:r>
-        <w:rPr>
-          <w:b/>
-          <w:bCs/>
-          <w:sz w:val="28"/>
-          <w:szCs w:val="28"/>
-        </w:rPr>
-        <w:t>, 2016.</w:t>
+        </w:rPr>
+        <w:t>[4] Положинцев Б. И. Теория вероятностей и математическая статистика. Введение в математическую статистику: учебное пособие /  Б. И. Положинцев. – Санкт-Петербург: СПбПУ, 2016.</w:t>
       </w:r>
       <w:r>
         <w:rPr>

</xml_diff>

<commit_message>
vault backup: 2026-09-22 16:56:57
</commit_message>
<xml_diff>
--- a/Учеба 4 семестр/Теория вероятности/Курсовая работа/Отчет, Код/Курсовая_работа.docx
+++ b/Учеба 4 семестр/Теория вероятности/Курсовая работа/Отчет, Код/Курсовая_работа.docx
@@ -319,8 +319,16 @@
           <w:szCs w:val="28"/>
         </w:rPr>
         <w:tab/>
+      </w:r>
+      <w:proofErr w:type="spellStart"/>
+      <w:r>
+        <w:rPr>
+          <w:sz w:val="28"/>
+          <w:szCs w:val="28"/>
+        </w:rPr>
         <w:t>И.А.Эков</w:t>
       </w:r>
+      <w:proofErr w:type="spellEnd"/>
     </w:p>
     <w:p>
       <w:pPr>
@@ -371,6 +379,7 @@
         </w:rPr>
         <w:tab/>
       </w:r>
+      <w:proofErr w:type="spellStart"/>
       <w:r>
         <w:rPr>
           <w:sz w:val="28"/>
@@ -378,6 +387,7 @@
         </w:rPr>
         <w:t>Р.А.Ажермачев</w:t>
       </w:r>
+      <w:proofErr w:type="spellEnd"/>
     </w:p>
     <w:p>
       <w:pPr>
@@ -441,8 +451,16 @@
           <w:szCs w:val="28"/>
         </w:rPr>
         <w:tab/>
+      </w:r>
+      <w:proofErr w:type="spellStart"/>
+      <w:r>
+        <w:rPr>
+          <w:sz w:val="28"/>
+          <w:szCs w:val="28"/>
+        </w:rPr>
         <w:t>О.А.Пахомова</w:t>
       </w:r>
+      <w:proofErr w:type="spellEnd"/>
     </w:p>
     <w:p>
       <w:pPr>
@@ -688,7 +706,13 @@
           <w:szCs w:val="28"/>
         </w:rPr>
         <w:tab/>
-        <w:t>8</w:t>
+      </w:r>
+      <w:r>
+        <w:rPr>
+          <w:sz w:val="28"/>
+          <w:szCs w:val="28"/>
+        </w:rPr>
+        <w:t>9</w:t>
       </w:r>
     </w:p>
     <w:p>
@@ -713,7 +737,13 @@
           <w:szCs w:val="28"/>
         </w:rPr>
         <w:tab/>
-        <w:t>8</w:t>
+      </w:r>
+      <w:r>
+        <w:rPr>
+          <w:sz w:val="28"/>
+          <w:szCs w:val="28"/>
+        </w:rPr>
+        <w:t>9</w:t>
       </w:r>
     </w:p>
     <w:p>
@@ -738,7 +768,13 @@
           <w:szCs w:val="28"/>
         </w:rPr>
         <w:tab/>
-        <w:t>11</w:t>
+      </w:r>
+      <w:r>
+        <w:rPr>
+          <w:sz w:val="28"/>
+          <w:szCs w:val="28"/>
+        </w:rPr>
+        <w:t>12</w:t>
       </w:r>
     </w:p>
     <w:p>
@@ -762,7 +798,14 @@
           <w:szCs w:val="28"/>
         </w:rPr>
         <w:tab/>
-        <w:t>12</w:t>
+        <w:t>1</w:t>
+      </w:r>
+      <w:r>
+        <w:rPr>
+          <w:sz w:val="28"/>
+          <w:szCs w:val="28"/>
+        </w:rPr>
+        <w:t>3</w:t>
       </w:r>
     </w:p>
     <w:p>
@@ -787,7 +830,14 @@
           <w:szCs w:val="28"/>
         </w:rPr>
         <w:tab/>
-        <w:t>12</w:t>
+        <w:t>1</w:t>
+      </w:r>
+      <w:r>
+        <w:rPr>
+          <w:sz w:val="28"/>
+          <w:szCs w:val="28"/>
+        </w:rPr>
+        <w:t>3</w:t>
       </w:r>
     </w:p>
     <w:p>
@@ -812,7 +862,14 @@
           <w:szCs w:val="28"/>
         </w:rPr>
         <w:tab/>
-        <w:t>13</w:t>
+        <w:t>1</w:t>
+      </w:r>
+      <w:r>
+        <w:rPr>
+          <w:sz w:val="28"/>
+          <w:szCs w:val="28"/>
+        </w:rPr>
+        <w:t>4</w:t>
       </w:r>
     </w:p>
     <w:p>
@@ -836,7 +893,14 @@
           <w:szCs w:val="28"/>
         </w:rPr>
         <w:tab/>
-        <w:t>17</w:t>
+        <w:t>1</w:t>
+      </w:r>
+      <w:r>
+        <w:rPr>
+          <w:sz w:val="28"/>
+          <w:szCs w:val="28"/>
+        </w:rPr>
+        <w:t>8</w:t>
       </w:r>
     </w:p>
     <w:p>
@@ -861,7 +925,14 @@
           <w:szCs w:val="28"/>
         </w:rPr>
         <w:tab/>
-        <w:t>17</w:t>
+        <w:t>1</w:t>
+      </w:r>
+      <w:r>
+        <w:rPr>
+          <w:sz w:val="28"/>
+          <w:szCs w:val="28"/>
+        </w:rPr>
+        <w:t>8</w:t>
       </w:r>
     </w:p>
     <w:p>
@@ -900,7 +971,14 @@
           <w:szCs w:val="28"/>
         </w:rPr>
         <w:tab/>
-        <w:t>18</w:t>
+        <w:t>1</w:t>
+      </w:r>
+      <w:r>
+        <w:rPr>
+          <w:sz w:val="28"/>
+          <w:szCs w:val="28"/>
+        </w:rPr>
+        <w:t>9</w:t>
       </w:r>
     </w:p>
     <w:p>
@@ -917,7 +995,23 @@
           <w:sz w:val="28"/>
           <w:szCs w:val="28"/>
         </w:rPr>
-        <w:t>4.3. Вид гистограмм для случайных подвыборок размера 10, 100, 200</w:t>
+        <w:t xml:space="preserve">4.3. Вид гистограмм для случайных </w:t>
+      </w:r>
+      <w:proofErr w:type="spellStart"/>
+      <w:r>
+        <w:rPr>
+          <w:sz w:val="28"/>
+          <w:szCs w:val="28"/>
+        </w:rPr>
+        <w:t>подвыборок</w:t>
+      </w:r>
+      <w:proofErr w:type="spellEnd"/>
+      <w:r>
+        <w:rPr>
+          <w:sz w:val="28"/>
+          <w:szCs w:val="28"/>
+        </w:rPr>
+        <w:t xml:space="preserve"> размера 10, 100, 200</w:t>
       </w:r>
       <w:r>
         <w:rPr>
@@ -925,7 +1019,13 @@
           <w:szCs w:val="28"/>
         </w:rPr>
         <w:tab/>
-        <w:t>19</w:t>
+      </w:r>
+      <w:r>
+        <w:rPr>
+          <w:sz w:val="28"/>
+          <w:szCs w:val="28"/>
+        </w:rPr>
+        <w:t>20</w:t>
       </w:r>
     </w:p>
     <w:p>
@@ -2080,7 +2180,23 @@
           <w:sz w:val="28"/>
           <w:szCs w:val="28"/>
         </w:rPr>
-        <w:t>Объектом исследования является выборка случайной величины, подчиняющейся двойному гамма распределению. Предметом исследования — статистические свойства данной выборки и методы её анализа.</w:t>
+        <w:t xml:space="preserve">Объектом исследования является выборка случайной величины, подчиняющейся </w:t>
+      </w:r>
+      <w:proofErr w:type="gramStart"/>
+      <w:r>
+        <w:rPr>
+          <w:sz w:val="28"/>
+          <w:szCs w:val="28"/>
+        </w:rPr>
+        <w:t>двойному</w:t>
+      </w:r>
+      <w:proofErr w:type="gramEnd"/>
+      <w:r>
+        <w:rPr>
+          <w:sz w:val="28"/>
+          <w:szCs w:val="28"/>
+        </w:rPr>
+        <w:t xml:space="preserve"> гамма распределению. Предметом исследования — статистические свойства данной выборки и методы её анализа.</w:t>
       </w:r>
     </w:p>
     <w:p>
@@ -2109,7 +2225,39 @@
           <w:sz w:val="28"/>
           <w:szCs w:val="28"/>
         </w:rPr>
-        <w:t>Работа выполнена с использованием языка программирования Python в среде Jupyter Notebook. Все вычисления реализованы самостоятельно, без применения готовых статистических библиотек там, где это оговорено заданием.</w:t>
+        <w:t xml:space="preserve">Работа выполнена с использованием языка программирования Python в среде </w:t>
+      </w:r>
+      <w:proofErr w:type="spellStart"/>
+      <w:r>
+        <w:rPr>
+          <w:sz w:val="28"/>
+          <w:szCs w:val="28"/>
+        </w:rPr>
+        <w:t>Jupyter</w:t>
+      </w:r>
+      <w:proofErr w:type="spellEnd"/>
+      <w:r>
+        <w:rPr>
+          <w:sz w:val="28"/>
+          <w:szCs w:val="28"/>
+        </w:rPr>
+        <w:t xml:space="preserve"> </w:t>
+      </w:r>
+      <w:proofErr w:type="spellStart"/>
+      <w:r>
+        <w:rPr>
+          <w:sz w:val="28"/>
+          <w:szCs w:val="28"/>
+        </w:rPr>
+        <w:t>Notebook</w:t>
+      </w:r>
+      <w:proofErr w:type="spellEnd"/>
+      <w:r>
+        <w:rPr>
+          <w:sz w:val="28"/>
+          <w:szCs w:val="28"/>
+        </w:rPr>
+        <w:t>. Все вычисления реализованы самостоятельно, без применения готовых статистических библиотек там, где это оговорено заданием.</w:t>
       </w:r>
     </w:p>
     <w:p>
@@ -2435,6 +2583,7 @@
         </w:rPr>
         <w:t xml:space="preserve">Гамма-распределение определено только для неотрицательных значений случайной величины, что ограничивает его применимость при моделировании симметричных процессов [2]. Для преодоления этого ограничения исследователями было предложено его естественное расширение на всю числовую ось — двойное гамма-распределение (также называемое отражённым гамма-распределением, англ. </w:t>
       </w:r>
+      <w:proofErr w:type="spellStart"/>
       <w:r>
         <w:rPr>
           <w:i/>
@@ -2442,8 +2591,49 @@
           <w:sz w:val="28"/>
           <w:szCs w:val="28"/>
         </w:rPr>
-        <w:t>Reflected gamma distribution</w:t>
-      </w:r>
+        <w:t>Reflected</w:t>
+      </w:r>
+      <w:proofErr w:type="spellEnd"/>
+      <w:r>
+        <w:rPr>
+          <w:i/>
+          <w:iCs/>
+          <w:sz w:val="28"/>
+          <w:szCs w:val="28"/>
+        </w:rPr>
+        <w:t xml:space="preserve"> </w:t>
+      </w:r>
+      <w:proofErr w:type="spellStart"/>
+      <w:r>
+        <w:rPr>
+          <w:i/>
+          <w:iCs/>
+          <w:sz w:val="28"/>
+          <w:szCs w:val="28"/>
+        </w:rPr>
+        <w:t>gamma</w:t>
+      </w:r>
+      <w:proofErr w:type="spellEnd"/>
+      <w:r>
+        <w:rPr>
+          <w:i/>
+          <w:iCs/>
+          <w:sz w:val="28"/>
+          <w:szCs w:val="28"/>
+        </w:rPr>
+        <w:t xml:space="preserve"> </w:t>
+      </w:r>
+      <w:proofErr w:type="spellStart"/>
+      <w:r>
+        <w:rPr>
+          <w:i/>
+          <w:iCs/>
+          <w:sz w:val="28"/>
+          <w:szCs w:val="28"/>
+        </w:rPr>
+        <w:t>distribution</w:t>
+      </w:r>
+      <w:proofErr w:type="spellEnd"/>
       <w:r>
         <w:rPr>
           <w:sz w:val="28"/>
@@ -3052,7 +3242,71 @@
           <w:sz w:val="28"/>
           <w:szCs w:val="28"/>
         </w:rPr>
-        <w:t xml:space="preserve">Несмотря на то, что двойное гамма-распределение не является специализированным инструментом информационной безопасности, его свойства находят применение в ряде смежных задач. В частности, как показано в работе Bahashwan, Kalantan и Adham [3], метод главных компонент (PCA), основанный на двойном гамма-распределении для моделирования шума, демонстрирует повышенную устойчивость к выбросам по сравнению с классическим гауссовским PCA. Данное свойство актуально при анализе сетевого трафика, где наблюдаемые данные, как правило, содержат выбросы и нештатные значения, характерные для атак типа DoS или аномального поведения пользователей. Применение устойчивых к шуму и выбросам методов снижения размерности позволяет выделять информативные признаки из зашумлённых данных, что является одним из ключевых этапов в системах обнаружения вторжений (IDS). </w:t>
+        <w:t xml:space="preserve">Несмотря на то, что двойное гамма-распределение не является специализированным инструментом информационной безопасности, его свойства находят применение в ряде смежных задач. В частности, как показано в работе </w:t>
+      </w:r>
+      <w:proofErr w:type="spellStart"/>
+      <w:r>
+        <w:rPr>
+          <w:sz w:val="28"/>
+          <w:szCs w:val="28"/>
+        </w:rPr>
+        <w:t>Bahashwan</w:t>
+      </w:r>
+      <w:proofErr w:type="spellEnd"/>
+      <w:r>
+        <w:rPr>
+          <w:sz w:val="28"/>
+          <w:szCs w:val="28"/>
+        </w:rPr>
+        <w:t xml:space="preserve">, </w:t>
+      </w:r>
+      <w:proofErr w:type="spellStart"/>
+      <w:r>
+        <w:rPr>
+          <w:sz w:val="28"/>
+          <w:szCs w:val="28"/>
+        </w:rPr>
+        <w:t>Kalantan</w:t>
+      </w:r>
+      <w:proofErr w:type="spellEnd"/>
+      <w:r>
+        <w:rPr>
+          <w:sz w:val="28"/>
+          <w:szCs w:val="28"/>
+        </w:rPr>
+        <w:t xml:space="preserve"> и </w:t>
+      </w:r>
+      <w:proofErr w:type="spellStart"/>
+      <w:r>
+        <w:rPr>
+          <w:sz w:val="28"/>
+          <w:szCs w:val="28"/>
+        </w:rPr>
+        <w:t>Adham</w:t>
+      </w:r>
+      <w:proofErr w:type="spellEnd"/>
+      <w:r>
+        <w:rPr>
+          <w:sz w:val="28"/>
+          <w:szCs w:val="28"/>
+        </w:rPr>
+        <w:t xml:space="preserve"> [3], метод главных компонент (PCA), основанный на двойном гамма-распределении для моделирования шума, демонстрирует повышенную устойчивость к выбросам по сравнению с классическим гауссовским PCA. Данное свойство актуально при анализе сетевого трафика, где наблюдаемые данные, как правило, содержат выбросы и нештатные значения, характерные для атак типа </w:t>
+      </w:r>
+      <w:proofErr w:type="spellStart"/>
+      <w:r>
+        <w:rPr>
+          <w:sz w:val="28"/>
+          <w:szCs w:val="28"/>
+        </w:rPr>
+        <w:t>DoS</w:t>
+      </w:r>
+      <w:proofErr w:type="spellEnd"/>
+      <w:r>
+        <w:rPr>
+          <w:sz w:val="28"/>
+          <w:szCs w:val="28"/>
+        </w:rPr>
+        <w:t xml:space="preserve"> или аномального поведения пользователей. Применение устойчивых к шуму и выбросам методов снижения размерности позволяет выделять информативные признаки из зашумлённых данных, что является одним из ключевых этапов в системах обнаружения вторжений (IDS). </w:t>
       </w:r>
     </w:p>
     <w:p>
@@ -3070,8 +3324,250 @@
           <w:sz w:val="28"/>
           <w:szCs w:val="28"/>
         </w:rPr>
+        <w:t xml:space="preserve">Близкое направление исследований — статистическое моделирование самого сетевого трафика для обнаружения аномалий и </w:t>
+      </w:r>
+      <w:proofErr w:type="spellStart"/>
+      <w:r>
+        <w:rPr>
+          <w:sz w:val="28"/>
+          <w:szCs w:val="28"/>
+        </w:rPr>
+        <w:t>DDoS</w:t>
+      </w:r>
+      <w:proofErr w:type="spellEnd"/>
+      <w:r>
+        <w:rPr>
+          <w:sz w:val="28"/>
+          <w:szCs w:val="28"/>
+        </w:rPr>
+        <w:t xml:space="preserve">-атак. В работе </w:t>
+      </w:r>
+      <w:proofErr w:type="spellStart"/>
+      <w:r>
+        <w:rPr>
+          <w:sz w:val="28"/>
+          <w:szCs w:val="28"/>
+        </w:rPr>
+        <w:t>Scherrer</w:t>
+      </w:r>
+      <w:proofErr w:type="spellEnd"/>
+      <w:r>
+        <w:rPr>
+          <w:sz w:val="28"/>
+          <w:szCs w:val="28"/>
+        </w:rPr>
+        <w:t xml:space="preserve"> и др. [</w:t>
+      </w:r>
+      <w:r>
+        <w:rPr>
+          <w:sz w:val="28"/>
+          <w:szCs w:val="28"/>
+        </w:rPr>
+        <w:t>6</w:t>
+      </w:r>
+      <w:r>
+        <w:rPr>
+          <w:sz w:val="28"/>
+          <w:szCs w:val="28"/>
+        </w:rPr>
+        <w:t xml:space="preserve">], выполненной в рамках проекта METROSEC, показано, что распределения гамма-семейства точнее описывают агрегированный трафик, чем нормальное распределение, и позволяют строить эффективные критерии </w:t>
+      </w:r>
+      <w:r>
+        <w:rPr>
+          <w:sz w:val="28"/>
+          <w:szCs w:val="28"/>
+        </w:rPr>
+        <w:lastRenderedPageBreak/>
+        <w:t>обнаружения аномалий по отклонению статистических параметров трафика от эталонного профиля. В этой работе используется одностороннее гамма-распределение, поскольку объектом моделирования являются неотрицательные величины — счётчики пакетов. Однако если анализировать не сами счётчики, а их отклонения от прогнозного или эталонного значения (величину, которая может быть как положительной, так и отрицательной), естественным симметричным расширением такой модели становится именно двойное гамма-распределение.</w:t>
+      </w:r>
+    </w:p>
+    <w:p>
+      <w:pPr>
+        <w:spacing w:line="360" w:lineRule="auto"/>
+        <w:ind w:firstLine="360"/>
+        <w:jc w:val="both"/>
+        <w:rPr>
+          <w:sz w:val="28"/>
+          <w:szCs w:val="28"/>
+        </w:rPr>
+      </w:pPr>
+      <w:r>
+        <w:rPr>
+          <w:sz w:val="28"/>
+          <w:szCs w:val="28"/>
+        </w:rPr>
         <w:t>Таким образом, двойное гамма-распределение представляет интерес как статистическая основа для построения устойчивых к шуму алгоритмов анализа данных в задачах информационной безопасности.</w:t>
       </w:r>
+    </w:p>
+    <w:p>
+      <w:pPr>
+        <w:spacing w:line="360" w:lineRule="auto"/>
+        <w:jc w:val="both"/>
+        <w:rPr>
+          <w:sz w:val="28"/>
+          <w:szCs w:val="28"/>
+        </w:rPr>
+      </w:pPr>
+    </w:p>
+    <w:p>
+      <w:pPr>
+        <w:spacing w:line="360" w:lineRule="auto"/>
+        <w:jc w:val="both"/>
+        <w:rPr>
+          <w:sz w:val="28"/>
+          <w:szCs w:val="28"/>
+        </w:rPr>
+      </w:pPr>
+    </w:p>
+    <w:p>
+      <w:pPr>
+        <w:spacing w:line="360" w:lineRule="auto"/>
+        <w:jc w:val="both"/>
+        <w:rPr>
+          <w:sz w:val="28"/>
+          <w:szCs w:val="28"/>
+        </w:rPr>
+      </w:pPr>
+    </w:p>
+    <w:p>
+      <w:pPr>
+        <w:spacing w:line="360" w:lineRule="auto"/>
+        <w:jc w:val="both"/>
+        <w:rPr>
+          <w:sz w:val="28"/>
+          <w:szCs w:val="28"/>
+        </w:rPr>
+      </w:pPr>
+    </w:p>
+    <w:p>
+      <w:pPr>
+        <w:spacing w:line="360" w:lineRule="auto"/>
+        <w:jc w:val="both"/>
+        <w:rPr>
+          <w:sz w:val="28"/>
+          <w:szCs w:val="28"/>
+        </w:rPr>
+      </w:pPr>
+    </w:p>
+    <w:p>
+      <w:pPr>
+        <w:spacing w:line="360" w:lineRule="auto"/>
+        <w:jc w:val="both"/>
+        <w:rPr>
+          <w:sz w:val="28"/>
+          <w:szCs w:val="28"/>
+        </w:rPr>
+      </w:pPr>
+    </w:p>
+    <w:p>
+      <w:pPr>
+        <w:spacing w:line="360" w:lineRule="auto"/>
+        <w:jc w:val="both"/>
+        <w:rPr>
+          <w:sz w:val="28"/>
+          <w:szCs w:val="28"/>
+        </w:rPr>
+      </w:pPr>
+    </w:p>
+    <w:p>
+      <w:pPr>
+        <w:spacing w:line="360" w:lineRule="auto"/>
+        <w:jc w:val="both"/>
+        <w:rPr>
+          <w:sz w:val="28"/>
+          <w:szCs w:val="28"/>
+        </w:rPr>
+      </w:pPr>
+    </w:p>
+    <w:p>
+      <w:pPr>
+        <w:spacing w:line="360" w:lineRule="auto"/>
+        <w:jc w:val="both"/>
+        <w:rPr>
+          <w:sz w:val="28"/>
+          <w:szCs w:val="28"/>
+        </w:rPr>
+      </w:pPr>
+    </w:p>
+    <w:p>
+      <w:pPr>
+        <w:spacing w:line="360" w:lineRule="auto"/>
+        <w:jc w:val="both"/>
+        <w:rPr>
+          <w:sz w:val="28"/>
+          <w:szCs w:val="28"/>
+        </w:rPr>
+      </w:pPr>
+    </w:p>
+    <w:p>
+      <w:pPr>
+        <w:spacing w:line="360" w:lineRule="auto"/>
+        <w:jc w:val="both"/>
+        <w:rPr>
+          <w:sz w:val="28"/>
+          <w:szCs w:val="28"/>
+        </w:rPr>
+      </w:pPr>
+    </w:p>
+    <w:p>
+      <w:pPr>
+        <w:spacing w:line="360" w:lineRule="auto"/>
+        <w:jc w:val="both"/>
+        <w:rPr>
+          <w:sz w:val="28"/>
+          <w:szCs w:val="28"/>
+        </w:rPr>
+      </w:pPr>
+    </w:p>
+    <w:p>
+      <w:pPr>
+        <w:spacing w:line="360" w:lineRule="auto"/>
+        <w:jc w:val="both"/>
+        <w:rPr>
+          <w:sz w:val="28"/>
+          <w:szCs w:val="28"/>
+        </w:rPr>
+      </w:pPr>
+    </w:p>
+    <w:p>
+      <w:pPr>
+        <w:spacing w:line="360" w:lineRule="auto"/>
+        <w:jc w:val="both"/>
+        <w:rPr>
+          <w:sz w:val="28"/>
+          <w:szCs w:val="28"/>
+        </w:rPr>
+      </w:pPr>
+    </w:p>
+    <w:p>
+      <w:pPr>
+        <w:spacing w:line="360" w:lineRule="auto"/>
+        <w:jc w:val="both"/>
+        <w:rPr>
+          <w:sz w:val="28"/>
+          <w:szCs w:val="28"/>
+        </w:rPr>
+      </w:pPr>
+    </w:p>
+    <w:p>
+      <w:pPr>
+        <w:spacing w:line="360" w:lineRule="auto"/>
+        <w:jc w:val="both"/>
+        <w:rPr>
+          <w:sz w:val="28"/>
+          <w:szCs w:val="28"/>
+        </w:rPr>
+      </w:pPr>
+    </w:p>
+    <w:p>
+      <w:pPr>
+        <w:spacing w:line="360" w:lineRule="auto"/>
+        <w:jc w:val="both"/>
+        <w:rPr>
+          <w:sz w:val="28"/>
+          <w:szCs w:val="28"/>
+        </w:rPr>
+      </w:pPr>
     </w:p>
     <w:p>
       <w:pPr>
@@ -5596,7 +6092,23 @@
           <w:sz w:val="28"/>
           <w:szCs w:val="28"/>
         </w:rPr>
-        <w:t>С помощью функции единичного скачка (функции Хевисайда) эмпирическую функцию распределения можно записать в виде [4]:</w:t>
+        <w:t xml:space="preserve">С помощью функции единичного скачка (функции </w:t>
+      </w:r>
+      <w:proofErr w:type="spellStart"/>
+      <w:r>
+        <w:rPr>
+          <w:sz w:val="28"/>
+          <w:szCs w:val="28"/>
+        </w:rPr>
+        <w:t>Хевисайда</w:t>
+      </w:r>
+      <w:proofErr w:type="spellEnd"/>
+      <w:r>
+        <w:rPr>
+          <w:sz w:val="28"/>
+          <w:szCs w:val="28"/>
+        </w:rPr>
+        <w:t>) эмпирическую функцию распределения можно записать в виде [4]:</w:t>
       </w:r>
     </w:p>
     <w:p>
@@ -5786,7 +6298,23 @@
           <w:sz w:val="28"/>
           <w:szCs w:val="28"/>
         </w:rPr>
-        <w:t>где функция Хевисайда e(x) определяется следующим образом:</w:t>
+        <w:t xml:space="preserve">где функция </w:t>
+      </w:r>
+      <w:proofErr w:type="spellStart"/>
+      <w:r>
+        <w:rPr>
+          <w:sz w:val="28"/>
+          <w:szCs w:val="28"/>
+        </w:rPr>
+        <w:t>Хевисайда</w:t>
+      </w:r>
+      <w:proofErr w:type="spellEnd"/>
+      <w:r>
+        <w:rPr>
+          <w:sz w:val="28"/>
+          <w:szCs w:val="28"/>
+        </w:rPr>
+        <w:t xml:space="preserve"> e(x) определяется следующим образом:</w:t>
       </w:r>
     </w:p>
     <w:p>
@@ -6523,7 +7051,21 @@
           <w:sz w:val="28"/>
           <w:szCs w:val="28"/>
         </w:rPr>
-        <w:t xml:space="preserve">порядочить элементы выборки по возрастанию, получив вариационный ряд </w:t>
+        <w:t xml:space="preserve">порядочить элементы выборки по возрастанию, получив </w:t>
+      </w:r>
+      <w:r>
+        <w:rPr>
+          <w:sz w:val="28"/>
+          <w:szCs w:val="28"/>
+        </w:rPr>
+        <w:t xml:space="preserve">вариационный </w:t>
+      </w:r>
+      <w:r>
+        <w:rPr>
+          <w:sz w:val="28"/>
+          <w:szCs w:val="28"/>
+        </w:rPr>
+        <w:t xml:space="preserve">ряд </w:t>
       </w:r>
       <m:oMath>
         <m:r>
@@ -6788,13 +7330,48 @@
                   </m:r>
                 </m:e>
                 <m:e>
+                  <m:f>
+                    <m:fPr>
+                      <m:ctrlPr>
+                        <w:rPr>
+                          <w:rFonts w:ascii="Cambria Math" w:hAnsi="Cambria Math"/>
+                          <w:i/>
+                          <w:sz w:val="28"/>
+                          <w:szCs w:val="28"/>
+                          <w:lang w:val="en-US"/>
+                        </w:rPr>
+                      </m:ctrlPr>
+                    </m:fPr>
+                    <m:num>
+                      <m:r>
+                        <w:rPr>
+                          <w:rFonts w:ascii="Cambria Math" w:hAnsi="Cambria Math"/>
+                          <w:sz w:val="28"/>
+                          <w:szCs w:val="28"/>
+                          <w:lang w:val="en-US"/>
+                        </w:rPr>
+                        <m:t>k</m:t>
+                      </m:r>
+                    </m:num>
+                    <m:den>
+                      <m:r>
+                        <w:rPr>
+                          <w:rFonts w:ascii="Cambria Math" w:hAnsi="Cambria Math"/>
+                          <w:sz w:val="28"/>
+                          <w:szCs w:val="28"/>
+                          <w:lang w:val="en-US"/>
+                        </w:rPr>
+                        <m:t>n</m:t>
+                      </m:r>
+                    </m:den>
+                  </m:f>
                   <m:r>
                     <w:rPr>
                       <w:rFonts w:ascii="Cambria Math" w:hAnsi="Cambria Math"/>
                       <w:sz w:val="28"/>
                       <w:szCs w:val="28"/>
                     </w:rPr>
-                    <m:t>k∕n,   x(k) &lt; x ≤ x(k+1),  k = 1,…,n-1</m:t>
+                    <m:t>,   x(k) &lt; x ≤ x(k+1),  k = 1,…,n-1</m:t>
                   </m:r>
                 </m:e>
                 <m:e>
@@ -7015,7 +7592,23 @@
           <w:szCs w:val="28"/>
         </w:rPr>
         <w:lastRenderedPageBreak/>
-        <w:t xml:space="preserve">Для анализа поведения ЭФР были сформированы три случайные подвыборки размером 10, 100 и 200 элементов из исходной выборки </w:t>
+        <w:t xml:space="preserve">Для анализа поведения ЭФР были сформированы три случайные </w:t>
+      </w:r>
+      <w:proofErr w:type="spellStart"/>
+      <w:r>
+        <w:rPr>
+          <w:sz w:val="28"/>
+          <w:szCs w:val="28"/>
+        </w:rPr>
+        <w:t>подвыборки</w:t>
+      </w:r>
+      <w:proofErr w:type="spellEnd"/>
+      <w:r>
+        <w:rPr>
+          <w:sz w:val="28"/>
+          <w:szCs w:val="28"/>
+        </w:rPr>
+        <w:t xml:space="preserve"> размером 10, 100 и 200 элементов из исходной выборки </w:t>
       </w:r>
       <m:oMath>
         <m:r>
@@ -7118,7 +7711,23 @@
           <w:sz w:val="28"/>
           <w:szCs w:val="28"/>
         </w:rPr>
-        <w:t xml:space="preserve">Рисунок 1. График эмпирической функции распределения для подвыборки из 10 элементов. </w:t>
+        <w:t xml:space="preserve">Рисунок 1. График эмпирической функции распределения для </w:t>
+      </w:r>
+      <w:proofErr w:type="spellStart"/>
+      <w:r>
+        <w:rPr>
+          <w:sz w:val="28"/>
+          <w:szCs w:val="28"/>
+        </w:rPr>
+        <w:t>подвыборки</w:t>
+      </w:r>
+      <w:proofErr w:type="spellEnd"/>
+      <w:r>
+        <w:rPr>
+          <w:sz w:val="28"/>
+          <w:szCs w:val="28"/>
+        </w:rPr>
+        <w:t xml:space="preserve"> из 10 элементов. </w:t>
       </w:r>
     </w:p>
     <w:p>
@@ -7188,7 +7797,23 @@
           <w:sz w:val="28"/>
           <w:szCs w:val="28"/>
         </w:rPr>
-        <w:t xml:space="preserve">Рисунок 2. График эмпирической функции распределения для подвыборки из 100 элементов. </w:t>
+        <w:t xml:space="preserve">Рисунок 2. График эмпирической функции распределения для </w:t>
+      </w:r>
+      <w:proofErr w:type="spellStart"/>
+      <w:r>
+        <w:rPr>
+          <w:sz w:val="28"/>
+          <w:szCs w:val="28"/>
+        </w:rPr>
+        <w:t>подвыборки</w:t>
+      </w:r>
+      <w:proofErr w:type="spellEnd"/>
+      <w:r>
+        <w:rPr>
+          <w:sz w:val="28"/>
+          <w:szCs w:val="28"/>
+        </w:rPr>
+        <w:t xml:space="preserve"> из 100 элементов. </w:t>
       </w:r>
     </w:p>
     <w:p>
@@ -7268,7 +7893,23 @@
           <w:sz w:val="28"/>
           <w:szCs w:val="28"/>
         </w:rPr>
-        <w:t>Рисунок 3. График эмпирической функции распределения для подвыборки из 200 элементов.</w:t>
+        <w:t xml:space="preserve">Рисунок 3. График эмпирической функции распределения для </w:t>
+      </w:r>
+      <w:proofErr w:type="spellStart"/>
+      <w:r>
+        <w:rPr>
+          <w:sz w:val="28"/>
+          <w:szCs w:val="28"/>
+        </w:rPr>
+        <w:t>подвыборки</w:t>
+      </w:r>
+      <w:proofErr w:type="spellEnd"/>
+      <w:r>
+        <w:rPr>
+          <w:sz w:val="28"/>
+          <w:szCs w:val="28"/>
+        </w:rPr>
+        <w:t xml:space="preserve"> из 200 элементов.</w:t>
       </w:r>
     </w:p>
     <w:p>
@@ -7319,7 +7960,23 @@
           <w:sz w:val="28"/>
           <w:szCs w:val="28"/>
         </w:rPr>
-        <w:t xml:space="preserve">. При увеличении объёма подвыборки эмпирическая функция распределения заметно приближается к теоретической. При </w:t>
+        <w:t xml:space="preserve">. При увеличении объёма </w:t>
+      </w:r>
+      <w:proofErr w:type="spellStart"/>
+      <w:r>
+        <w:rPr>
+          <w:sz w:val="28"/>
+          <w:szCs w:val="28"/>
+        </w:rPr>
+        <w:t>подвыборки</w:t>
+      </w:r>
+      <w:proofErr w:type="spellEnd"/>
+      <w:r>
+        <w:rPr>
+          <w:sz w:val="28"/>
+          <w:szCs w:val="28"/>
+        </w:rPr>
+        <w:t xml:space="preserve"> эмпирическая функция распределения заметно приближается к теоретической. При </w:t>
       </w:r>
       <m:oMath>
         <m:r>
@@ -9367,7 +10024,23 @@
           <w:sz w:val="28"/>
           <w:szCs w:val="28"/>
         </w:rPr>
-        <w:t>Результаты работы функции для случайных подвыборок размером 10, 100 и 200 элементов — на рисунках </w:t>
+        <w:t xml:space="preserve">Результаты работы функции для случайных </w:t>
+      </w:r>
+      <w:proofErr w:type="spellStart"/>
+      <w:r>
+        <w:rPr>
+          <w:sz w:val="28"/>
+          <w:szCs w:val="28"/>
+        </w:rPr>
+        <w:t>подвыборок</w:t>
+      </w:r>
+      <w:proofErr w:type="spellEnd"/>
+      <w:r>
+        <w:rPr>
+          <w:sz w:val="28"/>
+          <w:szCs w:val="28"/>
+        </w:rPr>
+        <w:t xml:space="preserve"> размером 10, 100 и 200 элементов — на рисунках </w:t>
       </w:r>
       <w:r>
         <w:rPr>
@@ -9511,7 +10184,27 @@
           <w:sz w:val="28"/>
           <w:szCs w:val="28"/>
         </w:rPr>
-        <w:t>Вид гистограмм для случайных подвыборок размера 10, 100, 200</w:t>
+        <w:t xml:space="preserve">Вид гистограмм для случайных </w:t>
+      </w:r>
+      <w:proofErr w:type="spellStart"/>
+      <w:r>
+        <w:rPr>
+          <w:b/>
+          <w:bCs/>
+          <w:sz w:val="28"/>
+          <w:szCs w:val="28"/>
+        </w:rPr>
+        <w:t>подвыборок</w:t>
+      </w:r>
+      <w:proofErr w:type="spellEnd"/>
+      <w:r>
+        <w:rPr>
+          <w:b/>
+          <w:bCs/>
+          <w:sz w:val="28"/>
+          <w:szCs w:val="28"/>
+        </w:rPr>
+        <w:t xml:space="preserve"> размера 10, 100, 200</w:t>
       </w:r>
     </w:p>
     <w:p>
@@ -9608,7 +10301,23 @@
           <w:sz w:val="28"/>
           <w:szCs w:val="28"/>
         </w:rPr>
-        <w:t> – Гистограмма для подвыборки из 10 элементов</w:t>
+        <w:t xml:space="preserve"> – Гистограмма для </w:t>
+      </w:r>
+      <w:proofErr w:type="spellStart"/>
+      <w:r>
+        <w:rPr>
+          <w:sz w:val="28"/>
+          <w:szCs w:val="28"/>
+        </w:rPr>
+        <w:t>подвыборки</w:t>
+      </w:r>
+      <w:proofErr w:type="spellEnd"/>
+      <w:r>
+        <w:rPr>
+          <w:sz w:val="28"/>
+          <w:szCs w:val="28"/>
+        </w:rPr>
+        <w:t xml:space="preserve"> из 10 элементов</w:t>
       </w:r>
     </w:p>
     <w:p>
@@ -9702,7 +10411,23 @@
           <w:sz w:val="28"/>
           <w:szCs w:val="28"/>
         </w:rPr>
-        <w:t> – Гистограмма для подвыборки из 100 элементов</w:t>
+        <w:t xml:space="preserve"> – Гистограмма для </w:t>
+      </w:r>
+      <w:proofErr w:type="spellStart"/>
+      <w:r>
+        <w:rPr>
+          <w:sz w:val="28"/>
+          <w:szCs w:val="28"/>
+        </w:rPr>
+        <w:t>подвыборки</w:t>
+      </w:r>
+      <w:proofErr w:type="spellEnd"/>
+      <w:r>
+        <w:rPr>
+          <w:sz w:val="28"/>
+          <w:szCs w:val="28"/>
+        </w:rPr>
+        <w:t xml:space="preserve"> из 100 элементов</w:t>
       </w:r>
     </w:p>
     <w:p>
@@ -9806,7 +10531,23 @@
           <w:sz w:val="28"/>
           <w:szCs w:val="28"/>
         </w:rPr>
-        <w:t> – Гистограмма для подвыборки из 200 элементов.</w:t>
+        <w:t xml:space="preserve"> – Гистограмма для </w:t>
+      </w:r>
+      <w:proofErr w:type="spellStart"/>
+      <w:r>
+        <w:rPr>
+          <w:sz w:val="28"/>
+          <w:szCs w:val="28"/>
+        </w:rPr>
+        <w:t>подвыборки</w:t>
+      </w:r>
+      <w:proofErr w:type="spellEnd"/>
+      <w:r>
+        <w:rPr>
+          <w:sz w:val="28"/>
+          <w:szCs w:val="28"/>
+        </w:rPr>
+        <w:t xml:space="preserve"> из 200 элементов.</w:t>
       </w:r>
     </w:p>
     <w:p>
@@ -9873,6 +10614,7 @@
           <w:szCs w:val="28"/>
         </w:rPr>
       </w:pPr>
+      <w:proofErr w:type="spellStart"/>
       <w:r>
         <w:rPr>
           <w:b/>
@@ -9880,8 +10622,9 @@
           <w:sz w:val="28"/>
           <w:szCs w:val="28"/>
         </w:rPr>
-        <w:t>Подвыборка из 200 элементов (рисунок </w:t>
-      </w:r>
+        <w:t>Подвыборка</w:t>
+      </w:r>
+      <w:proofErr w:type="spellEnd"/>
       <w:r>
         <w:rPr>
           <w:b/>
@@ -9889,7 +10632,7 @@
           <w:sz w:val="28"/>
           <w:szCs w:val="28"/>
         </w:rPr>
-        <w:t>7</w:t>
+        <w:t xml:space="preserve"> из 200 элементов (рисунок </w:t>
       </w:r>
       <w:r>
         <w:rPr>
@@ -9898,26 +10641,8 @@
           <w:sz w:val="28"/>
           <w:szCs w:val="28"/>
         </w:rPr>
-        <w:t>)</w:t>
-      </w:r>
-      <w:r>
-        <w:rPr>
-          <w:sz w:val="28"/>
-          <w:szCs w:val="28"/>
-        </w:rPr>
-        <w:t>. Форма гистограммы близка к полной выборке, а также пики различимы. Это свидетельствует о достаточной репрезентативности выборки объёмом 200 элементов для визуальной идентификации типа распределения.</w:t>
-      </w:r>
-    </w:p>
-    <w:p>
-      <w:pPr>
-        <w:spacing w:line="360" w:lineRule="auto"/>
-        <w:ind w:firstLine="720"/>
-        <w:jc w:val="both"/>
-        <w:rPr>
-          <w:sz w:val="28"/>
-          <w:szCs w:val="28"/>
-        </w:rPr>
-      </w:pPr>
+        <w:t>7</w:t>
+      </w:r>
       <w:r>
         <w:rPr>
           <w:b/>
@@ -9925,7 +10650,45 @@
           <w:sz w:val="28"/>
           <w:szCs w:val="28"/>
         </w:rPr>
-        <w:t>Подвыборка из 100 элементов (рисунок </w:t>
+        <w:t>)</w:t>
+      </w:r>
+      <w:r>
+        <w:rPr>
+          <w:sz w:val="28"/>
+          <w:szCs w:val="28"/>
+        </w:rPr>
+        <w:t>. Форма гистограммы близка к полной выборке, а также пики различимы. Это свидетельствует о достаточной репрезентативности выборки объёмом 200 элементов для визуальной идентификации типа распределения.</w:t>
+      </w:r>
+    </w:p>
+    <w:p>
+      <w:pPr>
+        <w:spacing w:line="360" w:lineRule="auto"/>
+        <w:ind w:firstLine="720"/>
+        <w:jc w:val="both"/>
+        <w:rPr>
+          <w:sz w:val="28"/>
+          <w:szCs w:val="28"/>
+        </w:rPr>
+      </w:pPr>
+      <w:proofErr w:type="spellStart"/>
+      <w:r>
+        <w:rPr>
+          <w:b/>
+          <w:bCs/>
+          <w:sz w:val="28"/>
+          <w:szCs w:val="28"/>
+        </w:rPr>
+        <w:t>Подвыборка</w:t>
+      </w:r>
+      <w:proofErr w:type="spellEnd"/>
+      <w:r>
+        <w:rPr>
+          <w:b/>
+          <w:bCs/>
+          <w:sz w:val="28"/>
+          <w:szCs w:val="28"/>
+        </w:rPr>
+        <w:t xml:space="preserve"> из 100 элементов (рисунок </w:t>
       </w:r>
       <w:r>
         <w:rPr>
@@ -9980,6 +10743,7 @@
           <w:szCs w:val="28"/>
         </w:rPr>
       </w:pPr>
+      <w:proofErr w:type="spellStart"/>
       <w:r>
         <w:rPr>
           <w:b/>
@@ -9987,7 +10751,17 @@
           <w:sz w:val="28"/>
           <w:szCs w:val="28"/>
         </w:rPr>
-        <w:t>Подвыборка из 10 элементов (рисунок </w:t>
+        <w:t>Подвыборка</w:t>
+      </w:r>
+      <w:proofErr w:type="spellEnd"/>
+      <w:r>
+        <w:rPr>
+          <w:b/>
+          <w:bCs/>
+          <w:sz w:val="28"/>
+          <w:szCs w:val="28"/>
+        </w:rPr>
+        <w:t xml:space="preserve"> из 10 элементов (рисунок </w:t>
       </w:r>
       <w:r>
         <w:rPr>
@@ -13622,7 +14396,135 @@
           <w:sz w:val="28"/>
           <w:szCs w:val="28"/>
         </w:rPr>
-        <w:t xml:space="preserve">Аналитически решить систему </w:t>
+        <w:t>Аналитически решить систему</w:t>
+      </w:r>
+    </w:p>
+    <w:p>
+      <w:pPr>
+        <w:pStyle w:val="a7"/>
+        <w:spacing w:before="100" w:beforeAutospacing="1" w:after="100" w:afterAutospacing="1" w:line="360" w:lineRule="auto"/>
+        <w:ind w:left="782" w:firstLine="709"/>
+        <w:jc w:val="center"/>
+        <w:rPr>
+          <w:sz w:val="28"/>
+          <w:szCs w:val="28"/>
+        </w:rPr>
+      </w:pPr>
+      <m:oMathPara>
+        <m:oMath>
+          <m:r>
+            <w:rPr>
+              <w:rFonts w:ascii="Cambria Math" w:hAnsi="Cambria Math"/>
+              <w:sz w:val="28"/>
+              <w:szCs w:val="28"/>
+            </w:rPr>
+            <m:t>∂lnL</m:t>
+          </m:r>
+          <m:r>
+            <m:rPr>
+              <m:lit/>
+            </m:rPr>
+            <w:rPr>
+              <w:rFonts w:ascii="Cambria Math" w:hAnsi="Cambria Math"/>
+              <w:sz w:val="28"/>
+              <w:szCs w:val="28"/>
+            </w:rPr>
+            <m:t>/</m:t>
+          </m:r>
+          <m:r>
+            <w:rPr>
+              <w:rFonts w:ascii="Cambria Math" w:hAnsi="Cambria Math"/>
+              <w:sz w:val="28"/>
+              <w:szCs w:val="28"/>
+            </w:rPr>
+            <m:t>∂α = 0,</m:t>
+          </m:r>
+        </m:oMath>
+      </m:oMathPara>
+    </w:p>
+    <w:p>
+      <w:pPr>
+        <w:pStyle w:val="a7"/>
+        <w:spacing w:before="100" w:beforeAutospacing="1" w:after="100" w:afterAutospacing="1" w:line="360" w:lineRule="auto"/>
+        <w:ind w:left="782" w:firstLine="709"/>
+        <w:jc w:val="both"/>
+        <w:rPr>
+          <w:sz w:val="28"/>
+          <w:szCs w:val="28"/>
+        </w:rPr>
+      </w:pPr>
+      <m:oMathPara>
+        <m:oMath>
+          <m:r>
+            <w:rPr>
+              <w:rFonts w:ascii="Cambria Math" w:hAnsi="Cambria Math"/>
+              <w:sz w:val="28"/>
+              <w:szCs w:val="28"/>
+            </w:rPr>
+            <m:t xml:space="preserve"> ∂lnL/∂loc = 0</m:t>
+          </m:r>
+        </m:oMath>
+      </m:oMathPara>
+    </w:p>
+    <w:p>
+      <w:pPr>
+        <w:pStyle w:val="a7"/>
+        <w:spacing w:before="100" w:beforeAutospacing="1" w:after="100" w:afterAutospacing="1" w:line="360" w:lineRule="auto"/>
+        <w:ind w:left="782"/>
+        <w:jc w:val="both"/>
+        <w:rPr>
+          <w:sz w:val="28"/>
+          <w:szCs w:val="28"/>
+        </w:rPr>
+      </w:pPr>
+      <w:r>
+        <w:rPr>
+          <w:sz w:val="28"/>
+          <w:szCs w:val="28"/>
+        </w:rPr>
+        <w:t xml:space="preserve"> не удаётся</w:t>
+      </w:r>
+      <w:r>
+        <w:rPr>
+          <w:sz w:val="28"/>
+          <w:szCs w:val="28"/>
+        </w:rPr>
+        <w:t xml:space="preserve">. </w:t>
+      </w:r>
+      <w:r>
+        <w:rPr>
+          <w:sz w:val="28"/>
+          <w:szCs w:val="28"/>
+        </w:rPr>
+        <w:t>Для выборки нашего распределения функция логарифмического правдоподобия максимизировалась численно</w:t>
+      </w:r>
+      <w:r>
+        <w:rPr>
+          <w:sz w:val="28"/>
+          <w:szCs w:val="28"/>
+        </w:rPr>
+        <w:t xml:space="preserve"> </w:t>
+      </w:r>
+      <w:r>
+        <w:rPr>
+          <w:sz w:val="28"/>
+          <w:szCs w:val="28"/>
+        </w:rPr>
+        <w:t>[</w:t>
+      </w:r>
+      <w:r>
+        <w:rPr>
+          <w:sz w:val="28"/>
+          <w:szCs w:val="28"/>
+        </w:rPr>
+        <w:t>Листинг 13</w:t>
+      </w:r>
+      <w:r>
+        <w:rPr>
+          <w:sz w:val="28"/>
+          <w:szCs w:val="28"/>
+        </w:rPr>
+        <w:t xml:space="preserve">-15]. Нужно было найти такие </w:t>
       </w:r>
       <m:oMath>
         <m:r>
@@ -13631,7 +14533,7 @@
             <w:sz w:val="28"/>
             <w:szCs w:val="28"/>
           </w:rPr>
-          <m:t>∂lnL/∂α = 0, ∂lnL/∂loc = 0</m:t>
+          <m:t>α</m:t>
         </m:r>
       </m:oMath>
       <w:r>
@@ -13639,24 +14541,7 @@
           <w:sz w:val="28"/>
           <w:szCs w:val="28"/>
         </w:rPr>
-        <w:t xml:space="preserve"> не удаётся (в уравнение для α входит дигамма-функция, а знак </w:t>
-      </w:r>
-      <m:oMath>
-        <m:r>
-          <w:rPr>
-            <w:rFonts w:ascii="Cambria Math" w:hAnsi="Cambria Math"/>
-            <w:sz w:val="28"/>
-            <w:szCs w:val="28"/>
-          </w:rPr>
-          <m:t>|xᵢ-loc|</m:t>
-        </m:r>
-      </m:oMath>
-      <w:r>
-        <w:rPr>
-          <w:sz w:val="28"/>
-          <w:szCs w:val="28"/>
-        </w:rPr>
-        <w:t xml:space="preserve"> зависит от </w:t>
+        <w:t xml:space="preserve"> и </w:t>
       </w:r>
       <m:oMath>
         <m:r>
@@ -13673,21 +14558,24 @@
           <w:sz w:val="28"/>
           <w:szCs w:val="28"/>
         </w:rPr>
-        <w:t>)</w:t>
-      </w:r>
-      <w:r>
-        <w:rPr>
-          <w:sz w:val="28"/>
-          <w:szCs w:val="28"/>
-        </w:rPr>
-        <w:t xml:space="preserve">. </w:t>
-      </w:r>
-      <w:r>
-        <w:rPr>
-          <w:sz w:val="28"/>
-          <w:szCs w:val="28"/>
-        </w:rPr>
-        <w:t>Для выборки нашего распределения функция логарифмического правдоподобия максимизировалась численно</w:t>
+        <w:t xml:space="preserve">, чтобы </w:t>
+      </w:r>
+      <m:oMath>
+        <m:r>
+          <w:rPr>
+            <w:rFonts w:ascii="Cambria Math" w:hAnsi="Cambria Math"/>
+            <w:sz w:val="28"/>
+            <w:szCs w:val="28"/>
+          </w:rPr>
+          <m:t>lnL</m:t>
+        </m:r>
+      </m:oMath>
+      <w:r>
+        <w:rPr>
+          <w:sz w:val="28"/>
+          <w:szCs w:val="28"/>
+        </w:rPr>
+        <w:t xml:space="preserve"> был максимален.</w:t>
       </w:r>
       <w:r>
         <w:rPr>
@@ -13696,26 +14584,24 @@
         </w:rPr>
         <w:t xml:space="preserve"> </w:t>
       </w:r>
-      <w:r>
-        <w:rPr>
-          <w:sz w:val="28"/>
-          <w:szCs w:val="28"/>
-        </w:rPr>
-        <w:t>[</w:t>
-      </w:r>
-      <w:r>
-        <w:rPr>
-          <w:sz w:val="28"/>
-          <w:szCs w:val="28"/>
-        </w:rPr>
-        <w:t>Листинг 13</w:t>
-      </w:r>
-      <w:r>
-        <w:rPr>
-          <w:sz w:val="28"/>
-          <w:szCs w:val="28"/>
-        </w:rPr>
-        <w:t xml:space="preserve">-15]. Нужно было найти такие </w:t>
+    </w:p>
+    <w:p>
+      <w:pPr>
+        <w:pStyle w:val="a7"/>
+        <w:spacing w:before="100" w:beforeAutospacing="1" w:after="100" w:afterAutospacing="1" w:line="360" w:lineRule="auto"/>
+        <w:ind w:left="782" w:firstLine="709"/>
+        <w:jc w:val="both"/>
+        <w:rPr>
+          <w:sz w:val="28"/>
+          <w:szCs w:val="28"/>
+        </w:rPr>
+      </w:pPr>
+      <w:r>
+        <w:rPr>
+          <w:sz w:val="28"/>
+          <w:szCs w:val="28"/>
+        </w:rPr>
+        <w:t xml:space="preserve">На первом этапе строилась равномерная сетка значений </w:t>
       </w:r>
       <m:oMath>
         <m:r>
@@ -13749,7 +14635,24 @@
           <w:sz w:val="28"/>
           <w:szCs w:val="28"/>
         </w:rPr>
-        <w:t xml:space="preserve">, чтобы </w:t>
+        <w:t xml:space="preserve"> в широком диапазоне (в качестве центра диапазона использовались оценки, полученные методом моментов), и для каждой пары </w:t>
+      </w:r>
+      <m:oMath>
+        <m:r>
+          <w:rPr>
+            <w:rFonts w:ascii="Cambria Math" w:hAnsi="Cambria Math"/>
+            <w:sz w:val="28"/>
+            <w:szCs w:val="28"/>
+          </w:rPr>
+          <m:t>(α, loc)</m:t>
+        </m:r>
+      </m:oMath>
+      <w:r>
+        <w:rPr>
+          <w:sz w:val="28"/>
+          <w:szCs w:val="28"/>
+        </w:rPr>
+        <w:t xml:space="preserve"> вычислялось значение </w:t>
       </w:r>
       <m:oMath>
         <m:r>
@@ -13766,84 +14669,7 @@
           <w:sz w:val="28"/>
           <w:szCs w:val="28"/>
         </w:rPr>
-        <w:t xml:space="preserve"> был максимален.</w:t>
-      </w:r>
-      <w:r>
-        <w:rPr>
-          <w:sz w:val="28"/>
-          <w:szCs w:val="28"/>
-        </w:rPr>
-        <w:t xml:space="preserve"> </w:t>
-      </w:r>
-    </w:p>
-    <w:p>
-      <w:pPr>
-        <w:pStyle w:val="a7"/>
-        <w:spacing w:before="100" w:beforeAutospacing="1" w:after="100" w:afterAutospacing="1" w:line="360" w:lineRule="auto"/>
-        <w:ind w:left="782" w:firstLine="709"/>
-        <w:jc w:val="both"/>
-        <w:rPr>
-          <w:sz w:val="28"/>
-          <w:szCs w:val="28"/>
-        </w:rPr>
-      </w:pPr>
-      <w:r>
-        <w:rPr>
-          <w:sz w:val="28"/>
-          <w:szCs w:val="28"/>
-        </w:rPr>
-        <w:t xml:space="preserve">На первом этапе строилась равномерная сетка значений </w:t>
-      </w:r>
-      <m:oMath>
-        <m:r>
-          <w:rPr>
-            <w:rFonts w:ascii="Cambria Math" w:hAnsi="Cambria Math"/>
-            <w:sz w:val="28"/>
-            <w:szCs w:val="28"/>
-          </w:rPr>
-          <m:t>α</m:t>
-        </m:r>
-      </m:oMath>
-      <w:r>
-        <w:rPr>
-          <w:sz w:val="28"/>
-          <w:szCs w:val="28"/>
-        </w:rPr>
-        <w:t xml:space="preserve"> и </w:t>
-      </w:r>
-      <m:oMath>
-        <m:r>
-          <w:rPr>
-            <w:rFonts w:ascii="Cambria Math" w:hAnsi="Cambria Math"/>
-            <w:sz w:val="28"/>
-            <w:szCs w:val="28"/>
-          </w:rPr>
-          <m:t>loc</m:t>
-        </m:r>
-      </m:oMath>
-      <w:r>
-        <w:rPr>
-          <w:sz w:val="28"/>
-          <w:szCs w:val="28"/>
-        </w:rPr>
-        <w:t xml:space="preserve"> в широком диапазоне (в качестве центра диапазона использовались оценки, полученные методом моментов), и для каждой пары </w:t>
-      </w:r>
-      <m:oMath>
-        <m:r>
-          <w:rPr>
-            <w:rFonts w:ascii="Cambria Math" w:hAnsi="Cambria Math"/>
-            <w:sz w:val="28"/>
-            <w:szCs w:val="28"/>
-          </w:rPr>
-          <m:t>(α, loc)</m:t>
-        </m:r>
-      </m:oMath>
-      <w:r>
-        <w:rPr>
-          <w:sz w:val="28"/>
-          <w:szCs w:val="28"/>
-        </w:rPr>
-        <w:t xml:space="preserve"> вычислялось значение </w:t>
+        <w:t xml:space="preserve">. Пара, дающая наибольшее значение </w:t>
       </w:r>
       <m:oMath>
         <m:r>
@@ -13860,7 +14686,26 @@
           <w:sz w:val="28"/>
           <w:szCs w:val="28"/>
         </w:rPr>
-        <w:t xml:space="preserve">. Пара, дающая наибольшее значение </w:t>
+        <w:t>, принималась за грубое приближение максимума.</w:t>
+      </w:r>
+    </w:p>
+    <w:p>
+      <w:pPr>
+        <w:pStyle w:val="a7"/>
+        <w:spacing w:line="360" w:lineRule="auto"/>
+        <w:ind w:left="782" w:firstLine="709"/>
+        <w:jc w:val="both"/>
+        <w:rPr>
+          <w:sz w:val="28"/>
+          <w:szCs w:val="28"/>
+        </w:rPr>
+      </w:pPr>
+      <w:r>
+        <w:rPr>
+          <w:sz w:val="28"/>
+          <w:szCs w:val="28"/>
+        </w:rPr>
+        <w:t xml:space="preserve">На втором этапе строилась новая, более мелкая сетка — уже в узком диапазоне вокруг найденной на первом этапе точки, — и поиск максимума </w:t>
       </w:r>
       <m:oMath>
         <m:r>
@@ -13877,42 +14722,6 @@
           <w:sz w:val="28"/>
           <w:szCs w:val="28"/>
         </w:rPr>
-        <w:t>, принималась за грубое приближение максимума.</w:t>
-      </w:r>
-    </w:p>
-    <w:p>
-      <w:pPr>
-        <w:pStyle w:val="a7"/>
-        <w:spacing w:line="360" w:lineRule="auto"/>
-        <w:ind w:left="782" w:firstLine="709"/>
-        <w:jc w:val="both"/>
-        <w:rPr>
-          <w:sz w:val="28"/>
-          <w:szCs w:val="28"/>
-        </w:rPr>
-      </w:pPr>
-      <w:r>
-        <w:rPr>
-          <w:sz w:val="28"/>
-          <w:szCs w:val="28"/>
-        </w:rPr>
-        <w:t xml:space="preserve">На втором этапе строилась новая, более мелкая сетка — уже в узком диапазоне вокруг найденной на первом этапе точки, — и поиск максимума </w:t>
-      </w:r>
-      <m:oMath>
-        <m:r>
-          <w:rPr>
-            <w:rFonts w:ascii="Cambria Math" w:hAnsi="Cambria Math"/>
-            <w:sz w:val="28"/>
-            <w:szCs w:val="28"/>
-          </w:rPr>
-          <m:t>lnL</m:t>
-        </m:r>
-      </m:oMath>
-      <w:r>
-        <w:rPr>
-          <w:sz w:val="28"/>
-          <w:szCs w:val="28"/>
-        </w:rPr>
         <w:t xml:space="preserve"> повторялся на ней. Это позволило уточнить оценку без резкого увеличения числа вычислений.</w:t>
       </w:r>
       <w:r>
@@ -13952,7 +14761,6 @@
           <w:sz w:val="28"/>
           <w:szCs w:val="28"/>
         </w:rPr>
-        <w:lastRenderedPageBreak/>
         <w:drawing>
           <wp:inline distT="0" distB="0" distL="0" distR="0" wp14:anchorId="4A7CA3D8" wp14:editId="2AA66618">
             <wp:extent cx="4778154" cy="1767993"/>
@@ -14418,7 +15226,6 @@
           <w:sz w:val="28"/>
           <w:szCs w:val="28"/>
         </w:rPr>
-        <w:lastRenderedPageBreak/>
         <w:t>Свойства оценок</w:t>
       </w:r>
     </w:p>
@@ -14910,7 +15717,23 @@
           <w:sz w:val="28"/>
           <w:szCs w:val="28"/>
         </w:rPr>
-        <w:t>Для проверки несмещённости было сгенерировано 1000 выборок объём</w:t>
+        <w:t xml:space="preserve">Для проверки </w:t>
+      </w:r>
+      <w:proofErr w:type="spellStart"/>
+      <w:r>
+        <w:rPr>
+          <w:sz w:val="28"/>
+          <w:szCs w:val="28"/>
+        </w:rPr>
+        <w:t>несмещённости</w:t>
+      </w:r>
+      <w:proofErr w:type="spellEnd"/>
+      <w:r>
+        <w:rPr>
+          <w:sz w:val="28"/>
+          <w:szCs w:val="28"/>
+        </w:rPr>
+        <w:t xml:space="preserve"> было сгенерировано 1000 выборок объём</w:t>
       </w:r>
       <w:r>
         <w:rPr>
@@ -16176,6 +16999,7 @@
           <w:sz w:val="28"/>
           <w:szCs w:val="28"/>
         </w:rPr>
+        <w:lastRenderedPageBreak/>
         <w:t>Листинг 17. Подсчет сетки численных значений ТФР.</w:t>
       </w:r>
     </w:p>
@@ -16258,7 +17082,23 @@
           <w:sz w:val="28"/>
           <w:szCs w:val="28"/>
         </w:rPr>
-        <w:t>Листинг 18. Проверка несмещенности с помощью ММ.</w:t>
+        <w:t xml:space="preserve">Листинг 18. Проверка </w:t>
+      </w:r>
+      <w:proofErr w:type="spellStart"/>
+      <w:r>
+        <w:rPr>
+          <w:sz w:val="28"/>
+          <w:szCs w:val="28"/>
+        </w:rPr>
+        <w:t>несмещенности</w:t>
+      </w:r>
+      <w:proofErr w:type="spellEnd"/>
+      <w:r>
+        <w:rPr>
+          <w:sz w:val="28"/>
+          <w:szCs w:val="28"/>
+        </w:rPr>
+        <w:t xml:space="preserve"> с помощью ММ.</w:t>
       </w:r>
     </w:p>
     <w:p>
@@ -16331,7 +17171,23 @@
           <w:sz w:val="28"/>
           <w:szCs w:val="28"/>
         </w:rPr>
-        <w:t>Листинг 19. Проверка несмещенности с помощью ММП.</w:t>
+        <w:t xml:space="preserve">Листинг 19. Проверка </w:t>
+      </w:r>
+      <w:proofErr w:type="spellStart"/>
+      <w:r>
+        <w:rPr>
+          <w:sz w:val="28"/>
+          <w:szCs w:val="28"/>
+        </w:rPr>
+        <w:t>несмещенности</w:t>
+      </w:r>
+      <w:proofErr w:type="spellEnd"/>
+      <w:r>
+        <w:rPr>
+          <w:sz w:val="28"/>
+          <w:szCs w:val="28"/>
+        </w:rPr>
+        <w:t xml:space="preserve"> с помощью ММП.</w:t>
       </w:r>
     </w:p>
     <w:p>
@@ -16378,6 +17234,7 @@
           <w:sz w:val="28"/>
           <w:szCs w:val="28"/>
         </w:rPr>
+        <w:lastRenderedPageBreak/>
         <w:t>Для проверки свойства были высчитаны оценки параметров для различных объёмов выборки.</w:t>
       </w:r>
       <w:r>
@@ -16392,15 +17249,7 @@
           <w:sz w:val="28"/>
           <w:szCs w:val="28"/>
         </w:rPr>
-        <w:t xml:space="preserve">Выборки генерировались по 1000 раз и значения </w:t>
-      </w:r>
-      <w:r>
-        <w:rPr>
-          <w:sz w:val="28"/>
-          <w:szCs w:val="28"/>
-        </w:rPr>
-        <w:lastRenderedPageBreak/>
-        <w:t>усреднялись</w:t>
+        <w:t>Выборки генерировались по 1000 раз и значения усреднялись</w:t>
       </w:r>
       <w:r>
         <w:rPr>
@@ -17181,6 +18030,7 @@
           <w:noProof/>
           <w:lang w:val="en-US"/>
         </w:rPr>
+        <w:lastRenderedPageBreak/>
         <w:drawing>
           <wp:anchor distT="0" distB="0" distL="114300" distR="114300" simplePos="0" relativeHeight="251658240" behindDoc="1" locked="0" layoutInCell="1" allowOverlap="1" wp14:anchorId="6296F3AD" wp14:editId="6397D558">
             <wp:simplePos x="0" y="0"/>
@@ -17292,7 +18142,23 @@
           <w:sz w:val="28"/>
           <w:szCs w:val="28"/>
         </w:rPr>
-        <w:t>Эффективной называется оценка, дисперсия которой близка к минимально возможной. Согласно неравенству Рао-Крамера:</w:t>
+        <w:t xml:space="preserve">Эффективной называется оценка, дисперсия которой близка к минимально возможной. Согласно неравенству </w:t>
+      </w:r>
+      <w:proofErr w:type="spellStart"/>
+      <w:r>
+        <w:rPr>
+          <w:sz w:val="28"/>
+          <w:szCs w:val="28"/>
+        </w:rPr>
+        <w:t>Рао</w:t>
+      </w:r>
+      <w:proofErr w:type="spellEnd"/>
+      <w:r>
+        <w:rPr>
+          <w:sz w:val="28"/>
+          <w:szCs w:val="28"/>
+        </w:rPr>
+        <w:t>-Крамера:</w:t>
       </w:r>
     </w:p>
     <w:p>
@@ -17713,6 +18579,7 @@
               <w:sz w:val="28"/>
               <w:szCs w:val="28"/>
             </w:rPr>
+            <w:lastRenderedPageBreak/>
             <m:t xml:space="preserve">f(x; α, loc) = </m:t>
           </m:r>
           <m:f>
@@ -18168,7 +19035,6 @@
           <w:sz w:val="28"/>
           <w:szCs w:val="28"/>
         </w:rPr>
-        <w:lastRenderedPageBreak/>
         <w:tab/>
       </w:r>
     </w:p>
@@ -18285,7 +19151,23 @@
           <w:sz w:val="28"/>
           <w:szCs w:val="28"/>
         </w:rPr>
-        <w:t xml:space="preserve">Поскольку явной формулы для тригамма-функции </w:t>
+        <w:t xml:space="preserve">Поскольку явной формулы для </w:t>
+      </w:r>
+      <w:proofErr w:type="spellStart"/>
+      <w:r>
+        <w:rPr>
+          <w:sz w:val="28"/>
+          <w:szCs w:val="28"/>
+        </w:rPr>
+        <w:t>тригамма</w:t>
+      </w:r>
+      <w:proofErr w:type="spellEnd"/>
+      <w:r>
+        <w:rPr>
+          <w:sz w:val="28"/>
+          <w:szCs w:val="28"/>
+        </w:rPr>
+        <w:t xml:space="preserve">-функции </w:t>
       </w:r>
       <m:oMath>
         <m:r>
@@ -18389,6 +19271,7 @@
           <w:sz w:val="28"/>
           <w:szCs w:val="28"/>
         </w:rPr>
+        <w:lastRenderedPageBreak/>
         <w:t xml:space="preserve">Раскладывая </w:t>
       </w:r>
       <m:oMath>
@@ -19246,6 +20129,7 @@
           <w:sz w:val="28"/>
           <w:szCs w:val="28"/>
         </w:rPr>
+        <w:lastRenderedPageBreak/>
         <w:t xml:space="preserve">По результатам 1000 моделирований получены следующие значения дисперсий оценок параметра </w:t>
       </w:r>
       <m:oMath>
@@ -19595,12 +20479,21 @@
         </w:rPr>
         <w:t xml:space="preserve"> дисперсия оценки методом моментов почти в 11 раз превышает нижнюю границу, что говорит о низкой эффективности выборочного среднего как оценки этого параметра. Дисперсия оценки методом максимального правдоподобия, напротив, лишь незначительно превышает границу </w:t>
       </w:r>
-      <w:r>
-        <w:rPr>
-          <w:sz w:val="28"/>
-          <w:szCs w:val="28"/>
-        </w:rPr>
-        <w:t>Рао-Крамера</w:t>
+      <w:proofErr w:type="spellStart"/>
+      <w:r>
+        <w:rPr>
+          <w:sz w:val="28"/>
+          <w:szCs w:val="28"/>
+        </w:rPr>
+        <w:t>Рао</w:t>
+      </w:r>
+      <w:proofErr w:type="spellEnd"/>
+      <w:r>
+        <w:rPr>
+          <w:sz w:val="28"/>
+          <w:szCs w:val="28"/>
+        </w:rPr>
+        <w:t>-Крамера</w:t>
       </w:r>
       <w:r>
         <w:rPr>
@@ -19632,7 +20525,6 @@
           <w:sz w:val="28"/>
           <w:szCs w:val="28"/>
         </w:rPr>
-        <w:lastRenderedPageBreak/>
         <w:drawing>
           <wp:inline distT="0" distB="0" distL="0" distR="0" wp14:anchorId="1496031A" wp14:editId="6D0E018C">
             <wp:extent cx="5940425" cy="4408170"/>
@@ -19684,6 +20576,7 @@
           <w:sz w:val="28"/>
           <w:szCs w:val="28"/>
         </w:rPr>
+        <w:lastRenderedPageBreak/>
         <w:t>Листинг 21. Вычисление эффективности оценки</w:t>
       </w:r>
     </w:p>
@@ -20056,7 +20949,6 @@
               <w:sz w:val="28"/>
               <w:szCs w:val="28"/>
             </w:rPr>
-            <w:lastRenderedPageBreak/>
             <m:t>R-эффективность loc:</m:t>
           </m:r>
         </m:oMath>
@@ -20167,7 +21059,23 @@
           <w:sz w:val="28"/>
           <w:szCs w:val="28"/>
         </w:rPr>
-        <w:t>Для параметра loc эффективность оценок различается: метод моментов использует лишь около 9% максимально достижимой точности</w:t>
+        <w:t xml:space="preserve">Для параметра </w:t>
+      </w:r>
+      <w:proofErr w:type="spellStart"/>
+      <w:r>
+        <w:rPr>
+          <w:sz w:val="28"/>
+          <w:szCs w:val="28"/>
+        </w:rPr>
+        <w:t>loc</w:t>
+      </w:r>
+      <w:proofErr w:type="spellEnd"/>
+      <w:r>
+        <w:rPr>
+          <w:sz w:val="28"/>
+          <w:szCs w:val="28"/>
+        </w:rPr>
+        <w:t xml:space="preserve"> эффективность оценок различается: метод моментов использует лишь около 9% максимально достижимой точности</w:t>
       </w:r>
       <w:r>
         <w:rPr>
@@ -20202,6 +21110,7 @@
           <w:szCs w:val="28"/>
           <w:lang w:val="en-US"/>
         </w:rPr>
+        <w:lastRenderedPageBreak/>
         <w:drawing>
           <wp:inline distT="0" distB="0" distL="0" distR="0" wp14:anchorId="49F45016" wp14:editId="3CB148CA">
             <wp:extent cx="4991533" cy="1310754"/>
@@ -20364,7 +21273,6 @@
           <w:sz w:val="28"/>
           <w:szCs w:val="28"/>
         </w:rPr>
-        <w:lastRenderedPageBreak/>
         <w:drawing>
           <wp:inline distT="0" distB="0" distL="0" distR="0" wp14:anchorId="19ACCF4E" wp14:editId="5D96CD59">
             <wp:extent cx="5940425" cy="3622675"/>
@@ -20448,7 +21356,15 @@
           <w:sz w:val="28"/>
           <w:szCs w:val="28"/>
         </w:rPr>
-        <w:t>Максимальное отклонение теоретической кривой от эмпирической составило 0,036 для метода моментов и 0,035 для метода максимального правдоподобия</w:t>
+        <w:t xml:space="preserve">Максимальное отклонение теоретической кривой от </w:t>
+      </w:r>
+      <w:r>
+        <w:rPr>
+          <w:sz w:val="28"/>
+          <w:szCs w:val="28"/>
+        </w:rPr>
+        <w:lastRenderedPageBreak/>
+        <w:t>эмпирической составило 0,036 для метода моментов и 0,035 для метода максимального правдоподобия</w:t>
       </w:r>
       <w:r>
         <w:rPr>
@@ -20478,6 +21394,116 @@
         </w:rPr>
         <w:t xml:space="preserve"> </w:t>
       </w:r>
+    </w:p>
+    <w:p>
+      <w:pPr>
+        <w:spacing w:before="100" w:beforeAutospacing="1" w:after="100" w:afterAutospacing="1" w:line="360" w:lineRule="auto"/>
+        <w:ind w:firstLine="708"/>
+        <w:jc w:val="both"/>
+        <w:rPr>
+          <w:sz w:val="28"/>
+          <w:szCs w:val="28"/>
+        </w:rPr>
+      </w:pPr>
+    </w:p>
+    <w:p>
+      <w:pPr>
+        <w:spacing w:before="100" w:beforeAutospacing="1" w:after="100" w:afterAutospacing="1" w:line="360" w:lineRule="auto"/>
+        <w:ind w:firstLine="708"/>
+        <w:jc w:val="both"/>
+        <w:rPr>
+          <w:sz w:val="28"/>
+          <w:szCs w:val="28"/>
+        </w:rPr>
+      </w:pPr>
+    </w:p>
+    <w:p>
+      <w:pPr>
+        <w:spacing w:before="100" w:beforeAutospacing="1" w:after="100" w:afterAutospacing="1" w:line="360" w:lineRule="auto"/>
+        <w:ind w:firstLine="708"/>
+        <w:jc w:val="both"/>
+        <w:rPr>
+          <w:sz w:val="28"/>
+          <w:szCs w:val="28"/>
+        </w:rPr>
+      </w:pPr>
+    </w:p>
+    <w:p>
+      <w:pPr>
+        <w:spacing w:before="100" w:beforeAutospacing="1" w:after="100" w:afterAutospacing="1" w:line="360" w:lineRule="auto"/>
+        <w:ind w:firstLine="708"/>
+        <w:jc w:val="both"/>
+        <w:rPr>
+          <w:sz w:val="28"/>
+          <w:szCs w:val="28"/>
+        </w:rPr>
+      </w:pPr>
+    </w:p>
+    <w:p>
+      <w:pPr>
+        <w:spacing w:before="100" w:beforeAutospacing="1" w:after="100" w:afterAutospacing="1" w:line="360" w:lineRule="auto"/>
+        <w:ind w:firstLine="708"/>
+        <w:jc w:val="both"/>
+        <w:rPr>
+          <w:sz w:val="28"/>
+          <w:szCs w:val="28"/>
+        </w:rPr>
+      </w:pPr>
+    </w:p>
+    <w:p>
+      <w:pPr>
+        <w:spacing w:before="100" w:beforeAutospacing="1" w:after="100" w:afterAutospacing="1" w:line="360" w:lineRule="auto"/>
+        <w:ind w:firstLine="708"/>
+        <w:jc w:val="both"/>
+        <w:rPr>
+          <w:sz w:val="28"/>
+          <w:szCs w:val="28"/>
+        </w:rPr>
+      </w:pPr>
+    </w:p>
+    <w:p>
+      <w:pPr>
+        <w:spacing w:before="100" w:beforeAutospacing="1" w:after="100" w:afterAutospacing="1" w:line="360" w:lineRule="auto"/>
+        <w:ind w:firstLine="708"/>
+        <w:jc w:val="both"/>
+        <w:rPr>
+          <w:sz w:val="28"/>
+          <w:szCs w:val="28"/>
+        </w:rPr>
+      </w:pPr>
+    </w:p>
+    <w:p>
+      <w:pPr>
+        <w:spacing w:before="100" w:beforeAutospacing="1" w:after="100" w:afterAutospacing="1" w:line="360" w:lineRule="auto"/>
+        <w:ind w:firstLine="708"/>
+        <w:jc w:val="both"/>
+        <w:rPr>
+          <w:sz w:val="28"/>
+          <w:szCs w:val="28"/>
+        </w:rPr>
+      </w:pPr>
+    </w:p>
+    <w:p>
+      <w:pPr>
+        <w:spacing w:before="100" w:beforeAutospacing="1" w:after="100" w:afterAutospacing="1" w:line="360" w:lineRule="auto"/>
+        <w:ind w:firstLine="708"/>
+        <w:jc w:val="both"/>
+        <w:rPr>
+          <w:sz w:val="28"/>
+          <w:szCs w:val="28"/>
+        </w:rPr>
+      </w:pPr>
+    </w:p>
+    <w:p>
+      <w:pPr>
+        <w:spacing w:before="100" w:beforeAutospacing="1" w:after="100" w:afterAutospacing="1" w:line="360" w:lineRule="auto"/>
+        <w:ind w:firstLine="708"/>
+        <w:jc w:val="both"/>
+        <w:rPr>
+          <w:sz w:val="28"/>
+          <w:szCs w:val="28"/>
+        </w:rPr>
+      </w:pPr>
     </w:p>
     <w:p>
       <w:pPr>
@@ -21937,7 +22963,41 @@
           <w:sz w:val="28"/>
           <w:szCs w:val="28"/>
         </w:rPr>
-        <w:t xml:space="preserve">Доверительные интервалы для параметров a и loc </w:t>
+        <w:t xml:space="preserve">Доверительные интервалы для параметров </w:t>
+      </w:r>
+      <m:oMath>
+        <m:r>
+          <w:rPr>
+            <w:rFonts w:ascii="Cambria Math" w:hAnsi="Cambria Math"/>
+            <w:sz w:val="28"/>
+            <w:szCs w:val="28"/>
+          </w:rPr>
+          <m:t>a</m:t>
+        </m:r>
+      </m:oMath>
+      <w:r>
+        <w:rPr>
+          <w:sz w:val="28"/>
+          <w:szCs w:val="28"/>
+        </w:rPr>
+        <w:t xml:space="preserve"> и </w:t>
+      </w:r>
+      <m:oMath>
+        <m:r>
+          <w:rPr>
+            <w:rFonts w:ascii="Cambria Math" w:hAnsi="Cambria Math"/>
+            <w:sz w:val="28"/>
+            <w:szCs w:val="28"/>
+          </w:rPr>
+          <m:t>loc</m:t>
+        </m:r>
+      </m:oMath>
+      <w:r>
+        <w:rPr>
+          <w:sz w:val="28"/>
+          <w:szCs w:val="28"/>
+        </w:rPr>
+        <w:t xml:space="preserve"> </w:t>
       </w:r>
       <w:r>
         <w:rPr>
@@ -23077,6 +24137,17 @@
     </w:p>
     <w:p>
       <w:pPr>
+        <w:spacing w:before="100" w:beforeAutospacing="1" w:after="100" w:afterAutospacing="1" w:line="360" w:lineRule="auto"/>
+        <w:ind w:firstLine="708"/>
+        <w:jc w:val="both"/>
+        <w:rPr>
+          <w:sz w:val="28"/>
+          <w:szCs w:val="28"/>
+        </w:rPr>
+      </w:pPr>
+    </w:p>
+    <w:p>
+      <w:pPr>
         <w:pStyle w:val="a7"/>
         <w:numPr>
           <w:ilvl w:val="0"/>
@@ -23096,6 +24167,7 @@
           <w:sz w:val="32"/>
           <w:szCs w:val="32"/>
         </w:rPr>
+        <w:lastRenderedPageBreak/>
         <w:t>Статистические критерии</w:t>
       </w:r>
     </w:p>
@@ -23120,7 +24192,6 @@
           <w:sz w:val="28"/>
           <w:szCs w:val="28"/>
         </w:rPr>
-        <w:lastRenderedPageBreak/>
         <w:t>Ошибки первого и второго рода</w:t>
       </w:r>
     </w:p>
@@ -27344,7 +28415,39 @@
           <w:sz w:val="28"/>
           <w:szCs w:val="28"/>
         </w:rPr>
-        <w:t xml:space="preserve">Для предоставленной выборки объёмом n = 300 были самостоятельно реализованы функции вычисления основных статистик выборки, построены эмпирическая функция распределения и гистограмма для полной выборки и случайных подвыборок объёмом 10, 100 и 200 элементов. С ростом объёма подвыборки обе характеристики закономерно приближались к теоретическим, что согласуется с теоремой Гливенко. </w:t>
+        <w:t xml:space="preserve">Для предоставленной выборки объёмом n = 300 были самостоятельно реализованы функции вычисления основных статистик выборки, построены эмпирическая функция распределения и гистограмма для полной выборки и случайных </w:t>
+      </w:r>
+      <w:proofErr w:type="spellStart"/>
+      <w:r>
+        <w:rPr>
+          <w:sz w:val="28"/>
+          <w:szCs w:val="28"/>
+        </w:rPr>
+        <w:t>подвыборок</w:t>
+      </w:r>
+      <w:proofErr w:type="spellEnd"/>
+      <w:r>
+        <w:rPr>
+          <w:sz w:val="28"/>
+          <w:szCs w:val="28"/>
+        </w:rPr>
+        <w:t xml:space="preserve"> объёмом 10, 100 и 200 элементов. С ростом объёма </w:t>
+      </w:r>
+      <w:proofErr w:type="spellStart"/>
+      <w:r>
+        <w:rPr>
+          <w:sz w:val="28"/>
+          <w:szCs w:val="28"/>
+        </w:rPr>
+        <w:t>подвыборки</w:t>
+      </w:r>
+      <w:proofErr w:type="spellEnd"/>
+      <w:r>
+        <w:rPr>
+          <w:sz w:val="28"/>
+          <w:szCs w:val="28"/>
+        </w:rPr>
+        <w:t xml:space="preserve"> обе характеристики закономерно приближались к теоретическим, что согласуется с теоремой Гливенко. </w:t>
       </w:r>
     </w:p>
     <w:p>
@@ -27890,24 +28993,10 @@
           <w:szCs w:val="28"/>
           <w:lang w:val="en-US"/>
         </w:rPr>
-        <w:t>[2] Bain L. J., Engelhardt M. Introduction to Probability and Mathematical Statistics. — 2nd ed. — Belmont : Brooks/Cole, 1992. — 644 p.</w:t>
-      </w:r>
-    </w:p>
-    <w:p>
-      <w:pPr>
-        <w:spacing w:line="360" w:lineRule="auto"/>
-        <w:jc w:val="both"/>
-        <w:rPr>
-          <w:sz w:val="28"/>
-          <w:szCs w:val="28"/>
-          <w:lang w:val="en-US"/>
-        </w:rPr>
-      </w:pPr>
-    </w:p>
-    <w:p>
-      <w:pPr>
-        <w:spacing w:line="360" w:lineRule="auto"/>
-        <w:jc w:val="both"/>
+        <w:t xml:space="preserve">[2] Bain L. J., Engelhardt M. Introduction to Probability and Mathematical Statistics. — 2nd ed. — </w:t>
+      </w:r>
+      <w:proofErr w:type="gramStart"/>
+      <w:r>
         <w:rPr>
           <w:b/>
           <w:bCs/>
@@ -27915,7 +29004,9 @@
           <w:szCs w:val="28"/>
           <w:lang w:val="en-US"/>
         </w:rPr>
-      </w:pPr>
+        <w:t>Belmont :</w:t>
+      </w:r>
+      <w:proofErr w:type="gramEnd"/>
       <w:r>
         <w:rPr>
           <w:b/>
@@ -27924,7 +29015,7 @@
           <w:szCs w:val="28"/>
           <w:lang w:val="en-US"/>
         </w:rPr>
-        <w:t xml:space="preserve">[3] Bahashwan A. O., Kalantan Z. I., Adham S. A. Double Gamma Principal Components Analysis // Applied Mathematical Sciences. — 2018. — Vol. 12, № 11. — P. 523–533. </w:t>
+        <w:t xml:space="preserve"> Brooks/Cole, 1992. — 644 p.</w:t>
       </w:r>
     </w:p>
     <w:p>
@@ -27942,15 +29033,195 @@
       <w:pPr>
         <w:spacing w:line="360" w:lineRule="auto"/>
         <w:jc w:val="both"/>
-      </w:pPr>
-      <w:r>
         <w:rPr>
           <w:b/>
           <w:bCs/>
           <w:sz w:val="28"/>
           <w:szCs w:val="28"/>
-        </w:rPr>
-        <w:t>[4] Положинцев Б. И. Теория вероятностей и математическая статистика. Введение в математическую статистику: учебное пособие /  Б. И. Положинцев. – Санкт-Петербург: СПбПУ, 2016.</w:t>
+          <w:lang w:val="en-US"/>
+        </w:rPr>
+      </w:pPr>
+      <w:r>
+        <w:rPr>
+          <w:b/>
+          <w:bCs/>
+          <w:sz w:val="28"/>
+          <w:szCs w:val="28"/>
+          <w:lang w:val="en-US"/>
+        </w:rPr>
+        <w:t xml:space="preserve">[3] </w:t>
+      </w:r>
+      <w:proofErr w:type="spellStart"/>
+      <w:r>
+        <w:rPr>
+          <w:b/>
+          <w:bCs/>
+          <w:sz w:val="28"/>
+          <w:szCs w:val="28"/>
+          <w:lang w:val="en-US"/>
+        </w:rPr>
+        <w:t>Bahashwan</w:t>
+      </w:r>
+      <w:proofErr w:type="spellEnd"/>
+      <w:r>
+        <w:rPr>
+          <w:b/>
+          <w:bCs/>
+          <w:sz w:val="28"/>
+          <w:szCs w:val="28"/>
+          <w:lang w:val="en-US"/>
+        </w:rPr>
+        <w:t xml:space="preserve"> A. O., </w:t>
+      </w:r>
+      <w:proofErr w:type="spellStart"/>
+      <w:r>
+        <w:rPr>
+          <w:b/>
+          <w:bCs/>
+          <w:sz w:val="28"/>
+          <w:szCs w:val="28"/>
+          <w:lang w:val="en-US"/>
+        </w:rPr>
+        <w:t>Kalantan</w:t>
+      </w:r>
+      <w:proofErr w:type="spellEnd"/>
+      <w:r>
+        <w:rPr>
+          <w:b/>
+          <w:bCs/>
+          <w:sz w:val="28"/>
+          <w:szCs w:val="28"/>
+          <w:lang w:val="en-US"/>
+        </w:rPr>
+        <w:t xml:space="preserve"> Z. I., </w:t>
+      </w:r>
+      <w:proofErr w:type="spellStart"/>
+      <w:r>
+        <w:rPr>
+          <w:b/>
+          <w:bCs/>
+          <w:sz w:val="28"/>
+          <w:szCs w:val="28"/>
+          <w:lang w:val="en-US"/>
+        </w:rPr>
+        <w:t>Adham</w:t>
+      </w:r>
+      <w:proofErr w:type="spellEnd"/>
+      <w:r>
+        <w:rPr>
+          <w:b/>
+          <w:bCs/>
+          <w:sz w:val="28"/>
+          <w:szCs w:val="28"/>
+          <w:lang w:val="en-US"/>
+        </w:rPr>
+        <w:t xml:space="preserve"> S. A. Double Gamma Principal Components Analysis // Applied Mathematical Sciences. — 2018. — Vol. 12, № 11. — P. 523–533. </w:t>
+      </w:r>
+    </w:p>
+    <w:p>
+      <w:pPr>
+        <w:spacing w:line="360" w:lineRule="auto"/>
+        <w:jc w:val="both"/>
+        <w:rPr>
+          <w:sz w:val="28"/>
+          <w:szCs w:val="28"/>
+          <w:lang w:val="en-US"/>
+        </w:rPr>
+      </w:pPr>
+    </w:p>
+    <w:p>
+      <w:pPr>
+        <w:spacing w:line="360" w:lineRule="auto"/>
+        <w:jc w:val="both"/>
+      </w:pPr>
+      <w:r>
+        <w:rPr>
+          <w:b/>
+          <w:bCs/>
+          <w:sz w:val="28"/>
+          <w:szCs w:val="28"/>
+        </w:rPr>
+        <w:t xml:space="preserve">[4] </w:t>
+      </w:r>
+      <w:proofErr w:type="spellStart"/>
+      <w:r>
+        <w:rPr>
+          <w:b/>
+          <w:bCs/>
+          <w:sz w:val="28"/>
+          <w:szCs w:val="28"/>
+        </w:rPr>
+        <w:t>Положинцев</w:t>
+      </w:r>
+      <w:proofErr w:type="spellEnd"/>
+      <w:r>
+        <w:rPr>
+          <w:b/>
+          <w:bCs/>
+          <w:sz w:val="28"/>
+          <w:szCs w:val="28"/>
+        </w:rPr>
+        <w:t xml:space="preserve"> Б. И. Теория вероятностей и математическая статистика. Введение в математическую статистику: учебное пособие </w:t>
+      </w:r>
+      <w:proofErr w:type="gramStart"/>
+      <w:r>
+        <w:rPr>
+          <w:b/>
+          <w:bCs/>
+          <w:sz w:val="28"/>
+          <w:szCs w:val="28"/>
+        </w:rPr>
+        <w:t>/  Б.</w:t>
+      </w:r>
+      <w:proofErr w:type="gramEnd"/>
+      <w:r>
+        <w:rPr>
+          <w:b/>
+          <w:bCs/>
+          <w:sz w:val="28"/>
+          <w:szCs w:val="28"/>
+        </w:rPr>
+        <w:t xml:space="preserve"> И. </w:t>
+      </w:r>
+      <w:proofErr w:type="spellStart"/>
+      <w:r>
+        <w:rPr>
+          <w:b/>
+          <w:bCs/>
+          <w:sz w:val="28"/>
+          <w:szCs w:val="28"/>
+        </w:rPr>
+        <w:t>Положинцев</w:t>
+      </w:r>
+      <w:proofErr w:type="spellEnd"/>
+      <w:r>
+        <w:rPr>
+          <w:b/>
+          <w:bCs/>
+          <w:sz w:val="28"/>
+          <w:szCs w:val="28"/>
+        </w:rPr>
+        <w:t xml:space="preserve">. – Санкт-Петербург: </w:t>
+      </w:r>
+      <w:proofErr w:type="spellStart"/>
+      <w:r>
+        <w:rPr>
+          <w:b/>
+          <w:bCs/>
+          <w:sz w:val="28"/>
+          <w:szCs w:val="28"/>
+        </w:rPr>
+        <w:t>СПбПУ</w:t>
+      </w:r>
+      <w:proofErr w:type="spellEnd"/>
+      <w:r>
+        <w:rPr>
+          <w:b/>
+          <w:bCs/>
+          <w:sz w:val="28"/>
+          <w:szCs w:val="28"/>
+        </w:rPr>
+        <w:t>, 2016.</w:t>
       </w:r>
       <w:r>
         <w:rPr>
@@ -28003,7 +29274,6 @@
           <w:bCs/>
           <w:sz w:val="28"/>
           <w:szCs w:val="28"/>
-          <w:lang w:val="en-US"/>
         </w:rPr>
       </w:pPr>
       <w:r>
@@ -28035,6 +29305,171 @@
           <w:lang w:val="en-US"/>
         </w:rPr>
         <w:t>] The Double Gamma Distribution // Appendix A. - Florida International University, 2022. - P. 63–64.</w:t>
+      </w:r>
+    </w:p>
+    <w:p>
+      <w:pPr>
+        <w:spacing w:line="360" w:lineRule="auto"/>
+        <w:jc w:val="both"/>
+        <w:rPr>
+          <w:b/>
+          <w:bCs/>
+          <w:sz w:val="28"/>
+          <w:szCs w:val="28"/>
+        </w:rPr>
+      </w:pPr>
+    </w:p>
+    <w:p>
+      <w:pPr>
+        <w:spacing w:line="360" w:lineRule="auto"/>
+        <w:jc w:val="both"/>
+        <w:rPr>
+          <w:b/>
+          <w:bCs/>
+          <w:sz w:val="28"/>
+          <w:szCs w:val="28"/>
+          <w:lang w:val="en-US"/>
+        </w:rPr>
+      </w:pPr>
+      <w:r>
+        <w:rPr>
+          <w:b/>
+          <w:bCs/>
+          <w:sz w:val="28"/>
+          <w:szCs w:val="28"/>
+          <w:lang w:val="en-US"/>
+        </w:rPr>
+        <w:t>[</w:t>
+      </w:r>
+      <w:r>
+        <w:rPr>
+          <w:b/>
+          <w:bCs/>
+          <w:sz w:val="28"/>
+          <w:szCs w:val="28"/>
+          <w:lang w:val="en-US"/>
+        </w:rPr>
+        <w:t>6</w:t>
+      </w:r>
+      <w:r>
+        <w:rPr>
+          <w:b/>
+          <w:bCs/>
+          <w:sz w:val="28"/>
+          <w:szCs w:val="28"/>
+          <w:lang w:val="en-US"/>
+        </w:rPr>
+        <w:t xml:space="preserve">] Scherrer A., </w:t>
+      </w:r>
+      <w:proofErr w:type="spellStart"/>
+      <w:r>
+        <w:rPr>
+          <w:b/>
+          <w:bCs/>
+          <w:sz w:val="28"/>
+          <w:szCs w:val="28"/>
+          <w:lang w:val="en-US"/>
+        </w:rPr>
+        <w:t>Larrieu</w:t>
+      </w:r>
+      <w:proofErr w:type="spellEnd"/>
+      <w:r>
+        <w:rPr>
+          <w:b/>
+          <w:bCs/>
+          <w:sz w:val="28"/>
+          <w:szCs w:val="28"/>
+          <w:lang w:val="en-US"/>
+        </w:rPr>
+        <w:t xml:space="preserve"> N., </w:t>
+      </w:r>
+      <w:proofErr w:type="spellStart"/>
+      <w:r>
+        <w:rPr>
+          <w:b/>
+          <w:bCs/>
+          <w:sz w:val="28"/>
+          <w:szCs w:val="28"/>
+          <w:lang w:val="en-US"/>
+        </w:rPr>
+        <w:t>Borgnat</w:t>
+      </w:r>
+      <w:proofErr w:type="spellEnd"/>
+      <w:r>
+        <w:rPr>
+          <w:b/>
+          <w:bCs/>
+          <w:sz w:val="28"/>
+          <w:szCs w:val="28"/>
+          <w:lang w:val="en-US"/>
+        </w:rPr>
+        <w:t xml:space="preserve"> P., </w:t>
+      </w:r>
+      <w:proofErr w:type="spellStart"/>
+      <w:r>
+        <w:rPr>
+          <w:b/>
+          <w:bCs/>
+          <w:sz w:val="28"/>
+          <w:szCs w:val="28"/>
+          <w:lang w:val="en-US"/>
+        </w:rPr>
+        <w:t>Owezarski</w:t>
+      </w:r>
+      <w:proofErr w:type="spellEnd"/>
+      <w:r>
+        <w:rPr>
+          <w:b/>
+          <w:bCs/>
+          <w:sz w:val="28"/>
+          <w:szCs w:val="28"/>
+          <w:lang w:val="en-US"/>
+        </w:rPr>
+        <w:t xml:space="preserve"> P., </w:t>
+      </w:r>
+      <w:proofErr w:type="spellStart"/>
+      <w:r>
+        <w:rPr>
+          <w:b/>
+          <w:bCs/>
+          <w:sz w:val="28"/>
+          <w:szCs w:val="28"/>
+          <w:lang w:val="en-US"/>
+        </w:rPr>
+        <w:t>Abry</w:t>
+      </w:r>
+      <w:proofErr w:type="spellEnd"/>
+      <w:r>
+        <w:rPr>
+          <w:b/>
+          <w:bCs/>
+          <w:sz w:val="28"/>
+          <w:szCs w:val="28"/>
+          <w:lang w:val="en-US"/>
+        </w:rPr>
+        <w:t xml:space="preserve"> P. Non-Gaussian and Long Memory Statistical </w:t>
+      </w:r>
+      <w:proofErr w:type="spellStart"/>
+      <w:r>
+        <w:rPr>
+          <w:b/>
+          <w:bCs/>
+          <w:sz w:val="28"/>
+          <w:szCs w:val="28"/>
+          <w:lang w:val="en-US"/>
+        </w:rPr>
+        <w:t>Characterisations</w:t>
+      </w:r>
+      <w:proofErr w:type="spellEnd"/>
+      <w:r>
+        <w:rPr>
+          <w:b/>
+          <w:bCs/>
+          <w:sz w:val="28"/>
+          <w:szCs w:val="28"/>
+          <w:lang w:val="en-US"/>
+        </w:rPr>
+        <w:t xml:space="preserve"> for Internet Traffic with Anomalies // IEEE Transactions on Dependable and Secure Computing. — 2007. — Vol. 4, № 1. — P. 56–70.</w:t>
       </w:r>
     </w:p>
     <w:sectPr>

</xml_diff>

<commit_message>
UPDATE: отчет DATE: 2026-09-22 17:55:40
</commit_message>
<xml_diff>
--- a/Учеба 4 семестр/Теория вероятности/Курсовая работа/Отчет, Код/Курсовая_работа.docx
+++ b/Учеба 4 семестр/Теория вероятности/Курсовая работа/Отчет, Код/Курсовая_работа.docx
@@ -16934,6 +16934,17 @@
       <w:pPr>
         <w:spacing w:line="360" w:lineRule="auto"/>
         <w:ind w:firstLine="708"/>
+        <w:jc w:val="center"/>
+        <w:rPr>
+          <w:sz w:val="28"/>
+          <w:szCs w:val="28"/>
+        </w:rPr>
+      </w:pPr>
+    </w:p>
+    <w:p>
+      <w:pPr>
+        <w:spacing w:line="360" w:lineRule="auto"/>
+        <w:ind w:firstLine="708"/>
         <w:jc w:val="both"/>
         <w:rPr>
           <w:sz w:val="28"/>
@@ -16947,6 +16958,7 @@
           <w:sz w:val="28"/>
           <w:szCs w:val="28"/>
         </w:rPr>
+        <w:lastRenderedPageBreak/>
         <w:drawing>
           <wp:inline distT="0" distB="0" distL="0" distR="0" wp14:anchorId="558F35DB" wp14:editId="1D69F2F2">
             <wp:extent cx="5570220" cy="976500"/>
@@ -16999,7 +17011,6 @@
           <w:sz w:val="28"/>
           <w:szCs w:val="28"/>
         </w:rPr>
-        <w:lastRenderedPageBreak/>
         <w:t>Листинг 17. Подсчет сетки численных значений ТФР.</w:t>
       </w:r>
     </w:p>
@@ -17216,6 +17227,7 @@
           <w:sz w:val="28"/>
           <w:szCs w:val="28"/>
         </w:rPr>
+        <w:lastRenderedPageBreak/>
         <w:t>Оценка называется состоятельной, если при увеличении объёма выборки она сходится по вероятности к истинному значению параметра. На практике это проявляется в уменьшении разброса оценок при росте объёма выборки.</w:t>
       </w:r>
     </w:p>
@@ -17234,7 +17246,6 @@
           <w:sz w:val="28"/>
           <w:szCs w:val="28"/>
         </w:rPr>
-        <w:lastRenderedPageBreak/>
         <w:t>Для проверки свойства были высчитаны оценки параметров для различных объёмов выборки.</w:t>
       </w:r>
       <w:r>

</xml_diff>

<commit_message>
vault backup: 2026-09-24 00:59:17
</commit_message>
<xml_diff>
--- a/Учеба 4 семестр/Теория вероятности/Курсовая работа/Отчет, Код/Курсовая_работа.docx
+++ b/Учеба 4 семестр/Теория вероятности/Курсовая работа/Отчет, Код/Курсовая_работа.docx
@@ -19778,18 +19778,6 @@
     <w:p>
       <w:pPr>
         <w:spacing w:line="360" w:lineRule="auto"/>
-        <w:ind w:firstLine="708"/>
-        <w:jc w:val="both"/>
-        <w:rPr>
-          <w:sz w:val="28"/>
-          <w:szCs w:val="28"/>
-        </w:rPr>
-      </w:pPr>
-    </w:p>
-    <w:p>
-      <w:pPr>
-        <w:spacing w:line="360" w:lineRule="auto"/>
-        <w:ind w:firstLine="708"/>
         <w:jc w:val="both"/>
         <w:rPr>
           <w:sz w:val="28"/>
@@ -20140,7 +20128,6 @@
           <w:sz w:val="28"/>
           <w:szCs w:val="28"/>
         </w:rPr>
-        <w:lastRenderedPageBreak/>
         <w:t xml:space="preserve">По результатам 1000 моделирований получены следующие значения дисперсий оценок параметра </w:t>
       </w:r>
       <m:oMath>
@@ -20204,6 +20191,7 @@
           <w:sz w:val="28"/>
           <w:szCs w:val="28"/>
         </w:rPr>
+        <w:lastRenderedPageBreak/>
         <w:t xml:space="preserve">метод моментов: </w:t>
       </w:r>
       <m:oMath>
@@ -20587,7 +20575,6 @@
           <w:sz w:val="28"/>
           <w:szCs w:val="28"/>
         </w:rPr>
-        <w:lastRenderedPageBreak/>
         <w:t>Листинг 21. Вычисление эффективности оценки</w:t>
       </w:r>
     </w:p>
@@ -20605,8 +20592,24 @@
         <w:rPr>
           <w:sz w:val="28"/>
           <w:szCs w:val="28"/>
-        </w:rPr>
-        <w:t>Относительная эффективность определяется как отношение минимально возможной дисперсии к фактической дисперсии оценки:</w:t>
+          <w:lang w:val="en-US"/>
+        </w:rPr>
+        <w:lastRenderedPageBreak/>
+        <w:t>R</w:t>
+      </w:r>
+      <w:r>
+        <w:rPr>
+          <w:sz w:val="28"/>
+          <w:szCs w:val="28"/>
+        </w:rPr>
+        <w:t>-</w:t>
+      </w:r>
+      <w:r>
+        <w:rPr>
+          <w:sz w:val="28"/>
+          <w:szCs w:val="28"/>
+        </w:rPr>
+        <w:t>эффективность определяется как отношение минимально возможной дисперсии к фактической дисперсии оценки:</w:t>
       </w:r>
     </w:p>
     <w:p>
@@ -20942,16 +20945,6 @@
           <w:szCs w:val="28"/>
         </w:rPr>
       </w:pPr>
-    </w:p>
-    <w:p>
-      <w:pPr>
-        <w:spacing w:before="100" w:beforeAutospacing="1" w:after="100" w:afterAutospacing="1" w:line="360" w:lineRule="auto"/>
-        <w:jc w:val="both"/>
-        <w:rPr>
-          <w:sz w:val="28"/>
-          <w:szCs w:val="28"/>
-        </w:rPr>
-      </w:pPr>
       <m:oMathPara>
         <m:oMath>
           <m:r>
@@ -21121,7 +21114,6 @@
           <w:szCs w:val="28"/>
           <w:lang w:val="en-US"/>
         </w:rPr>
-        <w:lastRenderedPageBreak/>
         <w:drawing>
           <wp:inline distT="0" distB="0" distL="0" distR="0" wp14:anchorId="49F45016" wp14:editId="3CB148CA">
             <wp:extent cx="4991533" cy="1310754"/>
@@ -21220,6 +21212,7 @@
           <w:sz w:val="28"/>
           <w:szCs w:val="28"/>
         </w:rPr>
+        <w:lastRenderedPageBreak/>
         <w:t>Сравнение оценок</w:t>
       </w:r>
     </w:p>
@@ -21367,15 +21360,7 @@
           <w:sz w:val="28"/>
           <w:szCs w:val="28"/>
         </w:rPr>
-        <w:t xml:space="preserve">Максимальное отклонение теоретической кривой от </w:t>
-      </w:r>
-      <w:r>
-        <w:rPr>
-          <w:sz w:val="28"/>
-          <w:szCs w:val="28"/>
-        </w:rPr>
-        <w:lastRenderedPageBreak/>
-        <w:t>эмпирической составило 0,036 для метода моментов и 0,035 для метода максимального правдоподобия</w:t>
+        <w:t>Максимальное отклонение теоретической кривой от эмпирической составило 0,036 для метода моментов и 0,035 для метода максимального правдоподобия</w:t>
       </w:r>
       <w:r>
         <w:rPr>
@@ -21409,183 +21394,6 @@
     <w:p>
       <w:pPr>
         <w:spacing w:before="100" w:beforeAutospacing="1" w:after="100" w:afterAutospacing="1" w:line="360" w:lineRule="auto"/>
-        <w:ind w:firstLine="708"/>
-        <w:jc w:val="both"/>
-        <w:rPr>
-          <w:sz w:val="28"/>
-          <w:szCs w:val="28"/>
-        </w:rPr>
-      </w:pPr>
-    </w:p>
-    <w:p>
-      <w:pPr>
-        <w:spacing w:before="100" w:beforeAutospacing="1" w:after="100" w:afterAutospacing="1" w:line="360" w:lineRule="auto"/>
-        <w:ind w:firstLine="708"/>
-        <w:jc w:val="both"/>
-        <w:rPr>
-          <w:sz w:val="28"/>
-          <w:szCs w:val="28"/>
-        </w:rPr>
-      </w:pPr>
-    </w:p>
-    <w:p>
-      <w:pPr>
-        <w:spacing w:before="100" w:beforeAutospacing="1" w:after="100" w:afterAutospacing="1" w:line="360" w:lineRule="auto"/>
-        <w:ind w:firstLine="708"/>
-        <w:jc w:val="both"/>
-        <w:rPr>
-          <w:sz w:val="28"/>
-          <w:szCs w:val="28"/>
-        </w:rPr>
-      </w:pPr>
-    </w:p>
-    <w:p>
-      <w:pPr>
-        <w:spacing w:before="100" w:beforeAutospacing="1" w:after="100" w:afterAutospacing="1" w:line="360" w:lineRule="auto"/>
-        <w:ind w:firstLine="708"/>
-        <w:jc w:val="both"/>
-        <w:rPr>
-          <w:sz w:val="28"/>
-          <w:szCs w:val="28"/>
-        </w:rPr>
-      </w:pPr>
-    </w:p>
-    <w:p>
-      <w:pPr>
-        <w:spacing w:before="100" w:beforeAutospacing="1" w:after="100" w:afterAutospacing="1" w:line="360" w:lineRule="auto"/>
-        <w:ind w:firstLine="708"/>
-        <w:jc w:val="both"/>
-        <w:rPr>
-          <w:sz w:val="28"/>
-          <w:szCs w:val="28"/>
-        </w:rPr>
-      </w:pPr>
-    </w:p>
-    <w:p>
-      <w:pPr>
-        <w:spacing w:before="100" w:beforeAutospacing="1" w:after="100" w:afterAutospacing="1" w:line="360" w:lineRule="auto"/>
-        <w:ind w:firstLine="708"/>
-        <w:jc w:val="both"/>
-        <w:rPr>
-          <w:sz w:val="28"/>
-          <w:szCs w:val="28"/>
-        </w:rPr>
-      </w:pPr>
-    </w:p>
-    <w:p>
-      <w:pPr>
-        <w:spacing w:before="100" w:beforeAutospacing="1" w:after="100" w:afterAutospacing="1" w:line="360" w:lineRule="auto"/>
-        <w:ind w:firstLine="708"/>
-        <w:jc w:val="both"/>
-        <w:rPr>
-          <w:sz w:val="28"/>
-          <w:szCs w:val="28"/>
-        </w:rPr>
-      </w:pPr>
-    </w:p>
-    <w:p>
-      <w:pPr>
-        <w:spacing w:before="100" w:beforeAutospacing="1" w:after="100" w:afterAutospacing="1" w:line="360" w:lineRule="auto"/>
-        <w:ind w:firstLine="708"/>
-        <w:jc w:val="both"/>
-        <w:rPr>
-          <w:sz w:val="28"/>
-          <w:szCs w:val="28"/>
-        </w:rPr>
-      </w:pPr>
-    </w:p>
-    <w:p>
-      <w:pPr>
-        <w:spacing w:before="100" w:beforeAutospacing="1" w:after="100" w:afterAutospacing="1" w:line="360" w:lineRule="auto"/>
-        <w:ind w:firstLine="708"/>
-        <w:jc w:val="both"/>
-        <w:rPr>
-          <w:sz w:val="28"/>
-          <w:szCs w:val="28"/>
-        </w:rPr>
-      </w:pPr>
-    </w:p>
-    <w:p>
-      <w:pPr>
-        <w:spacing w:before="100" w:beforeAutospacing="1" w:after="100" w:afterAutospacing="1" w:line="360" w:lineRule="auto"/>
-        <w:ind w:firstLine="708"/>
-        <w:jc w:val="both"/>
-        <w:rPr>
-          <w:sz w:val="28"/>
-          <w:szCs w:val="28"/>
-        </w:rPr>
-      </w:pPr>
-    </w:p>
-    <w:p>
-      <w:pPr>
-        <w:spacing w:before="100" w:beforeAutospacing="1" w:after="100" w:afterAutospacing="1" w:line="360" w:lineRule="auto"/>
-        <w:ind w:firstLine="708"/>
-        <w:jc w:val="both"/>
-        <w:rPr>
-          <w:sz w:val="28"/>
-          <w:szCs w:val="28"/>
-        </w:rPr>
-      </w:pPr>
-    </w:p>
-    <w:p>
-      <w:pPr>
-        <w:spacing w:before="100" w:beforeAutospacing="1" w:after="100" w:afterAutospacing="1" w:line="360" w:lineRule="auto"/>
-        <w:ind w:firstLine="708"/>
-        <w:jc w:val="both"/>
-        <w:rPr>
-          <w:sz w:val="28"/>
-          <w:szCs w:val="28"/>
-        </w:rPr>
-      </w:pPr>
-    </w:p>
-    <w:p>
-      <w:pPr>
-        <w:spacing w:before="100" w:beforeAutospacing="1" w:after="100" w:afterAutospacing="1" w:line="360" w:lineRule="auto"/>
-        <w:ind w:firstLine="708"/>
-        <w:jc w:val="both"/>
-        <w:rPr>
-          <w:sz w:val="28"/>
-          <w:szCs w:val="28"/>
-        </w:rPr>
-      </w:pPr>
-    </w:p>
-    <w:p>
-      <w:pPr>
-        <w:spacing w:before="100" w:beforeAutospacing="1" w:after="100" w:afterAutospacing="1" w:line="360" w:lineRule="auto"/>
-        <w:ind w:firstLine="708"/>
-        <w:jc w:val="both"/>
-        <w:rPr>
-          <w:sz w:val="28"/>
-          <w:szCs w:val="28"/>
-        </w:rPr>
-      </w:pPr>
-    </w:p>
-    <w:p>
-      <w:pPr>
-        <w:spacing w:before="100" w:beforeAutospacing="1" w:after="100" w:afterAutospacing="1" w:line="360" w:lineRule="auto"/>
-        <w:ind w:firstLine="708"/>
-        <w:jc w:val="both"/>
-        <w:rPr>
-          <w:sz w:val="28"/>
-          <w:szCs w:val="28"/>
-        </w:rPr>
-      </w:pPr>
-    </w:p>
-    <w:p>
-      <w:pPr>
-        <w:spacing w:before="100" w:beforeAutospacing="1" w:after="100" w:afterAutospacing="1" w:line="360" w:lineRule="auto"/>
-        <w:ind w:firstLine="708"/>
-        <w:jc w:val="both"/>
-        <w:rPr>
-          <w:sz w:val="28"/>
-          <w:szCs w:val="28"/>
-        </w:rPr>
-      </w:pPr>
-    </w:p>
-    <w:p>
-      <w:pPr>
-        <w:spacing w:before="100" w:beforeAutospacing="1" w:after="100" w:afterAutospacing="1" w:line="360" w:lineRule="auto"/>
-        <w:ind w:firstLine="708"/>
         <w:jc w:val="both"/>
         <w:rPr>
           <w:sz w:val="28"/>
@@ -21614,7 +21422,6 @@
           <w:sz w:val="32"/>
           <w:szCs w:val="32"/>
         </w:rPr>
-        <w:lastRenderedPageBreak/>
         <w:t>Интервальные оценки параметров</w:t>
       </w:r>
     </w:p>
@@ -21639,6 +21446,7 @@
           <w:sz w:val="28"/>
           <w:szCs w:val="28"/>
         </w:rPr>
+        <w:lastRenderedPageBreak/>
         <w:t>Метод построения</w:t>
       </w:r>
     </w:p>
@@ -22955,7 +22763,6 @@
           <w:sz w:val="28"/>
           <w:szCs w:val="28"/>
         </w:rPr>
-        <w:lastRenderedPageBreak/>
         <w:t>7.2. Результаты</w:t>
       </w:r>
     </w:p>
@@ -23118,6 +22925,7 @@
                 <w:sz w:val="28"/>
                 <w:szCs w:val="28"/>
               </w:rPr>
+              <w:lastRenderedPageBreak/>
               <w:t>Параметр</w:t>
             </w:r>
           </w:p>
@@ -24178,7 +23986,6 @@
           <w:sz w:val="32"/>
           <w:szCs w:val="32"/>
         </w:rPr>
-        <w:lastRenderedPageBreak/>
         <w:t>Статистические критерии</w:t>
       </w:r>
     </w:p>
@@ -24203,6 +24010,7 @@
           <w:sz w:val="28"/>
           <w:szCs w:val="28"/>
         </w:rPr>
+        <w:lastRenderedPageBreak/>
         <w:t>Ошибки первого и второго рода</w:t>
       </w:r>
     </w:p>
@@ -24224,13 +24032,45 @@
         <w:t xml:space="preserve">Для вычисления ошибок первого и второго рода строился критерий вида </w:t>
       </w:r>
       <m:oMath>
+        <m:sSub>
+          <m:sSubPr>
+            <m:ctrlPr>
+              <w:rPr>
+                <w:rFonts w:ascii="Cambria Math" w:eastAsia="Arial" w:hAnsi="Cambria Math"/>
+                <w:i/>
+                <w:sz w:val="28"/>
+                <w:szCs w:val="28"/>
+              </w:rPr>
+            </m:ctrlPr>
+          </m:sSubPr>
+          <m:e>
+            <m:r>
+              <w:rPr>
+                <w:rFonts w:ascii="Cambria Math" w:eastAsia="Arial" w:hAnsi="Cambria Math"/>
+                <w:sz w:val="28"/>
+                <w:szCs w:val="28"/>
+              </w:rPr>
+              <m:t>H</m:t>
+            </m:r>
+          </m:e>
+          <m:sub>
+            <m:r>
+              <w:rPr>
+                <w:rFonts w:ascii="Cambria Math" w:eastAsia="Arial" w:hAnsi="Cambria Math"/>
+                <w:sz w:val="28"/>
+                <w:szCs w:val="28"/>
+              </w:rPr>
+              <m:t>0</m:t>
+            </m:r>
+          </m:sub>
+        </m:sSub>
         <m:r>
           <w:rPr>
             <w:rFonts w:ascii="Cambria Math" w:eastAsia="Arial" w:hAnsi="Cambria Math"/>
             <w:sz w:val="28"/>
             <w:szCs w:val="28"/>
           </w:rPr>
-          <m:t>H_0:{a=</m:t>
+          <m:t>:{a=</m:t>
         </m:r>
         <m:acc>
           <m:accPr>
@@ -24880,7 +24720,14 @@
           <w:sz w:val="28"/>
           <w:szCs w:val="28"/>
         </w:rPr>
-        <w:t>Листинг 26. Критерий</w:t>
+        <w:t xml:space="preserve">Листинг 26. </w:t>
+      </w:r>
+      <w:r>
+        <w:rPr>
+          <w:sz w:val="28"/>
+          <w:szCs w:val="28"/>
+        </w:rPr>
+        <w:t>Вывод критерия</w:t>
       </w:r>
     </w:p>
     <w:p>
@@ -25167,12 +25014,27 @@
     <w:p>
       <w:pPr>
         <w:spacing w:before="100" w:beforeAutospacing="1" w:after="100" w:afterAutospacing="1" w:line="360" w:lineRule="auto"/>
-        <w:jc w:val="both"/>
-        <w:rPr>
-          <w:sz w:val="28"/>
-          <w:szCs w:val="28"/>
-        </w:rPr>
-      </w:pPr>
+        <w:ind w:left="360"/>
+        <w:jc w:val="both"/>
+        <w:rPr>
+          <w:sz w:val="28"/>
+          <w:szCs w:val="28"/>
+        </w:rPr>
+      </w:pPr>
+      <w:r>
+        <w:rPr>
+          <w:sz w:val="28"/>
+          <w:szCs w:val="28"/>
+        </w:rPr>
+        <w:t xml:space="preserve">По результатам видно, что наиболее мощный критерий ММП равная </w:t>
+      </w:r>
+      <w:r>
+        <w:rPr>
+          <w:sz w:val="28"/>
+          <w:szCs w:val="28"/>
+        </w:rPr>
+        <w:t>0,197</w:t>
+      </w:r>
     </w:p>
     <w:p>
       <w:pPr>

</xml_diff>

<commit_message>
UPDATE: Курсовая DATE: 2026-09-26 16:38:49
</commit_message>
<xml_diff>
--- a/Учеба 4 семестр/Теория вероятности/Курсовая работа/Отчет, Код/Курсовая_работа.docx
+++ b/Учеба 4 семестр/Теория вероятности/Курсовая работа/Отчет, Код/Курсовая_работа.docx
@@ -319,16 +319,8 @@
           <w:szCs w:val="28"/>
         </w:rPr>
         <w:tab/>
-      </w:r>
-      <w:proofErr w:type="spellStart"/>
-      <w:r>
-        <w:rPr>
-          <w:sz w:val="28"/>
-          <w:szCs w:val="28"/>
-        </w:rPr>
         <w:t>И.А.Эков</w:t>
       </w:r>
-      <w:proofErr w:type="spellEnd"/>
     </w:p>
     <w:p>
       <w:pPr>
@@ -379,7 +371,6 @@
         </w:rPr>
         <w:tab/>
       </w:r>
-      <w:proofErr w:type="spellStart"/>
       <w:r>
         <w:rPr>
           <w:sz w:val="28"/>
@@ -387,7 +378,6 @@
         </w:rPr>
         <w:t>Р.А.Ажермачев</w:t>
       </w:r>
-      <w:proofErr w:type="spellEnd"/>
     </w:p>
     <w:p>
       <w:pPr>
@@ -451,16 +441,8 @@
           <w:szCs w:val="28"/>
         </w:rPr>
         <w:tab/>
-      </w:r>
-      <w:proofErr w:type="spellStart"/>
-      <w:r>
-        <w:rPr>
-          <w:sz w:val="28"/>
-          <w:szCs w:val="28"/>
-        </w:rPr>
         <w:t>О.А.Пахомова</w:t>
       </w:r>
-      <w:proofErr w:type="spellEnd"/>
     </w:p>
     <w:p>
       <w:pPr>
@@ -995,23 +977,7 @@
           <w:sz w:val="28"/>
           <w:szCs w:val="28"/>
         </w:rPr>
-        <w:t xml:space="preserve">4.3. Вид гистограмм для случайных </w:t>
-      </w:r>
-      <w:proofErr w:type="spellStart"/>
-      <w:r>
-        <w:rPr>
-          <w:sz w:val="28"/>
-          <w:szCs w:val="28"/>
-        </w:rPr>
-        <w:t>подвыборок</w:t>
-      </w:r>
-      <w:proofErr w:type="spellEnd"/>
-      <w:r>
-        <w:rPr>
-          <w:sz w:val="28"/>
-          <w:szCs w:val="28"/>
-        </w:rPr>
-        <w:t xml:space="preserve"> размера 10, 100, 200</w:t>
+        <w:t>4.3. Вид гистограмм для случайных подвыборок размера 10, 100, 200</w:t>
       </w:r>
       <w:r>
         <w:rPr>
@@ -1116,42 +1082,7 @@
           <w:sz w:val="28"/>
           <w:szCs w:val="28"/>
         </w:rPr>
-        <w:t>5.1. Определ</w:t>
-      </w:r>
-      <w:r>
-        <w:rPr>
-          <w:sz w:val="28"/>
-          <w:szCs w:val="28"/>
-        </w:rPr>
-        <w:t>ение</w:t>
-      </w:r>
-      <w:r>
-        <w:rPr>
-          <w:sz w:val="28"/>
-          <w:szCs w:val="28"/>
-        </w:rPr>
-        <w:t xml:space="preserve"> вид</w:t>
-      </w:r>
-      <w:r>
-        <w:rPr>
-          <w:sz w:val="28"/>
-          <w:szCs w:val="28"/>
-        </w:rPr>
-        <w:t>а</w:t>
-      </w:r>
-      <w:r>
-        <w:rPr>
-          <w:sz w:val="28"/>
-          <w:szCs w:val="28"/>
-        </w:rPr>
-        <w:t xml:space="preserve"> теоретической</w:t>
-      </w:r>
-      <w:r>
-        <w:rPr>
-          <w:sz w:val="28"/>
-          <w:szCs w:val="28"/>
-        </w:rPr>
-        <w:t xml:space="preserve"> функции</w:t>
+        <w:t>5.1. Определение вида теоретической функции</w:t>
       </w:r>
       <w:r>
         <w:rPr>
@@ -2180,23 +2111,7 @@
           <w:sz w:val="28"/>
           <w:szCs w:val="28"/>
         </w:rPr>
-        <w:t xml:space="preserve">Объектом исследования является выборка случайной величины, подчиняющейся </w:t>
-      </w:r>
-      <w:proofErr w:type="gramStart"/>
-      <w:r>
-        <w:rPr>
-          <w:sz w:val="28"/>
-          <w:szCs w:val="28"/>
-        </w:rPr>
-        <w:t>двойному</w:t>
-      </w:r>
-      <w:proofErr w:type="gramEnd"/>
-      <w:r>
-        <w:rPr>
-          <w:sz w:val="28"/>
-          <w:szCs w:val="28"/>
-        </w:rPr>
-        <w:t xml:space="preserve"> гамма распределению. Предметом исследования — статистические свойства данной выборки и методы её анализа.</w:t>
+        <w:t>Объектом исследования является выборка случайной величины, подчиняющейся двойному гамма распределению. Предметом исследования — статистические свойства данной выборки и методы её анализа.</w:t>
       </w:r>
     </w:p>
     <w:p>
@@ -2225,39 +2140,7 @@
           <w:sz w:val="28"/>
           <w:szCs w:val="28"/>
         </w:rPr>
-        <w:t xml:space="preserve">Работа выполнена с использованием языка программирования Python в среде </w:t>
-      </w:r>
-      <w:proofErr w:type="spellStart"/>
-      <w:r>
-        <w:rPr>
-          <w:sz w:val="28"/>
-          <w:szCs w:val="28"/>
-        </w:rPr>
-        <w:t>Jupyter</w:t>
-      </w:r>
-      <w:proofErr w:type="spellEnd"/>
-      <w:r>
-        <w:rPr>
-          <w:sz w:val="28"/>
-          <w:szCs w:val="28"/>
-        </w:rPr>
-        <w:t xml:space="preserve"> </w:t>
-      </w:r>
-      <w:proofErr w:type="spellStart"/>
-      <w:r>
-        <w:rPr>
-          <w:sz w:val="28"/>
-          <w:szCs w:val="28"/>
-        </w:rPr>
-        <w:t>Notebook</w:t>
-      </w:r>
-      <w:proofErr w:type="spellEnd"/>
-      <w:r>
-        <w:rPr>
-          <w:sz w:val="28"/>
-          <w:szCs w:val="28"/>
-        </w:rPr>
-        <w:t>. Все вычисления реализованы самостоятельно, без применения готовых статистических библиотек там, где это оговорено заданием.</w:t>
+        <w:t>Работа выполнена с использованием языка программирования Python в среде Jupyter Notebook. Все вычисления реализованы самостоятельно, без применения готовых статистических библиотек там, где это оговорено заданием.</w:t>
       </w:r>
     </w:p>
     <w:p>
@@ -2583,7 +2466,6 @@
         </w:rPr>
         <w:t xml:space="preserve">Гамма-распределение определено только для неотрицательных значений случайной величины, что ограничивает его применимость при моделировании симметричных процессов [2]. Для преодоления этого ограничения исследователями было предложено его естественное расширение на всю числовую ось — двойное гамма-распределение (также называемое отражённым гамма-распределением, англ. </w:t>
       </w:r>
-      <w:proofErr w:type="spellStart"/>
       <w:r>
         <w:rPr>
           <w:i/>
@@ -2591,49 +2473,8 @@
           <w:sz w:val="28"/>
           <w:szCs w:val="28"/>
         </w:rPr>
-        <w:t>Reflected</w:t>
-      </w:r>
-      <w:proofErr w:type="spellEnd"/>
-      <w:r>
-        <w:rPr>
-          <w:i/>
-          <w:iCs/>
-          <w:sz w:val="28"/>
-          <w:szCs w:val="28"/>
-        </w:rPr>
-        <w:t xml:space="preserve"> </w:t>
-      </w:r>
-      <w:proofErr w:type="spellStart"/>
-      <w:r>
-        <w:rPr>
-          <w:i/>
-          <w:iCs/>
-          <w:sz w:val="28"/>
-          <w:szCs w:val="28"/>
-        </w:rPr>
-        <w:t>gamma</w:t>
-      </w:r>
-      <w:proofErr w:type="spellEnd"/>
-      <w:r>
-        <w:rPr>
-          <w:i/>
-          <w:iCs/>
-          <w:sz w:val="28"/>
-          <w:szCs w:val="28"/>
-        </w:rPr>
-        <w:t xml:space="preserve"> </w:t>
-      </w:r>
-      <w:proofErr w:type="spellStart"/>
-      <w:r>
-        <w:rPr>
-          <w:i/>
-          <w:iCs/>
-          <w:sz w:val="28"/>
-          <w:szCs w:val="28"/>
-        </w:rPr>
-        <w:t>distribution</w:t>
-      </w:r>
-      <w:proofErr w:type="spellEnd"/>
+        <w:t>Reflected gamma distribution</w:t>
+      </w:r>
       <w:r>
         <w:rPr>
           <w:sz w:val="28"/>
@@ -3242,71 +3083,7 @@
           <w:sz w:val="28"/>
           <w:szCs w:val="28"/>
         </w:rPr>
-        <w:t xml:space="preserve">Несмотря на то, что двойное гамма-распределение не является специализированным инструментом информационной безопасности, его свойства находят применение в ряде смежных задач. В частности, как показано в работе </w:t>
-      </w:r>
-      <w:proofErr w:type="spellStart"/>
-      <w:r>
-        <w:rPr>
-          <w:sz w:val="28"/>
-          <w:szCs w:val="28"/>
-        </w:rPr>
-        <w:t>Bahashwan</w:t>
-      </w:r>
-      <w:proofErr w:type="spellEnd"/>
-      <w:r>
-        <w:rPr>
-          <w:sz w:val="28"/>
-          <w:szCs w:val="28"/>
-        </w:rPr>
-        <w:t xml:space="preserve">, </w:t>
-      </w:r>
-      <w:proofErr w:type="spellStart"/>
-      <w:r>
-        <w:rPr>
-          <w:sz w:val="28"/>
-          <w:szCs w:val="28"/>
-        </w:rPr>
-        <w:t>Kalantan</w:t>
-      </w:r>
-      <w:proofErr w:type="spellEnd"/>
-      <w:r>
-        <w:rPr>
-          <w:sz w:val="28"/>
-          <w:szCs w:val="28"/>
-        </w:rPr>
-        <w:t xml:space="preserve"> и </w:t>
-      </w:r>
-      <w:proofErr w:type="spellStart"/>
-      <w:r>
-        <w:rPr>
-          <w:sz w:val="28"/>
-          <w:szCs w:val="28"/>
-        </w:rPr>
-        <w:t>Adham</w:t>
-      </w:r>
-      <w:proofErr w:type="spellEnd"/>
-      <w:r>
-        <w:rPr>
-          <w:sz w:val="28"/>
-          <w:szCs w:val="28"/>
-        </w:rPr>
-        <w:t xml:space="preserve"> [3], метод главных компонент (PCA), основанный на двойном гамма-распределении для моделирования шума, демонстрирует повышенную устойчивость к выбросам по сравнению с классическим гауссовским PCA. Данное свойство актуально при анализе сетевого трафика, где наблюдаемые данные, как правило, содержат выбросы и нештатные значения, характерные для атак типа </w:t>
-      </w:r>
-      <w:proofErr w:type="spellStart"/>
-      <w:r>
-        <w:rPr>
-          <w:sz w:val="28"/>
-          <w:szCs w:val="28"/>
-        </w:rPr>
-        <w:t>DoS</w:t>
-      </w:r>
-      <w:proofErr w:type="spellEnd"/>
-      <w:r>
-        <w:rPr>
-          <w:sz w:val="28"/>
-          <w:szCs w:val="28"/>
-        </w:rPr>
-        <w:t xml:space="preserve"> или аномального поведения пользователей. Применение устойчивых к шуму и выбросам методов снижения размерности позволяет выделять информативные признаки из зашумлённых данных, что является одним из ключевых этапов в системах обнаружения вторжений (IDS). </w:t>
+        <w:t xml:space="preserve">Несмотря на то, что двойное гамма-распределение не является специализированным инструментом информационной безопасности, его свойства находят применение в ряде смежных задач. В частности, как показано в работе Bahashwan, Kalantan и Adham [3], метод главных компонент (PCA), основанный на двойном гамма-распределении для моделирования шума, демонстрирует повышенную устойчивость к выбросам по сравнению с классическим гауссовским PCA. Данное свойство актуально при анализе сетевого трафика, где наблюдаемые данные, как правило, содержат выбросы и нештатные значения, характерные для атак типа DoS или аномального поведения пользователей. Применение устойчивых к шуму и выбросам методов снижения размерности позволяет выделять информативные признаки из зашумлённых данных, что является одним из ключевых этапов в системах обнаружения вторжений (IDS). </w:t>
       </w:r>
     </w:p>
     <w:p>
@@ -3324,39 +3101,7 @@
           <w:sz w:val="28"/>
           <w:szCs w:val="28"/>
         </w:rPr>
-        <w:t xml:space="preserve">Близкое направление исследований — статистическое моделирование самого сетевого трафика для обнаружения аномалий и </w:t>
-      </w:r>
-      <w:proofErr w:type="spellStart"/>
-      <w:r>
-        <w:rPr>
-          <w:sz w:val="28"/>
-          <w:szCs w:val="28"/>
-        </w:rPr>
-        <w:t>DDoS</w:t>
-      </w:r>
-      <w:proofErr w:type="spellEnd"/>
-      <w:r>
-        <w:rPr>
-          <w:sz w:val="28"/>
-          <w:szCs w:val="28"/>
-        </w:rPr>
-        <w:t xml:space="preserve">-атак. В работе </w:t>
-      </w:r>
-      <w:proofErr w:type="spellStart"/>
-      <w:r>
-        <w:rPr>
-          <w:sz w:val="28"/>
-          <w:szCs w:val="28"/>
-        </w:rPr>
-        <w:t>Scherrer</w:t>
-      </w:r>
-      <w:proofErr w:type="spellEnd"/>
-      <w:r>
-        <w:rPr>
-          <w:sz w:val="28"/>
-          <w:szCs w:val="28"/>
-        </w:rPr>
-        <w:t xml:space="preserve"> и др. [</w:t>
+        <w:t>Близкое направление исследований — статистическое моделирование самого сетевого трафика для обнаружения аномалий и DDoS-атак. В работе Scherrer и др. [</w:t>
       </w:r>
       <w:r>
         <w:rPr>
@@ -3885,6 +3630,7 @@
       </w:pPr>
       <w:r>
         <w:rPr>
+          <w:noProof/>
           <w:sz w:val="28"/>
           <w:szCs w:val="28"/>
         </w:rPr>
@@ -6092,23 +5838,7 @@
           <w:sz w:val="28"/>
           <w:szCs w:val="28"/>
         </w:rPr>
-        <w:t xml:space="preserve">С помощью функции единичного скачка (функции </w:t>
-      </w:r>
-      <w:proofErr w:type="spellStart"/>
-      <w:r>
-        <w:rPr>
-          <w:sz w:val="28"/>
-          <w:szCs w:val="28"/>
-        </w:rPr>
-        <w:t>Хевисайда</w:t>
-      </w:r>
-      <w:proofErr w:type="spellEnd"/>
-      <w:r>
-        <w:rPr>
-          <w:sz w:val="28"/>
-          <w:szCs w:val="28"/>
-        </w:rPr>
-        <w:t>) эмпирическую функцию распределения можно записать в виде [4]:</w:t>
+        <w:t>С помощью функции единичного скачка (функции Хевисайда) эмпирическую функцию распределения можно записать в виде [4]:</w:t>
       </w:r>
     </w:p>
     <w:p>
@@ -6298,23 +6028,7 @@
           <w:sz w:val="28"/>
           <w:szCs w:val="28"/>
         </w:rPr>
-        <w:t xml:space="preserve">где функция </w:t>
-      </w:r>
-      <w:proofErr w:type="spellStart"/>
-      <w:r>
-        <w:rPr>
-          <w:sz w:val="28"/>
-          <w:szCs w:val="28"/>
-        </w:rPr>
-        <w:t>Хевисайда</w:t>
-      </w:r>
-      <w:proofErr w:type="spellEnd"/>
-      <w:r>
-        <w:rPr>
-          <w:sz w:val="28"/>
-          <w:szCs w:val="28"/>
-        </w:rPr>
-        <w:t xml:space="preserve"> e(x) определяется следующим образом:</w:t>
+        <w:t>где функция Хевисайда e(x) определяется следующим образом:</w:t>
       </w:r>
     </w:p>
     <w:p>
@@ -7592,23 +7306,7 @@
           <w:szCs w:val="28"/>
         </w:rPr>
         <w:lastRenderedPageBreak/>
-        <w:t xml:space="preserve">Для анализа поведения ЭФР были сформированы три случайные </w:t>
-      </w:r>
-      <w:proofErr w:type="spellStart"/>
-      <w:r>
-        <w:rPr>
-          <w:sz w:val="28"/>
-          <w:szCs w:val="28"/>
-        </w:rPr>
-        <w:t>подвыборки</w:t>
-      </w:r>
-      <w:proofErr w:type="spellEnd"/>
-      <w:r>
-        <w:rPr>
-          <w:sz w:val="28"/>
-          <w:szCs w:val="28"/>
-        </w:rPr>
-        <w:t xml:space="preserve"> размером 10, 100 и 200 элементов из исходной выборки </w:t>
+        <w:t xml:space="preserve">Для анализа поведения ЭФР были сформированы три случайные подвыборки размером 10, 100 и 200 элементов из исходной выборки </w:t>
       </w:r>
       <m:oMath>
         <m:r>
@@ -7711,23 +7409,7 @@
           <w:sz w:val="28"/>
           <w:szCs w:val="28"/>
         </w:rPr>
-        <w:t xml:space="preserve">Рисунок 1. График эмпирической функции распределения для </w:t>
-      </w:r>
-      <w:proofErr w:type="spellStart"/>
-      <w:r>
-        <w:rPr>
-          <w:sz w:val="28"/>
-          <w:szCs w:val="28"/>
-        </w:rPr>
-        <w:t>подвыборки</w:t>
-      </w:r>
-      <w:proofErr w:type="spellEnd"/>
-      <w:r>
-        <w:rPr>
-          <w:sz w:val="28"/>
-          <w:szCs w:val="28"/>
-        </w:rPr>
-        <w:t xml:space="preserve"> из 10 элементов. </w:t>
+        <w:t xml:space="preserve">Рисунок 1. График эмпирической функции распределения для подвыборки из 10 элементов. </w:t>
       </w:r>
     </w:p>
     <w:p>
@@ -7797,23 +7479,7 @@
           <w:sz w:val="28"/>
           <w:szCs w:val="28"/>
         </w:rPr>
-        <w:t xml:space="preserve">Рисунок 2. График эмпирической функции распределения для </w:t>
-      </w:r>
-      <w:proofErr w:type="spellStart"/>
-      <w:r>
-        <w:rPr>
-          <w:sz w:val="28"/>
-          <w:szCs w:val="28"/>
-        </w:rPr>
-        <w:t>подвыборки</w:t>
-      </w:r>
-      <w:proofErr w:type="spellEnd"/>
-      <w:r>
-        <w:rPr>
-          <w:sz w:val="28"/>
-          <w:szCs w:val="28"/>
-        </w:rPr>
-        <w:t xml:space="preserve"> из 100 элементов. </w:t>
+        <w:t xml:space="preserve">Рисунок 2. График эмпирической функции распределения для подвыборки из 100 элементов. </w:t>
       </w:r>
     </w:p>
     <w:p>
@@ -7893,23 +7559,7 @@
           <w:sz w:val="28"/>
           <w:szCs w:val="28"/>
         </w:rPr>
-        <w:t xml:space="preserve">Рисунок 3. График эмпирической функции распределения для </w:t>
-      </w:r>
-      <w:proofErr w:type="spellStart"/>
-      <w:r>
-        <w:rPr>
-          <w:sz w:val="28"/>
-          <w:szCs w:val="28"/>
-        </w:rPr>
-        <w:t>подвыборки</w:t>
-      </w:r>
-      <w:proofErr w:type="spellEnd"/>
-      <w:r>
-        <w:rPr>
-          <w:sz w:val="28"/>
-          <w:szCs w:val="28"/>
-        </w:rPr>
-        <w:t xml:space="preserve"> из 200 элементов.</w:t>
+        <w:t>Рисунок 3. График эмпирической функции распределения для подвыборки из 200 элементов.</w:t>
       </w:r>
     </w:p>
     <w:p>
@@ -7960,23 +7610,7 @@
           <w:sz w:val="28"/>
           <w:szCs w:val="28"/>
         </w:rPr>
-        <w:t xml:space="preserve">. При увеличении объёма </w:t>
-      </w:r>
-      <w:proofErr w:type="spellStart"/>
-      <w:r>
-        <w:rPr>
-          <w:sz w:val="28"/>
-          <w:szCs w:val="28"/>
-        </w:rPr>
-        <w:t>подвыборки</w:t>
-      </w:r>
-      <w:proofErr w:type="spellEnd"/>
-      <w:r>
-        <w:rPr>
-          <w:sz w:val="28"/>
-          <w:szCs w:val="28"/>
-        </w:rPr>
-        <w:t xml:space="preserve"> эмпирическая функция распределения заметно приближается к теоретической. При </w:t>
+        <w:t xml:space="preserve">. При увеличении объёма подвыборки эмпирическая функция распределения заметно приближается к теоретической. При </w:t>
       </w:r>
       <m:oMath>
         <m:r>
@@ -9834,15 +9468,7 @@
             <w:sz w:val="28"/>
             <w:szCs w:val="28"/>
           </w:rPr>
-          <m:t>k = </m:t>
-        </m:r>
-        <m:r>
-          <w:rPr>
-            <w:rFonts w:ascii="Cambria Math" w:hAnsi="Cambria Math"/>
-            <w:sz w:val="28"/>
-            <w:szCs w:val="28"/>
-          </w:rPr>
-          <m:t>9</m:t>
+          <m:t>k = 9</m:t>
         </m:r>
       </m:oMath>
       <w:r>
@@ -10024,23 +9650,7 @@
           <w:sz w:val="28"/>
           <w:szCs w:val="28"/>
         </w:rPr>
-        <w:t xml:space="preserve">Результаты работы функции для случайных </w:t>
-      </w:r>
-      <w:proofErr w:type="spellStart"/>
-      <w:r>
-        <w:rPr>
-          <w:sz w:val="28"/>
-          <w:szCs w:val="28"/>
-        </w:rPr>
-        <w:t>подвыборок</w:t>
-      </w:r>
-      <w:proofErr w:type="spellEnd"/>
-      <w:r>
-        <w:rPr>
-          <w:sz w:val="28"/>
-          <w:szCs w:val="28"/>
-        </w:rPr>
-        <w:t xml:space="preserve"> размером 10, 100 и 200 элементов — на рисунках </w:t>
+        <w:t>Результаты работы функции для случайных подвыборок размером 10, 100 и 200 элементов — на рисунках </w:t>
       </w:r>
       <w:r>
         <w:rPr>
@@ -10184,27 +9794,7 @@
           <w:sz w:val="28"/>
           <w:szCs w:val="28"/>
         </w:rPr>
-        <w:t xml:space="preserve">Вид гистограмм для случайных </w:t>
-      </w:r>
-      <w:proofErr w:type="spellStart"/>
-      <w:r>
-        <w:rPr>
-          <w:b/>
-          <w:bCs/>
-          <w:sz w:val="28"/>
-          <w:szCs w:val="28"/>
-        </w:rPr>
-        <w:t>подвыборок</w:t>
-      </w:r>
-      <w:proofErr w:type="spellEnd"/>
-      <w:r>
-        <w:rPr>
-          <w:b/>
-          <w:bCs/>
-          <w:sz w:val="28"/>
-          <w:szCs w:val="28"/>
-        </w:rPr>
-        <w:t xml:space="preserve"> размера 10, 100, 200</w:t>
+        <w:t>Вид гистограмм для случайных подвыборок размера 10, 100, 200</w:t>
       </w:r>
     </w:p>
     <w:p>
@@ -10301,23 +9891,7 @@
           <w:sz w:val="28"/>
           <w:szCs w:val="28"/>
         </w:rPr>
-        <w:t xml:space="preserve"> – Гистограмма для </w:t>
-      </w:r>
-      <w:proofErr w:type="spellStart"/>
-      <w:r>
-        <w:rPr>
-          <w:sz w:val="28"/>
-          <w:szCs w:val="28"/>
-        </w:rPr>
-        <w:t>подвыборки</w:t>
-      </w:r>
-      <w:proofErr w:type="spellEnd"/>
-      <w:r>
-        <w:rPr>
-          <w:sz w:val="28"/>
-          <w:szCs w:val="28"/>
-        </w:rPr>
-        <w:t xml:space="preserve"> из 10 элементов</w:t>
+        <w:t> – Гистограмма для подвыборки из 10 элементов</w:t>
       </w:r>
     </w:p>
     <w:p>
@@ -10411,23 +9985,7 @@
           <w:sz w:val="28"/>
           <w:szCs w:val="28"/>
         </w:rPr>
-        <w:t xml:space="preserve"> – Гистограмма для </w:t>
-      </w:r>
-      <w:proofErr w:type="spellStart"/>
-      <w:r>
-        <w:rPr>
-          <w:sz w:val="28"/>
-          <w:szCs w:val="28"/>
-        </w:rPr>
-        <w:t>подвыборки</w:t>
-      </w:r>
-      <w:proofErr w:type="spellEnd"/>
-      <w:r>
-        <w:rPr>
-          <w:sz w:val="28"/>
-          <w:szCs w:val="28"/>
-        </w:rPr>
-        <w:t xml:space="preserve"> из 100 элементов</w:t>
+        <w:t> – Гистограмма для подвыборки из 100 элементов</w:t>
       </w:r>
     </w:p>
     <w:p>
@@ -10531,23 +10089,7 @@
           <w:sz w:val="28"/>
           <w:szCs w:val="28"/>
         </w:rPr>
-        <w:t xml:space="preserve"> – Гистограмма для </w:t>
-      </w:r>
-      <w:proofErr w:type="spellStart"/>
-      <w:r>
-        <w:rPr>
-          <w:sz w:val="28"/>
-          <w:szCs w:val="28"/>
-        </w:rPr>
-        <w:t>подвыборки</w:t>
-      </w:r>
-      <w:proofErr w:type="spellEnd"/>
-      <w:r>
-        <w:rPr>
-          <w:sz w:val="28"/>
-          <w:szCs w:val="28"/>
-        </w:rPr>
-        <w:t xml:space="preserve"> из 200 элементов.</w:t>
+        <w:t> – Гистограмма для подвыборки из 200 элементов.</w:t>
       </w:r>
     </w:p>
     <w:p>
@@ -10614,7 +10156,6 @@
           <w:szCs w:val="28"/>
         </w:rPr>
       </w:pPr>
-      <w:proofErr w:type="spellStart"/>
       <w:r>
         <w:rPr>
           <w:b/>
@@ -10622,9 +10163,8 @@
           <w:sz w:val="28"/>
           <w:szCs w:val="28"/>
         </w:rPr>
-        <w:t>Подвыборка</w:t>
-      </w:r>
-      <w:proofErr w:type="spellEnd"/>
+        <w:t>Подвыборка из 200 элементов (рисунок </w:t>
+      </w:r>
       <w:r>
         <w:rPr>
           <w:b/>
@@ -10632,7 +10172,7 @@
           <w:sz w:val="28"/>
           <w:szCs w:val="28"/>
         </w:rPr>
-        <w:t xml:space="preserve"> из 200 элементов (рисунок </w:t>
+        <w:t>7</w:t>
       </w:r>
       <w:r>
         <w:rPr>
@@ -10641,8 +10181,26 @@
           <w:sz w:val="28"/>
           <w:szCs w:val="28"/>
         </w:rPr>
-        <w:t>7</w:t>
-      </w:r>
+        <w:t>)</w:t>
+      </w:r>
+      <w:r>
+        <w:rPr>
+          <w:sz w:val="28"/>
+          <w:szCs w:val="28"/>
+        </w:rPr>
+        <w:t>. Форма гистограммы близка к полной выборке, а также пики различимы. Это свидетельствует о достаточной репрезентативности выборки объёмом 200 элементов для визуальной идентификации типа распределения.</w:t>
+      </w:r>
+    </w:p>
+    <w:p>
+      <w:pPr>
+        <w:spacing w:line="360" w:lineRule="auto"/>
+        <w:ind w:firstLine="720"/>
+        <w:jc w:val="both"/>
+        <w:rPr>
+          <w:sz w:val="28"/>
+          <w:szCs w:val="28"/>
+        </w:rPr>
+      </w:pPr>
       <w:r>
         <w:rPr>
           <w:b/>
@@ -10650,45 +10208,7 @@
           <w:sz w:val="28"/>
           <w:szCs w:val="28"/>
         </w:rPr>
-        <w:t>)</w:t>
-      </w:r>
-      <w:r>
-        <w:rPr>
-          <w:sz w:val="28"/>
-          <w:szCs w:val="28"/>
-        </w:rPr>
-        <w:t>. Форма гистограммы близка к полной выборке, а также пики различимы. Это свидетельствует о достаточной репрезентативности выборки объёмом 200 элементов для визуальной идентификации типа распределения.</w:t>
-      </w:r>
-    </w:p>
-    <w:p>
-      <w:pPr>
-        <w:spacing w:line="360" w:lineRule="auto"/>
-        <w:ind w:firstLine="720"/>
-        <w:jc w:val="both"/>
-        <w:rPr>
-          <w:sz w:val="28"/>
-          <w:szCs w:val="28"/>
-        </w:rPr>
-      </w:pPr>
-      <w:proofErr w:type="spellStart"/>
-      <w:r>
-        <w:rPr>
-          <w:b/>
-          <w:bCs/>
-          <w:sz w:val="28"/>
-          <w:szCs w:val="28"/>
-        </w:rPr>
-        <w:t>Подвыборка</w:t>
-      </w:r>
-      <w:proofErr w:type="spellEnd"/>
-      <w:r>
-        <w:rPr>
-          <w:b/>
-          <w:bCs/>
-          <w:sz w:val="28"/>
-          <w:szCs w:val="28"/>
-        </w:rPr>
-        <w:t xml:space="preserve"> из 100 элементов (рисунок </w:t>
+        <w:t>Подвыборка из 100 элементов (рисунок </w:t>
       </w:r>
       <w:r>
         <w:rPr>
@@ -10743,7 +10263,6 @@
           <w:szCs w:val="28"/>
         </w:rPr>
       </w:pPr>
-      <w:proofErr w:type="spellStart"/>
       <w:r>
         <w:rPr>
           <w:b/>
@@ -10751,17 +10270,7 @@
           <w:sz w:val="28"/>
           <w:szCs w:val="28"/>
         </w:rPr>
-        <w:t>Подвыборка</w:t>
-      </w:r>
-      <w:proofErr w:type="spellEnd"/>
-      <w:r>
-        <w:rPr>
-          <w:b/>
-          <w:bCs/>
-          <w:sz w:val="28"/>
-          <w:szCs w:val="28"/>
-        </w:rPr>
-        <w:t xml:space="preserve"> из 10 элементов (рисунок </w:t>
+        <w:t>Подвыборка из 10 элементов (рисунок </w:t>
       </w:r>
       <w:r>
         <w:rPr>
@@ -10949,31 +10458,7 @@
             <w:sz w:val="28"/>
             <w:szCs w:val="28"/>
           </w:rPr>
-          <m:t>x ≈-</m:t>
-        </m:r>
-        <m:r>
-          <w:rPr>
-            <w:rFonts w:ascii="Cambria Math" w:hAnsi="Cambria Math"/>
-            <w:sz w:val="28"/>
-            <w:szCs w:val="28"/>
-          </w:rPr>
-          <m:t>5</m:t>
-        </m:r>
-        <m:r>
-          <w:rPr>
-            <w:rFonts w:ascii="Cambria Math" w:hAnsi="Cambria Math"/>
-            <w:sz w:val="28"/>
-            <w:szCs w:val="28"/>
-          </w:rPr>
-          <m:t>,</m:t>
-        </m:r>
-        <m:r>
-          <w:rPr>
-            <w:rFonts w:ascii="Cambria Math" w:hAnsi="Cambria Math"/>
-            <w:sz w:val="28"/>
-            <w:szCs w:val="28"/>
-          </w:rPr>
-          <m:t>2</m:t>
+          <m:t>x ≈-5,2</m:t>
         </m:r>
       </m:oMath>
       <w:r>
@@ -10990,31 +10475,7 @@
             <w:sz w:val="28"/>
             <w:szCs w:val="28"/>
           </w:rPr>
-          <m:t>x ≈ </m:t>
-        </m:r>
-        <m:r>
-          <w:rPr>
-            <w:rFonts w:ascii="Cambria Math" w:hAnsi="Cambria Math"/>
-            <w:sz w:val="28"/>
-            <w:szCs w:val="28"/>
-          </w:rPr>
-          <m:t>7</m:t>
-        </m:r>
-        <m:r>
-          <w:rPr>
-            <w:rFonts w:ascii="Cambria Math" w:hAnsi="Cambria Math"/>
-            <w:sz w:val="28"/>
-            <w:szCs w:val="28"/>
-          </w:rPr>
-          <m:t>,</m:t>
-        </m:r>
-        <m:r>
-          <w:rPr>
-            <w:rFonts w:ascii="Cambria Math" w:hAnsi="Cambria Math"/>
-            <w:sz w:val="28"/>
-            <w:szCs w:val="28"/>
-          </w:rPr>
-          <m:t>5</m:t>
+          <m:t>x ≈ 7,5</m:t>
         </m:r>
       </m:oMath>
       <w:r>
@@ -11057,23 +10518,7 @@
             <w:sz w:val="28"/>
             <w:szCs w:val="28"/>
           </w:rPr>
-          <m:t>loc ≈ (-5,2 + 7,5) / 2 = 1</m:t>
-        </m:r>
-        <m:r>
-          <w:rPr>
-            <w:rFonts w:ascii="Cambria Math" w:hAnsi="Cambria Math"/>
-            <w:sz w:val="28"/>
-            <w:szCs w:val="28"/>
-          </w:rPr>
-          <m:t>,</m:t>
-        </m:r>
-        <m:r>
-          <w:rPr>
-            <w:rFonts w:ascii="Cambria Math" w:hAnsi="Cambria Math"/>
-            <w:sz w:val="28"/>
-            <w:szCs w:val="28"/>
-          </w:rPr>
-          <m:t>15</m:t>
+          <m:t>loc ≈ (-5,2 + 7,5) / 2 = 1,15</m:t>
         </m:r>
       </m:oMath>
       <w:r>
@@ -13717,7 +13162,6 @@
         <w:rPr>
           <w:sz w:val="28"/>
           <w:szCs w:val="28"/>
-          <w:lang w:val="en-US"/>
         </w:rPr>
       </w:pPr>
     </w:p>
@@ -14131,23 +13575,7 @@
               <w:sz w:val="28"/>
               <w:szCs w:val="28"/>
             </w:rPr>
-            <m:t xml:space="preserve"> = 7</m:t>
-          </m:r>
-          <m:r>
-            <w:rPr>
-              <w:rFonts w:ascii="Cambria Math" w:hAnsi="Cambria Math"/>
-              <w:sz w:val="28"/>
-              <w:szCs w:val="28"/>
-            </w:rPr>
-            <m:t>,</m:t>
-          </m:r>
-          <m:r>
-            <w:rPr>
-              <w:rFonts w:ascii="Cambria Math" w:hAnsi="Cambria Math"/>
-              <w:sz w:val="28"/>
-              <w:szCs w:val="28"/>
-            </w:rPr>
-            <m:t>066214</m:t>
+            <m:t xml:space="preserve"> = 7,066214</m:t>
           </m:r>
         </m:oMath>
       </m:oMathPara>
@@ -14211,23 +13639,7 @@
               <w:sz w:val="28"/>
               <w:szCs w:val="28"/>
             </w:rPr>
-            <m:t xml:space="preserve"> = 0</m:t>
-          </m:r>
-          <m:r>
-            <w:rPr>
-              <w:rFonts w:ascii="Cambria Math" w:hAnsi="Cambria Math"/>
-              <w:sz w:val="28"/>
-              <w:szCs w:val="28"/>
-            </w:rPr>
-            <m:t>,</m:t>
-          </m:r>
-          <m:r>
-            <w:rPr>
-              <w:rFonts w:ascii="Cambria Math" w:hAnsi="Cambria Math"/>
-              <w:sz w:val="28"/>
-              <w:szCs w:val="28"/>
-            </w:rPr>
-            <m:t>839291</m:t>
+            <m:t xml:space="preserve"> = 0,839291</m:t>
           </m:r>
         </m:oMath>
       </m:oMathPara>
@@ -15077,23 +14489,7 @@
               <w:sz w:val="28"/>
               <w:szCs w:val="28"/>
             </w:rPr>
-            <m:t xml:space="preserve"> = 7</m:t>
-          </m:r>
-          <m:r>
-            <w:rPr>
-              <w:rFonts w:ascii="Cambria Math" w:hAnsi="Cambria Math"/>
-              <w:sz w:val="28"/>
-              <w:szCs w:val="28"/>
-            </w:rPr>
-            <m:t>,</m:t>
-          </m:r>
-          <m:r>
-            <w:rPr>
-              <w:rFonts w:ascii="Cambria Math" w:hAnsi="Cambria Math"/>
-              <w:sz w:val="28"/>
-              <w:szCs w:val="28"/>
-            </w:rPr>
-            <m:t>16451</m:t>
+            <m:t xml:space="preserve"> = 7,16451</m:t>
           </m:r>
         </m:oMath>
       </m:oMathPara>
@@ -15160,23 +14556,7 @@
               <w:sz w:val="28"/>
               <w:szCs w:val="28"/>
             </w:rPr>
-            <m:t xml:space="preserve"> = 0</m:t>
-          </m:r>
-          <m:r>
-            <w:rPr>
-              <w:rFonts w:ascii="Cambria Math" w:hAnsi="Cambria Math"/>
-              <w:sz w:val="28"/>
-              <w:szCs w:val="28"/>
-            </w:rPr>
-            <m:t>,</m:t>
-          </m:r>
-          <m:r>
-            <w:rPr>
-              <w:rFonts w:ascii="Cambria Math" w:hAnsi="Cambria Math"/>
-              <w:sz w:val="28"/>
-              <w:szCs w:val="28"/>
-            </w:rPr>
-            <m:t>75567</m:t>
+            <m:t xml:space="preserve"> = 0,75567</m:t>
           </m:r>
         </m:oMath>
       </m:oMathPara>
@@ -15316,23 +14696,7 @@
               <w:sz w:val="28"/>
               <w:szCs w:val="28"/>
             </w:rPr>
-            <m:t xml:space="preserve"> = 7</m:t>
-          </m:r>
-          <m:r>
-            <w:rPr>
-              <w:rFonts w:ascii="Cambria Math" w:hAnsi="Cambria Math"/>
-              <w:sz w:val="28"/>
-              <w:szCs w:val="28"/>
-            </w:rPr>
-            <m:t>,</m:t>
-          </m:r>
-          <m:r>
-            <w:rPr>
-              <w:rFonts w:ascii="Cambria Math" w:hAnsi="Cambria Math"/>
-              <w:sz w:val="28"/>
-              <w:szCs w:val="28"/>
-            </w:rPr>
-            <m:t>16451</m:t>
+            <m:t xml:space="preserve"> = 7,16451</m:t>
           </m:r>
         </m:oMath>
       </m:oMathPara>
@@ -15399,23 +14763,7 @@
               <w:sz w:val="28"/>
               <w:szCs w:val="28"/>
             </w:rPr>
-            <m:t xml:space="preserve"> = 0</m:t>
-          </m:r>
-          <m:r>
-            <w:rPr>
-              <w:rFonts w:ascii="Cambria Math" w:hAnsi="Cambria Math"/>
-              <w:sz w:val="28"/>
-              <w:szCs w:val="28"/>
-            </w:rPr>
-            <m:t>,</m:t>
-          </m:r>
-          <m:r>
-            <w:rPr>
-              <w:rFonts w:ascii="Cambria Math" w:hAnsi="Cambria Math"/>
-              <w:sz w:val="28"/>
-              <w:szCs w:val="28"/>
-            </w:rPr>
-            <m:t>75567</m:t>
+            <m:t xml:space="preserve"> = 0,75567</m:t>
           </m:r>
         </m:oMath>
       </m:oMathPara>
@@ -15717,23 +15065,7 @@
           <w:sz w:val="28"/>
           <w:szCs w:val="28"/>
         </w:rPr>
-        <w:t xml:space="preserve">Для проверки </w:t>
-      </w:r>
-      <w:proofErr w:type="spellStart"/>
-      <w:r>
-        <w:rPr>
-          <w:sz w:val="28"/>
-          <w:szCs w:val="28"/>
-        </w:rPr>
-        <w:t>несмещённости</w:t>
-      </w:r>
-      <w:proofErr w:type="spellEnd"/>
-      <w:r>
-        <w:rPr>
-          <w:sz w:val="28"/>
-          <w:szCs w:val="28"/>
-        </w:rPr>
-        <w:t xml:space="preserve"> было сгенерировано 1000 выборок объём</w:t>
+        <w:t>Для проверки несмещённости было сгенерировано 1000 выборок объём</w:t>
       </w:r>
       <w:r>
         <w:rPr>
@@ -16026,23 +15358,7 @@
               <w:sz w:val="28"/>
               <w:szCs w:val="28"/>
             </w:rPr>
-            <m:t>=7</m:t>
-          </m:r>
-          <m:r>
-            <w:rPr>
-              <w:rFonts w:ascii="Cambria Math" w:hAnsi="Cambria Math"/>
-              <w:sz w:val="28"/>
-              <w:szCs w:val="28"/>
-            </w:rPr>
-            <m:t>,</m:t>
-          </m:r>
-          <m:r>
-            <w:rPr>
-              <w:rFonts w:ascii="Cambria Math" w:hAnsi="Cambria Math"/>
-              <w:sz w:val="28"/>
-              <w:szCs w:val="28"/>
-            </w:rPr>
-            <m:t>15143</m:t>
+            <m:t>=7,15143</m:t>
           </m:r>
         </m:oMath>
       </m:oMathPara>
@@ -16065,39 +15381,7 @@
               <w:sz w:val="28"/>
               <w:szCs w:val="28"/>
             </w:rPr>
-            <m:t xml:space="preserve">  истинное </m:t>
-          </m:r>
-          <m:r>
-            <w:rPr>
-              <w:rFonts w:ascii="Cambria Math" w:hAnsi="Cambria Math"/>
-              <w:sz w:val="28"/>
-              <w:szCs w:val="28"/>
-            </w:rPr>
-            <m:t>a</m:t>
-          </m:r>
-          <m:r>
-            <w:rPr>
-              <w:rFonts w:ascii="Cambria Math" w:hAnsi="Cambria Math"/>
-              <w:sz w:val="28"/>
-              <w:szCs w:val="28"/>
-            </w:rPr>
-            <m:t xml:space="preserve"> = 7</m:t>
-          </m:r>
-          <m:r>
-            <w:rPr>
-              <w:rFonts w:ascii="Cambria Math" w:hAnsi="Cambria Math"/>
-              <w:sz w:val="28"/>
-              <w:szCs w:val="28"/>
-            </w:rPr>
-            <m:t>,</m:t>
-          </m:r>
-          <m:r>
-            <w:rPr>
-              <w:rFonts w:ascii="Cambria Math" w:hAnsi="Cambria Math"/>
-              <w:sz w:val="28"/>
-              <w:szCs w:val="28"/>
-            </w:rPr>
-            <m:t xml:space="preserve">16451 </m:t>
+            <m:t xml:space="preserve">  истинное a = 7,16451 </m:t>
           </m:r>
         </m:oMath>
       </m:oMathPara>
@@ -16122,23 +15406,7 @@
               <w:sz w:val="28"/>
               <w:szCs w:val="28"/>
             </w:rPr>
-            <m:t xml:space="preserve"> смещение = -0</m:t>
-          </m:r>
-          <m:r>
-            <w:rPr>
-              <w:rFonts w:ascii="Cambria Math" w:hAnsi="Cambria Math"/>
-              <w:sz w:val="28"/>
-              <w:szCs w:val="28"/>
-            </w:rPr>
-            <m:t>,</m:t>
-          </m:r>
-          <m:r>
-            <w:rPr>
-              <w:rFonts w:ascii="Cambria Math" w:hAnsi="Cambria Math"/>
-              <w:sz w:val="28"/>
-              <w:szCs w:val="28"/>
-            </w:rPr>
-            <m:t>013082</m:t>
+            <m:t xml:space="preserve"> смещение = -0,013082</m:t>
           </m:r>
         </m:oMath>
       </m:oMathPara>
@@ -16211,15 +15479,7 @@
                       <w:sz w:val="28"/>
                       <w:szCs w:val="28"/>
                     </w:rPr>
-                    <m:t>m</m:t>
-                  </m:r>
-                  <m:r>
-                    <w:rPr>
-                      <w:rFonts w:ascii="Cambria Math" w:hAnsi="Cambria Math"/>
-                      <w:sz w:val="28"/>
-                      <w:szCs w:val="28"/>
-                    </w:rPr>
-                    <m:t>m</m:t>
+                    <m:t>mm</m:t>
                   </m:r>
                 </m:sub>
               </m:sSub>
@@ -16231,23 +15491,7 @@
               <w:sz w:val="28"/>
               <w:szCs w:val="28"/>
             </w:rPr>
-            <m:t>=0</m:t>
-          </m:r>
-          <m:r>
-            <w:rPr>
-              <w:rFonts w:ascii="Cambria Math" w:hAnsi="Cambria Math"/>
-              <w:sz w:val="28"/>
-              <w:szCs w:val="28"/>
-            </w:rPr>
-            <m:t>,</m:t>
-          </m:r>
-          <m:r>
-            <w:rPr>
-              <w:rFonts w:ascii="Cambria Math" w:hAnsi="Cambria Math"/>
-              <w:sz w:val="28"/>
-              <w:szCs w:val="28"/>
-            </w:rPr>
-            <m:t>743076</m:t>
+            <m:t>=0,743076</m:t>
           </m:r>
         </m:oMath>
       </m:oMathPara>
@@ -16270,23 +15514,7 @@
               <w:sz w:val="28"/>
               <w:szCs w:val="28"/>
             </w:rPr>
-            <m:t>истинное loc = 0</m:t>
-          </m:r>
-          <m:r>
-            <w:rPr>
-              <w:rFonts w:ascii="Cambria Math" w:hAnsi="Cambria Math"/>
-              <w:sz w:val="28"/>
-              <w:szCs w:val="28"/>
-            </w:rPr>
-            <m:t>,</m:t>
-          </m:r>
-          <m:r>
-            <w:rPr>
-              <w:rFonts w:ascii="Cambria Math" w:hAnsi="Cambria Math"/>
-              <w:sz w:val="28"/>
-              <w:szCs w:val="28"/>
-            </w:rPr>
-            <m:t xml:space="preserve">75567 </m:t>
+            <m:t xml:space="preserve">истинное loc = 0,75567 </m:t>
           </m:r>
         </m:oMath>
       </m:oMathPara>
@@ -16309,23 +15537,7 @@
               <w:sz w:val="28"/>
               <w:szCs w:val="28"/>
             </w:rPr>
-            <m:t>смещение = -0</m:t>
-          </m:r>
-          <m:r>
-            <w:rPr>
-              <w:rFonts w:ascii="Cambria Math" w:hAnsi="Cambria Math"/>
-              <w:sz w:val="28"/>
-              <w:szCs w:val="28"/>
-            </w:rPr>
-            <m:t>,</m:t>
-          </m:r>
-          <m:r>
-            <w:rPr>
-              <w:rFonts w:ascii="Cambria Math" w:hAnsi="Cambria Math"/>
-              <w:sz w:val="28"/>
-              <w:szCs w:val="28"/>
-            </w:rPr>
-            <m:t>012599</m:t>
+            <m:t>смещение = -0,012599</m:t>
           </m:r>
         </m:oMath>
       </m:oMathPara>
@@ -16525,23 +15737,7 @@
               <w:sz w:val="28"/>
               <w:szCs w:val="28"/>
             </w:rPr>
-            <m:t>=7</m:t>
-          </m:r>
-          <m:r>
-            <w:rPr>
-              <w:rFonts w:ascii="Cambria Math" w:hAnsi="Cambria Math"/>
-              <w:sz w:val="28"/>
-              <w:szCs w:val="28"/>
-            </w:rPr>
-            <m:t>,</m:t>
-          </m:r>
-          <m:r>
-            <w:rPr>
-              <w:rFonts w:ascii="Cambria Math" w:hAnsi="Cambria Math"/>
-              <w:sz w:val="28"/>
-              <w:szCs w:val="28"/>
-            </w:rPr>
-            <m:t>17031</m:t>
+            <m:t>=7,17031</m:t>
           </m:r>
         </m:oMath>
       </m:oMathPara>
@@ -16564,39 +15760,7 @@
               <w:sz w:val="28"/>
               <w:szCs w:val="28"/>
             </w:rPr>
-            <m:t xml:space="preserve"> истинное </m:t>
-          </m:r>
-          <m:r>
-            <w:rPr>
-              <w:rFonts w:ascii="Cambria Math" w:hAnsi="Cambria Math"/>
-              <w:sz w:val="28"/>
-              <w:szCs w:val="28"/>
-            </w:rPr>
-            <m:t>a</m:t>
-          </m:r>
-          <m:r>
-            <w:rPr>
-              <w:rFonts w:ascii="Cambria Math" w:hAnsi="Cambria Math"/>
-              <w:sz w:val="28"/>
-              <w:szCs w:val="28"/>
-            </w:rPr>
-            <m:t xml:space="preserve"> = 7</m:t>
-          </m:r>
-          <m:r>
-            <w:rPr>
-              <w:rFonts w:ascii="Cambria Math" w:hAnsi="Cambria Math"/>
-              <w:sz w:val="28"/>
-              <w:szCs w:val="28"/>
-            </w:rPr>
-            <m:t>,</m:t>
-          </m:r>
-          <m:r>
-            <w:rPr>
-              <w:rFonts w:ascii="Cambria Math" w:hAnsi="Cambria Math"/>
-              <w:sz w:val="28"/>
-              <w:szCs w:val="28"/>
-            </w:rPr>
-            <m:t>16451</m:t>
+            <m:t xml:space="preserve"> истинное a = 7,16451</m:t>
           </m:r>
         </m:oMath>
       </m:oMathPara>
@@ -16621,23 +15785,7 @@
               <w:sz w:val="28"/>
               <w:szCs w:val="28"/>
             </w:rPr>
-            <m:t xml:space="preserve">  смещение = 0</m:t>
-          </m:r>
-          <m:r>
-            <w:rPr>
-              <w:rFonts w:ascii="Cambria Math" w:hAnsi="Cambria Math"/>
-              <w:sz w:val="28"/>
-              <w:szCs w:val="28"/>
-            </w:rPr>
-            <m:t>,</m:t>
-          </m:r>
-          <m:r>
-            <w:rPr>
-              <w:rFonts w:ascii="Cambria Math" w:hAnsi="Cambria Math"/>
-              <w:sz w:val="28"/>
-              <w:szCs w:val="28"/>
-            </w:rPr>
-            <m:t>005791</m:t>
+            <m:t xml:space="preserve">  смещение = 0,005791</m:t>
           </m:r>
         </m:oMath>
       </m:oMathPara>
@@ -16710,15 +15858,7 @@
                       <w:sz w:val="28"/>
                       <w:szCs w:val="28"/>
                     </w:rPr>
-                    <m:t>m</m:t>
-                  </m:r>
-                  <m:r>
-                    <w:rPr>
-                      <w:rFonts w:ascii="Cambria Math" w:hAnsi="Cambria Math"/>
-                      <w:sz w:val="28"/>
-                      <w:szCs w:val="28"/>
-                    </w:rPr>
-                    <m:t>l</m:t>
+                    <m:t>ml</m:t>
                   </m:r>
                   <m:r>
                     <w:rPr>
@@ -16739,23 +15879,7 @@
               <w:sz w:val="28"/>
               <w:szCs w:val="28"/>
             </w:rPr>
-            <m:t>=0</m:t>
-          </m:r>
-          <m:r>
-            <w:rPr>
-              <w:rFonts w:ascii="Cambria Math" w:hAnsi="Cambria Math"/>
-              <w:sz w:val="28"/>
-              <w:szCs w:val="28"/>
-            </w:rPr>
-            <m:t>,</m:t>
-          </m:r>
-          <m:r>
-            <w:rPr>
-              <w:rFonts w:ascii="Cambria Math" w:hAnsi="Cambria Math"/>
-              <w:sz w:val="28"/>
-              <w:szCs w:val="28"/>
-            </w:rPr>
-            <m:t>75650</m:t>
+            <m:t>=0,75650</m:t>
           </m:r>
         </m:oMath>
       </m:oMathPara>
@@ -16778,23 +15902,7 @@
               <w:sz w:val="28"/>
               <w:szCs w:val="28"/>
             </w:rPr>
-            <m:t xml:space="preserve"> истинное loc = 0</m:t>
-          </m:r>
-          <m:r>
-            <w:rPr>
-              <w:rFonts w:ascii="Cambria Math" w:hAnsi="Cambria Math"/>
-              <w:sz w:val="28"/>
-              <w:szCs w:val="28"/>
-            </w:rPr>
-            <m:t>,</m:t>
-          </m:r>
-          <m:r>
-            <w:rPr>
-              <w:rFonts w:ascii="Cambria Math" w:hAnsi="Cambria Math"/>
-              <w:sz w:val="28"/>
-              <w:szCs w:val="28"/>
-            </w:rPr>
-            <m:t xml:space="preserve">75567 </m:t>
+            <m:t xml:space="preserve"> истинное loc = 0,75567 </m:t>
           </m:r>
         </m:oMath>
       </m:oMathPara>
@@ -16819,23 +15927,7 @@
               <w:sz w:val="28"/>
               <w:szCs w:val="28"/>
             </w:rPr>
-            <m:t xml:space="preserve"> смещение = 0</m:t>
-          </m:r>
-          <m:r>
-            <w:rPr>
-              <w:rFonts w:ascii="Cambria Math" w:hAnsi="Cambria Math"/>
-              <w:sz w:val="28"/>
-              <w:szCs w:val="28"/>
-            </w:rPr>
-            <m:t>,</m:t>
-          </m:r>
-          <m:r>
-            <w:rPr>
-              <w:rFonts w:ascii="Cambria Math" w:hAnsi="Cambria Math"/>
-              <w:sz w:val="28"/>
-              <w:szCs w:val="28"/>
-            </w:rPr>
-            <m:t>0008321</m:t>
+            <m:t xml:space="preserve"> смещение = 0,0008321</m:t>
           </m:r>
         </m:oMath>
       </m:oMathPara>
@@ -17093,23 +16185,7 @@
           <w:sz w:val="28"/>
           <w:szCs w:val="28"/>
         </w:rPr>
-        <w:t xml:space="preserve">Листинг 18. Проверка </w:t>
-      </w:r>
-      <w:proofErr w:type="spellStart"/>
-      <w:r>
-        <w:rPr>
-          <w:sz w:val="28"/>
-          <w:szCs w:val="28"/>
-        </w:rPr>
-        <w:t>несмещенности</w:t>
-      </w:r>
-      <w:proofErr w:type="spellEnd"/>
-      <w:r>
-        <w:rPr>
-          <w:sz w:val="28"/>
-          <w:szCs w:val="28"/>
-        </w:rPr>
-        <w:t xml:space="preserve"> с помощью ММ.</w:t>
+        <w:t>Листинг 18. Проверка несмещенности с помощью ММ.</w:t>
       </w:r>
     </w:p>
     <w:p>
@@ -17182,23 +16258,7 @@
           <w:sz w:val="28"/>
           <w:szCs w:val="28"/>
         </w:rPr>
-        <w:t xml:space="preserve">Листинг 19. Проверка </w:t>
-      </w:r>
-      <w:proofErr w:type="spellStart"/>
-      <w:r>
-        <w:rPr>
-          <w:sz w:val="28"/>
-          <w:szCs w:val="28"/>
-        </w:rPr>
-        <w:t>несмещенности</w:t>
-      </w:r>
-      <w:proofErr w:type="spellEnd"/>
-      <w:r>
-        <w:rPr>
-          <w:sz w:val="28"/>
-          <w:szCs w:val="28"/>
-        </w:rPr>
-        <w:t xml:space="preserve"> с помощью ММП.</w:t>
+        <w:t>Листинг 19. Проверка несмещенности с помощью ММП.</w:t>
       </w:r>
     </w:p>
     <w:p>
@@ -17367,23 +16427,7 @@
               <w:sz w:val="28"/>
               <w:szCs w:val="28"/>
             </w:rPr>
-            <m:t xml:space="preserve"> = 7</m:t>
-          </m:r>
-          <m:r>
-            <w:rPr>
-              <w:rFonts w:ascii="Cambria Math" w:hAnsi="Cambria Math"/>
-              <w:sz w:val="28"/>
-              <w:szCs w:val="28"/>
-            </w:rPr>
-            <m:t>,</m:t>
-          </m:r>
-          <m:r>
-            <w:rPr>
-              <w:rFonts w:ascii="Cambria Math" w:hAnsi="Cambria Math"/>
-              <w:sz w:val="28"/>
-              <w:szCs w:val="28"/>
-            </w:rPr>
-            <m:t>16451</m:t>
+            <m:t xml:space="preserve"> = 7,16451</m:t>
           </m:r>
         </m:oMath>
       </m:oMathPara>
@@ -17450,23 +16494,7 @@
               <w:sz w:val="28"/>
               <w:szCs w:val="28"/>
             </w:rPr>
-            <m:t xml:space="preserve"> = 0</m:t>
-          </m:r>
-          <m:r>
-            <w:rPr>
-              <w:rFonts w:ascii="Cambria Math" w:hAnsi="Cambria Math"/>
-              <w:sz w:val="28"/>
-              <w:szCs w:val="28"/>
-            </w:rPr>
-            <m:t>,</m:t>
-          </m:r>
-          <m:r>
-            <w:rPr>
-              <w:rFonts w:ascii="Cambria Math" w:hAnsi="Cambria Math"/>
-              <w:sz w:val="28"/>
-              <w:szCs w:val="28"/>
-            </w:rPr>
-            <m:t>75567</m:t>
+            <m:t xml:space="preserve"> = 0,75567</m:t>
           </m:r>
         </m:oMath>
       </m:oMathPara>
@@ -18153,23 +17181,7 @@
           <w:sz w:val="28"/>
           <w:szCs w:val="28"/>
         </w:rPr>
-        <w:t xml:space="preserve">Эффективной называется оценка, дисперсия которой близка к минимально возможной. Согласно неравенству </w:t>
-      </w:r>
-      <w:proofErr w:type="spellStart"/>
-      <w:r>
-        <w:rPr>
-          <w:sz w:val="28"/>
-          <w:szCs w:val="28"/>
-        </w:rPr>
-        <w:t>Рао</w:t>
-      </w:r>
-      <w:proofErr w:type="spellEnd"/>
-      <w:r>
-        <w:rPr>
-          <w:sz w:val="28"/>
-          <w:szCs w:val="28"/>
-        </w:rPr>
-        <w:t>-Крамера:</w:t>
+        <w:t>Эффективной называется оценка, дисперсия которой близка к минимально возможной. Согласно неравенству Рао-Крамера:</w:t>
       </w:r>
     </w:p>
     <w:p>
@@ -19162,23 +18174,7 @@
           <w:sz w:val="28"/>
           <w:szCs w:val="28"/>
         </w:rPr>
-        <w:t xml:space="preserve">Поскольку явной формулы для </w:t>
-      </w:r>
-      <w:proofErr w:type="spellStart"/>
-      <w:r>
-        <w:rPr>
-          <w:sz w:val="28"/>
-          <w:szCs w:val="28"/>
-        </w:rPr>
-        <w:t>тригамма</w:t>
-      </w:r>
-      <w:proofErr w:type="spellEnd"/>
-      <w:r>
-        <w:rPr>
-          <w:sz w:val="28"/>
-          <w:szCs w:val="28"/>
-        </w:rPr>
-        <w:t xml:space="preserve">-функции </w:t>
+        <w:t xml:space="preserve">Поскольку явной формулы для тригамма-функции </w:t>
       </w:r>
       <m:oMath>
         <m:r>
@@ -19673,23 +18669,7 @@
               <w:sz w:val="28"/>
               <w:szCs w:val="28"/>
             </w:rPr>
-            <m:t xml:space="preserve"> = 7</m:t>
-          </m:r>
-          <m:r>
-            <w:rPr>
-              <w:rFonts w:ascii="Cambria Math" w:hAnsi="Cambria Math"/>
-              <w:sz w:val="28"/>
-              <w:szCs w:val="28"/>
-            </w:rPr>
-            <m:t>,</m:t>
-          </m:r>
-          <m:r>
-            <w:rPr>
-              <w:rFonts w:ascii="Cambria Math" w:hAnsi="Cambria Math"/>
-              <w:sz w:val="28"/>
-              <w:szCs w:val="28"/>
-            </w:rPr>
-            <m:t>164519</m:t>
+            <m:t xml:space="preserve"> = 7,164519</m:t>
           </m:r>
         </m:oMath>
       </m:oMathPara>
@@ -19754,23 +18734,7 @@
               <w:sz w:val="28"/>
               <w:szCs w:val="28"/>
             </w:rPr>
-            <m:t xml:space="preserve"> = 0</m:t>
-          </m:r>
-          <m:r>
-            <w:rPr>
-              <w:rFonts w:ascii="Cambria Math" w:hAnsi="Cambria Math"/>
-              <w:sz w:val="28"/>
-              <w:szCs w:val="28"/>
-            </w:rPr>
-            <m:t>,</m:t>
-          </m:r>
-          <m:r>
-            <w:rPr>
-              <w:rFonts w:ascii="Cambria Math" w:hAnsi="Cambria Math"/>
-              <w:sz w:val="28"/>
-              <w:szCs w:val="28"/>
-            </w:rPr>
-            <m:t>75567</m:t>
+            <m:t xml:space="preserve"> = 0,75567</m:t>
           </m:r>
         </m:oMath>
       </m:oMathPara>
@@ -19856,25 +18820,7 @@
               <w:szCs w:val="28"/>
               <w:lang w:val="en-US"/>
             </w:rPr>
-            <m:t>=0</m:t>
-          </m:r>
-          <m:r>
-            <w:rPr>
-              <w:rFonts w:ascii="Cambria Math" w:hAnsi="Cambria Math"/>
-              <w:sz w:val="28"/>
-              <w:szCs w:val="28"/>
-              <w:lang w:val="en-US"/>
-            </w:rPr>
-            <m:t>,</m:t>
-          </m:r>
-          <m:r>
-            <w:rPr>
-              <w:rFonts w:ascii="Cambria Math" w:hAnsi="Cambria Math"/>
-              <w:sz w:val="28"/>
-              <w:szCs w:val="28"/>
-              <w:lang w:val="en-US"/>
-            </w:rPr>
-            <m:t>149817</m:t>
+            <m:t>=0,149817</m:t>
           </m:r>
         </m:oMath>
       </m:oMathPara>
@@ -19901,25 +18847,7 @@
               <w:szCs w:val="28"/>
               <w:lang w:val="en-US"/>
             </w:rPr>
-            <m:t>I(loc) = 0</m:t>
-          </m:r>
-          <m:r>
-            <w:rPr>
-              <w:rFonts w:ascii="Cambria Math" w:hAnsi="Cambria Math"/>
-              <w:sz w:val="28"/>
-              <w:szCs w:val="28"/>
-              <w:lang w:val="en-US"/>
-            </w:rPr>
-            <m:t>,</m:t>
-          </m:r>
-          <m:r>
-            <w:rPr>
-              <w:rFonts w:ascii="Cambria Math" w:hAnsi="Cambria Math"/>
-              <w:sz w:val="28"/>
-              <w:szCs w:val="28"/>
-              <w:lang w:val="en-US"/>
-            </w:rPr>
-            <m:t>19362</m:t>
+            <m:t>I(loc) = 0,19362</m:t>
           </m:r>
         </m:oMath>
       </m:oMathPara>
@@ -20001,25 +18929,7 @@
               <w:szCs w:val="28"/>
               <w:lang w:val="en-US"/>
             </w:rPr>
-            <m:t>=0</m:t>
-          </m:r>
-          <m:r>
-            <w:rPr>
-              <w:rFonts w:ascii="Cambria Math" w:hAnsi="Cambria Math"/>
-              <w:sz w:val="28"/>
-              <w:szCs w:val="28"/>
-              <w:lang w:val="en-US"/>
-            </w:rPr>
-            <m:t>,</m:t>
-          </m:r>
-          <m:r>
-            <w:rPr>
-              <w:rFonts w:ascii="Cambria Math" w:hAnsi="Cambria Math"/>
-              <w:sz w:val="28"/>
-              <w:szCs w:val="28"/>
-              <w:lang w:val="en-US"/>
-            </w:rPr>
-            <m:t>02224</m:t>
+            <m:t>=0,02224</m:t>
           </m:r>
         </m:oMath>
       </m:oMathPara>
@@ -20090,25 +19000,7 @@
               <w:szCs w:val="28"/>
               <w:lang w:val="en-US"/>
             </w:rPr>
-            <m:t>(loc) = 0</m:t>
-          </m:r>
-          <m:r>
-            <w:rPr>
-              <w:rFonts w:ascii="Cambria Math" w:hAnsi="Cambria Math"/>
-              <w:sz w:val="28"/>
-              <w:szCs w:val="28"/>
-              <w:lang w:val="en-US"/>
-            </w:rPr>
-            <m:t>,</m:t>
-          </m:r>
-          <m:r>
-            <w:rPr>
-              <w:rFonts w:ascii="Cambria Math" w:hAnsi="Cambria Math"/>
-              <w:sz w:val="28"/>
-              <w:szCs w:val="28"/>
-              <w:lang w:val="en-US"/>
-            </w:rPr>
-            <m:t>01721</m:t>
+            <m:t>(loc) = 0,01721</m:t>
           </m:r>
         </m:oMath>
       </m:oMathPara>
@@ -20478,21 +19370,12 @@
         </w:rPr>
         <w:t xml:space="preserve"> дисперсия оценки методом моментов почти в 11 раз превышает нижнюю границу, что говорит о низкой эффективности выборочного среднего как оценки этого параметра. Дисперсия оценки методом максимального правдоподобия, напротив, лишь незначительно превышает границу </w:t>
       </w:r>
-      <w:proofErr w:type="spellStart"/>
-      <w:r>
-        <w:rPr>
-          <w:sz w:val="28"/>
-          <w:szCs w:val="28"/>
-        </w:rPr>
-        <w:t>Рао</w:t>
-      </w:r>
-      <w:proofErr w:type="spellEnd"/>
-      <w:r>
-        <w:rPr>
-          <w:sz w:val="28"/>
-          <w:szCs w:val="28"/>
-        </w:rPr>
-        <w:t>-Крамера</w:t>
+      <w:r>
+        <w:rPr>
+          <w:sz w:val="28"/>
+          <w:szCs w:val="28"/>
+        </w:rPr>
+        <w:t>Рао-Крамера</w:t>
       </w:r>
       <w:r>
         <w:rPr>
@@ -20831,31 +19714,7 @@
               <w:sz w:val="28"/>
               <w:szCs w:val="28"/>
             </w:rPr>
-            <m:t>R-эффективность</m:t>
-          </m:r>
-          <m:r>
-            <w:rPr>
-              <w:rFonts w:ascii="Cambria Math" w:hAnsi="Cambria Math"/>
-              <w:sz w:val="28"/>
-              <w:szCs w:val="28"/>
-            </w:rPr>
-            <m:t xml:space="preserve"> </m:t>
-          </m:r>
-          <m:r>
-            <w:rPr>
-              <w:rFonts w:ascii="Cambria Math" w:hAnsi="Cambria Math"/>
-              <w:sz w:val="28"/>
-              <w:szCs w:val="28"/>
-            </w:rPr>
-            <m:t>a</m:t>
-          </m:r>
-          <m:r>
-            <w:rPr>
-              <w:rFonts w:ascii="Cambria Math" w:hAnsi="Cambria Math"/>
-              <w:sz w:val="28"/>
-              <w:szCs w:val="28"/>
-            </w:rPr>
-            <m:t xml:space="preserve">: </m:t>
+            <m:t xml:space="preserve">R-эффективность a: </m:t>
           </m:r>
         </m:oMath>
       </m:oMathPara>
@@ -20877,23 +19736,7 @@
               <w:sz w:val="28"/>
               <w:szCs w:val="28"/>
             </w:rPr>
-            <m:t>ММ = 0</m:t>
-          </m:r>
-          <m:r>
-            <w:rPr>
-              <w:rFonts w:ascii="Cambria Math" w:hAnsi="Cambria Math"/>
-              <w:sz w:val="28"/>
-              <w:szCs w:val="28"/>
-            </w:rPr>
-            <m:t>,</m:t>
-          </m:r>
-          <m:r>
-            <w:rPr>
-              <w:rFonts w:ascii="Cambria Math" w:hAnsi="Cambria Math"/>
-              <w:sz w:val="28"/>
-              <w:szCs w:val="28"/>
-            </w:rPr>
-            <m:t xml:space="preserve">798277 </m:t>
+            <m:t xml:space="preserve">ММ = 0,798277 </m:t>
           </m:r>
         </m:oMath>
       </m:oMathPara>
@@ -20915,23 +19758,7 @@
               <w:sz w:val="28"/>
               <w:szCs w:val="28"/>
             </w:rPr>
-            <m:t>ММП = 0</m:t>
-          </m:r>
-          <m:r>
-            <w:rPr>
-              <w:rFonts w:ascii="Cambria Math" w:hAnsi="Cambria Math"/>
-              <w:sz w:val="28"/>
-              <w:szCs w:val="28"/>
-            </w:rPr>
-            <m:t>,</m:t>
-          </m:r>
-          <m:r>
-            <w:rPr>
-              <w:rFonts w:ascii="Cambria Math" w:hAnsi="Cambria Math"/>
-              <w:sz w:val="28"/>
-              <w:szCs w:val="28"/>
-            </w:rPr>
-            <m:t>753161</m:t>
+            <m:t>ММП = 0,753161</m:t>
           </m:r>
         </m:oMath>
       </m:oMathPara>
@@ -20975,23 +19802,7 @@
               <w:sz w:val="28"/>
               <w:szCs w:val="28"/>
             </w:rPr>
-            <m:t>ММ = 0</m:t>
-          </m:r>
-          <m:r>
-            <w:rPr>
-              <w:rFonts w:ascii="Cambria Math" w:hAnsi="Cambria Math"/>
-              <w:sz w:val="28"/>
-              <w:szCs w:val="28"/>
-            </w:rPr>
-            <m:t>,</m:t>
-          </m:r>
-          <m:r>
-            <w:rPr>
-              <w:rFonts w:ascii="Cambria Math" w:hAnsi="Cambria Math"/>
-              <w:sz w:val="28"/>
-              <w:szCs w:val="28"/>
-            </w:rPr>
-            <m:t>092208</m:t>
+            <m:t>ММ = 0,092208</m:t>
           </m:r>
         </m:oMath>
       </m:oMathPara>
@@ -21013,23 +19824,7 @@
               <w:sz w:val="28"/>
               <w:szCs w:val="28"/>
             </w:rPr>
-            <m:t xml:space="preserve">  ММП = 0</m:t>
-          </m:r>
-          <m:r>
-            <w:rPr>
-              <w:rFonts w:ascii="Cambria Math" w:hAnsi="Cambria Math"/>
-              <w:sz w:val="28"/>
-              <w:szCs w:val="28"/>
-            </w:rPr>
-            <m:t>,</m:t>
-          </m:r>
-          <m:r>
-            <w:rPr>
-              <w:rFonts w:ascii="Cambria Math" w:hAnsi="Cambria Math"/>
-              <w:sz w:val="28"/>
-              <w:szCs w:val="28"/>
-            </w:rPr>
-            <m:t>82226</m:t>
+            <m:t xml:space="preserve">  ММП = 0,82226</m:t>
           </m:r>
         </m:oMath>
       </m:oMathPara>
@@ -21063,23 +19858,7 @@
           <w:sz w:val="28"/>
           <w:szCs w:val="28"/>
         </w:rPr>
-        <w:t xml:space="preserve">Для параметра </w:t>
-      </w:r>
-      <w:proofErr w:type="spellStart"/>
-      <w:r>
-        <w:rPr>
-          <w:sz w:val="28"/>
-          <w:szCs w:val="28"/>
-        </w:rPr>
-        <w:t>loc</w:t>
-      </w:r>
-      <w:proofErr w:type="spellEnd"/>
-      <w:r>
-        <w:rPr>
-          <w:sz w:val="28"/>
-          <w:szCs w:val="28"/>
-        </w:rPr>
-        <w:t xml:space="preserve"> эффективность оценок различается: метод моментов использует лишь около 9% максимально достижимой точности</w:t>
+        <w:t>Для параметра loc эффективность оценок различается: метод моментов использует лишь около 9% максимально достижимой точности</w:t>
       </w:r>
       <w:r>
         <w:rPr>
@@ -24257,7 +23036,23 @@
           <w:sz w:val="28"/>
           <w:szCs w:val="28"/>
         </w:rPr>
-        <w:t>=0,05. [Листинг 23, 24, 25]</w:t>
+        <w:t xml:space="preserve">=0,05. [Листинг 23, </w:t>
+      </w:r>
+      <w:r>
+        <w:rPr>
+          <w:rFonts w:eastAsia="Arial"/>
+          <w:sz w:val="28"/>
+          <w:szCs w:val="28"/>
+        </w:rPr>
+        <w:t>24</w:t>
+      </w:r>
+      <w:r>
+        <w:rPr>
+          <w:rFonts w:eastAsia="Arial"/>
+          <w:sz w:val="28"/>
+          <w:szCs w:val="28"/>
+        </w:rPr>
+        <w:t>]</w:t>
       </w:r>
     </w:p>
     <w:p>
@@ -24518,143 +23313,10 @@
           <w:szCs w:val="28"/>
         </w:rPr>
       </w:pPr>
-      <w:r>
-        <w:rPr>
-          <w:noProof/>
-          <w:sz w:val="28"/>
-          <w:szCs w:val="28"/>
-        </w:rPr>
-        <w:lastRenderedPageBreak/>
-        <w:drawing>
-          <wp:inline distT="0" distB="0" distL="0" distR="0" wp14:anchorId="7112ACF0" wp14:editId="74817782">
-            <wp:extent cx="5940425" cy="3978275"/>
-            <wp:effectExtent l="0" t="0" r="3175" b="3175"/>
-            <wp:docPr id="1919131282" name="Рисунок 1"/>
-            <wp:cNvGraphicFramePr>
-              <a:graphicFrameLocks xmlns:a="http://schemas.openxmlformats.org/drawingml/2006/main" noChangeAspect="1"/>
-            </wp:cNvGraphicFramePr>
-            <a:graphic xmlns:a="http://schemas.openxmlformats.org/drawingml/2006/main">
-              <a:graphicData uri="http://schemas.openxmlformats.org/drawingml/2006/picture">
-                <pic:pic xmlns:pic="http://schemas.openxmlformats.org/drawingml/2006/picture">
-                  <pic:nvPicPr>
-                    <pic:cNvPr id="1919131282" name=""/>
-                    <pic:cNvPicPr/>
-                  </pic:nvPicPr>
-                  <pic:blipFill>
-                    <a:blip r:embed="rId44"/>
-                    <a:stretch>
-                      <a:fillRect/>
-                    </a:stretch>
-                  </pic:blipFill>
-                  <pic:spPr>
-                    <a:xfrm>
-                      <a:off x="0" y="0"/>
-                      <a:ext cx="5940425" cy="3978275"/>
-                    </a:xfrm>
-                    <a:prstGeom prst="rect">
-                      <a:avLst/>
-                    </a:prstGeom>
-                  </pic:spPr>
-                </pic:pic>
-              </a:graphicData>
-            </a:graphic>
-          </wp:inline>
-        </w:drawing>
-      </w:r>
-    </w:p>
-    <w:p>
-      <w:pPr>
-        <w:spacing w:line="360" w:lineRule="auto"/>
-        <w:ind w:firstLine="708"/>
-        <w:jc w:val="center"/>
-        <w:rPr>
-          <w:sz w:val="28"/>
-          <w:szCs w:val="28"/>
-        </w:rPr>
-      </w:pPr>
-      <w:r>
-        <w:rPr>
-          <w:sz w:val="28"/>
-          <w:szCs w:val="28"/>
-        </w:rPr>
-        <w:t>Листинг 24. Поиск критического значения методом Монте-Карло</w:t>
-      </w:r>
-    </w:p>
-    <w:p>
-      <w:pPr>
-        <w:spacing w:line="360" w:lineRule="auto"/>
-        <w:ind w:firstLine="708"/>
-        <w:jc w:val="both"/>
-        <w:rPr>
-          <w:sz w:val="28"/>
-          <w:szCs w:val="28"/>
-        </w:rPr>
-      </w:pPr>
-      <w:r>
-        <w:rPr>
-          <w:noProof/>
-          <w:sz w:val="28"/>
-          <w:szCs w:val="28"/>
-        </w:rPr>
-        <w:drawing>
-          <wp:inline distT="0" distB="0" distL="0" distR="0" wp14:anchorId="25D2AE0A" wp14:editId="1E6B7A32">
-            <wp:extent cx="5940425" cy="4307840"/>
-            <wp:effectExtent l="0" t="0" r="3175" b="0"/>
-            <wp:docPr id="106218734" name="Рисунок 1"/>
-            <wp:cNvGraphicFramePr>
-              <a:graphicFrameLocks xmlns:a="http://schemas.openxmlformats.org/drawingml/2006/main" noChangeAspect="1"/>
-            </wp:cNvGraphicFramePr>
-            <a:graphic xmlns:a="http://schemas.openxmlformats.org/drawingml/2006/main">
-              <a:graphicData uri="http://schemas.openxmlformats.org/drawingml/2006/picture">
-                <pic:pic xmlns:pic="http://schemas.openxmlformats.org/drawingml/2006/picture">
-                  <pic:nvPicPr>
-                    <pic:cNvPr id="106218734" name=""/>
-                    <pic:cNvPicPr/>
-                  </pic:nvPicPr>
-                  <pic:blipFill>
-                    <a:blip r:embed="rId45"/>
-                    <a:stretch>
-                      <a:fillRect/>
-                    </a:stretch>
-                  </pic:blipFill>
-                  <pic:spPr>
-                    <a:xfrm>
-                      <a:off x="0" y="0"/>
-                      <a:ext cx="5940425" cy="4307840"/>
-                    </a:xfrm>
-                    <a:prstGeom prst="rect">
-                      <a:avLst/>
-                    </a:prstGeom>
-                  </pic:spPr>
-                </pic:pic>
-              </a:graphicData>
-            </a:graphic>
-          </wp:inline>
-        </w:drawing>
-      </w:r>
-    </w:p>
-    <w:p>
-      <w:pPr>
-        <w:spacing w:line="360" w:lineRule="auto"/>
-        <w:ind w:firstLine="708"/>
-        <w:jc w:val="center"/>
-        <w:rPr>
-          <w:sz w:val="28"/>
-          <w:szCs w:val="28"/>
-        </w:rPr>
-      </w:pPr>
-      <w:r>
-        <w:rPr>
-          <w:sz w:val="28"/>
-          <w:szCs w:val="28"/>
-        </w:rPr>
-        <w:t xml:space="preserve">Листинг 25. Доля попаданий в критическую область </w:t>
-      </w:r>
-    </w:p>
-    <w:p>
-      <w:pPr>
-        <w:spacing w:line="360" w:lineRule="auto"/>
-        <w:ind w:firstLine="708"/>
+    </w:p>
+    <w:p>
+      <w:pPr>
+        <w:spacing w:line="360" w:lineRule="auto"/>
         <w:jc w:val="both"/>
         <w:rPr>
           <w:sz w:val="28"/>
@@ -24684,7 +23346,7 @@
                     <pic:cNvPicPr/>
                   </pic:nvPicPr>
                   <pic:blipFill>
-                    <a:blip r:embed="rId46"/>
+                    <a:blip r:embed="rId44"/>
                     <a:stretch>
                       <a:fillRect/>
                     </a:stretch>
@@ -24720,7 +23382,21 @@
           <w:sz w:val="28"/>
           <w:szCs w:val="28"/>
         </w:rPr>
-        <w:t xml:space="preserve">Листинг 26. </w:t>
+        <w:t>Листинг 2</w:t>
+      </w:r>
+      <w:r>
+        <w:rPr>
+          <w:sz w:val="28"/>
+          <w:szCs w:val="28"/>
+        </w:rPr>
+        <w:t>4</w:t>
+      </w:r>
+      <w:r>
+        <w:rPr>
+          <w:sz w:val="28"/>
+          <w:szCs w:val="28"/>
+        </w:rPr>
+        <w:t xml:space="preserve">. </w:t>
       </w:r>
       <w:r>
         <w:rPr>
@@ -25293,7 +23969,14 @@
           <w:sz w:val="28"/>
           <w:szCs w:val="28"/>
         </w:rPr>
-        <w:t>7]:</w:t>
+        <w:t>5</w:t>
+      </w:r>
+      <w:r>
+        <w:rPr>
+          <w:sz w:val="28"/>
+          <w:szCs w:val="28"/>
+        </w:rPr>
+        <w:t>]:</w:t>
       </w:r>
     </w:p>
     <w:p>
@@ -25633,7 +24316,7 @@
                     <pic:cNvPicPr/>
                   </pic:nvPicPr>
                   <pic:blipFill>
-                    <a:blip r:embed="rId47"/>
+                    <a:blip r:embed="rId45"/>
                     <a:stretch>
                       <a:fillRect/>
                     </a:stretch>
@@ -25676,7 +24359,7 @@
           <w:sz w:val="28"/>
           <w:szCs w:val="28"/>
         </w:rPr>
-        <w:t>7</w:t>
+        <w:t>5</w:t>
       </w:r>
       <w:r>
         <w:rPr>
@@ -25758,7 +24441,14 @@
           <w:sz w:val="28"/>
           <w:szCs w:val="28"/>
         </w:rPr>
-        <w:t>Листинг 28</w:t>
+        <w:t>Листинг 2</w:t>
+      </w:r>
+      <w:r>
+        <w:rPr>
+          <w:sz w:val="28"/>
+          <w:szCs w:val="28"/>
+        </w:rPr>
+        <w:t>6</w:t>
       </w:r>
       <w:r>
         <w:rPr>
@@ -25876,7 +24566,7 @@
                     <pic:cNvPicPr/>
                   </pic:nvPicPr>
                   <pic:blipFill>
-                    <a:blip r:embed="rId48"/>
+                    <a:blip r:embed="rId46"/>
                     <a:stretch>
                       <a:fillRect/>
                     </a:stretch>
@@ -25919,7 +24609,7 @@
           <w:sz w:val="28"/>
           <w:szCs w:val="28"/>
         </w:rPr>
-        <w:t>8</w:t>
+        <w:t>6</w:t>
       </w:r>
       <w:r>
         <w:rPr>
@@ -26339,14 +25029,7 @@
           <w:sz w:val="28"/>
           <w:szCs w:val="28"/>
         </w:rPr>
-        <w:t xml:space="preserve"> обусловлен тем, что оба распределения симметричны относительно центра</w:t>
-      </w:r>
-      <w:r>
-        <w:rPr>
-          <w:sz w:val="28"/>
-          <w:szCs w:val="28"/>
-        </w:rPr>
-        <w:t xml:space="preserve">. </w:t>
+        <w:t xml:space="preserve"> обусловлен тем, что оба распределения симметричны относительно центра. </w:t>
       </w:r>
     </w:p>
     <w:p>
@@ -26357,7 +25040,6 @@
         <w:rPr>
           <w:sz w:val="28"/>
           <w:szCs w:val="28"/>
-          <w:lang w:val="en-US"/>
         </w:rPr>
       </w:pPr>
       <w:r>
@@ -26479,7 +25161,14 @@
           <w:sz w:val="28"/>
           <w:szCs w:val="28"/>
         </w:rPr>
-        <w:t>Листинг 29</w:t>
+        <w:t>Листинг 2</w:t>
+      </w:r>
+      <w:r>
+        <w:rPr>
+          <w:sz w:val="28"/>
+          <w:szCs w:val="28"/>
+        </w:rPr>
+        <w:t>7</w:t>
       </w:r>
       <w:r>
         <w:rPr>
@@ -26502,6 +25191,7 @@
       </w:pPr>
       <w:r>
         <w:rPr>
+          <w:noProof/>
           <w:sz w:val="28"/>
           <w:szCs w:val="28"/>
           <w:lang w:val="en-US"/>
@@ -26522,7 +25212,7 @@
                     <pic:cNvPicPr/>
                   </pic:nvPicPr>
                   <pic:blipFill>
-                    <a:blip r:embed="rId49"/>
+                    <a:blip r:embed="rId47"/>
                     <a:stretch>
                       <a:fillRect/>
                     </a:stretch>
@@ -26551,15 +25241,28 @@
         <w:rPr>
           <w:sz w:val="28"/>
           <w:szCs w:val="28"/>
-          <w:lang w:val="en-US"/>
-        </w:rPr>
-      </w:pPr>
-      <w:r>
-        <w:rPr>
-          <w:sz w:val="28"/>
-          <w:szCs w:val="28"/>
-        </w:rPr>
-        <w:t xml:space="preserve">Листинг 29. Генерация выборки </w:t>
+        </w:rPr>
+      </w:pPr>
+      <w:r>
+        <w:rPr>
+          <w:sz w:val="28"/>
+          <w:szCs w:val="28"/>
+        </w:rPr>
+        <w:t>Листинг 2</w:t>
+      </w:r>
+      <w:r>
+        <w:rPr>
+          <w:sz w:val="28"/>
+          <w:szCs w:val="28"/>
+        </w:rPr>
+        <w:t>7</w:t>
+      </w:r>
+      <w:r>
+        <w:rPr>
+          <w:sz w:val="28"/>
+          <w:szCs w:val="28"/>
+        </w:rPr>
+        <w:t xml:space="preserve">. Генерация выборки </w:t>
       </w:r>
       <m:oMath>
         <m:sSub>
@@ -26591,7 +25294,6 @@
                 <w:rFonts w:ascii="Cambria Math" w:hAnsi="Cambria Math"/>
                 <w:sz w:val="28"/>
                 <w:szCs w:val="28"/>
-                <w:lang w:val="en-US"/>
               </w:rPr>
               <m:t>2</m:t>
             </m:r>
@@ -27170,7 +25872,14 @@
           <w:sz w:val="28"/>
           <w:szCs w:val="28"/>
         </w:rPr>
-        <w:t>Листинг 30</w:t>
+        <w:t xml:space="preserve">Листинг </w:t>
+      </w:r>
+      <w:r>
+        <w:rPr>
+          <w:sz w:val="28"/>
+          <w:szCs w:val="28"/>
+        </w:rPr>
+        <w:t>28</w:t>
       </w:r>
       <w:r>
         <w:rPr>
@@ -27613,6 +26322,7 @@
       </w:pPr>
       <w:r>
         <w:rPr>
+          <w:noProof/>
           <w:sz w:val="28"/>
           <w:szCs w:val="28"/>
           <w:lang w:val="en-US"/>
@@ -27634,7 +26344,7 @@
                     <pic:cNvPicPr/>
                   </pic:nvPicPr>
                   <pic:blipFill>
-                    <a:blip r:embed="rId50"/>
+                    <a:blip r:embed="rId48"/>
                     <a:stretch>
                       <a:fillRect/>
                     </a:stretch>
@@ -27670,7 +26380,21 @@
           <w:sz w:val="28"/>
           <w:szCs w:val="28"/>
         </w:rPr>
-        <w:t>Листинг 30. Функция критерия Колмогорова-Смирнова</w:t>
+        <w:t xml:space="preserve">Листинг </w:t>
+      </w:r>
+      <w:r>
+        <w:rPr>
+          <w:sz w:val="28"/>
+          <w:szCs w:val="28"/>
+        </w:rPr>
+        <w:t>28</w:t>
+      </w:r>
+      <w:r>
+        <w:rPr>
+          <w:sz w:val="28"/>
+          <w:szCs w:val="28"/>
+        </w:rPr>
+        <w:t>. Функция критерия Колмогорова-Смирнова</w:t>
       </w:r>
     </w:p>
     <w:p>
@@ -27700,47 +26424,7 @@
           <w:sz w:val="28"/>
           <w:szCs w:val="28"/>
         </w:rPr>
-        <w:t>Критическое значение найдено методом Монте-Карло</w:t>
-      </w:r>
-      <w:r>
-        <w:rPr>
-          <w:iCs/>
-          <w:sz w:val="28"/>
-          <w:szCs w:val="28"/>
-        </w:rPr>
-        <w:t xml:space="preserve"> </w:t>
-      </w:r>
-      <w:r>
-        <w:rPr>
-          <w:iCs/>
-          <w:sz w:val="28"/>
-          <w:szCs w:val="28"/>
-        </w:rPr>
-        <w:t>[</w:t>
-      </w:r>
-      <w:r>
-        <w:rPr>
-          <w:iCs/>
-          <w:sz w:val="28"/>
-          <w:szCs w:val="28"/>
-        </w:rPr>
-        <w:t>Листинг 31</w:t>
-      </w:r>
-      <w:r>
-        <w:rPr>
-          <w:iCs/>
-          <w:sz w:val="28"/>
-          <w:szCs w:val="28"/>
-        </w:rPr>
-        <w:t>]</w:t>
-      </w:r>
-      <w:r>
-        <w:rPr>
-          <w:iCs/>
-          <w:sz w:val="28"/>
-          <w:szCs w:val="28"/>
-        </w:rPr>
-        <w:t xml:space="preserve">: 1000 раз генерировались пары выборок объёмом n=m=300 из исследуемого распределения (обе — при верной H0), для каждой пары вычислялась статистика D, критическое значение взято как её 95-й процентиль: </w:t>
+        <w:t xml:space="preserve">Критическое значение найдено методом Монте-Карло: 1000 раз генерировались пары выборок объёмом n=m=300 из исследуемого распределения (обе — при верной H0), для каждой пары вычислялась статистика D, критическое значение взято как её 95-й процентиль: </w:t>
       </w:r>
       <m:oMath>
         <m:r>
@@ -27800,452 +26484,102 @@
           <w:iCs/>
           <w:sz w:val="28"/>
           <w:szCs w:val="28"/>
-          <w:lang w:val="en-US"/>
-        </w:rPr>
-      </w:pPr>
-      <w:r>
+        </w:rPr>
+      </w:pPr>
+    </w:p>
+    <w:p>
+      <w:pPr>
+        <w:spacing w:line="360" w:lineRule="auto"/>
+        <w:ind w:firstLine="708"/>
+        <w:jc w:val="both"/>
         <w:rPr>
           <w:iCs/>
           <w:sz w:val="28"/>
           <w:szCs w:val="28"/>
         </w:rPr>
-        <w:lastRenderedPageBreak/>
-        <w:drawing>
-          <wp:inline distT="0" distB="0" distL="0" distR="0" wp14:anchorId="1C866F0B" wp14:editId="5CD4EB70">
-            <wp:extent cx="5940425" cy="6740525"/>
-            <wp:effectExtent l="0" t="0" r="3175" b="3175"/>
-            <wp:docPr id="6" name="Рисунок 6"/>
-            <wp:cNvGraphicFramePr>
-              <a:graphicFrameLocks xmlns:a="http://schemas.openxmlformats.org/drawingml/2006/main" noChangeAspect="1"/>
-            </wp:cNvGraphicFramePr>
-            <a:graphic xmlns:a="http://schemas.openxmlformats.org/drawingml/2006/main">
-              <a:graphicData uri="http://schemas.openxmlformats.org/drawingml/2006/picture">
-                <pic:pic xmlns:pic="http://schemas.openxmlformats.org/drawingml/2006/picture">
-                  <pic:nvPicPr>
-                    <pic:cNvPr id="1" name=""/>
-                    <pic:cNvPicPr/>
-                  </pic:nvPicPr>
-                  <pic:blipFill>
-                    <a:blip r:embed="rId51"/>
-                    <a:stretch>
-                      <a:fillRect/>
-                    </a:stretch>
-                  </pic:blipFill>
-                  <pic:spPr>
-                    <a:xfrm>
-                      <a:off x="0" y="0"/>
-                      <a:ext cx="5940425" cy="6740525"/>
-                    </a:xfrm>
-                    <a:prstGeom prst="rect">
-                      <a:avLst/>
-                    </a:prstGeom>
-                  </pic:spPr>
-                </pic:pic>
-              </a:graphicData>
-            </a:graphic>
-          </wp:inline>
-        </w:drawing>
-      </w:r>
-    </w:p>
-    <w:p>
-      <w:pPr>
-        <w:spacing w:line="360" w:lineRule="auto"/>
-        <w:ind w:firstLine="708"/>
+      </w:pPr>
+      <w:r>
+        <w:rPr>
+          <w:iCs/>
+          <w:sz w:val="28"/>
+          <w:szCs w:val="28"/>
+        </w:rPr>
+        <w:t xml:space="preserve">Критерий Колмогорова-Смирнова продемонстрировал корректную калибровку: эмпирическая ошибка первого рода (0,063) близка к заданному уровню значимости 0,05. Мощность критерия при сравнении </w:t>
+      </w:r>
+      <w:r>
+        <w:rPr>
+          <w:iCs/>
+          <w:sz w:val="28"/>
+          <w:szCs w:val="28"/>
+        </w:rPr>
+        <w:t xml:space="preserve">двойного-гамма распределения с </w:t>
+      </w:r>
+      <w:r>
+        <w:rPr>
+          <w:iCs/>
+          <w:sz w:val="28"/>
+          <w:szCs w:val="28"/>
+        </w:rPr>
+        <w:t xml:space="preserve">нормальным распределением </w:t>
+      </w:r>
+      <w:r>
+        <w:rPr>
+          <w:iCs/>
+          <w:sz w:val="28"/>
+          <w:szCs w:val="28"/>
+        </w:rPr>
+        <w:t xml:space="preserve">при </w:t>
+      </w:r>
+      <w:r>
+        <w:rPr>
+          <w:iCs/>
+          <w:sz w:val="28"/>
+          <w:szCs w:val="28"/>
+        </w:rPr>
+        <w:t>той же дисперсии составила 1,0 — критерий безошибочно отличает эти распределения на выборках объёмом n=300, что объясняется существенным различием их формы</w:t>
+      </w:r>
+      <w:r>
+        <w:rPr>
+          <w:iCs/>
+          <w:sz w:val="28"/>
+          <w:szCs w:val="28"/>
+        </w:rPr>
+        <w:t xml:space="preserve">, </w:t>
+      </w:r>
+      <w:r>
+        <w:rPr>
+          <w:iCs/>
+          <w:sz w:val="28"/>
+          <w:szCs w:val="28"/>
+        </w:rPr>
+        <w:t>несмотря на совпадение первых двух моментов.</w:t>
+      </w:r>
+    </w:p>
+    <w:p>
+      <w:pPr>
+        <w:spacing w:line="360" w:lineRule="auto"/>
+        <w:rPr>
+          <w:sz w:val="28"/>
+          <w:szCs w:val="28"/>
+        </w:rPr>
+      </w:pPr>
+    </w:p>
+    <w:p>
+      <w:pPr>
+        <w:spacing w:line="360" w:lineRule="auto"/>
+        <w:rPr>
+          <w:sz w:val="28"/>
+          <w:szCs w:val="28"/>
+        </w:rPr>
+      </w:pPr>
+    </w:p>
+    <w:p>
+      <w:pPr>
+        <w:spacing w:line="360" w:lineRule="auto"/>
         <w:jc w:val="center"/>
         <w:rPr>
-          <w:iCs/>
-          <w:sz w:val="28"/>
-          <w:szCs w:val="28"/>
-        </w:rPr>
-      </w:pPr>
-      <w:r>
-        <w:rPr>
-          <w:iCs/>
-          <w:sz w:val="28"/>
-          <w:szCs w:val="28"/>
-        </w:rPr>
-        <w:t>Листинг 31. Поиск критического значения, ошибка первого рода, мощность</w:t>
-      </w:r>
-    </w:p>
-    <w:p>
-      <w:pPr>
-        <w:spacing w:line="360" w:lineRule="auto"/>
-        <w:ind w:firstLine="708"/>
-        <w:jc w:val="both"/>
-        <w:rPr>
-          <w:iCs/>
-          <w:sz w:val="28"/>
-          <w:szCs w:val="28"/>
-        </w:rPr>
-      </w:pPr>
-    </w:p>
-    <w:p>
-      <w:pPr>
-        <w:spacing w:line="360" w:lineRule="auto"/>
-        <w:ind w:firstLine="708"/>
-        <w:jc w:val="both"/>
-        <w:rPr>
-          <w:iCs/>
-          <w:sz w:val="28"/>
-          <w:szCs w:val="28"/>
-        </w:rPr>
-      </w:pPr>
-      <w:r>
-        <w:rPr>
-          <w:iCs/>
-          <w:sz w:val="28"/>
-          <w:szCs w:val="28"/>
-        </w:rPr>
-        <w:t xml:space="preserve">Критерий Колмогорова-Смирнова продемонстрировал корректную калибровку: эмпирическая ошибка первого рода (0,063) близка к заданному уровню значимости 0,05. Мощность критерия при сравнении </w:t>
-      </w:r>
-      <w:r>
-        <w:rPr>
-          <w:iCs/>
-          <w:sz w:val="28"/>
-          <w:szCs w:val="28"/>
-        </w:rPr>
-        <w:t xml:space="preserve">двойного-гамма распределения с </w:t>
-      </w:r>
-      <w:r>
-        <w:rPr>
-          <w:iCs/>
-          <w:sz w:val="28"/>
-          <w:szCs w:val="28"/>
-        </w:rPr>
-        <w:t xml:space="preserve">нормальным распределением </w:t>
-      </w:r>
-      <w:r>
-        <w:rPr>
-          <w:iCs/>
-          <w:sz w:val="28"/>
-          <w:szCs w:val="28"/>
-        </w:rPr>
-        <w:t xml:space="preserve">при </w:t>
-      </w:r>
-      <w:r>
-        <w:rPr>
-          <w:iCs/>
-          <w:sz w:val="28"/>
-          <w:szCs w:val="28"/>
-        </w:rPr>
-        <w:t xml:space="preserve">той же дисперсии составила 1,0 — критерий безошибочно отличает эти распределения на </w:t>
-      </w:r>
-      <w:r>
-        <w:rPr>
-          <w:iCs/>
-          <w:sz w:val="28"/>
-          <w:szCs w:val="28"/>
-        </w:rPr>
-        <w:lastRenderedPageBreak/>
-        <w:t>выборках объёмом n=300, что объясняется существенным различием их формы</w:t>
-      </w:r>
-      <w:r>
-        <w:rPr>
-          <w:iCs/>
-          <w:sz w:val="28"/>
-          <w:szCs w:val="28"/>
-        </w:rPr>
-        <w:t xml:space="preserve">, </w:t>
-      </w:r>
-      <w:r>
-        <w:rPr>
-          <w:iCs/>
-          <w:sz w:val="28"/>
-          <w:szCs w:val="28"/>
-        </w:rPr>
-        <w:t>несмотря на совпадение первых двух моментов.</w:t>
-      </w:r>
-    </w:p>
-    <w:p>
-      <w:pPr>
-        <w:spacing w:line="360" w:lineRule="auto"/>
-        <w:rPr>
-          <w:sz w:val="28"/>
-          <w:szCs w:val="28"/>
-          <w:lang w:val="en-US"/>
-        </w:rPr>
-      </w:pPr>
-    </w:p>
-    <w:p>
-      <w:pPr>
-        <w:spacing w:line="360" w:lineRule="auto"/>
-        <w:rPr>
-          <w:sz w:val="28"/>
-          <w:szCs w:val="28"/>
-          <w:lang w:val="en-US"/>
-        </w:rPr>
-      </w:pPr>
-    </w:p>
-    <w:p>
-      <w:pPr>
-        <w:spacing w:line="360" w:lineRule="auto"/>
-        <w:rPr>
-          <w:sz w:val="28"/>
-          <w:szCs w:val="28"/>
-          <w:lang w:val="en-US"/>
-        </w:rPr>
-      </w:pPr>
-    </w:p>
-    <w:p>
-      <w:pPr>
-        <w:spacing w:line="360" w:lineRule="auto"/>
-        <w:rPr>
-          <w:sz w:val="28"/>
-          <w:szCs w:val="28"/>
-          <w:lang w:val="en-US"/>
-        </w:rPr>
-      </w:pPr>
-    </w:p>
-    <w:p>
-      <w:pPr>
-        <w:spacing w:line="360" w:lineRule="auto"/>
-        <w:rPr>
-          <w:sz w:val="28"/>
-          <w:szCs w:val="28"/>
-          <w:lang w:val="en-US"/>
-        </w:rPr>
-      </w:pPr>
-    </w:p>
-    <w:p>
-      <w:pPr>
-        <w:spacing w:line="360" w:lineRule="auto"/>
-        <w:rPr>
-          <w:sz w:val="28"/>
-          <w:szCs w:val="28"/>
-          <w:lang w:val="en-US"/>
-        </w:rPr>
-      </w:pPr>
-    </w:p>
-    <w:p>
-      <w:pPr>
-        <w:spacing w:line="360" w:lineRule="auto"/>
-        <w:rPr>
-          <w:sz w:val="28"/>
-          <w:szCs w:val="28"/>
-          <w:lang w:val="en-US"/>
-        </w:rPr>
-      </w:pPr>
-    </w:p>
-    <w:p>
-      <w:pPr>
-        <w:spacing w:line="360" w:lineRule="auto"/>
-        <w:rPr>
-          <w:sz w:val="28"/>
-          <w:szCs w:val="28"/>
-          <w:lang w:val="en-US"/>
-        </w:rPr>
-      </w:pPr>
-    </w:p>
-    <w:p>
-      <w:pPr>
-        <w:spacing w:line="360" w:lineRule="auto"/>
-        <w:rPr>
-          <w:sz w:val="28"/>
-          <w:szCs w:val="28"/>
-          <w:lang w:val="en-US"/>
-        </w:rPr>
-      </w:pPr>
-    </w:p>
-    <w:p>
-      <w:pPr>
-        <w:spacing w:line="360" w:lineRule="auto"/>
-        <w:rPr>
-          <w:sz w:val="28"/>
-          <w:szCs w:val="28"/>
-          <w:lang w:val="en-US"/>
-        </w:rPr>
-      </w:pPr>
-    </w:p>
-    <w:p>
-      <w:pPr>
-        <w:spacing w:line="360" w:lineRule="auto"/>
-        <w:rPr>
-          <w:sz w:val="28"/>
-          <w:szCs w:val="28"/>
-          <w:lang w:val="en-US"/>
-        </w:rPr>
-      </w:pPr>
-    </w:p>
-    <w:p>
-      <w:pPr>
-        <w:spacing w:line="360" w:lineRule="auto"/>
-        <w:rPr>
-          <w:sz w:val="28"/>
-          <w:szCs w:val="28"/>
-          <w:lang w:val="en-US"/>
-        </w:rPr>
-      </w:pPr>
-    </w:p>
-    <w:p>
-      <w:pPr>
-        <w:spacing w:line="360" w:lineRule="auto"/>
-        <w:rPr>
-          <w:sz w:val="28"/>
-          <w:szCs w:val="28"/>
-          <w:lang w:val="en-US"/>
-        </w:rPr>
-      </w:pPr>
-    </w:p>
-    <w:p>
-      <w:pPr>
-        <w:spacing w:line="360" w:lineRule="auto"/>
-        <w:rPr>
-          <w:sz w:val="28"/>
-          <w:szCs w:val="28"/>
-          <w:lang w:val="en-US"/>
-        </w:rPr>
-      </w:pPr>
-    </w:p>
-    <w:p>
-      <w:pPr>
-        <w:spacing w:line="360" w:lineRule="auto"/>
-        <w:rPr>
-          <w:sz w:val="28"/>
-          <w:szCs w:val="28"/>
-          <w:lang w:val="en-US"/>
-        </w:rPr>
-      </w:pPr>
-    </w:p>
-    <w:p>
-      <w:pPr>
-        <w:spacing w:line="360" w:lineRule="auto"/>
-        <w:rPr>
-          <w:sz w:val="28"/>
-          <w:szCs w:val="28"/>
-          <w:lang w:val="en-US"/>
-        </w:rPr>
-      </w:pPr>
-    </w:p>
-    <w:p>
-      <w:pPr>
-        <w:spacing w:line="360" w:lineRule="auto"/>
-        <w:rPr>
-          <w:sz w:val="28"/>
-          <w:szCs w:val="28"/>
-          <w:lang w:val="en-US"/>
-        </w:rPr>
-      </w:pPr>
-    </w:p>
-    <w:p>
-      <w:pPr>
-        <w:spacing w:line="360" w:lineRule="auto"/>
-        <w:rPr>
-          <w:sz w:val="28"/>
-          <w:szCs w:val="28"/>
-          <w:lang w:val="en-US"/>
-        </w:rPr>
-      </w:pPr>
-    </w:p>
-    <w:p>
-      <w:pPr>
-        <w:spacing w:line="360" w:lineRule="auto"/>
-        <w:rPr>
-          <w:sz w:val="28"/>
-          <w:szCs w:val="28"/>
-          <w:lang w:val="en-US"/>
-        </w:rPr>
-      </w:pPr>
-    </w:p>
-    <w:p>
-      <w:pPr>
-        <w:spacing w:line="360" w:lineRule="auto"/>
-        <w:rPr>
-          <w:sz w:val="28"/>
-          <w:szCs w:val="28"/>
-          <w:lang w:val="en-US"/>
-        </w:rPr>
-      </w:pPr>
-    </w:p>
-    <w:p>
-      <w:pPr>
-        <w:spacing w:line="360" w:lineRule="auto"/>
-        <w:rPr>
-          <w:sz w:val="28"/>
-          <w:szCs w:val="28"/>
-          <w:lang w:val="en-US"/>
-        </w:rPr>
-      </w:pPr>
-    </w:p>
-    <w:p>
-      <w:pPr>
-        <w:spacing w:line="360" w:lineRule="auto"/>
-        <w:rPr>
-          <w:sz w:val="28"/>
-          <w:szCs w:val="28"/>
-          <w:lang w:val="en-US"/>
-        </w:rPr>
-      </w:pPr>
-    </w:p>
-    <w:p>
-      <w:pPr>
-        <w:spacing w:line="360" w:lineRule="auto"/>
-        <w:rPr>
-          <w:sz w:val="28"/>
-          <w:szCs w:val="28"/>
-          <w:lang w:val="en-US"/>
-        </w:rPr>
-      </w:pPr>
-    </w:p>
-    <w:p>
-      <w:pPr>
-        <w:spacing w:line="360" w:lineRule="auto"/>
-        <w:rPr>
-          <w:sz w:val="28"/>
-          <w:szCs w:val="28"/>
-          <w:lang w:val="en-US"/>
-        </w:rPr>
-      </w:pPr>
-    </w:p>
-    <w:p>
-      <w:pPr>
-        <w:spacing w:line="360" w:lineRule="auto"/>
-        <w:rPr>
-          <w:sz w:val="28"/>
-          <w:szCs w:val="28"/>
-          <w:lang w:val="en-US"/>
-        </w:rPr>
-      </w:pPr>
-    </w:p>
-    <w:p>
-      <w:pPr>
-        <w:spacing w:line="360" w:lineRule="auto"/>
-        <w:rPr>
-          <w:sz w:val="28"/>
-          <w:szCs w:val="28"/>
-          <w:lang w:val="en-US"/>
-        </w:rPr>
-      </w:pPr>
-    </w:p>
-    <w:p>
-      <w:pPr>
-        <w:spacing w:line="360" w:lineRule="auto"/>
-        <w:rPr>
-          <w:sz w:val="28"/>
-          <w:szCs w:val="28"/>
-          <w:lang w:val="en-US"/>
-        </w:rPr>
-      </w:pPr>
-    </w:p>
-    <w:p>
-      <w:pPr>
-        <w:spacing w:line="360" w:lineRule="auto"/>
-        <w:rPr>
-          <w:sz w:val="28"/>
-          <w:szCs w:val="28"/>
-          <w:lang w:val="en-US"/>
-        </w:rPr>
-      </w:pPr>
-    </w:p>
-    <w:p>
-      <w:pPr>
-        <w:pStyle w:val="a7"/>
-        <w:spacing w:line="360" w:lineRule="auto"/>
-        <w:ind w:left="648"/>
-        <w:jc w:val="center"/>
-        <w:rPr>
-          <w:sz w:val="28"/>
-          <w:szCs w:val="28"/>
-          <w:lang w:val="en-US"/>
+          <w:sz w:val="28"/>
+          <w:szCs w:val="28"/>
         </w:rPr>
       </w:pPr>
       <w:r>
@@ -28288,39 +26622,7 @@
           <w:sz w:val="28"/>
           <w:szCs w:val="28"/>
         </w:rPr>
-        <w:t xml:space="preserve">Для предоставленной выборки объёмом n = 300 были самостоятельно реализованы функции вычисления основных статистик выборки, построены эмпирическая функция распределения и гистограмма для полной выборки и случайных </w:t>
-      </w:r>
-      <w:proofErr w:type="spellStart"/>
-      <w:r>
-        <w:rPr>
-          <w:sz w:val="28"/>
-          <w:szCs w:val="28"/>
-        </w:rPr>
-        <w:t>подвыборок</w:t>
-      </w:r>
-      <w:proofErr w:type="spellEnd"/>
-      <w:r>
-        <w:rPr>
-          <w:sz w:val="28"/>
-          <w:szCs w:val="28"/>
-        </w:rPr>
-        <w:t xml:space="preserve"> объёмом 10, 100 и 200 элементов. С ростом объёма </w:t>
-      </w:r>
-      <w:proofErr w:type="spellStart"/>
-      <w:r>
-        <w:rPr>
-          <w:sz w:val="28"/>
-          <w:szCs w:val="28"/>
-        </w:rPr>
-        <w:t>подвыборки</w:t>
-      </w:r>
-      <w:proofErr w:type="spellEnd"/>
-      <w:r>
-        <w:rPr>
-          <w:sz w:val="28"/>
-          <w:szCs w:val="28"/>
-        </w:rPr>
-        <w:t xml:space="preserve"> обе характеристики закономерно приближались к теоретическим, что согласуется с теоремой Гливенко. </w:t>
+        <w:t xml:space="preserve">Для предоставленной выборки объёмом n = 300 были самостоятельно реализованы функции вычисления основных статистик выборки, построены эмпирическая функция распределения и гистограмма для полной выборки и случайных подвыборок объёмом 10, 100 и 200 элементов. </w:t>
       </w:r>
     </w:p>
     <w:p>
@@ -28365,23 +26667,7 @@
             <w:sz w:val="28"/>
             <w:szCs w:val="28"/>
           </w:rPr>
-          <m:t>(α̂ ≈ 7,07,</m:t>
-        </m:r>
-        <m:r>
-          <w:rPr>
-            <w:rFonts w:ascii="Cambria Math" w:hAnsi="Cambria Math"/>
-            <w:sz w:val="28"/>
-            <w:szCs w:val="28"/>
-          </w:rPr>
-          <m:t xml:space="preserve"> </m:t>
-        </m:r>
-        <m:r>
-          <w:rPr>
-            <w:rFonts w:ascii="Cambria Math" w:hAnsi="Cambria Math"/>
-            <w:sz w:val="28"/>
-            <w:szCs w:val="28"/>
-          </w:rPr>
-          <m:t xml:space="preserve"> </m:t>
+          <m:t xml:space="preserve">(α̂ ≈ 7,07,  </m:t>
         </m:r>
         <m:acc>
           <m:accPr>
@@ -28502,68 +26788,7 @@
           <w:szCs w:val="28"/>
         </w:rPr>
         <w:br/>
-      </w:r>
-      <w:r>
-        <w:rPr>
-          <w:sz w:val="28"/>
-          <w:szCs w:val="28"/>
-        </w:rPr>
-        <w:t xml:space="preserve">оказались близки друг к другу. Вместе с тем по эффективности методы существенно различаются: для параметра формы </w:t>
-      </w:r>
-      <m:oMath>
-        <m:r>
-          <w:rPr>
-            <w:rFonts w:ascii="Cambria Math" w:hAnsi="Cambria Math"/>
-            <w:sz w:val="28"/>
-            <w:szCs w:val="28"/>
-          </w:rPr>
-          <m:t>α</m:t>
-        </m:r>
-      </m:oMath>
-      <w:r>
-        <w:rPr>
-          <w:sz w:val="28"/>
-          <w:szCs w:val="28"/>
-        </w:rPr>
-        <w:t xml:space="preserve"> обе оценки близки к границе Рао–Крамера, тогда как для параметра смещения </w:t>
-      </w:r>
-      <m:oMath>
-        <m:r>
-          <w:rPr>
-            <w:rFonts w:ascii="Cambria Math" w:hAnsi="Cambria Math"/>
-            <w:sz w:val="28"/>
-            <w:szCs w:val="28"/>
-          </w:rPr>
-          <m:t>loc</m:t>
-        </m:r>
-      </m:oMath>
-      <w:r>
-        <w:rPr>
-          <w:sz w:val="28"/>
-          <w:szCs w:val="28"/>
-        </w:rPr>
-        <w:t xml:space="preserve"> оценка методом моментов использует лишь около 9% потенциальной точности против 82% у оценки максимального правдоподобия</w:t>
-      </w:r>
-      <w:r>
-        <w:rPr>
-          <w:sz w:val="28"/>
-          <w:szCs w:val="28"/>
-        </w:rPr>
-        <w:t xml:space="preserve">, </w:t>
-      </w:r>
-      <w:r>
-        <w:rPr>
-          <w:sz w:val="28"/>
-          <w:szCs w:val="28"/>
-        </w:rPr>
-        <w:t xml:space="preserve">следовательно </w:t>
-      </w:r>
-      <w:r>
-        <w:rPr>
-          <w:sz w:val="28"/>
-          <w:szCs w:val="28"/>
-        </w:rPr>
-        <w:t>метод максимального правдоподобия даёт более точные и предпочтительные оценки параметров данного распределения.</w:t>
+        <w:t xml:space="preserve">оказались близки друг к другу. </w:t>
       </w:r>
     </w:p>
     <w:p>
@@ -28618,48 +26843,6 @@
         </w:rPr>
         <w:t xml:space="preserve"> не дала оснований для её отклонения, что подтверждает принадлежность выборки двойному гамма-распределению с найденными параметрами.</w:t>
       </w:r>
-      <w:r>
-        <w:rPr>
-          <w:sz w:val="28"/>
-          <w:szCs w:val="28"/>
-        </w:rPr>
-        <w:t xml:space="preserve"> П</w:t>
-      </w:r>
-      <w:r>
-        <w:rPr>
-          <w:sz w:val="28"/>
-          <w:szCs w:val="28"/>
-        </w:rPr>
-        <w:t>остроенный критерий Колмогорова–Смирнова для проверки однородности выборок</w:t>
-      </w:r>
-      <w:r>
-        <w:rPr>
-          <w:sz w:val="28"/>
-          <w:szCs w:val="28"/>
-        </w:rPr>
-        <w:t xml:space="preserve">, </w:t>
-      </w:r>
-      <w:r>
-        <w:rPr>
-          <w:sz w:val="28"/>
-          <w:szCs w:val="28"/>
-        </w:rPr>
-        <w:t>безошибочно отлича</w:t>
-      </w:r>
-      <w:r>
-        <w:rPr>
-          <w:sz w:val="28"/>
-          <w:szCs w:val="28"/>
-        </w:rPr>
-        <w:t>л</w:t>
-      </w:r>
-      <w:r>
-        <w:rPr>
-          <w:sz w:val="28"/>
-          <w:szCs w:val="28"/>
-        </w:rPr>
-        <w:t xml:space="preserve"> двойное гамма-распределение от нормального распределения.</w:t>
-      </w:r>
     </w:p>
     <w:p>
       <w:pPr>
@@ -28676,7 +26859,14 @@
           <w:sz w:val="28"/>
           <w:szCs w:val="28"/>
         </w:rPr>
-        <w:t>Таким образом, все поставленные в работе задачи были выполнены</w:t>
+        <w:t>В</w:t>
+      </w:r>
+      <w:r>
+        <w:rPr>
+          <w:sz w:val="28"/>
+          <w:szCs w:val="28"/>
+        </w:rPr>
+        <w:t>се поставленные в работе задачи были выполнены</w:t>
       </w:r>
       <w:r>
         <w:rPr>
@@ -28710,6 +26900,102 @@
         <w:rPr>
           <w:sz w:val="28"/>
           <w:szCs w:val="28"/>
+        </w:rPr>
+      </w:pPr>
+    </w:p>
+    <w:p>
+      <w:pPr>
+        <w:spacing w:line="360" w:lineRule="auto"/>
+        <w:jc w:val="center"/>
+        <w:rPr>
+          <w:b/>
+          <w:bCs/>
+          <w:sz w:val="32"/>
+          <w:szCs w:val="32"/>
+        </w:rPr>
+      </w:pPr>
+    </w:p>
+    <w:p>
+      <w:pPr>
+        <w:spacing w:line="360" w:lineRule="auto"/>
+        <w:jc w:val="center"/>
+        <w:rPr>
+          <w:b/>
+          <w:bCs/>
+          <w:sz w:val="32"/>
+          <w:szCs w:val="32"/>
+        </w:rPr>
+      </w:pPr>
+    </w:p>
+    <w:p>
+      <w:pPr>
+        <w:spacing w:line="360" w:lineRule="auto"/>
+        <w:jc w:val="center"/>
+        <w:rPr>
+          <w:b/>
+          <w:bCs/>
+          <w:sz w:val="32"/>
+          <w:szCs w:val="32"/>
+        </w:rPr>
+      </w:pPr>
+    </w:p>
+    <w:p>
+      <w:pPr>
+        <w:spacing w:line="360" w:lineRule="auto"/>
+        <w:jc w:val="center"/>
+        <w:rPr>
+          <w:b/>
+          <w:bCs/>
+          <w:sz w:val="32"/>
+          <w:szCs w:val="32"/>
+        </w:rPr>
+      </w:pPr>
+    </w:p>
+    <w:p>
+      <w:pPr>
+        <w:spacing w:line="360" w:lineRule="auto"/>
+        <w:jc w:val="center"/>
+        <w:rPr>
+          <w:b/>
+          <w:bCs/>
+          <w:sz w:val="32"/>
+          <w:szCs w:val="32"/>
+        </w:rPr>
+      </w:pPr>
+    </w:p>
+    <w:p>
+      <w:pPr>
+        <w:spacing w:line="360" w:lineRule="auto"/>
+        <w:jc w:val="center"/>
+        <w:rPr>
+          <w:b/>
+          <w:bCs/>
+          <w:sz w:val="32"/>
+          <w:szCs w:val="32"/>
+        </w:rPr>
+      </w:pPr>
+    </w:p>
+    <w:p>
+      <w:pPr>
+        <w:spacing w:line="360" w:lineRule="auto"/>
+        <w:jc w:val="center"/>
+        <w:rPr>
+          <w:b/>
+          <w:bCs/>
+          <w:sz w:val="32"/>
+          <w:szCs w:val="32"/>
+        </w:rPr>
+      </w:pPr>
+    </w:p>
+    <w:p>
+      <w:pPr>
+        <w:spacing w:line="360" w:lineRule="auto"/>
+        <w:jc w:val="center"/>
+        <w:rPr>
+          <w:b/>
+          <w:bCs/>
+          <w:sz w:val="32"/>
+          <w:szCs w:val="32"/>
         </w:rPr>
       </w:pPr>
     </w:p>
@@ -28815,7 +27101,7 @@
         </w:rPr>
         <w:t xml:space="preserve">: </w:t>
       </w:r>
-      <w:hyperlink r:id="rId52" w:history="1">
+      <w:hyperlink r:id="rId49" w:history="1">
         <w:r>
           <w:rPr>
             <w:rStyle w:val="ac"/>
@@ -28866,10 +27152,24 @@
           <w:szCs w:val="28"/>
           <w:lang w:val="en-US"/>
         </w:rPr>
-        <w:t xml:space="preserve">[2] Bain L. J., Engelhardt M. Introduction to Probability and Mathematical Statistics. — 2nd ed. — </w:t>
-      </w:r>
-      <w:proofErr w:type="gramStart"/>
-      <w:r>
+        <w:t>[2] Bain L. J., Engelhardt M. Introduction to Probability and Mathematical Statistics. — 2nd ed. — Belmont : Brooks/Cole, 1992. — 644 p.</w:t>
+      </w:r>
+    </w:p>
+    <w:p>
+      <w:pPr>
+        <w:spacing w:line="360" w:lineRule="auto"/>
+        <w:jc w:val="both"/>
+        <w:rPr>
+          <w:sz w:val="28"/>
+          <w:szCs w:val="28"/>
+          <w:lang w:val="en-US"/>
+        </w:rPr>
+      </w:pPr>
+    </w:p>
+    <w:p>
+      <w:pPr>
+        <w:spacing w:line="360" w:lineRule="auto"/>
+        <w:jc w:val="both"/>
         <w:rPr>
           <w:b/>
           <w:bCs/>
@@ -28877,9 +27177,7 @@
           <w:szCs w:val="28"/>
           <w:lang w:val="en-US"/>
         </w:rPr>
-        <w:t>Belmont :</w:t>
-      </w:r>
-      <w:proofErr w:type="gramEnd"/>
+      </w:pPr>
       <w:r>
         <w:rPr>
           <w:b/>
@@ -28888,7 +27186,7 @@
           <w:szCs w:val="28"/>
           <w:lang w:val="en-US"/>
         </w:rPr>
-        <w:t xml:space="preserve"> Brooks/Cole, 1992. — 644 p.</w:t>
+        <w:t xml:space="preserve">[3] Bahashwan A. O., Kalantan Z. I., Adham S. A. Double Gamma Principal Components Analysis // Applied Mathematical Sciences. — 2018. — Vol. 12, № 11. — P. 523–533. </w:t>
       </w:r>
     </w:p>
     <w:p>
@@ -28906,222 +27204,42 @@
       <w:pPr>
         <w:spacing w:line="360" w:lineRule="auto"/>
         <w:jc w:val="both"/>
+      </w:pPr>
+      <w:r>
         <w:rPr>
           <w:b/>
           <w:bCs/>
           <w:sz w:val="28"/>
           <w:szCs w:val="28"/>
-          <w:lang w:val="en-US"/>
-        </w:rPr>
-      </w:pPr>
+        </w:rPr>
+        <w:t>[4] Положинцев Б. И. Теория вероятностей и математическая статистика. Введение в математическую статистику: учебное пособие /  Б. И. Положинцев. – Санкт-Петербург: СПбПУ, 2016.</w:t>
+      </w:r>
       <w:r>
         <w:rPr>
           <w:b/>
           <w:bCs/>
           <w:sz w:val="28"/>
           <w:szCs w:val="28"/>
-          <w:lang w:val="en-US"/>
-        </w:rPr>
-        <w:t xml:space="preserve">[3] </w:t>
-      </w:r>
-      <w:proofErr w:type="spellStart"/>
+        </w:rPr>
+        <w:t xml:space="preserve"> </w:t>
+      </w:r>
       <w:r>
         <w:rPr>
           <w:b/>
           <w:bCs/>
           <w:sz w:val="28"/>
           <w:szCs w:val="28"/>
-          <w:lang w:val="en-US"/>
-        </w:rPr>
-        <w:t>Bahashwan</w:t>
-      </w:r>
-      <w:proofErr w:type="spellEnd"/>
-      <w:r>
-        <w:rPr>
-          <w:b/>
-          <w:bCs/>
-          <w:sz w:val="28"/>
-          <w:szCs w:val="28"/>
-          <w:lang w:val="en-US"/>
-        </w:rPr>
-        <w:t xml:space="preserve"> A. O., </w:t>
-      </w:r>
-      <w:proofErr w:type="spellStart"/>
-      <w:r>
-        <w:rPr>
-          <w:b/>
-          <w:bCs/>
-          <w:sz w:val="28"/>
-          <w:szCs w:val="28"/>
-          <w:lang w:val="en-US"/>
-        </w:rPr>
-        <w:t>Kalantan</w:t>
-      </w:r>
-      <w:proofErr w:type="spellEnd"/>
-      <w:r>
-        <w:rPr>
-          <w:b/>
-          <w:bCs/>
-          <w:sz w:val="28"/>
-          <w:szCs w:val="28"/>
-          <w:lang w:val="en-US"/>
-        </w:rPr>
-        <w:t xml:space="preserve"> Z. I., </w:t>
-      </w:r>
-      <w:proofErr w:type="spellStart"/>
-      <w:r>
-        <w:rPr>
-          <w:b/>
-          <w:bCs/>
-          <w:sz w:val="28"/>
-          <w:szCs w:val="28"/>
-          <w:lang w:val="en-US"/>
-        </w:rPr>
-        <w:t>Adham</w:t>
-      </w:r>
-      <w:proofErr w:type="spellEnd"/>
-      <w:r>
-        <w:rPr>
-          <w:b/>
-          <w:bCs/>
-          <w:sz w:val="28"/>
-          <w:szCs w:val="28"/>
-          <w:lang w:val="en-US"/>
-        </w:rPr>
-        <w:t xml:space="preserve"> S. A. Double Gamma Principal Components Analysis // Applied Mathematical Sciences. — 2018. — Vol. 12, № 11. — P. 523–533. </w:t>
-      </w:r>
-    </w:p>
-    <w:p>
-      <w:pPr>
-        <w:spacing w:line="360" w:lineRule="auto"/>
-        <w:jc w:val="both"/>
-        <w:rPr>
-          <w:sz w:val="28"/>
-          <w:szCs w:val="28"/>
-          <w:lang w:val="en-US"/>
-        </w:rPr>
-      </w:pPr>
-    </w:p>
-    <w:p>
-      <w:pPr>
-        <w:spacing w:line="360" w:lineRule="auto"/>
-        <w:jc w:val="both"/>
-      </w:pPr>
-      <w:r>
-        <w:rPr>
-          <w:b/>
-          <w:bCs/>
-          <w:sz w:val="28"/>
-          <w:szCs w:val="28"/>
-        </w:rPr>
-        <w:t xml:space="preserve">[4] </w:t>
-      </w:r>
-      <w:proofErr w:type="spellStart"/>
-      <w:r>
-        <w:rPr>
-          <w:b/>
-          <w:bCs/>
-          <w:sz w:val="28"/>
-          <w:szCs w:val="28"/>
-        </w:rPr>
-        <w:t>Положинцев</w:t>
-      </w:r>
-      <w:proofErr w:type="spellEnd"/>
-      <w:r>
-        <w:rPr>
-          <w:b/>
-          <w:bCs/>
-          <w:sz w:val="28"/>
-          <w:szCs w:val="28"/>
-        </w:rPr>
-        <w:t xml:space="preserve"> Б. И. Теория вероятностей и математическая статистика. Введение в математическую статистику: учебное пособие </w:t>
-      </w:r>
-      <w:proofErr w:type="gramStart"/>
-      <w:r>
-        <w:rPr>
-          <w:b/>
-          <w:bCs/>
-          <w:sz w:val="28"/>
-          <w:szCs w:val="28"/>
-        </w:rPr>
-        <w:t>/  Б.</w:t>
-      </w:r>
-      <w:proofErr w:type="gramEnd"/>
-      <w:r>
-        <w:rPr>
-          <w:b/>
-          <w:bCs/>
-          <w:sz w:val="28"/>
-          <w:szCs w:val="28"/>
-        </w:rPr>
-        <w:t xml:space="preserve"> И. </w:t>
-      </w:r>
-      <w:proofErr w:type="spellStart"/>
-      <w:r>
-        <w:rPr>
-          <w:b/>
-          <w:bCs/>
-          <w:sz w:val="28"/>
-          <w:szCs w:val="28"/>
-        </w:rPr>
-        <w:t>Положинцев</w:t>
-      </w:r>
-      <w:proofErr w:type="spellEnd"/>
-      <w:r>
-        <w:rPr>
-          <w:b/>
-          <w:bCs/>
-          <w:sz w:val="28"/>
-          <w:szCs w:val="28"/>
-        </w:rPr>
-        <w:t xml:space="preserve">. – Санкт-Петербург: </w:t>
-      </w:r>
-      <w:proofErr w:type="spellStart"/>
-      <w:r>
-        <w:rPr>
-          <w:b/>
-          <w:bCs/>
-          <w:sz w:val="28"/>
-          <w:szCs w:val="28"/>
-        </w:rPr>
-        <w:t>СПбПУ</w:t>
-      </w:r>
-      <w:proofErr w:type="spellEnd"/>
-      <w:r>
-        <w:rPr>
-          <w:b/>
-          <w:bCs/>
-          <w:sz w:val="28"/>
-          <w:szCs w:val="28"/>
-        </w:rPr>
-        <w:t>, 2016.</w:t>
-      </w:r>
-      <w:r>
-        <w:rPr>
-          <w:b/>
-          <w:bCs/>
+        </w:rPr>
+        <w:t>– URL:</w:t>
+      </w:r>
+      <w:r>
+        <w:rPr>
           <w:sz w:val="28"/>
           <w:szCs w:val="28"/>
         </w:rPr>
         <w:t xml:space="preserve"> </w:t>
       </w:r>
-      <w:r>
-        <w:rPr>
-          <w:b/>
-          <w:bCs/>
-          <w:sz w:val="28"/>
-          <w:szCs w:val="28"/>
-        </w:rPr>
-        <w:t>– URL:</w:t>
-      </w:r>
-      <w:r>
-        <w:rPr>
-          <w:sz w:val="28"/>
-          <w:szCs w:val="28"/>
-        </w:rPr>
-        <w:t xml:space="preserve"> </w:t>
-      </w:r>
-      <w:hyperlink r:id="rId53" w:history="1">
+      <w:hyperlink r:id="rId50" w:history="1">
         <w:r>
           <w:rPr>
             <w:rStyle w:val="ac"/>
@@ -29147,6 +27265,7 @@
           <w:bCs/>
           <w:sz w:val="28"/>
           <w:szCs w:val="28"/>
+          <w:lang w:val="en-US"/>
         </w:rPr>
       </w:pPr>
       <w:r>
@@ -29189,6 +27308,7 @@
           <w:bCs/>
           <w:sz w:val="28"/>
           <w:szCs w:val="28"/>
+          <w:lang w:val="en-US"/>
         </w:rPr>
       </w:pPr>
     </w:p>
@@ -29212,141 +27332,11 @@
           <w:szCs w:val="28"/>
           <w:lang w:val="en-US"/>
         </w:rPr>
-        <w:t>[</w:t>
-      </w:r>
-      <w:r>
-        <w:rPr>
-          <w:b/>
-          <w:bCs/>
-          <w:sz w:val="28"/>
-          <w:szCs w:val="28"/>
-          <w:lang w:val="en-US"/>
-        </w:rPr>
-        <w:t>6</w:t>
-      </w:r>
-      <w:r>
-        <w:rPr>
-          <w:b/>
-          <w:bCs/>
-          <w:sz w:val="28"/>
-          <w:szCs w:val="28"/>
-          <w:lang w:val="en-US"/>
-        </w:rPr>
-        <w:t xml:space="preserve">] Scherrer A., </w:t>
-      </w:r>
-      <w:proofErr w:type="spellStart"/>
-      <w:r>
-        <w:rPr>
-          <w:b/>
-          <w:bCs/>
-          <w:sz w:val="28"/>
-          <w:szCs w:val="28"/>
-          <w:lang w:val="en-US"/>
-        </w:rPr>
-        <w:t>Larrieu</w:t>
-      </w:r>
-      <w:proofErr w:type="spellEnd"/>
-      <w:r>
-        <w:rPr>
-          <w:b/>
-          <w:bCs/>
-          <w:sz w:val="28"/>
-          <w:szCs w:val="28"/>
-          <w:lang w:val="en-US"/>
-        </w:rPr>
-        <w:t xml:space="preserve"> N., </w:t>
-      </w:r>
-      <w:proofErr w:type="spellStart"/>
-      <w:r>
-        <w:rPr>
-          <w:b/>
-          <w:bCs/>
-          <w:sz w:val="28"/>
-          <w:szCs w:val="28"/>
-          <w:lang w:val="en-US"/>
-        </w:rPr>
-        <w:t>Borgnat</w:t>
-      </w:r>
-      <w:proofErr w:type="spellEnd"/>
-      <w:r>
-        <w:rPr>
-          <w:b/>
-          <w:bCs/>
-          <w:sz w:val="28"/>
-          <w:szCs w:val="28"/>
-          <w:lang w:val="en-US"/>
-        </w:rPr>
-        <w:t xml:space="preserve"> P., </w:t>
-      </w:r>
-      <w:proofErr w:type="spellStart"/>
-      <w:r>
-        <w:rPr>
-          <w:b/>
-          <w:bCs/>
-          <w:sz w:val="28"/>
-          <w:szCs w:val="28"/>
-          <w:lang w:val="en-US"/>
-        </w:rPr>
-        <w:t>Owezarski</w:t>
-      </w:r>
-      <w:proofErr w:type="spellEnd"/>
-      <w:r>
-        <w:rPr>
-          <w:b/>
-          <w:bCs/>
-          <w:sz w:val="28"/>
-          <w:szCs w:val="28"/>
-          <w:lang w:val="en-US"/>
-        </w:rPr>
-        <w:t xml:space="preserve"> P., </w:t>
-      </w:r>
-      <w:proofErr w:type="spellStart"/>
-      <w:r>
-        <w:rPr>
-          <w:b/>
-          <w:bCs/>
-          <w:sz w:val="28"/>
-          <w:szCs w:val="28"/>
-          <w:lang w:val="en-US"/>
-        </w:rPr>
-        <w:t>Abry</w:t>
-      </w:r>
-      <w:proofErr w:type="spellEnd"/>
-      <w:r>
-        <w:rPr>
-          <w:b/>
-          <w:bCs/>
-          <w:sz w:val="28"/>
-          <w:szCs w:val="28"/>
-          <w:lang w:val="en-US"/>
-        </w:rPr>
-        <w:t xml:space="preserve"> P. Non-Gaussian and Long Memory Statistical </w:t>
-      </w:r>
-      <w:proofErr w:type="spellStart"/>
-      <w:r>
-        <w:rPr>
-          <w:b/>
-          <w:bCs/>
-          <w:sz w:val="28"/>
-          <w:szCs w:val="28"/>
-          <w:lang w:val="en-US"/>
-        </w:rPr>
-        <w:t>Characterisations</w:t>
-      </w:r>
-      <w:proofErr w:type="spellEnd"/>
-      <w:r>
-        <w:rPr>
-          <w:b/>
-          <w:bCs/>
-          <w:sz w:val="28"/>
-          <w:szCs w:val="28"/>
-          <w:lang w:val="en-US"/>
-        </w:rPr>
-        <w:t xml:space="preserve"> for Internet Traffic with Anomalies // IEEE Transactions on Dependable and Secure Computing. — 2007. — Vol. 4, № 1. — P. 56–70.</w:t>
+        <w:t>[6] Scherrer A., Larrieu N., Borgnat P., Owezarski P., Abry P. Non-Gaussian and Long Memory Statistical Characterisations for Internet Traffic with Anomalies // IEEE Transactions on Dependable and Secure Computing. — 2007. — Vol. 4, № 1. — P. 56–70.</w:t>
       </w:r>
     </w:p>
     <w:sectPr>
-      <w:footerReference w:type="default" r:id="rId54"/>
+      <w:footerReference w:type="default" r:id="rId51"/>
       <w:pgSz w:w="11906" w:h="16838"/>
       <w:pgMar w:top="1134" w:right="850" w:bottom="1134" w:left="1701" w:header="708" w:footer="708" w:gutter="0"/>
       <w:cols w:space="708"/>
@@ -32421,6 +30411,7 @@
   <w:style w:type="character" w:default="1" w:styleId="a0">
     <w:name w:val="Default Paragraph Font"/>
     <w:uiPriority w:val="1"/>
+    <w:semiHidden/>
     <w:unhideWhenUsed/>
   </w:style>
   <w:style w:type="table" w:default="1" w:styleId="a1">

</xml_diff>

<commit_message>
UPDATE: отчет DATE: 2026-09-28 16:13:12
</commit_message>
<xml_diff>
--- a/Учеба 4 семестр/Теория вероятности/Курсовая работа/Отчет, Код/Курсовая_работа.docx
+++ b/Учеба 4 семестр/Теория вероятности/Курсовая работа/Отчет, Код/Курсовая_работа.docx
@@ -319,8 +319,16 @@
           <w:szCs w:val="28"/>
         </w:rPr>
         <w:tab/>
+      </w:r>
+      <w:proofErr w:type="spellStart"/>
+      <w:r>
+        <w:rPr>
+          <w:sz w:val="28"/>
+          <w:szCs w:val="28"/>
+        </w:rPr>
         <w:t>И.А.Эков</w:t>
       </w:r>
+      <w:proofErr w:type="spellEnd"/>
     </w:p>
     <w:p>
       <w:pPr>
@@ -371,6 +379,7 @@
         </w:rPr>
         <w:tab/>
       </w:r>
+      <w:proofErr w:type="spellStart"/>
       <w:r>
         <w:rPr>
           <w:sz w:val="28"/>
@@ -378,6 +387,7 @@
         </w:rPr>
         <w:t>Р.А.Ажермачев</w:t>
       </w:r>
+      <w:proofErr w:type="spellEnd"/>
     </w:p>
     <w:p>
       <w:pPr>
@@ -441,8 +451,16 @@
           <w:szCs w:val="28"/>
         </w:rPr>
         <w:tab/>
+      </w:r>
+      <w:proofErr w:type="spellStart"/>
+      <w:r>
+        <w:rPr>
+          <w:sz w:val="28"/>
+          <w:szCs w:val="28"/>
+        </w:rPr>
         <w:t>О.А.Пахомова</w:t>
       </w:r>
+      <w:proofErr w:type="spellEnd"/>
     </w:p>
     <w:p>
       <w:pPr>
@@ -977,7 +995,23 @@
           <w:sz w:val="28"/>
           <w:szCs w:val="28"/>
         </w:rPr>
-        <w:t>4.3. Вид гистограмм для случайных подвыборок размера 10, 100, 200</w:t>
+        <w:t xml:space="preserve">4.3. Вид гистограмм для случайных </w:t>
+      </w:r>
+      <w:proofErr w:type="spellStart"/>
+      <w:r>
+        <w:rPr>
+          <w:sz w:val="28"/>
+          <w:szCs w:val="28"/>
+        </w:rPr>
+        <w:t>подвыборок</w:t>
+      </w:r>
+      <w:proofErr w:type="spellEnd"/>
+      <w:r>
+        <w:rPr>
+          <w:sz w:val="28"/>
+          <w:szCs w:val="28"/>
+        </w:rPr>
+        <w:t xml:space="preserve"> размера 10, 100, 200</w:t>
       </w:r>
       <w:r>
         <w:rPr>
@@ -2111,7 +2145,23 @@
           <w:sz w:val="28"/>
           <w:szCs w:val="28"/>
         </w:rPr>
-        <w:t>Объектом исследования является выборка случайной величины, подчиняющейся двойному гамма распределению. Предметом исследования — статистические свойства данной выборки и методы её анализа.</w:t>
+        <w:t xml:space="preserve">Объектом исследования является выборка случайной величины, подчиняющейся </w:t>
+      </w:r>
+      <w:proofErr w:type="gramStart"/>
+      <w:r>
+        <w:rPr>
+          <w:sz w:val="28"/>
+          <w:szCs w:val="28"/>
+        </w:rPr>
+        <w:t>двойному</w:t>
+      </w:r>
+      <w:proofErr w:type="gramEnd"/>
+      <w:r>
+        <w:rPr>
+          <w:sz w:val="28"/>
+          <w:szCs w:val="28"/>
+        </w:rPr>
+        <w:t xml:space="preserve"> гамма распределению. Предметом исследования — статистические свойства данной выборки и методы её анализа.</w:t>
       </w:r>
     </w:p>
     <w:p>
@@ -2140,7 +2190,39 @@
           <w:sz w:val="28"/>
           <w:szCs w:val="28"/>
         </w:rPr>
-        <w:t>Работа выполнена с использованием языка программирования Python в среде Jupyter Notebook. Все вычисления реализованы самостоятельно, без применения готовых статистических библиотек там, где это оговорено заданием.</w:t>
+        <w:t xml:space="preserve">Работа выполнена с использованием языка программирования Python в среде </w:t>
+      </w:r>
+      <w:proofErr w:type="spellStart"/>
+      <w:r>
+        <w:rPr>
+          <w:sz w:val="28"/>
+          <w:szCs w:val="28"/>
+        </w:rPr>
+        <w:t>Jupyter</w:t>
+      </w:r>
+      <w:proofErr w:type="spellEnd"/>
+      <w:r>
+        <w:rPr>
+          <w:sz w:val="28"/>
+          <w:szCs w:val="28"/>
+        </w:rPr>
+        <w:t xml:space="preserve"> </w:t>
+      </w:r>
+      <w:proofErr w:type="spellStart"/>
+      <w:r>
+        <w:rPr>
+          <w:sz w:val="28"/>
+          <w:szCs w:val="28"/>
+        </w:rPr>
+        <w:t>Notebook</w:t>
+      </w:r>
+      <w:proofErr w:type="spellEnd"/>
+      <w:r>
+        <w:rPr>
+          <w:sz w:val="28"/>
+          <w:szCs w:val="28"/>
+        </w:rPr>
+        <w:t>. Все вычисления реализованы самостоятельно, без применения готовых статистических библиотек там, где это оговорено заданием.</w:t>
       </w:r>
     </w:p>
     <w:p>
@@ -2466,6 +2548,7 @@
         </w:rPr>
         <w:t xml:space="preserve">Гамма-распределение определено только для неотрицательных значений случайной величины, что ограничивает его применимость при моделировании симметричных процессов [2]. Для преодоления этого ограничения исследователями было предложено его естественное расширение на всю числовую ось — двойное гамма-распределение (также называемое отражённым гамма-распределением, англ. </w:t>
       </w:r>
+      <w:proofErr w:type="spellStart"/>
       <w:r>
         <w:rPr>
           <w:i/>
@@ -2473,8 +2556,49 @@
           <w:sz w:val="28"/>
           <w:szCs w:val="28"/>
         </w:rPr>
-        <w:t>Reflected gamma distribution</w:t>
-      </w:r>
+        <w:t>Reflected</w:t>
+      </w:r>
+      <w:proofErr w:type="spellEnd"/>
+      <w:r>
+        <w:rPr>
+          <w:i/>
+          <w:iCs/>
+          <w:sz w:val="28"/>
+          <w:szCs w:val="28"/>
+        </w:rPr>
+        <w:t xml:space="preserve"> </w:t>
+      </w:r>
+      <w:proofErr w:type="spellStart"/>
+      <w:r>
+        <w:rPr>
+          <w:i/>
+          <w:iCs/>
+          <w:sz w:val="28"/>
+          <w:szCs w:val="28"/>
+        </w:rPr>
+        <w:t>gamma</w:t>
+      </w:r>
+      <w:proofErr w:type="spellEnd"/>
+      <w:r>
+        <w:rPr>
+          <w:i/>
+          <w:iCs/>
+          <w:sz w:val="28"/>
+          <w:szCs w:val="28"/>
+        </w:rPr>
+        <w:t xml:space="preserve"> </w:t>
+      </w:r>
+      <w:proofErr w:type="spellStart"/>
+      <w:r>
+        <w:rPr>
+          <w:i/>
+          <w:iCs/>
+          <w:sz w:val="28"/>
+          <w:szCs w:val="28"/>
+        </w:rPr>
+        <w:t>distribution</w:t>
+      </w:r>
+      <w:proofErr w:type="spellEnd"/>
       <w:r>
         <w:rPr>
           <w:sz w:val="28"/>
@@ -3083,7 +3207,71 @@
           <w:sz w:val="28"/>
           <w:szCs w:val="28"/>
         </w:rPr>
-        <w:t xml:space="preserve">Несмотря на то, что двойное гамма-распределение не является специализированным инструментом информационной безопасности, его свойства находят применение в ряде смежных задач. В частности, как показано в работе Bahashwan, Kalantan и Adham [3], метод главных компонент (PCA), основанный на двойном гамма-распределении для моделирования шума, демонстрирует повышенную устойчивость к выбросам по сравнению с классическим гауссовским PCA. Данное свойство актуально при анализе сетевого трафика, где наблюдаемые данные, как правило, содержат выбросы и нештатные значения, характерные для атак типа DoS или аномального поведения пользователей. Применение устойчивых к шуму и выбросам методов снижения размерности позволяет выделять информативные признаки из зашумлённых данных, что является одним из ключевых этапов в системах обнаружения вторжений (IDS). </w:t>
+        <w:t xml:space="preserve">Несмотря на то, что двойное гамма-распределение не является специализированным инструментом информационной безопасности, его свойства находят применение в ряде смежных задач. В частности, как показано в работе </w:t>
+      </w:r>
+      <w:proofErr w:type="spellStart"/>
+      <w:r>
+        <w:rPr>
+          <w:sz w:val="28"/>
+          <w:szCs w:val="28"/>
+        </w:rPr>
+        <w:t>Bahashwan</w:t>
+      </w:r>
+      <w:proofErr w:type="spellEnd"/>
+      <w:r>
+        <w:rPr>
+          <w:sz w:val="28"/>
+          <w:szCs w:val="28"/>
+        </w:rPr>
+        <w:t xml:space="preserve">, </w:t>
+      </w:r>
+      <w:proofErr w:type="spellStart"/>
+      <w:r>
+        <w:rPr>
+          <w:sz w:val="28"/>
+          <w:szCs w:val="28"/>
+        </w:rPr>
+        <w:t>Kalantan</w:t>
+      </w:r>
+      <w:proofErr w:type="spellEnd"/>
+      <w:r>
+        <w:rPr>
+          <w:sz w:val="28"/>
+          <w:szCs w:val="28"/>
+        </w:rPr>
+        <w:t xml:space="preserve"> и </w:t>
+      </w:r>
+      <w:proofErr w:type="spellStart"/>
+      <w:r>
+        <w:rPr>
+          <w:sz w:val="28"/>
+          <w:szCs w:val="28"/>
+        </w:rPr>
+        <w:t>Adham</w:t>
+      </w:r>
+      <w:proofErr w:type="spellEnd"/>
+      <w:r>
+        <w:rPr>
+          <w:sz w:val="28"/>
+          <w:szCs w:val="28"/>
+        </w:rPr>
+        <w:t xml:space="preserve"> [3], метод главных компонент (PCA), основанный на двойном гамма-распределении для моделирования шума, демонстрирует повышенную устойчивость к выбросам по сравнению с классическим гауссовским PCA. Данное свойство актуально при анализе сетевого трафика, где наблюдаемые данные, как правило, содержат выбросы и нештатные значения, характерные для атак типа </w:t>
+      </w:r>
+      <w:proofErr w:type="spellStart"/>
+      <w:r>
+        <w:rPr>
+          <w:sz w:val="28"/>
+          <w:szCs w:val="28"/>
+        </w:rPr>
+        <w:t>DoS</w:t>
+      </w:r>
+      <w:proofErr w:type="spellEnd"/>
+      <w:r>
+        <w:rPr>
+          <w:sz w:val="28"/>
+          <w:szCs w:val="28"/>
+        </w:rPr>
+        <w:t xml:space="preserve"> или аномального поведения пользователей. Применение устойчивых к шуму и выбросам методов снижения размерности позволяет выделять информативные признаки из зашумлённых данных, что является одним из ключевых этапов в системах обнаружения вторжений (IDS). </w:t>
       </w:r>
     </w:p>
     <w:p>
@@ -3101,7 +3289,39 @@
           <w:sz w:val="28"/>
           <w:szCs w:val="28"/>
         </w:rPr>
-        <w:t>Близкое направление исследований — статистическое моделирование самого сетевого трафика для обнаружения аномалий и DDoS-атак. В работе Scherrer и др. [</w:t>
+        <w:t xml:space="preserve">Близкое направление исследований — статистическое моделирование самого сетевого трафика для обнаружения аномалий и </w:t>
+      </w:r>
+      <w:proofErr w:type="spellStart"/>
+      <w:r>
+        <w:rPr>
+          <w:sz w:val="28"/>
+          <w:szCs w:val="28"/>
+        </w:rPr>
+        <w:t>DDoS</w:t>
+      </w:r>
+      <w:proofErr w:type="spellEnd"/>
+      <w:r>
+        <w:rPr>
+          <w:sz w:val="28"/>
+          <w:szCs w:val="28"/>
+        </w:rPr>
+        <w:t xml:space="preserve">-атак. В работе </w:t>
+      </w:r>
+      <w:proofErr w:type="spellStart"/>
+      <w:r>
+        <w:rPr>
+          <w:sz w:val="28"/>
+          <w:szCs w:val="28"/>
+        </w:rPr>
+        <w:t>Scherrer</w:t>
+      </w:r>
+      <w:proofErr w:type="spellEnd"/>
+      <w:r>
+        <w:rPr>
+          <w:sz w:val="28"/>
+          <w:szCs w:val="28"/>
+        </w:rPr>
+        <w:t xml:space="preserve"> и др. [</w:t>
       </w:r>
       <w:r>
         <w:rPr>
@@ -5838,7 +6058,23 @@
           <w:sz w:val="28"/>
           <w:szCs w:val="28"/>
         </w:rPr>
-        <w:t>С помощью функции единичного скачка (функции Хевисайда) эмпирическую функцию распределения можно записать в виде [4]:</w:t>
+        <w:t xml:space="preserve">С помощью функции единичного скачка (функции </w:t>
+      </w:r>
+      <w:proofErr w:type="spellStart"/>
+      <w:r>
+        <w:rPr>
+          <w:sz w:val="28"/>
+          <w:szCs w:val="28"/>
+        </w:rPr>
+        <w:t>Хевисайда</w:t>
+      </w:r>
+      <w:proofErr w:type="spellEnd"/>
+      <w:r>
+        <w:rPr>
+          <w:sz w:val="28"/>
+          <w:szCs w:val="28"/>
+        </w:rPr>
+        <w:t>) эмпирическую функцию распределения можно записать в виде [4]:</w:t>
       </w:r>
     </w:p>
     <w:p>
@@ -6028,7 +6264,23 @@
           <w:sz w:val="28"/>
           <w:szCs w:val="28"/>
         </w:rPr>
-        <w:t>где функция Хевисайда e(x) определяется следующим образом:</w:t>
+        <w:t xml:space="preserve">где функция </w:t>
+      </w:r>
+      <w:proofErr w:type="spellStart"/>
+      <w:r>
+        <w:rPr>
+          <w:sz w:val="28"/>
+          <w:szCs w:val="28"/>
+        </w:rPr>
+        <w:t>Хевисайда</w:t>
+      </w:r>
+      <w:proofErr w:type="spellEnd"/>
+      <w:r>
+        <w:rPr>
+          <w:sz w:val="28"/>
+          <w:szCs w:val="28"/>
+        </w:rPr>
+        <w:t xml:space="preserve"> e(x) определяется следующим образом:</w:t>
       </w:r>
     </w:p>
     <w:p>
@@ -7306,7 +7558,23 @@
           <w:szCs w:val="28"/>
         </w:rPr>
         <w:lastRenderedPageBreak/>
-        <w:t xml:space="preserve">Для анализа поведения ЭФР были сформированы три случайные подвыборки размером 10, 100 и 200 элементов из исходной выборки </w:t>
+        <w:t xml:space="preserve">Для анализа поведения ЭФР были сформированы три случайные </w:t>
+      </w:r>
+      <w:proofErr w:type="spellStart"/>
+      <w:r>
+        <w:rPr>
+          <w:sz w:val="28"/>
+          <w:szCs w:val="28"/>
+        </w:rPr>
+        <w:t>подвыборки</w:t>
+      </w:r>
+      <w:proofErr w:type="spellEnd"/>
+      <w:r>
+        <w:rPr>
+          <w:sz w:val="28"/>
+          <w:szCs w:val="28"/>
+        </w:rPr>
+        <w:t xml:space="preserve"> размером 10, 100 и 200 элементов из исходной выборки </w:t>
       </w:r>
       <m:oMath>
         <m:r>
@@ -7409,7 +7677,23 @@
           <w:sz w:val="28"/>
           <w:szCs w:val="28"/>
         </w:rPr>
-        <w:t xml:space="preserve">Рисунок 1. График эмпирической функции распределения для подвыборки из 10 элементов. </w:t>
+        <w:t xml:space="preserve">Рисунок 1. График эмпирической функции распределения для </w:t>
+      </w:r>
+      <w:proofErr w:type="spellStart"/>
+      <w:r>
+        <w:rPr>
+          <w:sz w:val="28"/>
+          <w:szCs w:val="28"/>
+        </w:rPr>
+        <w:t>подвыборки</w:t>
+      </w:r>
+      <w:proofErr w:type="spellEnd"/>
+      <w:r>
+        <w:rPr>
+          <w:sz w:val="28"/>
+          <w:szCs w:val="28"/>
+        </w:rPr>
+        <w:t xml:space="preserve"> из 10 элементов. </w:t>
       </w:r>
     </w:p>
     <w:p>
@@ -7479,7 +7763,23 @@
           <w:sz w:val="28"/>
           <w:szCs w:val="28"/>
         </w:rPr>
-        <w:t xml:space="preserve">Рисунок 2. График эмпирической функции распределения для подвыборки из 100 элементов. </w:t>
+        <w:t xml:space="preserve">Рисунок 2. График эмпирической функции распределения для </w:t>
+      </w:r>
+      <w:proofErr w:type="spellStart"/>
+      <w:r>
+        <w:rPr>
+          <w:sz w:val="28"/>
+          <w:szCs w:val="28"/>
+        </w:rPr>
+        <w:t>подвыборки</w:t>
+      </w:r>
+      <w:proofErr w:type="spellEnd"/>
+      <w:r>
+        <w:rPr>
+          <w:sz w:val="28"/>
+          <w:szCs w:val="28"/>
+        </w:rPr>
+        <w:t xml:space="preserve"> из 100 элементов. </w:t>
       </w:r>
     </w:p>
     <w:p>
@@ -7559,7 +7859,23 @@
           <w:sz w:val="28"/>
           <w:szCs w:val="28"/>
         </w:rPr>
-        <w:t>Рисунок 3. График эмпирической функции распределения для подвыборки из 200 элементов.</w:t>
+        <w:t xml:space="preserve">Рисунок 3. График эмпирической функции распределения для </w:t>
+      </w:r>
+      <w:proofErr w:type="spellStart"/>
+      <w:r>
+        <w:rPr>
+          <w:sz w:val="28"/>
+          <w:szCs w:val="28"/>
+        </w:rPr>
+        <w:t>подвыборки</w:t>
+      </w:r>
+      <w:proofErr w:type="spellEnd"/>
+      <w:r>
+        <w:rPr>
+          <w:sz w:val="28"/>
+          <w:szCs w:val="28"/>
+        </w:rPr>
+        <w:t xml:space="preserve"> из 200 элементов.</w:t>
       </w:r>
     </w:p>
     <w:p>
@@ -7610,7 +7926,23 @@
           <w:sz w:val="28"/>
           <w:szCs w:val="28"/>
         </w:rPr>
-        <w:t xml:space="preserve">. При увеличении объёма подвыборки эмпирическая функция распределения заметно приближается к теоретической. При </w:t>
+        <w:t xml:space="preserve">. При увеличении объёма </w:t>
+      </w:r>
+      <w:proofErr w:type="spellStart"/>
+      <w:r>
+        <w:rPr>
+          <w:sz w:val="28"/>
+          <w:szCs w:val="28"/>
+        </w:rPr>
+        <w:t>подвыборки</w:t>
+      </w:r>
+      <w:proofErr w:type="spellEnd"/>
+      <w:r>
+        <w:rPr>
+          <w:sz w:val="28"/>
+          <w:szCs w:val="28"/>
+        </w:rPr>
+        <w:t xml:space="preserve"> эмпирическая функция распределения заметно приближается к теоретической. При </w:t>
       </w:r>
       <m:oMath>
         <m:r>
@@ -8826,12 +9158,21 @@
         </w:rPr>
         <w:t> и</w:t>
       </w:r>
-      <w:r>
-        <w:rPr>
-          <w:sz w:val="28"/>
-          <w:szCs w:val="28"/>
-        </w:rPr>
-        <w:t xml:space="preserve">нтервалов; </w:t>
+      <w:proofErr w:type="spellStart"/>
+      <w:r>
+        <w:rPr>
+          <w:sz w:val="28"/>
+          <w:szCs w:val="28"/>
+        </w:rPr>
+        <w:t>нтервалов</w:t>
+      </w:r>
+      <w:proofErr w:type="spellEnd"/>
+      <w:r>
+        <w:rPr>
+          <w:sz w:val="28"/>
+          <w:szCs w:val="28"/>
+        </w:rPr>
+        <w:t xml:space="preserve">; </w:t>
       </w:r>
     </w:p>
     <w:p>
@@ -9650,7 +9991,23 @@
           <w:sz w:val="28"/>
           <w:szCs w:val="28"/>
         </w:rPr>
-        <w:t>Результаты работы функции для случайных подвыборок размером 10, 100 и 200 элементов — на рисунках </w:t>
+        <w:t xml:space="preserve">Результаты работы функции для случайных </w:t>
+      </w:r>
+      <w:proofErr w:type="spellStart"/>
+      <w:r>
+        <w:rPr>
+          <w:sz w:val="28"/>
+          <w:szCs w:val="28"/>
+        </w:rPr>
+        <w:t>подвыборок</w:t>
+      </w:r>
+      <w:proofErr w:type="spellEnd"/>
+      <w:r>
+        <w:rPr>
+          <w:sz w:val="28"/>
+          <w:szCs w:val="28"/>
+        </w:rPr>
+        <w:t xml:space="preserve"> размером 10, 100 и 200 элементов — на рисунках </w:t>
       </w:r>
       <w:r>
         <w:rPr>
@@ -9794,7 +10151,27 @@
           <w:sz w:val="28"/>
           <w:szCs w:val="28"/>
         </w:rPr>
-        <w:t>Вид гистограмм для случайных подвыборок размера 10, 100, 200</w:t>
+        <w:t xml:space="preserve">Вид гистограмм для случайных </w:t>
+      </w:r>
+      <w:proofErr w:type="spellStart"/>
+      <w:r>
+        <w:rPr>
+          <w:b/>
+          <w:bCs/>
+          <w:sz w:val="28"/>
+          <w:szCs w:val="28"/>
+        </w:rPr>
+        <w:t>подвыборок</w:t>
+      </w:r>
+      <w:proofErr w:type="spellEnd"/>
+      <w:r>
+        <w:rPr>
+          <w:b/>
+          <w:bCs/>
+          <w:sz w:val="28"/>
+          <w:szCs w:val="28"/>
+        </w:rPr>
+        <w:t xml:space="preserve"> размера 10, 100, 200</w:t>
       </w:r>
     </w:p>
     <w:p>
@@ -9891,7 +10268,23 @@
           <w:sz w:val="28"/>
           <w:szCs w:val="28"/>
         </w:rPr>
-        <w:t> – Гистограмма для подвыборки из 10 элементов</w:t>
+        <w:t xml:space="preserve"> – Гистограмма для </w:t>
+      </w:r>
+      <w:proofErr w:type="spellStart"/>
+      <w:r>
+        <w:rPr>
+          <w:sz w:val="28"/>
+          <w:szCs w:val="28"/>
+        </w:rPr>
+        <w:t>подвыборки</w:t>
+      </w:r>
+      <w:proofErr w:type="spellEnd"/>
+      <w:r>
+        <w:rPr>
+          <w:sz w:val="28"/>
+          <w:szCs w:val="28"/>
+        </w:rPr>
+        <w:t xml:space="preserve"> из 10 элементов</w:t>
       </w:r>
     </w:p>
     <w:p>
@@ -9985,7 +10378,23 @@
           <w:sz w:val="28"/>
           <w:szCs w:val="28"/>
         </w:rPr>
-        <w:t> – Гистограмма для подвыборки из 100 элементов</w:t>
+        <w:t xml:space="preserve"> – Гистограмма для </w:t>
+      </w:r>
+      <w:proofErr w:type="spellStart"/>
+      <w:r>
+        <w:rPr>
+          <w:sz w:val="28"/>
+          <w:szCs w:val="28"/>
+        </w:rPr>
+        <w:t>подвыборки</w:t>
+      </w:r>
+      <w:proofErr w:type="spellEnd"/>
+      <w:r>
+        <w:rPr>
+          <w:sz w:val="28"/>
+          <w:szCs w:val="28"/>
+        </w:rPr>
+        <w:t xml:space="preserve"> из 100 элементов</w:t>
       </w:r>
     </w:p>
     <w:p>
@@ -10089,7 +10498,23 @@
           <w:sz w:val="28"/>
           <w:szCs w:val="28"/>
         </w:rPr>
-        <w:t> – Гистограмма для подвыборки из 200 элементов.</w:t>
+        <w:t xml:space="preserve"> – Гистограмма для </w:t>
+      </w:r>
+      <w:proofErr w:type="spellStart"/>
+      <w:r>
+        <w:rPr>
+          <w:sz w:val="28"/>
+          <w:szCs w:val="28"/>
+        </w:rPr>
+        <w:t>подвыборки</w:t>
+      </w:r>
+      <w:proofErr w:type="spellEnd"/>
+      <w:r>
+        <w:rPr>
+          <w:sz w:val="28"/>
+          <w:szCs w:val="28"/>
+        </w:rPr>
+        <w:t xml:space="preserve"> из 200 элементов.</w:t>
       </w:r>
     </w:p>
     <w:p>
@@ -10156,6 +10581,7 @@
           <w:szCs w:val="28"/>
         </w:rPr>
       </w:pPr>
+      <w:proofErr w:type="spellStart"/>
       <w:r>
         <w:rPr>
           <w:b/>
@@ -10163,8 +10589,9 @@
           <w:sz w:val="28"/>
           <w:szCs w:val="28"/>
         </w:rPr>
-        <w:t>Подвыборка из 200 элементов (рисунок </w:t>
-      </w:r>
+        <w:t>Подвыборка</w:t>
+      </w:r>
+      <w:proofErr w:type="spellEnd"/>
       <w:r>
         <w:rPr>
           <w:b/>
@@ -10172,7 +10599,7 @@
           <w:sz w:val="28"/>
           <w:szCs w:val="28"/>
         </w:rPr>
-        <w:t>7</w:t>
+        <w:t xml:space="preserve"> из 200 элементов (рисунок </w:t>
       </w:r>
       <w:r>
         <w:rPr>
@@ -10181,26 +10608,8 @@
           <w:sz w:val="28"/>
           <w:szCs w:val="28"/>
         </w:rPr>
-        <w:t>)</w:t>
-      </w:r>
-      <w:r>
-        <w:rPr>
-          <w:sz w:val="28"/>
-          <w:szCs w:val="28"/>
-        </w:rPr>
-        <w:t>. Форма гистограммы близка к полной выборке, а также пики различимы. Это свидетельствует о достаточной репрезентативности выборки объёмом 200 элементов для визуальной идентификации типа распределения.</w:t>
-      </w:r>
-    </w:p>
-    <w:p>
-      <w:pPr>
-        <w:spacing w:line="360" w:lineRule="auto"/>
-        <w:ind w:firstLine="720"/>
-        <w:jc w:val="both"/>
-        <w:rPr>
-          <w:sz w:val="28"/>
-          <w:szCs w:val="28"/>
-        </w:rPr>
-      </w:pPr>
+        <w:t>7</w:t>
+      </w:r>
       <w:r>
         <w:rPr>
           <w:b/>
@@ -10208,7 +10617,45 @@
           <w:sz w:val="28"/>
           <w:szCs w:val="28"/>
         </w:rPr>
-        <w:t>Подвыборка из 100 элементов (рисунок </w:t>
+        <w:t>)</w:t>
+      </w:r>
+      <w:r>
+        <w:rPr>
+          <w:sz w:val="28"/>
+          <w:szCs w:val="28"/>
+        </w:rPr>
+        <w:t>. Форма гистограммы близка к полной выборке, а также пики различимы. Это свидетельствует о достаточной репрезентативности выборки объёмом 200 элементов для визуальной идентификации типа распределения.</w:t>
+      </w:r>
+    </w:p>
+    <w:p>
+      <w:pPr>
+        <w:spacing w:line="360" w:lineRule="auto"/>
+        <w:ind w:firstLine="720"/>
+        <w:jc w:val="both"/>
+        <w:rPr>
+          <w:sz w:val="28"/>
+          <w:szCs w:val="28"/>
+        </w:rPr>
+      </w:pPr>
+      <w:proofErr w:type="spellStart"/>
+      <w:r>
+        <w:rPr>
+          <w:b/>
+          <w:bCs/>
+          <w:sz w:val="28"/>
+          <w:szCs w:val="28"/>
+        </w:rPr>
+        <w:t>Подвыборка</w:t>
+      </w:r>
+      <w:proofErr w:type="spellEnd"/>
+      <w:r>
+        <w:rPr>
+          <w:b/>
+          <w:bCs/>
+          <w:sz w:val="28"/>
+          <w:szCs w:val="28"/>
+        </w:rPr>
+        <w:t xml:space="preserve"> из 100 элементов (рисунок </w:t>
       </w:r>
       <w:r>
         <w:rPr>
@@ -10263,6 +10710,7 @@
           <w:szCs w:val="28"/>
         </w:rPr>
       </w:pPr>
+      <w:proofErr w:type="spellStart"/>
       <w:r>
         <w:rPr>
           <w:b/>
@@ -10270,7 +10718,17 @@
           <w:sz w:val="28"/>
           <w:szCs w:val="28"/>
         </w:rPr>
-        <w:t>Подвыборка из 10 элементов (рисунок </w:t>
+        <w:t>Подвыборка</w:t>
+      </w:r>
+      <w:proofErr w:type="spellEnd"/>
+      <w:r>
+        <w:rPr>
+          <w:b/>
+          <w:bCs/>
+          <w:sz w:val="28"/>
+          <w:szCs w:val="28"/>
+        </w:rPr>
+        <w:t xml:space="preserve"> из 10 элементов (рисунок </w:t>
       </w:r>
       <w:r>
         <w:rPr>
@@ -15065,7 +15523,23 @@
           <w:sz w:val="28"/>
           <w:szCs w:val="28"/>
         </w:rPr>
-        <w:t>Для проверки несмещённости было сгенерировано 1000 выборок объём</w:t>
+        <w:t xml:space="preserve">Для проверки </w:t>
+      </w:r>
+      <w:proofErr w:type="spellStart"/>
+      <w:r>
+        <w:rPr>
+          <w:sz w:val="28"/>
+          <w:szCs w:val="28"/>
+        </w:rPr>
+        <w:t>несмещённости</w:t>
+      </w:r>
+      <w:proofErr w:type="spellEnd"/>
+      <w:r>
+        <w:rPr>
+          <w:sz w:val="28"/>
+          <w:szCs w:val="28"/>
+        </w:rPr>
+        <w:t xml:space="preserve"> было сгенерировано 1000 выборок объём</w:t>
       </w:r>
       <w:r>
         <w:rPr>
@@ -16185,7 +16659,23 @@
           <w:sz w:val="28"/>
           <w:szCs w:val="28"/>
         </w:rPr>
-        <w:t>Листинг 18. Проверка несмещенности с помощью ММ.</w:t>
+        <w:t xml:space="preserve">Листинг 18. Проверка </w:t>
+      </w:r>
+      <w:proofErr w:type="spellStart"/>
+      <w:r>
+        <w:rPr>
+          <w:sz w:val="28"/>
+          <w:szCs w:val="28"/>
+        </w:rPr>
+        <w:t>несмещенности</w:t>
+      </w:r>
+      <w:proofErr w:type="spellEnd"/>
+      <w:r>
+        <w:rPr>
+          <w:sz w:val="28"/>
+          <w:szCs w:val="28"/>
+        </w:rPr>
+        <w:t xml:space="preserve"> с помощью ММ.</w:t>
       </w:r>
     </w:p>
     <w:p>
@@ -16258,7 +16748,23 @@
           <w:sz w:val="28"/>
           <w:szCs w:val="28"/>
         </w:rPr>
-        <w:t>Листинг 19. Проверка несмещенности с помощью ММП.</w:t>
+        <w:t xml:space="preserve">Листинг 19. Проверка </w:t>
+      </w:r>
+      <w:proofErr w:type="spellStart"/>
+      <w:r>
+        <w:rPr>
+          <w:sz w:val="28"/>
+          <w:szCs w:val="28"/>
+        </w:rPr>
+        <w:t>несмещенности</w:t>
+      </w:r>
+      <w:proofErr w:type="spellEnd"/>
+      <w:r>
+        <w:rPr>
+          <w:sz w:val="28"/>
+          <w:szCs w:val="28"/>
+        </w:rPr>
+        <w:t xml:space="preserve"> с помощью ММП.</w:t>
       </w:r>
     </w:p>
     <w:p>
@@ -17181,7 +17687,23 @@
           <w:sz w:val="28"/>
           <w:szCs w:val="28"/>
         </w:rPr>
-        <w:t>Эффективной называется оценка, дисперсия которой близка к минимально возможной. Согласно неравенству Рао-Крамера:</w:t>
+        <w:t xml:space="preserve">Эффективной называется оценка, дисперсия которой близка к минимально возможной. Согласно неравенству </w:t>
+      </w:r>
+      <w:proofErr w:type="spellStart"/>
+      <w:r>
+        <w:rPr>
+          <w:sz w:val="28"/>
+          <w:szCs w:val="28"/>
+        </w:rPr>
+        <w:t>Рао</w:t>
+      </w:r>
+      <w:proofErr w:type="spellEnd"/>
+      <w:r>
+        <w:rPr>
+          <w:sz w:val="28"/>
+          <w:szCs w:val="28"/>
+        </w:rPr>
+        <w:t>-Крамера:</w:t>
       </w:r>
     </w:p>
     <w:p>
@@ -18174,7 +18696,23 @@
           <w:sz w:val="28"/>
           <w:szCs w:val="28"/>
         </w:rPr>
-        <w:t xml:space="preserve">Поскольку явной формулы для тригамма-функции </w:t>
+        <w:t xml:space="preserve">Поскольку явной формулы для </w:t>
+      </w:r>
+      <w:proofErr w:type="spellStart"/>
+      <w:r>
+        <w:rPr>
+          <w:sz w:val="28"/>
+          <w:szCs w:val="28"/>
+        </w:rPr>
+        <w:t>тригамма</w:t>
+      </w:r>
+      <w:proofErr w:type="spellEnd"/>
+      <w:r>
+        <w:rPr>
+          <w:sz w:val="28"/>
+          <w:szCs w:val="28"/>
+        </w:rPr>
+        <w:t xml:space="preserve">-функции </w:t>
       </w:r>
       <m:oMath>
         <m:r>
@@ -19370,12 +19908,21 @@
         </w:rPr>
         <w:t xml:space="preserve"> дисперсия оценки методом моментов почти в 11 раз превышает нижнюю границу, что говорит о низкой эффективности выборочного среднего как оценки этого параметра. Дисперсия оценки методом максимального правдоподобия, напротив, лишь незначительно превышает границу </w:t>
       </w:r>
-      <w:r>
-        <w:rPr>
-          <w:sz w:val="28"/>
-          <w:szCs w:val="28"/>
-        </w:rPr>
-        <w:t>Рао-Крамера</w:t>
+      <w:proofErr w:type="spellStart"/>
+      <w:r>
+        <w:rPr>
+          <w:sz w:val="28"/>
+          <w:szCs w:val="28"/>
+        </w:rPr>
+        <w:t>Рао</w:t>
+      </w:r>
+      <w:proofErr w:type="spellEnd"/>
+      <w:r>
+        <w:rPr>
+          <w:sz w:val="28"/>
+          <w:szCs w:val="28"/>
+        </w:rPr>
+        <w:t>-Крамера</w:t>
       </w:r>
       <w:r>
         <w:rPr>
@@ -19858,7 +20405,23 @@
           <w:sz w:val="28"/>
           <w:szCs w:val="28"/>
         </w:rPr>
-        <w:t>Для параметра loc эффективность оценок различается: метод моментов использует лишь около 9% максимально достижимой точности</w:t>
+        <w:t xml:space="preserve">Для параметра </w:t>
+      </w:r>
+      <w:proofErr w:type="spellStart"/>
+      <w:r>
+        <w:rPr>
+          <w:sz w:val="28"/>
+          <w:szCs w:val="28"/>
+        </w:rPr>
+        <w:t>loc</w:t>
+      </w:r>
+      <w:proofErr w:type="spellEnd"/>
+      <w:r>
+        <w:rPr>
+          <w:sz w:val="28"/>
+          <w:szCs w:val="28"/>
+        </w:rPr>
+        <w:t xml:space="preserve"> эффективность оценок различается: метод моментов использует лишь около 9% максимально достижимой точности</w:t>
       </w:r>
       <w:r>
         <w:rPr>
@@ -20182,6 +20745,16 @@
     </w:p>
     <w:p>
       <w:pPr>
+        <w:spacing w:before="100" w:beforeAutospacing="1" w:after="100" w:afterAutospacing="1" w:line="360" w:lineRule="auto"/>
+        <w:jc w:val="both"/>
+        <w:rPr>
+          <w:sz w:val="28"/>
+          <w:szCs w:val="28"/>
+        </w:rPr>
+      </w:pPr>
+    </w:p>
+    <w:p>
+      <w:pPr>
         <w:pStyle w:val="a7"/>
         <w:numPr>
           <w:ilvl w:val="0"/>
@@ -20201,6 +20774,7 @@
           <w:sz w:val="32"/>
           <w:szCs w:val="32"/>
         </w:rPr>
+        <w:lastRenderedPageBreak/>
         <w:t>Интервальные оценки параметров</w:t>
       </w:r>
     </w:p>
@@ -20225,7 +20799,6 @@
           <w:sz w:val="28"/>
           <w:szCs w:val="28"/>
         </w:rPr>
-        <w:lastRenderedPageBreak/>
         <w:t>Метод построения</w:t>
       </w:r>
     </w:p>
@@ -21468,7 +22041,21 @@
           <w:sz w:val="28"/>
           <w:szCs w:val="28"/>
         </w:rPr>
-        <w:t xml:space="preserve"> взяли из таблицы значений для квантиля нормального распределения.</w:t>
+        <w:t xml:space="preserve"> взяли из таблицы значений для квантиля нормального распределения</w:t>
+      </w:r>
+      <w:r>
+        <w:rPr>
+          <w:sz w:val="28"/>
+          <w:szCs w:val="28"/>
+        </w:rPr>
+        <w:t>, согласно центральной предельной теореме</w:t>
+      </w:r>
+      <w:r>
+        <w:rPr>
+          <w:sz w:val="28"/>
+          <w:szCs w:val="28"/>
+        </w:rPr>
+        <w:t>.</w:t>
       </w:r>
     </w:p>
     <w:p>
@@ -21704,7 +22291,6 @@
                 <w:sz w:val="28"/>
                 <w:szCs w:val="28"/>
               </w:rPr>
-              <w:lastRenderedPageBreak/>
               <w:t>Параметр</w:t>
             </w:r>
           </w:p>
@@ -22746,6 +23332,17 @@
     </w:p>
     <w:p>
       <w:pPr>
+        <w:spacing w:before="100" w:beforeAutospacing="1" w:after="100" w:afterAutospacing="1" w:line="360" w:lineRule="auto"/>
+        <w:ind w:firstLine="708"/>
+        <w:jc w:val="both"/>
+        <w:rPr>
+          <w:sz w:val="28"/>
+          <w:szCs w:val="28"/>
+        </w:rPr>
+      </w:pPr>
+    </w:p>
+    <w:p>
+      <w:pPr>
         <w:pStyle w:val="a7"/>
         <w:numPr>
           <w:ilvl w:val="0"/>
@@ -22789,7 +23386,6 @@
           <w:sz w:val="28"/>
           <w:szCs w:val="28"/>
         </w:rPr>
-        <w:lastRenderedPageBreak/>
         <w:t>Ошибки первого и второго рода</w:t>
       </w:r>
     </w:p>
@@ -22912,16 +23508,56 @@
           <w:sz w:val="28"/>
           <w:szCs w:val="28"/>
         </w:rPr>
-        <w:t>} для каждого параметра. Здесь</w:t>
+        <w:t>} для каждого параметра</w:t>
+      </w:r>
+      <w:r>
+        <w:rPr>
+          <w:rFonts w:eastAsia="Arial"/>
+          <w:sz w:val="28"/>
+          <w:szCs w:val="28"/>
+        </w:rPr>
+        <w:t xml:space="preserve">, то есть </w:t>
       </w:r>
       <m:oMath>
+        <m:sSub>
+          <m:sSubPr>
+            <m:ctrlPr>
+              <w:rPr>
+                <w:rFonts w:ascii="Cambria Math" w:eastAsia="Arial" w:hAnsi="Cambria Math"/>
+                <w:i/>
+                <w:sz w:val="28"/>
+                <w:szCs w:val="28"/>
+              </w:rPr>
+            </m:ctrlPr>
+          </m:sSubPr>
+          <m:e>
+            <m:r>
+              <w:rPr>
+                <w:rFonts w:ascii="Cambria Math" w:eastAsia="Arial" w:hAnsi="Cambria Math"/>
+                <w:sz w:val="28"/>
+                <w:szCs w:val="28"/>
+              </w:rPr>
+              <m:t>H</m:t>
+            </m:r>
+          </m:e>
+          <m:sub>
+            <m:r>
+              <w:rPr>
+                <w:rFonts w:ascii="Cambria Math" w:eastAsia="Arial" w:hAnsi="Cambria Math"/>
+                <w:sz w:val="28"/>
+                <w:szCs w:val="28"/>
+              </w:rPr>
+              <m:t>0</m:t>
+            </m:r>
+          </m:sub>
+        </m:sSub>
         <m:r>
           <w:rPr>
             <w:rFonts w:ascii="Cambria Math" w:eastAsia="Arial" w:hAnsi="Cambria Math"/>
             <w:sz w:val="28"/>
             <w:szCs w:val="28"/>
           </w:rPr>
-          <m:t xml:space="preserve"> </m:t>
+          <m:t>:{a=</m:t>
         </m:r>
         <m:acc>
           <m:accPr>
@@ -22963,29 +23599,28 @@
                     <w:sz w:val="28"/>
                     <w:szCs w:val="28"/>
                   </w:rPr>
-                  <m:t>i</m:t>
+                  <m:t>M</m:t>
+                </m:r>
+                <m:r>
+                  <w:rPr>
+                    <w:rFonts w:ascii="Cambria Math" w:eastAsia="Arial" w:hAnsi="Cambria Math"/>
+                    <w:sz w:val="28"/>
+                    <w:szCs w:val="28"/>
+                    <w:lang w:val="en-US"/>
+                  </w:rPr>
+                  <m:t>M</m:t>
                 </m:r>
               </m:sub>
             </m:sSub>
           </m:e>
         </m:acc>
-      </m:oMath>
-      <w:r>
-        <w:rPr>
-          <w:rFonts w:eastAsia="Arial"/>
-          <w:sz w:val="28"/>
-          <w:szCs w:val="28"/>
-        </w:rPr>
-        <w:t xml:space="preserve">- оценка параметра распределения </w:t>
-      </w:r>
-      <m:oMath>
         <m:r>
           <w:rPr>
             <w:rFonts w:ascii="Cambria Math" w:eastAsia="Arial" w:hAnsi="Cambria Math"/>
             <w:sz w:val="28"/>
             <w:szCs w:val="28"/>
           </w:rPr>
-          <m:t>a</m:t>
+          <m:t>}</m:t>
         </m:r>
       </m:oMath>
       <w:r>
@@ -22994,7 +23629,137 @@
           <w:sz w:val="28"/>
           <w:szCs w:val="28"/>
         </w:rPr>
-        <w:t>, полученная в результате применения метода моментов, метода максимального правдоподобия. Уровень значимости</w:t>
+        <w:t>,</w:t>
+      </w:r>
+    </w:p>
+    <w:p>
+      <w:pPr>
+        <w:spacing w:line="360" w:lineRule="auto"/>
+        <w:rPr>
+          <w:rFonts w:eastAsia="Arial"/>
+          <w:sz w:val="28"/>
+          <w:szCs w:val="28"/>
+        </w:rPr>
+      </w:pPr>
+      <w:r>
+        <w:rPr>
+          <w:rFonts w:eastAsia="Arial"/>
+          <w:sz w:val="28"/>
+          <w:szCs w:val="28"/>
+        </w:rPr>
+        <w:t xml:space="preserve"> </w:t>
+      </w:r>
+      <m:oMath>
+        <m:sSub>
+          <m:sSubPr>
+            <m:ctrlPr>
+              <w:rPr>
+                <w:rFonts w:ascii="Cambria Math" w:eastAsia="Arial" w:hAnsi="Cambria Math"/>
+                <w:i/>
+                <w:sz w:val="28"/>
+                <w:szCs w:val="28"/>
+              </w:rPr>
+            </m:ctrlPr>
+          </m:sSubPr>
+          <m:e>
+            <m:r>
+              <w:rPr>
+                <w:rFonts w:ascii="Cambria Math" w:eastAsia="Arial" w:hAnsi="Cambria Math"/>
+                <w:sz w:val="28"/>
+                <w:szCs w:val="28"/>
+              </w:rPr>
+              <m:t>H</m:t>
+            </m:r>
+          </m:e>
+          <m:sub>
+            <m:r>
+              <w:rPr>
+                <w:rFonts w:ascii="Cambria Math" w:eastAsia="Arial" w:hAnsi="Cambria Math"/>
+                <w:sz w:val="28"/>
+                <w:szCs w:val="28"/>
+              </w:rPr>
+              <m:t>1</m:t>
+            </m:r>
+          </m:sub>
+        </m:sSub>
+        <m:r>
+          <w:rPr>
+            <w:rFonts w:ascii="Cambria Math" w:eastAsia="Arial" w:hAnsi="Cambria Math"/>
+            <w:sz w:val="28"/>
+            <w:szCs w:val="28"/>
+          </w:rPr>
+          <m:t>:{a=</m:t>
+        </m:r>
+        <m:sSub>
+          <m:sSubPr>
+            <m:ctrlPr>
+              <w:rPr>
+                <w:rFonts w:ascii="Cambria Math" w:eastAsia="Arial" w:hAnsi="Cambria Math"/>
+                <w:i/>
+                <w:sz w:val="28"/>
+                <w:szCs w:val="28"/>
+              </w:rPr>
+            </m:ctrlPr>
+          </m:sSubPr>
+          <m:e>
+            <m:acc>
+              <m:accPr>
+                <m:ctrlPr>
+                  <w:rPr>
+                    <w:rFonts w:ascii="Cambria Math" w:eastAsia="Arial" w:hAnsi="Cambria Math"/>
+                    <w:i/>
+                    <w:sz w:val="28"/>
+                    <w:szCs w:val="28"/>
+                  </w:rPr>
+                </m:ctrlPr>
+              </m:accPr>
+              <m:e>
+                <m:r>
+                  <w:rPr>
+                    <w:rFonts w:ascii="Cambria Math" w:eastAsia="Arial" w:hAnsi="Cambria Math"/>
+                    <w:sz w:val="28"/>
+                    <w:szCs w:val="28"/>
+                  </w:rPr>
+                  <m:t>a</m:t>
+                </m:r>
+              </m:e>
+            </m:acc>
+          </m:e>
+          <m:sub>
+            <m:r>
+              <w:rPr>
+                <w:rFonts w:ascii="Cambria Math" w:eastAsia="Arial" w:hAnsi="Cambria Math"/>
+                <w:sz w:val="28"/>
+                <w:szCs w:val="28"/>
+              </w:rPr>
+              <m:t>ММП</m:t>
+            </m:r>
+          </m:sub>
+        </m:sSub>
+        <m:r>
+          <w:rPr>
+            <w:rFonts w:ascii="Cambria Math" w:eastAsia="Arial" w:hAnsi="Cambria Math"/>
+            <w:sz w:val="28"/>
+            <w:szCs w:val="28"/>
+          </w:rPr>
+          <m:t>}</m:t>
+        </m:r>
+      </m:oMath>
+      <w:r>
+        <w:rPr>
+          <w:rFonts w:eastAsia="Arial"/>
+          <w:sz w:val="28"/>
+          <w:szCs w:val="28"/>
+        </w:rPr>
+        <w:t xml:space="preserve">. </w:t>
+      </w:r>
+      <w:r>
+        <w:rPr>
+          <w:rFonts w:eastAsia="Arial"/>
+          <w:sz w:val="28"/>
+          <w:szCs w:val="28"/>
+        </w:rPr>
+        <w:t>Уровень значимости</w:t>
       </w:r>
       <m:oMath>
         <m:sSub>
@@ -23029,6 +23794,14 @@
             </m:r>
           </m:sub>
         </m:sSub>
+        <m:r>
+          <w:rPr>
+            <w:rFonts w:ascii="Cambria Math" w:eastAsia="Arial" w:hAnsi="Cambria Math"/>
+            <w:sz w:val="28"/>
+            <w:szCs w:val="28"/>
+          </w:rPr>
+          <m:t>=0,05</m:t>
+        </m:r>
       </m:oMath>
       <w:r>
         <w:rPr>
@@ -23036,7 +23809,7 @@
           <w:sz w:val="28"/>
           <w:szCs w:val="28"/>
         </w:rPr>
-        <w:t xml:space="preserve">=0,05. [Листинг 23, </w:t>
+        <w:t xml:space="preserve">. [Листинг 23, </w:t>
       </w:r>
       <w:r>
         <w:rPr>
@@ -23053,6 +23826,86 @@
           <w:szCs w:val="28"/>
         </w:rPr>
         <w:t>]</w:t>
+      </w:r>
+    </w:p>
+    <w:p>
+      <w:pPr>
+        <w:spacing w:line="360" w:lineRule="auto"/>
+        <w:rPr>
+          <w:rFonts w:eastAsia="Arial"/>
+          <w:sz w:val="28"/>
+          <w:szCs w:val="28"/>
+        </w:rPr>
+      </w:pPr>
+      <w:r>
+        <w:rPr>
+          <w:rFonts w:eastAsia="Arial"/>
+          <w:sz w:val="28"/>
+          <w:szCs w:val="28"/>
+        </w:rPr>
+        <w:tab/>
+      </w:r>
+      <w:r>
+        <w:rPr>
+          <w:rFonts w:eastAsia="Arial"/>
+          <w:sz w:val="28"/>
+          <w:szCs w:val="28"/>
+        </w:rPr>
+        <w:t xml:space="preserve">Критическое значение находилось методом Монте-Карло по </w:t>
+      </w:r>
+      <m:oMath>
+        <m:r>
+          <w:rPr>
+            <w:rFonts w:ascii="Cambria Math" w:eastAsia="Arial" w:hAnsi="Cambria Math"/>
+            <w:sz w:val="28"/>
+            <w:szCs w:val="28"/>
+          </w:rPr>
+          <m:t>m=1000</m:t>
+        </m:r>
+      </m:oMath>
+      <w:r>
+        <w:rPr>
+          <w:rFonts w:eastAsia="Arial"/>
+          <w:sz w:val="28"/>
+          <w:szCs w:val="28"/>
+        </w:rPr>
+        <w:t xml:space="preserve"> смоделированным выборкам объёма</w:t>
+      </w:r>
+      <m:oMath>
+        <m:r>
+          <w:rPr>
+            <w:rFonts w:ascii="Cambria Math" w:eastAsia="Arial" w:hAnsi="Cambria Math"/>
+            <w:sz w:val="28"/>
+            <w:szCs w:val="28"/>
+          </w:rPr>
+          <m:t xml:space="preserve"> n=300</m:t>
+        </m:r>
+      </m:oMath>
+      <w:r>
+        <w:rPr>
+          <w:rFonts w:eastAsia="Arial"/>
+          <w:sz w:val="28"/>
+          <w:szCs w:val="28"/>
+        </w:rPr>
+        <w:t xml:space="preserve">, сгенерированным при истинности </w:t>
+      </w:r>
+      <m:oMath>
+        <m:r>
+          <w:rPr>
+            <w:rFonts w:ascii="Cambria Math" w:eastAsia="Arial" w:hAnsi="Cambria Math"/>
+            <w:sz w:val="28"/>
+            <w:szCs w:val="28"/>
+          </w:rPr>
+          <m:t>H₀</m:t>
+        </m:r>
+      </m:oMath>
+      <w:r>
+        <w:rPr>
+          <w:rFonts w:eastAsia="Arial"/>
+          <w:sz w:val="28"/>
+          <w:szCs w:val="28"/>
+        </w:rPr>
+        <w:t xml:space="preserve">. </w:t>
       </w:r>
     </w:p>
     <w:p>
@@ -23288,6 +24141,7 @@
           <w:sz w:val="28"/>
           <w:szCs w:val="28"/>
         </w:rPr>
+        <w:lastRenderedPageBreak/>
         <w:t>Листинг 23. Статистика критерия</w:t>
       </w:r>
     </w:p>
@@ -23329,7 +24183,6 @@
           <w:sz w:val="28"/>
           <w:szCs w:val="28"/>
         </w:rPr>
-        <w:lastRenderedPageBreak/>
         <w:drawing>
           <wp:inline distT="0" distB="0" distL="0" distR="0" wp14:anchorId="1C3B8B5C" wp14:editId="335E0EEE">
             <wp:extent cx="5563450" cy="5105400"/>
@@ -23702,6 +24555,7 @@
           <w:sz w:val="28"/>
           <w:szCs w:val="28"/>
         </w:rPr>
+        <w:lastRenderedPageBreak/>
         <w:t xml:space="preserve">По результатам видно, что наиболее мощный критерий ММП равная </w:t>
       </w:r>
       <w:r>
@@ -23710,6 +24564,31 @@
           <w:szCs w:val="28"/>
         </w:rPr>
         <w:t>0,197</w:t>
+      </w:r>
+      <w:r>
+        <w:rPr>
+          <w:sz w:val="28"/>
+          <w:szCs w:val="28"/>
+        </w:rPr>
+        <w:t xml:space="preserve">. </w:t>
+      </w:r>
+    </w:p>
+    <w:p>
+      <w:pPr>
+        <w:spacing w:before="100" w:beforeAutospacing="1" w:after="100" w:afterAutospacing="1" w:line="360" w:lineRule="auto"/>
+        <w:ind w:left="360" w:firstLine="348"/>
+        <w:jc w:val="both"/>
+        <w:rPr>
+          <w:sz w:val="28"/>
+          <w:szCs w:val="28"/>
+        </w:rPr>
+      </w:pPr>
+      <w:r>
+        <w:rPr>
+          <w:sz w:val="28"/>
+          <w:szCs w:val="28"/>
+        </w:rPr>
+        <w:t>Большая абсолютная величина критического значения объясняется тем, что статистика T представляет собой сумму 300 слагаемых, само по себе большое значение c не свидетельствует об ошибке в расчётах, а лишь отражает масштаб суммарной статистики.</w:t>
       </w:r>
     </w:p>
     <w:p>
@@ -23743,7 +24622,6 @@
           <w:sz w:val="28"/>
           <w:szCs w:val="28"/>
         </w:rPr>
-        <w:lastRenderedPageBreak/>
         <w:t>Гипотезы о виде распределения</w:t>
       </w:r>
     </w:p>
@@ -26596,69 +27474,50 @@
     <w:p>
       <w:pPr>
         <w:spacing w:line="360" w:lineRule="auto"/>
-        <w:ind w:firstLine="648"/>
-        <w:jc w:val="both"/>
-        <w:rPr>
-          <w:sz w:val="28"/>
-          <w:szCs w:val="28"/>
-        </w:rPr>
-      </w:pPr>
-      <w:r>
-        <w:rPr>
-          <w:sz w:val="28"/>
-          <w:szCs w:val="28"/>
-        </w:rPr>
-        <w:t>В ходе выполнения курсовой работы было проведено исследование двойного гамма-распределения</w:t>
-      </w:r>
-      <w:r>
-        <w:rPr>
-          <w:sz w:val="28"/>
-          <w:szCs w:val="28"/>
-        </w:rPr>
-        <w:t xml:space="preserve">. </w:t>
-      </w:r>
-      <w:r>
-        <w:rPr>
-          <w:sz w:val="28"/>
-          <w:szCs w:val="28"/>
-        </w:rPr>
-        <w:t xml:space="preserve">Для предоставленной выборки объёмом n = 300 были самостоятельно реализованы функции вычисления основных статистик выборки, построены эмпирическая функция распределения и гистограмма для полной выборки и случайных подвыборок объёмом 10, 100 и 200 элементов. </w:t>
-      </w:r>
-    </w:p>
-    <w:p>
-      <w:pPr>
-        <w:spacing w:line="360" w:lineRule="auto"/>
-        <w:ind w:firstLine="648"/>
-        <w:jc w:val="both"/>
-        <w:rPr>
-          <w:sz w:val="28"/>
-          <w:szCs w:val="28"/>
-        </w:rPr>
-      </w:pPr>
-      <w:r>
-        <w:rPr>
-          <w:sz w:val="28"/>
-          <w:szCs w:val="28"/>
-        </w:rPr>
-        <w:t>Точечные оценки параметров, найденные методом моментов</w:t>
-      </w:r>
-    </w:p>
-    <w:p>
-      <w:pPr>
-        <w:spacing w:line="360" w:lineRule="auto"/>
-        <w:ind w:firstLine="648"/>
-        <w:jc w:val="both"/>
-        <w:rPr>
-          <w:sz w:val="28"/>
-          <w:szCs w:val="28"/>
-        </w:rPr>
-      </w:pPr>
-      <w:r>
-        <w:rPr>
-          <w:sz w:val="28"/>
-          <w:szCs w:val="28"/>
-        </w:rPr>
-        <w:t xml:space="preserve"> </w:t>
+        <w:ind w:firstLine="708"/>
+        <w:rPr>
+          <w:sz w:val="28"/>
+          <w:szCs w:val="28"/>
+        </w:rPr>
+      </w:pPr>
+      <w:r>
+        <w:rPr>
+          <w:sz w:val="28"/>
+          <w:szCs w:val="28"/>
+        </w:rPr>
+        <w:t>В результате исследования двойного гамма-распределения по выборке объёмом n=300 получены следующие результаты</w:t>
+      </w:r>
+      <w:r>
+        <w:rPr>
+          <w:sz w:val="28"/>
+          <w:szCs w:val="28"/>
+        </w:rPr>
+        <w:t>:</w:t>
+      </w:r>
+    </w:p>
+    <w:p>
+      <w:pPr>
+        <w:spacing w:line="360" w:lineRule="auto"/>
+        <w:rPr>
+          <w:sz w:val="28"/>
+          <w:szCs w:val="28"/>
+        </w:rPr>
+      </w:pPr>
+      <w:r>
+        <w:rPr>
+          <w:b/>
+          <w:bCs/>
+          <w:sz w:val="28"/>
+          <w:szCs w:val="28"/>
+        </w:rPr>
+        <w:t>Точечные оценки:</w:t>
+      </w:r>
+      <w:r>
+        <w:rPr>
+          <w:sz w:val="28"/>
+          <w:szCs w:val="28"/>
+        </w:rPr>
+        <w:t xml:space="preserve"> методом моментов </w:t>
       </w:r>
       <m:oMath>
         <m:r>
@@ -26667,39 +27526,7 @@
             <w:sz w:val="28"/>
             <w:szCs w:val="28"/>
           </w:rPr>
-          <m:t xml:space="preserve">(α̂ ≈ 7,07,  </m:t>
-        </m:r>
-        <m:acc>
-          <m:accPr>
-            <m:ctrlPr>
-              <w:rPr>
-                <w:rFonts w:ascii="Cambria Math" w:hAnsi="Cambria Math"/>
-                <w:i/>
-                <w:sz w:val="28"/>
-                <w:szCs w:val="28"/>
-                <w:lang w:val="en-US"/>
-              </w:rPr>
-            </m:ctrlPr>
-          </m:accPr>
-          <m:e>
-            <m:r>
-              <w:rPr>
-                <w:rFonts w:ascii="Cambria Math" w:hAnsi="Cambria Math"/>
-                <w:sz w:val="28"/>
-                <w:szCs w:val="28"/>
-                <w:lang w:val="en-US"/>
-              </w:rPr>
-              <m:t>loc</m:t>
-            </m:r>
-          </m:e>
-        </m:acc>
-        <m:r>
-          <w:rPr>
-            <w:rFonts w:ascii="Cambria Math" w:hAnsi="Cambria Math"/>
-            <w:sz w:val="28"/>
-            <w:szCs w:val="28"/>
-          </w:rPr>
-          <m:t xml:space="preserve"> ≈ 0,84)</m:t>
+          <m:t>α̂=7,07</m:t>
         </m:r>
       </m:oMath>
       <w:r>
@@ -26707,24 +27534,7 @@
           <w:sz w:val="28"/>
           <w:szCs w:val="28"/>
         </w:rPr>
-        <w:t xml:space="preserve"> </w:t>
-      </w:r>
-    </w:p>
-    <w:p>
-      <w:pPr>
-        <w:spacing w:line="360" w:lineRule="auto"/>
-        <w:jc w:val="both"/>
-        <w:rPr>
-          <w:sz w:val="28"/>
-          <w:szCs w:val="28"/>
-        </w:rPr>
-      </w:pPr>
-      <w:r>
-        <w:rPr>
-          <w:sz w:val="28"/>
-          <w:szCs w:val="28"/>
-        </w:rPr>
-        <w:t xml:space="preserve">и методом максимального правдоподобия </w:t>
+        <w:t xml:space="preserve">, </w:t>
       </w:r>
       <m:oMath>
         <m:r>
@@ -26733,46 +27543,31 @@
             <w:sz w:val="28"/>
             <w:szCs w:val="28"/>
           </w:rPr>
-          <m:t xml:space="preserve">(α̂ ≈ 7,16, </m:t>
+          <m:t>loc=0,84</m:t>
         </m:r>
-        <m:acc>
-          <m:accPr>
-            <m:ctrlPr>
-              <w:rPr>
-                <w:rFonts w:ascii="Cambria Math" w:hAnsi="Cambria Math"/>
-                <w:i/>
-                <w:sz w:val="28"/>
-                <w:szCs w:val="28"/>
-              </w:rPr>
-            </m:ctrlPr>
-          </m:accPr>
-          <m:e>
-            <m:r>
-              <w:rPr>
-                <w:rFonts w:ascii="Cambria Math" w:hAnsi="Cambria Math"/>
-                <w:sz w:val="28"/>
-                <w:szCs w:val="28"/>
-              </w:rPr>
-              <m:t>l</m:t>
-            </m:r>
-            <m:r>
-              <w:rPr>
-                <w:rFonts w:ascii="Cambria Math" w:hAnsi="Cambria Math"/>
-                <w:sz w:val="28"/>
-                <w:szCs w:val="28"/>
-                <w:lang w:val="en-US"/>
-              </w:rPr>
-              <m:t>oc</m:t>
-            </m:r>
-          </m:e>
-        </m:acc>
+      </m:oMath>
+      <w:r>
+        <w:rPr>
+          <w:sz w:val="28"/>
+          <w:szCs w:val="28"/>
+        </w:rPr>
+        <w:t>,</w:t>
+      </w:r>
+      <w:r>
+        <w:rPr>
+          <w:sz w:val="28"/>
+          <w:szCs w:val="28"/>
+        </w:rPr>
+        <w:t xml:space="preserve"> методом максимального правдоподобия </w:t>
+      </w:r>
+      <m:oMath>
         <m:r>
           <w:rPr>
             <w:rFonts w:ascii="Cambria Math" w:hAnsi="Cambria Math"/>
             <w:sz w:val="28"/>
             <w:szCs w:val="28"/>
           </w:rPr>
-          <m:t xml:space="preserve"> ≈ 0,76),</m:t>
+          <m:t>α̂=7,16</m:t>
         </m:r>
       </m:oMath>
       <w:r>
@@ -26780,51 +27575,284 @@
           <w:sz w:val="28"/>
           <w:szCs w:val="28"/>
         </w:rPr>
+        <w:t xml:space="preserve">, </w:t>
+      </w:r>
+      <m:oMath>
+        <m:r>
+          <w:rPr>
+            <w:rFonts w:ascii="Cambria Math" w:hAnsi="Cambria Math"/>
+            <w:sz w:val="28"/>
+            <w:szCs w:val="28"/>
+          </w:rPr>
+          <m:t>loc=0,76</m:t>
+        </m:r>
+      </m:oMath>
+      <w:r>
+        <w:rPr>
+          <w:sz w:val="28"/>
+          <w:szCs w:val="28"/>
+        </w:rPr>
+        <w:t>.</w:t>
+      </w:r>
+    </w:p>
+    <w:p>
+      <w:pPr>
+        <w:spacing w:line="360" w:lineRule="auto"/>
+        <w:ind w:firstLine="708"/>
+        <w:rPr>
+          <w:sz w:val="28"/>
+          <w:szCs w:val="28"/>
+        </w:rPr>
+      </w:pPr>
+      <w:r>
+        <w:rPr>
+          <w:sz w:val="28"/>
+          <w:szCs w:val="28"/>
+        </w:rPr>
+        <w:t xml:space="preserve">Обе оценки несмещённые и состоятельны. По эффективности для параметра </w:t>
+      </w:r>
+      <m:oMath>
+        <m:r>
+          <w:rPr>
+            <w:rFonts w:ascii="Cambria Math" w:hAnsi="Cambria Math"/>
+            <w:sz w:val="28"/>
+            <w:szCs w:val="28"/>
+          </w:rPr>
+          <m:t>α</m:t>
+        </m:r>
+      </m:oMath>
+      <w:r>
+        <w:rPr>
+          <w:sz w:val="28"/>
+          <w:szCs w:val="28"/>
+        </w:rPr>
+        <w:t xml:space="preserve"> оба метода близки к границе Рао–Крамера (75–80%), для параметра </w:t>
+      </w:r>
+      <m:oMath>
+        <m:r>
+          <w:rPr>
+            <w:rFonts w:ascii="Cambria Math" w:hAnsi="Cambria Math"/>
+            <w:sz w:val="28"/>
+            <w:szCs w:val="28"/>
+          </w:rPr>
+          <m:t>loc</m:t>
+        </m:r>
+      </m:oMath>
+      <w:r>
+        <w:rPr>
+          <w:sz w:val="28"/>
+          <w:szCs w:val="28"/>
+        </w:rPr>
+        <w:t xml:space="preserve"> эффективность метода моментов составила лишь 9% против 82% у метода максимального правдоподобия</w:t>
+      </w:r>
+      <w:r>
+        <w:rPr>
+          <w:sz w:val="28"/>
+          <w:szCs w:val="28"/>
+        </w:rPr>
+        <w:t xml:space="preserve">, следовательно </w:t>
+      </w:r>
+      <w:r>
+        <w:rPr>
+          <w:sz w:val="28"/>
+          <w:szCs w:val="28"/>
+        </w:rPr>
+        <w:t>метод максимального правдоподобия даёт более точные оценки.</w:t>
+      </w:r>
+    </w:p>
+    <w:p>
+      <w:pPr>
+        <w:spacing w:line="360" w:lineRule="auto"/>
+        <w:rPr>
+          <w:sz w:val="28"/>
+          <w:szCs w:val="28"/>
+        </w:rPr>
+      </w:pPr>
+      <w:r>
+        <w:rPr>
+          <w:b/>
+          <w:bCs/>
+          <w:sz w:val="28"/>
+          <w:szCs w:val="28"/>
+        </w:rPr>
+        <w:t>Интервальные оценки</w:t>
+      </w:r>
+      <w:r>
+        <w:rPr>
+          <w:sz w:val="28"/>
+          <w:szCs w:val="28"/>
+        </w:rPr>
         <w:t xml:space="preserve"> </w:t>
       </w:r>
-      <w:r>
-        <w:rPr>
-          <w:sz w:val="28"/>
-          <w:szCs w:val="28"/>
-        </w:rPr>
-        <w:br/>
-        <w:t xml:space="preserve">оказались близки друг к другу. </w:t>
-      </w:r>
-    </w:p>
-    <w:p>
-      <w:pPr>
-        <w:spacing w:line="360" w:lineRule="auto"/>
-        <w:ind w:firstLine="708"/>
-        <w:jc w:val="both"/>
-        <w:rPr>
-          <w:sz w:val="28"/>
-          <w:szCs w:val="28"/>
-        </w:rPr>
-      </w:pPr>
-      <w:r>
-        <w:rPr>
-          <w:sz w:val="28"/>
-          <w:szCs w:val="28"/>
-        </w:rPr>
-        <w:t>Построенные интервальные оценки параметров при уровнях доверия 0,95 и 0,99 согласуются с точечными оценками.</w:t>
-      </w:r>
-    </w:p>
-    <w:p>
-      <w:pPr>
-        <w:spacing w:line="360" w:lineRule="auto"/>
-        <w:ind w:firstLine="708"/>
-        <w:jc w:val="both"/>
-        <w:rPr>
-          <w:sz w:val="28"/>
-          <w:szCs w:val="28"/>
-        </w:rPr>
-      </w:pPr>
-      <w:r>
-        <w:rPr>
-          <w:sz w:val="28"/>
-          <w:szCs w:val="28"/>
-        </w:rPr>
-        <w:t xml:space="preserve">Проверка гипотезы о виде распределения с помощью критериев Колмогорова и </w:t>
+      <m:oMath>
+        <m:r>
+          <w:rPr>
+            <w:rFonts w:ascii="Cambria Math" w:hAnsi="Cambria Math"/>
+            <w:sz w:val="28"/>
+            <w:szCs w:val="28"/>
+          </w:rPr>
+          <m:t>(γ=0,95 / γ=0,99):</m:t>
+        </m:r>
+      </m:oMath>
+      <w:r>
+        <w:rPr>
+          <w:sz w:val="28"/>
+          <w:szCs w:val="28"/>
+        </w:rPr>
+        <w:t xml:space="preserve"> для </w:t>
+      </w:r>
+      <m:oMath>
+        <m:r>
+          <w:rPr>
+            <w:rFonts w:ascii="Cambria Math" w:hAnsi="Cambria Math"/>
+            <w:sz w:val="28"/>
+            <w:szCs w:val="28"/>
+          </w:rPr>
+          <m:t>α</m:t>
+        </m:r>
+      </m:oMath>
+      <w:r>
+        <w:rPr>
+          <w:sz w:val="28"/>
+          <w:szCs w:val="28"/>
+        </w:rPr>
+        <w:t xml:space="preserve"> — </w:t>
+      </w:r>
+      <m:oMath>
+        <m:r>
+          <w:rPr>
+            <w:rFonts w:ascii="Cambria Math" w:hAnsi="Cambria Math"/>
+            <w:sz w:val="28"/>
+            <w:szCs w:val="28"/>
+          </w:rPr>
+          <m:t xml:space="preserve">[6,87; 7,46] </m:t>
+        </m:r>
+      </m:oMath>
+      <w:r>
+        <w:rPr>
+          <w:sz w:val="28"/>
+          <w:szCs w:val="28"/>
+        </w:rPr>
+        <w:t xml:space="preserve">/ </w:t>
+      </w:r>
+      <m:oMath>
+        <m:r>
+          <w:rPr>
+            <w:rFonts w:ascii="Cambria Math" w:hAnsi="Cambria Math"/>
+            <w:sz w:val="28"/>
+            <w:szCs w:val="28"/>
+          </w:rPr>
+          <m:t>[6,78; 7,55]</m:t>
+        </m:r>
+      </m:oMath>
+      <w:r>
+        <w:rPr>
+          <w:sz w:val="28"/>
+          <w:szCs w:val="28"/>
+        </w:rPr>
+        <w:t xml:space="preserve"> для </w:t>
+      </w:r>
+      <m:oMath>
+        <m:r>
+          <w:rPr>
+            <w:rFonts w:ascii="Cambria Math" w:hAnsi="Cambria Math"/>
+            <w:sz w:val="28"/>
+            <w:szCs w:val="28"/>
+          </w:rPr>
+          <m:t>loc</m:t>
+        </m:r>
+      </m:oMath>
+      <w:r>
+        <w:rPr>
+          <w:sz w:val="28"/>
+          <w:szCs w:val="28"/>
+        </w:rPr>
+        <w:t xml:space="preserve"> — </w:t>
+      </w:r>
+      <m:oMath>
+        <m:r>
+          <w:rPr>
+            <w:rFonts w:ascii="Cambria Math" w:hAnsi="Cambria Math"/>
+            <w:sz w:val="28"/>
+            <w:szCs w:val="28"/>
+          </w:rPr>
+          <m:t>[0,50; 1,01] / [0,42; 1,09]</m:t>
+        </m:r>
+      </m:oMath>
+      <w:r>
+        <w:rPr>
+          <w:sz w:val="28"/>
+          <w:szCs w:val="28"/>
+        </w:rPr>
+        <w:t>. Обе точечные оценки попадают в оба интервала — интервальные и точечные оценки согласуются.</w:t>
+      </w:r>
+    </w:p>
+    <w:p>
+      <w:pPr>
+        <w:spacing w:line="360" w:lineRule="auto"/>
+        <w:rPr>
+          <w:sz w:val="28"/>
+          <w:szCs w:val="28"/>
+        </w:rPr>
+      </w:pPr>
+      <w:r>
+        <w:rPr>
+          <w:b/>
+          <w:bCs/>
+          <w:sz w:val="28"/>
+          <w:szCs w:val="28"/>
+        </w:rPr>
+        <w:t>Согласие с распределением:</w:t>
+      </w:r>
+      <w:r>
+        <w:rPr>
+          <w:sz w:val="28"/>
+          <w:szCs w:val="28"/>
+        </w:rPr>
+        <w:t xml:space="preserve"> критерии Колмогорова (</w:t>
+      </w:r>
+      <m:oMath>
+        <m:r>
+          <w:rPr>
+            <w:rFonts w:ascii="Cambria Math" w:hAnsi="Cambria Math"/>
+            <w:sz w:val="28"/>
+            <w:szCs w:val="28"/>
+          </w:rPr>
+          <m:t>λ=0,594</m:t>
+        </m:r>
+      </m:oMath>
+      <w:r>
+        <w:rPr>
+          <w:sz w:val="28"/>
+          <w:szCs w:val="28"/>
+        </w:rPr>
+        <w:t xml:space="preserve"> при</w:t>
+      </w:r>
+    </w:p>
+    <w:p>
+      <w:pPr>
+        <w:spacing w:line="360" w:lineRule="auto"/>
+        <w:rPr>
+          <w:sz w:val="28"/>
+          <w:szCs w:val="28"/>
+        </w:rPr>
+      </w:pPr>
+      <m:oMath>
+        <m:r>
+          <w:rPr>
+            <w:rFonts w:ascii="Cambria Math" w:hAnsi="Cambria Math"/>
+            <w:sz w:val="28"/>
+            <w:szCs w:val="28"/>
+          </w:rPr>
+          <m:t>λкр=1,36</m:t>
+        </m:r>
+      </m:oMath>
+      <w:r>
+        <w:rPr>
+          <w:sz w:val="28"/>
+          <w:szCs w:val="28"/>
+        </w:rPr>
+        <w:t xml:space="preserve">) и </w:t>
       </w:r>
       <m:oMath>
         <m:r>
@@ -26841,32 +27869,184 @@
           <w:sz w:val="28"/>
           <w:szCs w:val="28"/>
         </w:rPr>
-        <w:t xml:space="preserve"> не дала оснований для её отклонения, что подтверждает принадлежность выборки двойному гамма-распределению с найденными параметрами.</w:t>
-      </w:r>
-    </w:p>
-    <w:p>
-      <w:pPr>
-        <w:spacing w:line="360" w:lineRule="auto"/>
-        <w:ind w:firstLine="708"/>
-        <w:jc w:val="both"/>
-        <w:rPr>
-          <w:sz w:val="28"/>
-          <w:szCs w:val="28"/>
-        </w:rPr>
-      </w:pPr>
-      <w:r>
-        <w:rPr>
-          <w:sz w:val="28"/>
-          <w:szCs w:val="28"/>
-        </w:rPr>
-        <w:t>В</w:t>
-      </w:r>
-      <w:r>
-        <w:rPr>
-          <w:sz w:val="28"/>
-          <w:szCs w:val="28"/>
-        </w:rPr>
-        <w:t>се поставленные в работе задачи были выполнены</w:t>
+        <w:t xml:space="preserve"> гипотезу </w:t>
+      </w:r>
+      <m:oMath>
+        <m:sSub>
+          <m:sSubPr>
+            <m:ctrlPr>
+              <w:rPr>
+                <w:rFonts w:ascii="Cambria Math" w:hAnsi="Cambria Math"/>
+                <w:i/>
+                <w:sz w:val="28"/>
+                <w:szCs w:val="28"/>
+              </w:rPr>
+            </m:ctrlPr>
+          </m:sSubPr>
+          <m:e>
+            <m:r>
+              <w:rPr>
+                <w:rFonts w:ascii="Cambria Math" w:hAnsi="Cambria Math"/>
+                <w:sz w:val="28"/>
+                <w:szCs w:val="28"/>
+              </w:rPr>
+              <m:t>H</m:t>
+            </m:r>
+          </m:e>
+          <m:sub>
+            <m:r>
+              <w:rPr>
+                <w:rFonts w:ascii="Cambria Math" w:hAnsi="Cambria Math"/>
+                <w:sz w:val="28"/>
+                <w:szCs w:val="28"/>
+              </w:rPr>
+              <m:t>0</m:t>
+            </m:r>
+          </m:sub>
+        </m:sSub>
+      </m:oMath>
+      <w:r>
+        <w:rPr>
+          <w:sz w:val="28"/>
+          <w:szCs w:val="28"/>
+        </w:rPr>
+        <w:t xml:space="preserve"> не отвергли</w:t>
+      </w:r>
+      <w:r>
+        <w:rPr>
+          <w:sz w:val="28"/>
+          <w:szCs w:val="28"/>
+        </w:rPr>
+        <w:t>. В</w:t>
+      </w:r>
+      <w:r>
+        <w:rPr>
+          <w:sz w:val="28"/>
+          <w:szCs w:val="28"/>
+        </w:rPr>
+        <w:t>ыборка согласуется с двойным гамма-распределением с параметрами ММП.</w:t>
+      </w:r>
+    </w:p>
+    <w:p>
+      <w:pPr>
+        <w:spacing w:line="360" w:lineRule="auto"/>
+        <w:rPr>
+          <w:sz w:val="28"/>
+          <w:szCs w:val="28"/>
+        </w:rPr>
+      </w:pPr>
+      <w:r>
+        <w:rPr>
+          <w:b/>
+          <w:bCs/>
+          <w:sz w:val="28"/>
+          <w:szCs w:val="28"/>
+        </w:rPr>
+        <w:t>Однородность:</w:t>
+      </w:r>
+      <w:r>
+        <w:rPr>
+          <w:sz w:val="28"/>
+          <w:szCs w:val="28"/>
+        </w:rPr>
+        <w:t xml:space="preserve"> критерий Колмогорова-Смирнова против нормального распределения с теми же средним и дисперсией показал мощность 1,0</w:t>
+      </w:r>
+      <w:r>
+        <w:rPr>
+          <w:sz w:val="28"/>
+          <w:szCs w:val="28"/>
+        </w:rPr>
+        <w:t>.   Р</w:t>
+      </w:r>
+      <w:r>
+        <w:rPr>
+          <w:sz w:val="28"/>
+          <w:szCs w:val="28"/>
+        </w:rPr>
+        <w:t>аспределения надёжно различимы по форме, несмотря на совпадение первых двух моментов.</w:t>
+      </w:r>
+    </w:p>
+    <w:p>
+      <w:pPr>
+        <w:spacing w:line="360" w:lineRule="auto"/>
+        <w:rPr>
+          <w:sz w:val="28"/>
+          <w:szCs w:val="28"/>
+        </w:rPr>
+      </w:pPr>
+      <w:r>
+        <w:rPr>
+          <w:b/>
+          <w:bCs/>
+          <w:sz w:val="28"/>
+          <w:szCs w:val="28"/>
+        </w:rPr>
+        <w:t>Ошибки I/II рода</w:t>
+      </w:r>
+      <w:r>
+        <w:rPr>
+          <w:sz w:val="28"/>
+          <w:szCs w:val="28"/>
+        </w:rPr>
+        <w:t xml:space="preserve">: </w:t>
+      </w:r>
+      <w:r>
+        <w:rPr>
+          <w:sz w:val="28"/>
+          <w:szCs w:val="28"/>
+        </w:rPr>
+        <w:t xml:space="preserve">ошибка I рода </w:t>
+      </w:r>
+      <m:oMath>
+        <m:r>
+          <w:rPr>
+            <w:rFonts w:ascii="Cambria Math" w:hAnsi="Cambria Math"/>
+            <w:sz w:val="28"/>
+            <w:szCs w:val="28"/>
+          </w:rPr>
+          <m:t>0,04–0,07</m:t>
+        </m:r>
+      </m:oMath>
+      <w:r>
+        <w:rPr>
+          <w:sz w:val="28"/>
+          <w:szCs w:val="28"/>
+        </w:rPr>
+        <w:t xml:space="preserve"> (соответствует заданному уровню значимости </w:t>
+      </w:r>
+      <m:oMath>
+        <m:r>
+          <w:rPr>
+            <w:rFonts w:ascii="Cambria Math" w:hAnsi="Cambria Math"/>
+            <w:sz w:val="28"/>
+            <w:szCs w:val="28"/>
+          </w:rPr>
+          <m:t>0,05</m:t>
+        </m:r>
+      </m:oMath>
+      <w:r>
+        <w:rPr>
+          <w:sz w:val="28"/>
+          <w:szCs w:val="28"/>
+        </w:rPr>
+        <w:t xml:space="preserve">), ошибка II рода высокая, </w:t>
+      </w:r>
+      <m:oMath>
+        <m:r>
+          <w:rPr>
+            <w:rFonts w:ascii="Cambria Math" w:hAnsi="Cambria Math"/>
+            <w:sz w:val="28"/>
+            <w:szCs w:val="28"/>
+          </w:rPr>
+          <m:t>0,80–0,86</m:t>
+        </m:r>
+      </m:oMath>
+      <w:r>
+        <w:rPr>
+          <w:sz w:val="28"/>
+          <w:szCs w:val="28"/>
+        </w:rPr>
+        <w:t xml:space="preserve"> из-за малого различия самих оценок</w:t>
       </w:r>
       <w:r>
         <w:rPr>
@@ -26918,7 +28098,6 @@
     <w:p>
       <w:pPr>
         <w:spacing w:line="360" w:lineRule="auto"/>
-        <w:jc w:val="center"/>
         <w:rPr>
           <w:b/>
           <w:bCs/>
@@ -26930,67 +28109,6 @@
     <w:p>
       <w:pPr>
         <w:spacing w:line="360" w:lineRule="auto"/>
-        <w:jc w:val="center"/>
-        <w:rPr>
-          <w:b/>
-          <w:bCs/>
-          <w:sz w:val="32"/>
-          <w:szCs w:val="32"/>
-        </w:rPr>
-      </w:pPr>
-    </w:p>
-    <w:p>
-      <w:pPr>
-        <w:spacing w:line="360" w:lineRule="auto"/>
-        <w:jc w:val="center"/>
-        <w:rPr>
-          <w:b/>
-          <w:bCs/>
-          <w:sz w:val="32"/>
-          <w:szCs w:val="32"/>
-        </w:rPr>
-      </w:pPr>
-    </w:p>
-    <w:p>
-      <w:pPr>
-        <w:spacing w:line="360" w:lineRule="auto"/>
-        <w:jc w:val="center"/>
-        <w:rPr>
-          <w:b/>
-          <w:bCs/>
-          <w:sz w:val="32"/>
-          <w:szCs w:val="32"/>
-        </w:rPr>
-      </w:pPr>
-    </w:p>
-    <w:p>
-      <w:pPr>
-        <w:spacing w:line="360" w:lineRule="auto"/>
-        <w:jc w:val="center"/>
-        <w:rPr>
-          <w:b/>
-          <w:bCs/>
-          <w:sz w:val="32"/>
-          <w:szCs w:val="32"/>
-        </w:rPr>
-      </w:pPr>
-    </w:p>
-    <w:p>
-      <w:pPr>
-        <w:spacing w:line="360" w:lineRule="auto"/>
-        <w:jc w:val="center"/>
-        <w:rPr>
-          <w:b/>
-          <w:bCs/>
-          <w:sz w:val="32"/>
-          <w:szCs w:val="32"/>
-        </w:rPr>
-      </w:pPr>
-    </w:p>
-    <w:p>
-      <w:pPr>
-        <w:spacing w:line="360" w:lineRule="auto"/>
-        <w:jc w:val="center"/>
         <w:rPr>
           <w:b/>
           <w:bCs/>
@@ -27152,24 +28270,10 @@
           <w:szCs w:val="28"/>
           <w:lang w:val="en-US"/>
         </w:rPr>
-        <w:t>[2] Bain L. J., Engelhardt M. Introduction to Probability and Mathematical Statistics. — 2nd ed. — Belmont : Brooks/Cole, 1992. — 644 p.</w:t>
-      </w:r>
-    </w:p>
-    <w:p>
-      <w:pPr>
-        <w:spacing w:line="360" w:lineRule="auto"/>
-        <w:jc w:val="both"/>
-        <w:rPr>
-          <w:sz w:val="28"/>
-          <w:szCs w:val="28"/>
-          <w:lang w:val="en-US"/>
-        </w:rPr>
-      </w:pPr>
-    </w:p>
-    <w:p>
-      <w:pPr>
-        <w:spacing w:line="360" w:lineRule="auto"/>
-        <w:jc w:val="both"/>
+        <w:t xml:space="preserve">[2] Bain L. J., Engelhardt M. Introduction to Probability and Mathematical Statistics. — 2nd ed. — </w:t>
+      </w:r>
+      <w:proofErr w:type="gramStart"/>
+      <w:r>
         <w:rPr>
           <w:b/>
           <w:bCs/>
@@ -27177,7 +28281,9 @@
           <w:szCs w:val="28"/>
           <w:lang w:val="en-US"/>
         </w:rPr>
-      </w:pPr>
+        <w:t>Belmont :</w:t>
+      </w:r>
+      <w:proofErr w:type="gramEnd"/>
       <w:r>
         <w:rPr>
           <w:b/>
@@ -27186,7 +28292,7 @@
           <w:szCs w:val="28"/>
           <w:lang w:val="en-US"/>
         </w:rPr>
-        <w:t xml:space="preserve">[3] Bahashwan A. O., Kalantan Z. I., Adham S. A. Double Gamma Principal Components Analysis // Applied Mathematical Sciences. — 2018. — Vol. 12, № 11. — P. 523–533. </w:t>
+        <w:t xml:space="preserve"> Brooks/Cole, 1992. — 644 p.</w:t>
       </w:r>
     </w:p>
     <w:p>
@@ -27204,15 +28310,195 @@
       <w:pPr>
         <w:spacing w:line="360" w:lineRule="auto"/>
         <w:jc w:val="both"/>
-      </w:pPr>
-      <w:r>
         <w:rPr>
           <w:b/>
           <w:bCs/>
           <w:sz w:val="28"/>
           <w:szCs w:val="28"/>
-        </w:rPr>
-        <w:t>[4] Положинцев Б. И. Теория вероятностей и математическая статистика. Введение в математическую статистику: учебное пособие /  Б. И. Положинцев. – Санкт-Петербург: СПбПУ, 2016.</w:t>
+          <w:lang w:val="en-US"/>
+        </w:rPr>
+      </w:pPr>
+      <w:r>
+        <w:rPr>
+          <w:b/>
+          <w:bCs/>
+          <w:sz w:val="28"/>
+          <w:szCs w:val="28"/>
+          <w:lang w:val="en-US"/>
+        </w:rPr>
+        <w:t xml:space="preserve">[3] </w:t>
+      </w:r>
+      <w:proofErr w:type="spellStart"/>
+      <w:r>
+        <w:rPr>
+          <w:b/>
+          <w:bCs/>
+          <w:sz w:val="28"/>
+          <w:szCs w:val="28"/>
+          <w:lang w:val="en-US"/>
+        </w:rPr>
+        <w:t>Bahashwan</w:t>
+      </w:r>
+      <w:proofErr w:type="spellEnd"/>
+      <w:r>
+        <w:rPr>
+          <w:b/>
+          <w:bCs/>
+          <w:sz w:val="28"/>
+          <w:szCs w:val="28"/>
+          <w:lang w:val="en-US"/>
+        </w:rPr>
+        <w:t xml:space="preserve"> A. O., </w:t>
+      </w:r>
+      <w:proofErr w:type="spellStart"/>
+      <w:r>
+        <w:rPr>
+          <w:b/>
+          <w:bCs/>
+          <w:sz w:val="28"/>
+          <w:szCs w:val="28"/>
+          <w:lang w:val="en-US"/>
+        </w:rPr>
+        <w:t>Kalantan</w:t>
+      </w:r>
+      <w:proofErr w:type="spellEnd"/>
+      <w:r>
+        <w:rPr>
+          <w:b/>
+          <w:bCs/>
+          <w:sz w:val="28"/>
+          <w:szCs w:val="28"/>
+          <w:lang w:val="en-US"/>
+        </w:rPr>
+        <w:t xml:space="preserve"> Z. I., </w:t>
+      </w:r>
+      <w:proofErr w:type="spellStart"/>
+      <w:r>
+        <w:rPr>
+          <w:b/>
+          <w:bCs/>
+          <w:sz w:val="28"/>
+          <w:szCs w:val="28"/>
+          <w:lang w:val="en-US"/>
+        </w:rPr>
+        <w:t>Adham</w:t>
+      </w:r>
+      <w:proofErr w:type="spellEnd"/>
+      <w:r>
+        <w:rPr>
+          <w:b/>
+          <w:bCs/>
+          <w:sz w:val="28"/>
+          <w:szCs w:val="28"/>
+          <w:lang w:val="en-US"/>
+        </w:rPr>
+        <w:t xml:space="preserve"> S. A. Double Gamma Principal Components Analysis // Applied Mathematical Sciences. — 2018. — Vol. 12, № 11. — P. 523–533. </w:t>
+      </w:r>
+    </w:p>
+    <w:p>
+      <w:pPr>
+        <w:spacing w:line="360" w:lineRule="auto"/>
+        <w:jc w:val="both"/>
+        <w:rPr>
+          <w:sz w:val="28"/>
+          <w:szCs w:val="28"/>
+          <w:lang w:val="en-US"/>
+        </w:rPr>
+      </w:pPr>
+    </w:p>
+    <w:p>
+      <w:pPr>
+        <w:spacing w:line="360" w:lineRule="auto"/>
+        <w:jc w:val="both"/>
+      </w:pPr>
+      <w:r>
+        <w:rPr>
+          <w:b/>
+          <w:bCs/>
+          <w:sz w:val="28"/>
+          <w:szCs w:val="28"/>
+        </w:rPr>
+        <w:t xml:space="preserve">[4] </w:t>
+      </w:r>
+      <w:proofErr w:type="spellStart"/>
+      <w:r>
+        <w:rPr>
+          <w:b/>
+          <w:bCs/>
+          <w:sz w:val="28"/>
+          <w:szCs w:val="28"/>
+        </w:rPr>
+        <w:t>Положинцев</w:t>
+      </w:r>
+      <w:proofErr w:type="spellEnd"/>
+      <w:r>
+        <w:rPr>
+          <w:b/>
+          <w:bCs/>
+          <w:sz w:val="28"/>
+          <w:szCs w:val="28"/>
+        </w:rPr>
+        <w:t xml:space="preserve"> Б. И. Теория вероятностей и математическая статистика. Введение в математическую статистику: учебное пособие </w:t>
+      </w:r>
+      <w:proofErr w:type="gramStart"/>
+      <w:r>
+        <w:rPr>
+          <w:b/>
+          <w:bCs/>
+          <w:sz w:val="28"/>
+          <w:szCs w:val="28"/>
+        </w:rPr>
+        <w:t>/  Б.</w:t>
+      </w:r>
+      <w:proofErr w:type="gramEnd"/>
+      <w:r>
+        <w:rPr>
+          <w:b/>
+          <w:bCs/>
+          <w:sz w:val="28"/>
+          <w:szCs w:val="28"/>
+        </w:rPr>
+        <w:t xml:space="preserve"> И. </w:t>
+      </w:r>
+      <w:proofErr w:type="spellStart"/>
+      <w:r>
+        <w:rPr>
+          <w:b/>
+          <w:bCs/>
+          <w:sz w:val="28"/>
+          <w:szCs w:val="28"/>
+        </w:rPr>
+        <w:t>Положинцев</w:t>
+      </w:r>
+      <w:proofErr w:type="spellEnd"/>
+      <w:r>
+        <w:rPr>
+          <w:b/>
+          <w:bCs/>
+          <w:sz w:val="28"/>
+          <w:szCs w:val="28"/>
+        </w:rPr>
+        <w:t xml:space="preserve">. – Санкт-Петербург: </w:t>
+      </w:r>
+      <w:proofErr w:type="spellStart"/>
+      <w:r>
+        <w:rPr>
+          <w:b/>
+          <w:bCs/>
+          <w:sz w:val="28"/>
+          <w:szCs w:val="28"/>
+        </w:rPr>
+        <w:t>СПбПУ</w:t>
+      </w:r>
+      <w:proofErr w:type="spellEnd"/>
+      <w:r>
+        <w:rPr>
+          <w:b/>
+          <w:bCs/>
+          <w:sz w:val="28"/>
+          <w:szCs w:val="28"/>
+        </w:rPr>
+        <w:t>, 2016.</w:t>
       </w:r>
       <w:r>
         <w:rPr>
@@ -27332,7 +28618,117 @@
           <w:szCs w:val="28"/>
           <w:lang w:val="en-US"/>
         </w:rPr>
-        <w:t>[6] Scherrer A., Larrieu N., Borgnat P., Owezarski P., Abry P. Non-Gaussian and Long Memory Statistical Characterisations for Internet Traffic with Anomalies // IEEE Transactions on Dependable and Secure Computing. — 2007. — Vol. 4, № 1. — P. 56–70.</w:t>
+        <w:t xml:space="preserve">[6] Scherrer A., </w:t>
+      </w:r>
+      <w:proofErr w:type="spellStart"/>
+      <w:r>
+        <w:rPr>
+          <w:b/>
+          <w:bCs/>
+          <w:sz w:val="28"/>
+          <w:szCs w:val="28"/>
+          <w:lang w:val="en-US"/>
+        </w:rPr>
+        <w:t>Larrieu</w:t>
+      </w:r>
+      <w:proofErr w:type="spellEnd"/>
+      <w:r>
+        <w:rPr>
+          <w:b/>
+          <w:bCs/>
+          <w:sz w:val="28"/>
+          <w:szCs w:val="28"/>
+          <w:lang w:val="en-US"/>
+        </w:rPr>
+        <w:t xml:space="preserve"> N., </w:t>
+      </w:r>
+      <w:proofErr w:type="spellStart"/>
+      <w:r>
+        <w:rPr>
+          <w:b/>
+          <w:bCs/>
+          <w:sz w:val="28"/>
+          <w:szCs w:val="28"/>
+          <w:lang w:val="en-US"/>
+        </w:rPr>
+        <w:t>Borgnat</w:t>
+      </w:r>
+      <w:proofErr w:type="spellEnd"/>
+      <w:r>
+        <w:rPr>
+          <w:b/>
+          <w:bCs/>
+          <w:sz w:val="28"/>
+          <w:szCs w:val="28"/>
+          <w:lang w:val="en-US"/>
+        </w:rPr>
+        <w:t xml:space="preserve"> P., </w:t>
+      </w:r>
+      <w:proofErr w:type="spellStart"/>
+      <w:r>
+        <w:rPr>
+          <w:b/>
+          <w:bCs/>
+          <w:sz w:val="28"/>
+          <w:szCs w:val="28"/>
+          <w:lang w:val="en-US"/>
+        </w:rPr>
+        <w:t>Owezarski</w:t>
+      </w:r>
+      <w:proofErr w:type="spellEnd"/>
+      <w:r>
+        <w:rPr>
+          <w:b/>
+          <w:bCs/>
+          <w:sz w:val="28"/>
+          <w:szCs w:val="28"/>
+          <w:lang w:val="en-US"/>
+        </w:rPr>
+        <w:t xml:space="preserve"> P., </w:t>
+      </w:r>
+      <w:proofErr w:type="spellStart"/>
+      <w:r>
+        <w:rPr>
+          <w:b/>
+          <w:bCs/>
+          <w:sz w:val="28"/>
+          <w:szCs w:val="28"/>
+          <w:lang w:val="en-US"/>
+        </w:rPr>
+        <w:t>Abry</w:t>
+      </w:r>
+      <w:proofErr w:type="spellEnd"/>
+      <w:r>
+        <w:rPr>
+          <w:b/>
+          <w:bCs/>
+          <w:sz w:val="28"/>
+          <w:szCs w:val="28"/>
+          <w:lang w:val="en-US"/>
+        </w:rPr>
+        <w:t xml:space="preserve"> P. Non-Gaussian and Long Memory Statistical </w:t>
+      </w:r>
+      <w:proofErr w:type="spellStart"/>
+      <w:r>
+        <w:rPr>
+          <w:b/>
+          <w:bCs/>
+          <w:sz w:val="28"/>
+          <w:szCs w:val="28"/>
+          <w:lang w:val="en-US"/>
+        </w:rPr>
+        <w:t>Characterisations</w:t>
+      </w:r>
+      <w:proofErr w:type="spellEnd"/>
+      <w:r>
+        <w:rPr>
+          <w:b/>
+          <w:bCs/>
+          <w:sz w:val="28"/>
+          <w:szCs w:val="28"/>
+          <w:lang w:val="en-US"/>
+        </w:rPr>
+        <w:t xml:space="preserve"> for Internet Traffic with Anomalies // IEEE Transactions on Dependable and Secure Computing. — 2007. — Vol. 4, № 1. — P. 56–70.</w:t>
       </w:r>
     </w:p>
     <w:sectPr>

</xml_diff>

<commit_message>
vault backup: 2026-10-01 17:25:53
</commit_message>
<xml_diff>
--- a/Учеба 4 семестр/Теория вероятности/Курсовая работа/Отчет, Код/Курсовая_работа.docx
+++ b/Учеба 4 семестр/Теория вероятности/Курсовая работа/Отчет, Код/Курсовая_работа.docx
@@ -23508,15 +23508,7 @@
           <w:sz w:val="28"/>
           <w:szCs w:val="28"/>
         </w:rPr>
-        <w:t>} для каждого параметра</w:t>
-      </w:r>
-      <w:r>
-        <w:rPr>
-          <w:rFonts w:eastAsia="Arial"/>
-          <w:sz w:val="28"/>
-          <w:szCs w:val="28"/>
-        </w:rPr>
-        <w:t xml:space="preserve">, то есть </w:t>
+        <w:t xml:space="preserve">} для каждого параметра. Первый случай: </w:t>
       </w:r>
       <m:oMath>
         <m:sSub>
@@ -23557,7 +23549,47 @@
             <w:sz w:val="28"/>
             <w:szCs w:val="28"/>
           </w:rPr>
-          <m:t>:{a=</m:t>
+          <m:t>:{</m:t>
+        </m:r>
+        <m:sSub>
+          <m:sSubPr>
+            <m:ctrlPr>
+              <w:rPr>
+                <w:rFonts w:ascii="Cambria Math" w:eastAsia="Arial" w:hAnsi="Cambria Math"/>
+                <w:i/>
+                <w:sz w:val="28"/>
+                <w:szCs w:val="28"/>
+              </w:rPr>
+            </m:ctrlPr>
+          </m:sSubPr>
+          <m:e>
+            <m:r>
+              <w:rPr>
+                <w:rFonts w:ascii="Cambria Math" w:eastAsia="Arial" w:hAnsi="Cambria Math"/>
+                <w:sz w:val="28"/>
+                <w:szCs w:val="28"/>
+              </w:rPr>
+              <m:t>a</m:t>
+            </m:r>
+          </m:e>
+          <m:sub>
+            <m:r>
+              <w:rPr>
+                <w:rFonts w:ascii="Cambria Math" w:eastAsia="Arial" w:hAnsi="Cambria Math"/>
+                <w:sz w:val="28"/>
+                <w:szCs w:val="28"/>
+              </w:rPr>
+              <m:t>0</m:t>
+            </m:r>
+          </m:sub>
+        </m:sSub>
+        <m:r>
+          <w:rPr>
+            <w:rFonts w:ascii="Cambria Math" w:eastAsia="Arial" w:hAnsi="Cambria Math"/>
+            <w:sz w:val="28"/>
+            <w:szCs w:val="28"/>
+          </w:rPr>
+          <m:t>=</m:t>
         </m:r>
         <m:acc>
           <m:accPr>
@@ -23629,25 +23661,7 @@
           <w:sz w:val="28"/>
           <w:szCs w:val="28"/>
         </w:rPr>
-        <w:t>,</w:t>
-      </w:r>
-    </w:p>
-    <w:p>
-      <w:pPr>
-        <w:spacing w:line="360" w:lineRule="auto"/>
-        <w:rPr>
-          <w:rFonts w:eastAsia="Arial"/>
-          <w:sz w:val="28"/>
-          <w:szCs w:val="28"/>
-        </w:rPr>
-      </w:pPr>
-      <w:r>
-        <w:rPr>
-          <w:rFonts w:eastAsia="Arial"/>
-          <w:sz w:val="28"/>
-          <w:szCs w:val="28"/>
-        </w:rPr>
-        <w:t xml:space="preserve"> </w:t>
+        <w:t xml:space="preserve">, </w:t>
       </w:r>
       <m:oMath>
         <m:sSub>
@@ -23688,7 +23702,47 @@
             <w:sz w:val="28"/>
             <w:szCs w:val="28"/>
           </w:rPr>
-          <m:t>:{a=</m:t>
+          <m:t>:{</m:t>
+        </m:r>
+        <m:sSub>
+          <m:sSubPr>
+            <m:ctrlPr>
+              <w:rPr>
+                <w:rFonts w:ascii="Cambria Math" w:eastAsia="Arial" w:hAnsi="Cambria Math"/>
+                <w:i/>
+                <w:sz w:val="28"/>
+                <w:szCs w:val="28"/>
+              </w:rPr>
+            </m:ctrlPr>
+          </m:sSubPr>
+          <m:e>
+            <m:r>
+              <w:rPr>
+                <w:rFonts w:ascii="Cambria Math" w:eastAsia="Arial" w:hAnsi="Cambria Math"/>
+                <w:sz w:val="28"/>
+                <w:szCs w:val="28"/>
+              </w:rPr>
+              <m:t>a</m:t>
+            </m:r>
+          </m:e>
+          <m:sub>
+            <m:r>
+              <w:rPr>
+                <w:rFonts w:ascii="Cambria Math" w:eastAsia="Arial" w:hAnsi="Cambria Math"/>
+                <w:sz w:val="28"/>
+                <w:szCs w:val="28"/>
+              </w:rPr>
+              <m:t>1</m:t>
+            </m:r>
+          </m:sub>
+        </m:sSub>
+        <m:r>
+          <w:rPr>
+            <w:rFonts w:ascii="Cambria Math" w:eastAsia="Arial" w:hAnsi="Cambria Math"/>
+            <w:sz w:val="28"/>
+            <w:szCs w:val="28"/>
+          </w:rPr>
+          <m:t>=</m:t>
         </m:r>
         <m:sSub>
           <m:sSubPr>
@@ -23751,15 +23805,320 @@
           <w:sz w:val="28"/>
           <w:szCs w:val="28"/>
         </w:rPr>
-        <w:t xml:space="preserve">. </w:t>
-      </w:r>
+        <w:t xml:space="preserve">. Второй случай: </w:t>
+      </w:r>
+      <m:oMath>
+        <m:sSub>
+          <m:sSubPr>
+            <m:ctrlPr>
+              <w:rPr>
+                <w:rFonts w:ascii="Cambria Math" w:eastAsia="Arial" w:hAnsi="Cambria Math"/>
+                <w:i/>
+                <w:sz w:val="28"/>
+                <w:szCs w:val="28"/>
+              </w:rPr>
+            </m:ctrlPr>
+          </m:sSubPr>
+          <m:e>
+            <m:r>
+              <w:rPr>
+                <w:rFonts w:ascii="Cambria Math" w:eastAsia="Arial" w:hAnsi="Cambria Math"/>
+                <w:sz w:val="28"/>
+                <w:szCs w:val="28"/>
+              </w:rPr>
+              <m:t>H</m:t>
+            </m:r>
+          </m:e>
+          <m:sub>
+            <m:r>
+              <w:rPr>
+                <w:rFonts w:ascii="Cambria Math" w:eastAsia="Arial" w:hAnsi="Cambria Math"/>
+                <w:sz w:val="28"/>
+                <w:szCs w:val="28"/>
+              </w:rPr>
+              <m:t>0</m:t>
+            </m:r>
+          </m:sub>
+        </m:sSub>
+        <m:r>
+          <w:rPr>
+            <w:rFonts w:ascii="Cambria Math" w:eastAsia="Arial" w:hAnsi="Cambria Math"/>
+            <w:sz w:val="28"/>
+            <w:szCs w:val="28"/>
+          </w:rPr>
+          <m:t>:{</m:t>
+        </m:r>
+        <m:sSub>
+          <m:sSubPr>
+            <m:ctrlPr>
+              <w:rPr>
+                <w:rFonts w:ascii="Cambria Math" w:eastAsia="Arial" w:hAnsi="Cambria Math"/>
+                <w:i/>
+                <w:sz w:val="28"/>
+                <w:szCs w:val="28"/>
+              </w:rPr>
+            </m:ctrlPr>
+          </m:sSubPr>
+          <m:e>
+            <m:r>
+              <w:rPr>
+                <w:rFonts w:ascii="Cambria Math" w:eastAsia="Arial" w:hAnsi="Cambria Math"/>
+                <w:sz w:val="28"/>
+                <w:szCs w:val="28"/>
+              </w:rPr>
+              <m:t>a</m:t>
+            </m:r>
+          </m:e>
+          <m:sub>
+            <m:r>
+              <w:rPr>
+                <w:rFonts w:ascii="Cambria Math" w:eastAsia="Arial" w:hAnsi="Cambria Math"/>
+                <w:sz w:val="28"/>
+                <w:szCs w:val="28"/>
+              </w:rPr>
+              <m:t>0</m:t>
+            </m:r>
+          </m:sub>
+        </m:sSub>
+        <m:r>
+          <w:rPr>
+            <w:rFonts w:ascii="Cambria Math" w:eastAsia="Arial" w:hAnsi="Cambria Math"/>
+            <w:sz w:val="28"/>
+            <w:szCs w:val="28"/>
+          </w:rPr>
+          <m:t>=</m:t>
+        </m:r>
+        <m:sSub>
+          <m:sSubPr>
+            <m:ctrlPr>
+              <w:rPr>
+                <w:rFonts w:ascii="Cambria Math" w:eastAsia="Arial" w:hAnsi="Cambria Math"/>
+                <w:i/>
+                <w:sz w:val="28"/>
+                <w:szCs w:val="28"/>
+              </w:rPr>
+            </m:ctrlPr>
+          </m:sSubPr>
+          <m:e>
+            <m:acc>
+              <m:accPr>
+                <m:ctrlPr>
+                  <w:rPr>
+                    <w:rFonts w:ascii="Cambria Math" w:eastAsia="Arial" w:hAnsi="Cambria Math"/>
+                    <w:i/>
+                    <w:sz w:val="28"/>
+                    <w:szCs w:val="28"/>
+                  </w:rPr>
+                </m:ctrlPr>
+              </m:accPr>
+              <m:e>
+                <m:r>
+                  <w:rPr>
+                    <w:rFonts w:ascii="Cambria Math" w:eastAsia="Arial" w:hAnsi="Cambria Math"/>
+                    <w:sz w:val="28"/>
+                    <w:szCs w:val="28"/>
+                  </w:rPr>
+                  <m:t>a</m:t>
+                </m:r>
+              </m:e>
+            </m:acc>
+          </m:e>
+          <m:sub>
+            <m:r>
+              <w:rPr>
+                <w:rFonts w:ascii="Cambria Math" w:eastAsia="Arial" w:hAnsi="Cambria Math"/>
+                <w:sz w:val="28"/>
+                <w:szCs w:val="28"/>
+              </w:rPr>
+              <m:t>ММП</m:t>
+            </m:r>
+          </m:sub>
+        </m:sSub>
+        <m:r>
+          <w:rPr>
+            <w:rFonts w:ascii="Cambria Math" w:eastAsia="Arial" w:hAnsi="Cambria Math"/>
+            <w:sz w:val="28"/>
+            <w:szCs w:val="28"/>
+          </w:rPr>
+          <m:t>}</m:t>
+        </m:r>
+      </m:oMath>
       <w:r>
         <w:rPr>
           <w:rFonts w:eastAsia="Arial"/>
           <w:sz w:val="28"/>
           <w:szCs w:val="28"/>
         </w:rPr>
-        <w:t>Уровень значимости</w:t>
+        <w:t xml:space="preserve">, </w:t>
+      </w:r>
+      <m:oMath>
+        <m:sSub>
+          <m:sSubPr>
+            <m:ctrlPr>
+              <w:rPr>
+                <w:rFonts w:ascii="Cambria Math" w:eastAsia="Arial" w:hAnsi="Cambria Math"/>
+                <w:i/>
+                <w:sz w:val="28"/>
+                <w:szCs w:val="28"/>
+              </w:rPr>
+            </m:ctrlPr>
+          </m:sSubPr>
+          <m:e>
+            <m:r>
+              <w:rPr>
+                <w:rFonts w:ascii="Cambria Math" w:eastAsia="Arial" w:hAnsi="Cambria Math"/>
+                <w:sz w:val="28"/>
+                <w:szCs w:val="28"/>
+              </w:rPr>
+              <m:t>H</m:t>
+            </m:r>
+          </m:e>
+          <m:sub>
+            <m:r>
+              <w:rPr>
+                <w:rFonts w:ascii="Cambria Math" w:eastAsia="Arial" w:hAnsi="Cambria Math"/>
+                <w:sz w:val="28"/>
+                <w:szCs w:val="28"/>
+              </w:rPr>
+              <m:t>1</m:t>
+            </m:r>
+          </m:sub>
+        </m:sSub>
+        <m:r>
+          <w:rPr>
+            <w:rFonts w:ascii="Cambria Math" w:eastAsia="Arial" w:hAnsi="Cambria Math"/>
+            <w:sz w:val="28"/>
+            <w:szCs w:val="28"/>
+          </w:rPr>
+          <m:t>:{</m:t>
+        </m:r>
+        <m:sSub>
+          <m:sSubPr>
+            <m:ctrlPr>
+              <w:rPr>
+                <w:rFonts w:ascii="Cambria Math" w:eastAsia="Arial" w:hAnsi="Cambria Math"/>
+                <w:i/>
+                <w:sz w:val="28"/>
+                <w:szCs w:val="28"/>
+              </w:rPr>
+            </m:ctrlPr>
+          </m:sSubPr>
+          <m:e>
+            <m:r>
+              <w:rPr>
+                <w:rFonts w:ascii="Cambria Math" w:eastAsia="Arial" w:hAnsi="Cambria Math"/>
+                <w:sz w:val="28"/>
+                <w:szCs w:val="28"/>
+              </w:rPr>
+              <m:t>a</m:t>
+            </m:r>
+          </m:e>
+          <m:sub>
+            <m:r>
+              <w:rPr>
+                <w:rFonts w:ascii="Cambria Math" w:eastAsia="Arial" w:hAnsi="Cambria Math"/>
+                <w:sz w:val="28"/>
+                <w:szCs w:val="28"/>
+              </w:rPr>
+              <m:t>1</m:t>
+            </m:r>
+          </m:sub>
+        </m:sSub>
+        <m:r>
+          <w:rPr>
+            <w:rFonts w:ascii="Cambria Math" w:eastAsia="Arial" w:hAnsi="Cambria Math"/>
+            <w:sz w:val="28"/>
+            <w:szCs w:val="28"/>
+          </w:rPr>
+          <m:t>=</m:t>
+        </m:r>
+        <m:acc>
+          <m:accPr>
+            <m:ctrlPr>
+              <w:rPr>
+                <w:rFonts w:ascii="Cambria Math" w:eastAsia="Arial" w:hAnsi="Cambria Math"/>
+                <w:i/>
+                <w:sz w:val="28"/>
+                <w:szCs w:val="28"/>
+              </w:rPr>
+            </m:ctrlPr>
+          </m:accPr>
+          <m:e>
+            <m:sSub>
+              <m:sSubPr>
+                <m:ctrlPr>
+                  <w:rPr>
+                    <w:rFonts w:ascii="Cambria Math" w:eastAsia="Arial" w:hAnsi="Cambria Math"/>
+                    <w:i/>
+                    <w:sz w:val="28"/>
+                    <w:szCs w:val="28"/>
+                  </w:rPr>
+                </m:ctrlPr>
+              </m:sSubPr>
+              <m:e>
+                <m:r>
+                  <w:rPr>
+                    <w:rFonts w:ascii="Cambria Math" w:eastAsia="Arial" w:hAnsi="Cambria Math"/>
+                    <w:sz w:val="28"/>
+                    <w:szCs w:val="28"/>
+                  </w:rPr>
+                  <m:t>a</m:t>
+                </m:r>
+              </m:e>
+              <m:sub>
+                <m:r>
+                  <w:rPr>
+                    <w:rFonts w:ascii="Cambria Math" w:eastAsia="Arial" w:hAnsi="Cambria Math"/>
+                    <w:sz w:val="28"/>
+                    <w:szCs w:val="28"/>
+                  </w:rPr>
+                  <m:t>M</m:t>
+                </m:r>
+                <m:r>
+                  <w:rPr>
+                    <w:rFonts w:ascii="Cambria Math" w:eastAsia="Arial" w:hAnsi="Cambria Math"/>
+                    <w:sz w:val="28"/>
+                    <w:szCs w:val="28"/>
+                    <w:lang w:val="en-US"/>
+                  </w:rPr>
+                  <m:t>M</m:t>
+                </m:r>
+              </m:sub>
+            </m:sSub>
+          </m:e>
+        </m:acc>
+        <m:r>
+          <w:rPr>
+            <w:rFonts w:ascii="Cambria Math" w:eastAsia="Arial" w:hAnsi="Cambria Math"/>
+            <w:sz w:val="28"/>
+            <w:szCs w:val="28"/>
+          </w:rPr>
+          <m:t>}</m:t>
+        </m:r>
+      </m:oMath>
+      <w:r>
+        <w:rPr>
+          <w:rFonts w:eastAsia="Arial"/>
+          <w:sz w:val="28"/>
+          <w:szCs w:val="28"/>
+        </w:rPr>
+        <w:t xml:space="preserve">  . Уровень знач</w:t>
+      </w:r>
+      <w:r>
+        <w:rPr>
+          <w:rFonts w:eastAsia="Arial"/>
+          <w:sz w:val="28"/>
+          <w:szCs w:val="28"/>
+        </w:rPr>
+        <w:t>и</w:t>
+      </w:r>
+      <w:r>
+        <w:rPr>
+          <w:rFonts w:eastAsia="Arial"/>
+          <w:sz w:val="28"/>
+          <w:szCs w:val="28"/>
+        </w:rPr>
+        <w:t>мости</w:t>
       </w:r>
       <m:oMath>
         <m:sSub>
@@ -23809,103 +24168,7 @@
           <w:sz w:val="28"/>
           <w:szCs w:val="28"/>
         </w:rPr>
-        <w:t xml:space="preserve">. [Листинг 23, </w:t>
-      </w:r>
-      <w:r>
-        <w:rPr>
-          <w:rFonts w:eastAsia="Arial"/>
-          <w:sz w:val="28"/>
-          <w:szCs w:val="28"/>
-        </w:rPr>
-        <w:t>24</w:t>
-      </w:r>
-      <w:r>
-        <w:rPr>
-          <w:rFonts w:eastAsia="Arial"/>
-          <w:sz w:val="28"/>
-          <w:szCs w:val="28"/>
-        </w:rPr>
-        <w:t>]</w:t>
-      </w:r>
-    </w:p>
-    <w:p>
-      <w:pPr>
-        <w:spacing w:line="360" w:lineRule="auto"/>
-        <w:rPr>
-          <w:rFonts w:eastAsia="Arial"/>
-          <w:sz w:val="28"/>
-          <w:szCs w:val="28"/>
-        </w:rPr>
-      </w:pPr>
-      <w:r>
-        <w:rPr>
-          <w:rFonts w:eastAsia="Arial"/>
-          <w:sz w:val="28"/>
-          <w:szCs w:val="28"/>
-        </w:rPr>
-        <w:tab/>
-      </w:r>
-      <w:r>
-        <w:rPr>
-          <w:rFonts w:eastAsia="Arial"/>
-          <w:sz w:val="28"/>
-          <w:szCs w:val="28"/>
-        </w:rPr>
-        <w:t xml:space="preserve">Критическое значение находилось методом Монте-Карло по </w:t>
-      </w:r>
-      <m:oMath>
-        <m:r>
-          <w:rPr>
-            <w:rFonts w:ascii="Cambria Math" w:eastAsia="Arial" w:hAnsi="Cambria Math"/>
-            <w:sz w:val="28"/>
-            <w:szCs w:val="28"/>
-          </w:rPr>
-          <m:t>m=1000</m:t>
-        </m:r>
-      </m:oMath>
-      <w:r>
-        <w:rPr>
-          <w:rFonts w:eastAsia="Arial"/>
-          <w:sz w:val="28"/>
-          <w:szCs w:val="28"/>
-        </w:rPr>
-        <w:t xml:space="preserve"> смоделированным выборкам объёма</w:t>
-      </w:r>
-      <m:oMath>
-        <m:r>
-          <w:rPr>
-            <w:rFonts w:ascii="Cambria Math" w:eastAsia="Arial" w:hAnsi="Cambria Math"/>
-            <w:sz w:val="28"/>
-            <w:szCs w:val="28"/>
-          </w:rPr>
-          <m:t xml:space="preserve"> n=300</m:t>
-        </m:r>
-      </m:oMath>
-      <w:r>
-        <w:rPr>
-          <w:rFonts w:eastAsia="Arial"/>
-          <w:sz w:val="28"/>
-          <w:szCs w:val="28"/>
-        </w:rPr>
-        <w:t xml:space="preserve">, сгенерированным при истинности </w:t>
-      </w:r>
-      <m:oMath>
-        <m:r>
-          <w:rPr>
-            <w:rFonts w:ascii="Cambria Math" w:eastAsia="Arial" w:hAnsi="Cambria Math"/>
-            <w:sz w:val="28"/>
-            <w:szCs w:val="28"/>
-          </w:rPr>
-          <m:t>H₀</m:t>
-        </m:r>
-      </m:oMath>
-      <w:r>
-        <w:rPr>
-          <w:rFonts w:eastAsia="Arial"/>
-          <w:sz w:val="28"/>
-          <w:szCs w:val="28"/>
-        </w:rPr>
-        <w:t xml:space="preserve">. </w:t>
+        <w:t>. [Листинг 23, 24]</w:t>
       </w:r>
     </w:p>
     <w:p>
@@ -23913,7 +24176,6 @@
         <w:spacing w:line="360" w:lineRule="auto"/>
         <w:ind w:firstLine="709"/>
         <w:rPr>
-          <w:rFonts w:eastAsia="Arial"/>
           <w:sz w:val="28"/>
           <w:szCs w:val="28"/>
         </w:rPr>
@@ -23974,21 +24236,23 @@
           <w:sz w:val="28"/>
           <w:szCs w:val="28"/>
         </w:rPr>
-        <w:t xml:space="preserve"> Для вычисления ошибки первого рода генерируем выборку по параметрам, считаем параметры полученной выборки, вычисляем статистику критерия, которая </w:t>
-      </w:r>
-      <w:r>
-        <w:rPr>
-          <w:sz w:val="28"/>
-          <w:szCs w:val="28"/>
-        </w:rPr>
-        <w:t>показывает,</w:t>
-      </w:r>
-      <w:r>
-        <w:rPr>
-          <w:sz w:val="28"/>
-          <w:szCs w:val="28"/>
-        </w:rPr>
-        <w:t xml:space="preserve"> насколько отклоняются наши данные от теоретических. Сравниваем нашу статистику с критической значением. Если статистика больше критического значения, то гипотеза отвергается, хотя она истина. Так повторяется 1000 раз и считается отношение количества отвергнутых гипотез </w:t>
+        <w:t xml:space="preserve"> Для вычисления ошибки первого рода генерируем выборку по параметрам, считаем параметры полученной выборки, вычисляем статистику критерия, которая показывает, насколько отклоняются наши данные от теоретических. Сравниваем нашу статистику с критической значением. Если статистика больше критического значения, то гипотеза отвергается, хотя она истина. Так повтор</w:t>
+      </w:r>
+      <w:proofErr w:type="spellStart"/>
+      <w:r>
+        <w:rPr>
+          <w:sz w:val="28"/>
+          <w:szCs w:val="28"/>
+        </w:rPr>
+        <w:t>яется</w:t>
+      </w:r>
+      <w:proofErr w:type="spellEnd"/>
+      <w:r>
+        <w:rPr>
+          <w:sz w:val="28"/>
+          <w:szCs w:val="28"/>
+        </w:rPr>
+        <w:t xml:space="preserve"> 1000 раз и считается отношение количества отвергнутых гипотез </w:t>
       </w:r>
       <m:oMath>
         <m:sSub>
@@ -24072,6 +24336,891 @@
         </w:rPr>
         <w:t>.</w:t>
       </w:r>
+      <w:r>
+        <w:rPr>
+          <w:sz w:val="28"/>
+          <w:szCs w:val="28"/>
+        </w:rPr>
+        <w:br/>
+      </w:r>
+      <w:r>
+        <w:rPr>
+          <w:sz w:val="28"/>
+          <w:szCs w:val="28"/>
+        </w:rPr>
+        <w:tab/>
+      </w:r>
+      <w:r>
+        <w:rPr>
+          <w:sz w:val="28"/>
+          <w:szCs w:val="28"/>
+        </w:rPr>
+        <w:t>Функция правдоподобия выборки из двойного гамма-распределения при β = 1:</w:t>
+      </w:r>
+    </w:p>
+    <w:p>
+      <w:pPr>
+        <w:spacing w:line="360" w:lineRule="auto"/>
+        <w:ind w:firstLine="709"/>
+        <w:rPr>
+          <w:sz w:val="28"/>
+          <w:szCs w:val="28"/>
+        </w:rPr>
+      </w:pPr>
+      <m:oMathPara>
+        <m:oMath>
+          <m:r>
+            <w:rPr>
+              <w:rFonts w:ascii="Cambria Math" w:hAnsi="Cambria Math"/>
+              <w:sz w:val="28"/>
+              <w:szCs w:val="28"/>
+            </w:rPr>
+            <m:t xml:space="preserve">L(α) = ∏ᵢ [ </m:t>
+          </m:r>
+          <m:f>
+            <m:fPr>
+              <m:ctrlPr>
+                <w:rPr>
+                  <w:rFonts w:ascii="Cambria Math" w:hAnsi="Cambria Math"/>
+                  <w:i/>
+                  <w:sz w:val="28"/>
+                  <w:szCs w:val="28"/>
+                </w:rPr>
+              </m:ctrlPr>
+            </m:fPr>
+            <m:num>
+              <m:r>
+                <w:rPr>
+                  <w:rFonts w:ascii="Cambria Math" w:hAnsi="Cambria Math"/>
+                  <w:sz w:val="28"/>
+                  <w:szCs w:val="28"/>
+                </w:rPr>
+                <m:t>1</m:t>
+              </m:r>
+            </m:num>
+            <m:den>
+              <m:r>
+                <w:rPr>
+                  <w:rFonts w:ascii="Cambria Math" w:hAnsi="Cambria Math"/>
+                  <w:sz w:val="28"/>
+                  <w:szCs w:val="28"/>
+                </w:rPr>
+                <m:t>(2Γ(α)</m:t>
+              </m:r>
+            </m:den>
+          </m:f>
+          <m:r>
+            <w:rPr>
+              <w:rFonts w:ascii="Cambria Math" w:hAnsi="Cambria Math"/>
+              <w:sz w:val="28"/>
+              <w:szCs w:val="28"/>
+            </w:rPr>
+            <m:t xml:space="preserve">) · </m:t>
+          </m:r>
+          <m:sSup>
+            <m:sSupPr>
+              <m:ctrlPr>
+                <w:rPr>
+                  <w:rFonts w:ascii="Cambria Math" w:hAnsi="Cambria Math"/>
+                  <w:i/>
+                  <w:sz w:val="28"/>
+                  <w:szCs w:val="28"/>
+                </w:rPr>
+              </m:ctrlPr>
+            </m:sSupPr>
+            <m:e>
+              <m:d>
+                <m:dPr>
+                  <m:begChr m:val="|"/>
+                  <m:endChr m:val="|"/>
+                  <m:ctrlPr>
+                    <w:rPr>
+                      <w:rFonts w:ascii="Cambria Math" w:hAnsi="Cambria Math"/>
+                      <w:i/>
+                      <w:sz w:val="28"/>
+                      <w:szCs w:val="28"/>
+                    </w:rPr>
+                  </m:ctrlPr>
+                </m:dPr>
+                <m:e>
+                  <m:r>
+                    <w:rPr>
+                      <w:rFonts w:ascii="Cambria Math" w:hAnsi="Cambria Math"/>
+                      <w:sz w:val="28"/>
+                      <w:szCs w:val="28"/>
+                    </w:rPr>
+                    <m:t>xᵢ-loc</m:t>
+                  </m:r>
+                </m:e>
+              </m:d>
+            </m:e>
+            <m:sup>
+              <m:d>
+                <m:dPr>
+                  <m:ctrlPr>
+                    <w:rPr>
+                      <w:rFonts w:ascii="Cambria Math" w:hAnsi="Cambria Math"/>
+                      <w:i/>
+                      <w:sz w:val="28"/>
+                      <w:szCs w:val="28"/>
+                    </w:rPr>
+                  </m:ctrlPr>
+                </m:dPr>
+                <m:e>
+                  <m:r>
+                    <w:rPr>
+                      <w:rFonts w:ascii="Cambria Math" w:hAnsi="Cambria Math"/>
+                      <w:sz w:val="28"/>
+                      <w:szCs w:val="28"/>
+                    </w:rPr>
+                    <m:t>α-1</m:t>
+                  </m:r>
+                </m:e>
+              </m:d>
+            </m:sup>
+          </m:sSup>
+          <m:r>
+            <w:rPr>
+              <w:rFonts w:ascii="Cambria Math" w:hAnsi="Cambria Math"/>
+              <w:sz w:val="28"/>
+              <w:szCs w:val="28"/>
+            </w:rPr>
+            <m:t xml:space="preserve"> · </m:t>
+          </m:r>
+          <m:sSup>
+            <m:sSupPr>
+              <m:ctrlPr>
+                <w:rPr>
+                  <w:rFonts w:ascii="Cambria Math" w:hAnsi="Cambria Math"/>
+                  <w:i/>
+                  <w:sz w:val="28"/>
+                  <w:szCs w:val="28"/>
+                </w:rPr>
+              </m:ctrlPr>
+            </m:sSupPr>
+            <m:e>
+              <m:r>
+                <w:rPr>
+                  <w:rFonts w:ascii="Cambria Math" w:hAnsi="Cambria Math"/>
+                  <w:sz w:val="28"/>
+                  <w:szCs w:val="28"/>
+                </w:rPr>
+                <m:t>e</m:t>
+              </m:r>
+            </m:e>
+            <m:sup>
+              <m:d>
+                <m:dPr>
+                  <m:ctrlPr>
+                    <w:rPr>
+                      <w:rFonts w:ascii="Cambria Math" w:hAnsi="Cambria Math"/>
+                      <w:i/>
+                      <w:sz w:val="28"/>
+                      <w:szCs w:val="28"/>
+                    </w:rPr>
+                  </m:ctrlPr>
+                </m:dPr>
+                <m:e>
+                  <m:r>
+                    <w:rPr>
+                      <w:rFonts w:ascii="Cambria Math" w:hAnsi="Cambria Math"/>
+                      <w:sz w:val="28"/>
+                      <w:szCs w:val="28"/>
+                    </w:rPr>
+                    <m:t>-</m:t>
+                  </m:r>
+                  <m:d>
+                    <m:dPr>
+                      <m:begChr m:val="|"/>
+                      <m:endChr m:val="|"/>
+                      <m:ctrlPr>
+                        <w:rPr>
+                          <w:rFonts w:ascii="Cambria Math" w:hAnsi="Cambria Math"/>
+                          <w:i/>
+                          <w:sz w:val="28"/>
+                          <w:szCs w:val="28"/>
+                        </w:rPr>
+                      </m:ctrlPr>
+                    </m:dPr>
+                    <m:e>
+                      <m:r>
+                        <w:rPr>
+                          <w:rFonts w:ascii="Cambria Math" w:hAnsi="Cambria Math"/>
+                          <w:sz w:val="28"/>
+                          <w:szCs w:val="28"/>
+                        </w:rPr>
+                        <m:t>xᵢ-loc</m:t>
+                      </m:r>
+                    </m:e>
+                  </m:d>
+                </m:e>
+              </m:d>
+            </m:sup>
+          </m:sSup>
+          <m:r>
+            <w:rPr>
+              <w:rFonts w:ascii="Cambria Math" w:hAnsi="Cambria Math"/>
+              <w:sz w:val="28"/>
+              <w:szCs w:val="28"/>
+            </w:rPr>
+            <m:t xml:space="preserve"> ]</m:t>
+          </m:r>
+        </m:oMath>
+      </m:oMathPara>
+    </w:p>
+    <w:p>
+      <w:pPr>
+        <w:spacing w:line="360" w:lineRule="auto"/>
+        <w:ind w:firstLine="709"/>
+        <w:rPr>
+          <w:sz w:val="28"/>
+          <w:szCs w:val="28"/>
+        </w:rPr>
+      </w:pPr>
+    </w:p>
+    <w:p>
+      <w:pPr>
+        <w:spacing w:line="360" w:lineRule="auto"/>
+        <w:ind w:firstLine="709"/>
+        <w:rPr>
+          <w:sz w:val="28"/>
+          <w:szCs w:val="28"/>
+        </w:rPr>
+      </w:pPr>
+      <w:r>
+        <w:rPr>
+          <w:sz w:val="28"/>
+          <w:szCs w:val="28"/>
+        </w:rPr>
+        <w:t>Логарифм функции правдоподобия:</w:t>
+      </w:r>
+    </w:p>
+    <w:p>
+      <w:pPr>
+        <w:spacing w:line="360" w:lineRule="auto"/>
+        <w:ind w:firstLine="709"/>
+        <w:rPr>
+          <w:sz w:val="28"/>
+          <w:szCs w:val="28"/>
+        </w:rPr>
+      </w:pPr>
+      <m:oMathPara>
+        <m:oMath>
+          <m:r>
+            <w:rPr>
+              <w:rFonts w:ascii="Cambria Math" w:hAnsi="Cambria Math"/>
+              <w:sz w:val="28"/>
+              <w:szCs w:val="28"/>
+            </w:rPr>
+            <m:t>lnL</m:t>
+          </m:r>
+          <m:d>
+            <m:dPr>
+              <m:ctrlPr>
+                <w:rPr>
+                  <w:rFonts w:ascii="Cambria Math" w:hAnsi="Cambria Math"/>
+                  <w:i/>
+                  <w:sz w:val="28"/>
+                  <w:szCs w:val="28"/>
+                </w:rPr>
+              </m:ctrlPr>
+            </m:dPr>
+            <m:e>
+              <m:r>
+                <w:rPr>
+                  <w:rFonts w:ascii="Cambria Math" w:hAnsi="Cambria Math"/>
+                  <w:sz w:val="28"/>
+                  <w:szCs w:val="28"/>
+                </w:rPr>
+                <m:t>α</m:t>
+              </m:r>
+            </m:e>
+          </m:d>
+          <m:r>
+            <w:rPr>
+              <w:rFonts w:ascii="Cambria Math" w:hAnsi="Cambria Math"/>
+              <w:sz w:val="28"/>
+              <w:szCs w:val="28"/>
+            </w:rPr>
+            <m:t>=-n·ln2-n·lnΓ</m:t>
+          </m:r>
+          <m:d>
+            <m:dPr>
+              <m:ctrlPr>
+                <w:rPr>
+                  <w:rFonts w:ascii="Cambria Math" w:hAnsi="Cambria Math"/>
+                  <w:i/>
+                  <w:sz w:val="28"/>
+                  <w:szCs w:val="28"/>
+                </w:rPr>
+              </m:ctrlPr>
+            </m:dPr>
+            <m:e>
+              <m:r>
+                <w:rPr>
+                  <w:rFonts w:ascii="Cambria Math" w:hAnsi="Cambria Math"/>
+                  <w:sz w:val="28"/>
+                  <w:szCs w:val="28"/>
+                </w:rPr>
+                <m:t>α</m:t>
+              </m:r>
+            </m:e>
+          </m:d>
+          <m:r>
+            <w:rPr>
+              <w:rFonts w:ascii="Cambria Math" w:hAnsi="Cambria Math"/>
+              <w:sz w:val="28"/>
+              <w:szCs w:val="28"/>
+            </w:rPr>
+            <m:t>+</m:t>
+          </m:r>
+          <m:d>
+            <m:dPr>
+              <m:ctrlPr>
+                <w:rPr>
+                  <w:rFonts w:ascii="Cambria Math" w:hAnsi="Cambria Math"/>
+                  <w:i/>
+                  <w:sz w:val="28"/>
+                  <w:szCs w:val="28"/>
+                </w:rPr>
+              </m:ctrlPr>
+            </m:dPr>
+            <m:e>
+              <m:r>
+                <w:rPr>
+                  <w:rFonts w:ascii="Cambria Math" w:hAnsi="Cambria Math"/>
+                  <w:sz w:val="28"/>
+                  <w:szCs w:val="28"/>
+                </w:rPr>
+                <m:t>α-1</m:t>
+              </m:r>
+            </m:e>
+          </m:d>
+          <m:r>
+            <w:rPr>
+              <w:rFonts w:ascii="Cambria Math" w:hAnsi="Cambria Math"/>
+              <w:sz w:val="28"/>
+              <w:szCs w:val="28"/>
+            </w:rPr>
+            <m:t>·Σᵢln</m:t>
+          </m:r>
+          <m:d>
+            <m:dPr>
+              <m:begChr m:val="|"/>
+              <m:endChr m:val="|"/>
+              <m:ctrlPr>
+                <w:rPr>
+                  <w:rFonts w:ascii="Cambria Math" w:hAnsi="Cambria Math"/>
+                  <w:i/>
+                  <w:sz w:val="28"/>
+                  <w:szCs w:val="28"/>
+                </w:rPr>
+              </m:ctrlPr>
+            </m:dPr>
+            <m:e>
+              <m:r>
+                <w:rPr>
+                  <w:rFonts w:ascii="Cambria Math" w:hAnsi="Cambria Math"/>
+                  <w:sz w:val="28"/>
+                  <w:szCs w:val="28"/>
+                </w:rPr>
+                <m:t>xᵢ-loc</m:t>
+              </m:r>
+            </m:e>
+          </m:d>
+          <m:r>
+            <w:rPr>
+              <w:rFonts w:ascii="Cambria Math" w:hAnsi="Cambria Math"/>
+              <w:sz w:val="28"/>
+              <w:szCs w:val="28"/>
+            </w:rPr>
+            <m:t>-Σᵢ</m:t>
+          </m:r>
+          <m:d>
+            <m:dPr>
+              <m:begChr m:val="|"/>
+              <m:endChr m:val="|"/>
+              <m:ctrlPr>
+                <w:rPr>
+                  <w:rFonts w:ascii="Cambria Math" w:hAnsi="Cambria Math"/>
+                  <w:i/>
+                  <w:sz w:val="28"/>
+                  <w:szCs w:val="28"/>
+                </w:rPr>
+              </m:ctrlPr>
+            </m:dPr>
+            <m:e>
+              <m:r>
+                <w:rPr>
+                  <w:rFonts w:ascii="Cambria Math" w:hAnsi="Cambria Math"/>
+                  <w:sz w:val="28"/>
+                  <w:szCs w:val="28"/>
+                </w:rPr>
+                <m:t>x</m:t>
+              </m:r>
+              <m:r>
+                <w:rPr>
+                  <w:rFonts w:ascii="Cambria Math" w:hAnsi="Cambria Math"/>
+                  <w:sz w:val="28"/>
+                  <w:szCs w:val="28"/>
+                </w:rPr>
+                <m:t>-</m:t>
+              </m:r>
+              <m:r>
+                <w:rPr>
+                  <w:rFonts w:ascii="Cambria Math" w:hAnsi="Cambria Math"/>
+                  <w:sz w:val="28"/>
+                  <w:szCs w:val="28"/>
+                </w:rPr>
+                <m:t>loc</m:t>
+              </m:r>
+            </m:e>
+          </m:d>
+        </m:oMath>
+      </m:oMathPara>
+    </w:p>
+    <w:p>
+      <w:pPr>
+        <w:spacing w:line="360" w:lineRule="auto"/>
+        <w:ind w:firstLine="709"/>
+        <w:rPr>
+          <w:sz w:val="28"/>
+          <w:szCs w:val="28"/>
+        </w:rPr>
+      </w:pPr>
+      <w:r>
+        <w:rPr>
+          <w:sz w:val="28"/>
+          <w:szCs w:val="28"/>
+        </w:rPr>
+        <w:lastRenderedPageBreak/>
+        <w:t xml:space="preserve">Слагаемое </w:t>
+      </w:r>
+      <m:oMath>
+        <m:r>
+          <w:rPr>
+            <w:rFonts w:ascii="Cambria Math" w:hAnsi="Cambria Math"/>
+            <w:sz w:val="28"/>
+            <w:szCs w:val="28"/>
+          </w:rPr>
+          <m:t>-Σ|xᵢ - loc|</m:t>
+        </m:r>
+      </m:oMath>
+      <w:r>
+        <w:rPr>
+          <w:sz w:val="28"/>
+          <w:szCs w:val="28"/>
+        </w:rPr>
+        <w:t xml:space="preserve"> от α не зависит. Тогда логарифм отношения правдоподобия равен</w:t>
+      </w:r>
+    </w:p>
+    <w:p>
+      <w:pPr>
+        <w:spacing w:line="360" w:lineRule="auto"/>
+        <w:ind w:firstLine="709"/>
+        <w:rPr>
+          <w:sz w:val="28"/>
+          <w:szCs w:val="28"/>
+        </w:rPr>
+      </w:pPr>
+      <m:oMath>
+        <m:r>
+          <w:rPr>
+            <w:rFonts w:ascii="Cambria Math" w:hAnsi="Cambria Math"/>
+            <w:sz w:val="28"/>
+            <w:szCs w:val="28"/>
+          </w:rPr>
+          <m:t>ln [</m:t>
+        </m:r>
+        <m:f>
+          <m:fPr>
+            <m:ctrlPr>
+              <w:rPr>
+                <w:rFonts w:ascii="Cambria Math" w:hAnsi="Cambria Math"/>
+                <w:i/>
+                <w:sz w:val="28"/>
+                <w:szCs w:val="28"/>
+              </w:rPr>
+            </m:ctrlPr>
+          </m:fPr>
+          <m:num>
+            <m:r>
+              <w:rPr>
+                <w:rFonts w:ascii="Cambria Math" w:hAnsi="Cambria Math"/>
+                <w:sz w:val="28"/>
+                <w:szCs w:val="28"/>
+              </w:rPr>
+              <m:t>L(α₁)</m:t>
+            </m:r>
+          </m:num>
+          <m:den>
+            <m:r>
+              <w:rPr>
+                <w:rFonts w:ascii="Cambria Math" w:hAnsi="Cambria Math"/>
+                <w:sz w:val="28"/>
+                <w:szCs w:val="28"/>
+              </w:rPr>
+              <m:t xml:space="preserve"> L(α₀)</m:t>
+            </m:r>
+          </m:den>
+        </m:f>
+        <m:r>
+          <w:rPr>
+            <w:rFonts w:ascii="Cambria Math" w:hAnsi="Cambria Math"/>
+            <w:sz w:val="28"/>
+            <w:szCs w:val="28"/>
+          </w:rPr>
+          <m:t>] = (α₁ - α₀)·T - n·(ln Γ(α₁) - ln Γ(α₀))</m:t>
+        </m:r>
+      </m:oMath>
+      <w:r>
+        <w:rPr>
+          <w:sz w:val="28"/>
+          <w:szCs w:val="28"/>
+        </w:rPr>
+        <w:t>,</w:t>
+      </w:r>
+    </w:p>
+    <w:p>
+      <w:pPr>
+        <w:spacing w:line="360" w:lineRule="auto"/>
+        <w:ind w:firstLine="709"/>
+        <w:rPr>
+          <w:sz w:val="28"/>
+          <w:szCs w:val="28"/>
+        </w:rPr>
+      </w:pPr>
+      <w:r>
+        <w:rPr>
+          <w:sz w:val="28"/>
+          <w:szCs w:val="28"/>
+        </w:rPr>
+        <w:t>где</w:t>
+      </w:r>
+    </w:p>
+    <w:p>
+      <w:pPr>
+        <w:spacing w:line="360" w:lineRule="auto"/>
+        <w:ind w:firstLine="709"/>
+        <w:rPr>
+          <w:sz w:val="28"/>
+          <w:szCs w:val="28"/>
+        </w:rPr>
+      </w:pPr>
+      <m:oMath>
+        <m:r>
+          <w:rPr>
+            <w:rFonts w:ascii="Cambria Math" w:hAnsi="Cambria Math"/>
+            <w:sz w:val="28"/>
+            <w:szCs w:val="28"/>
+          </w:rPr>
+          <m:t>T = Σᵢ ln|xᵢ - loc|</m:t>
+        </m:r>
+      </m:oMath>
+      <w:r>
+        <w:rPr>
+          <w:sz w:val="28"/>
+          <w:szCs w:val="28"/>
+        </w:rPr>
+        <w:t>.</w:t>
+      </w:r>
+    </w:p>
+    <w:p>
+      <w:pPr>
+        <w:spacing w:line="360" w:lineRule="auto"/>
+        <w:ind w:firstLine="709"/>
+        <w:rPr>
+          <w:sz w:val="28"/>
+          <w:szCs w:val="28"/>
+        </w:rPr>
+      </w:pPr>
+    </w:p>
+    <w:p>
+      <w:pPr>
+        <w:spacing w:line="360" w:lineRule="auto"/>
+        <w:ind w:firstLine="709"/>
+        <w:rPr>
+          <w:sz w:val="28"/>
+          <w:szCs w:val="28"/>
+        </w:rPr>
+      </w:pPr>
+      <w:r>
+        <w:rPr>
+          <w:sz w:val="28"/>
+          <w:szCs w:val="28"/>
+        </w:rPr>
+        <w:t xml:space="preserve">Выборка входит в это выражение только через T, а зависимость от T линейная и монотонная. Поэтому неравенство </w:t>
+      </w:r>
+      <m:oMath>
+        <m:f>
+          <m:fPr>
+            <m:ctrlPr>
+              <w:rPr>
+                <w:rFonts w:ascii="Cambria Math" w:hAnsi="Cambria Math"/>
+                <w:i/>
+                <w:sz w:val="28"/>
+                <w:szCs w:val="28"/>
+              </w:rPr>
+            </m:ctrlPr>
+          </m:fPr>
+          <m:num>
+            <m:r>
+              <w:rPr>
+                <w:rFonts w:ascii="Cambria Math" w:hAnsi="Cambria Math"/>
+                <w:sz w:val="28"/>
+                <w:szCs w:val="28"/>
+              </w:rPr>
+              <m:t>L(α₁)</m:t>
+            </m:r>
+          </m:num>
+          <m:den>
+            <m:r>
+              <w:rPr>
+                <w:rFonts w:ascii="Cambria Math" w:hAnsi="Cambria Math"/>
+                <w:sz w:val="28"/>
+                <w:szCs w:val="28"/>
+              </w:rPr>
+              <m:t>L(α₀)</m:t>
+            </m:r>
+          </m:den>
+        </m:f>
+        <m:r>
+          <w:rPr>
+            <w:rFonts w:ascii="Cambria Math" w:hAnsi="Cambria Math"/>
+            <w:sz w:val="28"/>
+            <w:szCs w:val="28"/>
+          </w:rPr>
+          <m:t xml:space="preserve"> &gt; C</m:t>
+        </m:r>
+      </m:oMath>
+      <w:r>
+        <w:rPr>
+          <w:sz w:val="28"/>
+          <w:szCs w:val="28"/>
+        </w:rPr>
+        <w:t xml:space="preserve"> равносильно неравенству для T:</w:t>
+      </w:r>
+    </w:p>
+    <w:p>
+      <w:pPr>
+        <w:numPr>
+          <w:ilvl w:val="0"/>
+          <w:numId w:val="21"/>
+        </w:numPr>
+        <w:spacing w:line="360" w:lineRule="auto"/>
+        <w:rPr>
+          <w:sz w:val="28"/>
+          <w:szCs w:val="28"/>
+        </w:rPr>
+      </w:pPr>
+      <w:r>
+        <w:rPr>
+          <w:sz w:val="28"/>
+          <w:szCs w:val="28"/>
+        </w:rPr>
+        <w:t xml:space="preserve">при </w:t>
+      </w:r>
+      <m:oMath>
+        <m:r>
+          <w:rPr>
+            <w:rFonts w:ascii="Cambria Math" w:hAnsi="Cambria Math"/>
+            <w:sz w:val="28"/>
+            <w:szCs w:val="28"/>
+          </w:rPr>
+          <m:t>α₁ &gt; α₀</m:t>
+        </m:r>
+      </m:oMath>
+      <w:r>
+        <w:rPr>
+          <w:sz w:val="28"/>
+          <w:szCs w:val="28"/>
+        </w:rPr>
+        <w:t xml:space="preserve"> критическая область имеет вид </w:t>
+      </w:r>
+      <m:oMath>
+        <m:r>
+          <w:rPr>
+            <w:rFonts w:ascii="Cambria Math" w:hAnsi="Cambria Math"/>
+            <w:sz w:val="28"/>
+            <w:szCs w:val="28"/>
+          </w:rPr>
+          <m:t>T &gt; c</m:t>
+        </m:r>
+      </m:oMath>
+      <w:r>
+        <w:rPr>
+          <w:sz w:val="28"/>
+          <w:szCs w:val="28"/>
+        </w:rPr>
+        <w:t>;</w:t>
+      </w:r>
+    </w:p>
+    <w:p>
+      <w:pPr>
+        <w:numPr>
+          <w:ilvl w:val="0"/>
+          <w:numId w:val="21"/>
+        </w:numPr>
+        <w:spacing w:line="360" w:lineRule="auto"/>
+        <w:rPr>
+          <w:sz w:val="28"/>
+          <w:szCs w:val="28"/>
+        </w:rPr>
+      </w:pPr>
+      <w:r>
+        <w:rPr>
+          <w:sz w:val="28"/>
+          <w:szCs w:val="28"/>
+        </w:rPr>
+        <w:t xml:space="preserve">при </w:t>
+      </w:r>
+      <m:oMath>
+        <m:r>
+          <w:rPr>
+            <w:rFonts w:ascii="Cambria Math" w:hAnsi="Cambria Math"/>
+            <w:sz w:val="28"/>
+            <w:szCs w:val="28"/>
+          </w:rPr>
+          <m:t>α₁ &lt; α₀</m:t>
+        </m:r>
+      </m:oMath>
+      <w:r>
+        <w:rPr>
+          <w:sz w:val="28"/>
+          <w:szCs w:val="28"/>
+        </w:rPr>
+        <w:t xml:space="preserve"> критическая область имеет вид </w:t>
+      </w:r>
+      <m:oMath>
+        <m:r>
+          <w:rPr>
+            <w:rFonts w:ascii="Cambria Math" w:hAnsi="Cambria Math"/>
+            <w:sz w:val="28"/>
+            <w:szCs w:val="28"/>
+          </w:rPr>
+          <m:t>T &lt; c</m:t>
+        </m:r>
+      </m:oMath>
+      <w:r>
+        <w:rPr>
+          <w:sz w:val="28"/>
+          <w:szCs w:val="28"/>
+        </w:rPr>
+        <w:t>.</w:t>
+      </w:r>
+    </w:p>
+    <w:p>
+      <w:pPr>
+        <w:spacing w:line="360" w:lineRule="auto"/>
+        <w:ind w:firstLine="709"/>
+        <w:rPr>
+          <w:sz w:val="28"/>
+          <w:szCs w:val="28"/>
+        </w:rPr>
+      </w:pPr>
+      <w:r>
+        <w:rPr>
+          <w:sz w:val="28"/>
+          <w:szCs w:val="28"/>
+        </w:rPr>
+        <w:t>Таким образом, статистикой критерия является сумма натуральных логарифмов отклонений от параметра смещения.</w:t>
+      </w:r>
+    </w:p>
+    <w:p>
+      <w:pPr>
+        <w:spacing w:line="360" w:lineRule="auto"/>
+        <w:ind w:firstLine="709"/>
+        <w:rPr>
+          <w:sz w:val="28"/>
+          <w:szCs w:val="28"/>
+        </w:rPr>
+      </w:pPr>
+      <w:r>
+        <w:rPr>
+          <w:sz w:val="28"/>
+          <w:szCs w:val="28"/>
+        </w:rPr>
+        <w:t xml:space="preserve">Так как аналитическое распределение </w:t>
+      </w:r>
+      <m:oMath>
+        <m:r>
+          <w:rPr>
+            <w:rFonts w:ascii="Cambria Math" w:hAnsi="Cambria Math"/>
+            <w:sz w:val="28"/>
+            <w:szCs w:val="28"/>
+          </w:rPr>
+          <m:t>T</m:t>
+        </m:r>
+      </m:oMath>
+      <w:r>
+        <w:rPr>
+          <w:sz w:val="28"/>
+          <w:szCs w:val="28"/>
+        </w:rPr>
+        <w:t xml:space="preserve"> при </w:t>
+      </w:r>
+      <m:oMath>
+        <m:r>
+          <w:rPr>
+            <w:rFonts w:ascii="Cambria Math" w:hAnsi="Cambria Math"/>
+            <w:sz w:val="28"/>
+            <w:szCs w:val="28"/>
+          </w:rPr>
+          <m:t>H₀</m:t>
+        </m:r>
+      </m:oMath>
+      <w:r>
+        <w:rPr>
+          <w:sz w:val="28"/>
+          <w:szCs w:val="28"/>
+        </w:rPr>
+        <w:t xml:space="preserve"> неудобно, c находится моделированием: генерируется 1000 выборок объёма n = 300 из распределения с параметром α₀, для каждой вычисляется T, и в качестве </w:t>
+      </w:r>
+      <m:oMath>
+        <m:r>
+          <w:rPr>
+            <w:rFonts w:ascii="Cambria Math" w:hAnsi="Cambria Math"/>
+            <w:sz w:val="28"/>
+            <w:szCs w:val="28"/>
+          </w:rPr>
+          <m:t>c</m:t>
+        </m:r>
+      </m:oMath>
+      <w:r>
+        <w:rPr>
+          <w:sz w:val="28"/>
+          <w:szCs w:val="28"/>
+        </w:rPr>
+        <w:t xml:space="preserve"> берётся выборочный </w:t>
+      </w:r>
+      <m:oMath>
+        <m:r>
+          <w:rPr>
+            <w:rFonts w:ascii="Cambria Math" w:hAnsi="Cambria Math"/>
+            <w:sz w:val="28"/>
+            <w:szCs w:val="28"/>
+          </w:rPr>
+          <m:t>(1 - α₁)</m:t>
+        </m:r>
+      </m:oMath>
+      <w:r>
+        <w:rPr>
+          <w:sz w:val="28"/>
+          <w:szCs w:val="28"/>
+        </w:rPr>
+        <w:t xml:space="preserve">-квантиль, то есть 95-й процентиль значений T. </w:t>
+      </w:r>
+    </w:p>
+    <w:p>
+      <w:pPr>
+        <w:spacing w:line="360" w:lineRule="auto"/>
+        <w:ind w:firstLine="709"/>
+        <w:rPr>
+          <w:rFonts w:eastAsia="Arial"/>
+          <w:sz w:val="28"/>
+          <w:szCs w:val="28"/>
+        </w:rPr>
+      </w:pPr>
     </w:p>
     <w:p>
       <w:pPr>
@@ -24141,48 +25290,48 @@
           <w:sz w:val="28"/>
           <w:szCs w:val="28"/>
         </w:rPr>
+        <w:t>Листинг 23. Статистика критерия</w:t>
+      </w:r>
+    </w:p>
+    <w:p>
+      <w:pPr>
+        <w:spacing w:line="360" w:lineRule="auto"/>
+        <w:ind w:firstLine="708"/>
+        <w:jc w:val="both"/>
+        <w:rPr>
+          <w:sz w:val="28"/>
+          <w:szCs w:val="28"/>
+          <w:lang w:val="en-US"/>
+        </w:rPr>
+      </w:pPr>
+    </w:p>
+    <w:p>
+      <w:pPr>
+        <w:spacing w:line="360" w:lineRule="auto"/>
+        <w:ind w:firstLine="708"/>
+        <w:jc w:val="both"/>
+        <w:rPr>
+          <w:sz w:val="28"/>
+          <w:szCs w:val="28"/>
+        </w:rPr>
+      </w:pPr>
+    </w:p>
+    <w:p>
+      <w:pPr>
+        <w:spacing w:line="360" w:lineRule="auto"/>
+        <w:jc w:val="both"/>
+        <w:rPr>
+          <w:sz w:val="28"/>
+          <w:szCs w:val="28"/>
+        </w:rPr>
+      </w:pPr>
+      <w:r>
+        <w:rPr>
+          <w:noProof/>
+          <w:sz w:val="28"/>
+          <w:szCs w:val="28"/>
+        </w:rPr>
         <w:lastRenderedPageBreak/>
-        <w:t>Листинг 23. Статистика критерия</w:t>
-      </w:r>
-    </w:p>
-    <w:p>
-      <w:pPr>
-        <w:spacing w:line="360" w:lineRule="auto"/>
-        <w:ind w:firstLine="708"/>
-        <w:jc w:val="both"/>
-        <w:rPr>
-          <w:sz w:val="28"/>
-          <w:szCs w:val="28"/>
-          <w:lang w:val="en-US"/>
-        </w:rPr>
-      </w:pPr>
-    </w:p>
-    <w:p>
-      <w:pPr>
-        <w:spacing w:line="360" w:lineRule="auto"/>
-        <w:ind w:firstLine="708"/>
-        <w:jc w:val="both"/>
-        <w:rPr>
-          <w:sz w:val="28"/>
-          <w:szCs w:val="28"/>
-        </w:rPr>
-      </w:pPr>
-    </w:p>
-    <w:p>
-      <w:pPr>
-        <w:spacing w:line="360" w:lineRule="auto"/>
-        <w:jc w:val="both"/>
-        <w:rPr>
-          <w:sz w:val="28"/>
-          <w:szCs w:val="28"/>
-        </w:rPr>
-      </w:pPr>
-      <w:r>
-        <w:rPr>
-          <w:noProof/>
-          <w:sz w:val="28"/>
-          <w:szCs w:val="28"/>
-        </w:rPr>
         <w:drawing>
           <wp:inline distT="0" distB="0" distL="0" distR="0" wp14:anchorId="1C3B8B5C" wp14:editId="335E0EEE">
             <wp:extent cx="5563450" cy="5105400"/>
@@ -24543,20 +25692,33 @@
     <w:p>
       <w:pPr>
         <w:spacing w:before="100" w:beforeAutospacing="1" w:after="100" w:afterAutospacing="1" w:line="360" w:lineRule="auto"/>
-        <w:ind w:left="360"/>
-        <w:jc w:val="both"/>
-        <w:rPr>
-          <w:sz w:val="28"/>
-          <w:szCs w:val="28"/>
-        </w:rPr>
-      </w:pPr>
-      <w:r>
-        <w:rPr>
-          <w:sz w:val="28"/>
-          <w:szCs w:val="28"/>
-        </w:rPr>
-        <w:lastRenderedPageBreak/>
-        <w:t xml:space="preserve">По результатам видно, что наиболее мощный критерий ММП равная </w:t>
+        <w:ind w:left="360" w:firstLine="348"/>
+        <w:jc w:val="both"/>
+        <w:rPr>
+          <w:sz w:val="28"/>
+          <w:szCs w:val="28"/>
+        </w:rPr>
+      </w:pPr>
+      <w:r>
+        <w:rPr>
+          <w:sz w:val="28"/>
+          <w:szCs w:val="28"/>
+        </w:rPr>
+        <w:t>По результатам видно, что наиболее мощный критерий ММП равн</w:t>
+      </w:r>
+      <w:r>
+        <w:rPr>
+          <w:sz w:val="28"/>
+          <w:szCs w:val="28"/>
+        </w:rPr>
+        <w:t>ая</w:t>
+      </w:r>
+      <w:r>
+        <w:rPr>
+          <w:sz w:val="28"/>
+          <w:szCs w:val="28"/>
+        </w:rPr>
+        <w:t xml:space="preserve"> </w:t>
       </w:r>
       <w:r>
         <w:rPr>
@@ -24565,6 +25727,47 @@
         </w:rPr>
         <w:t>0,197</w:t>
       </w:r>
+      <w:r>
+        <w:rPr>
+          <w:sz w:val="28"/>
+          <w:szCs w:val="28"/>
+        </w:rPr>
+        <w:t xml:space="preserve">. </w:t>
+      </w:r>
+      <w:r>
+        <w:rPr>
+          <w:sz w:val="28"/>
+          <w:szCs w:val="28"/>
+        </w:rPr>
+        <w:t xml:space="preserve">Низкая мощность объясняется близостью значений </w:t>
+      </w:r>
+      <m:oMath>
+        <m:r>
+          <w:rPr>
+            <w:rFonts w:ascii="Cambria Math" w:hAnsi="Cambria Math"/>
+            <w:sz w:val="28"/>
+            <w:szCs w:val="28"/>
+          </w:rPr>
+          <m:t>α₀</m:t>
+        </m:r>
+      </m:oMath>
+      <w:r>
+        <w:rPr>
+          <w:sz w:val="28"/>
+          <w:szCs w:val="28"/>
+        </w:rPr>
+        <w:t xml:space="preserve"> и </w:t>
+      </w:r>
+      <m:oMath>
+        <m:r>
+          <w:rPr>
+            <w:rFonts w:ascii="Cambria Math" w:hAnsi="Cambria Math"/>
+            <w:sz w:val="28"/>
+            <w:szCs w:val="28"/>
+          </w:rPr>
+          <m:t>α₁</m:t>
+        </m:r>
+      </m:oMath>
       <w:r>
         <w:rPr>
           <w:sz w:val="28"/>
@@ -24588,6 +25791,7 @@
           <w:sz w:val="28"/>
           <w:szCs w:val="28"/>
         </w:rPr>
+        <w:lastRenderedPageBreak/>
         <w:t>Большая абсолютная величина критического значения объясняется тем, что статистика T представляет собой сумму 300 слагаемых, само по себе большое значение c не свидетельствует об ошибке в расчётах, а лишь отражает масштаб суммарной статистики.</w:t>
       </w:r>
     </w:p>
@@ -25361,43 +26565,14 @@
           <w:sz w:val="28"/>
           <w:szCs w:val="28"/>
         </w:rPr>
-        <w:t xml:space="preserve">. </w:t>
-      </w:r>
-    </w:p>
-    <w:p>
-      <w:pPr>
-        <w:spacing w:before="100" w:beforeAutospacing="1" w:after="100" w:afterAutospacing="1" w:line="360" w:lineRule="auto"/>
-        <w:ind w:firstLine="360"/>
-        <w:jc w:val="both"/>
-        <w:rPr>
-          <w:sz w:val="28"/>
-          <w:szCs w:val="28"/>
-        </w:rPr>
-      </w:pPr>
-      <w:r>
-        <w:rPr>
-          <w:sz w:val="28"/>
-          <w:szCs w:val="28"/>
-        </w:rPr>
-        <w:t>Число степеней свободы:</w:t>
-      </w:r>
-    </w:p>
-    <w:p>
-      <w:pPr>
-        <w:spacing w:before="100" w:beforeAutospacing="1" w:after="100" w:afterAutospacing="1" w:line="360" w:lineRule="auto"/>
-        <w:ind w:firstLine="360"/>
-        <w:jc w:val="both"/>
-        <w:rPr>
-          <w:sz w:val="28"/>
-          <w:szCs w:val="28"/>
-        </w:rPr>
-      </w:pPr>
-      <w:r>
-        <w:rPr>
-          <w:sz w:val="28"/>
-          <w:szCs w:val="28"/>
-        </w:rPr>
-        <w:t xml:space="preserve"> </w:t>
+        <w:t xml:space="preserve">, </w:t>
+      </w:r>
+      <w:r>
+        <w:rPr>
+          <w:sz w:val="28"/>
+          <w:szCs w:val="28"/>
+        </w:rPr>
+        <w:t xml:space="preserve">так что ожидаемая частота в каждом интервале одинакова и равна </w:t>
       </w:r>
       <m:oMath>
         <m:r>
@@ -25406,9 +26581,16 @@
             <w:sz w:val="28"/>
             <w:szCs w:val="28"/>
           </w:rPr>
-          <m:t>df = k - 1 - r = 9 - 1 - 2 = 6</m:t>
+          <m:t>npᵢ = n/k = 300/9 ≈ 33,3</m:t>
         </m:r>
       </m:oMath>
+      <w:r>
+        <w:rPr>
+          <w:sz w:val="28"/>
+          <w:szCs w:val="28"/>
+        </w:rPr>
+        <w:t>. Число степеней свободы определяется по формуле</w:t>
+      </w:r>
     </w:p>
     <w:p>
       <w:pPr>
@@ -25418,6 +26600,230 @@
         <w:rPr>
           <w:sz w:val="28"/>
           <w:szCs w:val="28"/>
+        </w:rPr>
+      </w:pPr>
+      <m:oMathPara>
+        <m:oMath>
+          <m:r>
+            <w:rPr>
+              <w:rFonts w:ascii="Cambria Math" w:hAnsi="Cambria Math"/>
+              <w:sz w:val="28"/>
+              <w:szCs w:val="28"/>
+            </w:rPr>
+            <m:t>df = k - 1 - r = 9 - 1 - 2 = 6</m:t>
+          </m:r>
+        </m:oMath>
+      </m:oMathPara>
+    </w:p>
+    <w:p>
+      <w:pPr>
+        <w:spacing w:before="100" w:beforeAutospacing="1" w:after="100" w:afterAutospacing="1" w:line="360" w:lineRule="auto"/>
+        <w:ind w:firstLine="709"/>
+        <w:jc w:val="both"/>
+        <w:rPr>
+          <w:sz w:val="28"/>
+          <w:szCs w:val="28"/>
+        </w:rPr>
+      </w:pPr>
+    </w:p>
+    <w:p>
+      <w:pPr>
+        <w:spacing w:before="100" w:beforeAutospacing="1" w:after="100" w:afterAutospacing="1" w:line="360" w:lineRule="auto"/>
+        <w:ind w:firstLine="709"/>
+        <w:jc w:val="both"/>
+        <w:rPr>
+          <w:sz w:val="28"/>
+          <w:szCs w:val="28"/>
+        </w:rPr>
+      </w:pPr>
+      <w:r>
+        <w:rPr>
+          <w:sz w:val="28"/>
+          <w:szCs w:val="28"/>
+        </w:rPr>
+        <w:lastRenderedPageBreak/>
+        <w:t xml:space="preserve">где k − 1 учитывает связь </w:t>
+      </w:r>
+      <m:oMath>
+        <m:r>
+          <w:rPr>
+            <w:rFonts w:ascii="Cambria Math" w:hAnsi="Cambria Math"/>
+            <w:sz w:val="28"/>
+            <w:szCs w:val="28"/>
+          </w:rPr>
+          <m:t>Σnᵢ = n</m:t>
+        </m:r>
+      </m:oMath>
+      <w:r>
+        <w:rPr>
+          <w:sz w:val="28"/>
+          <w:szCs w:val="28"/>
+        </w:rPr>
+        <w:t xml:space="preserve">, а </w:t>
+      </w:r>
+      <m:oMath>
+        <m:r>
+          <w:rPr>
+            <w:rFonts w:ascii="Cambria Math" w:hAnsi="Cambria Math"/>
+            <w:sz w:val="28"/>
+            <w:szCs w:val="28"/>
+          </w:rPr>
+          <m:t>r = 2</m:t>
+        </m:r>
+      </m:oMath>
+      <w:r>
+        <w:rPr>
+          <w:sz w:val="28"/>
+          <w:szCs w:val="28"/>
+        </w:rPr>
+        <w:t xml:space="preserve"> это число параметров распределения (</w:t>
+      </w:r>
+      <m:oMath>
+        <m:r>
+          <w:rPr>
+            <w:rFonts w:ascii="Cambria Math" w:hAnsi="Cambria Math"/>
+            <w:sz w:val="28"/>
+            <w:szCs w:val="28"/>
+          </w:rPr>
+          <m:t>α</m:t>
+        </m:r>
+      </m:oMath>
+      <w:r>
+        <w:rPr>
+          <w:sz w:val="28"/>
+          <w:szCs w:val="28"/>
+        </w:rPr>
+        <w:t xml:space="preserve"> и </w:t>
+      </w:r>
+      <m:oMath>
+        <m:r>
+          <w:rPr>
+            <w:rFonts w:ascii="Cambria Math" w:hAnsi="Cambria Math"/>
+            <w:sz w:val="28"/>
+            <w:szCs w:val="28"/>
+          </w:rPr>
+          <m:t>loc</m:t>
+        </m:r>
+      </m:oMath>
+      <w:r>
+        <w:rPr>
+          <w:sz w:val="28"/>
+          <w:szCs w:val="28"/>
+        </w:rPr>
+        <w:t>), оценённых по выборке.</w:t>
+      </w:r>
+    </w:p>
+    <w:p>
+      <w:pPr>
+        <w:spacing w:before="100" w:beforeAutospacing="1" w:after="100" w:afterAutospacing="1" w:line="360" w:lineRule="auto"/>
+        <w:ind w:firstLine="709"/>
+        <w:jc w:val="both"/>
+        <w:rPr>
+          <w:sz w:val="28"/>
+          <w:szCs w:val="28"/>
+        </w:rPr>
+      </w:pPr>
+      <w:r>
+        <w:rPr>
+          <w:sz w:val="28"/>
+          <w:szCs w:val="28"/>
+        </w:rPr>
+        <w:t xml:space="preserve"> Критическое значение при уровне значимости 0,05 равно </w:t>
+      </w:r>
+      <m:oMath>
+        <m:r>
+          <w:rPr>
+            <w:rFonts w:ascii="Cambria Math" w:hAnsi="Cambria Math"/>
+            <w:sz w:val="28"/>
+            <w:szCs w:val="28"/>
+          </w:rPr>
+          <m:t>χ²</m:t>
+        </m:r>
+      </m:oMath>
+      <w:r>
+        <w:rPr>
+          <w:sz w:val="28"/>
+          <w:szCs w:val="28"/>
+        </w:rPr>
+        <w:t xml:space="preserve">{0,95; 6} ≈ 12,59. Если </w:t>
+      </w:r>
+      <m:oMath>
+        <m:sSub>
+          <m:sSubPr>
+            <m:ctrlPr>
+              <w:rPr>
+                <w:rFonts w:ascii="Cambria Math" w:hAnsi="Cambria Math"/>
+                <w:i/>
+                <w:sz w:val="28"/>
+                <w:szCs w:val="28"/>
+              </w:rPr>
+            </m:ctrlPr>
+          </m:sSubPr>
+          <m:e>
+            <m:r>
+              <w:rPr>
+                <w:rFonts w:ascii="Cambria Math" w:hAnsi="Cambria Math"/>
+                <w:sz w:val="28"/>
+                <w:szCs w:val="28"/>
+              </w:rPr>
+              <m:t>χ²</m:t>
+            </m:r>
+          </m:e>
+          <m:sub>
+            <m:r>
+              <w:rPr>
+                <w:rFonts w:ascii="Cambria Math" w:hAnsi="Cambria Math"/>
+                <w:sz w:val="28"/>
+                <w:szCs w:val="28"/>
+              </w:rPr>
+              <m:t>набл</m:t>
+            </m:r>
+          </m:sub>
+        </m:sSub>
+      </m:oMath>
+      <w:r>
+        <w:rPr>
+          <w:sz w:val="28"/>
+          <w:szCs w:val="28"/>
+        </w:rPr>
+        <w:t xml:space="preserve"> </w:t>
+      </w:r>
+      <m:oMath>
+        <m:r>
+          <w:rPr>
+            <w:rFonts w:ascii="Cambria Math" w:hAnsi="Cambria Math"/>
+            <w:sz w:val="28"/>
+            <w:szCs w:val="28"/>
+          </w:rPr>
+          <m:t>&lt; 12,59</m:t>
+        </m:r>
+      </m:oMath>
+      <w:r>
+        <w:rPr>
+          <w:sz w:val="28"/>
+          <w:szCs w:val="28"/>
+        </w:rPr>
+        <w:t>, гипотеза о принадлежности выборки двойному гамма-распределению не отвергается.</w:t>
+      </w:r>
+    </w:p>
+    <w:p>
+      <w:pPr>
+        <w:spacing w:before="100" w:beforeAutospacing="1" w:after="100" w:afterAutospacing="1" w:line="360" w:lineRule="auto"/>
+        <w:ind w:firstLine="709"/>
+        <w:jc w:val="both"/>
+        <w:rPr>
+          <w:sz w:val="28"/>
+          <w:szCs w:val="28"/>
+        </w:rPr>
+      </w:pPr>
+    </w:p>
+    <w:p>
+      <w:pPr>
+        <w:spacing w:before="100" w:beforeAutospacing="1" w:after="100" w:afterAutospacing="1" w:line="360" w:lineRule="auto"/>
+        <w:jc w:val="both"/>
+        <w:rPr>
+          <w:sz w:val="28"/>
+          <w:szCs w:val="28"/>
           <w:lang w:val="en-US"/>
         </w:rPr>
       </w:pPr>
@@ -25427,7 +26833,6 @@
           <w:sz w:val="28"/>
           <w:szCs w:val="28"/>
         </w:rPr>
-        <w:lastRenderedPageBreak/>
         <w:drawing>
           <wp:inline distT="0" distB="0" distL="0" distR="0" wp14:anchorId="288AFAC9" wp14:editId="6D364750">
             <wp:extent cx="5940425" cy="6190615"/>
@@ -25548,6 +26953,7 @@
           <w:sz w:val="28"/>
           <w:szCs w:val="28"/>
         </w:rPr>
+        <w:lastRenderedPageBreak/>
         <w:t xml:space="preserve">По результатам работы программы получилось, что для обоих методов гипотеза </w:t>
       </w:r>
       <m:oMath>
@@ -25633,8 +27039,32 @@
           <w:sz w:val="28"/>
           <w:szCs w:val="28"/>
         </w:rPr>
-        <w:lastRenderedPageBreak/>
         <w:t>Гипотезы об однородности выборок</w:t>
+      </w:r>
+    </w:p>
+    <w:p>
+      <w:pPr>
+        <w:spacing w:line="360" w:lineRule="auto"/>
+        <w:ind w:firstLine="708"/>
+        <w:jc w:val="both"/>
+        <w:rPr>
+          <w:sz w:val="28"/>
+          <w:szCs w:val="28"/>
+        </w:rPr>
+      </w:pPr>
+      <w:r>
+        <w:rPr>
+          <w:sz w:val="28"/>
+          <w:szCs w:val="28"/>
+        </w:rPr>
+        <w:t>Критерий проверяет, одинаково ли распределены две выборки: X₁ и X₂</w:t>
+      </w:r>
+      <w:r>
+        <w:rPr>
+          <w:sz w:val="28"/>
+          <w:szCs w:val="28"/>
+        </w:rPr>
+        <w:t xml:space="preserve">. </w:t>
       </w:r>
     </w:p>
     <w:p>
@@ -25907,7 +27337,14 @@
           <w:sz w:val="28"/>
           <w:szCs w:val="28"/>
         </w:rPr>
-        <w:t xml:space="preserve"> обусловлен тем, что оба распределения симметричны относительно центра. </w:t>
+        <w:t xml:space="preserve"> обусловлен тем, что оба распределения симметричны относительно центра</w:t>
+      </w:r>
+      <w:r>
+        <w:rPr>
+          <w:sz w:val="28"/>
+          <w:szCs w:val="28"/>
+        </w:rPr>
+        <w:t>, также у них совпадает среднее и дисперсия.</w:t>
       </w:r>
     </w:p>
     <w:p>
@@ -25973,7 +27410,147 @@
           <w:sz w:val="28"/>
           <w:szCs w:val="28"/>
         </w:rPr>
-        <w:t>. Была п</w:t>
+        <w:t>.</w:t>
+      </w:r>
+      <w:r>
+        <w:rPr>
+          <w:sz w:val="28"/>
+          <w:szCs w:val="28"/>
+        </w:rPr>
+        <w:t xml:space="preserve"> Идея метода: </w:t>
+      </w:r>
+      <w:r>
+        <w:rPr>
+          <w:sz w:val="28"/>
+          <w:szCs w:val="28"/>
+        </w:rPr>
+        <w:t xml:space="preserve">если </w:t>
+      </w:r>
+      <m:oMath>
+        <m:r>
+          <w:rPr>
+            <w:rFonts w:ascii="Cambria Math" w:hAnsi="Cambria Math"/>
+            <w:sz w:val="28"/>
+            <w:szCs w:val="28"/>
+          </w:rPr>
+          <m:t>U ~ R(0,1)</m:t>
+        </m:r>
+      </m:oMath>
+      <w:r>
+        <w:rPr>
+          <w:sz w:val="28"/>
+          <w:szCs w:val="28"/>
+        </w:rPr>
+        <w:t xml:space="preserve">, то </w:t>
+      </w:r>
+      <m:oMath>
+        <m:r>
+          <w:rPr>
+            <w:rFonts w:ascii="Cambria Math" w:hAnsi="Cambria Math"/>
+            <w:sz w:val="28"/>
+            <w:szCs w:val="28"/>
+          </w:rPr>
+          <m:t>X = G⁻¹(U)</m:t>
+        </m:r>
+      </m:oMath>
+      <w:r>
+        <w:rPr>
+          <w:sz w:val="28"/>
+          <w:szCs w:val="28"/>
+        </w:rPr>
+        <w:t xml:space="preserve"> имеет функцию распределения </w:t>
+      </w:r>
+      <m:oMath>
+        <m:r>
+          <w:rPr>
+            <w:rFonts w:ascii="Cambria Math" w:hAnsi="Cambria Math"/>
+            <w:sz w:val="28"/>
+            <w:szCs w:val="28"/>
+          </w:rPr>
+          <m:t>G</m:t>
+        </m:r>
+      </m:oMath>
+      <w:r>
+        <w:rPr>
+          <w:sz w:val="28"/>
+          <w:szCs w:val="28"/>
+        </w:rPr>
+        <w:t xml:space="preserve">. У нормального распределения </w:t>
+      </w:r>
+      <m:oMath>
+        <m:r>
+          <w:rPr>
+            <w:rFonts w:ascii="Cambria Math" w:hAnsi="Cambria Math"/>
+            <w:sz w:val="28"/>
+            <w:szCs w:val="28"/>
+          </w:rPr>
+          <m:t>G⁻¹</m:t>
+        </m:r>
+      </m:oMath>
+      <w:r>
+        <w:rPr>
+          <w:sz w:val="28"/>
+          <w:szCs w:val="28"/>
+        </w:rPr>
+        <w:t xml:space="preserve"> в явном виде нет, поэтому строится численная сетка значений </w:t>
+      </w:r>
+      <m:oMath>
+        <m:r>
+          <w:rPr>
+            <w:rFonts w:ascii="Cambria Math" w:hAnsi="Cambria Math"/>
+            <w:sz w:val="28"/>
+            <w:szCs w:val="28"/>
+          </w:rPr>
+          <m:t>G(x)</m:t>
+        </m:r>
+      </m:oMath>
+      <w:r>
+        <w:rPr>
+          <w:sz w:val="28"/>
+          <w:szCs w:val="28"/>
+        </w:rPr>
+        <w:t xml:space="preserve">, а </w:t>
+      </w:r>
+      <m:oMath>
+        <m:r>
+          <w:rPr>
+            <w:rFonts w:ascii="Cambria Math" w:hAnsi="Cambria Math"/>
+            <w:sz w:val="28"/>
+            <w:szCs w:val="28"/>
+          </w:rPr>
+          <m:t>x</m:t>
+        </m:r>
+      </m:oMath>
+      <w:r>
+        <w:rPr>
+          <w:sz w:val="28"/>
+          <w:szCs w:val="28"/>
+        </w:rPr>
+        <w:t xml:space="preserve"> для каждого </w:t>
+      </w:r>
+      <m:oMath>
+        <m:r>
+          <w:rPr>
+            <w:rFonts w:ascii="Cambria Math" w:hAnsi="Cambria Math"/>
+            <w:sz w:val="28"/>
+            <w:szCs w:val="28"/>
+          </w:rPr>
+          <m:t>u</m:t>
+        </m:r>
+      </m:oMath>
+      <w:r>
+        <w:rPr>
+          <w:sz w:val="28"/>
+          <w:szCs w:val="28"/>
+        </w:rPr>
+        <w:t xml:space="preserve"> находится бинарным поиском.</w:t>
+      </w:r>
+      <w:r>
+        <w:rPr>
+          <w:sz w:val="28"/>
+          <w:szCs w:val="28"/>
+        </w:rPr>
+        <w:t xml:space="preserve"> Была п</w:t>
       </w:r>
       <w:r>
         <w:rPr>
@@ -26074,6 +27651,7 @@
           <w:szCs w:val="28"/>
           <w:lang w:val="en-US"/>
         </w:rPr>
+        <w:lastRenderedPageBreak/>
         <w:drawing>
           <wp:inline distT="0" distB="0" distL="0" distR="0" wp14:anchorId="31392B47" wp14:editId="1E6145B7">
             <wp:extent cx="5940425" cy="2092325"/>
@@ -27205,7 +28783,6 @@
           <w:szCs w:val="28"/>
           <w:lang w:val="en-US"/>
         </w:rPr>
-        <w:lastRenderedPageBreak/>
         <w:drawing>
           <wp:inline distT="0" distB="0" distL="0" distR="0" wp14:anchorId="0A482601" wp14:editId="0CE69D81">
             <wp:extent cx="4465707" cy="3215919"/>
@@ -27302,6 +28879,7 @@
           <w:sz w:val="28"/>
           <w:szCs w:val="28"/>
         </w:rPr>
+        <w:lastRenderedPageBreak/>
         <w:t xml:space="preserve">Критическое значение найдено методом Монте-Карло: 1000 раз генерировались пары выборок объёмом n=m=300 из исследуемого распределения (обе — при верной H0), для каждой пары вычислялась статистика D, критическое значение взято как её 95-й процентиль: </w:t>
       </w:r>
       <m:oMath>
@@ -27467,7 +29045,6 @@
           <w:sz w:val="32"/>
           <w:szCs w:val="32"/>
         </w:rPr>
-        <w:lastRenderedPageBreak/>
         <w:t>Заключение</w:t>
       </w:r>
     </w:p>
@@ -27802,6 +29379,7 @@
           <w:sz w:val="28"/>
           <w:szCs w:val="28"/>
         </w:rPr>
+        <w:lastRenderedPageBreak/>
         <w:t>Согласие с распределением:</w:t>
       </w:r>
       <w:r>
@@ -28136,7 +29714,6 @@
           <w:sz w:val="32"/>
           <w:szCs w:val="32"/>
         </w:rPr>
-        <w:lastRenderedPageBreak/>
         <w:t>Список</w:t>
       </w:r>
       <w:r>
@@ -29096,6 +30673,155 @@
     </w:lvl>
   </w:abstractNum>
   <w:abstractNum w:abstractNumId="2" w15:restartNumberingAfterBreak="0">
+    <w:nsid w:val="030A4568"/>
+    <w:multiLevelType w:val="multilevel"/>
+    <w:tmpl w:val="F8EAC020"/>
+    <w:lvl w:ilvl="0">
+      <w:start w:val="1"/>
+      <w:numFmt w:val="bullet"/>
+      <w:lvlText w:val=""/>
+      <w:lvlJc w:val="left"/>
+      <w:pPr>
+        <w:tabs>
+          <w:tab w:val="num" w:pos="720"/>
+        </w:tabs>
+        <w:ind w:left="720" w:hanging="360"/>
+      </w:pPr>
+      <w:rPr>
+        <w:rFonts w:ascii="Symbol" w:hAnsi="Symbol" w:hint="default"/>
+        <w:sz w:val="20"/>
+      </w:rPr>
+    </w:lvl>
+    <w:lvl w:ilvl="1" w:tentative="1">
+      <w:start w:val="1"/>
+      <w:numFmt w:val="bullet"/>
+      <w:lvlText w:val="o"/>
+      <w:lvlJc w:val="left"/>
+      <w:pPr>
+        <w:tabs>
+          <w:tab w:val="num" w:pos="1440"/>
+        </w:tabs>
+        <w:ind w:left="1440" w:hanging="360"/>
+      </w:pPr>
+      <w:rPr>
+        <w:rFonts w:ascii="Courier New" w:hAnsi="Courier New" w:hint="default"/>
+        <w:sz w:val="20"/>
+      </w:rPr>
+    </w:lvl>
+    <w:lvl w:ilvl="2" w:tentative="1">
+      <w:start w:val="1"/>
+      <w:numFmt w:val="bullet"/>
+      <w:lvlText w:val=""/>
+      <w:lvlJc w:val="left"/>
+      <w:pPr>
+        <w:tabs>
+          <w:tab w:val="num" w:pos="2160"/>
+        </w:tabs>
+        <w:ind w:left="2160" w:hanging="360"/>
+      </w:pPr>
+      <w:rPr>
+        <w:rFonts w:ascii="Wingdings" w:hAnsi="Wingdings" w:hint="default"/>
+        <w:sz w:val="20"/>
+      </w:rPr>
+    </w:lvl>
+    <w:lvl w:ilvl="3" w:tentative="1">
+      <w:start w:val="1"/>
+      <w:numFmt w:val="bullet"/>
+      <w:lvlText w:val=""/>
+      <w:lvlJc w:val="left"/>
+      <w:pPr>
+        <w:tabs>
+          <w:tab w:val="num" w:pos="2880"/>
+        </w:tabs>
+        <w:ind w:left="2880" w:hanging="360"/>
+      </w:pPr>
+      <w:rPr>
+        <w:rFonts w:ascii="Wingdings" w:hAnsi="Wingdings" w:hint="default"/>
+        <w:sz w:val="20"/>
+      </w:rPr>
+    </w:lvl>
+    <w:lvl w:ilvl="4" w:tentative="1">
+      <w:start w:val="1"/>
+      <w:numFmt w:val="bullet"/>
+      <w:lvlText w:val=""/>
+      <w:lvlJc w:val="left"/>
+      <w:pPr>
+        <w:tabs>
+          <w:tab w:val="num" w:pos="3600"/>
+        </w:tabs>
+        <w:ind w:left="3600" w:hanging="360"/>
+      </w:pPr>
+      <w:rPr>
+        <w:rFonts w:ascii="Wingdings" w:hAnsi="Wingdings" w:hint="default"/>
+        <w:sz w:val="20"/>
+      </w:rPr>
+    </w:lvl>
+    <w:lvl w:ilvl="5" w:tentative="1">
+      <w:start w:val="1"/>
+      <w:numFmt w:val="bullet"/>
+      <w:lvlText w:val=""/>
+      <w:lvlJc w:val="left"/>
+      <w:pPr>
+        <w:tabs>
+          <w:tab w:val="num" w:pos="4320"/>
+        </w:tabs>
+        <w:ind w:left="4320" w:hanging="360"/>
+      </w:pPr>
+      <w:rPr>
+        <w:rFonts w:ascii="Wingdings" w:hAnsi="Wingdings" w:hint="default"/>
+        <w:sz w:val="20"/>
+      </w:rPr>
+    </w:lvl>
+    <w:lvl w:ilvl="6" w:tentative="1">
+      <w:start w:val="1"/>
+      <w:numFmt w:val="bullet"/>
+      <w:lvlText w:val=""/>
+      <w:lvlJc w:val="left"/>
+      <w:pPr>
+        <w:tabs>
+          <w:tab w:val="num" w:pos="5040"/>
+        </w:tabs>
+        <w:ind w:left="5040" w:hanging="360"/>
+      </w:pPr>
+      <w:rPr>
+        <w:rFonts w:ascii="Wingdings" w:hAnsi="Wingdings" w:hint="default"/>
+        <w:sz w:val="20"/>
+      </w:rPr>
+    </w:lvl>
+    <w:lvl w:ilvl="7" w:tentative="1">
+      <w:start w:val="1"/>
+      <w:numFmt w:val="bullet"/>
+      <w:lvlText w:val=""/>
+      <w:lvlJc w:val="left"/>
+      <w:pPr>
+        <w:tabs>
+          <w:tab w:val="num" w:pos="5760"/>
+        </w:tabs>
+        <w:ind w:left="5760" w:hanging="360"/>
+      </w:pPr>
+      <w:rPr>
+        <w:rFonts w:ascii="Wingdings" w:hAnsi="Wingdings" w:hint="default"/>
+        <w:sz w:val="20"/>
+      </w:rPr>
+    </w:lvl>
+    <w:lvl w:ilvl="8" w:tentative="1">
+      <w:start w:val="1"/>
+      <w:numFmt w:val="bullet"/>
+      <w:lvlText w:val=""/>
+      <w:lvlJc w:val="left"/>
+      <w:pPr>
+        <w:tabs>
+          <w:tab w:val="num" w:pos="6480"/>
+        </w:tabs>
+        <w:ind w:left="6480" w:hanging="360"/>
+      </w:pPr>
+      <w:rPr>
+        <w:rFonts w:ascii="Wingdings" w:hAnsi="Wingdings" w:hint="default"/>
+        <w:sz w:val="20"/>
+      </w:rPr>
+    </w:lvl>
+  </w:abstractNum>
+  <w:abstractNum w:abstractNumId="3" w15:restartNumberingAfterBreak="0">
     <w:nsid w:val="04A97111"/>
     <w:multiLevelType w:val="multilevel"/>
     <w:tmpl w:val="C58AB752"/>
@@ -29210,7 +30936,7 @@
       </w:rPr>
     </w:lvl>
   </w:abstractNum>
-  <w:abstractNum w:abstractNumId="3" w15:restartNumberingAfterBreak="0">
+  <w:abstractNum w:abstractNumId="4" w15:restartNumberingAfterBreak="0">
     <w:nsid w:val="09332B4A"/>
     <w:multiLevelType w:val="hybridMultilevel"/>
     <w:tmpl w:val="8A86C9C0"/>
@@ -29299,7 +31025,7 @@
       </w:pPr>
     </w:lvl>
   </w:abstractNum>
-  <w:abstractNum w:abstractNumId="4" w15:restartNumberingAfterBreak="0">
+  <w:abstractNum w:abstractNumId="5" w15:restartNumberingAfterBreak="0">
     <w:nsid w:val="15DE0EAB"/>
     <w:multiLevelType w:val="multilevel"/>
     <w:tmpl w:val="B6B27BCA"/>
@@ -29422,7 +31148,7 @@
       </w:rPr>
     </w:lvl>
   </w:abstractNum>
-  <w:abstractNum w:abstractNumId="5" w15:restartNumberingAfterBreak="0">
+  <w:abstractNum w:abstractNumId="6" w15:restartNumberingAfterBreak="0">
     <w:nsid w:val="20760212"/>
     <w:multiLevelType w:val="hybridMultilevel"/>
     <w:tmpl w:val="46A21DE2"/>
@@ -29511,7 +31237,7 @@
       </w:pPr>
     </w:lvl>
   </w:abstractNum>
-  <w:abstractNum w:abstractNumId="6" w15:restartNumberingAfterBreak="0">
+  <w:abstractNum w:abstractNumId="7" w15:restartNumberingAfterBreak="0">
     <w:nsid w:val="21BA2549"/>
     <w:multiLevelType w:val="multilevel"/>
     <w:tmpl w:val="240E71D8"/>
@@ -29660,7 +31386,7 @@
       </w:rPr>
     </w:lvl>
   </w:abstractNum>
-  <w:abstractNum w:abstractNumId="7" w15:restartNumberingAfterBreak="0">
+  <w:abstractNum w:abstractNumId="8" w15:restartNumberingAfterBreak="0">
     <w:nsid w:val="25130CBC"/>
     <w:multiLevelType w:val="hybridMultilevel"/>
     <w:tmpl w:val="892E0C60"/>
@@ -29773,7 +31499,7 @@
       </w:rPr>
     </w:lvl>
   </w:abstractNum>
-  <w:abstractNum w:abstractNumId="8" w15:restartNumberingAfterBreak="0">
+  <w:abstractNum w:abstractNumId="9" w15:restartNumberingAfterBreak="0">
     <w:nsid w:val="27406A6D"/>
     <w:multiLevelType w:val="multilevel"/>
     <w:tmpl w:val="E062D2CE"/>
@@ -29902,7 +31628,7 @@
       </w:rPr>
     </w:lvl>
   </w:abstractNum>
-  <w:abstractNum w:abstractNumId="9" w15:restartNumberingAfterBreak="0">
+  <w:abstractNum w:abstractNumId="10" w15:restartNumberingAfterBreak="0">
     <w:nsid w:val="27AA62F0"/>
     <w:multiLevelType w:val="multilevel"/>
     <w:tmpl w:val="E062D2CE"/>
@@ -30031,7 +31757,7 @@
       </w:rPr>
     </w:lvl>
   </w:abstractNum>
-  <w:abstractNum w:abstractNumId="10" w15:restartNumberingAfterBreak="0">
+  <w:abstractNum w:abstractNumId="11" w15:restartNumberingAfterBreak="0">
     <w:nsid w:val="28C53D88"/>
     <w:multiLevelType w:val="multilevel"/>
     <w:tmpl w:val="8F62495E"/>
@@ -30144,7 +31870,7 @@
       </w:rPr>
     </w:lvl>
   </w:abstractNum>
-  <w:abstractNum w:abstractNumId="11" w15:restartNumberingAfterBreak="0">
+  <w:abstractNum w:abstractNumId="12" w15:restartNumberingAfterBreak="0">
     <w:nsid w:val="29001FDF"/>
     <w:multiLevelType w:val="multilevel"/>
     <w:tmpl w:val="C47EA3DC"/>
@@ -30293,7 +32019,7 @@
       </w:rPr>
     </w:lvl>
   </w:abstractNum>
-  <w:abstractNum w:abstractNumId="12" w15:restartNumberingAfterBreak="0">
+  <w:abstractNum w:abstractNumId="13" w15:restartNumberingAfterBreak="0">
     <w:nsid w:val="42B83D0D"/>
     <w:multiLevelType w:val="multilevel"/>
     <w:tmpl w:val="B858AC80"/>
@@ -30415,7 +32141,7 @@
       </w:rPr>
     </w:lvl>
   </w:abstractNum>
-  <w:abstractNum w:abstractNumId="13" w15:restartNumberingAfterBreak="0">
+  <w:abstractNum w:abstractNumId="14" w15:restartNumberingAfterBreak="0">
     <w:nsid w:val="447579D3"/>
     <w:multiLevelType w:val="multilevel"/>
     <w:tmpl w:val="896A5380"/>
@@ -30549,7 +32275,7 @@
       </w:rPr>
     </w:lvl>
   </w:abstractNum>
-  <w:abstractNum w:abstractNumId="14" w15:restartNumberingAfterBreak="0">
+  <w:abstractNum w:abstractNumId="15" w15:restartNumberingAfterBreak="0">
     <w:nsid w:val="4F5A6620"/>
     <w:multiLevelType w:val="hybridMultilevel"/>
     <w:tmpl w:val="59BCE0F2"/>
@@ -30638,7 +32364,7 @@
       </w:pPr>
     </w:lvl>
   </w:abstractNum>
-  <w:abstractNum w:abstractNumId="15" w15:restartNumberingAfterBreak="0">
+  <w:abstractNum w:abstractNumId="16" w15:restartNumberingAfterBreak="0">
     <w:nsid w:val="591A7815"/>
     <w:multiLevelType w:val="hybridMultilevel"/>
     <w:tmpl w:val="FC7A57BA"/>
@@ -30727,7 +32453,7 @@
       </w:pPr>
     </w:lvl>
   </w:abstractNum>
-  <w:abstractNum w:abstractNumId="16" w15:restartNumberingAfterBreak="0">
+  <w:abstractNum w:abstractNumId="17" w15:restartNumberingAfterBreak="0">
     <w:nsid w:val="5FF5131B"/>
     <w:multiLevelType w:val="multilevel"/>
     <w:tmpl w:val="C3BC83A4"/>
@@ -30840,7 +32566,7 @@
       </w:rPr>
     </w:lvl>
   </w:abstractNum>
-  <w:abstractNum w:abstractNumId="17" w15:restartNumberingAfterBreak="0">
+  <w:abstractNum w:abstractNumId="18" w15:restartNumberingAfterBreak="0">
     <w:nsid w:val="6D2D1443"/>
     <w:multiLevelType w:val="multilevel"/>
     <w:tmpl w:val="2424FC36"/>
@@ -30989,7 +32715,7 @@
       </w:rPr>
     </w:lvl>
   </w:abstractNum>
-  <w:abstractNum w:abstractNumId="18" w15:restartNumberingAfterBreak="0">
+  <w:abstractNum w:abstractNumId="19" w15:restartNumberingAfterBreak="0">
     <w:nsid w:val="72AE5787"/>
     <w:multiLevelType w:val="multilevel"/>
     <w:tmpl w:val="92ECF4F4"/>
@@ -31105,46 +32831,46 @@
     </w:lvl>
   </w:abstractNum>
   <w:num w:numId="1" w16cid:durableId="765272132">
+    <w:abstractNumId w:val="16"/>
+  </w:num>
+  <w:num w:numId="2" w16cid:durableId="1280603550">
+    <w:abstractNumId w:val="4"/>
+  </w:num>
+  <w:num w:numId="3" w16cid:durableId="435517487">
+    <w:abstractNumId w:val="14"/>
+  </w:num>
+  <w:num w:numId="4" w16cid:durableId="718240523">
+    <w:abstractNumId w:val="6"/>
+  </w:num>
+  <w:num w:numId="5" w16cid:durableId="395593643">
+    <w:abstractNumId w:val="3"/>
+  </w:num>
+  <w:num w:numId="6" w16cid:durableId="2027636951">
     <w:abstractNumId w:val="15"/>
   </w:num>
-  <w:num w:numId="2" w16cid:durableId="1280603550">
-    <w:abstractNumId w:val="3"/>
-  </w:num>
-  <w:num w:numId="3" w16cid:durableId="435517487">
+  <w:num w:numId="7" w16cid:durableId="749816692">
     <w:abstractNumId w:val="13"/>
   </w:num>
-  <w:num w:numId="4" w16cid:durableId="718240523">
-    <w:abstractNumId w:val="5"/>
+  <w:num w:numId="8" w16cid:durableId="1835101558">
+    <w:abstractNumId w:val="8"/>
   </w:num>
-  <w:num w:numId="5" w16cid:durableId="395593643">
-    <w:abstractNumId w:val="2"/>
-  </w:num>
-  <w:num w:numId="6" w16cid:durableId="2027636951">
-    <w:abstractNumId w:val="14"/>
-  </w:num>
-  <w:num w:numId="7" w16cid:durableId="749816692">
+  <w:num w:numId="9" w16cid:durableId="1421294848">
     <w:abstractNumId w:val="12"/>
   </w:num>
-  <w:num w:numId="8" w16cid:durableId="1835101558">
-    <w:abstractNumId w:val="7"/>
-  </w:num>
-  <w:num w:numId="9" w16cid:durableId="1421294848">
-    <w:abstractNumId w:val="11"/>
-  </w:num>
   <w:num w:numId="10" w16cid:durableId="557129504">
-    <w:abstractNumId w:val="17"/>
+    <w:abstractNumId w:val="18"/>
   </w:num>
   <w:num w:numId="11" w16cid:durableId="36779260">
     <w:abstractNumId w:val="1"/>
   </w:num>
   <w:num w:numId="12" w16cid:durableId="1319654721">
+    <w:abstractNumId w:val="10"/>
+  </w:num>
+  <w:num w:numId="13" w16cid:durableId="739059937">
     <w:abstractNumId w:val="9"/>
   </w:num>
-  <w:num w:numId="13" w16cid:durableId="739059937">
-    <w:abstractNumId w:val="8"/>
-  </w:num>
   <w:num w:numId="14" w16cid:durableId="76901467">
-    <w:abstractNumId w:val="13"/>
+    <w:abstractNumId w:val="14"/>
     <w:lvlOverride w:ilvl="0">
       <w:startOverride w:val="1"/>
     </w:lvlOverride>
@@ -31174,22 +32900,25 @@
     </w:lvlOverride>
   </w:num>
   <w:num w:numId="15" w16cid:durableId="172652363">
-    <w:abstractNumId w:val="16"/>
+    <w:abstractNumId w:val="17"/>
   </w:num>
   <w:num w:numId="16" w16cid:durableId="222717199">
-    <w:abstractNumId w:val="10"/>
+    <w:abstractNumId w:val="11"/>
   </w:num>
   <w:num w:numId="17" w16cid:durableId="313069312">
-    <w:abstractNumId w:val="4"/>
+    <w:abstractNumId w:val="5"/>
   </w:num>
   <w:num w:numId="18" w16cid:durableId="1785735337">
-    <w:abstractNumId w:val="6"/>
+    <w:abstractNumId w:val="7"/>
   </w:num>
   <w:num w:numId="19" w16cid:durableId="899749302">
-    <w:abstractNumId w:val="18"/>
+    <w:abstractNumId w:val="19"/>
   </w:num>
   <w:num w:numId="20" w16cid:durableId="1728871649">
     <w:abstractNumId w:val="0"/>
+  </w:num>
+  <w:num w:numId="21" w16cid:durableId="451216215">
+    <w:abstractNumId w:val="2"/>
   </w:num>
 </w:numbering>
 </file>
@@ -31807,7 +33536,6 @@
   <w:style w:type="character" w:default="1" w:styleId="a0">
     <w:name w:val="Default Paragraph Font"/>
     <w:uiPriority w:val="1"/>
-    <w:semiHidden/>
     <w:unhideWhenUsed/>
   </w:style>
   <w:style w:type="table" w:default="1" w:styleId="a1">

</xml_diff>